<commit_message>
W2: add RQ7 reusable-design-patterns table (Table 19) in Conclusion; Q2: mark case-study pointers (§3.x) distinctly from surveyed literature ([n]) in Table 5; rebuild 1-col/2-col DOCX+PDF
wins-only scan: clean; em-dash: 0; Table 19 referenced in prose; all §3.x pointers resolve. W4 (selection-scope sentence) intentionally not added per author.
Co-Authored-By: Claude Opus 4.8 <noreply@anthropic.com>
</commit_message>
<xml_diff>
--- a/paper-1col.docx
+++ b/paper-1col.docx
@@ -2,7 +2,63 @@
 <file path=word/document.xml><?xml version="1.0" encoding="utf-8"?>
 <w:document xmlns:w="http://schemas.openxmlformats.org/wordprocessingml/2006/main" xmlns:m="http://schemas.openxmlformats.org/officeDocument/2006/math" xmlns:r="http://schemas.openxmlformats.org/officeDocument/2006/relationships" xmlns:o="urn:schemas-microsoft-com:office:office" xmlns:v="urn:schemas-microsoft-com:vml" xmlns:w10="urn:schemas-microsoft-com:office:word" xmlns:a="http://schemas.openxmlformats.org/drawingml/2006/main" xmlns:pic="http://schemas.openxmlformats.org/drawingml/2006/picture" xmlns:wp="http://schemas.openxmlformats.org/drawingml/2006/wordprocessingDrawing">
   <w:body>
-    <w:bookmarkStart w:id="75" w:name="X62474ac8021dc677ea6aef3c984b364bc7f39ed"/>
+    <w:p>
+      <w:pPr>
+        <w:pStyle w:val="FirstParagraph"/>
+        <w:jc w:val="both"/>
+        <w:keepNext w:val="0"/>
+        <w:keepLines w:val="0"/>
+        <w:widowControl w:val="1"/>
+      </w:pPr>
+      <w:r>
+        <w:t xml:space="preserve">Download</w:t>
+      </w:r>
+      <w:r>
+        <w:t xml:space="preserve"> </w:t>
+      </w:r>
+      <w:hyperlink r:id="rId9">
+        <w:r>
+          <w:rPr>
+            <w:rStyle w:val="Hyperlink"/>
+          </w:rPr>
+          <w:t xml:space="preserve">PDF · 1-col</w:t>
+        </w:r>
+      </w:hyperlink>
+      <w:r>
+        <w:t xml:space="preserve"> </w:t>
+      </w:r>
+      <w:hyperlink r:id="rId10">
+        <w:r>
+          <w:rPr>
+            <w:rStyle w:val="Hyperlink"/>
+          </w:rPr>
+          <w:t xml:space="preserve">PDF · 2-col</w:t>
+        </w:r>
+      </w:hyperlink>
+      <w:r>
+        <w:t xml:space="preserve"> </w:t>
+      </w:r>
+      <w:hyperlink r:id="rId11">
+        <w:r>
+          <w:rPr>
+            <w:rStyle w:val="Hyperlink"/>
+          </w:rPr>
+          <w:t xml:space="preserve">Word · 1-col</w:t>
+        </w:r>
+      </w:hyperlink>
+      <w:r>
+        <w:t xml:space="preserve"> </w:t>
+      </w:r>
+      <w:hyperlink r:id="rId12">
+        <w:r>
+          <w:rPr>
+            <w:rStyle w:val="Hyperlink"/>
+          </w:rPr>
+          <w:t xml:space="preserve">Word · 2-col</w:t>
+        </w:r>
+      </w:hyperlink>
+    </w:p>
+    <w:bookmarkStart w:id="79" w:name="X62474ac8021dc677ea6aef3c984b364bc7f39ed"/>
     <w:p>
       <w:pPr>
         <w:pStyle w:val="Title"/>
@@ -258,7 +314,7 @@
         <w:t xml:space="preserve">authentic-data transfer together with attention to safety, privacy, and external validation.</w:t>
       </w:r>
     </w:p>
-    <w:bookmarkStart w:id="9" w:name="s1"/>
+    <w:bookmarkStart w:id="13" w:name="s1"/>
     <w:p>
       <w:pPr>
         <w:pStyle w:val="Heading2"/>
@@ -959,8 +1015,8 @@
         <w:t xml:space="preserve">here.</w:t>
       </w:r>
     </w:p>
-    <w:bookmarkEnd w:id="9"/>
-    <w:bookmarkStart w:id="21" w:name="s2"/>
+    <w:bookmarkEnd w:id="13"/>
+    <w:bookmarkStart w:id="25" w:name="s2"/>
     <w:p>
       <w:pPr>
         <w:pStyle w:val="Heading2"/>
@@ -1119,7 +1175,7 @@
         <w:t xml:space="preserve">generation, the subject of this survey, sets out to relieve.</w:t>
       </w:r>
     </w:p>
-    <w:bookmarkStart w:id="13" w:name="clinical-communication-in-healthcare-ai"/>
+    <w:bookmarkStart w:id="17" w:name="clinical-communication-in-healthcare-ai"/>
     <w:p>
       <w:pPr>
         <w:pStyle w:val="Heading3"/>
@@ -1131,7 +1187,7 @@
         <w:t xml:space="preserve">2.1  Clinical Communication in Healthcare AI</w:t>
       </w:r>
     </w:p>
-    <w:bookmarkStart w:id="10" w:name="modalities-of-clinical-communication"/>
+    <w:bookmarkStart w:id="14" w:name="modalities-of-clinical-communication"/>
     <w:p>
       <w:pPr>
         <w:pStyle w:val="Heading4"/>
@@ -2789,8 +2845,8 @@
         <w:t xml:space="preserve">channels, languages, labels, and rare cases that real corpora do not supply.</w:t>
       </w:r>
     </w:p>
-    <w:bookmarkEnd w:id="10"/>
-    <w:bookmarkStart w:id="11" w:name="X79830f1909957bf926c31ab7ad2def96d5a5599"/>
+    <w:bookmarkEnd w:id="14"/>
+    <w:bookmarkStart w:id="15" w:name="X79830f1909957bf926c31ab7ad2def96d5a5599"/>
     <w:p>
       <w:pPr>
         <w:pStyle w:val="Heading4"/>
@@ -3895,8 +3951,8 @@
         </w:tc>
       </w:tr>
     </w:tbl>
-    <w:bookmarkEnd w:id="11"/>
-    <w:bookmarkStart w:id="12" w:name="clinical-nlp-tasks"/>
+    <w:bookmarkEnd w:id="15"/>
+    <w:bookmarkStart w:id="16" w:name="clinical-nlp-tasks"/>
     <w:p>
       <w:pPr>
         <w:pStyle w:val="Heading4"/>
@@ -4763,9 +4819,9 @@
         </w:tc>
       </w:tr>
     </w:tbl>
-    <w:bookmarkEnd w:id="12"/>
-    <w:bookmarkEnd w:id="13"/>
-    <w:bookmarkStart w:id="18" w:name="X2fcc01e80d3f74904b8a94b6a858f8ab2487ea4"/>
+    <w:bookmarkEnd w:id="16"/>
+    <w:bookmarkEnd w:id="17"/>
+    <w:bookmarkStart w:id="22" w:name="X2fcc01e80d3f74904b8a94b6a858f8ab2487ea4"/>
     <w:p>
       <w:pPr>
         <w:pStyle w:val="Heading3"/>
@@ -4777,7 +4833,7 @@
         <w:t xml:space="preserve">2.2  Generating Synthetic Clinical Communication</w:t>
       </w:r>
     </w:p>
-    <w:bookmarkStart w:id="14" w:name="Xf487674f1e8279eb9f68af77c7aaf44559788a2"/>
+    <w:bookmarkStart w:id="18" w:name="Xf487674f1e8279eb9f68af77c7aaf44559788a2"/>
     <w:p>
       <w:pPr>
         <w:pStyle w:val="Heading4"/>
@@ -4849,8 +4905,8 @@
         <w:t xml:space="preserve">distribution are set by design rather than confounded by whatever real data happened to be available.</w:t>
       </w:r>
     </w:p>
-    <w:bookmarkEnd w:id="14"/>
-    <w:bookmarkStart w:id="15" w:name="generation-approaches"/>
+    <w:bookmarkEnd w:id="18"/>
+    <w:bookmarkStart w:id="19" w:name="generation-approaches"/>
     <w:p>
       <w:pPr>
         <w:pStyle w:val="Heading4"/>
@@ -5144,8 +5200,8 @@
         <w:t xml:space="preserve">judge to filter the result.</w:t>
       </w:r>
     </w:p>
-    <w:bookmarkEnd w:id="15"/>
-    <w:bookmarkStart w:id="16" w:name="automatic-annotation"/>
+    <w:bookmarkEnd w:id="19"/>
+    <w:bookmarkStart w:id="20" w:name="automatic-annotation"/>
     <w:p>
       <w:pPr>
         <w:pStyle w:val="Heading4"/>
@@ -5241,8 +5297,8 @@
         <w:t xml:space="preserve">audited by an independent model judge before a record is admitted.</w:t>
       </w:r>
     </w:p>
-    <w:bookmarkEnd w:id="16"/>
-    <w:bookmarkStart w:id="17" w:name="dataset-construction"/>
+    <w:bookmarkEnd w:id="20"/>
+    <w:bookmarkStart w:id="21" w:name="dataset-construction"/>
     <w:p>
       <w:pPr>
         <w:pStyle w:val="Heading4"/>
@@ -5296,9 +5352,9 @@
         <w:t xml:space="preserve">several noise levels, across distinct writer profiles, or with channel reliability deliberately degraded.</w:t>
       </w:r>
     </w:p>
-    <w:bookmarkEnd w:id="17"/>
-    <w:bookmarkEnd w:id="18"/>
-    <w:bookmarkStart w:id="19" w:name="s4"/>
+    <w:bookmarkEnd w:id="21"/>
+    <w:bookmarkEnd w:id="22"/>
+    <w:bookmarkStart w:id="23" w:name="s4"/>
     <w:p>
       <w:pPr>
         <w:pStyle w:val="Heading3"/>
@@ -6040,8 +6096,8 @@
         <w:t xml:space="preserve">.</w:t>
       </w:r>
     </w:p>
-    <w:bookmarkEnd w:id="19"/>
-    <w:bookmarkStart w:id="20" w:name="s5"/>
+    <w:bookmarkEnd w:id="23"/>
+    <w:bookmarkStart w:id="24" w:name="s5"/>
     <w:p>
       <w:pPr>
         <w:pStyle w:val="Heading3"/>
@@ -6298,7 +6354,7 @@
           <w:b w:val="0"/>
           <w:i/>
         </w:rPr>
-        <w:t>Downstream clinical NLP tasks supported by synthetic clinical communication, with representative references.</w:t>
+        <w:t>Downstream clinical NLP tasks supported by synthetic clinical communication. Bracketed entries [n] cite surveyed literature; § entries point to the application studies in Section 3.</w:t>
       </w:r>
     </w:p>
     <w:tbl>
@@ -6307,7 +6363,7 @@
         <w:tblW w:type="pct" w:w="5000"/>
         <w:jc w:val="center"/>
         <w:tblLook w:firstRow="1" w:lastRow="0" w:firstColumn="0" w:lastColumn="0" w:noHBand="0" w:noVBand="0" w:val="0020"/>
-        <w:tblCaption w:val="Table 5. Downstream clinical NLP tasks supported by synthetic clinical communication, with representative references."/>
+        <w:tblCaption w:val="Table 5. Downstream clinical NLP tasks supported by synthetic clinical communication. Bracketed entries [n] cite surveyed literature; § entries point to the application studies in Section 3."/>
         <w:tblLayout w:type="autofit"/>
         <w:tblBorders>
           <w:top w:val="single" w:sz="10" w:color="4F6272"/>
@@ -6499,7 +6555,7 @@
                 <w:rFonts w:ascii="Times New Roman" w:hAnsi="Times New Roman"/>
                 <w:sz w:val="19"/>
               </w:rPr>
-              <w:t xml:space="preserve">[4], [5], [18], [39], [40], [44], [45], [71], [79]</w:t>
+              <w:t xml:space="preserve">[4], [5], [18], [39], [40], [44], [45], [71], [79] · §3.2.1, §3.4.2</w:t>
             </w:r>
           </w:p>
         </w:tc>
@@ -6757,7 +6813,7 @@
                 <w:rFonts w:ascii="Times New Roman" w:hAnsi="Times New Roman"/>
                 <w:sz w:val="19"/>
               </w:rPr>
-              <w:t xml:space="preserve">[1], [2], [46], [47], [48], [49]</w:t>
+              <w:t xml:space="preserve">[1], [2], [46], [47], [48], [49] · §3.1.1, §3.1.2</w:t>
             </w:r>
           </w:p>
         </w:tc>
@@ -6929,7 +6985,7 @@
                 <w:rFonts w:ascii="Times New Roman" w:hAnsi="Times New Roman"/>
                 <w:sz w:val="19"/>
               </w:rPr>
-              <w:t xml:space="preserve">[3], [38], [64], [66], [67]</w:t>
+              <w:t xml:space="preserve">[3], [38], [64], [66], [67] · §3.1.3, §3.3.1–3.3.6, §3.4.1</w:t>
             </w:r>
           </w:p>
         </w:tc>
@@ -7015,7 +7071,7 @@
                 <w:rFonts w:ascii="Times New Roman" w:hAnsi="Times New Roman"/>
                 <w:sz w:val="19"/>
               </w:rPr>
-              <w:t xml:space="preserve">[65], and Section 3.4</w:t>
+              <w:t xml:space="preserve">[65] · §3.4.3</w:t>
             </w:r>
           </w:p>
         </w:tc>
@@ -7187,7 +7243,7 @@
                 <w:rFonts w:ascii="Times New Roman" w:hAnsi="Times New Roman"/>
                 <w:sz w:val="19"/>
               </w:rPr>
-              <w:t xml:space="preserve">[8], [9], [10], [11], [12], [16], [17], [68], [69]</w:t>
+              <w:t xml:space="preserve">[8], [9], [10], [11], [12], [16], [17], [68], [69] · §3.1.2</w:t>
             </w:r>
           </w:p>
         </w:tc>
@@ -7273,15 +7329,15 @@
                 <w:rFonts w:ascii="Times New Roman" w:hAnsi="Times New Roman"/>
                 <w:sz w:val="19"/>
               </w:rPr>
-              <w:t xml:space="preserve">[29], [30], [31], [32], [70], [71], [77], [78], [79], [80], [81], [82]</w:t>
+              <w:t xml:space="preserve">[29], [30], [31], [32], [70], [71], [77], [78], [79], [80], [81], [82] · §3.3.5</w:t>
             </w:r>
           </w:p>
         </w:tc>
       </w:tr>
     </w:tbl>
-    <w:bookmarkEnd w:id="20"/>
-    <w:bookmarkEnd w:id="21"/>
-    <w:bookmarkStart w:id="60" w:name="s6"/>
+    <w:bookmarkEnd w:id="24"/>
+    <w:bookmarkEnd w:id="25"/>
+    <w:bookmarkStart w:id="64" w:name="s6"/>
     <w:p>
       <w:pPr>
         <w:pStyle w:val="Heading2"/>
@@ -9444,7 +9500,7 @@
         </w:tc>
       </w:tr>
     </w:tbl>
-    <w:bookmarkStart w:id="25" w:name="s61"/>
+    <w:bookmarkStart w:id="29" w:name="s61"/>
     <w:p>
       <w:pPr>
         <w:pStyle w:val="Heading3"/>
@@ -9519,7 +9575,7 @@
         <w:t xml:space="preserve">of that exchange: how a model can learn from, and reason over, the way patients actually speak.</w:t>
       </w:r>
     </w:p>
-    <w:bookmarkStart w:id="22" w:name="X62b93aa3d2e6c5dbfd461e0e0edd7c358401bcb"/>
+    <w:bookmarkStart w:id="26" w:name="X62b93aa3d2e6c5dbfd461e0e0edd7c358401bcb"/>
     <w:p>
       <w:pPr>
         <w:pStyle w:val="Heading4"/>
@@ -10285,8 +10341,8 @@
         </w:tc>
       </w:tr>
     </w:tbl>
-    <w:bookmarkEnd w:id="22"/>
-    <w:bookmarkStart w:id="23" w:name="X115db5d5291af705c3dd90ac5aa32f2d1bb0a23"/>
+    <w:bookmarkEnd w:id="26"/>
+    <w:bookmarkStart w:id="27" w:name="X115db5d5291af705c3dd90ac5aa32f2d1bb0a23"/>
     <w:p>
       <w:pPr>
         <w:pStyle w:val="Heading4"/>
@@ -10970,8 +11026,8 @@
         </w:tc>
       </w:tr>
     </w:tbl>
-    <w:bookmarkEnd w:id="23"/>
-    <w:bookmarkStart w:id="24" w:name="urgency-triage-from-arrival-complaints"/>
+    <w:bookmarkEnd w:id="27"/>
+    <w:bookmarkStart w:id="28" w:name="urgency-triage-from-arrival-complaints"/>
     <w:p>
       <w:pPr>
         <w:pStyle w:val="Heading4"/>
@@ -11583,9 +11639,9 @@
         </w:tc>
       </w:tr>
     </w:tbl>
-    <w:bookmarkEnd w:id="24"/>
-    <w:bookmarkEnd w:id="25"/>
-    <w:bookmarkStart w:id="30" w:name="s62"/>
+    <w:bookmarkEnd w:id="28"/>
+    <w:bookmarkEnd w:id="29"/>
+    <w:bookmarkStart w:id="34" w:name="s62"/>
     <w:p>
       <w:pPr>
         <w:pStyle w:val="Heading3"/>
@@ -11660,7 +11716,7 @@
         <w:t xml:space="preserve">synthetic discharge summaries in a low-resource language.</w:t>
       </w:r>
     </w:p>
-    <w:bookmarkStart w:id="29" w:name="X9a81a03a99525fa747acd29ab6db71b5aa03c76"/>
+    <w:bookmarkStart w:id="33" w:name="X9a81a03a99525fa747acd29ab6db71b5aa03c76"/>
     <w:p>
       <w:pPr>
         <w:pStyle w:val="Heading4"/>
@@ -12299,18 +12355,18 @@
           <wp:inline>
             <wp:extent cx="5943600" cy="3522346"/>
             <wp:effectExtent b="0" l="0" r="0" t="0"/>
-            <wp:docPr descr="Model comparison for clinical-decision extraction" title="" id="27" name="Picture"/>
+            <wp:docPr descr="Model comparison for clinical-decision extraction" title="" id="31" name="Picture"/>
             <a:graphic>
               <a:graphicData uri="http://schemas.openxmlformats.org/drawingml/2006/picture">
                 <pic:pic>
                   <pic:nvPicPr>
-                    <pic:cNvPr descr="figures/fig1_crosslingual_f1.png" id="28" name="Picture"/>
+                    <pic:cNvPr descr="figures/fig1_crosslingual_f1.png" id="32" name="Picture"/>
                     <pic:cNvPicPr>
                       <a:picLocks noChangeArrowheads="1" noChangeAspect="1"/>
                     </pic:cNvPicPr>
                   </pic:nvPicPr>
                   <pic:blipFill>
-                    <a:blip r:embed="rId26"/>
+                    <a:blip r:embed="rId30"/>
                     <a:stretch>
                       <a:fillRect/>
                     </a:stretch>
@@ -12368,9 +12424,9 @@
         <w:t>Clinical-decision extraction: strict versus relaxed F1 across models.</w:t>
       </w:r>
     </w:p>
-    <w:bookmarkEnd w:id="29"/>
-    <w:bookmarkEnd w:id="30"/>
-    <w:bookmarkStart w:id="46" w:name="s63"/>
+    <w:bookmarkEnd w:id="33"/>
+    <w:bookmarkEnd w:id="34"/>
+    <w:bookmarkStart w:id="50" w:name="s63"/>
     <w:p>
       <w:pPr>
         <w:pStyle w:val="Heading3"/>
@@ -12442,7 +12498,7 @@
         <w:t xml:space="preserve">classification, and home-care status monitoring.</w:t>
       </w:r>
     </w:p>
-    <w:bookmarkStart w:id="34" w:name="X4c70d57689a9bd123de09154f3f9deb67fbd261"/>
+    <w:bookmarkStart w:id="38" w:name="X4c70d57689a9bd123de09154f3f9deb67fbd261"/>
     <w:p>
       <w:pPr>
         <w:pStyle w:val="Heading4"/>
@@ -13148,18 +13204,18 @@
           <wp:inline>
             <wp:extent cx="5943600" cy="3054839"/>
             <wp:effectExtent b="0" l="0" r="0" t="0"/>
-            <wp:docPr descr="Portal-message triage results summary" title="" id="32" name="Picture"/>
+            <wp:docPr descr="Portal-message triage results summary" title="" id="36" name="Picture"/>
             <a:graphic>
               <a:graphicData uri="http://schemas.openxmlformats.org/drawingml/2006/picture">
                 <pic:pic>
                   <pic:nvPicPr>
-                    <pic:cNvPr descr="figures/fig2_portal_triage.png" id="33" name="Picture"/>
+                    <pic:cNvPr descr="figures/fig2_portal_triage.png" id="37" name="Picture"/>
                     <pic:cNvPicPr>
                       <a:picLocks noChangeArrowheads="1" noChangeAspect="1"/>
                     </pic:cNvPicPr>
                   </pic:nvPicPr>
                   <pic:blipFill>
-                    <a:blip r:embed="rId31"/>
+                    <a:blip r:embed="rId35"/>
                     <a:stretch>
                       <a:fillRect/>
                     </a:stretch>
@@ -13217,8 +13273,8 @@
         <w:t>Portal-message triage: fine-tuned heads versus zero- and few-shot prompting.</w:t>
       </w:r>
     </w:p>
-    <w:bookmarkEnd w:id="34"/>
-    <w:bookmarkStart w:id="38" w:name="severity-triage-of-postpartum-messages"/>
+    <w:bookmarkEnd w:id="38"/>
+    <w:bookmarkStart w:id="42" w:name="severity-triage-of-postpartum-messages"/>
     <w:p>
       <w:pPr>
         <w:pStyle w:val="Heading4"/>
@@ -13738,18 +13794,18 @@
           <wp:inline>
             <wp:extent cx="5266944" cy="4139184"/>
             <wp:effectExtent b="0" l="0" r="0" t="0"/>
-            <wp:docPr descr="Postpartum severity-triage confusion matrix" title="" id="36" name="Picture"/>
+            <wp:docPr descr="Postpartum severity-triage confusion matrix" title="" id="40" name="Picture"/>
             <a:graphic>
               <a:graphicData uri="http://schemas.openxmlformats.org/drawingml/2006/picture">
                 <pic:pic>
                   <pic:nvPicPr>
-                    <pic:cNvPr descr="figures/fig3_csection_confusion.png" id="37" name="Picture"/>
+                    <pic:cNvPr descr="figures/fig3_csection_confusion.png" id="41" name="Picture"/>
                     <pic:cNvPicPr>
                       <a:picLocks noChangeArrowheads="1" noChangeAspect="1"/>
                     </pic:cNvPicPr>
                   </pic:nvPicPr>
                   <pic:blipFill>
-                    <a:blip r:embed="rId35"/>
+                    <a:blip r:embed="rId39"/>
                     <a:stretch>
                       <a:fillRect/>
                     </a:stretch>
@@ -13807,8 +13863,8 @@
         <w:t>Postpartum severity triage: GPT-4o-mini zero-shot confusion matrix.</w:t>
       </w:r>
     </w:p>
-    <w:bookmarkEnd w:id="38"/>
-    <w:bookmarkStart w:id="39" w:name="X520f61b7cb788da1820b939779dd0cffacbd021"/>
+    <w:bookmarkEnd w:id="42"/>
+    <w:bookmarkStart w:id="43" w:name="X520f61b7cb788da1820b939779dd0cffacbd021"/>
     <w:p>
       <w:pPr>
         <w:pStyle w:val="Heading4"/>
@@ -14262,8 +14318,8 @@
         </w:tc>
       </w:tr>
     </w:tbl>
-    <w:bookmarkEnd w:id="39"/>
-    <w:bookmarkStart w:id="40" w:name="X8723f5f4a831929ea0d7e731d5de347d5e355d1"/>
+    <w:bookmarkEnd w:id="43"/>
+    <w:bookmarkStart w:id="44" w:name="X8723f5f4a831929ea0d7e731d5de347d5e355d1"/>
     <w:p>
       <w:pPr>
         <w:pStyle w:val="Heading4"/>
@@ -14779,8 +14835,8 @@
         </w:tc>
       </w:tr>
     </w:tbl>
-    <w:bookmarkEnd w:id="40"/>
-    <w:bookmarkStart w:id="41" w:name="X9e4a77421b8c20f8d39059239d60de8009e90ff"/>
+    <w:bookmarkEnd w:id="44"/>
+    <w:bookmarkStart w:id="45" w:name="X9e4a77421b8c20f8d39059239d60de8009e90ff"/>
     <w:p>
       <w:pPr>
         <w:pStyle w:val="Heading4"/>
@@ -15490,8 +15546,8 @@
         </w:tc>
       </w:tr>
     </w:tbl>
-    <w:bookmarkEnd w:id="41"/>
-    <w:bookmarkStart w:id="45" w:name="X866505a93d30ea0aa48cc2aaff2638a55d83073"/>
+    <w:bookmarkEnd w:id="45"/>
+    <w:bookmarkStart w:id="49" w:name="X866505a93d30ea0aa48cc2aaff2638a55d83073"/>
     <w:p>
       <w:pPr>
         <w:pStyle w:val="Heading4"/>
@@ -15588,18 +15644,18 @@
           <wp:inline>
             <wp:extent cx="5943600" cy="2948139"/>
             <wp:effectExtent b="0" l="0" r="0" t="0"/>
-            <wp:docPr descr="Per-class recall of top fusion models" title="" id="43" name="Picture"/>
+            <wp:docPr descr="Per-class recall of top fusion models" title="" id="47" name="Picture"/>
             <a:graphic>
               <a:graphicData uri="http://schemas.openxmlformats.org/drawingml/2006/picture">
                 <pic:pic>
                   <pic:nvPicPr>
-                    <pic:cNvPr descr="figures/fig4_homecare_recall.png" id="44" name="Picture"/>
+                    <pic:cNvPr descr="figures/fig4_homecare_recall.png" id="48" name="Picture"/>
                     <pic:cNvPicPr>
                       <a:picLocks noChangeArrowheads="1" noChangeAspect="1"/>
                     </pic:cNvPicPr>
                   </pic:nvPicPr>
                   <pic:blipFill>
-                    <a:blip r:embed="rId42"/>
+                    <a:blip r:embed="rId46"/>
                     <a:stretch>
                       <a:fillRect/>
                     </a:stretch>
@@ -15657,9 +15713,9 @@
         <w:t>Home-care status detection: per-class recall of the top fusion models.</w:t>
       </w:r>
     </w:p>
-    <w:bookmarkEnd w:id="45"/>
-    <w:bookmarkEnd w:id="46"/>
-    <w:bookmarkStart w:id="59" w:name="s64"/>
+    <w:bookmarkEnd w:id="49"/>
+    <w:bookmarkEnd w:id="50"/>
+    <w:bookmarkStart w:id="63" w:name="s64"/>
     <w:p>
       <w:pPr>
         <w:pStyle w:val="Heading3"/>
@@ -15749,7 +15805,7 @@
         <w:t xml:space="preserve">target EMS pre-arrival, field casualty radio, and SBAR handover.</w:t>
       </w:r>
     </w:p>
-    <w:bookmarkStart w:id="50" w:name="routing-ems-pre-arrival-reports"/>
+    <w:bookmarkStart w:id="54" w:name="routing-ems-pre-arrival-reports"/>
     <w:p>
       <w:pPr>
         <w:pStyle w:val="Heading4"/>
@@ -16189,18 +16245,18 @@
           <wp:inline>
             <wp:extent cx="5553456" cy="3718560"/>
             <wp:effectExtent b="0" l="0" r="0" t="0"/>
-            <wp:docPr descr="Macro-F1 across training setups" title="" id="48" name="Picture"/>
+            <wp:docPr descr="Macro-F1 across training setups" title="" id="52" name="Picture"/>
             <a:graphic>
               <a:graphicData uri="http://schemas.openxmlformats.org/drawingml/2006/picture">
                 <pic:pic>
                   <pic:nvPicPr>
-                    <pic:cNvPr descr="figures/fig5_medalert_macrof1.png" id="49" name="Picture"/>
+                    <pic:cNvPr descr="figures/fig5_medalert_macrof1.png" id="53" name="Picture"/>
                     <pic:cNvPicPr>
                       <a:picLocks noChangeArrowheads="1" noChangeAspect="1"/>
                     </pic:cNvPicPr>
                   </pic:nvPicPr>
                   <pic:blipFill>
-                    <a:blip r:embed="rId47"/>
+                    <a:blip r:embed="rId51"/>
                     <a:stretch>
                       <a:fillRect/>
                     </a:stretch>
@@ -16258,8 +16314,8 @@
         <w:t>EMS report routing: macro-F1 across training setups; noisy synthetic data helps.</w:t>
       </w:r>
     </w:p>
-    <w:bookmarkEnd w:id="50"/>
-    <w:bookmarkStart w:id="54" w:name="Xff7e8eb076cd6934f1148f387c5bb7adf4aa2cd"/>
+    <w:bookmarkEnd w:id="54"/>
+    <w:bookmarkStart w:id="58" w:name="Xff7e8eb076cd6934f1148f387c5bb7adf4aa2cd"/>
     <w:p>
       <w:pPr>
         <w:pStyle w:val="Heading4"/>
@@ -16896,18 +16952,18 @@
           <wp:inline>
             <wp:extent cx="5943600" cy="2592105"/>
             <wp:effectExtent b="0" l="0" r="0" t="0"/>
-            <wp:docPr descr="Casualty-record reconstruction model comparison" title="" id="52" name="Picture"/>
+            <wp:docPr descr="Casualty-record reconstruction model comparison" title="" id="56" name="Picture"/>
             <a:graphic>
               <a:graphicData uri="http://schemas.openxmlformats.org/drawingml/2006/picture">
                 <pic:pic>
                   <pic:nvPicPr>
-                    <pic:cNvPr descr="figures/fig6_casualty_reconstruction.png" id="53" name="Picture"/>
+                    <pic:cNvPr descr="figures/fig6_casualty_reconstruction.png" id="57" name="Picture"/>
                     <pic:cNvPicPr>
                       <a:picLocks noChangeArrowheads="1" noChangeAspect="1"/>
                     </pic:cNvPicPr>
                   </pic:nvPicPr>
                   <pic:blipFill>
-                    <a:blip r:embed="rId51"/>
+                    <a:blip r:embed="rId55"/>
                     <a:stretch>
                       <a:fillRect/>
                     </a:stretch>
@@ -16965,8 +17021,8 @@
         <w:t>Casualty-record reconstruction: accuracy, F1, and hallucination counts.</w:t>
       </w:r>
     </w:p>
-    <w:bookmarkEnd w:id="54"/>
-    <w:bookmarkStart w:id="58" w:name="completeness-checking-of-sbar-handovers"/>
+    <w:bookmarkEnd w:id="58"/>
+    <w:bookmarkStart w:id="62" w:name="completeness-checking-of-sbar-handovers"/>
     <w:p>
       <w:pPr>
         <w:pStyle w:val="Heading4"/>
@@ -17713,18 +17769,18 @@
           <wp:inline>
             <wp:extent cx="5943600" cy="3616036"/>
             <wp:effectExtent b="0" l="0" r="0" t="0"/>
-            <wp:docPr descr="SBAR class macro-F1 comparison" title="" id="56" name="Picture"/>
+            <wp:docPr descr="SBAR class macro-F1 comparison" title="" id="60" name="Picture"/>
             <a:graphic>
               <a:graphicData uri="http://schemas.openxmlformats.org/drawingml/2006/picture">
                 <pic:pic>
                   <pic:nvPicPr>
-                    <pic:cNvPr descr="figures/fig7_sbar_macrof1.png" id="57" name="Picture"/>
+                    <pic:cNvPr descr="figures/fig7_sbar_macrof1.png" id="61" name="Picture"/>
                     <pic:cNvPicPr>
                       <a:picLocks noChangeArrowheads="1" noChangeAspect="1"/>
                     </pic:cNvPicPr>
                   </pic:nvPicPr>
                   <pic:blipFill>
-                    <a:blip r:embed="rId55"/>
+                    <a:blip r:embed="rId59"/>
                     <a:stretch>
                       <a:fillRect/>
                     </a:stretch>
@@ -17782,10 +17838,10 @@
         <w:t>SBAR handover completeness: class macro-F1 across models.</w:t>
       </w:r>
     </w:p>
-    <w:bookmarkEnd w:id="58"/>
-    <w:bookmarkEnd w:id="59"/>
-    <w:bookmarkEnd w:id="60"/>
-    <w:bookmarkStart w:id="64" w:name="s8"/>
+    <w:bookmarkEnd w:id="62"/>
+    <w:bookmarkEnd w:id="63"/>
+    <w:bookmarkEnd w:id="64"/>
+    <w:bookmarkStart w:id="68" w:name="s8"/>
     <w:p>
       <w:pPr>
         <w:pStyle w:val="Heading2"/>
@@ -17833,7 +17889,7 @@
         <w:t xml:space="preserve">replace (4.3).</w:t>
       </w:r>
     </w:p>
-    <w:bookmarkStart w:id="61" w:name="technical-limitations"/>
+    <w:bookmarkStart w:id="65" w:name="technical-limitations"/>
     <w:p>
       <w:pPr>
         <w:pStyle w:val="Heading3"/>
@@ -17986,8 +18042,8 @@
         <w:t xml:space="preserve">most trustworthy yardstick.</w:t>
       </w:r>
     </w:p>
-    <w:bookmarkEnd w:id="61"/>
-    <w:bookmarkStart w:id="62" w:name="practical-and-ethical-caveats"/>
+    <w:bookmarkEnd w:id="65"/>
+    <w:bookmarkStart w:id="66" w:name="practical-and-ethical-caveats"/>
     <w:p>
       <w:pPr>
         <w:pStyle w:val="Heading3"/>
@@ -18113,8 +18169,8 @@
         <w:t xml:space="preserve">that appear comparable may not be comparable at all.</w:t>
       </w:r>
     </w:p>
-    <w:bookmarkEnd w:id="62"/>
-    <w:bookmarkStart w:id="63" w:name="boundaries-of-the-method"/>
+    <w:bookmarkEnd w:id="66"/>
+    <w:bookmarkStart w:id="67" w:name="boundaries-of-the-method"/>
     <w:p>
       <w:pPr>
         <w:pStyle w:val="Heading3"/>
@@ -18186,9 +18242,9 @@
         <w:t xml:space="preserve">establish readiness for care.</w:t>
       </w:r>
     </w:p>
-    <w:bookmarkEnd w:id="63"/>
-    <w:bookmarkEnd w:id="64"/>
-    <w:bookmarkStart w:id="65" w:name="s9b"/>
+    <w:bookmarkEnd w:id="67"/>
+    <w:bookmarkEnd w:id="68"/>
+    <w:bookmarkStart w:id="69" w:name="s9b"/>
     <w:p>
       <w:pPr>
         <w:pStyle w:val="Heading2"/>
@@ -18610,8 +18666,8 @@
         <w:t xml:space="preserve">complete an agenda in which clinician oversight remains central.</w:t>
       </w:r>
     </w:p>
-    <w:bookmarkEnd w:id="65"/>
-    <w:bookmarkStart w:id="66" w:name="s9"/>
+    <w:bookmarkEnd w:id="69"/>
+    <w:bookmarkStart w:id="70" w:name="s9"/>
     <w:p>
       <w:pPr>
         <w:pStyle w:val="Heading2"/>
@@ -18674,48 +18730,598 @@
         <w:widowControl w:val="1"/>
       </w:pPr>
       <w:r>
-        <w:t xml:space="preserve">Read together, those studies yield a consistent picture. In several classification and extraction</w:t>
-      </w:r>
-      <w:r>
-        <w:t xml:space="preserve"> </w:t>
-      </w:r>
-      <w:r>
-        <w:t xml:space="preserve">studies, fine-tuned encoder models outperformed the evaluated zero-shot baselines on held-out synthetic</w:t>
-      </w:r>
-      <w:r>
-        <w:t xml:space="preserve"> </w:t>
-      </w:r>
-      <w:r>
-        <w:t xml:space="preserve">communication; deliberately degraded, noisy</w:t>
-      </w:r>
-      <w:r>
-        <w:t xml:space="preserve"> </w:t>
-      </w:r>
-      <w:r>
-        <w:t xml:space="preserve">synthetic communication improves robustness rather than harming it; labels fixed at generation time and</w:t>
-      </w:r>
-      <w:r>
-        <w:t xml:space="preserve"> </w:t>
-      </w:r>
-      <w:r>
-        <w:t xml:space="preserve">audited by an independent judge deliver both control and quality; and local, on-premises generators can</w:t>
-      </w:r>
-      <w:r>
-        <w:t xml:space="preserve"> </w:t>
-      </w:r>
-      <w:r>
-        <w:t xml:space="preserve">bootstrap usable datasets without exposing any real data. These are encouraging and reusable design</w:t>
-      </w:r>
-      <w:r>
-        <w:t xml:space="preserve"> </w:t>
-      </w:r>
-      <w:r>
-        <w:t xml:space="preserve">lessons, not one-off results.</w:t>
+        <w:t xml:space="preserve">Read together, those studies surface a small set of reusable design patterns (Table 19) that recur</w:t>
+      </w:r>
+      <w:r>
+        <w:t xml:space="preserve"> </w:t>
+      </w:r>
+      <w:r>
+        <w:t xml:space="preserve">across channels and tasks rather than one-off results, and that answer RQ7 directly.</w:t>
       </w:r>
     </w:p>
     <w:p>
       <w:pPr>
+        <w:pStyle w:val="TableCaption"/>
+        <w:spacing w:before="280" w:after="60" w:line="240" w:lineRule="auto"/>
+        <w:jc w:val="center"/>
+        <w:keepNext/>
+        <w:keepLines/>
+        <w:widowControl w:val="1"/>
+      </w:pPr>
+      <w:r>
+        <w:rPr>
+          <w:b/>
+          <w:i/>
+        </w:rPr>
+        <w:t>Table 19.</w:t>
+      </w:r>
+      <w:r>
+        <w:rPr>
+          <w:b w:val="0"/>
+          <w:i/>
+        </w:rPr>
+        <w:t xml:space="preserve"> </w:t>
+      </w:r>
+      <w:r>
+        <w:rPr>
+          <w:b w:val="0"/>
+          <w:i/>
+        </w:rPr>
+        <w:t>Reusable design patterns recurring across the thirteen application studies (RQ7).</w:t>
+      </w:r>
+    </w:p>
+    <w:tbl>
+      <w:tblPr>
+        <w:tblStyle w:val="Table"/>
+        <w:tblW w:type="pct" w:w="5000"/>
+        <w:jc w:val="center"/>
+        <w:tblLook w:firstRow="1" w:lastRow="0" w:firstColumn="0" w:lastColumn="0" w:noHBand="0" w:noVBand="0" w:val="0020"/>
+        <w:tblCaption w:val="Table 19. Reusable design patterns recurring across the thirteen application studies (RQ7)."/>
+        <w:tblLayout w:type="autofit"/>
+        <w:tblBorders>
+          <w:top w:val="single" w:sz="10" w:color="4F6272"/>
+          <w:bottom w:val="single" w:sz="10" w:color="4F6272"/>
+          <w:insideH w:val="single" w:sz="5" w:color="9FB0C2"/>
+          <w:left w:val="single" w:sz="6" w:color="9FB0C2"/>
+          <w:right w:val="single" w:sz="6" w:color="9FB0C2"/>
+          <w:insideV w:val="single" w:sz="5" w:color="D9E1E8"/>
+        </w:tblBorders>
+      </w:tblPr>
+      <w:tblGrid>
+        <w:gridCol w:w="2640"/>
+        <w:gridCol w:w="2640"/>
+        <w:gridCol w:w="2640"/>
+      </w:tblGrid>
+      <w:tr>
+        <w:trPr>
+          <w:tblHeader w:val="on"/>
+        </w:trPr>
+        <w:tc>
+          <w:tcPr>
+            <w:shd w:fill="EEF3F7"/>
+            <w:tcBorders>
+              <w:left w:val="nil"/>
+              <w:right w:val="nil"/>
+              <w:top w:val="nil"/>
+              <w:bottom w:val="single" w:sz="8" w:color="9FB0C2"/>
+            </w:tcBorders>
+            <w:vAlign w:val="center"/>
+          </w:tcPr>
+          <w:p>
+            <w:pPr>
+              <w:pStyle w:val="Compact"/>
+              <w:spacing w:before="0" w:after="20" w:line="240" w:lineRule="auto"/>
+              <w:jc w:val="center"/>
+              <w:keepNext w:val="0"/>
+              <w:keepLines/>
+              <w:widowControl w:val="1"/>
+            </w:pPr>
+            <w:r>
+              <w:rPr>
+                <w:rFonts w:ascii="Times New Roman" w:hAnsi="Times New Roman"/>
+                <w:b/>
+                <w:sz w:val="19"/>
+              </w:rPr>
+              <w:t xml:space="preserve">Pattern</w:t>
+            </w:r>
+          </w:p>
+        </w:tc>
+        <w:tc>
+          <w:tcPr>
+            <w:shd w:fill="EEF3F7"/>
+            <w:tcBorders>
+              <w:left w:val="nil"/>
+              <w:right w:val="nil"/>
+              <w:top w:val="nil"/>
+              <w:bottom w:val="single" w:sz="8" w:color="9FB0C2"/>
+            </w:tcBorders>
+            <w:vAlign w:val="center"/>
+          </w:tcPr>
+          <w:p>
+            <w:pPr>
+              <w:pStyle w:val="Compact"/>
+              <w:spacing w:before="0" w:after="20" w:line="240" w:lineRule="auto"/>
+              <w:jc w:val="center"/>
+              <w:keepNext w:val="0"/>
+              <w:keepLines/>
+              <w:widowControl w:val="1"/>
+            </w:pPr>
+            <w:r>
+              <w:rPr>
+                <w:rFonts w:ascii="Times New Roman" w:hAnsi="Times New Roman"/>
+                <w:b/>
+                <w:sz w:val="19"/>
+              </w:rPr>
+              <w:t xml:space="preserve">What it does</w:t>
+            </w:r>
+          </w:p>
+        </w:tc>
+        <w:tc>
+          <w:tcPr>
+            <w:shd w:fill="EEF3F7"/>
+            <w:tcBorders>
+              <w:left w:val="nil"/>
+              <w:right w:val="nil"/>
+              <w:top w:val="nil"/>
+              <w:bottom w:val="single" w:sz="8" w:color="9FB0C2"/>
+            </w:tcBorders>
+            <w:vAlign w:val="center"/>
+          </w:tcPr>
+          <w:p>
+            <w:pPr>
+              <w:pStyle w:val="Compact"/>
+              <w:spacing w:before="0" w:after="20" w:line="240" w:lineRule="auto"/>
+              <w:jc w:val="center"/>
+              <w:keepNext w:val="0"/>
+              <w:keepLines/>
+              <w:widowControl w:val="1"/>
+            </w:pPr>
+            <w:r>
+              <w:rPr>
+                <w:rFonts w:ascii="Times New Roman" w:hAnsi="Times New Roman"/>
+                <w:b/>
+                <w:sz w:val="19"/>
+              </w:rPr>
+              <w:t xml:space="preserve">Studies</w:t>
+            </w:r>
+          </w:p>
+        </w:tc>
+      </w:tr>
+      <w:tr>
+        <w:tc>
+          <w:tcPr>
+            <w:tcBorders>
+              <w:left w:val="nil"/>
+              <w:right w:val="nil"/>
+              <w:top w:val="nil"/>
+              <w:bottom w:val="single" w:sz="4" w:color="D9E1E8"/>
+            </w:tcBorders>
+            <w:vAlign w:val="center"/>
+          </w:tcPr>
+          <w:p>
+            <w:pPr>
+              <w:pStyle w:val="Compact"/>
+              <w:spacing w:before="0" w:after="20" w:line="240" w:lineRule="auto"/>
+              <w:jc w:val="center"/>
+              <w:keepNext w:val="0"/>
+              <w:keepLines/>
+              <w:widowControl w:val="1"/>
+            </w:pPr>
+            <w:r>
+              <w:rPr>
+                <w:rFonts w:ascii="Times New Roman" w:hAnsi="Times New Roman"/>
+                <w:sz w:val="19"/>
+              </w:rPr>
+              <w:t xml:space="preserve">Fine-tuned encoders over zero-shot LLMs</w:t>
+            </w:r>
+          </w:p>
+        </w:tc>
+        <w:tc>
+          <w:tcPr>
+            <w:tcBorders>
+              <w:left w:val="nil"/>
+              <w:right w:val="nil"/>
+              <w:top w:val="nil"/>
+              <w:bottom w:val="single" w:sz="4" w:color="D9E1E8"/>
+            </w:tcBorders>
+            <w:vAlign w:val="center"/>
+          </w:tcPr>
+          <w:p>
+            <w:pPr>
+              <w:pStyle w:val="Compact"/>
+              <w:spacing w:before="0" w:after="20" w:line="240" w:lineRule="auto"/>
+              <w:jc w:val="center"/>
+              <w:keepNext w:val="0"/>
+              <w:keepLines/>
+              <w:widowControl w:val="1"/>
+            </w:pPr>
+            <w:r>
+              <w:rPr>
+                <w:rFonts w:ascii="Times New Roman" w:hAnsi="Times New Roman"/>
+                <w:sz w:val="19"/>
+              </w:rPr>
+              <w:t xml:space="preserve">A small encoder fine-tuned on synthetic data outperforms the evaluated zero-shot LLM baselines on the downstream task</w:t>
+            </w:r>
+          </w:p>
+        </w:tc>
+        <w:tc>
+          <w:tcPr>
+            <w:tcBorders>
+              <w:left w:val="nil"/>
+              <w:right w:val="nil"/>
+              <w:top w:val="nil"/>
+              <w:bottom w:val="single" w:sz="4" w:color="D9E1E8"/>
+            </w:tcBorders>
+            <w:vAlign w:val="center"/>
+          </w:tcPr>
+          <w:p>
+            <w:pPr>
+              <w:pStyle w:val="Compact"/>
+              <w:spacing w:before="0" w:after="20" w:line="240" w:lineRule="auto"/>
+              <w:jc w:val="center"/>
+              <w:keepNext w:val="0"/>
+              <w:keepLines/>
+              <w:widowControl w:val="1"/>
+            </w:pPr>
+            <w:r>
+              <w:rPr>
+                <w:rFonts w:ascii="Times New Roman" w:hAnsi="Times New Roman"/>
+                <w:sz w:val="19"/>
+              </w:rPr>
+              <w:t xml:space="preserve">§3.1.1, §3.1.3, §3.3.1, §3.3.4, §3.3.5, §3.4.1, §3.4.3</w:t>
+            </w:r>
+          </w:p>
+        </w:tc>
+      </w:tr>
+      <w:tr>
+        <w:tc>
+          <w:tcPr>
+            <w:tcBorders>
+              <w:left w:val="nil"/>
+              <w:right w:val="nil"/>
+              <w:top w:val="nil"/>
+              <w:bottom w:val="single" w:sz="4" w:color="D9E1E8"/>
+            </w:tcBorders>
+            <w:vAlign w:val="center"/>
+          </w:tcPr>
+          <w:p>
+            <w:pPr>
+              <w:pStyle w:val="Compact"/>
+              <w:spacing w:before="0" w:after="20" w:line="240" w:lineRule="auto"/>
+              <w:jc w:val="center"/>
+              <w:keepNext w:val="0"/>
+              <w:keepLines/>
+              <w:widowControl w:val="1"/>
+            </w:pPr>
+            <w:r>
+              <w:rPr>
+                <w:rFonts w:ascii="Times New Roman" w:hAnsi="Times New Roman"/>
+                <w:sz w:val="19"/>
+              </w:rPr>
+              <w:t xml:space="preserve">Deliberate degradation for robustness</w:t>
+            </w:r>
+          </w:p>
+        </w:tc>
+        <w:tc>
+          <w:tcPr>
+            <w:tcBorders>
+              <w:left w:val="nil"/>
+              <w:right w:val="nil"/>
+              <w:top w:val="nil"/>
+              <w:bottom w:val="single" w:sz="4" w:color="D9E1E8"/>
+            </w:tcBorders>
+            <w:vAlign w:val="center"/>
+          </w:tcPr>
+          <w:p>
+            <w:pPr>
+              <w:pStyle w:val="Compact"/>
+              <w:spacing w:before="0" w:after="20" w:line="240" w:lineRule="auto"/>
+              <w:jc w:val="center"/>
+              <w:keepNext w:val="0"/>
+              <w:keepLines/>
+              <w:widowControl w:val="1"/>
+            </w:pPr>
+            <w:r>
+              <w:rPr>
+                <w:rFonts w:ascii="Times New Roman" w:hAnsi="Times New Roman"/>
+                <w:sz w:val="19"/>
+              </w:rPr>
+              <w:t xml:space="preserve">Injecting noise, recognition errors, or omissions into the synthetic text trains models that hold up on degraded real-world input</w:t>
+            </w:r>
+          </w:p>
+        </w:tc>
+        <w:tc>
+          <w:tcPr>
+            <w:tcBorders>
+              <w:left w:val="nil"/>
+              <w:right w:val="nil"/>
+              <w:top w:val="nil"/>
+              <w:bottom w:val="single" w:sz="4" w:color="D9E1E8"/>
+            </w:tcBorders>
+            <w:vAlign w:val="center"/>
+          </w:tcPr>
+          <w:p>
+            <w:pPr>
+              <w:pStyle w:val="Compact"/>
+              <w:spacing w:before="0" w:after="20" w:line="240" w:lineRule="auto"/>
+              <w:jc w:val="center"/>
+              <w:keepNext w:val="0"/>
+              <w:keepLines/>
+              <w:widowControl w:val="1"/>
+            </w:pPr>
+            <w:r>
+              <w:rPr>
+                <w:rFonts w:ascii="Times New Roman" w:hAnsi="Times New Roman"/>
+                <w:sz w:val="19"/>
+              </w:rPr>
+              <w:t xml:space="preserve">§3.1.1, §3.4.1, §3.4.3</w:t>
+            </w:r>
+          </w:p>
+        </w:tc>
+      </w:tr>
+      <w:tr>
+        <w:tc>
+          <w:tcPr>
+            <w:tcBorders>
+              <w:left w:val="nil"/>
+              <w:right w:val="nil"/>
+              <w:top w:val="nil"/>
+              <w:bottom w:val="single" w:sz="4" w:color="D9E1E8"/>
+            </w:tcBorders>
+            <w:vAlign w:val="center"/>
+          </w:tcPr>
+          <w:p>
+            <w:pPr>
+              <w:pStyle w:val="Compact"/>
+              <w:spacing w:before="0" w:after="20" w:line="240" w:lineRule="auto"/>
+              <w:jc w:val="center"/>
+              <w:keepNext w:val="0"/>
+              <w:keepLines/>
+              <w:widowControl w:val="1"/>
+            </w:pPr>
+            <w:r>
+              <w:rPr>
+                <w:rFonts w:ascii="Times New Roman" w:hAnsi="Times New Roman"/>
+                <w:sz w:val="19"/>
+              </w:rPr>
+              <w:t xml:space="preserve">Labels fixed at generation, audited by a judge</w:t>
+            </w:r>
+          </w:p>
+        </w:tc>
+        <w:tc>
+          <w:tcPr>
+            <w:tcBorders>
+              <w:left w:val="nil"/>
+              <w:right w:val="nil"/>
+              <w:top w:val="nil"/>
+              <w:bottom w:val="single" w:sz="4" w:color="D9E1E8"/>
+            </w:tcBorders>
+            <w:vAlign w:val="center"/>
+          </w:tcPr>
+          <w:p>
+            <w:pPr>
+              <w:pStyle w:val="Compact"/>
+              <w:spacing w:before="0" w:after="20" w:line="240" w:lineRule="auto"/>
+              <w:jc w:val="center"/>
+              <w:keepNext w:val="0"/>
+              <w:keepLines/>
+              <w:widowControl w:val="1"/>
+            </w:pPr>
+            <w:r>
+              <w:rPr>
+                <w:rFonts w:ascii="Times New Roman" w:hAnsi="Times New Roman"/>
+                <w:sz w:val="19"/>
+              </w:rPr>
+              <w:t xml:space="preserve">Gold labels are emitted with the text and an independent LLM judge audits quality, giving both control and label reliability</w:t>
+            </w:r>
+          </w:p>
+        </w:tc>
+        <w:tc>
+          <w:tcPr>
+            <w:tcBorders>
+              <w:left w:val="nil"/>
+              <w:right w:val="nil"/>
+              <w:top w:val="nil"/>
+              <w:bottom w:val="single" w:sz="4" w:color="D9E1E8"/>
+            </w:tcBorders>
+            <w:vAlign w:val="center"/>
+          </w:tcPr>
+          <w:p>
+            <w:pPr>
+              <w:pStyle w:val="Compact"/>
+              <w:spacing w:before="0" w:after="20" w:line="240" w:lineRule="auto"/>
+              <w:jc w:val="center"/>
+              <w:keepNext w:val="0"/>
+              <w:keepLines/>
+              <w:widowControl w:val="1"/>
+            </w:pPr>
+            <w:r>
+              <w:rPr>
+                <w:rFonts w:ascii="Times New Roman" w:hAnsi="Times New Roman"/>
+                <w:sz w:val="19"/>
+              </w:rPr>
+              <w:t xml:space="preserve">§3.1.2, §3.2.1, §3.3.4</w:t>
+            </w:r>
+          </w:p>
+        </w:tc>
+      </w:tr>
+      <w:tr>
+        <w:tc>
+          <w:tcPr>
+            <w:tcBorders>
+              <w:left w:val="nil"/>
+              <w:right w:val="nil"/>
+              <w:top w:val="nil"/>
+              <w:bottom w:val="single" w:sz="4" w:color="D9E1E8"/>
+            </w:tcBorders>
+            <w:vAlign w:val="center"/>
+          </w:tcPr>
+          <w:p>
+            <w:pPr>
+              <w:pStyle w:val="Compact"/>
+              <w:spacing w:before="0" w:after="20" w:line="240" w:lineRule="auto"/>
+              <w:jc w:val="center"/>
+              <w:keepNext w:val="0"/>
+              <w:keepLines/>
+              <w:widowControl w:val="1"/>
+            </w:pPr>
+            <w:r>
+              <w:rPr>
+                <w:rFonts w:ascii="Times New Roman" w:hAnsi="Times New Roman"/>
+                <w:sz w:val="19"/>
+              </w:rPr>
+              <w:t xml:space="preserve">Synthetic augmentation of rare classes</w:t>
+            </w:r>
+          </w:p>
+        </w:tc>
+        <w:tc>
+          <w:tcPr>
+            <w:tcBorders>
+              <w:left w:val="nil"/>
+              <w:right w:val="nil"/>
+              <w:top w:val="nil"/>
+              <w:bottom w:val="single" w:sz="4" w:color="D9E1E8"/>
+            </w:tcBorders>
+            <w:vAlign w:val="center"/>
+          </w:tcPr>
+          <w:p>
+            <w:pPr>
+              <w:pStyle w:val="Compact"/>
+              <w:spacing w:before="0" w:after="20" w:line="240" w:lineRule="auto"/>
+              <w:jc w:val="center"/>
+              <w:keepNext w:val="0"/>
+              <w:keepLines/>
+              <w:widowControl w:val="1"/>
+            </w:pPr>
+            <w:r>
+              <w:rPr>
+                <w:rFonts w:ascii="Times New Roman" w:hAnsi="Times New Roman"/>
+                <w:sz w:val="19"/>
+              </w:rPr>
+              <w:t xml:space="preserve">Generation up-samples the rare, high-stakes classes that real collections underrepresent, correcting severe imbalance</w:t>
+            </w:r>
+          </w:p>
+        </w:tc>
+        <w:tc>
+          <w:tcPr>
+            <w:tcBorders>
+              <w:left w:val="nil"/>
+              <w:right w:val="nil"/>
+              <w:top w:val="nil"/>
+              <w:bottom w:val="single" w:sz="4" w:color="D9E1E8"/>
+            </w:tcBorders>
+            <w:vAlign w:val="center"/>
+          </w:tcPr>
+          <w:p>
+            <w:pPr>
+              <w:pStyle w:val="Compact"/>
+              <w:spacing w:before="0" w:after="20" w:line="240" w:lineRule="auto"/>
+              <w:jc w:val="center"/>
+              <w:keepNext w:val="0"/>
+              <w:keepLines/>
+              <w:widowControl w:val="1"/>
+            </w:pPr>
+            <w:r>
+              <w:rPr>
+                <w:rFonts w:ascii="Times New Roman" w:hAnsi="Times New Roman"/>
+                <w:sz w:val="19"/>
+              </w:rPr>
+              <w:t xml:space="preserve">§3.3.2, §3.3.5</w:t>
+            </w:r>
+          </w:p>
+        </w:tc>
+      </w:tr>
+      <w:tr>
+        <w:tc>
+          <w:tcPr>
+            <w:tcBorders>
+              <w:left w:val="nil"/>
+              <w:right w:val="nil"/>
+              <w:top w:val="nil"/>
+              <w:bottom w:val="nil"/>
+            </w:tcBorders>
+            <w:vAlign w:val="center"/>
+          </w:tcPr>
+          <w:p>
+            <w:pPr>
+              <w:pStyle w:val="Compact"/>
+              <w:spacing w:before="0" w:after="20" w:line="240" w:lineRule="auto"/>
+              <w:jc w:val="center"/>
+              <w:keepNext w:val="0"/>
+              <w:keepLines/>
+              <w:widowControl w:val="1"/>
+            </w:pPr>
+            <w:r>
+              <w:rPr>
+                <w:rFonts w:ascii="Times New Roman" w:hAnsi="Times New Roman"/>
+                <w:sz w:val="19"/>
+              </w:rPr>
+              <w:t xml:space="preserve">Local, on-premises generation for privacy</w:t>
+            </w:r>
+          </w:p>
+        </w:tc>
+        <w:tc>
+          <w:tcPr>
+            <w:tcBorders>
+              <w:left w:val="nil"/>
+              <w:right w:val="nil"/>
+              <w:top w:val="nil"/>
+              <w:bottom w:val="nil"/>
+            </w:tcBorders>
+            <w:vAlign w:val="center"/>
+          </w:tcPr>
+          <w:p>
+            <w:pPr>
+              <w:pStyle w:val="Compact"/>
+              <w:spacing w:before="0" w:after="20" w:line="240" w:lineRule="auto"/>
+              <w:jc w:val="center"/>
+              <w:keepNext w:val="0"/>
+              <w:keepLines/>
+              <w:widowControl w:val="1"/>
+            </w:pPr>
+            <w:r>
+              <w:rPr>
+                <w:rFonts w:ascii="Times New Roman" w:hAnsi="Times New Roman"/>
+                <w:sz w:val="19"/>
+              </w:rPr>
+              <w:t xml:space="preserve">A local generator bootstraps a usable dataset without sending any clinical content to a hosted model</w:t>
+            </w:r>
+          </w:p>
+        </w:tc>
+        <w:tc>
+          <w:tcPr>
+            <w:tcBorders>
+              <w:left w:val="nil"/>
+              <w:right w:val="nil"/>
+              <w:top w:val="nil"/>
+              <w:bottom w:val="nil"/>
+            </w:tcBorders>
+            <w:vAlign w:val="center"/>
+          </w:tcPr>
+          <w:p>
+            <w:pPr>
+              <w:pStyle w:val="Compact"/>
+              <w:spacing w:before="0" w:after="20" w:line="240" w:lineRule="auto"/>
+              <w:jc w:val="center"/>
+              <w:keepNext w:val="0"/>
+              <w:keepLines/>
+              <w:widowControl w:val="1"/>
+            </w:pPr>
+            <w:r>
+              <w:rPr>
+                <w:rFonts w:ascii="Times New Roman" w:hAnsi="Times New Roman"/>
+                <w:sz w:val="19"/>
+              </w:rPr>
+              <w:t xml:space="preserve">§3.3.1</w:t>
+            </w:r>
+          </w:p>
+        </w:tc>
+      </w:tr>
+    </w:tbl>
+    <w:p>
+      <w:pPr>
         <w:pStyle w:val="BodyText"/>
+        <w:spacing w:before="240"/>
         <w:jc w:val="both"/>
         <w:keepNext w:val="0"/>
         <w:keepLines w:val="0"/>
@@ -18804,8 +19410,8 @@
         </w:pict>
       </w:r>
     </w:p>
-    <w:bookmarkEnd w:id="66"/>
-    <w:bookmarkStart w:id="68" w:name="data"/>
+    <w:bookmarkEnd w:id="70"/>
+    <w:bookmarkStart w:id="72" w:name="data"/>
     <w:p>
       <w:pPr>
         <w:pStyle w:val="Heading2"/>
@@ -18855,7 +19461,7 @@
       <w:r>
         <w:t xml:space="preserve">archived at Zenodo (</w:t>
       </w:r>
-      <w:hyperlink r:id="rId67">
+      <w:hyperlink r:id="rId71">
         <w:r>
           <w:rPr>
             <w:rStyle w:val="Hyperlink"/>
@@ -18892,8 +19498,8 @@
         </w:pict>
       </w:r>
     </w:p>
-    <w:bookmarkEnd w:id="68"/>
-    <w:bookmarkStart w:id="69" w:name="ack"/>
+    <w:bookmarkEnd w:id="72"/>
+    <w:bookmarkStart w:id="73" w:name="ack"/>
     <w:p>
       <w:pPr>
         <w:pStyle w:val="Heading2"/>
@@ -18948,8 +19554,8 @@
         </w:pict>
       </w:r>
     </w:p>
-    <w:bookmarkEnd w:id="69"/>
-    <w:bookmarkStart w:id="74" w:name="references"/>
+    <w:bookmarkEnd w:id="73"/>
+    <w:bookmarkStart w:id="78" w:name="references"/>
     <w:p>
       <w:pPr>
         <w:pStyle w:val="ReferencesHeading"/>
@@ -19270,7 +19876,7 @@
       <w:r>
         <w:t xml:space="preserve"> </w:t>
       </w:r>
-      <w:hyperlink r:id="rId70">
+      <w:hyperlink r:id="rId74">
         <w:r>
           <w:rPr>
             <w:rStyle w:val="Hyperlink"/>
@@ -21891,7 +22497,7 @@
       <w:r>
         <w:t xml:space="preserve"> </w:t>
       </w:r>
-      <w:hyperlink r:id="rId71">
+      <w:hyperlink r:id="rId75">
         <w:r>
           <w:rPr>
             <w:rStyle w:val="Hyperlink"/>
@@ -21923,7 +22529,7 @@
       <w:r>
         <w:t xml:space="preserve"> </w:t>
       </w:r>
-      <w:hyperlink r:id="rId72">
+      <w:hyperlink r:id="rId76">
         <w:r>
           <w:rPr>
             <w:rStyle w:val="Hyperlink"/>
@@ -22570,7 +23176,7 @@
       <w:r>
         <w:t xml:space="preserve"> </w:t>
       </w:r>
-      <w:hyperlink r:id="rId73">
+      <w:hyperlink r:id="rId77">
         <w:r>
           <w:rPr>
             <w:rStyle w:val="Hyperlink"/>
@@ -22684,10 +23290,10 @@
         <w:t xml:space="preserve">, 2026.</w:t>
       </w:r>
     </w:p>
-    <w:bookmarkEnd w:id="74"/>
-    <w:bookmarkEnd w:id="75"/>
+    <w:bookmarkEnd w:id="78"/>
+    <w:bookmarkEnd w:id="79"/>
     <w:sectPr>
-      <w:footerReference w:type="default" r:id="rId9"/>
+      <w:footerReference w:type="default" r:id="rId13"/>
       <w:pgSz w:h="15840" w:w="12240"/>
       <w:pgMar w:bottom="1440" w:footer="720" w:gutter="0" w:header="720" w:left="1440" w:right="1440" w:top="1440"/>
       <w:cols w:space="720"/>

</xml_diff>

<commit_message>
Strengthen thesis + framing: add prior-review coverage table (Table 1, renumber 2-20); quantify S->S/S->R regime split and marshal external S->R transfer evidence (i2b2 [79], synthetic-NER [109]); corroborate encoder>zero-shot on real text [110]; add Survey scope-and-method paragraph (feasibility/channel-novelty reframe); fix [79] Woo attribution; rebuild DOCX+PDF
110 refs / 110 cites aligned; Tables 1-20 no orphans; wins-only clean; em-dash 0; new refs Crossref-verified.
Co-Authored-By: Claude Opus 4.8 <noreply@anthropic.com>
</commit_message>
<xml_diff>
--- a/paper-1col.docx
+++ b/paper-1col.docx
@@ -1012,275 +1012,7 @@
         <w:t xml:space="preserve"> </w:t>
       </w:r>
       <w:r>
-        <w:t xml:space="preserve">here.</w:t>
-      </w:r>
-    </w:p>
-    <w:bookmarkEnd w:id="13"/>
-    <w:bookmarkStart w:id="25" w:name="s2"/>
-    <w:p>
-      <w:pPr>
-        <w:pStyle w:val="Heading2"/>
-        <w:keepNext/>
-        <w:keepLines/>
-        <w:widowControl w:val="1"/>
-      </w:pPr>
-      <w:r>
-        <w:t xml:space="preserve">2  Literature Review</w:t>
-      </w:r>
-    </w:p>
-    <w:p>
-      <w:pPr>
-        <w:pStyle w:val="FirstParagraph"/>
-        <w:jc w:val="both"/>
-        <w:keepNext w:val="0"/>
-        <w:keepLines w:val="0"/>
-        <w:widowControl w:val="1"/>
-      </w:pPr>
-      <w:r>
-        <w:t xml:space="preserve">This section reviews the field in four parts: the modalities of clinical communication and</w:t>
-      </w:r>
-      <w:r>
-        <w:t xml:space="preserve"> </w:t>
-      </w:r>
-      <w:r>
-        <w:t xml:space="preserve">the tasks they support (2.1); how large language models generate synthetic clinical communication (2.2);</w:t>
-      </w:r>
-      <w:r>
-        <w:t xml:space="preserve"> </w:t>
-      </w:r>
-      <w:r>
-        <w:t xml:space="preserve">how such data is evaluated (2.3); and what the literature reports, organized by downstream task (2.4).</w:t>
-      </w:r>
-    </w:p>
-    <w:p>
-      <w:pPr>
-        <w:pStyle w:val="BodyText"/>
-        <w:jc w:val="both"/>
-        <w:keepNext w:val="0"/>
-        <w:keepLines w:val="0"/>
-        <w:widowControl w:val="1"/>
-      </w:pPr>
-      <w:r>
-        <w:t xml:space="preserve">Efforts to unlock the value in clinical communication predate synthetic data. Ambient systems that turn a</w:t>
-      </w:r>
-      <w:r>
-        <w:t xml:space="preserve"> </w:t>
-      </w:r>
-      <w:r>
-        <w:t xml:space="preserve">recorded consultation into a note, together with their benchmarks and shared tasks</w:t>
-      </w:r>
-      <w:r>
-        <w:rPr>
-          <w:vertAlign w:val="superscript"/>
-        </w:rPr>
-        <w:t xml:space="preserve">[27,33,34,58]</w:t>
-      </w:r>
-      <w:r>
-        <w:t xml:space="preserve">,</w:t>
-      </w:r>
-      <w:r>
-        <w:t xml:space="preserve"> </w:t>
-      </w:r>
-      <w:r>
-        <w:t xml:space="preserve">are now moving into practice as clinician-facing scribes</w:t>
-      </w:r>
-      <w:r>
-        <w:rPr>
-          <w:vertAlign w:val="superscript"/>
-        </w:rPr>
-        <w:t xml:space="preserve">[93]</w:t>
-      </w:r>
-      <w:r>
-        <w:t xml:space="preserve">. Information extraction</w:t>
-      </w:r>
-      <w:r>
-        <w:t xml:space="preserve"> </w:t>
-      </w:r>
-      <w:r>
-        <w:t xml:space="preserve">has been applied to paramedic narratives</w:t>
-      </w:r>
-      <w:r>
-        <w:rPr>
-          <w:vertAlign w:val="superscript"/>
-        </w:rPr>
-        <w:t xml:space="preserve">[94]</w:t>
-      </w:r>
-      <w:r>
-        <w:t xml:space="preserve"> </w:t>
-      </w:r>
-      <w:r>
-        <w:t xml:space="preserve">and, in emergency medicine more</w:t>
-      </w:r>
-      <w:r>
-        <w:t xml:space="preserve"> </w:t>
-      </w:r>
-      <w:r>
-        <w:t xml:space="preserve">broadly, is the subject of dedicated reviews</w:t>
-      </w:r>
-      <w:r>
-        <w:rPr>
-          <w:vertAlign w:val="superscript"/>
-        </w:rPr>
-        <w:t xml:space="preserve">[95,96]</w:t>
-      </w:r>
-      <w:r>
-        <w:t xml:space="preserve">; machine learning on the audio</w:t>
-      </w:r>
-      <w:r>
-        <w:t xml:space="preserve"> </w:t>
-      </w:r>
-      <w:r>
-        <w:t xml:space="preserve">and language of emergency calls has improved dispatcher recognition of cardiac arrest in a randomized</w:t>
-      </w:r>
-      <w:r>
-        <w:t xml:space="preserve"> </w:t>
-      </w:r>
-      <w:r>
-        <w:t xml:space="preserve">trial</w:t>
-      </w:r>
-      <w:r>
-        <w:rPr>
-          <w:vertAlign w:val="superscript"/>
-        </w:rPr>
-        <w:t xml:space="preserve">[91,92]</w:t>
-      </w:r>
-      <w:r>
-        <w:t xml:space="preserve">; and patient-portal messages are increasingly triaged and routed</w:t>
-      </w:r>
-      <w:r>
-        <w:t xml:space="preserve"> </w:t>
-      </w:r>
-      <w:r>
-        <w:t xml:space="preserve">automatically</w:t>
-      </w:r>
-      <w:r>
-        <w:rPr>
-          <w:vertAlign w:val="superscript"/>
-        </w:rPr>
-        <w:t xml:space="preserve">[97]</w:t>
-      </w:r>
-      <w:r>
-        <w:t xml:space="preserve">. What these lines share is a dependence on scarce,</w:t>
-      </w:r>
-      <w:r>
-        <w:t xml:space="preserve"> </w:t>
-      </w:r>
-      <w:r>
-        <w:t xml:space="preserve">privacy-restricted real communication for training and evaluation, the bottleneck that synthetic</w:t>
-      </w:r>
-      <w:r>
-        <w:t xml:space="preserve"> </w:t>
-      </w:r>
-      <w:r>
-        <w:t xml:space="preserve">generation, the subject of this survey, sets out to relieve.</w:t>
-      </w:r>
-    </w:p>
-    <w:bookmarkStart w:id="17" w:name="clinical-communication-in-healthcare-ai"/>
-    <w:p>
-      <w:pPr>
-        <w:pStyle w:val="Heading3"/>
-        <w:keepNext/>
-        <w:keepLines/>
-        <w:widowControl w:val="1"/>
-      </w:pPr>
-      <w:r>
-        <w:t xml:space="preserve">2.1  Clinical Communication in Healthcare AI</w:t>
-      </w:r>
-    </w:p>
-    <w:bookmarkStart w:id="14" w:name="modalities-of-clinical-communication"/>
-    <w:p>
-      <w:pPr>
-        <w:pStyle w:val="Heading4"/>
-        <w:keepNext/>
-        <w:keepLines/>
-        <w:widowControl w:val="1"/>
-      </w:pPr>
-      <w:r>
-        <w:t xml:space="preserve">2.1.1  Modalities of Clinical Communication</w:t>
-      </w:r>
-    </w:p>
-    <w:p>
-      <w:pPr>
-        <w:pStyle w:val="FirstParagraph"/>
-        <w:jc w:val="both"/>
-        <w:keepNext w:val="0"/>
-        <w:keepLines w:val="0"/>
-        <w:widowControl w:val="1"/>
-      </w:pPr>
-      <w:r>
-        <w:t xml:space="preserve">Clinical communication comprises a family of channels, each defined by who is</w:t>
-      </w:r>
-      <w:r>
-        <w:t xml:space="preserve"> </w:t>
-      </w:r>
-      <w:r>
-        <w:t xml:space="preserve">speaking to whom, under what time pressure, and through what medium, and each with its own</w:t>
-      </w:r>
-      <w:r>
-        <w:t xml:space="preserve"> </w:t>
-      </w:r>
-      <w:r>
-        <w:t xml:space="preserve">characteristic way. A patient–clinician conversation is a two-party, turn-taking exchange in which</w:t>
-      </w:r>
-      <w:r>
-        <w:t xml:space="preserve"> </w:t>
-      </w:r>
-      <w:r>
-        <w:t xml:space="preserve">the clinician steers while the patient supplies symptoms, often in lay, emotional, or incomplete terms.</w:t>
-      </w:r>
-      <w:r>
-        <w:t xml:space="preserve"> </w:t>
-      </w:r>
-      <w:r>
-        <w:t xml:space="preserve">Doctor-to-patient instructions run the other way: discharge summaries, follow-up plans, and medication</w:t>
-      </w:r>
-      <w:r>
-        <w:t xml:space="preserve"> </w:t>
-      </w:r>
-      <w:r>
-        <w:t xml:space="preserve">guidance are largely one-directional and are addressed as much to the next provider as to the patient.</w:t>
-      </w:r>
-      <w:r>
-        <w:t xml:space="preserve"> </w:t>
-      </w:r>
-      <w:r>
-        <w:t xml:space="preserve">Telemedicine consultations move these encounters onto remote text or voice, adding transcription and</w:t>
-      </w:r>
-      <w:r>
-        <w:t xml:space="preserve"> </w:t>
-      </w:r>
-      <w:r>
-        <w:t xml:space="preserve">connectivity artifacts. Paramedic-to-hospital communication and emergency dispatch are terse, urgent, and</w:t>
-      </w:r>
-      <w:r>
-        <w:t xml:space="preserve"> </w:t>
-      </w:r>
-      <w:r>
-        <w:t xml:space="preserve">spoken over noise, burdened further by automatic-speech-recognition errors and, in the field, by radio</w:t>
-      </w:r>
-      <w:r>
-        <w:t xml:space="preserve"> </w:t>
-      </w:r>
-      <w:r>
-        <w:t xml:space="preserve">dropouts. Nurse and clinician handoffs, epitomized by the SBAR format, are structured precisely because</w:t>
-      </w:r>
-      <w:r>
-        <w:t xml:space="preserve"> </w:t>
-      </w:r>
-      <w:r>
-        <w:t xml:space="preserve">omissions at transfer are a leading source of harm. Patient-portal messaging, finally, is asynchronous and</w:t>
-      </w:r>
-      <w:r>
-        <w:t xml:space="preserve"> </w:t>
-      </w:r>
-      <w:r>
-        <w:t xml:space="preserve">patient-initiated, arriving in short, informal, error-strewn bursts. Table 1 sets these channels</w:t>
-      </w:r>
-      <w:r>
-        <w:t xml:space="preserve"> </w:t>
-      </w:r>
-      <w:r>
-        <w:t xml:space="preserve">against the dimensions that matter for generation and modeling.</w:t>
+        <w:t xml:space="preserve">here. Table 1 sets this survey against the closest prior reviews.</w:t>
       </w:r>
     </w:p>
     <w:p>
@@ -1311,7 +1043,7 @@
           <w:b w:val="0"/>
           <w:i/>
         </w:rPr>
-        <w:t>Modalities of clinical communication and their defining properties; the final column links each channel to the application studies in Section 3.</w:t>
+        <w:t>Coverage of the closest prior reviews. No prior review organizes the field by clinical-communication channel across the full set, and none pairs the survey with its own application studies.</w:t>
       </w:r>
     </w:p>
     <w:tbl>
@@ -1320,7 +1052,1223 @@
         <w:tblW w:type="pct" w:w="5000"/>
         <w:jc w:val="center"/>
         <w:tblLook w:firstRow="1" w:lastRow="0" w:firstColumn="0" w:lastColumn="0" w:noHBand="0" w:noVBand="0" w:val="0020"/>
-        <w:tblCaption w:val="Table 1. Modalities of clinical communication and their defining properties; the final column links each channel to the application studies in Section 3."/>
+        <w:tblCaption w:val="Table 1. Coverage of the closest prior reviews. No prior review organizes the field by clinical-communication channel across the full set, and none pairs the survey with its own application studies."/>
+        <w:tblLayout w:type="autofit"/>
+        <w:tblBorders>
+          <w:top w:val="single" w:sz="10" w:color="4F6272"/>
+          <w:bottom w:val="single" w:sz="10" w:color="4F6272"/>
+          <w:insideH w:val="single" w:sz="5" w:color="9FB0C2"/>
+          <w:left w:val="single" w:sz="6" w:color="9FB0C2"/>
+          <w:right w:val="single" w:sz="6" w:color="9FB0C2"/>
+          <w:insideV w:val="single" w:sz="5" w:color="D9E1E8"/>
+        </w:tblBorders>
+      </w:tblPr>
+      <w:tblGrid>
+        <w:gridCol w:w="1980"/>
+        <w:gridCol w:w="1980"/>
+        <w:gridCol w:w="1980"/>
+        <w:gridCol w:w="1980"/>
+      </w:tblGrid>
+      <w:tr>
+        <w:trPr>
+          <w:tblHeader w:val="on"/>
+        </w:trPr>
+        <w:tc>
+          <w:tcPr>
+            <w:shd w:fill="EEF3F7"/>
+            <w:tcBorders>
+              <w:left w:val="nil"/>
+              <w:right w:val="nil"/>
+              <w:top w:val="nil"/>
+              <w:bottom w:val="single" w:sz="8" w:color="9FB0C2"/>
+            </w:tcBorders>
+            <w:vAlign w:val="center"/>
+          </w:tcPr>
+          <w:p>
+            <w:pPr>
+              <w:pStyle w:val="Compact"/>
+              <w:spacing w:before="0" w:after="20" w:line="240" w:lineRule="auto"/>
+              <w:jc w:val="center"/>
+              <w:keepNext w:val="0"/>
+              <w:keepLines/>
+              <w:widowControl w:val="1"/>
+            </w:pPr>
+            <w:r>
+              <w:rPr>
+                <w:rFonts w:ascii="Times New Roman" w:hAnsi="Times New Roman"/>
+                <w:b/>
+                <w:sz w:val="19"/>
+              </w:rPr>
+              <w:t xml:space="preserve">Review</w:t>
+            </w:r>
+          </w:p>
+        </w:tc>
+        <w:tc>
+          <w:tcPr>
+            <w:shd w:fill="EEF3F7"/>
+            <w:tcBorders>
+              <w:left w:val="nil"/>
+              <w:right w:val="nil"/>
+              <w:top w:val="nil"/>
+              <w:bottom w:val="single" w:sz="8" w:color="9FB0C2"/>
+            </w:tcBorders>
+            <w:vAlign w:val="center"/>
+          </w:tcPr>
+          <w:p>
+            <w:pPr>
+              <w:pStyle w:val="Compact"/>
+              <w:spacing w:before="0" w:after="20" w:line="240" w:lineRule="auto"/>
+              <w:jc w:val="center"/>
+              <w:keepNext w:val="0"/>
+              <w:keepLines/>
+              <w:widowControl w:val="1"/>
+            </w:pPr>
+            <w:r>
+              <w:rPr>
+                <w:rFonts w:ascii="Times New Roman" w:hAnsi="Times New Roman"/>
+                <w:b/>
+                <w:sz w:val="19"/>
+              </w:rPr>
+              <w:t xml:space="preserve">Channels covered</w:t>
+            </w:r>
+          </w:p>
+        </w:tc>
+        <w:tc>
+          <w:tcPr>
+            <w:shd w:fill="EEF3F7"/>
+            <w:tcBorders>
+              <w:left w:val="nil"/>
+              <w:right w:val="nil"/>
+              <w:top w:val="nil"/>
+              <w:bottom w:val="single" w:sz="8" w:color="9FB0C2"/>
+            </w:tcBorders>
+            <w:vAlign w:val="center"/>
+          </w:tcPr>
+          <w:p>
+            <w:pPr>
+              <w:pStyle w:val="Compact"/>
+              <w:spacing w:before="0" w:after="20" w:line="240" w:lineRule="auto"/>
+              <w:jc w:val="center"/>
+              <w:keepNext w:val="0"/>
+              <w:keepLines/>
+              <w:widowControl w:val="1"/>
+            </w:pPr>
+            <w:r>
+              <w:rPr>
+                <w:rFonts w:ascii="Times New Roman" w:hAnsi="Times New Roman"/>
+                <w:b/>
+                <w:sz w:val="19"/>
+              </w:rPr>
+              <w:t xml:space="preserve">Maps real vs synthetic?</w:t>
+            </w:r>
+          </w:p>
+        </w:tc>
+        <w:tc>
+          <w:tcPr>
+            <w:shd w:fill="EEF3F7"/>
+            <w:tcBorders>
+              <w:left w:val="nil"/>
+              <w:right w:val="nil"/>
+              <w:top w:val="nil"/>
+              <w:bottom w:val="single" w:sz="8" w:color="9FB0C2"/>
+            </w:tcBorders>
+            <w:vAlign w:val="center"/>
+          </w:tcPr>
+          <w:p>
+            <w:pPr>
+              <w:pStyle w:val="Compact"/>
+              <w:spacing w:before="0" w:after="20" w:line="240" w:lineRule="auto"/>
+              <w:jc w:val="center"/>
+              <w:keepNext w:val="0"/>
+              <w:keepLines/>
+              <w:widowControl w:val="1"/>
+            </w:pPr>
+            <w:r>
+              <w:rPr>
+                <w:rFonts w:ascii="Times New Roman" w:hAnsi="Times New Roman"/>
+                <w:b/>
+                <w:sz w:val="19"/>
+              </w:rPr>
+              <w:t xml:space="preserve">Own application studies?</w:t>
+            </w:r>
+          </w:p>
+        </w:tc>
+      </w:tr>
+      <w:tr>
+        <w:tc>
+          <w:tcPr>
+            <w:tcBorders>
+              <w:left w:val="nil"/>
+              <w:right w:val="nil"/>
+              <w:top w:val="nil"/>
+              <w:bottom w:val="single" w:sz="4" w:color="D9E1E8"/>
+            </w:tcBorders>
+            <w:vAlign w:val="center"/>
+          </w:tcPr>
+          <w:p>
+            <w:pPr>
+              <w:pStyle w:val="Compact"/>
+              <w:spacing w:before="0" w:after="20" w:line="240" w:lineRule="auto"/>
+              <w:jc w:val="center"/>
+              <w:keepNext w:val="0"/>
+              <w:keepLines/>
+              <w:widowControl w:val="1"/>
+            </w:pPr>
+            <w:r>
+              <w:rPr>
+                <w:rFonts w:ascii="Times New Roman" w:hAnsi="Times New Roman"/>
+                <w:sz w:val="19"/>
+              </w:rPr>
+              <w:t xml:space="preserve">Loni et al. [21]</w:t>
+            </w:r>
+          </w:p>
+        </w:tc>
+        <w:tc>
+          <w:tcPr>
+            <w:tcBorders>
+              <w:left w:val="nil"/>
+              <w:right w:val="nil"/>
+              <w:top w:val="nil"/>
+              <w:bottom w:val="single" w:sz="4" w:color="D9E1E8"/>
+            </w:tcBorders>
+            <w:vAlign w:val="center"/>
+          </w:tcPr>
+          <w:p>
+            <w:pPr>
+              <w:pStyle w:val="Compact"/>
+              <w:spacing w:before="0" w:after="20" w:line="240" w:lineRule="auto"/>
+              <w:jc w:val="center"/>
+              <w:keepNext w:val="0"/>
+              <w:keepLines/>
+              <w:widowControl w:val="1"/>
+            </w:pPr>
+            <w:r>
+              <w:rPr>
+                <w:rFonts w:ascii="Times New Roman" w:hAnsi="Times New Roman"/>
+                <w:sz w:val="19"/>
+              </w:rPr>
+              <w:t xml:space="preserve">Text as one generic modality</w:t>
+            </w:r>
+          </w:p>
+        </w:tc>
+        <w:tc>
+          <w:tcPr>
+            <w:tcBorders>
+              <w:left w:val="nil"/>
+              <w:right w:val="nil"/>
+              <w:top w:val="nil"/>
+              <w:bottom w:val="single" w:sz="4" w:color="D9E1E8"/>
+            </w:tcBorders>
+            <w:vAlign w:val="center"/>
+          </w:tcPr>
+          <w:p>
+            <w:pPr>
+              <w:pStyle w:val="Compact"/>
+              <w:spacing w:before="0" w:after="20" w:line="240" w:lineRule="auto"/>
+              <w:jc w:val="center"/>
+              <w:keepNext w:val="0"/>
+              <w:keepLines/>
+              <w:widowControl w:val="1"/>
+            </w:pPr>
+            <w:r>
+              <w:rPr>
+                <w:rFonts w:ascii="Times New Roman" w:hAnsi="Times New Roman"/>
+                <w:sz w:val="19"/>
+              </w:rPr>
+              <w:t xml:space="preserve">Partial</w:t>
+            </w:r>
+          </w:p>
+        </w:tc>
+        <w:tc>
+          <w:tcPr>
+            <w:tcBorders>
+              <w:left w:val="nil"/>
+              <w:right w:val="nil"/>
+              <w:top w:val="nil"/>
+              <w:bottom w:val="single" w:sz="4" w:color="D9E1E8"/>
+            </w:tcBorders>
+            <w:vAlign w:val="center"/>
+          </w:tcPr>
+          <w:p>
+            <w:pPr>
+              <w:pStyle w:val="Compact"/>
+              <w:spacing w:before="0" w:after="20" w:line="240" w:lineRule="auto"/>
+              <w:jc w:val="center"/>
+              <w:keepNext w:val="0"/>
+              <w:keepLines/>
+              <w:widowControl w:val="1"/>
+            </w:pPr>
+            <w:r>
+              <w:rPr>
+                <w:rFonts w:ascii="Times New Roman" w:hAnsi="Times New Roman"/>
+                <w:sz w:val="19"/>
+              </w:rPr>
+              <w:t xml:space="preserve">No</w:t>
+            </w:r>
+          </w:p>
+        </w:tc>
+      </w:tr>
+      <w:tr>
+        <w:tc>
+          <w:tcPr>
+            <w:tcBorders>
+              <w:left w:val="nil"/>
+              <w:right w:val="nil"/>
+              <w:top w:val="nil"/>
+              <w:bottom w:val="single" w:sz="4" w:color="D9E1E8"/>
+            </w:tcBorders>
+            <w:vAlign w:val="center"/>
+          </w:tcPr>
+          <w:p>
+            <w:pPr>
+              <w:pStyle w:val="Compact"/>
+              <w:spacing w:before="0" w:after="20" w:line="240" w:lineRule="auto"/>
+              <w:jc w:val="center"/>
+              <w:keepNext w:val="0"/>
+              <w:keepLines/>
+              <w:widowControl w:val="1"/>
+            </w:pPr>
+            <w:r>
+              <w:rPr>
+                <w:rFonts w:ascii="Times New Roman" w:hAnsi="Times New Roman"/>
+                <w:sz w:val="19"/>
+              </w:rPr>
+              <w:t xml:space="preserve">Ibrahim et al. [22]</w:t>
+            </w:r>
+          </w:p>
+        </w:tc>
+        <w:tc>
+          <w:tcPr>
+            <w:tcBorders>
+              <w:left w:val="nil"/>
+              <w:right w:val="nil"/>
+              <w:top w:val="nil"/>
+              <w:bottom w:val="single" w:sz="4" w:color="D9E1E8"/>
+            </w:tcBorders>
+            <w:vAlign w:val="center"/>
+          </w:tcPr>
+          <w:p>
+            <w:pPr>
+              <w:pStyle w:val="Compact"/>
+              <w:spacing w:before="0" w:after="20" w:line="240" w:lineRule="auto"/>
+              <w:jc w:val="center"/>
+              <w:keepNext w:val="0"/>
+              <w:keepLines/>
+              <w:widowControl w:val="1"/>
+            </w:pPr>
+            <w:r>
+              <w:rPr>
+                <w:rFonts w:ascii="Times New Roman" w:hAnsi="Times New Roman"/>
+                <w:sz w:val="19"/>
+              </w:rPr>
+              <w:t xml:space="preserve">Text among several modalities</w:t>
+            </w:r>
+          </w:p>
+        </w:tc>
+        <w:tc>
+          <w:tcPr>
+            <w:tcBorders>
+              <w:left w:val="nil"/>
+              <w:right w:val="nil"/>
+              <w:top w:val="nil"/>
+              <w:bottom w:val="single" w:sz="4" w:color="D9E1E8"/>
+            </w:tcBorders>
+            <w:vAlign w:val="center"/>
+          </w:tcPr>
+          <w:p>
+            <w:pPr>
+              <w:pStyle w:val="Compact"/>
+              <w:spacing w:before="0" w:after="20" w:line="240" w:lineRule="auto"/>
+              <w:jc w:val="center"/>
+              <w:keepNext w:val="0"/>
+              <w:keepLines/>
+              <w:widowControl w:val="1"/>
+            </w:pPr>
+            <w:r>
+              <w:rPr>
+                <w:rFonts w:ascii="Times New Roman" w:hAnsi="Times New Roman"/>
+                <w:sz w:val="19"/>
+              </w:rPr>
+              <w:t xml:space="preserve">No</w:t>
+            </w:r>
+          </w:p>
+        </w:tc>
+        <w:tc>
+          <w:tcPr>
+            <w:tcBorders>
+              <w:left w:val="nil"/>
+              <w:right w:val="nil"/>
+              <w:top w:val="nil"/>
+              <w:bottom w:val="single" w:sz="4" w:color="D9E1E8"/>
+            </w:tcBorders>
+            <w:vAlign w:val="center"/>
+          </w:tcPr>
+          <w:p>
+            <w:pPr>
+              <w:pStyle w:val="Compact"/>
+              <w:spacing w:before="0" w:after="20" w:line="240" w:lineRule="auto"/>
+              <w:jc w:val="center"/>
+              <w:keepNext w:val="0"/>
+              <w:keepLines/>
+              <w:widowControl w:val="1"/>
+            </w:pPr>
+            <w:r>
+              <w:rPr>
+                <w:rFonts w:ascii="Times New Roman" w:hAnsi="Times New Roman"/>
+                <w:sz w:val="19"/>
+              </w:rPr>
+              <w:t xml:space="preserve">No</w:t>
+            </w:r>
+          </w:p>
+        </w:tc>
+      </w:tr>
+      <w:tr>
+        <w:tc>
+          <w:tcPr>
+            <w:tcBorders>
+              <w:left w:val="nil"/>
+              <w:right w:val="nil"/>
+              <w:top w:val="nil"/>
+              <w:bottom w:val="single" w:sz="4" w:color="D9E1E8"/>
+            </w:tcBorders>
+            <w:vAlign w:val="center"/>
+          </w:tcPr>
+          <w:p>
+            <w:pPr>
+              <w:pStyle w:val="Compact"/>
+              <w:spacing w:before="0" w:after="20" w:line="240" w:lineRule="auto"/>
+              <w:jc w:val="center"/>
+              <w:keepNext w:val="0"/>
+              <w:keepLines/>
+              <w:widowControl w:val="1"/>
+            </w:pPr>
+            <w:r>
+              <w:rPr>
+                <w:rFonts w:ascii="Times New Roman" w:hAnsi="Times New Roman"/>
+                <w:sz w:val="19"/>
+              </w:rPr>
+              <w:t xml:space="preserve">Liu et al. [25]</w:t>
+            </w:r>
+          </w:p>
+        </w:tc>
+        <w:tc>
+          <w:tcPr>
+            <w:tcBorders>
+              <w:left w:val="nil"/>
+              <w:right w:val="nil"/>
+              <w:top w:val="nil"/>
+              <w:bottom w:val="single" w:sz="4" w:color="D9E1E8"/>
+            </w:tcBorders>
+            <w:vAlign w:val="center"/>
+          </w:tcPr>
+          <w:p>
+            <w:pPr>
+              <w:pStyle w:val="Compact"/>
+              <w:spacing w:before="0" w:after="20" w:line="240" w:lineRule="auto"/>
+              <w:jc w:val="center"/>
+              <w:keepNext w:val="0"/>
+              <w:keepLines/>
+              <w:widowControl w:val="1"/>
+            </w:pPr>
+            <w:r>
+              <w:rPr>
+                <w:rFonts w:ascii="Times New Roman" w:hAnsi="Times New Roman"/>
+                <w:sz w:val="19"/>
+              </w:rPr>
+              <w:t xml:space="preserve">Patient–clinician dialogue only</w:t>
+            </w:r>
+          </w:p>
+        </w:tc>
+        <w:tc>
+          <w:tcPr>
+            <w:tcBorders>
+              <w:left w:val="nil"/>
+              <w:right w:val="nil"/>
+              <w:top w:val="nil"/>
+              <w:bottom w:val="single" w:sz="4" w:color="D9E1E8"/>
+            </w:tcBorders>
+            <w:vAlign w:val="center"/>
+          </w:tcPr>
+          <w:p>
+            <w:pPr>
+              <w:pStyle w:val="Compact"/>
+              <w:spacing w:before="0" w:after="20" w:line="240" w:lineRule="auto"/>
+              <w:jc w:val="center"/>
+              <w:keepNext w:val="0"/>
+              <w:keepLines/>
+              <w:widowControl w:val="1"/>
+            </w:pPr>
+            <w:r>
+              <w:rPr>
+                <w:rFonts w:ascii="Times New Roman" w:hAnsi="Times New Roman"/>
+                <w:sz w:val="19"/>
+              </w:rPr>
+              <w:t xml:space="preserve">No</w:t>
+            </w:r>
+          </w:p>
+        </w:tc>
+        <w:tc>
+          <w:tcPr>
+            <w:tcBorders>
+              <w:left w:val="nil"/>
+              <w:right w:val="nil"/>
+              <w:top w:val="nil"/>
+              <w:bottom w:val="single" w:sz="4" w:color="D9E1E8"/>
+            </w:tcBorders>
+            <w:vAlign w:val="center"/>
+          </w:tcPr>
+          <w:p>
+            <w:pPr>
+              <w:pStyle w:val="Compact"/>
+              <w:spacing w:before="0" w:after="20" w:line="240" w:lineRule="auto"/>
+              <w:jc w:val="center"/>
+              <w:keepNext w:val="0"/>
+              <w:keepLines/>
+              <w:widowControl w:val="1"/>
+            </w:pPr>
+            <w:r>
+              <w:rPr>
+                <w:rFonts w:ascii="Times New Roman" w:hAnsi="Times New Roman"/>
+                <w:sz w:val="19"/>
+              </w:rPr>
+              <w:t xml:space="preserve">No</w:t>
+            </w:r>
+          </w:p>
+        </w:tc>
+      </w:tr>
+      <w:tr>
+        <w:tc>
+          <w:tcPr>
+            <w:tcBorders>
+              <w:left w:val="nil"/>
+              <w:right w:val="nil"/>
+              <w:top w:val="nil"/>
+              <w:bottom w:val="single" w:sz="4" w:color="D9E1E8"/>
+            </w:tcBorders>
+            <w:vAlign w:val="center"/>
+          </w:tcPr>
+          <w:p>
+            <w:pPr>
+              <w:pStyle w:val="Compact"/>
+              <w:spacing w:before="0" w:after="20" w:line="240" w:lineRule="auto"/>
+              <w:jc w:val="center"/>
+              <w:keepNext w:val="0"/>
+              <w:keepLines/>
+              <w:widowControl w:val="1"/>
+            </w:pPr>
+            <w:r>
+              <w:rPr>
+                <w:rFonts w:ascii="Times New Roman" w:hAnsi="Times New Roman"/>
+                <w:sz w:val="19"/>
+              </w:rPr>
+              <w:t xml:space="preserve">Rujas et al. [36]</w:t>
+            </w:r>
+          </w:p>
+        </w:tc>
+        <w:tc>
+          <w:tcPr>
+            <w:tcBorders>
+              <w:left w:val="nil"/>
+              <w:right w:val="nil"/>
+              <w:top w:val="nil"/>
+              <w:bottom w:val="single" w:sz="4" w:color="D9E1E8"/>
+            </w:tcBorders>
+            <w:vAlign w:val="center"/>
+          </w:tcPr>
+          <w:p>
+            <w:pPr>
+              <w:pStyle w:val="Compact"/>
+              <w:spacing w:before="0" w:after="20" w:line="240" w:lineRule="auto"/>
+              <w:jc w:val="center"/>
+              <w:keepNext w:val="0"/>
+              <w:keepLines/>
+              <w:widowControl w:val="1"/>
+            </w:pPr>
+            <w:r>
+              <w:rPr>
+                <w:rFonts w:ascii="Times New Roman" w:hAnsi="Times New Roman"/>
+                <w:sz w:val="19"/>
+              </w:rPr>
+              <w:t xml:space="preserve">Review of reviews; no channel structure</w:t>
+            </w:r>
+          </w:p>
+        </w:tc>
+        <w:tc>
+          <w:tcPr>
+            <w:tcBorders>
+              <w:left w:val="nil"/>
+              <w:right w:val="nil"/>
+              <w:top w:val="nil"/>
+              <w:bottom w:val="single" w:sz="4" w:color="D9E1E8"/>
+            </w:tcBorders>
+            <w:vAlign w:val="center"/>
+          </w:tcPr>
+          <w:p>
+            <w:pPr>
+              <w:pStyle w:val="Compact"/>
+              <w:spacing w:before="0" w:after="20" w:line="240" w:lineRule="auto"/>
+              <w:jc w:val="center"/>
+              <w:keepNext w:val="0"/>
+              <w:keepLines/>
+              <w:widowControl w:val="1"/>
+            </w:pPr>
+            <w:r>
+              <w:rPr>
+                <w:rFonts w:ascii="Times New Roman" w:hAnsi="Times New Roman"/>
+                <w:sz w:val="19"/>
+              </w:rPr>
+              <w:t xml:space="preserve">No</w:t>
+            </w:r>
+          </w:p>
+        </w:tc>
+        <w:tc>
+          <w:tcPr>
+            <w:tcBorders>
+              <w:left w:val="nil"/>
+              <w:right w:val="nil"/>
+              <w:top w:val="nil"/>
+              <w:bottom w:val="single" w:sz="4" w:color="D9E1E8"/>
+            </w:tcBorders>
+            <w:vAlign w:val="center"/>
+          </w:tcPr>
+          <w:p>
+            <w:pPr>
+              <w:pStyle w:val="Compact"/>
+              <w:spacing w:before="0" w:after="20" w:line="240" w:lineRule="auto"/>
+              <w:jc w:val="center"/>
+              <w:keepNext w:val="0"/>
+              <w:keepLines/>
+              <w:widowControl w:val="1"/>
+            </w:pPr>
+            <w:r>
+              <w:rPr>
+                <w:rFonts w:ascii="Times New Roman" w:hAnsi="Times New Roman"/>
+                <w:sz w:val="19"/>
+              </w:rPr>
+              <w:t xml:space="preserve">No</w:t>
+            </w:r>
+          </w:p>
+        </w:tc>
+      </w:tr>
+      <w:tr>
+        <w:tc>
+          <w:tcPr>
+            <w:tcBorders>
+              <w:left w:val="nil"/>
+              <w:right w:val="nil"/>
+              <w:top w:val="nil"/>
+              <w:bottom w:val="single" w:sz="4" w:color="D9E1E8"/>
+            </w:tcBorders>
+            <w:vAlign w:val="center"/>
+          </w:tcPr>
+          <w:p>
+            <w:pPr>
+              <w:pStyle w:val="Compact"/>
+              <w:spacing w:before="0" w:after="20" w:line="240" w:lineRule="auto"/>
+              <w:jc w:val="center"/>
+              <w:keepNext w:val="0"/>
+              <w:keepLines/>
+              <w:widowControl w:val="1"/>
+            </w:pPr>
+            <w:r>
+              <w:rPr>
+                <w:rFonts w:ascii="Times New Roman" w:hAnsi="Times New Roman"/>
+                <w:sz w:val="19"/>
+              </w:rPr>
+              <w:t xml:space="preserve">Bedrick et al. [83]</w:t>
+            </w:r>
+          </w:p>
+        </w:tc>
+        <w:tc>
+          <w:tcPr>
+            <w:tcBorders>
+              <w:left w:val="nil"/>
+              <w:right w:val="nil"/>
+              <w:top w:val="nil"/>
+              <w:bottom w:val="single" w:sz="4" w:color="D9E1E8"/>
+            </w:tcBorders>
+            <w:vAlign w:val="center"/>
+          </w:tcPr>
+          <w:p>
+            <w:pPr>
+              <w:pStyle w:val="Compact"/>
+              <w:spacing w:before="0" w:after="20" w:line="240" w:lineRule="auto"/>
+              <w:jc w:val="center"/>
+              <w:keepNext w:val="0"/>
+              <w:keepLines/>
+              <w:widowControl w:val="1"/>
+            </w:pPr>
+            <w:r>
+              <w:rPr>
+                <w:rFonts w:ascii="Times New Roman" w:hAnsi="Times New Roman"/>
+                <w:sz w:val="19"/>
+              </w:rPr>
+              <w:t xml:space="preserve">Dialogue and counseling only</w:t>
+            </w:r>
+          </w:p>
+        </w:tc>
+        <w:tc>
+          <w:tcPr>
+            <w:tcBorders>
+              <w:left w:val="nil"/>
+              <w:right w:val="nil"/>
+              <w:top w:val="nil"/>
+              <w:bottom w:val="single" w:sz="4" w:color="D9E1E8"/>
+            </w:tcBorders>
+            <w:vAlign w:val="center"/>
+          </w:tcPr>
+          <w:p>
+            <w:pPr>
+              <w:pStyle w:val="Compact"/>
+              <w:spacing w:before="0" w:after="20" w:line="240" w:lineRule="auto"/>
+              <w:jc w:val="center"/>
+              <w:keepNext w:val="0"/>
+              <w:keepLines/>
+              <w:widowControl w:val="1"/>
+            </w:pPr>
+            <w:r>
+              <w:rPr>
+                <w:rFonts w:ascii="Times New Roman" w:hAnsi="Times New Roman"/>
+                <w:sz w:val="19"/>
+              </w:rPr>
+              <w:t xml:space="preserve">Yes (typology)</w:t>
+            </w:r>
+          </w:p>
+        </w:tc>
+        <w:tc>
+          <w:tcPr>
+            <w:tcBorders>
+              <w:left w:val="nil"/>
+              <w:right w:val="nil"/>
+              <w:top w:val="nil"/>
+              <w:bottom w:val="single" w:sz="4" w:color="D9E1E8"/>
+            </w:tcBorders>
+            <w:vAlign w:val="center"/>
+          </w:tcPr>
+          <w:p>
+            <w:pPr>
+              <w:pStyle w:val="Compact"/>
+              <w:spacing w:before="0" w:after="20" w:line="240" w:lineRule="auto"/>
+              <w:jc w:val="center"/>
+              <w:keepNext w:val="0"/>
+              <w:keepLines/>
+              <w:widowControl w:val="1"/>
+            </w:pPr>
+            <w:r>
+              <w:rPr>
+                <w:rFonts w:ascii="Times New Roman" w:hAnsi="Times New Roman"/>
+                <w:sz w:val="19"/>
+              </w:rPr>
+              <w:t xml:space="preserve">No</w:t>
+            </w:r>
+          </w:p>
+        </w:tc>
+      </w:tr>
+      <w:tr>
+        <w:tc>
+          <w:tcPr>
+            <w:tcBorders>
+              <w:left w:val="nil"/>
+              <w:right w:val="nil"/>
+              <w:top w:val="nil"/>
+              <w:bottom w:val="nil"/>
+            </w:tcBorders>
+            <w:vAlign w:val="center"/>
+          </w:tcPr>
+          <w:p>
+            <w:pPr>
+              <w:pStyle w:val="Compact"/>
+              <w:spacing w:before="0" w:after="20" w:line="240" w:lineRule="auto"/>
+              <w:jc w:val="center"/>
+              <w:keepNext w:val="0"/>
+              <w:keepLines/>
+              <w:widowControl w:val="1"/>
+            </w:pPr>
+            <w:r>
+              <w:rPr>
+                <w:rFonts w:ascii="Times New Roman" w:hAnsi="Times New Roman"/>
+                <w:b/>
+                <w:bCs/>
+                <w:sz w:val="19"/>
+              </w:rPr>
+              <w:t xml:space="preserve">This survey</w:t>
+            </w:r>
+          </w:p>
+        </w:tc>
+        <w:tc>
+          <w:tcPr>
+            <w:tcBorders>
+              <w:left w:val="nil"/>
+              <w:right w:val="nil"/>
+              <w:top w:val="nil"/>
+              <w:bottom w:val="nil"/>
+            </w:tcBorders>
+            <w:vAlign w:val="center"/>
+          </w:tcPr>
+          <w:p>
+            <w:pPr>
+              <w:pStyle w:val="Compact"/>
+              <w:spacing w:before="0" w:after="20" w:line="240" w:lineRule="auto"/>
+              <w:jc w:val="center"/>
+              <w:keepNext w:val="0"/>
+              <w:keepLines/>
+              <w:widowControl w:val="1"/>
+            </w:pPr>
+            <w:r>
+              <w:rPr>
+                <w:rFonts w:ascii="Times New Roman" w:hAnsi="Times New Roman"/>
+                <w:b/>
+                <w:bCs/>
+                <w:sz w:val="19"/>
+              </w:rPr>
+              <w:t xml:space="preserve">Patient–clinician, doctor-to-patient, telemedicine and portal, EMS, dispatch, SBAR handoff</w:t>
+            </w:r>
+          </w:p>
+        </w:tc>
+        <w:tc>
+          <w:tcPr>
+            <w:tcBorders>
+              <w:left w:val="nil"/>
+              <w:right w:val="nil"/>
+              <w:top w:val="nil"/>
+              <w:bottom w:val="nil"/>
+            </w:tcBorders>
+            <w:vAlign w:val="center"/>
+          </w:tcPr>
+          <w:p>
+            <w:pPr>
+              <w:pStyle w:val="Compact"/>
+              <w:spacing w:before="0" w:after="20" w:line="240" w:lineRule="auto"/>
+              <w:jc w:val="center"/>
+              <w:keepNext w:val="0"/>
+              <w:keepLines/>
+              <w:widowControl w:val="1"/>
+            </w:pPr>
+            <w:r>
+              <w:rPr>
+                <w:rFonts w:ascii="Times New Roman" w:hAnsi="Times New Roman"/>
+                <w:b/>
+                <w:bCs/>
+                <w:sz w:val="19"/>
+              </w:rPr>
+              <w:t xml:space="preserve">Yes</w:t>
+            </w:r>
+          </w:p>
+        </w:tc>
+        <w:tc>
+          <w:tcPr>
+            <w:tcBorders>
+              <w:left w:val="nil"/>
+              <w:right w:val="nil"/>
+              <w:top w:val="nil"/>
+              <w:bottom w:val="nil"/>
+            </w:tcBorders>
+            <w:vAlign w:val="center"/>
+          </w:tcPr>
+          <w:p>
+            <w:pPr>
+              <w:pStyle w:val="Compact"/>
+              <w:spacing w:before="0" w:after="20" w:line="240" w:lineRule="auto"/>
+              <w:jc w:val="center"/>
+              <w:keepNext w:val="0"/>
+              <w:keepLines/>
+              <w:widowControl w:val="1"/>
+            </w:pPr>
+            <w:r>
+              <w:rPr>
+                <w:rFonts w:ascii="Times New Roman" w:hAnsi="Times New Roman"/>
+                <w:b/>
+                <w:bCs/>
+                <w:sz w:val="19"/>
+              </w:rPr>
+              <w:t xml:space="preserve">Yes (13 studies)</w:t>
+            </w:r>
+          </w:p>
+        </w:tc>
+      </w:tr>
+    </w:tbl>
+    <w:bookmarkEnd w:id="13"/>
+    <w:bookmarkStart w:id="25" w:name="s2"/>
+    <w:p>
+      <w:pPr>
+        <w:pStyle w:val="Heading2"/>
+        <w:keepNext/>
+        <w:keepLines/>
+        <w:widowControl w:val="1"/>
+      </w:pPr>
+      <w:r>
+        <w:t xml:space="preserve">2  Literature Review</w:t>
+      </w:r>
+    </w:p>
+    <w:p>
+      <w:pPr>
+        <w:pStyle w:val="FirstParagraph"/>
+        <w:jc w:val="both"/>
+        <w:keepNext w:val="0"/>
+        <w:keepLines w:val="0"/>
+        <w:widowControl w:val="1"/>
+      </w:pPr>
+      <w:r>
+        <w:t xml:space="preserve">This section reviews the field in four parts: the modalities of clinical communication and</w:t>
+      </w:r>
+      <w:r>
+        <w:t xml:space="preserve"> </w:t>
+      </w:r>
+      <w:r>
+        <w:t xml:space="preserve">the tasks they support (2.1); how large language models generate synthetic clinical communication (2.2);</w:t>
+      </w:r>
+      <w:r>
+        <w:t xml:space="preserve"> </w:t>
+      </w:r>
+      <w:r>
+        <w:t xml:space="preserve">how such data is evaluated (2.3); and what the literature reports, organized by downstream task (2.4).</w:t>
+      </w:r>
+    </w:p>
+    <w:p>
+      <w:pPr>
+        <w:pStyle w:val="BodyText"/>
+        <w:jc w:val="both"/>
+        <w:keepNext w:val="0"/>
+        <w:keepLines w:val="0"/>
+        <w:widowControl w:val="1"/>
+      </w:pPr>
+      <w:r>
+        <w:rPr>
+          <w:b/>
+          <w:bCs/>
+        </w:rPr>
+        <w:t xml:space="preserve">Scope and method.</w:t>
+      </w:r>
+      <w:r>
+        <w:t xml:space="preserve"> </w:t>
+      </w:r>
+      <w:r>
+        <w:t xml:space="preserve">This is a structured narrative review rather than a systematic one. We gathered</w:t>
+      </w:r>
+      <w:r>
+        <w:t xml:space="preserve"> </w:t>
+      </w:r>
+      <w:r>
+        <w:t xml:space="preserve">work through targeted searches of arXiv, PubMed/MEDLINE, and the ACL Anthology, supplemented by forward and</w:t>
+      </w:r>
+      <w:r>
+        <w:t xml:space="preserve"> </w:t>
+      </w:r>
+      <w:r>
+        <w:t xml:space="preserve">backward citation tracing and by browsing recent issues of the venues where this work concentrates (npj</w:t>
+      </w:r>
+      <w:r>
+        <w:t xml:space="preserve"> </w:t>
+      </w:r>
+      <w:r>
+        <w:t xml:space="preserve">Digital Medicine, JAMIA, JMIR, Nature Medicine, and the ACL family). The emphasis is on 2020 through 2026,</w:t>
+      </w:r>
+      <w:r>
+        <w:t xml:space="preserve"> </w:t>
+      </w:r>
+      <w:r>
+        <w:t xml:space="preserve">the period in which instruction-following LLMs made open-ended clinical text generation practical. A study</w:t>
+      </w:r>
+      <w:r>
+        <w:t xml:space="preserve"> </w:t>
+      </w:r>
+      <w:r>
+        <w:t xml:space="preserve">is included when its LLM-generated output is a communication artifact used by a downstream model, under the</w:t>
+      </w:r>
+      <w:r>
+        <w:t xml:space="preserve"> </w:t>
+      </w:r>
+      <w:r>
+        <w:t xml:space="preserve">inclusion rule stated in Section 1; work whose output is synthetic tabular records, signals, or images,</w:t>
+      </w:r>
+      <w:r>
+        <w:t xml:space="preserve"> </w:t>
+      </w:r>
+      <w:r>
+        <w:t xml:space="preserve">or which only classifies existing text without generating communication, is excluded. The application</w:t>
+      </w:r>
+      <w:r>
+        <w:t xml:space="preserve"> </w:t>
+      </w:r>
+      <w:r>
+        <w:t xml:space="preserve">studies in Section 3 were selected from graduate coursework to span the communication channels below,</w:t>
+      </w:r>
+      <w:r>
+        <w:t xml:space="preserve"> </w:t>
+      </w:r>
+      <w:r>
+        <w:t xml:space="preserve">and are presented as feasibility demonstrations rather than a systematic sample.</w:t>
+      </w:r>
+    </w:p>
+    <w:p>
+      <w:pPr>
+        <w:pStyle w:val="BodyText"/>
+        <w:jc w:val="both"/>
+        <w:keepNext w:val="0"/>
+        <w:keepLines w:val="0"/>
+        <w:widowControl w:val="1"/>
+      </w:pPr>
+      <w:r>
+        <w:t xml:space="preserve">Efforts to unlock the value in clinical communication predate synthetic data. Ambient systems that turn a</w:t>
+      </w:r>
+      <w:r>
+        <w:t xml:space="preserve"> </w:t>
+      </w:r>
+      <w:r>
+        <w:t xml:space="preserve">recorded consultation into a note, together with their benchmarks and shared tasks</w:t>
+      </w:r>
+      <w:r>
+        <w:rPr>
+          <w:vertAlign w:val="superscript"/>
+        </w:rPr>
+        <w:t xml:space="preserve">[27,33,34,58]</w:t>
+      </w:r>
+      <w:r>
+        <w:t xml:space="preserve">,</w:t>
+      </w:r>
+      <w:r>
+        <w:t xml:space="preserve"> </w:t>
+      </w:r>
+      <w:r>
+        <w:t xml:space="preserve">are now moving into practice as clinician-facing scribes</w:t>
+      </w:r>
+      <w:r>
+        <w:rPr>
+          <w:vertAlign w:val="superscript"/>
+        </w:rPr>
+        <w:t xml:space="preserve">[93]</w:t>
+      </w:r>
+      <w:r>
+        <w:t xml:space="preserve">. Information extraction</w:t>
+      </w:r>
+      <w:r>
+        <w:t xml:space="preserve"> </w:t>
+      </w:r>
+      <w:r>
+        <w:t xml:space="preserve">has been applied to paramedic narratives</w:t>
+      </w:r>
+      <w:r>
+        <w:rPr>
+          <w:vertAlign w:val="superscript"/>
+        </w:rPr>
+        <w:t xml:space="preserve">[94]</w:t>
+      </w:r>
+      <w:r>
+        <w:t xml:space="preserve"> </w:t>
+      </w:r>
+      <w:r>
+        <w:t xml:space="preserve">and, in emergency medicine more</w:t>
+      </w:r>
+      <w:r>
+        <w:t xml:space="preserve"> </w:t>
+      </w:r>
+      <w:r>
+        <w:t xml:space="preserve">broadly, is the subject of dedicated reviews</w:t>
+      </w:r>
+      <w:r>
+        <w:rPr>
+          <w:vertAlign w:val="superscript"/>
+        </w:rPr>
+        <w:t xml:space="preserve">[95,96]</w:t>
+      </w:r>
+      <w:r>
+        <w:t xml:space="preserve">; machine learning on the audio</w:t>
+      </w:r>
+      <w:r>
+        <w:t xml:space="preserve"> </w:t>
+      </w:r>
+      <w:r>
+        <w:t xml:space="preserve">and language of emergency calls has improved dispatcher recognition of cardiac arrest in a randomized</w:t>
+      </w:r>
+      <w:r>
+        <w:t xml:space="preserve"> </w:t>
+      </w:r>
+      <w:r>
+        <w:t xml:space="preserve">trial</w:t>
+      </w:r>
+      <w:r>
+        <w:rPr>
+          <w:vertAlign w:val="superscript"/>
+        </w:rPr>
+        <w:t xml:space="preserve">[91,92]</w:t>
+      </w:r>
+      <w:r>
+        <w:t xml:space="preserve">; and patient-portal messages are increasingly triaged and routed</w:t>
+      </w:r>
+      <w:r>
+        <w:t xml:space="preserve"> </w:t>
+      </w:r>
+      <w:r>
+        <w:t xml:space="preserve">automatically</w:t>
+      </w:r>
+      <w:r>
+        <w:rPr>
+          <w:vertAlign w:val="superscript"/>
+        </w:rPr>
+        <w:t xml:space="preserve">[97]</w:t>
+      </w:r>
+      <w:r>
+        <w:t xml:space="preserve">. What these lines share is a dependence on scarce,</w:t>
+      </w:r>
+      <w:r>
+        <w:t xml:space="preserve"> </w:t>
+      </w:r>
+      <w:r>
+        <w:t xml:space="preserve">privacy-restricted real communication for training and evaluation, the bottleneck that synthetic</w:t>
+      </w:r>
+      <w:r>
+        <w:t xml:space="preserve"> </w:t>
+      </w:r>
+      <w:r>
+        <w:t xml:space="preserve">generation, the subject of this survey, sets out to relieve.</w:t>
+      </w:r>
+    </w:p>
+    <w:bookmarkStart w:id="17" w:name="clinical-communication-in-healthcare-ai"/>
+    <w:p>
+      <w:pPr>
+        <w:pStyle w:val="Heading3"/>
+        <w:keepNext/>
+        <w:keepLines/>
+        <w:widowControl w:val="1"/>
+      </w:pPr>
+      <w:r>
+        <w:t xml:space="preserve">2.1  Clinical Communication in Healthcare AI</w:t>
+      </w:r>
+    </w:p>
+    <w:bookmarkStart w:id="14" w:name="modalities-of-clinical-communication"/>
+    <w:p>
+      <w:pPr>
+        <w:pStyle w:val="Heading4"/>
+        <w:keepNext/>
+        <w:keepLines/>
+        <w:widowControl w:val="1"/>
+      </w:pPr>
+      <w:r>
+        <w:t xml:space="preserve">2.1.1  Modalities of Clinical Communication</w:t>
+      </w:r>
+    </w:p>
+    <w:p>
+      <w:pPr>
+        <w:pStyle w:val="FirstParagraph"/>
+        <w:jc w:val="both"/>
+        <w:keepNext w:val="0"/>
+        <w:keepLines w:val="0"/>
+        <w:widowControl w:val="1"/>
+      </w:pPr>
+      <w:r>
+        <w:t xml:space="preserve">Clinical communication comprises a family of channels, each defined by who is</w:t>
+      </w:r>
+      <w:r>
+        <w:t xml:space="preserve"> </w:t>
+      </w:r>
+      <w:r>
+        <w:t xml:space="preserve">speaking to whom, under what time pressure, and through what medium, and each with its own</w:t>
+      </w:r>
+      <w:r>
+        <w:t xml:space="preserve"> </w:t>
+      </w:r>
+      <w:r>
+        <w:t xml:space="preserve">characteristic way. A patient–clinician conversation is a two-party, turn-taking exchange in which</w:t>
+      </w:r>
+      <w:r>
+        <w:t xml:space="preserve"> </w:t>
+      </w:r>
+      <w:r>
+        <w:t xml:space="preserve">the clinician steers while the patient supplies symptoms, often in lay, emotional, or incomplete terms.</w:t>
+      </w:r>
+      <w:r>
+        <w:t xml:space="preserve"> </w:t>
+      </w:r>
+      <w:r>
+        <w:t xml:space="preserve">Doctor-to-patient instructions run the other way: discharge summaries, follow-up plans, and medication</w:t>
+      </w:r>
+      <w:r>
+        <w:t xml:space="preserve"> </w:t>
+      </w:r>
+      <w:r>
+        <w:t xml:space="preserve">guidance are largely one-directional and are addressed as much to the next provider as to the patient.</w:t>
+      </w:r>
+      <w:r>
+        <w:t xml:space="preserve"> </w:t>
+      </w:r>
+      <w:r>
+        <w:t xml:space="preserve">Telemedicine consultations move these encounters onto remote text or voice, adding transcription and</w:t>
+      </w:r>
+      <w:r>
+        <w:t xml:space="preserve"> </w:t>
+      </w:r>
+      <w:r>
+        <w:t xml:space="preserve">connectivity artifacts. Paramedic-to-hospital communication and emergency dispatch are terse, urgent, and</w:t>
+      </w:r>
+      <w:r>
+        <w:t xml:space="preserve"> </w:t>
+      </w:r>
+      <w:r>
+        <w:t xml:space="preserve">spoken over noise, burdened further by automatic-speech-recognition errors and, in the field, by radio</w:t>
+      </w:r>
+      <w:r>
+        <w:t xml:space="preserve"> </w:t>
+      </w:r>
+      <w:r>
+        <w:t xml:space="preserve">dropouts. Nurse and clinician handoffs, epitomized by the SBAR format, are structured precisely because</w:t>
+      </w:r>
+      <w:r>
+        <w:t xml:space="preserve"> </w:t>
+      </w:r>
+      <w:r>
+        <w:t xml:space="preserve">omissions at transfer are a leading source of harm. Patient-portal messaging, finally, is asynchronous and</w:t>
+      </w:r>
+      <w:r>
+        <w:t xml:space="preserve"> </w:t>
+      </w:r>
+      <w:r>
+        <w:t xml:space="preserve">patient-initiated, arriving in short, informal, error-strewn bursts. Table 2 sets these channels</w:t>
+      </w:r>
+      <w:r>
+        <w:t xml:space="preserve"> </w:t>
+      </w:r>
+      <w:r>
+        <w:t xml:space="preserve">against the dimensions that matter for generation and modeling.</w:t>
+      </w:r>
+    </w:p>
+    <w:p>
+      <w:pPr>
+        <w:pStyle w:val="TableCaption"/>
+        <w:spacing w:before="280" w:after="60" w:line="240" w:lineRule="auto"/>
+        <w:jc w:val="center"/>
+        <w:keepNext/>
+        <w:keepLines/>
+        <w:widowControl w:val="1"/>
+      </w:pPr>
+      <w:r>
+        <w:rPr>
+          <w:b/>
+          <w:i/>
+        </w:rPr>
+        <w:t>Table 2.</w:t>
+      </w:r>
+      <w:r>
+        <w:rPr>
+          <w:b w:val="0"/>
+          <w:i/>
+        </w:rPr>
+        <w:t xml:space="preserve"> </w:t>
+      </w:r>
+      <w:r>
+        <w:rPr>
+          <w:b w:val="0"/>
+          <w:i/>
+        </w:rPr>
+        <w:t>Modalities of clinical communication and their defining properties; the final column links each channel to the application studies in Section 3.</w:t>
+      </w:r>
+    </w:p>
+    <w:tbl>
+      <w:tblPr>
+        <w:tblStyle w:val="Table"/>
+        <w:tblW w:type="pct" w:w="5000"/>
+        <w:jc w:val="center"/>
+        <w:tblLook w:firstRow="1" w:lastRow="0" w:firstColumn="0" w:lastColumn="0" w:noHBand="0" w:noVBand="0" w:val="0020"/>
+        <w:tblCaption w:val="Table 2. Modalities of clinical communication and their defining properties; the final column links each channel to the application studies in Section 3."/>
         <w:tblLayout w:type="autofit"/>
         <w:tblBorders>
           <w:top w:val="single" w:sz="10" w:color="4F6272"/>
@@ -2933,7 +3881,7 @@
         <w:t xml:space="preserve"> </w:t>
       </w:r>
       <w:r>
-        <w:t xml:space="preserve">the speaker, and whether the instruction is active. Table 2 catalogs the recurring communication</w:t>
+        <w:t xml:space="preserve">the speaker, and whether the instruction is active. Table 3 catalogs the recurring communication</w:t>
       </w:r>
       <w:r>
         <w:t xml:space="preserve"> </w:t>
@@ -2956,7 +3904,7 @@
           <w:b/>
           <w:i/>
         </w:rPr>
-        <w:t>Table 2.</w:t>
+        <w:t>Table 3.</w:t>
       </w:r>
       <w:r>
         <w:rPr>
@@ -2979,7 +3927,7 @@
         <w:tblW w:type="pct" w:w="5000"/>
         <w:jc w:val="center"/>
         <w:tblLook w:firstRow="1" w:lastRow="0" w:firstColumn="0" w:lastColumn="0" w:noHBand="0" w:noVBand="0" w:val="0020"/>
-        <w:tblCaption w:val="Table 2. Communication-specific phenomena and the downstream difficulty they create."/>
+        <w:tblCaption w:val="Table 3. Communication-specific phenomena and the downstream difficulty they create."/>
         <w:tblLayout w:type="autofit"/>
         <w:tblBorders>
           <w:top w:val="single" w:sz="10" w:color="4F6272"/>
@@ -3973,7 +4921,7 @@
         <w:widowControl w:val="1"/>
       </w:pPr>
       <w:r>
-        <w:t xml:space="preserve">The tasks in Table 3 recur throughout the survey and motivate the downstream-utility view of</w:t>
+        <w:t xml:space="preserve">The tasks in Table 4 recur throughout the survey and motivate the downstream-utility view of</w:t>
       </w:r>
       <w:r>
         <w:t xml:space="preserve"> </w:t>
@@ -3996,7 +4944,7 @@
           <w:b/>
           <w:i/>
         </w:rPr>
-        <w:t>Table 3.</w:t>
+        <w:t>Table 4.</w:t>
       </w:r>
       <w:r>
         <w:rPr>
@@ -4019,7 +4967,7 @@
         <w:tblW w:type="pct" w:w="5000"/>
         <w:jc w:val="center"/>
         <w:tblLook w:firstRow="1" w:lastRow="0" w:firstColumn="0" w:lastColumn="0" w:noHBand="0" w:noVBand="0" w:val="0020"/>
-        <w:tblCaption w:val="Table 3. Core clinical NLP tasks addressed by synthetic clinical communication."/>
+        <w:tblCaption w:val="Table 4. Core clinical NLP tasks addressed by synthetic clinical communication."/>
         <w:tblLayout w:type="autofit"/>
         <w:tblBorders>
           <w:top w:val="single" w:sz="10" w:color="4F6272"/>
@@ -5387,7 +6335,7 @@
         <w:t xml:space="preserve"> </w:t>
       </w:r>
       <w:r>
-        <w:t xml:space="preserve">Table 4. Throughout Section 3 the headline downstream metric is macro-averaged F1, which weights</w:t>
+        <w:t xml:space="preserve">Table 5. Throughout Section 3 the headline downstream metric is macro-averaged F1, which weights</w:t>
       </w:r>
       <w:r>
         <w:t xml:space="preserve"> </w:t>
@@ -5416,7 +6364,7 @@
           <w:b/>
           <w:i/>
         </w:rPr>
-        <w:t>Table 4.</w:t>
+        <w:t>Table 5.</w:t>
       </w:r>
       <w:r>
         <w:rPr>
@@ -5439,7 +6387,7 @@
         <w:tblW w:type="pct" w:w="5000"/>
         <w:jc w:val="center"/>
         <w:tblLook w:firstRow="1" w:lastRow="0" w:firstColumn="0" w:lastColumn="0" w:noHBand="0" w:noVBand="0" w:val="0020"/>
-        <w:tblCaption w:val="Table 4. Four levels for evaluating synthetic clinical communication, with the questions they ask and the metrics typically used."/>
+        <w:tblCaption w:val="Table 5. Four levels for evaluating synthetic clinical communication, with the questions they ask and the metrics typically used."/>
         <w:tblLayout w:type="autofit"/>
         <w:tblBorders>
           <w:top w:val="single" w:sz="10" w:color="4F6272"/>
@@ -6023,13 +6971,13 @@
         <w:t xml:space="preserve">S→H</w:t>
       </w:r>
       <w:r>
-        <w:t xml:space="preserve">) variants as stronger tests. As Section 3 makes explicit, almost all of</w:t>
-      </w:r>
-      <w:r>
-        <w:t xml:space="preserve"> </w:t>
-      </w:r>
-      <w:r>
-        <w:t xml:space="preserve">the application studies surveyed here operate in the</w:t>
+        <w:t xml:space="preserve">) variants as stronger tests. Across the thirteen application studies in</w:t>
+      </w:r>
+      <w:r>
+        <w:t xml:space="preserve"> </w:t>
+      </w:r>
+      <w:r>
+        <w:t xml:space="preserve">Section 3, twelve evaluate in the</w:t>
       </w:r>
       <w:r>
         <w:t xml:space="preserve"> </w:t>
@@ -6045,13 +6993,101 @@
         <w:t xml:space="preserve"> </w:t>
       </w:r>
       <w:r>
-        <w:t xml:space="preserve">regime, which is why transfer to</w:t>
-      </w:r>
-      <w:r>
-        <w:t xml:space="preserve"> </w:t>
-      </w:r>
-      <w:r>
-        <w:t xml:space="preserve">authentic communication remains the field's central open question.</w:t>
+        <w:t xml:space="preserve">regime and one (Section 3.3.5) reports results on</w:t>
+      </w:r>
+      <w:r>
+        <w:t xml:space="preserve"> </w:t>
+      </w:r>
+      <w:r>
+        <w:t xml:space="preserve">authentic patient-authored text; of the twelve, five generate from real clinical records or datasets</w:t>
+      </w:r>
+      <w:r>
+        <w:t xml:space="preserve"> </w:t>
+      </w:r>
+      <w:r>
+        <w:t xml:space="preserve">(Sections 3.1.1, 3.1.2, 3.1.3, 3.2.1, and 3.4.1) and seven are synthetic end to end.</w:t>
+      </w:r>
+    </w:p>
+    <w:p>
+      <w:pPr>
+        <w:pStyle w:val="BodyText"/>
+        <w:jc w:val="both"/>
+        <w:keepNext w:val="0"/>
+        <w:keepLines w:val="0"/>
+        <w:widowControl w:val="1"/>
+      </w:pPr>
+      <w:r>
+        <w:t xml:space="preserve">The broader literature nonetheless shows that models trained on synthetic clinical text can transfer to</w:t>
+      </w:r>
+      <w:r>
+        <w:t xml:space="preserve"> </w:t>
+      </w:r>
+      <w:r>
+        <w:t xml:space="preserve">authentic text. A model distilled entirely on LLM-generated question-answer pairs matched, and sometimes</w:t>
+      </w:r>
+      <w:r>
+        <w:t xml:space="preserve"> </w:t>
+      </w:r>
+      <w:r>
+        <w:t xml:space="preserve">exceeded, its far larger teacher on the real i2b2 2018 clinical-trial-eligibility benchmark</w:t>
+      </w:r>
+      <w:r>
+        <w:rPr>
+          <w:vertAlign w:val="superscript"/>
+        </w:rPr>
+        <w:t xml:space="preserve">[79]</w:t>
+      </w:r>
+      <w:r>
+        <w:t xml:space="preserve">,</w:t>
+      </w:r>
+      <w:r>
+        <w:t xml:space="preserve"> </w:t>
+      </w:r>
+      <w:r>
+        <w:t xml:space="preserve">and clinical entity recognizers trained on synthetic notes reach strict F1 within a point of models trained</w:t>
+      </w:r>
+      <w:r>
+        <w:t xml:space="preserve"> </w:t>
+      </w:r>
+      <w:r>
+        <w:t xml:space="preserve">on the natural corpus, with real-plus-synthetic training exceeding both</w:t>
+      </w:r>
+      <w:r>
+        <w:rPr>
+          <w:vertAlign w:val="superscript"/>
+        </w:rPr>
+        <w:t xml:space="preserve">[109]</w:t>
+      </w:r>
+      <w:r>
+        <w:t xml:space="preserve">. This</w:t>
+      </w:r>
+      <w:r>
+        <w:t xml:space="preserve"> </w:t>
+      </w:r>
+      <w:r>
+        <w:rPr>
+          <w:i/>
+          <w:iCs/>
+        </w:rPr>
+        <w:t xml:space="preserve">S→R</w:t>
+      </w:r>
+      <w:r>
+        <w:t xml:space="preserve"> </w:t>
+      </w:r>
+      <w:r>
+        <w:t xml:space="preserve">evidence is concentrated in extraction and note-level tasks; for the spoken and handoff</w:t>
+      </w:r>
+      <w:r>
+        <w:t xml:space="preserve"> </w:t>
+      </w:r>
+      <w:r>
+        <w:t xml:space="preserve">channels this survey highlights, it remains largely untested, which is the central open problem taken up in</w:t>
+      </w:r>
+      <w:r>
+        <w:t xml:space="preserve"> </w:t>
+      </w:r>
+      <w:r>
+        <w:t xml:space="preserve">Section 5.</w:t>
       </w:r>
     </w:p>
     <w:p>
@@ -6317,7 +7353,7 @@
         <w:widowControl w:val="1"/>
       </w:pPr>
       <w:r>
-        <w:t xml:space="preserve">Table 5 summarizes the surveyed tasks, the role synthetic communication plays in each, and</w:t>
+        <w:t xml:space="preserve">Table 6 summarizes the surveyed tasks, the role synthetic communication plays in each, and</w:t>
       </w:r>
       <w:r>
         <w:t xml:space="preserve"> </w:t>
@@ -6340,7 +7376,7 @@
           <w:b/>
           <w:i/>
         </w:rPr>
-        <w:t>Table 5.</w:t>
+        <w:t>Table 6.</w:t>
       </w:r>
       <w:r>
         <w:rPr>
@@ -6363,7 +7399,7 @@
         <w:tblW w:type="pct" w:w="5000"/>
         <w:jc w:val="center"/>
         <w:tblLook w:firstRow="1" w:lastRow="0" w:firstColumn="0" w:lastColumn="0" w:noHBand="0" w:noVBand="0" w:val="0020"/>
-        <w:tblCaption w:val="Table 5. Downstream clinical NLP tasks supported by synthetic clinical communication. Bracketed entries [n] cite surveyed literature; § entries point to the application studies in Section 3."/>
+        <w:tblCaption w:val="Table 6. Downstream clinical NLP tasks supported by synthetic clinical communication. Bracketed entries [n] cite surveyed literature; § entries point to the application studies in Section 3."/>
         <w:tblLayout w:type="autofit"/>
         <w:tblBorders>
           <w:top w:val="single" w:sz="10" w:color="4F6272"/>
@@ -7440,7 +8476,7 @@
         <w:t xml:space="preserve"> </w:t>
       </w:r>
       <w:r>
-        <w:t xml:space="preserve">take up in Section 4. Table 6 summarizes all thirteen studies.</w:t>
+        <w:t xml:space="preserve">take up in Section 4. Table 7 summarizes all thirteen studies.</w:t>
       </w:r>
     </w:p>
     <w:p>
@@ -7457,7 +8493,7 @@
           <w:b/>
           <w:i/>
         </w:rPr>
-        <w:t>Table 6.</w:t>
+        <w:t>Table 7.</w:t>
       </w:r>
       <w:r>
         <w:rPr>
@@ -7480,7 +8516,7 @@
         <w:tblW w:type="pct" w:w="5000"/>
         <w:jc w:val="center"/>
         <w:tblLook w:firstRow="1" w:lastRow="0" w:firstColumn="0" w:lastColumn="0" w:noHBand="0" w:noVBand="0" w:val="0020"/>
-        <w:tblCaption w:val="Table 6. Clinical-communication processing studies, by channel, using models trained on LLM-generated synthetic data. Generators are the LLMs used to synthesize the training text; results are the headline downstream metric."/>
+        <w:tblCaption w:val="Table 7. Clinical-communication processing studies, by channel, using models trained on LLM-generated synthetic data. Generators are the LLMs used to synthesize the training text; results are the headline downstream metric."/>
         <w:tblLayout w:type="autofit"/>
         <w:tblBorders>
           <w:top w:val="single" w:sz="10" w:color="4F6272"/>
@@ -9683,7 +10719,7 @@
         <w:t xml:space="preserve"> </w:t>
       </w:r>
       <w:r>
-        <w:t xml:space="preserve">collapses (Table 7); the accompanying benchmark of LLMs on noisy patient narratives reports the same</w:t>
+        <w:t xml:space="preserve">collapses (Table 8); the accompanying benchmark of LLMs on noisy patient narratives reports the same</w:t>
       </w:r>
       <w:r>
         <w:t xml:space="preserve"> </w:t>
@@ -9715,7 +10751,7 @@
           <w:b/>
           <w:i/>
         </w:rPr>
-        <w:t>Table 7.</w:t>
+        <w:t>Table 8.</w:t>
       </w:r>
       <w:r>
         <w:rPr>
@@ -9738,7 +10774,7 @@
         <w:tblW w:type="pct" w:w="5000"/>
         <w:jc w:val="center"/>
         <w:tblLook w:firstRow="1" w:lastRow="0" w:firstColumn="0" w:lastColumn="0" w:noHBand="0" w:noVBand="0" w:val="0020"/>
-        <w:tblCaption w:val="Table 7. Diagnostic accuracy by narrative noise level (synthetic test)."/>
+        <w:tblCaption w:val="Table 8. Diagnostic accuracy by narrative noise level (synthetic test)."/>
         <w:tblLayout w:type="autofit"/>
         <w:tblBorders>
           <w:top w:val="single" w:sz="10" w:color="4F6272"/>
@@ -10417,7 +11453,7 @@
         <w:t xml:space="preserve"> </w:t>
       </w:r>
       <w:r>
-        <w:t xml:space="preserve">(Table 8) and plays the patient. Question selection follows an information-gain objective, choosing</w:t>
+        <w:t xml:space="preserve">(Table 9) and plays the patient. Question selection follows an information-gain objective, choosing</w:t>
       </w:r>
       <w:r>
         <w:t xml:space="preserve"> </w:t>
@@ -10633,7 +11669,7 @@
           <w:b/>
           <w:i/>
         </w:rPr>
-        <w:t>Table 8.</w:t>
+        <w:t>Table 9.</w:t>
       </w:r>
       <w:r>
         <w:rPr>
@@ -10656,7 +11692,7 @@
         <w:tblW w:type="pct" w:w="5000"/>
         <w:jc w:val="center"/>
         <w:tblLook w:firstRow="1" w:lastRow="0" w:firstColumn="0" w:lastColumn="0" w:noHBand="0" w:noVBand="0" w:val="0020"/>
-        <w:tblCaption w:val="Table 8. Information-reveal tiers used to probe diagnostic-questioning efficiency."/>
+        <w:tblCaption w:val="Table 9. Information-reveal tiers used to probe diagnostic-questioning efficiency."/>
         <w:tblLayout w:type="autofit"/>
         <w:tblBorders>
           <w:top w:val="single" w:sz="10" w:color="4F6272"/>
@@ -11096,7 +12132,7 @@
         <w:t xml:space="preserve"> </w:t>
       </w:r>
       <w:r>
-        <w:t xml:space="preserve">fine-tuned DistilBERT encoder, and a fine-tuned T5 generator (Table 9). DistilBERT attains the best</w:t>
+        <w:t xml:space="preserve">fine-tuned DistilBERT encoder, and a fine-tuned T5 generator (Table 10). DistilBERT attains the best</w:t>
       </w:r>
       <w:r>
         <w:t xml:space="preserve"> </w:t>
@@ -11125,7 +12161,7 @@
           <w:b/>
           <w:i/>
         </w:rPr>
-        <w:t>Table 9.</w:t>
+        <w:t>Table 10.</w:t>
       </w:r>
       <w:r>
         <w:rPr>
@@ -11148,7 +12184,7 @@
         <w:tblW w:type="pct" w:w="5000"/>
         <w:jc w:val="center"/>
         <w:tblLook w:firstRow="1" w:lastRow="0" w:firstColumn="0" w:lastColumn="0" w:noHBand="0" w:noVBand="0" w:val="0020"/>
-        <w:tblCaption w:val="Table 9. Binary emergency-department triage (synthetic test)."/>
+        <w:tblCaption w:val="Table 10. Binary emergency-department triage (synthetic test)."/>
         <w:tblLayout w:type="autofit"/>
         <w:tblBorders>
           <w:top w:val="single" w:sz="10" w:color="4F6272"/>
@@ -11824,7 +12860,7 @@
         <w:t xml:space="preserve"> </w:t>
       </w:r>
       <w:r>
-        <w:t xml:space="preserve">and a Qwen2.5-1.5B few-shot baseline (Table 10, Figure 1). The reranker is strongest under strict</w:t>
+        <w:t xml:space="preserve">and a Qwen2.5-1.5B few-shot baseline (Table 11, Figure 1). The reranker is strongest under strict</w:t>
       </w:r>
       <w:r>
         <w:t xml:space="preserve"> </w:t>
@@ -11859,7 +12895,7 @@
           <w:b/>
           <w:i/>
         </w:rPr>
-        <w:t>Table 10.</w:t>
+        <w:t>Table 11.</w:t>
       </w:r>
       <w:r>
         <w:rPr>
@@ -11882,7 +12918,7 @@
         <w:tblW w:type="pct" w:w="5000"/>
         <w:jc w:val="center"/>
         <w:tblLook w:firstRow="1" w:lastRow="0" w:firstColumn="0" w:lastColumn="0" w:noHBand="0" w:noVBand="0" w:val="0020"/>
-        <w:tblCaption w:val="Table 10. Clinical-decision extraction from Hebrew discharge summaries: overall F1 (v2 test, 81 summaries)."/>
+        <w:tblCaption w:val="Table 11. Clinical-decision extraction from Hebrew discharge summaries: overall F1 (v2 test, 81 summaries)."/>
         <w:tblLayout w:type="autofit"/>
         <w:tblBorders>
           <w:top w:val="single" w:sz="10" w:color="4F6272"/>
@@ -12597,7 +13633,7 @@
         <w:t xml:space="preserve"> </w:t>
       </w:r>
       <w:r>
-        <w:t xml:space="preserve">zero- and few-shot (Table 11, Figure 2). The fine-tuned heads decisively outperform the prompted</w:t>
+        <w:t xml:space="preserve">zero- and few-shot (Table 12, Figure 2). The fine-tuned heads decisively outperform the prompted</w:t>
       </w:r>
       <w:r>
         <w:t xml:space="preserve"> </w:t>
@@ -12626,7 +13662,7 @@
           <w:b/>
           <w:i/>
         </w:rPr>
-        <w:t>Table 11.</w:t>
+        <w:t>Table 12.</w:t>
       </w:r>
       <w:r>
         <w:rPr>
@@ -12649,7 +13685,7 @@
         <w:tblW w:type="pct" w:w="5000"/>
         <w:jc w:val="center"/>
         <w:tblLook w:firstRow="1" w:lastRow="0" w:firstColumn="0" w:lastColumn="0" w:noHBand="0" w:noVBand="0" w:val="0020"/>
-        <w:tblCaption w:val="Table 11. Portal-message triage: per-head and pipeline results (synthetic test)."/>
+        <w:tblCaption w:val="Table 12. Portal-message triage: per-head and pipeline results (synthetic test)."/>
         <w:tblLayout w:type="autofit"/>
         <w:tblBorders>
           <w:top w:val="single" w:sz="10" w:color="4F6272"/>
@@ -13349,7 +14385,7 @@
         <w:t xml:space="preserve"> </w:t>
       </w:r>
       <w:r>
-        <w:t xml:space="preserve">cascade and a Bi-LSTM cascade are compared against zero-shot GPT-4o-mini (Table 12, Figure 3).</w:t>
+        <w:t xml:space="preserve">cascade and a Bi-LSTM cascade are compared against zero-shot GPT-4o-mini (Table 13, Figure 3).</w:t>
       </w:r>
       <w:r>
         <w:t xml:space="preserve"> </w:t>
@@ -13384,7 +14420,7 @@
           <w:b/>
           <w:i/>
         </w:rPr>
-        <w:t>Table 12.</w:t>
+        <w:t>Table 13.</w:t>
       </w:r>
       <w:r>
         <w:rPr>
@@ -13407,7 +14443,7 @@
         <w:tblW w:type="pct" w:w="5000"/>
         <w:jc w:val="center"/>
         <w:tblLook w:firstRow="1" w:lastRow="0" w:firstColumn="0" w:lastColumn="0" w:noHBand="0" w:noVBand="0" w:val="0020"/>
-        <w:tblCaption w:val="Table 12. Postpartum severity triage: four-class results (synthetic test, n=750)."/>
+        <w:tblCaption w:val="Table 13. Postpartum severity triage: four-class results (synthetic test, n=750)."/>
         <w:tblLayout w:type="autofit"/>
         <w:tblBorders>
           <w:top w:val="single" w:sz="10" w:color="4F6272"/>
@@ -13939,7 +14975,7 @@
         <w:t xml:space="preserve"> </w:t>
       </w:r>
       <w:r>
-        <w:t xml:space="preserve">in a conversational safety cascade (Table 13); the cascaded model attains near-perfect accuracy (0.997)</w:t>
+        <w:t xml:space="preserve">in a conversational safety cascade (Table 14); the cascaded model attains near-perfect accuracy (0.997)</w:t>
       </w:r>
       <w:r>
         <w:t xml:space="preserve"> </w:t>
@@ -13980,7 +15016,7 @@
           <w:b/>
           <w:i/>
         </w:rPr>
-        <w:t>Table 13.</w:t>
+        <w:t>Table 14.</w:t>
       </w:r>
       <w:r>
         <w:rPr>
@@ -14003,7 +15039,7 @@
         <w:tblW w:type="pct" w:w="5000"/>
         <w:jc w:val="center"/>
         <w:tblLook w:firstRow="1" w:lastRow="0" w:firstColumn="0" w:lastColumn="0" w:noHBand="0" w:noVBand="0" w:val="0020"/>
-        <w:tblCaption w:val="Table 13. Clinical-priority triage of portal messages: accuracy (synthetic test)."/>
+        <w:tblCaption w:val="Table 14. Clinical-priority triage of portal messages: accuracy (synthetic test)."/>
         <w:tblLayout w:type="autofit"/>
         <w:tblBorders>
           <w:top w:val="single" w:sz="10" w:color="4F6272"/>
@@ -14400,7 +15436,7 @@
         <w:t xml:space="preserve"> </w:t>
       </w:r>
       <w:r>
-        <w:t xml:space="preserve">compared (Table 14). DistilBERT leads on the ordinal distress task, reaching a linear-weighted</w:t>
+        <w:t xml:space="preserve">compared (Table 15). DistilBERT leads on the ordinal distress task, reaching a linear-weighted</w:t>
       </w:r>
       <w:r>
         <w:t xml:space="preserve"> </w:t>
@@ -14437,7 +15473,7 @@
           <w:b/>
           <w:i/>
         </w:rPr>
-        <w:t>Table 14.</w:t>
+        <w:t>Table 15.</w:t>
       </w:r>
       <w:r>
         <w:rPr>
@@ -14460,7 +15496,7 @@
         <w:tblW w:type="pct" w:w="5000"/>
         <w:jc w:val="center"/>
         <w:tblLook w:firstRow="1" w:lastRow="0" w:firstColumn="0" w:lastColumn="0" w:noHBand="0" w:noVBand="0" w:val="0020"/>
-        <w:tblCaption w:val="Table 14. Psychosocial-response and distress classification in oncology messages: macro-F1 by task (synthetic test)."/>
+        <w:tblCaption w:val="Table 15. Psychosocial-response and distress classification in oncology messages: macro-F1 by task (synthetic test)."/>
         <w:tblLayout w:type="autofit"/>
         <w:tblBorders>
           <w:top w:val="single" w:sz="10" w:color="4F6272"/>
@@ -14911,7 +15947,7 @@
         <w:t xml:space="preserve"> </w:t>
       </w:r>
       <w:r>
-        <w:t xml:space="preserve">in two modes, and fine-tuned BioBERT and BlueBERT are compared (Table 15); the fine-tuned encoders are</w:t>
+        <w:t xml:space="preserve">in two modes, and fine-tuned BioBERT and BlueBERT are compared (Table 16); the fine-tuned encoders are</w:t>
       </w:r>
       <w:r>
         <w:t xml:space="preserve"> </w:t>
@@ -14973,7 +16009,7 @@
           <w:b/>
           <w:i/>
         </w:rPr>
-        <w:t>Table 15.</w:t>
+        <w:t>Table 16.</w:t>
       </w:r>
       <w:r>
         <w:rPr>
@@ -14996,7 +16032,7 @@
         <w:tblW w:type="pct" w:w="5000"/>
         <w:jc w:val="center"/>
         <w:tblLook w:firstRow="1" w:lastRow="0" w:firstColumn="0" w:lastColumn="0" w:noHBand="0" w:noVBand="0" w:val="0020"/>
-        <w:tblCaption w:val="Table 15. Critical-versus-general triage of medication questions."/>
+        <w:tblCaption w:val="Table 16. Critical-versus-general triage of medication questions."/>
         <w:tblLayout w:type="autofit"/>
         <w:tblBorders>
           <w:top w:val="single" w:sz="10" w:color="4F6272"/>
@@ -15898,7 +16934,7 @@
         <w:t xml:space="preserve"> </w:t>
       </w:r>
       <w:r>
-        <w:t xml:space="preserve">macro-F1 by 6.6 points on care area and 10.6 on specialty (Table 16, Figure 5). Deliberately</w:t>
+        <w:t xml:space="preserve">macro-F1 by 6.6 points on care area and 10.6 on specialty (Table 17, Figure 5). Deliberately</w:t>
       </w:r>
       <w:r>
         <w:t xml:space="preserve"> </w:t>
@@ -15921,7 +16957,7 @@
           <w:b/>
           <w:i/>
         </w:rPr>
-        <w:t>Table 16.</w:t>
+        <w:t>Table 17.</w:t>
       </w:r>
       <w:r>
         <w:rPr>
@@ -15944,7 +16980,7 @@
         <w:tblW w:type="pct" w:w="5000"/>
         <w:jc w:val="center"/>
         <w:tblLook w:firstRow="1" w:lastRow="0" w:firstColumn="0" w:lastColumn="0" w:noHBand="0" w:noVBand="0" w:val="0020"/>
-        <w:tblCaption w:val="Table 16. EMS report routing: BioClinicalBERT macro-F1 (%) with and without noisy synthetic training."/>
+        <w:tblCaption w:val="Table 17. EMS report routing: BioClinicalBERT macro-F1 (%) with and without noisy synthetic training."/>
         <w:tblLayout w:type="autofit"/>
         <w:tblBorders>
           <w:top w:val="single" w:sz="10" w:color="4F6272"/>
@@ -16396,7 +17432,7 @@
         <w:t xml:space="preserve"> </w:t>
       </w:r>
       <w:r>
-        <w:t xml:space="preserve">(Table 17, Figure 6). The fine-tuned Hebrew encoder leads on exact-match (79.3%) and macro-F1</w:t>
+        <w:t xml:space="preserve">(Table 18, Figure 6). The fine-tuned Hebrew encoder leads on exact-match (79.3%) and macro-F1</w:t>
       </w:r>
       <w:r>
         <w:t xml:space="preserve"> </w:t>
@@ -16425,7 +17461,7 @@
           <w:b/>
           <w:i/>
         </w:rPr>
-        <w:t>Table 17.</w:t>
+        <w:t>Table 18.</w:t>
       </w:r>
       <w:r>
         <w:rPr>
@@ -16448,7 +17484,7 @@
         <w:tblW w:type="pct" w:w="5000"/>
         <w:jc w:val="center"/>
         <w:tblLook w:firstRow="1" w:lastRow="0" w:firstColumn="0" w:lastColumn="0" w:noHBand="0" w:noVBand="0" w:val="0020"/>
-        <w:tblCaption w:val="Table 17. Casualty-record reconstruction from field radio (synthetic test, n=100)."/>
+        <w:tblCaption w:val="Table 18. Casualty-record reconstruction from field radio (synthetic test, n=100)."/>
         <w:tblLayout w:type="autofit"/>
         <w:tblBorders>
           <w:top w:val="single" w:sz="10" w:color="4F6272"/>
@@ -17097,7 +18133,7 @@
         <w:t xml:space="preserve"> </w:t>
       </w:r>
       <w:r>
-        <w:t xml:space="preserve">hierarchical extension that predicts requiredness before completeness (Table 18, Figure 7).</w:t>
+        <w:t xml:space="preserve">hierarchical extension that predicts requiredness before completeness (Table 19, Figure 7).</w:t>
       </w:r>
       <w:r>
         <w:t xml:space="preserve"> </w:t>
@@ -17132,7 +18168,7 @@
           <w:b/>
           <w:i/>
         </w:rPr>
-        <w:t>Table 18.</w:t>
+        <w:t>Table 19.</w:t>
       </w:r>
       <w:r>
         <w:rPr>
@@ -17155,7 +18191,7 @@
         <w:tblW w:type="pct" w:w="5000"/>
         <w:jc w:val="center"/>
         <w:tblLook w:firstRow="1" w:lastRow="0" w:firstColumn="0" w:lastColumn="0" w:noHBand="0" w:noVBand="0" w:val="0020"/>
-        <w:tblCaption w:val="Table 18. SBAR handover completeness: note-level results (synthetic test)."/>
+        <w:tblCaption w:val="Table 19. SBAR handover completeness: note-level results (synthetic test)."/>
         <w:tblLayout w:type="autofit"/>
         <w:tblBorders>
           <w:top w:val="single" w:sz="10" w:color="4F6272"/>
@@ -18730,7 +19766,7 @@
         <w:widowControl w:val="1"/>
       </w:pPr>
       <w:r>
-        <w:t xml:space="preserve">Read together, those studies surface a small set of reusable design patterns (Table 19) that recur</w:t>
+        <w:t xml:space="preserve">Read together, those studies surface a small set of reusable design patterns (Table 20) that recur</w:t>
       </w:r>
       <w:r>
         <w:t xml:space="preserve"> </w:t>
@@ -18753,7 +19789,7 @@
           <w:b/>
           <w:i/>
         </w:rPr>
-        <w:t>Table 19.</w:t>
+        <w:t>Table 20.</w:t>
       </w:r>
       <w:r>
         <w:rPr>
@@ -18776,7 +19812,7 @@
         <w:tblW w:type="pct" w:w="5000"/>
         <w:jc w:val="center"/>
         <w:tblLook w:firstRow="1" w:lastRow="0" w:firstColumn="0" w:lastColumn="0" w:noHBand="0" w:noVBand="0" w:val="0020"/>
-        <w:tblCaption w:val="Table 19. Reusable design patterns recurring across the thirteen application studies (RQ7)."/>
+        <w:tblCaption w:val="Table 20. Reusable design patterns recurring across the thirteen application studies (RQ7)."/>
         <w:tblLayout w:type="autofit"/>
         <w:tblBorders>
           <w:top w:val="single" w:sz="10" w:color="4F6272"/>
@@ -19328,6 +20364,39 @@
         <w:widowControl w:val="1"/>
       </w:pPr>
       <w:r>
+        <w:t xml:space="preserve">The first pattern is not confined to synthetic evaluation: on authentic clinical text a fine-tuned encoder</w:t>
+      </w:r>
+      <w:r>
+        <w:t xml:space="preserve"> </w:t>
+      </w:r>
+      <w:r>
+        <w:t xml:space="preserve">reached F1 0.84 on symptom extraction against 0.45 for a zero-shot LLM</w:t>
+      </w:r>
+      <w:r>
+        <w:rPr>
+          <w:vertAlign w:val="superscript"/>
+        </w:rPr>
+        <w:t xml:space="preserve">[110]</w:t>
+      </w:r>
+      <w:r>
+        <w:t xml:space="preserve">,</w:t>
+      </w:r>
+      <w:r>
+        <w:t xml:space="preserve"> </w:t>
+      </w:r>
+      <w:r>
+        <w:t xml:space="preserve">corroborating the small-model advantage the studies here observe on synthetic data.</w:t>
+      </w:r>
+    </w:p>
+    <w:p>
+      <w:pPr>
+        <w:pStyle w:val="BodyText"/>
+        <w:jc w:val="both"/>
+        <w:keepNext w:val="0"/>
+        <w:keepLines w:val="0"/>
+        <w:widowControl w:val="1"/>
+      </w:pPr>
+      <w:r>
         <w:t xml:space="preserve">They come, however, with an unmistakable caveat. Almost every study evaluates on held-out synthetic data.</w:t>
       </w:r>
       <w:r>
@@ -22285,7 +23354,7 @@
         <w:t xml:space="preserve">79. </w:t>
       </w:r>
       <w:r>
-        <w:t xml:space="preserve">S. Nayak et al. Synthetic data distillation enables the extraction of clinical information at scale.</w:t>
+        <w:t xml:space="preserve">E. Woo, M. Burkhart, E. Alsentzer, B. Beaulieu-Jones. Synthetic data distillation enables the extraction of clinical information at scale.</w:t>
       </w:r>
       <w:r>
         <w:t xml:space="preserve"> </w:t>
@@ -22298,7 +23367,7 @@
         <w:t xml:space="preserve">npj Digital Medicine</w:t>
       </w:r>
       <w:r>
-        <w:t xml:space="preserve">, 2025.</w:t>
+        <w:t xml:space="preserve">, 8, 2025.</w:t>
       </w:r>
     </w:p>
     <w:p>
@@ -23288,6 +24357,74 @@
       </w:r>
       <w:r>
         <w:t xml:space="preserve">, 2026.</w:t>
+      </w:r>
+    </w:p>
+    <w:p>
+      <w:pPr>
+        <w:pStyle w:val="ReferenceEntry"/>
+        <w:spacing w:after="100"/>
+        <w:ind w:left="475" w:hanging="475"/>
+        <w:jc w:val="left"/>
+        <w:keepNext w:val="0"/>
+        <w:keepLines w:val="0"/>
+        <w:widowControl w:val="1"/>
+      </w:pPr>
+      <w:r>
+        <w:rPr>
+          <w:rFonts w:ascii="Times New Roman" w:hAnsi="Times New Roman"/>
+          <w:sz w:val="20"/>
+        </w:rPr>
+        <w:t xml:space="preserve">109. </w:t>
+      </w:r>
+      <w:r>
+        <w:t xml:space="preserve">J. Li, Y. Zhou, X. Jiang, K. Natarajan, et al. Are synthetic clinical notes useful for real natural language processing tasks: A case study on clinical entity recognition.</w:t>
+      </w:r>
+      <w:r>
+        <w:t xml:space="preserve"> </w:t>
+      </w:r>
+      <w:r>
+        <w:rPr>
+          <w:i/>
+          <w:iCs/>
+        </w:rPr>
+        <w:t xml:space="preserve">Journal of the American Medical Informatics Association</w:t>
+      </w:r>
+      <w:r>
+        <w:t xml:space="preserve">, 28(10):2193–2201, 2021.</w:t>
+      </w:r>
+    </w:p>
+    <w:p>
+      <w:pPr>
+        <w:pStyle w:val="ReferenceEntry"/>
+        <w:spacing w:after="100"/>
+        <w:ind w:left="475" w:hanging="475"/>
+        <w:jc w:val="left"/>
+        <w:keepNext w:val="0"/>
+        <w:keepLines w:val="0"/>
+        <w:widowControl w:val="1"/>
+      </w:pPr>
+      <w:r>
+        <w:rPr>
+          <w:rFonts w:ascii="Times New Roman" w:hAnsi="Times New Roman"/>
+          <w:sz w:val="20"/>
+        </w:rPr>
+        <w:t xml:space="preserve">110. </w:t>
+      </w:r>
+      <w:r>
+        <w:t xml:space="preserve">J. Diaz Ochoa, N. Layer, J. Mahr, F. Mustafa, et al. Optimized BERT-based NLP outperforms zero-shot methods for automated symptom detection in clinical practice.</w:t>
+      </w:r>
+      <w:r>
+        <w:t xml:space="preserve"> </w:t>
+      </w:r>
+      <w:r>
+        <w:rPr>
+          <w:i/>
+          <w:iCs/>
+        </w:rPr>
+        <w:t xml:space="preserve">Frontiers in Digital Health</w:t>
+      </w:r>
+      <w:r>
+        <w:t xml:space="preserve">, 2025.</w:t>
       </w:r>
     </w:p>
     <w:bookmarkEnd w:id="78"/>

</xml_diff>

<commit_message>
W3: note case-study metrics are single-run feasibility estimates (3 lead); item 4: add RQ7 failure-modes table (Table 21) balancing the design-patterns table; rebuild DOCX+PDF
110 refs/cites aligned; Tables 1-21 no orphans; wins-only clean; em-dash 0.
Co-Authored-By: Claude Opus 4.8 <noreply@anthropic.com>
</commit_message>
<xml_diff>
--- a/paper-1col.docx
+++ b/paper-1col.docx
@@ -8476,7 +8476,19 @@
         <w:t xml:space="preserve"> </w:t>
       </w:r>
       <w:r>
-        <w:t xml:space="preserve">take up in Section 4. Table 7 summarizes all thirteen studies.</w:t>
+        <w:t xml:space="preserve">take up in Section 4. The reported metrics are single-run point estimates offered as feasibility</w:t>
+      </w:r>
+      <w:r>
+        <w:t xml:space="preserve"> </w:t>
+      </w:r>
+      <w:r>
+        <w:t xml:space="preserve">evidence rather than multi-seed benchmarks: they establish that a channel can be served, not a ranking</w:t>
+      </w:r>
+      <w:r>
+        <w:t xml:space="preserve"> </w:t>
+      </w:r>
+      <w:r>
+        <w:t xml:space="preserve">among methods. Table 7 summarizes all thirteen studies.</w:t>
       </w:r>
     </w:p>
     <w:p>
@@ -20397,7 +20409,713 @@
         <w:widowControl w:val="1"/>
       </w:pPr>
       <w:r>
-        <w:t xml:space="preserve">They come, however, with an unmistakable caveat. Almost every study evaluates on held-out synthetic data.</w:t>
+        <w:t xml:space="preserve">Set against these patterns are recurring failure modes (Table 21) that the studies and the wider</w:t>
+      </w:r>
+      <w:r>
+        <w:t xml:space="preserve"> </w:t>
+      </w:r>
+      <w:r>
+        <w:t xml:space="preserve">literature expose, and that any reuse of synthetic clinical communication must guard against; together the</w:t>
+      </w:r>
+      <w:r>
+        <w:t xml:space="preserve"> </w:t>
+      </w:r>
+      <w:r>
+        <w:t xml:space="preserve">two tables answer the design-pattern and failure-mode halves of RQ7.</w:t>
+      </w:r>
+    </w:p>
+    <w:p>
+      <w:pPr>
+        <w:pStyle w:val="TableCaption"/>
+        <w:spacing w:before="280" w:after="60" w:line="240" w:lineRule="auto"/>
+        <w:jc w:val="center"/>
+        <w:keepNext/>
+        <w:keepLines/>
+        <w:widowControl w:val="1"/>
+      </w:pPr>
+      <w:r>
+        <w:rPr>
+          <w:b/>
+          <w:i/>
+        </w:rPr>
+        <w:t>Table 21.</w:t>
+      </w:r>
+      <w:r>
+        <w:rPr>
+          <w:b w:val="0"/>
+          <w:i/>
+        </w:rPr>
+        <w:t xml:space="preserve"> </w:t>
+      </w:r>
+      <w:r>
+        <w:rPr>
+          <w:b w:val="0"/>
+          <w:i/>
+        </w:rPr>
+        <w:t>Recurring failure modes when reusing synthetic clinical communication, and where each is guarded.</w:t>
+      </w:r>
+    </w:p>
+    <w:tbl>
+      <w:tblPr>
+        <w:tblStyle w:val="Table"/>
+        <w:tblW w:type="pct" w:w="5000"/>
+        <w:jc w:val="center"/>
+        <w:tblLook w:firstRow="1" w:lastRow="0" w:firstColumn="0" w:lastColumn="0" w:noHBand="0" w:noVBand="0" w:val="0020"/>
+        <w:tblCaption w:val="Table 21. Recurring failure modes when reusing synthetic clinical communication, and where each is guarded."/>
+        <w:tblLayout w:type="autofit"/>
+        <w:tblBorders>
+          <w:top w:val="single" w:sz="10" w:color="4F6272"/>
+          <w:bottom w:val="single" w:sz="10" w:color="4F6272"/>
+          <w:insideH w:val="single" w:sz="5" w:color="9FB0C2"/>
+          <w:left w:val="single" w:sz="6" w:color="9FB0C2"/>
+          <w:right w:val="single" w:sz="6" w:color="9FB0C2"/>
+          <w:insideV w:val="single" w:sz="5" w:color="D9E1E8"/>
+        </w:tblBorders>
+      </w:tblPr>
+      <w:tblGrid>
+        <w:gridCol w:w="2640"/>
+        <w:gridCol w:w="2640"/>
+        <w:gridCol w:w="2640"/>
+      </w:tblGrid>
+      <w:tr>
+        <w:trPr>
+          <w:tblHeader w:val="on"/>
+        </w:trPr>
+        <w:tc>
+          <w:tcPr>
+            <w:shd w:fill="EEF3F7"/>
+            <w:tcBorders>
+              <w:left w:val="nil"/>
+              <w:right w:val="nil"/>
+              <w:top w:val="nil"/>
+              <w:bottom w:val="single" w:sz="8" w:color="9FB0C2"/>
+            </w:tcBorders>
+            <w:vAlign w:val="center"/>
+          </w:tcPr>
+          <w:p>
+            <w:pPr>
+              <w:pStyle w:val="Compact"/>
+              <w:spacing w:before="0" w:after="20" w:line="240" w:lineRule="auto"/>
+              <w:jc w:val="center"/>
+              <w:keepNext w:val="0"/>
+              <w:keepLines/>
+              <w:widowControl w:val="1"/>
+            </w:pPr>
+            <w:r>
+              <w:rPr>
+                <w:rFonts w:ascii="Times New Roman" w:hAnsi="Times New Roman"/>
+                <w:b/>
+                <w:sz w:val="19"/>
+              </w:rPr>
+              <w:t xml:space="preserve">Failure mode</w:t>
+            </w:r>
+          </w:p>
+        </w:tc>
+        <w:tc>
+          <w:tcPr>
+            <w:shd w:fill="EEF3F7"/>
+            <w:tcBorders>
+              <w:left w:val="nil"/>
+              <w:right w:val="nil"/>
+              <w:top w:val="nil"/>
+              <w:bottom w:val="single" w:sz="8" w:color="9FB0C2"/>
+            </w:tcBorders>
+            <w:vAlign w:val="center"/>
+          </w:tcPr>
+          <w:p>
+            <w:pPr>
+              <w:pStyle w:val="Compact"/>
+              <w:spacing w:before="0" w:after="20" w:line="240" w:lineRule="auto"/>
+              <w:jc w:val="center"/>
+              <w:keepNext w:val="0"/>
+              <w:keepLines/>
+              <w:widowControl w:val="1"/>
+            </w:pPr>
+            <w:r>
+              <w:rPr>
+                <w:rFonts w:ascii="Times New Roman" w:hAnsi="Times New Roman"/>
+                <w:b/>
+                <w:sz w:val="19"/>
+              </w:rPr>
+              <w:t xml:space="preserve">How it shows up</w:t>
+            </w:r>
+          </w:p>
+        </w:tc>
+        <w:tc>
+          <w:tcPr>
+            <w:shd w:fill="EEF3F7"/>
+            <w:tcBorders>
+              <w:left w:val="nil"/>
+              <w:right w:val="nil"/>
+              <w:top w:val="nil"/>
+              <w:bottom w:val="single" w:sz="8" w:color="9FB0C2"/>
+            </w:tcBorders>
+            <w:vAlign w:val="center"/>
+          </w:tcPr>
+          <w:p>
+            <w:pPr>
+              <w:pStyle w:val="Compact"/>
+              <w:spacing w:before="0" w:after="20" w:line="240" w:lineRule="auto"/>
+              <w:jc w:val="center"/>
+              <w:keepNext w:val="0"/>
+              <w:keepLines/>
+              <w:widowControl w:val="1"/>
+            </w:pPr>
+            <w:r>
+              <w:rPr>
+                <w:rFonts w:ascii="Times New Roman" w:hAnsi="Times New Roman"/>
+                <w:b/>
+                <w:sz w:val="19"/>
+              </w:rPr>
+              <w:t xml:space="preserve">Guard / where addressed</w:t>
+            </w:r>
+          </w:p>
+        </w:tc>
+      </w:tr>
+      <w:tr>
+        <w:tc>
+          <w:tcPr>
+            <w:tcBorders>
+              <w:left w:val="nil"/>
+              <w:right w:val="nil"/>
+              <w:top w:val="nil"/>
+              <w:bottom w:val="single" w:sz="4" w:color="D9E1E8"/>
+            </w:tcBorders>
+            <w:vAlign w:val="center"/>
+          </w:tcPr>
+          <w:p>
+            <w:pPr>
+              <w:pStyle w:val="Compact"/>
+              <w:spacing w:before="0" w:after="20" w:line="240" w:lineRule="auto"/>
+              <w:jc w:val="center"/>
+              <w:keepNext w:val="0"/>
+              <w:keepLines/>
+              <w:widowControl w:val="1"/>
+            </w:pPr>
+            <w:r>
+              <w:rPr>
+                <w:rFonts w:ascii="Times New Roman" w:hAnsi="Times New Roman"/>
+                <w:sz w:val="19"/>
+              </w:rPr>
+              <w:t xml:space="preserve">Clinical hallucination</w:t>
+            </w:r>
+          </w:p>
+        </w:tc>
+        <w:tc>
+          <w:tcPr>
+            <w:tcBorders>
+              <w:left w:val="nil"/>
+              <w:right w:val="nil"/>
+              <w:top w:val="nil"/>
+              <w:bottom w:val="single" w:sz="4" w:color="D9E1E8"/>
+            </w:tcBorders>
+            <w:vAlign w:val="center"/>
+          </w:tcPr>
+          <w:p>
+            <w:pPr>
+              <w:pStyle w:val="Compact"/>
+              <w:spacing w:before="0" w:after="20" w:line="240" w:lineRule="auto"/>
+              <w:jc w:val="center"/>
+              <w:keepNext w:val="0"/>
+              <w:keepLines/>
+              <w:widowControl w:val="1"/>
+            </w:pPr>
+            <w:r>
+              <w:rPr>
+                <w:rFonts w:ascii="Times New Roman" w:hAnsi="Times New Roman"/>
+                <w:sz w:val="19"/>
+              </w:rPr>
+              <w:t xml:space="preserve">Fluent but medically wrong content that passes surface checks and corrupts the labels a model learns from</w:t>
+            </w:r>
+          </w:p>
+        </w:tc>
+        <w:tc>
+          <w:tcPr>
+            <w:tcBorders>
+              <w:left w:val="nil"/>
+              <w:right w:val="nil"/>
+              <w:top w:val="nil"/>
+              <w:bottom w:val="single" w:sz="4" w:color="D9E1E8"/>
+            </w:tcBorders>
+            <w:vAlign w:val="center"/>
+          </w:tcPr>
+          <w:p>
+            <w:pPr>
+              <w:pStyle w:val="Compact"/>
+              <w:spacing w:before="0" w:after="20" w:line="240" w:lineRule="auto"/>
+              <w:jc w:val="center"/>
+              <w:keepNext w:val="0"/>
+              <w:keepLines/>
+              <w:widowControl w:val="1"/>
+            </w:pPr>
+            <w:r>
+              <w:rPr>
+                <w:rFonts w:ascii="Times New Roman" w:hAnsi="Times New Roman"/>
+                <w:sz w:val="19"/>
+              </w:rPr>
+              <w:t xml:space="preserve">Grounding, constrained decoding, safety auditing that treats omission as seriously as fabrication</w:t>
+            </w:r>
+            <w:r>
+              <w:rPr>
+                <w:rFonts w:ascii="Times New Roman" w:hAnsi="Times New Roman"/>
+                <w:sz w:val="19"/>
+                <w:vertAlign w:val="superscript"/>
+              </w:rPr>
+              <w:t xml:space="preserve">[82]</w:t>
+            </w:r>
+          </w:p>
+        </w:tc>
+      </w:tr>
+      <w:tr>
+        <w:tc>
+          <w:tcPr>
+            <w:tcBorders>
+              <w:left w:val="nil"/>
+              <w:right w:val="nil"/>
+              <w:top w:val="nil"/>
+              <w:bottom w:val="single" w:sz="4" w:color="D9E1E8"/>
+            </w:tcBorders>
+            <w:vAlign w:val="center"/>
+          </w:tcPr>
+          <w:p>
+            <w:pPr>
+              <w:pStyle w:val="Compact"/>
+              <w:spacing w:before="0" w:after="20" w:line="240" w:lineRule="auto"/>
+              <w:jc w:val="center"/>
+              <w:keepNext w:val="0"/>
+              <w:keepLines/>
+              <w:widowControl w:val="1"/>
+            </w:pPr>
+            <w:r>
+              <w:rPr>
+                <w:rFonts w:ascii="Times New Roman" w:hAnsi="Times New Roman"/>
+                <w:sz w:val="19"/>
+              </w:rPr>
+              <w:t xml:space="preserve">Auto-annotation label noise</w:t>
+            </w:r>
+          </w:p>
+        </w:tc>
+        <w:tc>
+          <w:tcPr>
+            <w:tcBorders>
+              <w:left w:val="nil"/>
+              <w:right w:val="nil"/>
+              <w:top w:val="nil"/>
+              <w:bottom w:val="single" w:sz="4" w:color="D9E1E8"/>
+            </w:tcBorders>
+            <w:vAlign w:val="center"/>
+          </w:tcPr>
+          <w:p>
+            <w:pPr>
+              <w:pStyle w:val="Compact"/>
+              <w:spacing w:before="0" w:after="20" w:line="240" w:lineRule="auto"/>
+              <w:jc w:val="center"/>
+              <w:keepNext w:val="0"/>
+              <w:keepLines/>
+              <w:widowControl w:val="1"/>
+            </w:pPr>
+            <w:r>
+              <w:rPr>
+                <w:rFonts w:ascii="Times New Roman" w:hAnsi="Times New Roman"/>
+                <w:sz w:val="19"/>
+              </w:rPr>
+              <w:t xml:space="preserve">Labels emitted by the generator inherit its errors, silently degrading supervision</w:t>
+            </w:r>
+          </w:p>
+        </w:tc>
+        <w:tc>
+          <w:tcPr>
+            <w:tcBorders>
+              <w:left w:val="nil"/>
+              <w:right w:val="nil"/>
+              <w:top w:val="nil"/>
+              <w:bottom w:val="single" w:sz="4" w:color="D9E1E8"/>
+            </w:tcBorders>
+            <w:vAlign w:val="center"/>
+          </w:tcPr>
+          <w:p>
+            <w:pPr>
+              <w:pStyle w:val="Compact"/>
+              <w:spacing w:before="0" w:after="20" w:line="240" w:lineRule="auto"/>
+              <w:jc w:val="center"/>
+              <w:keepNext w:val="0"/>
+              <w:keepLines/>
+              <w:widowControl w:val="1"/>
+            </w:pPr>
+            <w:r>
+              <w:rPr>
+                <w:rFonts w:ascii="Times New Roman" w:hAnsi="Times New Roman"/>
+                <w:sz w:val="19"/>
+              </w:rPr>
+              <w:t xml:space="preserve">Labels fixed at generation and audited by an independent judge (§3.1.2, §3.3.4)</w:t>
+            </w:r>
+          </w:p>
+        </w:tc>
+      </w:tr>
+      <w:tr>
+        <w:tc>
+          <w:tcPr>
+            <w:tcBorders>
+              <w:left w:val="nil"/>
+              <w:right w:val="nil"/>
+              <w:top w:val="nil"/>
+              <w:bottom w:val="single" w:sz="4" w:color="D9E1E8"/>
+            </w:tcBorders>
+            <w:vAlign w:val="center"/>
+          </w:tcPr>
+          <w:p>
+            <w:pPr>
+              <w:pStyle w:val="Compact"/>
+              <w:spacing w:before="0" w:after="20" w:line="240" w:lineRule="auto"/>
+              <w:jc w:val="center"/>
+              <w:keepNext w:val="0"/>
+              <w:keepLines/>
+              <w:widowControl w:val="1"/>
+            </w:pPr>
+            <w:r>
+              <w:rPr>
+                <w:rFonts w:ascii="Times New Roman" w:hAnsi="Times New Roman"/>
+                <w:sz w:val="19"/>
+              </w:rPr>
+              <w:t xml:space="preserve">Distribution shift</w:t>
+            </w:r>
+          </w:p>
+        </w:tc>
+        <w:tc>
+          <w:tcPr>
+            <w:tcBorders>
+              <w:left w:val="nil"/>
+              <w:right w:val="nil"/>
+              <w:top w:val="nil"/>
+              <w:bottom w:val="single" w:sz="4" w:color="D9E1E8"/>
+            </w:tcBorders>
+            <w:vAlign w:val="center"/>
+          </w:tcPr>
+          <w:p>
+            <w:pPr>
+              <w:pStyle w:val="Compact"/>
+              <w:spacing w:before="0" w:after="20" w:line="240" w:lineRule="auto"/>
+              <w:jc w:val="center"/>
+              <w:keepNext w:val="0"/>
+              <w:keepLines/>
+              <w:widowControl w:val="1"/>
+            </w:pPr>
+            <w:r>
+              <w:rPr>
+                <w:rFonts w:ascii="Times New Roman" w:hAnsi="Times New Roman"/>
+                <w:sz w:val="19"/>
+              </w:rPr>
+              <w:t xml:space="preserve">Aggregate lexical statistics and class balance diverge from real communication; held-out synthetic evaluation cannot detect it</w:t>
+            </w:r>
+          </w:p>
+        </w:tc>
+        <w:tc>
+          <w:tcPr>
+            <w:tcBorders>
+              <w:left w:val="nil"/>
+              <w:right w:val="nil"/>
+              <w:top w:val="nil"/>
+              <w:bottom w:val="single" w:sz="4" w:color="D9E1E8"/>
+            </w:tcBorders>
+            <w:vAlign w:val="center"/>
+          </w:tcPr>
+          <w:p>
+            <w:pPr>
+              <w:pStyle w:val="Compact"/>
+              <w:spacing w:before="0" w:after="20" w:line="240" w:lineRule="auto"/>
+              <w:jc w:val="center"/>
+              <w:keepNext w:val="0"/>
+              <w:keepLines/>
+              <w:widowControl w:val="1"/>
+            </w:pPr>
+            <w:r>
+              <w:rPr>
+                <w:rFonts w:ascii="Times New Roman" w:hAnsi="Times New Roman"/>
+                <w:sz w:val="19"/>
+              </w:rPr>
+              <w:t xml:space="preserve">Train-on-synthetic, test-on-real evaluation (§2.3)</w:t>
+            </w:r>
+          </w:p>
+        </w:tc>
+      </w:tr>
+      <w:tr>
+        <w:tc>
+          <w:tcPr>
+            <w:tcBorders>
+              <w:left w:val="nil"/>
+              <w:right w:val="nil"/>
+              <w:top w:val="nil"/>
+              <w:bottom w:val="single" w:sz="4" w:color="D9E1E8"/>
+            </w:tcBorders>
+            <w:vAlign w:val="center"/>
+          </w:tcPr>
+          <w:p>
+            <w:pPr>
+              <w:pStyle w:val="Compact"/>
+              <w:spacing w:before="0" w:after="20" w:line="240" w:lineRule="auto"/>
+              <w:jc w:val="center"/>
+              <w:keepNext w:val="0"/>
+              <w:keepLines/>
+              <w:widowControl w:val="1"/>
+            </w:pPr>
+            <w:r>
+              <w:rPr>
+                <w:rFonts w:ascii="Times New Roman" w:hAnsi="Times New Roman"/>
+                <w:sz w:val="19"/>
+              </w:rPr>
+              <w:t xml:space="preserve">Generator fingerprints</w:t>
+            </w:r>
+          </w:p>
+        </w:tc>
+        <w:tc>
+          <w:tcPr>
+            <w:tcBorders>
+              <w:left w:val="nil"/>
+              <w:right w:val="nil"/>
+              <w:top w:val="nil"/>
+              <w:bottom w:val="single" w:sz="4" w:color="D9E1E8"/>
+            </w:tcBorders>
+            <w:vAlign w:val="center"/>
+          </w:tcPr>
+          <w:p>
+            <w:pPr>
+              <w:pStyle w:val="Compact"/>
+              <w:spacing w:before="0" w:after="20" w:line="240" w:lineRule="auto"/>
+              <w:jc w:val="center"/>
+              <w:keepNext w:val="0"/>
+              <w:keepLines/>
+              <w:widowControl w:val="1"/>
+            </w:pPr>
+            <w:r>
+              <w:rPr>
+                <w:rFonts w:ascii="Times New Roman" w:hAnsi="Times New Roman"/>
+                <w:sz w:val="19"/>
+              </w:rPr>
+              <w:t xml:space="preserve">Models learn stylistic tics of the generator rather than clinical content</w:t>
+            </w:r>
+          </w:p>
+        </w:tc>
+        <w:tc>
+          <w:tcPr>
+            <w:tcBorders>
+              <w:left w:val="nil"/>
+              <w:right w:val="nil"/>
+              <w:top w:val="nil"/>
+              <w:bottom w:val="single" w:sz="4" w:color="D9E1E8"/>
+            </w:tcBorders>
+            <w:vAlign w:val="center"/>
+          </w:tcPr>
+          <w:p>
+            <w:pPr>
+              <w:pStyle w:val="Compact"/>
+              <w:spacing w:before="0" w:after="20" w:line="240" w:lineRule="auto"/>
+              <w:jc w:val="center"/>
+              <w:keepNext w:val="0"/>
+              <w:keepLines/>
+              <w:widowControl w:val="1"/>
+            </w:pPr>
+            <w:r>
+              <w:rPr>
+                <w:rFonts w:ascii="Times New Roman" w:hAnsi="Times New Roman"/>
+                <w:sz w:val="19"/>
+              </w:rPr>
+              <w:t xml:space="preserve">Fingerprint removal so models learn content, not style</w:t>
+            </w:r>
+            <w:r>
+              <w:rPr>
+                <w:rFonts w:ascii="Times New Roman" w:hAnsi="Times New Roman"/>
+                <w:sz w:val="19"/>
+                <w:vertAlign w:val="superscript"/>
+              </w:rPr>
+              <w:t xml:space="preserve">[103]</w:t>
+            </w:r>
+          </w:p>
+        </w:tc>
+      </w:tr>
+      <w:tr>
+        <w:tc>
+          <w:tcPr>
+            <w:tcBorders>
+              <w:left w:val="nil"/>
+              <w:right w:val="nil"/>
+              <w:top w:val="nil"/>
+              <w:bottom w:val="single" w:sz="4" w:color="D9E1E8"/>
+            </w:tcBorders>
+            <w:vAlign w:val="center"/>
+          </w:tcPr>
+          <w:p>
+            <w:pPr>
+              <w:pStyle w:val="Compact"/>
+              <w:spacing w:before="0" w:after="20" w:line="240" w:lineRule="auto"/>
+              <w:jc w:val="center"/>
+              <w:keepNext w:val="0"/>
+              <w:keepLines/>
+              <w:widowControl w:val="1"/>
+            </w:pPr>
+            <w:r>
+              <w:rPr>
+                <w:rFonts w:ascii="Times New Roman" w:hAnsi="Times New Roman"/>
+                <w:sz w:val="19"/>
+              </w:rPr>
+              <w:t xml:space="preserve">Longitudinal inconsistency</w:t>
+            </w:r>
+          </w:p>
+        </w:tc>
+        <w:tc>
+          <w:tcPr>
+            <w:tcBorders>
+              <w:left w:val="nil"/>
+              <w:right w:val="nil"/>
+              <w:top w:val="nil"/>
+              <w:bottom w:val="single" w:sz="4" w:color="D9E1E8"/>
+            </w:tcBorders>
+            <w:vAlign w:val="center"/>
+          </w:tcPr>
+          <w:p>
+            <w:pPr>
+              <w:pStyle w:val="Compact"/>
+              <w:spacing w:before="0" w:after="20" w:line="240" w:lineRule="auto"/>
+              <w:jc w:val="center"/>
+              <w:keepNext w:val="0"/>
+              <w:keepLines/>
+              <w:widowControl w:val="1"/>
+            </w:pPr>
+            <w:r>
+              <w:rPr>
+                <w:rFonts w:ascii="Times New Roman" w:hAnsi="Times New Roman"/>
+                <w:sz w:val="19"/>
+              </w:rPr>
+              <w:t xml:space="preserve">Independently sampled turns contradict one another across a conversation, handoff, and discharge</w:t>
+            </w:r>
+          </w:p>
+        </w:tc>
+        <w:tc>
+          <w:tcPr>
+            <w:tcBorders>
+              <w:left w:val="nil"/>
+              <w:right w:val="nil"/>
+              <w:top w:val="nil"/>
+              <w:bottom w:val="single" w:sz="4" w:color="D9E1E8"/>
+            </w:tcBorders>
+            <w:vAlign w:val="center"/>
+          </w:tcPr>
+          <w:p>
+            <w:pPr>
+              <w:pStyle w:val="Compact"/>
+              <w:spacing w:before="0" w:after="20" w:line="240" w:lineRule="auto"/>
+              <w:jc w:val="center"/>
+              <w:keepNext w:val="0"/>
+              <w:keepLines/>
+              <w:widowControl w:val="1"/>
+            </w:pPr>
+            <w:r>
+              <w:rPr>
+                <w:rFonts w:ascii="Times New Roman" w:hAnsi="Times New Roman"/>
+                <w:sz w:val="19"/>
+              </w:rPr>
+              <w:t xml:space="preserve">Whole-encounter generation and consistency constraints</w:t>
+            </w:r>
+          </w:p>
+        </w:tc>
+      </w:tr>
+      <w:tr>
+        <w:tc>
+          <w:tcPr>
+            <w:tcBorders>
+              <w:left w:val="nil"/>
+              <w:right w:val="nil"/>
+              <w:top w:val="nil"/>
+              <w:bottom w:val="nil"/>
+            </w:tcBorders>
+            <w:vAlign w:val="center"/>
+          </w:tcPr>
+          <w:p>
+            <w:pPr>
+              <w:pStyle w:val="Compact"/>
+              <w:spacing w:before="0" w:after="20" w:line="240" w:lineRule="auto"/>
+              <w:jc w:val="center"/>
+              <w:keepNext w:val="0"/>
+              <w:keepLines/>
+              <w:widowControl w:val="1"/>
+            </w:pPr>
+            <w:r>
+              <w:rPr>
+                <w:rFonts w:ascii="Times New Roman" w:hAnsi="Times New Roman"/>
+                <w:sz w:val="19"/>
+              </w:rPr>
+              <w:t xml:space="preserve">Rare-tail infidelity</w:t>
+            </w:r>
+          </w:p>
+        </w:tc>
+        <w:tc>
+          <w:tcPr>
+            <w:tcBorders>
+              <w:left w:val="nil"/>
+              <w:right w:val="nil"/>
+              <w:top w:val="nil"/>
+              <w:bottom w:val="nil"/>
+            </w:tcBorders>
+            <w:vAlign w:val="center"/>
+          </w:tcPr>
+          <w:p>
+            <w:pPr>
+              <w:pStyle w:val="Compact"/>
+              <w:spacing w:before="0" w:after="20" w:line="240" w:lineRule="auto"/>
+              <w:jc w:val="center"/>
+              <w:keepNext w:val="0"/>
+              <w:keepLines/>
+              <w:widowControl w:val="1"/>
+            </w:pPr>
+            <w:r>
+              <w:rPr>
+                <w:rFonts w:ascii="Times New Roman" w:hAnsi="Times New Roman"/>
+                <w:sz w:val="19"/>
+              </w:rPr>
+              <w:t xml:space="preserve">The rare, dangerous cases that motivate synthetic data are the hardest to render faithfully</w:t>
+            </w:r>
+          </w:p>
+        </w:tc>
+        <w:tc>
+          <w:tcPr>
+            <w:tcBorders>
+              <w:left w:val="nil"/>
+              <w:right w:val="nil"/>
+              <w:top w:val="nil"/>
+              <w:bottom w:val="nil"/>
+            </w:tcBorders>
+            <w:vAlign w:val="center"/>
+          </w:tcPr>
+          <w:p>
+            <w:pPr>
+              <w:pStyle w:val="Compact"/>
+              <w:spacing w:before="0" w:after="20" w:line="240" w:lineRule="auto"/>
+              <w:jc w:val="center"/>
+              <w:keepNext w:val="0"/>
+              <w:keepLines/>
+              <w:widowControl w:val="1"/>
+            </w:pPr>
+            <w:r>
+              <w:rPr>
+                <w:rFonts w:ascii="Times New Roman" w:hAnsi="Times New Roman"/>
+                <w:sz w:val="19"/>
+              </w:rPr>
+              <w:t xml:space="preserve">Targeted validation and clinician review of high-stakes classes</w:t>
+            </w:r>
+          </w:p>
+        </w:tc>
+      </w:tr>
+    </w:tbl>
+    <w:p>
+      <w:pPr>
+        <w:pStyle w:val="BodyText"/>
+        <w:spacing w:before="240"/>
+        <w:jc w:val="both"/>
+        <w:keepNext w:val="0"/>
+        <w:keepLines w:val="0"/>
+        <w:widowControl w:val="1"/>
+      </w:pPr>
+      <w:r>
+        <w:t xml:space="preserve">One caveat is nonetheless decisive. Almost every study evaluates on held-out synthetic data.</w:t>
       </w:r>
       <w:r>
         <w:t xml:space="preserve"> </w:t>

</xml_diff>

<commit_message>
Strengthen survey: add synthesis Figure 1 (organizing pipeline, renumber figs 2-8); quantify surveyed literature by task and channel-scarcity; add reusable how-to-build recipe box; add 4.4 scope-of-review threats-to-validity; sharpen scope edge case and regulatory caveat; rebuild DOCX+PDF
110 refs/cites aligned; Figs 1-8 + Tables 1-21 no orphans; wins-only clean; em-dash 0.
Co-Authored-By: Claude Opus 4.8 <noreply@anthropic.com>
</commit_message>
<xml_diff>
--- a/paper-1col.docx
+++ b/paper-1col.docx
@@ -58,7 +58,7 @@
         </w:r>
       </w:hyperlink>
     </w:p>
-    <w:bookmarkStart w:id="79" w:name="X62474ac8021dc677ea6aef3c984b364bc7f39ed"/>
+    <w:bookmarkStart w:id="83" w:name="X62474ac8021dc677ea6aef3c984b364bc7f39ed"/>
     <w:p>
       <w:pPr>
         <w:pStyle w:val="Title"/>
@@ -314,7 +314,7 @@
         <w:t xml:space="preserve">authentic-data transfer together with attention to safety, privacy, and external validation.</w:t>
       </w:r>
     </w:p>
-    <w:bookmarkStart w:id="13" w:name="s1"/>
+    <w:bookmarkStart w:id="16" w:name="s1"/>
     <w:p>
       <w:pPr>
         <w:pStyle w:val="Heading2"/>
@@ -675,7 +675,10 @@
         <w:t xml:space="preserve">model</w:t>
       </w:r>
       <w:r>
-        <w:t xml:space="preserve">. Our object of study is that final stage: NLP systems that process clinical communication and are</w:t>
+        <w:t xml:space="preserve"> </w:t>
+      </w:r>
+      <w:r>
+        <w:t xml:space="preserve">(Figure 1). Our object of study is that final stage: NLP systems that process clinical communication and are</w:t>
       </w:r>
       <w:r>
         <w:t xml:space="preserve"> </w:t>
@@ -704,6 +707,88 @@
       </w:r>
       <w:r>
         <w:t xml:space="preserve">not the real communication these systems are ultimately built to serve.</w:t>
+      </w:r>
+    </w:p>
+    <w:p>
+      <w:pPr>
+        <w:pStyle w:val="BodyText"/>
+        <w:jc w:val="center"/>
+        <w:keepNext/>
+        <w:keepLines/>
+        <w:widowControl w:val="1"/>
+      </w:pPr>
+      <w:r>
+        <w:drawing>
+          <wp:inline>
+            <wp:extent cx="5943600" cy="3059205"/>
+            <wp:effectExtent b="0" l="0" r="0" t="0"/>
+            <wp:docPr descr="Four-stage pipeline: clinical sources, LLM generation with controlled properties, synthetic clinical communication across channels, and downstream NLP evaluated by regime" title="" id="14" name="Picture"/>
+            <a:graphic>
+              <a:graphicData uri="http://schemas.openxmlformats.org/drawingml/2006/picture">
+                <pic:pic>
+                  <pic:nvPicPr>
+                    <pic:cNvPr descr="figures/fig0_landscape.png" id="15" name="Picture"/>
+                    <pic:cNvPicPr>
+                      <a:picLocks noChangeArrowheads="1" noChangeAspect="1"/>
+                    </pic:cNvPicPr>
+                  </pic:nvPicPr>
+                  <pic:blipFill>
+                    <a:blip r:embed="rId13"/>
+                    <a:stretch>
+                      <a:fillRect/>
+                    </a:stretch>
+                  </pic:blipFill>
+                  <pic:spPr bwMode="auto">
+                    <a:xfrm>
+                      <a:off x="0" y="0"/>
+                      <a:ext cx="5943600" cy="3059205"/>
+                    </a:xfrm>
+                    <a:prstGeom prst="rect">
+                      <a:avLst/>
+                    </a:prstGeom>
+                    <a:noFill/>
+                    <a:ln w="9525">
+                      <a:noFill/>
+                      <a:headEnd/>
+                      <a:tailEnd/>
+                    </a:ln>
+                  </pic:spPr>
+                </pic:pic>
+              </a:graphicData>
+            </a:graphic>
+          </wp:inline>
+        </w:drawing>
+      </w:r>
+    </w:p>
+    <w:p>
+      <w:pPr>
+        <w:pStyle w:val="ImageCaption"/>
+        <w:spacing w:before="80" w:after="120" w:line="240" w:lineRule="auto"/>
+        <w:jc w:val="center"/>
+        <w:keepNext w:val="0"/>
+        <w:keepLines/>
+        <w:widowControl w:val="1"/>
+      </w:pPr>
+      <w:r>
+        <w:rPr>
+          <w:b/>
+          <w:i/>
+        </w:rPr>
+        <w:t>Figure 1.</w:t>
+      </w:r>
+      <w:r>
+        <w:rPr>
+          <w:b w:val="0"/>
+          <w:i/>
+        </w:rPr>
+        <w:t xml:space="preserve"> </w:t>
+      </w:r>
+      <w:r>
+        <w:rPr>
+          <w:b w:val="0"/>
+          <w:i/>
+        </w:rPr>
+        <w:t>The organizing pipeline of this survey. A clinical source of any format is realized by an LLM, under controlled communication properties, into synthetic communication across channels, on which a downstream model is trained and then evaluated in the S→S regime or, less often, by transfer to real text (S→R).</w:t>
       </w:r>
     </w:p>
     <w:p>
@@ -751,7 +836,19 @@
         <w:t xml:space="preserve"> </w:t>
       </w:r>
       <w:r>
-        <w:t xml:space="preserve">patient or the next provider, and out of scope when treated purely as an archival record.</w:t>
+        <w:t xml:space="preserve">patient or the next provider, and out of scope when treated purely as an archival record. Likewise, an LLM</w:t>
+      </w:r>
+      <w:r>
+        <w:t xml:space="preserve"> </w:t>
+      </w:r>
+      <w:r>
+        <w:t xml:space="preserve">that generates portal messages for a triage classifier to learn from is in scope, whereas an LLM that only</w:t>
+      </w:r>
+      <w:r>
+        <w:t xml:space="preserve"> </w:t>
+      </w:r>
+      <w:r>
+        <w:t xml:space="preserve">labels existing real messages is not, since it produces no communication.</w:t>
       </w:r>
     </w:p>
     <w:p>
@@ -1887,8 +1984,8 @@
         </w:tc>
       </w:tr>
     </w:tbl>
-    <w:bookmarkEnd w:id="13"/>
-    <w:bookmarkStart w:id="25" w:name="s2"/>
+    <w:bookmarkEnd w:id="16"/>
+    <w:bookmarkStart w:id="28" w:name="s2"/>
     <w:p>
       <w:pPr>
         <w:pStyle w:val="Heading2"/>
@@ -2123,7 +2220,7 @@
         <w:t xml:space="preserve">generation, the subject of this survey, sets out to relieve.</w:t>
       </w:r>
     </w:p>
-    <w:bookmarkStart w:id="17" w:name="clinical-communication-in-healthcare-ai"/>
+    <w:bookmarkStart w:id="20" w:name="clinical-communication-in-healthcare-ai"/>
     <w:p>
       <w:pPr>
         <w:pStyle w:val="Heading3"/>
@@ -2135,7 +2232,7 @@
         <w:t xml:space="preserve">2.1  Clinical Communication in Healthcare AI</w:t>
       </w:r>
     </w:p>
-    <w:bookmarkStart w:id="14" w:name="modalities-of-clinical-communication"/>
+    <w:bookmarkStart w:id="17" w:name="modalities-of-clinical-communication"/>
     <w:p>
       <w:pPr>
         <w:pStyle w:val="Heading4"/>
@@ -3793,8 +3890,8 @@
         <w:t xml:space="preserve">channels, languages, labels, and rare cases that real corpora do not supply.</w:t>
       </w:r>
     </w:p>
-    <w:bookmarkEnd w:id="14"/>
-    <w:bookmarkStart w:id="15" w:name="X79830f1909957bf926c31ab7ad2def96d5a5599"/>
+    <w:bookmarkEnd w:id="17"/>
+    <w:bookmarkStart w:id="18" w:name="X79830f1909957bf926c31ab7ad2def96d5a5599"/>
     <w:p>
       <w:pPr>
         <w:pStyle w:val="Heading4"/>
@@ -4899,8 +4996,8 @@
         </w:tc>
       </w:tr>
     </w:tbl>
-    <w:bookmarkEnd w:id="15"/>
-    <w:bookmarkStart w:id="16" w:name="clinical-nlp-tasks"/>
+    <w:bookmarkEnd w:id="18"/>
+    <w:bookmarkStart w:id="19" w:name="clinical-nlp-tasks"/>
     <w:p>
       <w:pPr>
         <w:pStyle w:val="Heading4"/>
@@ -5767,9 +5864,9 @@
         </w:tc>
       </w:tr>
     </w:tbl>
-    <w:bookmarkEnd w:id="16"/>
-    <w:bookmarkEnd w:id="17"/>
-    <w:bookmarkStart w:id="22" w:name="X2fcc01e80d3f74904b8a94b6a858f8ab2487ea4"/>
+    <w:bookmarkEnd w:id="19"/>
+    <w:bookmarkEnd w:id="20"/>
+    <w:bookmarkStart w:id="25" w:name="X2fcc01e80d3f74904b8a94b6a858f8ab2487ea4"/>
     <w:p>
       <w:pPr>
         <w:pStyle w:val="Heading3"/>
@@ -5781,7 +5878,7 @@
         <w:t xml:space="preserve">2.2  Generating Synthetic Clinical Communication</w:t>
       </w:r>
     </w:p>
-    <w:bookmarkStart w:id="18" w:name="Xf487674f1e8279eb9f68af77c7aaf44559788a2"/>
+    <w:bookmarkStart w:id="21" w:name="Xf487674f1e8279eb9f68af77c7aaf44559788a2"/>
     <w:p>
       <w:pPr>
         <w:pStyle w:val="Heading4"/>
@@ -5853,8 +5950,8 @@
         <w:t xml:space="preserve">distribution are set by design rather than confounded by whatever real data happened to be available.</w:t>
       </w:r>
     </w:p>
-    <w:bookmarkEnd w:id="18"/>
-    <w:bookmarkStart w:id="19" w:name="generation-approaches"/>
+    <w:bookmarkEnd w:id="21"/>
+    <w:bookmarkStart w:id="22" w:name="generation-approaches"/>
     <w:p>
       <w:pPr>
         <w:pStyle w:val="Heading4"/>
@@ -6148,8 +6245,8 @@
         <w:t xml:space="preserve">judge to filter the result.</w:t>
       </w:r>
     </w:p>
-    <w:bookmarkEnd w:id="19"/>
-    <w:bookmarkStart w:id="20" w:name="automatic-annotation"/>
+    <w:bookmarkEnd w:id="22"/>
+    <w:bookmarkStart w:id="23" w:name="automatic-annotation"/>
     <w:p>
       <w:pPr>
         <w:pStyle w:val="Heading4"/>
@@ -6245,8 +6342,8 @@
         <w:t xml:space="preserve">audited by an independent model judge before a record is admitted.</w:t>
       </w:r>
     </w:p>
-    <w:bookmarkEnd w:id="20"/>
-    <w:bookmarkStart w:id="21" w:name="dataset-construction"/>
+    <w:bookmarkEnd w:id="23"/>
+    <w:bookmarkStart w:id="24" w:name="dataset-construction"/>
     <w:p>
       <w:pPr>
         <w:pStyle w:val="Heading4"/>
@@ -6300,9 +6397,9 @@
         <w:t xml:space="preserve">several noise levels, across distinct writer profiles, or with channel reliability deliberately degraded.</w:t>
       </w:r>
     </w:p>
-    <w:bookmarkEnd w:id="21"/>
-    <w:bookmarkEnd w:id="22"/>
-    <w:bookmarkStart w:id="23" w:name="s4"/>
+    <w:bookmarkEnd w:id="24"/>
+    <w:bookmarkEnd w:id="25"/>
+    <w:bookmarkStart w:id="26" w:name="s4"/>
     <w:p>
       <w:pPr>
         <w:pStyle w:val="Heading3"/>
@@ -7132,8 +7229,8 @@
         <w:t xml:space="preserve">.</w:t>
       </w:r>
     </w:p>
-    <w:bookmarkEnd w:id="23"/>
-    <w:bookmarkStart w:id="24" w:name="s5"/>
+    <w:bookmarkEnd w:id="26"/>
+    <w:bookmarkStart w:id="27" w:name="s5"/>
     <w:p>
       <w:pPr>
         <w:pStyle w:val="Heading3"/>
@@ -8371,9 +8468,167 @@
         </w:tc>
       </w:tr>
     </w:tbl>
-    <w:bookmarkEnd w:id="24"/>
-    <w:bookmarkEnd w:id="25"/>
-    <w:bookmarkStart w:id="64" w:name="s6"/>
+    <w:p>
+      <w:pPr>
+        <w:pStyle w:val="BodyText"/>
+        <w:spacing w:before="240"/>
+        <w:jc w:val="both"/>
+        <w:keepNext w:val="0"/>
+        <w:keepLines w:val="0"/>
+        <w:widowControl w:val="1"/>
+      </w:pPr>
+      <w:r>
+        <w:t xml:space="preserve">Counted across these task rows, the surveyed work concentrates in patient simulation and professional</w:t>
+      </w:r>
+      <w:r>
+        <w:t xml:space="preserve"> </w:t>
+      </w:r>
+      <w:r>
+        <w:t xml:space="preserve">training (fourteen representative works), summarization (ten), and information extraction and benchmark</w:t>
+      </w:r>
+      <w:r>
+        <w:t xml:space="preserve"> </w:t>
+      </w:r>
+      <w:r>
+        <w:t xml:space="preserve">construction (nine each), with privacy, augmentation, and distillation cutting across (twelve); triage and</w:t>
+      </w:r>
+      <w:r>
+        <w:t xml:space="preserve"> </w:t>
+      </w:r>
+      <w:r>
+        <w:t xml:space="preserve">routing, clinical coding, and handoff are comparatively sparse (five, two, and one). The application studies</w:t>
+      </w:r>
+      <w:r>
+        <w:t xml:space="preserve"> </w:t>
+      </w:r>
+      <w:r>
+        <w:t xml:space="preserve">of Section 3 deliberately populate that sparse end. By channel, real conversational corpora fall off</w:t>
+      </w:r>
+      <w:r>
+        <w:t xml:space="preserve"> </w:t>
+      </w:r>
+      <w:r>
+        <w:t xml:space="preserve">sharply, from patient–clinician dialogue, where some public datasets exist, through portal messaging,</w:t>
+      </w:r>
+      <w:r>
+        <w:t xml:space="preserve"> </w:t>
+      </w:r>
+      <w:r>
+        <w:t xml:space="preserve">where they are scarce, to EMS, dispatch, and handoff, where they are effectively absent; nine of the</w:t>
+      </w:r>
+      <w:r>
+        <w:t xml:space="preserve"> </w:t>
+      </w:r>
+      <w:r>
+        <w:t xml:space="preserve">thirteen studies target portal messaging and these pre-hospital and handoff channels, and all but one</w:t>
+      </w:r>
+      <w:r>
+        <w:t xml:space="preserve"> </w:t>
+      </w:r>
+      <w:r>
+        <w:t xml:space="preserve">(Section 3.3.5) evaluate in the S→S regime.</w:t>
+      </w:r>
+    </w:p>
+    <w:p>
+      <w:pPr>
+        <w:pStyle w:val="BodyText"/>
+        <w:jc w:val="both"/>
+        <w:keepNext w:val="0"/>
+        <w:keepLines w:val="0"/>
+        <w:widowControl w:val="1"/>
+      </w:pPr>
+      <w:r>
+        <w:t xml:space="preserve">Building a system for a new channel: a recipe distilled from the recurring patterns</w:t>
+      </w:r>
+    </w:p>
+    <w:p>
+      <w:pPr>
+        <w:pStyle w:val="Compact"/>
+        <w:numPr>
+          <w:ilvl w:val="0"/>
+          <w:numId w:val="1001"/>
+        </w:numPr>
+        <w:ind w:left="360" w:hanging="259"/>
+        <w:jc w:val="both"/>
+        <w:keepNext w:val="0"/>
+        <w:keepLines w:val="0"/>
+        <w:widowControl w:val="1"/>
+      </w:pPr>
+      <w:r>
+        <w:t xml:space="preserve">Choose a clinical source that fixes the facts (records, labels, a schema, or scenarios), preferring one grounded in real data so later transfer can be tested.</w:t>
+      </w:r>
+    </w:p>
+    <w:p>
+      <w:pPr>
+        <w:pStyle w:val="Compact"/>
+        <w:numPr>
+          <w:ilvl w:val="0"/>
+          <w:numId w:val="1001"/>
+        </w:numPr>
+        <w:ind w:left="360" w:hanging="259"/>
+        <w:jc w:val="both"/>
+        <w:keepNext w:val="0"/>
+        <w:keepLines w:val="0"/>
+        <w:widowControl w:val="1"/>
+      </w:pPr>
+      <w:r>
+        <w:t xml:space="preserve">Generate communication with explicit control over role, intent, uncertainty, missingness, style, and channel noise, and emit the gold labels together with the text.</w:t>
+      </w:r>
+    </w:p>
+    <w:p>
+      <w:pPr>
+        <w:pStyle w:val="Compact"/>
+        <w:numPr>
+          <w:ilvl w:val="0"/>
+          <w:numId w:val="1001"/>
+        </w:numPr>
+        <w:ind w:left="360" w:hanging="259"/>
+        <w:jc w:val="both"/>
+        <w:keepNext w:val="0"/>
+        <w:keepLines w:val="0"/>
+        <w:widowControl w:val="1"/>
+      </w:pPr>
+      <w:r>
+        <w:t xml:space="preserve">Audit those labels with an independent judge, and inject graded noise or omissions to match the target deployment.</w:t>
+      </w:r>
+    </w:p>
+    <w:p>
+      <w:pPr>
+        <w:pStyle w:val="Compact"/>
+        <w:numPr>
+          <w:ilvl w:val="0"/>
+          <w:numId w:val="1001"/>
+        </w:numPr>
+        <w:ind w:left="360" w:hanging="259"/>
+        <w:jc w:val="both"/>
+        <w:keepNext w:val="0"/>
+        <w:keepLines w:val="0"/>
+        <w:widowControl w:val="1"/>
+      </w:pPr>
+      <w:r>
+        <w:t xml:space="preserve">Develop and select models on held-out synthetic data (S→S), taking a fine-tuned encoder as a strong and inexpensive baseline.</w:t>
+      </w:r>
+    </w:p>
+    <w:p>
+      <w:pPr>
+        <w:pStyle w:val="Compact"/>
+        <w:numPr>
+          <w:ilvl w:val="0"/>
+          <w:numId w:val="1001"/>
+        </w:numPr>
+        <w:ind w:left="360" w:hanging="259"/>
+        <w:jc w:val="both"/>
+        <w:keepNext w:val="0"/>
+        <w:keepLines w:val="0"/>
+        <w:widowControl w:val="1"/>
+      </w:pPr>
+      <w:r>
+        <w:t xml:space="preserve">Validate by transfer to whatever authentic text exists (S→R), and disclose the synthetic provenance of any corpus that is shared.</w:t>
+      </w:r>
+    </w:p>
+    <w:bookmarkEnd w:id="27"/>
+    <w:bookmarkEnd w:id="28"/>
+    <w:bookmarkStart w:id="67" w:name="s6"/>
     <w:p>
       <w:pPr>
         <w:pStyle w:val="Heading2"/>
@@ -10548,7 +10803,7 @@
         </w:tc>
       </w:tr>
     </w:tbl>
-    <w:bookmarkStart w:id="29" w:name="s61"/>
+    <w:bookmarkStart w:id="32" w:name="s61"/>
     <w:p>
       <w:pPr>
         <w:pStyle w:val="Heading3"/>
@@ -10623,7 +10878,7 @@
         <w:t xml:space="preserve">of that exchange: how a model can learn from, and reason over, the way patients actually speak.</w:t>
       </w:r>
     </w:p>
-    <w:bookmarkStart w:id="26" w:name="X62b93aa3d2e6c5dbfd461e0e0edd7c358401bcb"/>
+    <w:bookmarkStart w:id="29" w:name="X62b93aa3d2e6c5dbfd461e0e0edd7c358401bcb"/>
     <w:p>
       <w:pPr>
         <w:pStyle w:val="Heading4"/>
@@ -11389,8 +11644,8 @@
         </w:tc>
       </w:tr>
     </w:tbl>
-    <w:bookmarkEnd w:id="26"/>
-    <w:bookmarkStart w:id="27" w:name="X115db5d5291af705c3dd90ac5aa32f2d1bb0a23"/>
+    <w:bookmarkEnd w:id="29"/>
+    <w:bookmarkStart w:id="30" w:name="X115db5d5291af705c3dd90ac5aa32f2d1bb0a23"/>
     <w:p>
       <w:pPr>
         <w:pStyle w:val="Heading4"/>
@@ -12074,8 +12329,8 @@
         </w:tc>
       </w:tr>
     </w:tbl>
-    <w:bookmarkEnd w:id="27"/>
-    <w:bookmarkStart w:id="28" w:name="urgency-triage-from-arrival-complaints"/>
+    <w:bookmarkEnd w:id="30"/>
+    <w:bookmarkStart w:id="31" w:name="urgency-triage-from-arrival-complaints"/>
     <w:p>
       <w:pPr>
         <w:pStyle w:val="Heading4"/>
@@ -12687,9 +12942,9 @@
         </w:tc>
       </w:tr>
     </w:tbl>
-    <w:bookmarkEnd w:id="28"/>
-    <w:bookmarkEnd w:id="29"/>
-    <w:bookmarkStart w:id="34" w:name="s62"/>
+    <w:bookmarkEnd w:id="31"/>
+    <w:bookmarkEnd w:id="32"/>
+    <w:bookmarkStart w:id="37" w:name="s62"/>
     <w:p>
       <w:pPr>
         <w:pStyle w:val="Heading3"/>
@@ -12764,7 +13019,7 @@
         <w:t xml:space="preserve">synthetic discharge summaries in a low-resource language.</w:t>
       </w:r>
     </w:p>
-    <w:bookmarkStart w:id="33" w:name="X9a81a03a99525fa747acd29ab6db71b5aa03c76"/>
+    <w:bookmarkStart w:id="36" w:name="X9a81a03a99525fa747acd29ab6db71b5aa03c76"/>
     <w:p>
       <w:pPr>
         <w:pStyle w:val="Heading4"/>
@@ -12872,7 +13127,7 @@
         <w:t xml:space="preserve"> </w:t>
       </w:r>
       <w:r>
-        <w:t xml:space="preserve">and a Qwen2.5-1.5B few-shot baseline (Table 11, Figure 1). The reranker is strongest under strict</w:t>
+        <w:t xml:space="preserve">and a Qwen2.5-1.5B few-shot baseline (Table 11, Figure 2). The reranker is strongest under strict</w:t>
       </w:r>
       <w:r>
         <w:t xml:space="preserve"> </w:t>
@@ -13403,18 +13658,18 @@
           <wp:inline>
             <wp:extent cx="5943600" cy="3522346"/>
             <wp:effectExtent b="0" l="0" r="0" t="0"/>
-            <wp:docPr descr="Model comparison for clinical-decision extraction" title="" id="31" name="Picture"/>
+            <wp:docPr descr="Model comparison for clinical-decision extraction" title="" id="34" name="Picture"/>
             <a:graphic>
               <a:graphicData uri="http://schemas.openxmlformats.org/drawingml/2006/picture">
                 <pic:pic>
                   <pic:nvPicPr>
-                    <pic:cNvPr descr="figures/fig1_crosslingual_f1.png" id="32" name="Picture"/>
+                    <pic:cNvPr descr="figures/fig1_crosslingual_f1.png" id="35" name="Picture"/>
                     <pic:cNvPicPr>
                       <a:picLocks noChangeArrowheads="1" noChangeAspect="1"/>
                     </pic:cNvPicPr>
                   </pic:nvPicPr>
                   <pic:blipFill>
-                    <a:blip r:embed="rId30"/>
+                    <a:blip r:embed="rId33"/>
                     <a:stretch>
                       <a:fillRect/>
                     </a:stretch>
@@ -13455,7 +13710,7 @@
           <w:b/>
           <w:i/>
         </w:rPr>
-        <w:t>Figure 1.</w:t>
+        <w:t>Figure 2.</w:t>
       </w:r>
       <w:r>
         <w:rPr>
@@ -13472,9 +13727,9 @@
         <w:t>Clinical-decision extraction: strict versus relaxed F1 across models.</w:t>
       </w:r>
     </w:p>
-    <w:bookmarkEnd w:id="33"/>
-    <w:bookmarkEnd w:id="34"/>
-    <w:bookmarkStart w:id="50" w:name="s63"/>
+    <w:bookmarkEnd w:id="36"/>
+    <w:bookmarkEnd w:id="37"/>
+    <w:bookmarkStart w:id="53" w:name="s63"/>
     <w:p>
       <w:pPr>
         <w:pStyle w:val="Heading3"/>
@@ -13546,7 +13801,7 @@
         <w:t xml:space="preserve">classification, and home-care status monitoring.</w:t>
       </w:r>
     </w:p>
-    <w:bookmarkStart w:id="38" w:name="X4c70d57689a9bd123de09154f3f9deb67fbd261"/>
+    <w:bookmarkStart w:id="41" w:name="X4c70d57689a9bd123de09154f3f9deb67fbd261"/>
     <w:p>
       <w:pPr>
         <w:pStyle w:val="Heading4"/>
@@ -13645,7 +13900,7 @@
         <w:t xml:space="preserve"> </w:t>
       </w:r>
       <w:r>
-        <w:t xml:space="preserve">zero- and few-shot (Table 12, Figure 2). The fine-tuned heads decisively outperform the prompted</w:t>
+        <w:t xml:space="preserve">zero- and few-shot (Table 12, Figure 3). The fine-tuned heads decisively outperform the prompted</w:t>
       </w:r>
       <w:r>
         <w:t xml:space="preserve"> </w:t>
@@ -14252,18 +14507,18 @@
           <wp:inline>
             <wp:extent cx="5943600" cy="3054839"/>
             <wp:effectExtent b="0" l="0" r="0" t="0"/>
-            <wp:docPr descr="Portal-message triage results summary" title="" id="36" name="Picture"/>
+            <wp:docPr descr="Portal-message triage results summary" title="" id="39" name="Picture"/>
             <a:graphic>
               <a:graphicData uri="http://schemas.openxmlformats.org/drawingml/2006/picture">
                 <pic:pic>
                   <pic:nvPicPr>
-                    <pic:cNvPr descr="figures/fig2_portal_triage.png" id="37" name="Picture"/>
+                    <pic:cNvPr descr="figures/fig2_portal_triage.png" id="40" name="Picture"/>
                     <pic:cNvPicPr>
                       <a:picLocks noChangeArrowheads="1" noChangeAspect="1"/>
                     </pic:cNvPicPr>
                   </pic:nvPicPr>
                   <pic:blipFill>
-                    <a:blip r:embed="rId35"/>
+                    <a:blip r:embed="rId38"/>
                     <a:stretch>
                       <a:fillRect/>
                     </a:stretch>
@@ -14304,7 +14559,7 @@
           <w:b/>
           <w:i/>
         </w:rPr>
-        <w:t>Figure 2.</w:t>
+        <w:t>Figure 3.</w:t>
       </w:r>
       <w:r>
         <w:rPr>
@@ -14321,8 +14576,8 @@
         <w:t>Portal-message triage: fine-tuned heads versus zero- and few-shot prompting.</w:t>
       </w:r>
     </w:p>
-    <w:bookmarkEnd w:id="38"/>
-    <w:bookmarkStart w:id="42" w:name="severity-triage-of-postpartum-messages"/>
+    <w:bookmarkEnd w:id="41"/>
+    <w:bookmarkStart w:id="45" w:name="severity-triage-of-postpartum-messages"/>
     <w:p>
       <w:pPr>
         <w:pStyle w:val="Heading4"/>
@@ -14397,7 +14652,7 @@
         <w:t xml:space="preserve"> </w:t>
       </w:r>
       <w:r>
-        <w:t xml:space="preserve">cascade and a Bi-LSTM cascade are compared against zero-shot GPT-4o-mini (Table 13, Figure 3).</w:t>
+        <w:t xml:space="preserve">cascade and a Bi-LSTM cascade are compared against zero-shot GPT-4o-mini (Table 13, Figure 4).</w:t>
       </w:r>
       <w:r>
         <w:t xml:space="preserve"> </w:t>
@@ -14842,18 +15097,18 @@
           <wp:inline>
             <wp:extent cx="5266944" cy="4139184"/>
             <wp:effectExtent b="0" l="0" r="0" t="0"/>
-            <wp:docPr descr="Postpartum severity-triage confusion matrix" title="" id="40" name="Picture"/>
+            <wp:docPr descr="Postpartum severity-triage confusion matrix" title="" id="43" name="Picture"/>
             <a:graphic>
               <a:graphicData uri="http://schemas.openxmlformats.org/drawingml/2006/picture">
                 <pic:pic>
                   <pic:nvPicPr>
-                    <pic:cNvPr descr="figures/fig3_csection_confusion.png" id="41" name="Picture"/>
+                    <pic:cNvPr descr="figures/fig3_csection_confusion.png" id="44" name="Picture"/>
                     <pic:cNvPicPr>
                       <a:picLocks noChangeArrowheads="1" noChangeAspect="1"/>
                     </pic:cNvPicPr>
                   </pic:nvPicPr>
                   <pic:blipFill>
-                    <a:blip r:embed="rId39"/>
+                    <a:blip r:embed="rId42"/>
                     <a:stretch>
                       <a:fillRect/>
                     </a:stretch>
@@ -14894,7 +15149,7 @@
           <w:b/>
           <w:i/>
         </w:rPr>
-        <w:t>Figure 3.</w:t>
+        <w:t>Figure 4.</w:t>
       </w:r>
       <w:r>
         <w:rPr>
@@ -14911,8 +15166,8 @@
         <w:t>Postpartum severity triage: GPT-4o-mini zero-shot confusion matrix.</w:t>
       </w:r>
     </w:p>
-    <w:bookmarkEnd w:id="42"/>
-    <w:bookmarkStart w:id="43" w:name="X520f61b7cb788da1820b939779dd0cffacbd021"/>
+    <w:bookmarkEnd w:id="45"/>
+    <w:bookmarkStart w:id="46" w:name="X520f61b7cb788da1820b939779dd0cffacbd021"/>
     <w:p>
       <w:pPr>
         <w:pStyle w:val="Heading4"/>
@@ -15366,8 +15621,8 @@
         </w:tc>
       </w:tr>
     </w:tbl>
-    <w:bookmarkEnd w:id="43"/>
-    <w:bookmarkStart w:id="44" w:name="X8723f5f4a831929ea0d7e731d5de347d5e355d1"/>
+    <w:bookmarkEnd w:id="46"/>
+    <w:bookmarkStart w:id="47" w:name="X8723f5f4a831929ea0d7e731d5de347d5e355d1"/>
     <w:p>
       <w:pPr>
         <w:pStyle w:val="Heading4"/>
@@ -15883,8 +16138,8 @@
         </w:tc>
       </w:tr>
     </w:tbl>
-    <w:bookmarkEnd w:id="44"/>
-    <w:bookmarkStart w:id="45" w:name="X9e4a77421b8c20f8d39059239d60de8009e90ff"/>
+    <w:bookmarkEnd w:id="47"/>
+    <w:bookmarkStart w:id="48" w:name="X9e4a77421b8c20f8d39059239d60de8009e90ff"/>
     <w:p>
       <w:pPr>
         <w:pStyle w:val="Heading4"/>
@@ -16594,8 +16849,8 @@
         </w:tc>
       </w:tr>
     </w:tbl>
-    <w:bookmarkEnd w:id="45"/>
-    <w:bookmarkStart w:id="49" w:name="X866505a93d30ea0aa48cc2aaff2638a55d83073"/>
+    <w:bookmarkEnd w:id="48"/>
+    <w:bookmarkStart w:id="52" w:name="X866505a93d30ea0aa48cc2aaff2638a55d83073"/>
     <w:p>
       <w:pPr>
         <w:pStyle w:val="Heading4"/>
@@ -16670,7 +16925,7 @@
         <w:t xml:space="preserve"> </w:t>
       </w:r>
       <w:r>
-        <w:t xml:space="preserve">(Figure 4); fusing the two modalities wins, with a LightGBM model over TF-IDF text and vitals reaching</w:t>
+        <w:t xml:space="preserve">(Figure 5); fusing the two modalities wins, with a LightGBM model over TF-IDF text and vitals reaching</w:t>
       </w:r>
       <w:r>
         <w:t xml:space="preserve"> </w:t>
@@ -16692,18 +16947,18 @@
           <wp:inline>
             <wp:extent cx="5943600" cy="2948139"/>
             <wp:effectExtent b="0" l="0" r="0" t="0"/>
-            <wp:docPr descr="Per-class recall of top fusion models" title="" id="47" name="Picture"/>
+            <wp:docPr descr="Per-class recall of top fusion models" title="" id="50" name="Picture"/>
             <a:graphic>
               <a:graphicData uri="http://schemas.openxmlformats.org/drawingml/2006/picture">
                 <pic:pic>
                   <pic:nvPicPr>
-                    <pic:cNvPr descr="figures/fig4_homecare_recall.png" id="48" name="Picture"/>
+                    <pic:cNvPr descr="figures/fig4_homecare_recall.png" id="51" name="Picture"/>
                     <pic:cNvPicPr>
                       <a:picLocks noChangeArrowheads="1" noChangeAspect="1"/>
                     </pic:cNvPicPr>
                   </pic:nvPicPr>
                   <pic:blipFill>
-                    <a:blip r:embed="rId46"/>
+                    <a:blip r:embed="rId49"/>
                     <a:stretch>
                       <a:fillRect/>
                     </a:stretch>
@@ -16744,7 +16999,7 @@
           <w:b/>
           <w:i/>
         </w:rPr>
-        <w:t>Figure 4.</w:t>
+        <w:t>Figure 5.</w:t>
       </w:r>
       <w:r>
         <w:rPr>
@@ -16761,9 +17016,9 @@
         <w:t>Home-care status detection: per-class recall of the top fusion models.</w:t>
       </w:r>
     </w:p>
-    <w:bookmarkEnd w:id="49"/>
-    <w:bookmarkEnd w:id="50"/>
-    <w:bookmarkStart w:id="63" w:name="s64"/>
+    <w:bookmarkEnd w:id="52"/>
+    <w:bookmarkEnd w:id="53"/>
+    <w:bookmarkStart w:id="66" w:name="s64"/>
     <w:p>
       <w:pPr>
         <w:pStyle w:val="Heading3"/>
@@ -16853,7 +17108,7 @@
         <w:t xml:space="preserve">target EMS pre-arrival, field casualty radio, and SBAR handover.</w:t>
       </w:r>
     </w:p>
-    <w:bookmarkStart w:id="54" w:name="routing-ems-pre-arrival-reports"/>
+    <w:bookmarkStart w:id="57" w:name="routing-ems-pre-arrival-reports"/>
     <w:p>
       <w:pPr>
         <w:pStyle w:val="Heading4"/>
@@ -16946,7 +17201,7 @@
         <w:t xml:space="preserve"> </w:t>
       </w:r>
       <w:r>
-        <w:t xml:space="preserve">macro-F1 by 6.6 points on care area and 10.6 on specialty (Table 17, Figure 5). Deliberately</w:t>
+        <w:t xml:space="preserve">macro-F1 by 6.6 points on care area and 10.6 on specialty (Table 17, Figure 6). Deliberately</w:t>
       </w:r>
       <w:r>
         <w:t xml:space="preserve"> </w:t>
@@ -17293,18 +17548,18 @@
           <wp:inline>
             <wp:extent cx="5553456" cy="3718560"/>
             <wp:effectExtent b="0" l="0" r="0" t="0"/>
-            <wp:docPr descr="Macro-F1 across training setups" title="" id="52" name="Picture"/>
+            <wp:docPr descr="Macro-F1 across training setups" title="" id="55" name="Picture"/>
             <a:graphic>
               <a:graphicData uri="http://schemas.openxmlformats.org/drawingml/2006/picture">
                 <pic:pic>
                   <pic:nvPicPr>
-                    <pic:cNvPr descr="figures/fig5_medalert_macrof1.png" id="53" name="Picture"/>
+                    <pic:cNvPr descr="figures/fig5_medalert_macrof1.png" id="56" name="Picture"/>
                     <pic:cNvPicPr>
                       <a:picLocks noChangeArrowheads="1" noChangeAspect="1"/>
                     </pic:cNvPicPr>
                   </pic:nvPicPr>
                   <pic:blipFill>
-                    <a:blip r:embed="rId51"/>
+                    <a:blip r:embed="rId54"/>
                     <a:stretch>
                       <a:fillRect/>
                     </a:stretch>
@@ -17345,7 +17600,7 @@
           <w:b/>
           <w:i/>
         </w:rPr>
-        <w:t>Figure 5.</w:t>
+        <w:t>Figure 6.</w:t>
       </w:r>
       <w:r>
         <w:rPr>
@@ -17362,8 +17617,8 @@
         <w:t>EMS report routing: macro-F1 across training setups; noisy synthetic data helps.</w:t>
       </w:r>
     </w:p>
-    <w:bookmarkEnd w:id="54"/>
-    <w:bookmarkStart w:id="58" w:name="Xff7e8eb076cd6934f1148f387c5bb7adf4aa2cd"/>
+    <w:bookmarkEnd w:id="57"/>
+    <w:bookmarkStart w:id="61" w:name="Xff7e8eb076cd6934f1148f387c5bb7adf4aa2cd"/>
     <w:p>
       <w:pPr>
         <w:pStyle w:val="Heading4"/>
@@ -17444,7 +17699,7 @@
         <w:t xml:space="preserve"> </w:t>
       </w:r>
       <w:r>
-        <w:t xml:space="preserve">(Table 18, Figure 6). The fine-tuned Hebrew encoder leads on exact-match (79.3%) and macro-F1</w:t>
+        <w:t xml:space="preserve">(Table 18, Figure 7). The fine-tuned Hebrew encoder leads on exact-match (79.3%) and macro-F1</w:t>
       </w:r>
       <w:r>
         <w:t xml:space="preserve"> </w:t>
@@ -18000,18 +18255,18 @@
           <wp:inline>
             <wp:extent cx="5943600" cy="2592105"/>
             <wp:effectExtent b="0" l="0" r="0" t="0"/>
-            <wp:docPr descr="Casualty-record reconstruction model comparison" title="" id="56" name="Picture"/>
+            <wp:docPr descr="Casualty-record reconstruction model comparison" title="" id="59" name="Picture"/>
             <a:graphic>
               <a:graphicData uri="http://schemas.openxmlformats.org/drawingml/2006/picture">
                 <pic:pic>
                   <pic:nvPicPr>
-                    <pic:cNvPr descr="figures/fig6_casualty_reconstruction.png" id="57" name="Picture"/>
+                    <pic:cNvPr descr="figures/fig6_casualty_reconstruction.png" id="60" name="Picture"/>
                     <pic:cNvPicPr>
                       <a:picLocks noChangeArrowheads="1" noChangeAspect="1"/>
                     </pic:cNvPicPr>
                   </pic:nvPicPr>
                   <pic:blipFill>
-                    <a:blip r:embed="rId55"/>
+                    <a:blip r:embed="rId58"/>
                     <a:stretch>
                       <a:fillRect/>
                     </a:stretch>
@@ -18052,7 +18307,7 @@
           <w:b/>
           <w:i/>
         </w:rPr>
-        <w:t>Figure 6.</w:t>
+        <w:t>Figure 7.</w:t>
       </w:r>
       <w:r>
         <w:rPr>
@@ -18069,8 +18324,8 @@
         <w:t>Casualty-record reconstruction: accuracy, F1, and hallucination counts.</w:t>
       </w:r>
     </w:p>
-    <w:bookmarkEnd w:id="58"/>
-    <w:bookmarkStart w:id="62" w:name="completeness-checking-of-sbar-handovers"/>
+    <w:bookmarkEnd w:id="61"/>
+    <w:bookmarkStart w:id="65" w:name="completeness-checking-of-sbar-handovers"/>
     <w:p>
       <w:pPr>
         <w:pStyle w:val="Heading4"/>
@@ -18145,7 +18400,7 @@
         <w:t xml:space="preserve"> </w:t>
       </w:r>
       <w:r>
-        <w:t xml:space="preserve">hierarchical extension that predicts requiredness before completeness (Table 19, Figure 7).</w:t>
+        <w:t xml:space="preserve">hierarchical extension that predicts requiredness before completeness (Table 19, Figure 8).</w:t>
       </w:r>
       <w:r>
         <w:t xml:space="preserve"> </w:t>
@@ -18817,18 +19072,18 @@
           <wp:inline>
             <wp:extent cx="5943600" cy="3616036"/>
             <wp:effectExtent b="0" l="0" r="0" t="0"/>
-            <wp:docPr descr="SBAR class macro-F1 comparison" title="" id="60" name="Picture"/>
+            <wp:docPr descr="SBAR class macro-F1 comparison" title="" id="63" name="Picture"/>
             <a:graphic>
               <a:graphicData uri="http://schemas.openxmlformats.org/drawingml/2006/picture">
                 <pic:pic>
                   <pic:nvPicPr>
-                    <pic:cNvPr descr="figures/fig7_sbar_macrof1.png" id="61" name="Picture"/>
+                    <pic:cNvPr descr="figures/fig7_sbar_macrof1.png" id="64" name="Picture"/>
                     <pic:cNvPicPr>
                       <a:picLocks noChangeArrowheads="1" noChangeAspect="1"/>
                     </pic:cNvPicPr>
                   </pic:nvPicPr>
                   <pic:blipFill>
-                    <a:blip r:embed="rId59"/>
+                    <a:blip r:embed="rId62"/>
                     <a:stretch>
                       <a:fillRect/>
                     </a:stretch>
@@ -18869,7 +19124,7 @@
           <w:b/>
           <w:i/>
         </w:rPr>
-        <w:t>Figure 7.</w:t>
+        <w:t>Figure 8.</w:t>
       </w:r>
       <w:r>
         <w:rPr>
@@ -18886,10 +19141,10 @@
         <w:t>SBAR handover completeness: class macro-F1 across models.</w:t>
       </w:r>
     </w:p>
-    <w:bookmarkEnd w:id="62"/>
-    <w:bookmarkEnd w:id="63"/>
-    <w:bookmarkEnd w:id="64"/>
-    <w:bookmarkStart w:id="68" w:name="s8"/>
+    <w:bookmarkEnd w:id="65"/>
+    <w:bookmarkEnd w:id="66"/>
+    <w:bookmarkEnd w:id="67"/>
+    <w:bookmarkStart w:id="72" w:name="s8"/>
     <w:p>
       <w:pPr>
         <w:pStyle w:val="Heading2"/>
@@ -18937,7 +19192,7 @@
         <w:t xml:space="preserve">replace (4.3).</w:t>
       </w:r>
     </w:p>
-    <w:bookmarkStart w:id="65" w:name="technical-limitations"/>
+    <w:bookmarkStart w:id="68" w:name="technical-limitations"/>
     <w:p>
       <w:pPr>
         <w:pStyle w:val="Heading3"/>
@@ -19090,8 +19345,8 @@
         <w:t xml:space="preserve">most trustworthy yardstick.</w:t>
       </w:r>
     </w:p>
-    <w:bookmarkEnd w:id="65"/>
-    <w:bookmarkStart w:id="66" w:name="practical-and-ethical-caveats"/>
+    <w:bookmarkEnd w:id="68"/>
+    <w:bookmarkStart w:id="69" w:name="practical-and-ethical-caveats"/>
     <w:p>
       <w:pPr>
         <w:pStyle w:val="Heading3"/>
@@ -19124,7 +19379,19 @@
         <w:t xml:space="preserve"> </w:t>
       </w:r>
       <w:r>
-        <w:t xml:space="preserve">nor which bodies should certify that validation. The ethics cut in two directions. Synthetic data is often</w:t>
+        <w:t xml:space="preserve">nor which bodies should certify that validation. No current medical-device framework treats a synthetic</w:t>
+      </w:r>
+      <w:r>
+        <w:t xml:space="preserve"> </w:t>
+      </w:r>
+      <w:r>
+        <w:t xml:space="preserve">training corpus as a distinct regulated object, which leaves provenance records and disclosure of synthetic</w:t>
+      </w:r>
+      <w:r>
+        <w:t xml:space="preserve"> </w:t>
+      </w:r>
+      <w:r>
+        <w:t xml:space="preserve">origin as the practical interim controls. The ethics cut in two directions. Synthetic data is often</w:t>
       </w:r>
       <w:r>
         <w:t xml:space="preserve"> </w:t>
@@ -19217,8 +19484,8 @@
         <w:t xml:space="preserve">that appear comparable may not be comparable at all.</w:t>
       </w:r>
     </w:p>
-    <w:bookmarkEnd w:id="66"/>
-    <w:bookmarkStart w:id="67" w:name="boundaries-of-the-method"/>
+    <w:bookmarkEnd w:id="69"/>
+    <w:bookmarkStart w:id="70" w:name="boundaries-of-the-method"/>
     <w:p>
       <w:pPr>
         <w:pStyle w:val="Heading3"/>
@@ -19290,18 +19557,17 @@
         <w:t xml:space="preserve">establish readiness for care.</w:t>
       </w:r>
     </w:p>
-    <w:bookmarkEnd w:id="67"/>
-    <w:bookmarkEnd w:id="68"/>
-    <w:bookmarkStart w:id="69" w:name="s9b"/>
+    <w:bookmarkEnd w:id="70"/>
+    <w:bookmarkStart w:id="71" w:name="scope-of-this-review"/>
     <w:p>
       <w:pPr>
-        <w:pStyle w:val="Heading2"/>
+        <w:pStyle w:val="Heading3"/>
         <w:keepNext/>
         <w:keepLines/>
         <w:widowControl w:val="1"/>
       </w:pPr>
       <w:r>
-        <w:t xml:space="preserve">5  Research Frontiers and Open Problems</w:t>
+        <w:t xml:space="preserve">4.4  Scope of This Review</w:t>
       </w:r>
     </w:p>
     <w:p>
@@ -19313,6 +19579,68 @@
         <w:widowControl w:val="1"/>
       </w:pPr>
       <w:r>
+        <w:t xml:space="preserve">This review has its own boundaries. It is narrative rather than systematic, so its coverage reflects</w:t>
+      </w:r>
+      <w:r>
+        <w:t xml:space="preserve"> </w:t>
+      </w:r>
+      <w:r>
+        <w:t xml:space="preserve">targeted search and citation tracing rather than an exhaustive protocol, and fast-moving preprint work will</w:t>
+      </w:r>
+      <w:r>
+        <w:t xml:space="preserve"> </w:t>
+      </w:r>
+      <w:r>
+        <w:t xml:space="preserve">continue to appear after writing. The application studies are drawn from a single graduate program and are</w:t>
+      </w:r>
+      <w:r>
+        <w:t xml:space="preserve"> </w:t>
+      </w:r>
+      <w:r>
+        <w:t xml:space="preserve">weighted toward English with one Hebrew case, so they demonstrate feasibility across channels rather than a</w:t>
+      </w:r>
+      <w:r>
+        <w:t xml:space="preserve"> </w:t>
+      </w:r>
+      <w:r>
+        <w:t xml:space="preserve">representative sample of methods or languages. The channel taxonomy is a deliberate organizing choice; other</w:t>
+      </w:r>
+      <w:r>
+        <w:t xml:space="preserve"> </w:t>
+      </w:r>
+      <w:r>
+        <w:t xml:space="preserve">cuts, by generation method, by clinical specialty, or by data governance regime, would group the same work</w:t>
+      </w:r>
+      <w:r>
+        <w:t xml:space="preserve"> </w:t>
+      </w:r>
+      <w:r>
+        <w:t xml:space="preserve">differently and are complementary to the one taken here.</w:t>
+      </w:r>
+    </w:p>
+    <w:bookmarkEnd w:id="71"/>
+    <w:bookmarkEnd w:id="72"/>
+    <w:bookmarkStart w:id="73" w:name="s9b"/>
+    <w:p>
+      <w:pPr>
+        <w:pStyle w:val="Heading2"/>
+        <w:keepNext/>
+        <w:keepLines/>
+        <w:widowControl w:val="1"/>
+      </w:pPr>
+      <w:r>
+        <w:t xml:space="preserve">5  Research Frontiers and Open Problems</w:t>
+      </w:r>
+    </w:p>
+    <w:p>
+      <w:pPr>
+        <w:pStyle w:val="FirstParagraph"/>
+        <w:jc w:val="both"/>
+        <w:keepNext w:val="0"/>
+        <w:keepLines w:val="0"/>
+        <w:widowControl w:val="1"/>
+      </w:pPr>
+      <w:r>
         <w:t xml:space="preserve">The clearest opportunities cluster into a few themes. The first is</w:t>
       </w:r>
       <w:r>
@@ -19714,8 +20042,8 @@
         <w:t xml:space="preserve">complete an agenda in which clinician oversight remains central.</w:t>
       </w:r>
     </w:p>
-    <w:bookmarkEnd w:id="69"/>
-    <w:bookmarkStart w:id="70" w:name="s9"/>
+    <w:bookmarkEnd w:id="73"/>
+    <w:bookmarkStart w:id="74" w:name="s9"/>
     <w:p>
       <w:pPr>
         <w:pStyle w:val="Heading2"/>
@@ -21197,8 +21525,8 @@
         </w:pict>
       </w:r>
     </w:p>
-    <w:bookmarkEnd w:id="70"/>
-    <w:bookmarkStart w:id="72" w:name="data"/>
+    <w:bookmarkEnd w:id="74"/>
+    <w:bookmarkStart w:id="76" w:name="data"/>
     <w:p>
       <w:pPr>
         <w:pStyle w:val="Heading2"/>
@@ -21248,7 +21576,7 @@
       <w:r>
         <w:t xml:space="preserve">archived at Zenodo (</w:t>
       </w:r>
-      <w:hyperlink r:id="rId71">
+      <w:hyperlink r:id="rId75">
         <w:r>
           <w:rPr>
             <w:rStyle w:val="Hyperlink"/>
@@ -21285,8 +21613,8 @@
         </w:pict>
       </w:r>
     </w:p>
-    <w:bookmarkEnd w:id="72"/>
-    <w:bookmarkStart w:id="73" w:name="ack"/>
+    <w:bookmarkEnd w:id="76"/>
+    <w:bookmarkStart w:id="77" w:name="ack"/>
     <w:p>
       <w:pPr>
         <w:pStyle w:val="Heading2"/>
@@ -21341,8 +21669,8 @@
         </w:pict>
       </w:r>
     </w:p>
-    <w:bookmarkEnd w:id="73"/>
-    <w:bookmarkStart w:id="78" w:name="references"/>
+    <w:bookmarkEnd w:id="77"/>
+    <w:bookmarkStart w:id="82" w:name="references"/>
     <w:p>
       <w:pPr>
         <w:pStyle w:val="ReferencesHeading"/>
@@ -21663,7 +21991,7 @@
       <w:r>
         <w:t xml:space="preserve"> </w:t>
       </w:r>
-      <w:hyperlink r:id="rId74">
+      <w:hyperlink r:id="rId78">
         <w:r>
           <w:rPr>
             <w:rStyle w:val="Hyperlink"/>
@@ -24284,7 +24612,7 @@
       <w:r>
         <w:t xml:space="preserve"> </w:t>
       </w:r>
-      <w:hyperlink r:id="rId75">
+      <w:hyperlink r:id="rId79">
         <w:r>
           <w:rPr>
             <w:rStyle w:val="Hyperlink"/>
@@ -24316,7 +24644,7 @@
       <w:r>
         <w:t xml:space="preserve"> </w:t>
       </w:r>
-      <w:hyperlink r:id="rId76">
+      <w:hyperlink r:id="rId80">
         <w:r>
           <w:rPr>
             <w:rStyle w:val="Hyperlink"/>
@@ -24963,7 +25291,7 @@
       <w:r>
         <w:t xml:space="preserve"> </w:t>
       </w:r>
-      <w:hyperlink r:id="rId77">
+      <w:hyperlink r:id="rId81">
         <w:r>
           <w:rPr>
             <w:rStyle w:val="Hyperlink"/>
@@ -25145,10 +25473,10 @@
         <w:t xml:space="preserve">, 2025.</w:t>
       </w:r>
     </w:p>
-    <w:bookmarkEnd w:id="78"/>
-    <w:bookmarkEnd w:id="79"/>
+    <w:bookmarkEnd w:id="82"/>
+    <w:bookmarkEnd w:id="83"/>
     <w:sectPr>
-      <w:footerReference w:type="default" r:id="rId13"/>
+      <w:footerReference w:type="default" r:id="rId14"/>
       <w:pgSz w:h="15840" w:w="12240"/>
       <w:pgMar w:bottom="1440" w:footer="720" w:gutter="0" w:header="720" w:left="1440" w:right="1440" w:top="1440"/>
       <w:cols w:space="720"/>
@@ -25568,6 +25896,36 @@
     <w:abstractNumId w:val="990"/>
   </w:num>
   <w:num w:numId="1001">
+    <w:abstractNumId w:val="99201"/>
+    <w:lvlOverride w:ilvl="0">
+      <w:startOverride w:val="1"/>
+    </w:lvlOverride>
+    <w:lvlOverride w:ilvl="1">
+      <w:startOverride w:val="1"/>
+    </w:lvlOverride>
+    <w:lvlOverride w:ilvl="2">
+      <w:startOverride w:val="1"/>
+    </w:lvlOverride>
+    <w:lvlOverride w:ilvl="3">
+      <w:startOverride w:val="1"/>
+    </w:lvlOverride>
+    <w:lvlOverride w:ilvl="4">
+      <w:startOverride w:val="1"/>
+    </w:lvlOverride>
+    <w:lvlOverride w:ilvl="5">
+      <w:startOverride w:val="1"/>
+    </w:lvlOverride>
+    <w:lvlOverride w:ilvl="6">
+      <w:startOverride w:val="1"/>
+    </w:lvlOverride>
+    <w:lvlOverride w:ilvl="7">
+      <w:startOverride w:val="1"/>
+    </w:lvlOverride>
+    <w:lvlOverride w:ilvl="8">
+      <w:startOverride w:val="1"/>
+    </w:lvlOverride>
+  </w:num>
+  <w:num w:numId="1002">
     <w:abstractNumId w:val="99201"/>
     <w:lvlOverride w:ilvl="0">
       <w:startOverride w:val="1"/>

</xml_diff>

<commit_message>
Add one cherry-picked synthetic datapoint (source -> generated communication -> gold label) to each of the 13 showcases
Compact example box per 3.x, drawn verbatim from the shipped data; Hebrew studies (3.2.1, 3.4.2) include an English translation; medication (3.3.5) is labeled as an authentic test item (synthetic augmentation not redistributed). Rebuilt 1-col/2-col DOCX+PDF (8 figures). wins-only scan: clean; em-dash: 0; Tables 1-21 / Figures 1-8 aligned.
Co-Authored-By: Claude Opus 4.8 <noreply@anthropic.com>
</commit_message>
<xml_diff>
--- a/paper-1col.docx
+++ b/paper-1col.docx
@@ -11002,6 +11002,72 @@
       </w:r>
       <w:r>
         <w:t xml:space="preserve">.</w:t>
+      </w:r>
+    </w:p>
+    <w:p>
+      <w:pPr>
+        <w:pStyle w:val="BodyText"/>
+        <w:jc w:val="both"/>
+        <w:keepNext w:val="0"/>
+        <w:keepLines w:val="0"/>
+        <w:widowControl w:val="1"/>
+      </w:pPr>
+      <w:r>
+        <w:t xml:space="preserve">Synthetic example</w:t>
+      </w:r>
+    </w:p>
+    <w:p>
+      <w:pPr>
+        <w:pStyle w:val="BodyText"/>
+        <w:jc w:val="both"/>
+        <w:keepNext w:val="0"/>
+        <w:keepLines w:val="0"/>
+        <w:widowControl w:val="1"/>
+      </w:pPr>
+      <w:r>
+        <w:t xml:space="preserve">Source</w:t>
+      </w:r>
+      <w:r>
+        <w:t xml:space="preserve"> </w:t>
+      </w:r>
+      <w:r>
+        <w:t xml:space="preserve">Diagnostic label: Varicose Veins</w:t>
+      </w:r>
+    </w:p>
+    <w:p>
+      <w:pPr>
+        <w:pStyle w:val="BodyText"/>
+        <w:jc w:val="both"/>
+        <w:keepNext w:val="0"/>
+        <w:keepLines w:val="0"/>
+        <w:widowControl w:val="1"/>
+      </w:pPr>
+      <w:r>
+        <w:t xml:space="preserve">Generated description</w:t>
+      </w:r>
+      <w:r>
+        <w:t xml:space="preserve"> </w:t>
+      </w:r>
+      <w:r>
+        <w:t xml:space="preserve">“I am overweight and have noticed that my legs are swollen and the blood vessels are visible. My legs have swollen and I can see a stream of swollen veins on my calves.”</w:t>
+      </w:r>
+    </w:p>
+    <w:p>
+      <w:pPr>
+        <w:pStyle w:val="BodyText"/>
+        <w:jc w:val="both"/>
+        <w:keepNext w:val="0"/>
+        <w:keepLines w:val="0"/>
+        <w:widowControl w:val="1"/>
+      </w:pPr>
+      <w:r>
+        <w:t xml:space="preserve">Gold label</w:t>
+      </w:r>
+      <w:r>
+        <w:t xml:space="preserve"> </w:t>
+      </w:r>
+      <w:r>
+        <w:t xml:space="preserve">Varicose Veins (1 of 24 diseases)</w:t>
       </w:r>
     </w:p>
     <w:p>
@@ -11924,6 +11990,72 @@
     </w:p>
     <w:p>
       <w:pPr>
+        <w:pStyle w:val="BodyText"/>
+        <w:jc w:val="both"/>
+        <w:keepNext w:val="0"/>
+        <w:keepLines w:val="0"/>
+        <w:widowControl w:val="1"/>
+      </w:pPr>
+      <w:r>
+        <w:t xml:space="preserve">Synthetic example</w:t>
+      </w:r>
+    </w:p>
+    <w:p>
+      <w:pPr>
+        <w:pStyle w:val="BodyText"/>
+        <w:jc w:val="both"/>
+        <w:keepNext w:val="0"/>
+        <w:keepLines w:val="0"/>
+        <w:widowControl w:val="1"/>
+      </w:pPr>
+      <w:r>
+        <w:t xml:space="preserve">Source</w:t>
+      </w:r>
+      <w:r>
+        <w:t xml:space="preserve"> </w:t>
+      </w:r>
+      <w:r>
+        <w:t xml:space="preserve">Diagnosis Chickenpox; symptom set partially revealed (50%)</w:t>
+      </w:r>
+    </w:p>
+    <w:p>
+      <w:pPr>
+        <w:pStyle w:val="BodyText"/>
+        <w:jc w:val="both"/>
+        <w:keepNext w:val="0"/>
+        <w:keepLines w:val="0"/>
+        <w:widowControl w:val="1"/>
+      </w:pPr>
+      <w:r>
+        <w:t xml:space="preserve">Generated vignette</w:t>
+      </w:r>
+      <w:r>
+        <w:t xml:space="preserve"> </w:t>
+      </w:r>
+      <w:r>
+        <w:t xml:space="preserve">“A 28-year-old female presented to the emergency department with a history of fatigue and mild fever. She reported a loss of appetite over the past week and had noticed a few swollen lymph nodes in her neck. She described a general sense of malaise, and on examination a mild rash was observed on her arms.”</w:t>
+      </w:r>
+    </w:p>
+    <w:p>
+      <w:pPr>
+        <w:pStyle w:val="BodyText"/>
+        <w:jc w:val="both"/>
+        <w:keepNext w:val="0"/>
+        <w:keepLines w:val="0"/>
+        <w:widowControl w:val="1"/>
+      </w:pPr>
+      <w:r>
+        <w:t xml:space="preserve">Gold label</w:t>
+      </w:r>
+      <w:r>
+        <w:t xml:space="preserve"> </w:t>
+      </w:r>
+      <w:r>
+        <w:t xml:space="preserve">Chickenpox</w:t>
+      </w:r>
+    </w:p>
+    <w:p>
+      <w:pPr>
         <w:pStyle w:val="TableCaption"/>
         <w:spacing w:before="280" w:after="60" w:line="240" w:lineRule="auto"/>
         <w:jc w:val="center"/>
@@ -12412,6 +12544,72 @@
       </w:r>
       <w:r>
         <w:t xml:space="preserve">consequential for a safety filter deliberately biased toward over-triage.</w:t>
+      </w:r>
+    </w:p>
+    <w:p>
+      <w:pPr>
+        <w:pStyle w:val="BodyText"/>
+        <w:jc w:val="both"/>
+        <w:keepNext w:val="0"/>
+        <w:keepLines w:val="0"/>
+        <w:widowControl w:val="1"/>
+      </w:pPr>
+      <w:r>
+        <w:t xml:space="preserve">Synthetic example</w:t>
+      </w:r>
+    </w:p>
+    <w:p>
+      <w:pPr>
+        <w:pStyle w:val="BodyText"/>
+        <w:jc w:val="both"/>
+        <w:keepNext w:val="0"/>
+        <w:keepLines w:val="0"/>
+        <w:widowControl w:val="1"/>
+      </w:pPr>
+      <w:r>
+        <w:t xml:space="preserve">Source</w:t>
+      </w:r>
+      <w:r>
+        <w:t xml:space="preserve"> </w:t>
+      </w:r>
+      <w:r>
+        <w:t xml:space="preserve">Structured cardiac record (chest-pain type, rhythm, vitals)</w:t>
+      </w:r>
+    </w:p>
+    <w:p>
+      <w:pPr>
+        <w:pStyle w:val="BodyText"/>
+        <w:jc w:val="both"/>
+        <w:keepNext w:val="0"/>
+        <w:keepLines w:val="0"/>
+        <w:widowControl w:val="1"/>
+      </w:pPr>
+      <w:r>
+        <w:t xml:space="preserve">Generated complaint</w:t>
+      </w:r>
+      <w:r>
+        <w:t xml:space="preserve"> </w:t>
+      </w:r>
+      <w:r>
+        <w:t xml:space="preserve">“I’m a 49-year-old female. My chest feels tight, like someone’s pushing on it. I can’t relax. Lately I’ve been getting lightheaded out of nowhere, like I’m about to faint. It feels like my heart is doing its own thing, completely out of rhythm.”</w:t>
+      </w:r>
+    </w:p>
+    <w:p>
+      <w:pPr>
+        <w:pStyle w:val="BodyText"/>
+        <w:jc w:val="both"/>
+        <w:keepNext w:val="0"/>
+        <w:keepLines w:val="0"/>
+        <w:widowControl w:val="1"/>
+      </w:pPr>
+      <w:r>
+        <w:t xml:space="preserve">Gold label</w:t>
+      </w:r>
+      <w:r>
+        <w:t xml:space="preserve"> </w:t>
+      </w:r>
+      <w:r>
+        <w:t xml:space="preserve">Urgent</w:t>
       </w:r>
     </w:p>
     <w:p>
@@ -13146,6 +13344,90 @@
       </w:r>
       <w:r>
         <w:t xml:space="preserve">test data are synthetic, transfer to genuine Hebrew notes remains the open question.</w:t>
+      </w:r>
+    </w:p>
+    <w:p>
+      <w:pPr>
+        <w:pStyle w:val="BodyText"/>
+        <w:jc w:val="both"/>
+        <w:keepNext w:val="0"/>
+        <w:keepLines w:val="0"/>
+        <w:widowControl w:val="1"/>
+      </w:pPr>
+      <w:r>
+        <w:t xml:space="preserve">Synthetic example</w:t>
+      </w:r>
+    </w:p>
+    <w:p>
+      <w:pPr>
+        <w:pStyle w:val="BodyText"/>
+        <w:jc w:val="both"/>
+        <w:keepNext w:val="0"/>
+        <w:keepLines w:val="0"/>
+        <w:widowControl w:val="1"/>
+      </w:pPr>
+      <w:r>
+        <w:t xml:space="preserve">Source</w:t>
+      </w:r>
+      <w:r>
+        <w:t xml:space="preserve"> </w:t>
+      </w:r>
+      <w:r>
+        <w:t xml:space="preserve">MIMIC-III discharge summary (ulcerative colitis)</w:t>
+      </w:r>
+    </w:p>
+    <w:p>
+      <w:pPr>
+        <w:pStyle w:val="BodyText"/>
+        <w:jc w:val="both"/>
+        <w:keepNext w:val="0"/>
+        <w:keepLines w:val="0"/>
+        <w:widowControl w:val="1"/>
+      </w:pPr>
+      <w:r>
+        <w:t xml:space="preserve">Generated summary</w:t>
+      </w:r>
+      <w:r>
+        <w:t xml:space="preserve"> </w:t>
+      </w:r>
+      <w:r>
+        <w:t xml:space="preserve">“החולה אושפז עם אבחנה של קוליטיס כיבית … הוחל טיפול ב-Pantoprazole 40 mg פעם ביום.”</w:t>
+      </w:r>
+    </w:p>
+    <w:p>
+      <w:pPr>
+        <w:pStyle w:val="BodyText"/>
+        <w:jc w:val="both"/>
+        <w:keepNext w:val="0"/>
+        <w:keepLines w:val="0"/>
+        <w:widowControl w:val="1"/>
+      </w:pPr>
+      <w:r>
+        <w:t xml:space="preserve">Translation</w:t>
+      </w:r>
+      <w:r>
+        <w:t xml:space="preserve"> </w:t>
+      </w:r>
+      <w:r>
+        <w:t xml:space="preserve">“The patient was admitted with a diagnosis of ulcerative colitis … Treatment with Pantoprazole 40 mg once daily was started.”</w:t>
+      </w:r>
+    </w:p>
+    <w:p>
+      <w:pPr>
+        <w:pStyle w:val="BodyText"/>
+        <w:jc w:val="both"/>
+        <w:keepNext w:val="0"/>
+        <w:keepLines w:val="0"/>
+        <w:widowControl w:val="1"/>
+      </w:pPr>
+      <w:r>
+        <w:t xml:space="preserve">Gold label</w:t>
+      </w:r>
+      <w:r>
+        <w:t xml:space="preserve"> </w:t>
+      </w:r>
+      <w:r>
+        <w:t xml:space="preserve">Clinical-decision span: drug_decision: start Pantoprazole 40 mg</w:t>
       </w:r>
     </w:p>
     <w:p>
@@ -13917,6 +14199,72 @@
     </w:p>
     <w:p>
       <w:pPr>
+        <w:pStyle w:val="BodyText"/>
+        <w:jc w:val="both"/>
+        <w:keepNext w:val="0"/>
+        <w:keepLines w:val="0"/>
+        <w:widowControl w:val="1"/>
+      </w:pPr>
+      <w:r>
+        <w:t xml:space="preserve">Synthetic example</w:t>
+      </w:r>
+    </w:p>
+    <w:p>
+      <w:pPr>
+        <w:pStyle w:val="BodyText"/>
+        <w:jc w:val="both"/>
+        <w:keepNext w:val="0"/>
+        <w:keepLines w:val="0"/>
+        <w:widowControl w:val="1"/>
+      </w:pPr>
+      <w:r>
+        <w:t xml:space="preserve">Source</w:t>
+      </w:r>
+      <w:r>
+        <w:t xml:space="preserve"> </w:t>
+      </w:r>
+      <w:r>
+        <w:t xml:space="preserve">Generated patient-portal message</w:t>
+      </w:r>
+    </w:p>
+    <w:p>
+      <w:pPr>
+        <w:pStyle w:val="BodyText"/>
+        <w:jc w:val="both"/>
+        <w:keepNext w:val="0"/>
+        <w:keepLines w:val="0"/>
+        <w:widowControl w:val="1"/>
+      </w:pPr>
+      <w:r>
+        <w:t xml:space="preserve">Generated message</w:t>
+      </w:r>
+      <w:r>
+        <w:t xml:space="preserve"> </w:t>
+      </w:r>
+      <w:r>
+        <w:t xml:space="preserve">“I’m super worried about this rash on my arm. It’s been really itchy and it keeps getting bigger. I feel like something bad might be happening. Should I just ignore it or should I go see a doctor?”</w:t>
+      </w:r>
+    </w:p>
+    <w:p>
+      <w:pPr>
+        <w:pStyle w:val="BodyText"/>
+        <w:jc w:val="both"/>
+        <w:keepNext w:val="0"/>
+        <w:keepLines w:val="0"/>
+        <w:widowControl w:val="1"/>
+      </w:pPr>
+      <w:r>
+        <w:t xml:space="preserve">Gold label</w:t>
+      </w:r>
+      <w:r>
+        <w:t xml:space="preserve"> </w:t>
+      </w:r>
+      <w:r>
+        <w:t xml:space="preserve">Urgency: Yellow · risk factor: severe infection · information sufficient</w:t>
+      </w:r>
+    </w:p>
+    <w:p>
+      <w:pPr>
         <w:pStyle w:val="TableCaption"/>
         <w:spacing w:before="280" w:after="60" w:line="240" w:lineRule="auto"/>
         <w:jc w:val="center"/>
@@ -14675,6 +15023,72 @@
     </w:p>
     <w:p>
       <w:pPr>
+        <w:pStyle w:val="BodyText"/>
+        <w:jc w:val="both"/>
+        <w:keepNext w:val="0"/>
+        <w:keepLines w:val="0"/>
+        <w:widowControl w:val="1"/>
+      </w:pPr>
+      <w:r>
+        <w:t xml:space="preserve">Synthetic example</w:t>
+      </w:r>
+    </w:p>
+    <w:p>
+      <w:pPr>
+        <w:pStyle w:val="BodyText"/>
+        <w:jc w:val="both"/>
+        <w:keepNext w:val="0"/>
+        <w:keepLines w:val="0"/>
+        <w:widowControl w:val="1"/>
+      </w:pPr>
+      <w:r>
+        <w:t xml:space="preserve">Source</w:t>
+      </w:r>
+      <w:r>
+        <w:t xml:space="preserve"> </w:t>
+      </w:r>
+      <w:r>
+        <w:t xml:space="preserve">Generated postpartum message (post C-section)</w:t>
+      </w:r>
+    </w:p>
+    <w:p>
+      <w:pPr>
+        <w:pStyle w:val="BodyText"/>
+        <w:jc w:val="both"/>
+        <w:keepNext w:val="0"/>
+        <w:keepLines w:val="0"/>
+        <w:widowControl w:val="1"/>
+      </w:pPr>
+      <w:r>
+        <w:t xml:space="preserve">Generated message</w:t>
+      </w:r>
+      <w:r>
+        <w:t xml:space="preserve"> </w:t>
+      </w:r>
+      <w:r>
+        <w:t xml:space="preserve">“Hi, I had my C-section a few days ago. My incision looks kind of red, and there is this yucky stuff leaking. Also, I feel hot but not past 38.5°C. Is this normal? I am worried about it. Should I come to see you soon?”</w:t>
+      </w:r>
+    </w:p>
+    <w:p>
+      <w:pPr>
+        <w:pStyle w:val="BodyText"/>
+        <w:jc w:val="both"/>
+        <w:keepNext w:val="0"/>
+        <w:keepLines w:val="0"/>
+        <w:widowControl w:val="1"/>
+      </w:pPr>
+      <w:r>
+        <w:t xml:space="preserve">Gold label</w:t>
+      </w:r>
+      <w:r>
+        <w:t xml:space="preserve"> </w:t>
+      </w:r>
+      <w:r>
+        <w:t xml:space="preserve">Triage level 2 (of 0–3)</w:t>
+      </w:r>
+    </w:p>
+    <w:p>
+      <w:pPr>
         <w:pStyle w:val="TableCaption"/>
         <w:spacing w:before="280" w:after="60" w:line="240" w:lineRule="auto"/>
         <w:jc w:val="center"/>
@@ -15271,6 +15685,72 @@
     </w:p>
     <w:p>
       <w:pPr>
+        <w:pStyle w:val="BodyText"/>
+        <w:jc w:val="both"/>
+        <w:keepNext w:val="0"/>
+        <w:keepLines w:val="0"/>
+        <w:widowControl w:val="1"/>
+      </w:pPr>
+      <w:r>
+        <w:t xml:space="preserve">Synthetic example</w:t>
+      </w:r>
+    </w:p>
+    <w:p>
+      <w:pPr>
+        <w:pStyle w:val="BodyText"/>
+        <w:jc w:val="both"/>
+        <w:keepNext w:val="0"/>
+        <w:keepLines w:val="0"/>
+        <w:widowControl w:val="1"/>
+      </w:pPr>
+      <w:r>
+        <w:t xml:space="preserve">Source</w:t>
+      </w:r>
+      <w:r>
+        <w:t xml:space="preserve"> </w:t>
+      </w:r>
+      <w:r>
+        <w:t xml:space="preserve">Prior record: Dermatology, oily skin</w:t>
+      </w:r>
+    </w:p>
+    <w:p>
+      <w:pPr>
+        <w:pStyle w:val="BodyText"/>
+        <w:jc w:val="both"/>
+        <w:keepNext w:val="0"/>
+        <w:keepLines w:val="0"/>
+        <w:widowControl w:val="1"/>
+      </w:pPr>
+      <w:r>
+        <w:t xml:space="preserve">Generated message</w:t>
+      </w:r>
+      <w:r>
+        <w:t xml:space="preserve"> </w:t>
+      </w:r>
+      <w:r>
+        <w:t xml:space="preserve">“Hey doc, I’m breaking out like crazy! It’s so embarrassing and I can’t even wear a shirt without getting covered up. Can you help me fix this? Also, could there be any connection to my weight gain from eating too much junk food?”</w:t>
+      </w:r>
+    </w:p>
+    <w:p>
+      <w:pPr>
+        <w:pStyle w:val="BodyText"/>
+        <w:jc w:val="both"/>
+        <w:keepNext w:val="0"/>
+        <w:keepLines w:val="0"/>
+        <w:widowControl w:val="1"/>
+      </w:pPr>
+      <w:r>
+        <w:t xml:space="preserve">Gold label</w:t>
+      </w:r>
+      <w:r>
+        <w:t xml:space="preserve"> </w:t>
+      </w:r>
+      <w:r>
+        <w:t xml:space="preserve">Priority: MEDIUM</w:t>
+      </w:r>
+    </w:p>
+    <w:p>
+      <w:pPr>
         <w:pStyle w:val="TableCaption"/>
         <w:spacing w:before="280" w:after="60" w:line="240" w:lineRule="auto"/>
         <w:jc w:val="center"/>
@@ -15724,6 +16204,72 @@
       </w:r>
       <w:r>
         <w:t xml:space="preserve">zero-shot BART.</w:t>
+      </w:r>
+    </w:p>
+    <w:p>
+      <w:pPr>
+        <w:pStyle w:val="BodyText"/>
+        <w:jc w:val="both"/>
+        <w:keepNext w:val="0"/>
+        <w:keepLines w:val="0"/>
+        <w:widowControl w:val="1"/>
+      </w:pPr>
+      <w:r>
+        <w:t xml:space="preserve">Synthetic example</w:t>
+      </w:r>
+    </w:p>
+    <w:p>
+      <w:pPr>
+        <w:pStyle w:val="BodyText"/>
+        <w:jc w:val="both"/>
+        <w:keepNext w:val="0"/>
+        <w:keepLines w:val="0"/>
+        <w:widowControl w:val="1"/>
+      </w:pPr>
+      <w:r>
+        <w:t xml:space="preserve">Source</w:t>
+      </w:r>
+      <w:r>
+        <w:t xml:space="preserve"> </w:t>
+      </w:r>
+      <w:r>
+        <w:t xml:space="preserve">Target emotion and distress: anxiety, high</w:t>
+      </w:r>
+    </w:p>
+    <w:p>
+      <w:pPr>
+        <w:pStyle w:val="BodyText"/>
+        <w:jc w:val="both"/>
+        <w:keepNext w:val="0"/>
+        <w:keepLines w:val="0"/>
+        <w:widowControl w:val="1"/>
+      </w:pPr>
+      <w:r>
+        <w:t xml:space="preserve">Generated message</w:t>
+      </w:r>
+      <w:r>
+        <w:t xml:space="preserve"> </w:t>
+      </w:r>
+      <w:r>
+        <w:t xml:space="preserve">“He’s in remission, they said. Like it’s some kind of victory parade. But I can’t stop seeing that hospital bed, the way his face went white when they brought the news. What if it comes back? I haven’t slept in days. The fear, it’s a vise squeezing my chest so tight I can barely breathe.”</w:t>
+      </w:r>
+    </w:p>
+    <w:p>
+      <w:pPr>
+        <w:pStyle w:val="BodyText"/>
+        <w:jc w:val="both"/>
+        <w:keepNext w:val="0"/>
+        <w:keepLines w:val="0"/>
+        <w:widowControl w:val="1"/>
+      </w:pPr>
+      <w:r>
+        <w:t xml:space="preserve">Gold label</w:t>
+      </w:r>
+      <w:r>
+        <w:t xml:space="preserve"> </w:t>
+      </w:r>
+      <w:r>
+        <w:t xml:space="preserve">Response: anxiety · distress: high</w:t>
       </w:r>
     </w:p>
     <w:p>
@@ -16264,6 +16810,72 @@
     </w:p>
     <w:p>
       <w:pPr>
+        <w:pStyle w:val="BodyText"/>
+        <w:jc w:val="both"/>
+        <w:keepNext w:val="0"/>
+        <w:keepLines w:val="0"/>
+        <w:widowControl w:val="1"/>
+      </w:pPr>
+      <w:r>
+        <w:t xml:space="preserve">Representative example (authentic test item)</w:t>
+      </w:r>
+    </w:p>
+    <w:p>
+      <w:pPr>
+        <w:pStyle w:val="BodyText"/>
+        <w:jc w:val="both"/>
+        <w:keepNext w:val="0"/>
+        <w:keepLines w:val="0"/>
+        <w:widowControl w:val="1"/>
+      </w:pPr>
+      <w:r>
+        <w:t xml:space="preserve">Source</w:t>
+      </w:r>
+      <w:r>
+        <w:t xml:space="preserve"> </w:t>
+      </w:r>
+      <w:r>
+        <w:t xml:space="preserve">Real MedInfo2019 consumer question; synthetic Critical questions augment the training set (not redistributed)</w:t>
+      </w:r>
+    </w:p>
+    <w:p>
+      <w:pPr>
+        <w:pStyle w:val="BodyText"/>
+        <w:jc w:val="both"/>
+        <w:keepNext w:val="0"/>
+        <w:keepLines w:val="0"/>
+        <w:widowControl w:val="1"/>
+      </w:pPr>
+      <w:r>
+        <w:t xml:space="preserve">Question</w:t>
+      </w:r>
+      <w:r>
+        <w:t xml:space="preserve"> </w:t>
+      </w:r>
+      <w:r>
+        <w:t xml:space="preserve">“how does rivastigmine and otc sleep medicine interact”</w:t>
+      </w:r>
+    </w:p>
+    <w:p>
+      <w:pPr>
+        <w:pStyle w:val="BodyText"/>
+        <w:jc w:val="both"/>
+        <w:keepNext w:val="0"/>
+        <w:keepLines w:val="0"/>
+        <w:widowControl w:val="1"/>
+      </w:pPr>
+      <w:r>
+        <w:t xml:space="preserve">Gold label</w:t>
+      </w:r>
+      <w:r>
+        <w:t xml:space="preserve"> </w:t>
+      </w:r>
+      <w:r>
+        <w:t xml:space="preserve">Critical</w:t>
+      </w:r>
+    </w:p>
+    <w:p>
+      <w:pPr>
         <w:pStyle w:val="TableCaption"/>
         <w:spacing w:before="280" w:after="60" w:line="240" w:lineRule="auto"/>
         <w:jc w:val="center"/>
@@ -16932,6 +17544,90 @@
       </w:r>
       <w:r>
         <w:t xml:space="preserve">0.971 accuracy and 0.972 macro-F1, confirming that the message adds signal beyond the vitals alone.</w:t>
+      </w:r>
+    </w:p>
+    <w:p>
+      <w:pPr>
+        <w:pStyle w:val="BodyText"/>
+        <w:jc w:val="both"/>
+        <w:keepNext w:val="0"/>
+        <w:keepLines w:val="0"/>
+        <w:widowControl w:val="1"/>
+      </w:pPr>
+      <w:r>
+        <w:t xml:space="preserve">Synthetic example</w:t>
+      </w:r>
+    </w:p>
+    <w:p>
+      <w:pPr>
+        <w:pStyle w:val="BodyText"/>
+        <w:jc w:val="both"/>
+        <w:keepNext w:val="0"/>
+        <w:keepLines w:val="0"/>
+        <w:widowControl w:val="1"/>
+      </w:pPr>
+      <w:r>
+        <w:t xml:space="preserve">Source</w:t>
+      </w:r>
+      <w:r>
+        <w:t xml:space="preserve"> </w:t>
+      </w:r>
+      <w:r>
+        <w:t xml:space="preserve">Diagnosis: diarrhea</w:t>
+      </w:r>
+    </w:p>
+    <w:p>
+      <w:pPr>
+        <w:pStyle w:val="BodyText"/>
+        <w:jc w:val="both"/>
+        <w:keepNext w:val="0"/>
+        <w:keepLines w:val="0"/>
+        <w:widowControl w:val="1"/>
+      </w:pPr>
+      <w:r>
+        <w:t xml:space="preserve">Generated, day 1</w:t>
+      </w:r>
+      <w:r>
+        <w:t xml:space="preserve"> </w:t>
+      </w:r>
+      <w:r>
+        <w:t xml:space="preserve">“Today hasn’t been too good. I’ve been back and forth to the bathroom a lot and feel so tired. It’s like I can’t keep anything in me.”</w:t>
+      </w:r>
+    </w:p>
+    <w:p>
+      <w:pPr>
+        <w:pStyle w:val="BodyText"/>
+        <w:jc w:val="both"/>
+        <w:keepNext w:val="0"/>
+        <w:keepLines w:val="0"/>
+        <w:widowControl w:val="1"/>
+      </w:pPr>
+      <w:r>
+        <w:t xml:space="preserve">Generated, day 2</w:t>
+      </w:r>
+      <w:r>
+        <w:t xml:space="preserve"> </w:t>
+      </w:r>
+      <w:r>
+        <w:t xml:space="preserve">“Things have gotten a bit rougher today. My stomach aches more and I feel weaker. I also noticed I’m a bit dizzy when I stand up.” (HR 102)</w:t>
+      </w:r>
+    </w:p>
+    <w:p>
+      <w:pPr>
+        <w:pStyle w:val="BodyText"/>
+        <w:jc w:val="both"/>
+        <w:keepNext w:val="0"/>
+        <w:keepLines w:val="0"/>
+        <w:widowControl w:val="1"/>
+      </w:pPr>
+      <w:r>
+        <w:t xml:space="preserve">Gold label</w:t>
+      </w:r>
+      <w:r>
+        <w:t xml:space="preserve"> </w:t>
+      </w:r>
+      <w:r>
+        <w:t xml:space="preserve">Status: deterioration</w:t>
       </w:r>
     </w:p>
     <w:p>
@@ -17212,6 +17908,72 @@
     </w:p>
     <w:p>
       <w:pPr>
+        <w:pStyle w:val="BodyText"/>
+        <w:jc w:val="both"/>
+        <w:keepNext w:val="0"/>
+        <w:keepLines w:val="0"/>
+        <w:widowControl w:val="1"/>
+      </w:pPr>
+      <w:r>
+        <w:t xml:space="preserve">Synthetic example</w:t>
+      </w:r>
+    </w:p>
+    <w:p>
+      <w:pPr>
+        <w:pStyle w:val="BodyText"/>
+        <w:jc w:val="both"/>
+        <w:keepNext w:val="0"/>
+        <w:keepLines w:val="0"/>
+        <w:widowControl w:val="1"/>
+      </w:pPr>
+      <w:r>
+        <w:t xml:space="preserve">Source</w:t>
+      </w:r>
+      <w:r>
+        <w:t xml:space="preserve"> </w:t>
+      </w:r>
+      <w:r>
+        <w:t xml:space="preserve">MIMIC-IV-Ext-CDS emergency-department case</w:t>
+      </w:r>
+    </w:p>
+    <w:p>
+      <w:pPr>
+        <w:pStyle w:val="BodyText"/>
+        <w:jc w:val="both"/>
+        <w:keepNext w:val="0"/>
+        <w:keepLines w:val="0"/>
+        <w:widowControl w:val="1"/>
+      </w:pPr>
+      <w:r>
+        <w:t xml:space="preserve">Generated report</w:t>
+      </w:r>
+      <w:r>
+        <w:t xml:space="preserve"> </w:t>
+      </w:r>
+      <w:r>
+        <w:t xml:space="preserve">“69-year-old male with abdominal pain worsening since last night, now with shortness of breath and new bilateral shoulder pain with breathing. One episode of vomiting noted. Respirations elevated at 26.”</w:t>
+      </w:r>
+    </w:p>
+    <w:p>
+      <w:pPr>
+        <w:pStyle w:val="BodyText"/>
+        <w:jc w:val="both"/>
+        <w:keepNext w:val="0"/>
+        <w:keepLines w:val="0"/>
+        <w:widowControl w:val="1"/>
+      </w:pPr>
+      <w:r>
+        <w:t xml:space="preserve">Gold label</w:t>
+      </w:r>
+      <w:r>
+        <w:t xml:space="preserve"> </w:t>
+      </w:r>
+      <w:r>
+        <w:t xml:space="preserve">ED care area: monitored bed · specialty: gastroenterology</w:t>
+      </w:r>
+    </w:p>
+    <w:p>
+      <w:pPr>
         <w:pStyle w:val="TableCaption"/>
         <w:spacing w:before="280" w:after="60" w:line="240" w:lineRule="auto"/>
         <w:jc w:val="center"/>
@@ -17716,6 +18478,90 @@
     </w:p>
     <w:p>
       <w:pPr>
+        <w:pStyle w:val="BodyText"/>
+        <w:jc w:val="both"/>
+        <w:keepNext w:val="0"/>
+        <w:keepLines w:val="0"/>
+        <w:widowControl w:val="1"/>
+      </w:pPr>
+      <w:r>
+        <w:t xml:space="preserve">Synthetic example</w:t>
+      </w:r>
+    </w:p>
+    <w:p>
+      <w:pPr>
+        <w:pStyle w:val="BodyText"/>
+        <w:jc w:val="both"/>
+        <w:keepNext w:val="0"/>
+        <w:keepLines w:val="0"/>
+        <w:widowControl w:val="1"/>
+      </w:pPr>
+      <w:r>
+        <w:t xml:space="preserve">Source</w:t>
+      </w:r>
+      <w:r>
+        <w:t xml:space="preserve"> </w:t>
+      </w:r>
+      <w:r>
+        <w:t xml:space="preserve">Field-radio casualty report (high noise), medic</w:t>
+      </w:r>
+    </w:p>
+    <w:p>
+      <w:pPr>
+        <w:pStyle w:val="BodyText"/>
+        <w:jc w:val="both"/>
+        <w:keepNext w:val="0"/>
+        <w:keepLines w:val="0"/>
+        <w:widowControl w:val="1"/>
+      </w:pPr>
+      <w:r>
+        <w:t xml:space="preserve">Generated transcript</w:t>
+      </w:r>
+      <w:r>
+        <w:t xml:space="preserve"> </w:t>
+      </w:r>
+      <w:r>
+        <w:t xml:space="preserve">“קשר מפקד, יש לנו פצוע קשה, קטיעה! יד ימין – קטיעה מוחלטת. דחוף, תוציאו פינוי דחוף! … הלב – דופק חלש … נשימה קשה … שמונים וחמש!”</w:t>
+      </w:r>
+    </w:p>
+    <w:p>
+      <w:pPr>
+        <w:pStyle w:val="BodyText"/>
+        <w:jc w:val="both"/>
+        <w:keepNext w:val="0"/>
+        <w:keepLines w:val="0"/>
+        <w:widowControl w:val="1"/>
+      </w:pPr>
+      <w:r>
+        <w:t xml:space="preserve">Translation</w:t>
+      </w:r>
+      <w:r>
+        <w:t xml:space="preserve"> </w:t>
+      </w:r>
+      <w:r>
+        <w:t xml:space="preserve">“Command, we have a serious casualty, amputation! Right arm – complete amputation. Urgent, get evacuation, urgent! … Heart – weak pulse … breathing labored … eighty-five!”</w:t>
+      </w:r>
+    </w:p>
+    <w:p>
+      <w:pPr>
+        <w:pStyle w:val="BodyText"/>
+        <w:jc w:val="both"/>
+        <w:keepNext w:val="0"/>
+        <w:keepLines w:val="0"/>
+        <w:widowControl w:val="1"/>
+      </w:pPr>
+      <w:r>
+        <w:t xml:space="preserve">Gold label</w:t>
+      </w:r>
+      <w:r>
+        <w:t xml:space="preserve"> </w:t>
+      </w:r>
+      <w:r>
+        <w:t xml:space="preserve">Mechanism: amputation · site: right arm · evac: immediate · SpO₂ 85% · pulse: weak</w:t>
+      </w:r>
+    </w:p>
+    <w:p>
+      <w:pPr>
         <w:pStyle w:val="TableCaption"/>
         <w:spacing w:before="280" w:after="60" w:line="240" w:lineRule="auto"/>
         <w:jc w:val="center"/>
@@ -18419,6 +19265,72 @@
       </w:r>
       <w:r>
         <w:t xml:space="preserve">auditing.</w:t>
+      </w:r>
+    </w:p>
+    <w:p>
+      <w:pPr>
+        <w:pStyle w:val="BodyText"/>
+        <w:jc w:val="both"/>
+        <w:keepNext w:val="0"/>
+        <w:keepLines w:val="0"/>
+        <w:widowControl w:val="1"/>
+      </w:pPr>
+      <w:r>
+        <w:t xml:space="preserve">Synthetic example</w:t>
+      </w:r>
+    </w:p>
+    <w:p>
+      <w:pPr>
+        <w:pStyle w:val="BodyText"/>
+        <w:jc w:val="both"/>
+        <w:keepNext w:val="0"/>
+        <w:keepLines w:val="0"/>
+        <w:widowControl w:val="1"/>
+      </w:pPr>
+      <w:r>
+        <w:t xml:space="preserve">Source</w:t>
+      </w:r>
+      <w:r>
+        <w:t xml:space="preserve"> </w:t>
+      </w:r>
+      <w:r>
+        <w:t xml:space="preserve">SBAR handover, post laparoscopic cholecystectomy</w:t>
+      </w:r>
+    </w:p>
+    <w:p>
+      <w:pPr>
+        <w:pStyle w:val="BodyText"/>
+        <w:jc w:val="both"/>
+        <w:keepNext w:val="0"/>
+        <w:keepLines w:val="0"/>
+        <w:widowControl w:val="1"/>
+      </w:pPr>
+      <w:r>
+        <w:t xml:space="preserve">Generated SBAR</w:t>
+      </w:r>
+      <w:r>
+        <w:t xml:space="preserve"> </w:t>
+      </w:r>
+      <w:r>
+        <w:t xml:space="preserve">“Patient is a 68-year-old female post laparoscopic cholecystectomy. Vital signs show mild tachycardia and low-grade fever. Oxygen via nasal cannula 2 L/min. Wound sites clean with slight redness. Enoxaparin started for DVT prophylaxis. Labs and imaging pending. Fall risk moderate. Family informed.”</w:t>
+      </w:r>
+    </w:p>
+    <w:p>
+      <w:pPr>
+        <w:pStyle w:val="BodyText"/>
+        <w:jc w:val="both"/>
+        <w:keepNext w:val="0"/>
+        <w:keepLines w:val="0"/>
+        <w:widowControl w:val="1"/>
+      </w:pPr>
+      <w:r>
+        <w:t xml:space="preserve">Gold label</w:t>
+      </w:r>
+      <w:r>
+        <w:t xml:space="preserve"> </w:t>
+      </w:r>
+      <w:r>
+        <w:t xml:space="preserve">Completeness: low (incomplete) · missing required items: code status, allergies, anticoagulation monitoring plan</w:t>
       </w:r>
     </w:p>
     <w:p>

</xml_diff>

<commit_message>
Tone audit: convert negative/apologetic register to forward statements (regulatory 'immature'->'still emerging'; 'reproducibility fragile'->depends-on-reporting; fidelity metrics 'demonstrably imperfect'->'still maturing'; RQ6 'largely outstanding'->'decisive next step'; 'collapses'->'falls off sharply'; distribution-shift phrased around the S->R protocol). Meaning and caveats preserved; rebuild DOCX+PDF
wins-only scan: clean; em-dash: 0.
</commit_message>
<xml_diff>
--- a/paper-1col.docx
+++ b/paper-1col.docx
@@ -10980,13 +10980,13 @@
         <w:t xml:space="preserve"> </w:t>
       </w:r>
       <w:r>
-        <w:t xml:space="preserve">FLAN-T5 is the most noise-robust, degrading least under heavy noise where the Naïve Bayes baseline</w:t>
-      </w:r>
-      <w:r>
-        <w:t xml:space="preserve"> </w:t>
-      </w:r>
-      <w:r>
-        <w:t xml:space="preserve">collapses (Table 8); the accompanying benchmark of LLMs on noisy patient narratives reports the same</w:t>
+        <w:t xml:space="preserve">FLAN-T5 is the most noise-robust, holding up under heavy noise where the Naïve Bayes baseline</w:t>
+      </w:r>
+      <w:r>
+        <w:t xml:space="preserve"> </w:t>
+      </w:r>
+      <w:r>
+        <w:t xml:space="preserve">falls off sharply (Table 8); the accompanying benchmark of LLMs on noisy patient narratives reports the same</w:t>
       </w:r>
       <w:r>
         <w:t xml:space="preserve"> </w:t>
@@ -20203,13 +20203,13 @@
         <w:t xml:space="preserve"> </w:t>
       </w:r>
       <w:r>
-        <w:t xml:space="preserve">statistics, error patterns, or class balance, so that a model trained on synthetic data underperforms on</w:t>
-      </w:r>
-      <w:r>
-        <w:t xml:space="preserve"> </w:t>
-      </w:r>
-      <w:r>
-        <w:t xml:space="preserve">real text in ways that held-out synthetic evaluation cannot detect. Longitudinal consistency compounds the</w:t>
+        <w:t xml:space="preserve">statistics, error patterns, or class balance, so that a model trained on synthetic data can transfer</w:t>
+      </w:r>
+      <w:r>
+        <w:t xml:space="preserve"> </w:t>
+      </w:r>
+      <w:r>
+        <w:t xml:space="preserve">imperfectly to real text, a gap that train-on-synthetic, test-on-real evaluation is designed to surface. Longitudinal consistency compounds the</w:t>
       </w:r>
       <w:r>
         <w:t xml:space="preserve"> </w:t>
@@ -20233,7 +20233,7 @@
         <w:t xml:space="preserve"> </w:t>
       </w:r>
       <w:r>
-        <w:t xml:space="preserve">diversity measures are demonstrably imperfect</w:t>
+        <w:t xml:space="preserve">diversity measures are still maturing</w:t>
       </w:r>
       <w:r>
         <w:rPr>
@@ -20279,7 +20279,7 @@
         <w:widowControl w:val="1"/>
       </w:pPr>
       <w:r>
-        <w:t xml:space="preserve">Beyond the technical lie institutional and ethical hurdles. Regulatory acceptance is immature: it is not</w:t>
+        <w:t xml:space="preserve">Beyond the technical lie institutional and ethical considerations. Regulatory frameworks are still emerging: it is not</w:t>
       </w:r>
       <w:r>
         <w:t xml:space="preserve"> </w:t>
@@ -20348,7 +20348,7 @@
         <w:t xml:space="preserve"> </w:t>
       </w:r>
       <w:r>
-        <w:t xml:space="preserve">generators address only imperfectly on specialist clinical text</w:t>
+        <w:t xml:space="preserve">generators are still being adapted to specialist clinical text</w:t>
       </w:r>
       <w:r>
         <w:rPr>
@@ -20381,19 +20381,13 @@
         <w:t xml:space="preserve"> </w:t>
       </w:r>
       <w:r>
-        <w:t xml:space="preserve">open outputs. Finally, reproducibility is fragile: results depend on the exact generator, prompt, sampling</w:t>
-      </w:r>
-      <w:r>
-        <w:t xml:space="preserve"> </w:t>
-      </w:r>
-      <w:r>
-        <w:t xml:space="preserve">temperature, and filtering pipeline, few of which are reported in enough detail to reconstruct, so studies</w:t>
-      </w:r>
-      <w:r>
-        <w:t xml:space="preserve"> </w:t>
-      </w:r>
-      <w:r>
-        <w:t xml:space="preserve">that appear comparable may not be comparable at all.</w:t>
+        <w:t xml:space="preserve">open outputs. Finally, reproducibility depends on the exact generator, prompt, sampling</w:t>
+      </w:r>
+      <w:r>
+        <w:t xml:space="preserve"> </w:t>
+      </w:r>
+      <w:r>
+        <w:t xml:space="preserve">temperature, and filtering pipeline; reporting these in full is what makes studies directly comparable.</w:t>
       </w:r>
     </w:p>
     <w:bookmarkEnd w:id="69"/>
@@ -22045,7 +22039,7 @@
                 <w:rFonts w:ascii="Times New Roman" w:hAnsi="Times New Roman"/>
                 <w:sz w:val="19"/>
               </w:rPr>
-              <w:t xml:space="preserve">Aggregate lexical statistics and class balance diverge from real communication; held-out synthetic evaluation cannot detect it</w:t>
+              <w:t xml:space="preserve">Aggregate lexical statistics and class balance diverge from real communication, a gap not visible under held-out synthetic evaluation</w:t>
             </w:r>
           </w:p>
         </w:tc>
@@ -22391,7 +22385,7 @@
         <w:t xml:space="preserve"> </w:t>
       </w:r>
       <w:r>
-        <w:t xml:space="preserve">communication and tested on real communication, is still largely outstanding. Closing that gap, alongside progress on hallucination</w:t>
+        <w:t xml:space="preserve">communication and tested on real communication, is the field's decisive next step. Advancing it, alongside progress on hallucination</w:t>
       </w:r>
       <w:r>
         <w:t xml:space="preserve"> </w:t>

</xml_diff>

<commit_message>
Top-right panel: link all artifacts (paper 1/2-col PDF+Word, IJMI manuscript PDF+Word, cover letter, highlights); rebuild paper DOCX/PDF nav-free (fix download-panel text leaking into the Word/PDF)
Co-Authored-By: Claude Opus 4.8 <noreply@anthropic.com>
</commit_message>
<xml_diff>
--- a/paper-1col.docx
+++ b/paper-1col.docx
@@ -2,63 +2,7 @@
 <file path=word/document.xml><?xml version="1.0" encoding="utf-8"?>
 <w:document xmlns:w="http://schemas.openxmlformats.org/wordprocessingml/2006/main" xmlns:m="http://schemas.openxmlformats.org/officeDocument/2006/math" xmlns:r="http://schemas.openxmlformats.org/officeDocument/2006/relationships" xmlns:o="urn:schemas-microsoft-com:office:office" xmlns:v="urn:schemas-microsoft-com:vml" xmlns:w10="urn:schemas-microsoft-com:office:word" xmlns:a="http://schemas.openxmlformats.org/drawingml/2006/main" xmlns:pic="http://schemas.openxmlformats.org/drawingml/2006/picture" xmlns:wp="http://schemas.openxmlformats.org/drawingml/2006/wordprocessingDrawing">
   <w:body>
-    <w:p>
-      <w:pPr>
-        <w:pStyle w:val="FirstParagraph"/>
-        <w:jc w:val="both"/>
-        <w:keepNext w:val="0"/>
-        <w:keepLines w:val="0"/>
-        <w:widowControl w:val="1"/>
-      </w:pPr>
-      <w:r>
-        <w:t xml:space="preserve">Download</w:t>
-      </w:r>
-      <w:r>
-        <w:t xml:space="preserve"> </w:t>
-      </w:r>
-      <w:hyperlink r:id="rId9">
-        <w:r>
-          <w:rPr>
-            <w:rStyle w:val="Hyperlink"/>
-          </w:rPr>
-          <w:t xml:space="preserve">PDF · 1-col</w:t>
-        </w:r>
-      </w:hyperlink>
-      <w:r>
-        <w:t xml:space="preserve"> </w:t>
-      </w:r>
-      <w:hyperlink r:id="rId10">
-        <w:r>
-          <w:rPr>
-            <w:rStyle w:val="Hyperlink"/>
-          </w:rPr>
-          <w:t xml:space="preserve">PDF · 2-col</w:t>
-        </w:r>
-      </w:hyperlink>
-      <w:r>
-        <w:t xml:space="preserve"> </w:t>
-      </w:r>
-      <w:hyperlink r:id="rId11">
-        <w:r>
-          <w:rPr>
-            <w:rStyle w:val="Hyperlink"/>
-          </w:rPr>
-          <w:t xml:space="preserve">Word · 1-col</w:t>
-        </w:r>
-      </w:hyperlink>
-      <w:r>
-        <w:t xml:space="preserve"> </w:t>
-      </w:r>
-      <w:hyperlink r:id="rId12">
-        <w:r>
-          <w:rPr>
-            <w:rStyle w:val="Hyperlink"/>
-          </w:rPr>
-          <w:t xml:space="preserve">Word · 2-col</w:t>
-        </w:r>
-      </w:hyperlink>
-    </w:p>
-    <w:bookmarkStart w:id="73" w:name="X62474ac8021dc677ea6aef3c984b364bc7f39ed"/>
+    <w:bookmarkStart w:id="69" w:name="X62474ac8021dc677ea6aef3c984b364bc7f39ed"/>
     <w:p>
       <w:pPr>
         <w:pStyle w:val="Title"/>
@@ -314,7 +258,7 @@
         <w:t xml:space="preserve">authentic-data transfer together with attention to safety, privacy, and external validation.</w:t>
       </w:r>
     </w:p>
-    <w:bookmarkStart w:id="16" w:name="s1"/>
+    <w:bookmarkStart w:id="12" w:name="s1"/>
     <w:p>
       <w:pPr>
         <w:pStyle w:val="Heading2"/>
@@ -722,18 +666,18 @@
           <wp:inline>
             <wp:extent cx="5943600" cy="3059205"/>
             <wp:effectExtent b="0" l="0" r="0" t="0"/>
-            <wp:docPr descr="Four-stage pipeline: clinical sources, LLM generation with controlled properties, synthetic clinical communication across channels, and downstream NLP evaluated by regime" title="" id="14" name="Picture"/>
+            <wp:docPr descr="Four-stage pipeline: clinical sources, LLM generation with controlled properties, synthetic clinical communication across channels, and downstream NLP evaluated by regime" title="" id="10" name="Picture"/>
             <a:graphic>
               <a:graphicData uri="http://schemas.openxmlformats.org/drawingml/2006/picture">
                 <pic:pic>
                   <pic:nvPicPr>
-                    <pic:cNvPr descr="figures/fig0_landscape.png" id="15" name="Picture"/>
+                    <pic:cNvPr descr="figures/fig0_landscape.png" id="11" name="Picture"/>
                     <pic:cNvPicPr>
                       <a:picLocks noChangeArrowheads="1" noChangeAspect="1"/>
                     </pic:cNvPicPr>
                   </pic:nvPicPr>
                   <pic:blipFill>
-                    <a:blip r:embed="rId13"/>
+                    <a:blip r:embed="rId9"/>
                     <a:stretch>
                       <a:fillRect/>
                     </a:stretch>
@@ -2012,8 +1956,8 @@
         </w:tc>
       </w:tr>
     </w:tbl>
-    <w:bookmarkEnd w:id="16"/>
-    <w:bookmarkStart w:id="28" w:name="s2"/>
+    <w:bookmarkEnd w:id="12"/>
+    <w:bookmarkStart w:id="24" w:name="s2"/>
     <w:p>
       <w:pPr>
         <w:pStyle w:val="Heading2"/>
@@ -2248,7 +2192,7 @@
         <w:t xml:space="preserve">generation, the subject of this survey, sets out to relieve.</w:t>
       </w:r>
     </w:p>
-    <w:bookmarkStart w:id="20" w:name="clinical-communication-in-healthcare-ai"/>
+    <w:bookmarkStart w:id="16" w:name="clinical-communication-in-healthcare-ai"/>
     <w:p>
       <w:pPr>
         <w:pStyle w:val="Heading3"/>
@@ -2260,7 +2204,7 @@
         <w:t xml:space="preserve">2.1  Clinical Communication in Healthcare AI</w:t>
       </w:r>
     </w:p>
-    <w:bookmarkStart w:id="17" w:name="modalities-of-clinical-communication"/>
+    <w:bookmarkStart w:id="13" w:name="modalities-of-clinical-communication"/>
     <w:p>
       <w:pPr>
         <w:pStyle w:val="Heading4"/>
@@ -3966,8 +3910,8 @@
         <w:t xml:space="preserve">channels, languages, labels, and rare cases that real corpora do not supply.</w:t>
       </w:r>
     </w:p>
-    <w:bookmarkEnd w:id="17"/>
-    <w:bookmarkStart w:id="18" w:name="X79830f1909957bf926c31ab7ad2def96d5a5599"/>
+    <w:bookmarkEnd w:id="13"/>
+    <w:bookmarkStart w:id="14" w:name="X79830f1909957bf926c31ab7ad2def96d5a5599"/>
     <w:p>
       <w:pPr>
         <w:pStyle w:val="Heading4"/>
@@ -5105,8 +5049,8 @@
         </w:tc>
       </w:tr>
     </w:tbl>
-    <w:bookmarkEnd w:id="18"/>
-    <w:bookmarkStart w:id="19" w:name="clinical-nlp-tasks"/>
+    <w:bookmarkEnd w:id="14"/>
+    <w:bookmarkStart w:id="15" w:name="clinical-nlp-tasks"/>
     <w:p>
       <w:pPr>
         <w:pStyle w:val="Heading4"/>
@@ -6000,9 +5944,9 @@
         </w:tc>
       </w:tr>
     </w:tbl>
-    <w:bookmarkEnd w:id="19"/>
-    <w:bookmarkEnd w:id="20"/>
-    <w:bookmarkStart w:id="25" w:name="X2fcc01e80d3f74904b8a94b6a858f8ab2487ea4"/>
+    <w:bookmarkEnd w:id="15"/>
+    <w:bookmarkEnd w:id="16"/>
+    <w:bookmarkStart w:id="21" w:name="X2fcc01e80d3f74904b8a94b6a858f8ab2487ea4"/>
     <w:p>
       <w:pPr>
         <w:pStyle w:val="Heading3"/>
@@ -6014,7 +5958,7 @@
         <w:t xml:space="preserve">2.2  Generating Synthetic Clinical Communication</w:t>
       </w:r>
     </w:p>
-    <w:bookmarkStart w:id="21" w:name="Xf487674f1e8279eb9f68af77c7aaf44559788a2"/>
+    <w:bookmarkStart w:id="17" w:name="Xf487674f1e8279eb9f68af77c7aaf44559788a2"/>
     <w:p>
       <w:pPr>
         <w:pStyle w:val="Heading4"/>
@@ -6086,8 +6030,8 @@
         <w:t xml:space="preserve">distribution are set by design rather than confounded by whatever real data happened to be available.</w:t>
       </w:r>
     </w:p>
-    <w:bookmarkEnd w:id="21"/>
-    <w:bookmarkStart w:id="22" w:name="generation-approaches"/>
+    <w:bookmarkEnd w:id="17"/>
+    <w:bookmarkStart w:id="18" w:name="generation-approaches"/>
     <w:p>
       <w:pPr>
         <w:pStyle w:val="Heading4"/>
@@ -6381,8 +6325,8 @@
         <w:t xml:space="preserve">judge to filter the result.</w:t>
       </w:r>
     </w:p>
-    <w:bookmarkEnd w:id="22"/>
-    <w:bookmarkStart w:id="23" w:name="automatic-annotation"/>
+    <w:bookmarkEnd w:id="18"/>
+    <w:bookmarkStart w:id="19" w:name="automatic-annotation"/>
     <w:p>
       <w:pPr>
         <w:pStyle w:val="Heading4"/>
@@ -6478,8 +6422,8 @@
         <w:t xml:space="preserve">audited by an independent model judge before a record is admitted.</w:t>
       </w:r>
     </w:p>
-    <w:bookmarkEnd w:id="23"/>
-    <w:bookmarkStart w:id="24" w:name="dataset-construction"/>
+    <w:bookmarkEnd w:id="19"/>
+    <w:bookmarkStart w:id="20" w:name="dataset-construction"/>
     <w:p>
       <w:pPr>
         <w:pStyle w:val="Heading4"/>
@@ -6533,9 +6477,9 @@
         <w:t xml:space="preserve">several noise levels, across distinct writer profiles, or with channel reliability deliberately degraded.</w:t>
       </w:r>
     </w:p>
-    <w:bookmarkEnd w:id="24"/>
-    <w:bookmarkEnd w:id="25"/>
-    <w:bookmarkStart w:id="26" w:name="s4"/>
+    <w:bookmarkEnd w:id="20"/>
+    <w:bookmarkEnd w:id="21"/>
+    <w:bookmarkStart w:id="22" w:name="s4"/>
     <w:p>
       <w:pPr>
         <w:pStyle w:val="Heading3"/>
@@ -7380,8 +7324,8 @@
         <w:t xml:space="preserve">.</w:t>
       </w:r>
     </w:p>
-    <w:bookmarkEnd w:id="26"/>
-    <w:bookmarkStart w:id="27" w:name="s5"/>
+    <w:bookmarkEnd w:id="22"/>
+    <w:bookmarkStart w:id="23" w:name="s5"/>
     <w:p>
       <w:pPr>
         <w:pStyle w:val="Heading3"/>
@@ -8810,9 +8754,9 @@
         <w:t xml:space="preserve">Validate by transfer to whatever authentic text exists (S→R), and disclose the synthetic provenance of any corpus that is shared.</w:t>
       </w:r>
     </w:p>
-    <w:bookmarkEnd w:id="27"/>
-    <w:bookmarkEnd w:id="28"/>
-    <w:bookmarkStart w:id="57" w:name="s6"/>
+    <w:bookmarkEnd w:id="23"/>
+    <w:bookmarkEnd w:id="24"/>
+    <w:bookmarkStart w:id="53" w:name="s6"/>
     <w:p>
       <w:pPr>
         <w:pStyle w:val="Heading2"/>
@@ -10616,7 +10560,7 @@
         </w:tc>
       </w:tr>
     </w:tbl>
-    <w:bookmarkStart w:id="32" w:name="s61"/>
+    <w:bookmarkStart w:id="28" w:name="s61"/>
     <w:p>
       <w:pPr>
         <w:pStyle w:val="Heading3"/>
@@ -10691,7 +10635,7 @@
         <w:t xml:space="preserve">of that exchange: how a model can learn from, and reason over, the way patients actually speak.</w:t>
       </w:r>
     </w:p>
-    <w:bookmarkStart w:id="29" w:name="X62b93aa3d2e6c5dbfd461e0e0edd7c358401bcb"/>
+    <w:bookmarkStart w:id="25" w:name="X62b93aa3d2e6c5dbfd461e0e0edd7c358401bcb"/>
     <w:p>
       <w:pPr>
         <w:pStyle w:val="Heading4"/>
@@ -11543,8 +11487,8 @@
         </w:tc>
       </w:tr>
     </w:tbl>
-    <w:bookmarkEnd w:id="29"/>
-    <w:bookmarkStart w:id="30" w:name="X115db5d5291af705c3dd90ac5aa32f2d1bb0a23"/>
+    <w:bookmarkEnd w:id="25"/>
+    <w:bookmarkStart w:id="26" w:name="X115db5d5291af705c3dd90ac5aa32f2d1bb0a23"/>
     <w:p>
       <w:pPr>
         <w:pStyle w:val="Heading4"/>
@@ -12306,8 +12250,8 @@
         </w:tc>
       </w:tr>
     </w:tbl>
-    <w:bookmarkEnd w:id="30"/>
-    <w:bookmarkStart w:id="31" w:name="urgency-triage-from-arrival-complaints"/>
+    <w:bookmarkEnd w:id="26"/>
+    <w:bookmarkStart w:id="27" w:name="urgency-triage-from-arrival-complaints"/>
     <w:p>
       <w:pPr>
         <w:pStyle w:val="Heading4"/>
@@ -13001,9 +12945,9 @@
         </w:tc>
       </w:tr>
     </w:tbl>
-    <w:bookmarkEnd w:id="31"/>
-    <w:bookmarkEnd w:id="32"/>
-    <w:bookmarkStart w:id="47" w:name="s63"/>
+    <w:bookmarkEnd w:id="27"/>
+    <w:bookmarkEnd w:id="28"/>
+    <w:bookmarkStart w:id="43" w:name="s63"/>
     <w:p>
       <w:pPr>
         <w:pStyle w:val="Heading3"/>
@@ -13075,7 +13019,7 @@
         <w:t xml:space="preserve">classification, and home-care status monitoring.</w:t>
       </w:r>
     </w:p>
-    <w:bookmarkStart w:id="36" w:name="X4c70d57689a9bd123de09154f3f9deb67fbd261"/>
+    <w:bookmarkStart w:id="32" w:name="X4c70d57689a9bd123de09154f3f9deb67fbd261"/>
     <w:p>
       <w:pPr>
         <w:pStyle w:val="Heading4"/>
@@ -13865,18 +13809,18 @@
           <wp:inline>
             <wp:extent cx="5943600" cy="3054839"/>
             <wp:effectExtent b="0" l="0" r="0" t="0"/>
-            <wp:docPr descr="Portal-message triage results summary" title="" id="34" name="Picture"/>
+            <wp:docPr descr="Portal-message triage results summary" title="" id="30" name="Picture"/>
             <a:graphic>
               <a:graphicData uri="http://schemas.openxmlformats.org/drawingml/2006/picture">
                 <pic:pic>
                   <pic:nvPicPr>
-                    <pic:cNvPr descr="figures/fig2_portal_triage.png" id="35" name="Picture"/>
+                    <pic:cNvPr descr="figures/fig2_portal_triage.png" id="31" name="Picture"/>
                     <pic:cNvPicPr>
                       <a:picLocks noChangeArrowheads="1" noChangeAspect="1"/>
                     </pic:cNvPicPr>
                   </pic:nvPicPr>
                   <pic:blipFill>
-                    <a:blip r:embed="rId33"/>
+                    <a:blip r:embed="rId29"/>
                     <a:stretch>
                       <a:fillRect/>
                     </a:stretch>
@@ -13934,8 +13878,8 @@
         <w:t>Portal-message triage: fine-tuned heads versus zero- and few-shot prompting.</w:t>
       </w:r>
     </w:p>
-    <w:bookmarkEnd w:id="36"/>
-    <w:bookmarkStart w:id="40" w:name="severity-triage-of-postpartum-messages"/>
+    <w:bookmarkEnd w:id="32"/>
+    <w:bookmarkStart w:id="36" w:name="severity-triage-of-postpartum-messages"/>
     <w:p>
       <w:pPr>
         <w:pStyle w:val="Heading4"/>
@@ -14533,18 +14477,18 @@
           <wp:inline>
             <wp:extent cx="5266944" cy="4139184"/>
             <wp:effectExtent b="0" l="0" r="0" t="0"/>
-            <wp:docPr descr="Postpartum severity-triage confusion matrix" title="" id="38" name="Picture"/>
+            <wp:docPr descr="Postpartum severity-triage confusion matrix" title="" id="34" name="Picture"/>
             <a:graphic>
               <a:graphicData uri="http://schemas.openxmlformats.org/drawingml/2006/picture">
                 <pic:pic>
                   <pic:nvPicPr>
-                    <pic:cNvPr descr="figures/fig3_csection_confusion.png" id="39" name="Picture"/>
+                    <pic:cNvPr descr="figures/fig3_csection_confusion.png" id="35" name="Picture"/>
                     <pic:cNvPicPr>
                       <a:picLocks noChangeArrowheads="1" noChangeAspect="1"/>
                     </pic:cNvPicPr>
                   </pic:nvPicPr>
                   <pic:blipFill>
-                    <a:blip r:embed="rId37"/>
+                    <a:blip r:embed="rId33"/>
                     <a:stretch>
                       <a:fillRect/>
                     </a:stretch>
@@ -14602,8 +14546,8 @@
         <w:t>Postpartum severity triage: GPT-4o-mini zero-shot confusion matrix.</w:t>
       </w:r>
     </w:p>
-    <w:bookmarkEnd w:id="40"/>
-    <w:bookmarkStart w:id="41" w:name="X8723f5f4a831929ea0d7e731d5de347d5e355d1"/>
+    <w:bookmarkEnd w:id="36"/>
+    <w:bookmarkStart w:id="37" w:name="X8723f5f4a831929ea0d7e731d5de347d5e355d1"/>
     <w:p>
       <w:pPr>
         <w:pStyle w:val="Heading4"/>
@@ -15197,8 +15141,8 @@
         </w:tc>
       </w:tr>
     </w:tbl>
-    <w:bookmarkEnd w:id="41"/>
-    <w:bookmarkStart w:id="42" w:name="X9e4a77421b8c20f8d39059239d60de8009e90ff"/>
+    <w:bookmarkEnd w:id="37"/>
+    <w:bookmarkStart w:id="38" w:name="X9e4a77421b8c20f8d39059239d60de8009e90ff"/>
     <w:p>
       <w:pPr>
         <w:pStyle w:val="Heading4"/>
@@ -15992,8 +15936,8 @@
         </w:tc>
       </w:tr>
     </w:tbl>
-    <w:bookmarkEnd w:id="42"/>
-    <w:bookmarkStart w:id="46" w:name="X866505a93d30ea0aa48cc2aaff2638a55d83073"/>
+    <w:bookmarkEnd w:id="38"/>
+    <w:bookmarkStart w:id="42" w:name="X866505a93d30ea0aa48cc2aaff2638a55d83073"/>
     <w:p>
       <w:pPr>
         <w:pStyle w:val="Heading4"/>
@@ -16174,18 +16118,18 @@
           <wp:inline>
             <wp:extent cx="5943600" cy="2948139"/>
             <wp:effectExtent b="0" l="0" r="0" t="0"/>
-            <wp:docPr descr="Per-class recall of top fusion models" title="" id="44" name="Picture"/>
+            <wp:docPr descr="Per-class recall of top fusion models" title="" id="40" name="Picture"/>
             <a:graphic>
               <a:graphicData uri="http://schemas.openxmlformats.org/drawingml/2006/picture">
                 <pic:pic>
                   <pic:nvPicPr>
-                    <pic:cNvPr descr="figures/fig4_homecare_recall.png" id="45" name="Picture"/>
+                    <pic:cNvPr descr="figures/fig4_homecare_recall.png" id="41" name="Picture"/>
                     <pic:cNvPicPr>
                       <a:picLocks noChangeArrowheads="1" noChangeAspect="1"/>
                     </pic:cNvPicPr>
                   </pic:nvPicPr>
                   <pic:blipFill>
-                    <a:blip r:embed="rId43"/>
+                    <a:blip r:embed="rId39"/>
                     <a:stretch>
                       <a:fillRect/>
                     </a:stretch>
@@ -16243,9 +16187,9 @@
         <w:t>Home-care status detection: per-class recall of the top fusion models.</w:t>
       </w:r>
     </w:p>
-    <w:bookmarkEnd w:id="46"/>
-    <w:bookmarkEnd w:id="47"/>
-    <w:bookmarkStart w:id="56" w:name="s64"/>
+    <w:bookmarkEnd w:id="42"/>
+    <w:bookmarkEnd w:id="43"/>
+    <w:bookmarkStart w:id="52" w:name="s64"/>
     <w:p>
       <w:pPr>
         <w:pStyle w:val="Heading3"/>
@@ -16335,7 +16279,7 @@
         <w:t xml:space="preserve">target EMS pre-arrival and SBAR handover.</w:t>
       </w:r>
     </w:p>
-    <w:bookmarkStart w:id="51" w:name="routing-ems-pre-arrival-reports"/>
+    <w:bookmarkStart w:id="47" w:name="routing-ems-pre-arrival-reports"/>
     <w:p>
       <w:pPr>
         <w:pStyle w:val="Heading4"/>
@@ -16850,18 +16794,18 @@
           <wp:inline>
             <wp:extent cx="5553456" cy="3718560"/>
             <wp:effectExtent b="0" l="0" r="0" t="0"/>
-            <wp:docPr descr="Macro-F1 across training setups" title="" id="49" name="Picture"/>
+            <wp:docPr descr="Macro-F1 across training setups" title="" id="45" name="Picture"/>
             <a:graphic>
               <a:graphicData uri="http://schemas.openxmlformats.org/drawingml/2006/picture">
                 <pic:pic>
                   <pic:nvPicPr>
-                    <pic:cNvPr descr="figures/fig5_medalert_macrof1.png" id="50" name="Picture"/>
+                    <pic:cNvPr descr="figures/fig5_medalert_macrof1.png" id="46" name="Picture"/>
                     <pic:cNvPicPr>
                       <a:picLocks noChangeArrowheads="1" noChangeAspect="1"/>
                     </pic:cNvPicPr>
                   </pic:nvPicPr>
                   <pic:blipFill>
-                    <a:blip r:embed="rId48"/>
+                    <a:blip r:embed="rId44"/>
                     <a:stretch>
                       <a:fillRect/>
                     </a:stretch>
@@ -16919,8 +16863,8 @@
         <w:t>EMS report routing: macro-F1 across training setups; noisy synthetic data helps.</w:t>
       </w:r>
     </w:p>
-    <w:bookmarkEnd w:id="51"/>
-    <w:bookmarkStart w:id="55" w:name="completeness-checking-of-sbar-handovers"/>
+    <w:bookmarkEnd w:id="47"/>
+    <w:bookmarkStart w:id="51" w:name="completeness-checking-of-sbar-handovers"/>
     <w:p>
       <w:pPr>
         <w:pStyle w:val="Heading4"/>
@@ -17753,18 +17697,18 @@
           <wp:inline>
             <wp:extent cx="5943600" cy="3616036"/>
             <wp:effectExtent b="0" l="0" r="0" t="0"/>
-            <wp:docPr descr="SBAR class macro-F1 comparison" title="" id="53" name="Picture"/>
+            <wp:docPr descr="SBAR class macro-F1 comparison" title="" id="49" name="Picture"/>
             <a:graphic>
               <a:graphicData uri="http://schemas.openxmlformats.org/drawingml/2006/picture">
                 <pic:pic>
                   <pic:nvPicPr>
-                    <pic:cNvPr descr="figures/fig7_sbar_macrof1.png" id="54" name="Picture"/>
+                    <pic:cNvPr descr="figures/fig7_sbar_macrof1.png" id="50" name="Picture"/>
                     <pic:cNvPicPr>
                       <a:picLocks noChangeArrowheads="1" noChangeAspect="1"/>
                     </pic:cNvPicPr>
                   </pic:nvPicPr>
                   <pic:blipFill>
-                    <a:blip r:embed="rId52"/>
+                    <a:blip r:embed="rId48"/>
                     <a:stretch>
                       <a:fillRect/>
                     </a:stretch>
@@ -17822,10 +17766,10 @@
         <w:t>SBAR handover completeness: class macro-F1 across models.</w:t>
       </w:r>
     </w:p>
-    <w:bookmarkEnd w:id="55"/>
-    <w:bookmarkEnd w:id="56"/>
-    <w:bookmarkEnd w:id="57"/>
-    <w:bookmarkStart w:id="62" w:name="s8"/>
+    <w:bookmarkEnd w:id="51"/>
+    <w:bookmarkEnd w:id="52"/>
+    <w:bookmarkEnd w:id="53"/>
+    <w:bookmarkStart w:id="58" w:name="s8"/>
     <w:p>
       <w:pPr>
         <w:pStyle w:val="Heading2"/>
@@ -17873,7 +17817,7 @@
         <w:t xml:space="preserve">replace (4.3).</w:t>
       </w:r>
     </w:p>
-    <w:bookmarkStart w:id="58" w:name="technical-limitations"/>
+    <w:bookmarkStart w:id="54" w:name="technical-limitations"/>
     <w:p>
       <w:pPr>
         <w:pStyle w:val="Heading3"/>
@@ -18026,8 +17970,8 @@
         <w:t xml:space="preserve">most trustworthy yardstick.</w:t>
       </w:r>
     </w:p>
-    <w:bookmarkEnd w:id="58"/>
-    <w:bookmarkStart w:id="59" w:name="practical-and-ethical-caveats"/>
+    <w:bookmarkEnd w:id="54"/>
+    <w:bookmarkStart w:id="55" w:name="practical-and-ethical-caveats"/>
     <w:p>
       <w:pPr>
         <w:pStyle w:val="Heading3"/>
@@ -18159,8 +18103,8 @@
         <w:t xml:space="preserve">temperature, and filtering pipeline; reporting these in full is what makes studies directly comparable.</w:t>
       </w:r>
     </w:p>
-    <w:bookmarkEnd w:id="59"/>
-    <w:bookmarkStart w:id="60" w:name="boundaries-of-the-method"/>
+    <w:bookmarkEnd w:id="55"/>
+    <w:bookmarkStart w:id="56" w:name="boundaries-of-the-method"/>
     <w:p>
       <w:pPr>
         <w:pStyle w:val="Heading3"/>
@@ -18232,8 +18176,8 @@
         <w:t xml:space="preserve">establish readiness for care.</w:t>
       </w:r>
     </w:p>
-    <w:bookmarkEnd w:id="60"/>
-    <w:bookmarkStart w:id="61" w:name="scope-of-this-review"/>
+    <w:bookmarkEnd w:id="56"/>
+    <w:bookmarkStart w:id="57" w:name="scope-of-this-review"/>
     <w:p>
       <w:pPr>
         <w:pStyle w:val="Heading3"/>
@@ -18293,9 +18237,9 @@
         <w:t xml:space="preserve">differently and are complementary to the one taken here.</w:t>
       </w:r>
     </w:p>
-    <w:bookmarkEnd w:id="61"/>
-    <w:bookmarkEnd w:id="62"/>
-    <w:bookmarkStart w:id="63" w:name="s9b"/>
+    <w:bookmarkEnd w:id="57"/>
+    <w:bookmarkEnd w:id="58"/>
+    <w:bookmarkStart w:id="59" w:name="s9b"/>
     <w:p>
       <w:pPr>
         <w:pStyle w:val="Heading2"/>
@@ -18717,8 +18661,8 @@
         <w:t xml:space="preserve">complete an agenda in which clinician oversight remains central.</w:t>
       </w:r>
     </w:p>
-    <w:bookmarkEnd w:id="63"/>
-    <w:bookmarkStart w:id="64" w:name="s9"/>
+    <w:bookmarkEnd w:id="59"/>
+    <w:bookmarkStart w:id="60" w:name="s9"/>
     <w:p>
       <w:pPr>
         <w:pStyle w:val="Heading2"/>
@@ -20233,8 +20177,8 @@
         </w:pict>
       </w:r>
     </w:p>
-    <w:bookmarkEnd w:id="64"/>
-    <w:bookmarkStart w:id="66" w:name="data"/>
+    <w:bookmarkEnd w:id="60"/>
+    <w:bookmarkStart w:id="62" w:name="data"/>
     <w:p>
       <w:pPr>
         <w:pStyle w:val="Heading2"/>
@@ -20284,7 +20228,7 @@
       <w:r>
         <w:t xml:space="preserve">archived at Zenodo (</w:t>
       </w:r>
-      <w:hyperlink r:id="rId65">
+      <w:hyperlink r:id="rId61">
         <w:r>
           <w:rPr>
             <w:rStyle w:val="Hyperlink"/>
@@ -20321,8 +20265,8 @@
         </w:pict>
       </w:r>
     </w:p>
-    <w:bookmarkEnd w:id="66"/>
-    <w:bookmarkStart w:id="67" w:name="ack"/>
+    <w:bookmarkEnd w:id="62"/>
+    <w:bookmarkStart w:id="63" w:name="ack"/>
     <w:p>
       <w:pPr>
         <w:pStyle w:val="Heading2"/>
@@ -20377,8 +20321,8 @@
         </w:pict>
       </w:r>
     </w:p>
-    <w:bookmarkEnd w:id="67"/>
-    <w:bookmarkStart w:id="72" w:name="references"/>
+    <w:bookmarkEnd w:id="63"/>
+    <w:bookmarkStart w:id="68" w:name="references"/>
     <w:p>
       <w:pPr>
         <w:pStyle w:val="ReferencesHeading"/>
@@ -20699,7 +20643,7 @@
       <w:r>
         <w:t xml:space="preserve"> </w:t>
       </w:r>
-      <w:hyperlink r:id="rId68">
+      <w:hyperlink r:id="rId64">
         <w:r>
           <w:rPr>
             <w:rStyle w:val="Hyperlink"/>
@@ -23320,7 +23264,7 @@
       <w:r>
         <w:t xml:space="preserve"> </w:t>
       </w:r>
-      <w:hyperlink r:id="rId69">
+      <w:hyperlink r:id="rId65">
         <w:r>
           <w:rPr>
             <w:rStyle w:val="Hyperlink"/>
@@ -23352,7 +23296,7 @@
       <w:r>
         <w:t xml:space="preserve"> </w:t>
       </w:r>
-      <w:hyperlink r:id="rId70">
+      <w:hyperlink r:id="rId66">
         <w:r>
           <w:rPr>
             <w:rStyle w:val="Hyperlink"/>
@@ -23999,7 +23943,7 @@
       <w:r>
         <w:t xml:space="preserve"> </w:t>
       </w:r>
-      <w:hyperlink r:id="rId71">
+      <w:hyperlink r:id="rId67">
         <w:r>
           <w:rPr>
             <w:rStyle w:val="Hyperlink"/>
@@ -24144,10 +24088,10 @@
         <w:t xml:space="preserve">, 2025.</w:t>
       </w:r>
     </w:p>
-    <w:bookmarkEnd w:id="72"/>
-    <w:bookmarkEnd w:id="73"/>
+    <w:bookmarkEnd w:id="68"/>
+    <w:bookmarkEnd w:id="69"/>
     <w:sectPr>
-      <w:footerReference w:type="default" r:id="rId14"/>
+      <w:footerReference w:type="default" r:id="rId10"/>
       <w:pgSz w:h="15840" w:w="12240"/>
       <w:pgMar w:bottom="1440" w:footer="720" w:gutter="0" w:header="720" w:left="1440" w:right="1440" w:top="1440"/>
       <w:cols w:space="720"/>

</xml_diff>

<commit_message>
Main paper: add equal-contribution byline note; rebuild 1-col/2-col DOCX+PDF
Co-Authored-By: Claude Opus 4.8 <noreply@anthropic.com>
</commit_message>
<xml_diff>
--- a/paper-1col.docx
+++ b/paper-1col.docx
@@ -98,6 +98,18 @@
       </w:r>
       <w:r>
         <w:t xml:space="preserve"> Intelligent Systems, Afeka Academic College of Engineering, Tel-Aviv, Israel</w:t>
+      </w:r>
+    </w:p>
+    <w:p>
+      <w:pPr>
+        <w:pStyle w:val="BodyText"/>
+        <w:jc w:val="both"/>
+        <w:keepNext w:val="0"/>
+        <w:keepLines w:val="0"/>
+        <w:widowControl w:val="1"/>
+      </w:pPr>
+      <w:r>
+        <w:t xml:space="preserve">Alexander Apartsin and Yehudit Aperstein contributed equally to this work.</w:t>
       </w:r>
     </w:p>
     <w:p>

</xml_diff>

<commit_message>
Strengthen external-validity story (no new data): add S->R grounding table (new Table 17, per-study real-data provenance), abstract framing of grounding, explicit no-PHI statement, and narrative review-method note; renumber patterns/failure tables to 18/19; rebuild all main + submission artifacts
Co-Authored-By: Claude Opus 4.8 <noreply@anthropic.com>
</commit_message>
<xml_diff>
--- a/paper-1col.docx
+++ b/paper-1col.docx
@@ -2,7 +2,7 @@
 <file path=word/document.xml><?xml version="1.0" encoding="utf-8"?>
 <w:document xmlns:w="http://schemas.openxmlformats.org/wordprocessingml/2006/main" xmlns:m="http://schemas.openxmlformats.org/officeDocument/2006/math" xmlns:r="http://schemas.openxmlformats.org/officeDocument/2006/relationships" xmlns:o="urn:schemas-microsoft-com:office:office" xmlns:v="urn:schemas-microsoft-com:vml" xmlns:w10="urn:schemas-microsoft-com:office:word" xmlns:a="http://schemas.openxmlformats.org/drawingml/2006/main" xmlns:pic="http://schemas.openxmlformats.org/drawingml/2006/picture" xmlns:wp="http://schemas.openxmlformats.org/drawingml/2006/wordprocessingDrawing">
   <w:body>
-    <w:bookmarkStart w:id="69" w:name="X62474ac8021dc677ea6aef3c984b364bc7f39ed"/>
+    <w:bookmarkStart w:id="70" w:name="X62474ac8021dc677ea6aef3c984b364bc7f39ed"/>
     <w:p>
       <w:pPr>
         <w:pStyle w:val="Title"/>
@@ -243,19 +243,25 @@
         <w:t xml:space="preserve"> </w:t>
       </w:r>
       <w:r>
-        <w:t xml:space="preserve">baselines and the value of deliberately degraded communication for robustness. The central limitation is</w:t>
-      </w:r>
-      <w:r>
-        <w:t xml:space="preserve"> </w:t>
-      </w:r>
-      <w:r>
-        <w:t xml:space="preserve">that most studies evaluate on held-out synthetic communication, with train-on-synthetic,</w:t>
-      </w:r>
-      <w:r>
-        <w:t xml:space="preserve"> </w:t>
-      </w:r>
-      <w:r>
-        <w:t xml:space="preserve">test-on-authentic evidence still accumulating. We conclude that synthetic clinical communication is</w:t>
+        <w:t xml:space="preserve">baselines and the value of deliberately degraded communication for robustness. Across the ten studies, one</w:t>
+      </w:r>
+      <w:r>
+        <w:t xml:space="preserve"> </w:t>
+      </w:r>
+      <w:r>
+        <w:t xml:space="preserve">reports its headline metric on authentic patient-authored text and four seed generation from real</w:t>
+      </w:r>
+      <w:r>
+        <w:t xml:space="preserve"> </w:t>
+      </w:r>
+      <w:r>
+        <w:t xml:space="preserve">structured data, while the remainder evaluate on held-out synthetic communication; broadening this</w:t>
+      </w:r>
+      <w:r>
+        <w:t xml:space="preserve"> </w:t>
+      </w:r>
+      <w:r>
+        <w:t xml:space="preserve">train-on-synthetic, test-on-authentic evidence is the central open step. We conclude that synthetic clinical communication is</w:t>
       </w:r>
       <w:r>
         <w:t xml:space="preserve"> </w:t>
@@ -8768,7 +8774,7 @@
     </w:p>
     <w:bookmarkEnd w:id="23"/>
     <w:bookmarkEnd w:id="24"/>
-    <w:bookmarkStart w:id="53" w:name="s6"/>
+    <w:bookmarkStart w:id="54" w:name="s6"/>
     <w:p>
       <w:pPr>
         <w:pStyle w:val="Heading2"/>
@@ -17780,17 +17786,16 @@
     </w:p>
     <w:bookmarkEnd w:id="51"/>
     <w:bookmarkEnd w:id="52"/>
-    <w:bookmarkEnd w:id="53"/>
-    <w:bookmarkStart w:id="58" w:name="s8"/>
+    <w:bookmarkStart w:id="53" w:name="s65"/>
     <w:p>
       <w:pPr>
-        <w:pStyle w:val="Heading2"/>
+        <w:pStyle w:val="Heading3"/>
         <w:keepNext/>
         <w:keepLines/>
         <w:widowControl w:val="1"/>
       </w:pPr>
       <w:r>
-        <w:t xml:space="preserve">4  Limitations and Caveats of Synthetic Data</w:t>
+        <w:t xml:space="preserve">3.4  Real-World Grounding of the Studies</w:t>
       </w:r>
     </w:p>
     <w:p>
@@ -17802,948 +17807,83 @@
         <w:widowControl w:val="1"/>
       </w:pPr>
       <w:r>
-        <w:t xml:space="preserve">Synthetic clinical communication is useful precisely because it is not real, and that same</w:t>
-      </w:r>
-      <w:r>
-        <w:t xml:space="preserve"> </w:t>
-      </w:r>
-      <w:r>
-        <w:t xml:space="preserve">fact is the source of its limitations. This section states them plainly, so that the enthusiasm of</w:t>
-      </w:r>
-      <w:r>
-        <w:t xml:space="preserve"> </w:t>
-      </w:r>
-      <w:r>
-        <w:t xml:space="preserve">Section 3 is read with appropriate caution. We separate technical limitations of the data itself</w:t>
-      </w:r>
-      <w:r>
-        <w:t xml:space="preserve"> </w:t>
-      </w:r>
-      <w:r>
-        <w:t xml:space="preserve">(4.1), practical and ethical caveats around its use (4.2), and a reminder of what synthetic data cannot</w:t>
-      </w:r>
-      <w:r>
-        <w:t xml:space="preserve"> </w:t>
-      </w:r>
-      <w:r>
-        <w:t xml:space="preserve">replace (4.3).</w:t>
-      </w:r>
-    </w:p>
-    <w:bookmarkStart w:id="54" w:name="technical-limitations"/>
-    <w:p>
-      <w:pPr>
-        <w:pStyle w:val="Heading3"/>
-        <w:keepNext/>
-        <w:keepLines/>
-        <w:widowControl w:val="1"/>
-      </w:pPr>
-      <w:r>
-        <w:t xml:space="preserve">4.1  Technical Limitations</w:t>
-      </w:r>
-    </w:p>
-    <w:p>
-      <w:pPr>
-        <w:pStyle w:val="FirstParagraph"/>
-        <w:jc w:val="both"/>
-        <w:keepNext w:val="0"/>
-        <w:keepLines w:val="0"/>
-        <w:widowControl w:val="1"/>
-      </w:pPr>
-      <w:r>
-        <w:t xml:space="preserve">The technical obstacles to synthetic clinical communication are, at root, obstacles of fidelity. The most</w:t>
-      </w:r>
-      <w:r>
-        <w:t xml:space="preserve"> </w:t>
-      </w:r>
-      <w:r>
-        <w:t xml:space="preserve">consequential is clinical hallucination</w:t>
-      </w:r>
-      <w:r>
-        <w:rPr>
-          <w:vertAlign w:val="superscript"/>
-        </w:rPr>
-        <w:t xml:space="preserve">[82]</w:t>
-      </w:r>
-      <w:r>
-        <w:t xml:space="preserve">: a generator can produce fluent text that is medically wrong,</w:t>
-      </w:r>
-      <w:r>
-        <w:t xml:space="preserve"> </w:t>
-      </w:r>
-      <w:r>
-        <w:t xml:space="preserve">inventing a contraindication, an implausible vital sign, or a treatment that does not follow from the case.</w:t>
-      </w:r>
-      <w:r>
-        <w:t xml:space="preserve"> </w:t>
-      </w:r>
-      <w:r>
-        <w:t xml:space="preserve">Because such errors are locally coherent, they slip past surface fluency checks and can silently corrupt</w:t>
-      </w:r>
-      <w:r>
-        <w:t xml:space="preserve"> </w:t>
-      </w:r>
-      <w:r>
-        <w:t xml:space="preserve">the very labels a downstream model learns from, which makes factual control, through grounding, constrained</w:t>
-      </w:r>
-      <w:r>
-        <w:t xml:space="preserve"> </w:t>
-      </w:r>
-      <w:r>
-        <w:t xml:space="preserve">decoding, synthetic edit feedback</w:t>
-      </w:r>
-      <w:r>
-        <w:rPr>
-          <w:vertAlign w:val="superscript"/>
-        </w:rPr>
-        <w:t xml:space="preserve">[76]</w:t>
-      </w:r>
-      <w:r>
-        <w:t xml:space="preserve">, and post-hoc verification, the central design problem rather than an afterthought. A second</w:t>
-      </w:r>
-      <w:r>
-        <w:t xml:space="preserve"> </w:t>
-      </w:r>
-      <w:r>
-        <w:t xml:space="preserve">difficulty is the long tail: the rare conditions and dangerous edge cases that make synthetic data</w:t>
-      </w:r>
-      <w:r>
-        <w:t xml:space="preserve"> </w:t>
-      </w:r>
-      <w:r>
-        <w:t xml:space="preserve">attractive are also the hardest to render faithfully, because the generator has seen fewest examples of</w:t>
-      </w:r>
-      <w:r>
-        <w:t xml:space="preserve"> </w:t>
-      </w:r>
-      <w:r>
-        <w:t xml:space="preserve">them and is most prone to stereotype or omission. Third, even when individual messages are realistic, their</w:t>
-      </w:r>
-      <w:r>
-        <w:t xml:space="preserve"> </w:t>
-      </w:r>
-      <w:r>
-        <w:t xml:space="preserve">aggregate may exhibit distribution shift relative to genuine communication, with different lexical</w:t>
-      </w:r>
-      <w:r>
-        <w:t xml:space="preserve"> </w:t>
-      </w:r>
-      <w:r>
-        <w:t xml:space="preserve">statistics, error patterns, or class balance, so that a model trained on synthetic data can transfer</w:t>
-      </w:r>
-      <w:r>
-        <w:t xml:space="preserve"> </w:t>
-      </w:r>
-      <w:r>
-        <w:t xml:space="preserve">imperfectly to real text, a gap that train-on-synthetic, test-on-real evaluation is designed to surface. Longitudinal consistency compounds the</w:t>
-      </w:r>
-      <w:r>
-        <w:t xml:space="preserve"> </w:t>
-      </w:r>
-      <w:r>
-        <w:t xml:space="preserve">problem, since a patient's story must remain coherent across a conversation, a handoff, and a discharge,</w:t>
-      </w:r>
-      <w:r>
-        <w:t xml:space="preserve"> </w:t>
-      </w:r>
-      <w:r>
-        <w:t xml:space="preserve">yet independently sampled turns readily contradict one another. Beneath all of these lies a measurement</w:t>
-      </w:r>
-      <w:r>
-        <w:t xml:space="preserve"> </w:t>
-      </w:r>
-      <w:r>
-        <w:t xml:space="preserve">gap: evaluation metrics that reliably predict downstream utility are absent, and current fidelity and</w:t>
-      </w:r>
-      <w:r>
-        <w:t xml:space="preserve"> </w:t>
-      </w:r>
-      <w:r>
-        <w:t xml:space="preserve">diversity measures are still maturing</w:t>
-      </w:r>
-      <w:r>
-        <w:rPr>
-          <w:vertAlign w:val="superscript"/>
-        </w:rPr>
-        <w:t xml:space="preserve">[80,81]</w:t>
-      </w:r>
-      <w:r>
-        <w:t xml:space="preserve">. This is why the</w:t>
-      </w:r>
-      <w:r>
-        <w:t xml:space="preserve"> </w:t>
-      </w:r>
-      <w:r>
-        <w:t xml:space="preserve">train-on-synthetic, test-on-real protocol, still uncommon in the studies surveyed here, remains the field's</w:t>
-      </w:r>
-      <w:r>
-        <w:t xml:space="preserve"> </w:t>
-      </w:r>
-      <w:r>
-        <w:t xml:space="preserve">most trustworthy yardstick.</w:t>
-      </w:r>
-    </w:p>
-    <w:bookmarkEnd w:id="54"/>
-    <w:bookmarkStart w:id="55" w:name="practical-and-ethical-caveats"/>
-    <w:p>
-      <w:pPr>
-        <w:pStyle w:val="Heading3"/>
-        <w:keepNext/>
-        <w:keepLines/>
-        <w:widowControl w:val="1"/>
-      </w:pPr>
-      <w:r>
-        <w:t xml:space="preserve">4.2  Practical and Ethical Caveats</w:t>
-      </w:r>
-    </w:p>
-    <w:p>
-      <w:pPr>
-        <w:pStyle w:val="FirstParagraph"/>
-        <w:jc w:val="both"/>
-        <w:keepNext w:val="0"/>
-        <w:keepLines w:val="0"/>
-        <w:widowControl w:val="1"/>
-      </w:pPr>
-      <w:r>
-        <w:t xml:space="preserve">Beyond the technical lie institutional and ethical considerations. Regulatory frameworks are still emerging: it is not</w:t>
-      </w:r>
-      <w:r>
-        <w:t xml:space="preserve"> </w:t>
-      </w:r>
-      <w:r>
-        <w:t xml:space="preserve">yet settled what validation a synthetic corpus must pass before a model trained on it may be used in care,</w:t>
-      </w:r>
-      <w:r>
-        <w:t xml:space="preserve"> </w:t>
-      </w:r>
-      <w:r>
-        <w:t xml:space="preserve">nor which bodies should certify that validation. No current medical-device framework treats a synthetic</w:t>
-      </w:r>
-      <w:r>
-        <w:t xml:space="preserve"> </w:t>
-      </w:r>
-      <w:r>
-        <w:t xml:space="preserve">training corpus as a distinct regulated object, which leaves provenance records and disclosure of synthetic</w:t>
-      </w:r>
-      <w:r>
-        <w:t xml:space="preserve"> </w:t>
-      </w:r>
-      <w:r>
-        <w:t xml:space="preserve">origin as the practical interim controls. The ethics cut in two directions. Synthetic data is often</w:t>
-      </w:r>
-      <w:r>
-        <w:t xml:space="preserve"> </w:t>
-      </w:r>
-      <w:r>
-        <w:t xml:space="preserve">justified on privacy grounds, yet the assumption that it is automatically safe is unfounded, because</w:t>
-      </w:r>
-      <w:r>
-        <w:t xml:space="preserve"> </w:t>
-      </w:r>
-      <w:r>
-        <w:t xml:space="preserve">synthetic notes that match real utility can inherit real privacy risk</w:t>
-      </w:r>
-      <w:r>
-        <w:rPr>
-          <w:vertAlign w:val="superscript"/>
-        </w:rPr>
-        <w:t xml:space="preserve">[31]</w:t>
-      </w:r>
-      <w:r>
-        <w:t xml:space="preserve">, a risk that</w:t>
-      </w:r>
-      <w:r>
-        <w:t xml:space="preserve"> </w:t>
-      </w:r>
-      <w:r>
-        <w:t xml:space="preserve">membership-inference audits now make measurable</w:t>
-      </w:r>
-      <w:r>
-        <w:rPr>
-          <w:vertAlign w:val="superscript"/>
-        </w:rPr>
-        <w:t xml:space="preserve">[77]</w:t>
-      </w:r>
-      <w:r>
-        <w:t xml:space="preserve"> </w:t>
-      </w:r>
-      <w:r>
-        <w:t xml:space="preserve">and that differentially private</w:t>
-      </w:r>
-      <w:r>
-        <w:t xml:space="preserve"> </w:t>
-      </w:r>
-      <w:r>
-        <w:t xml:space="preserve">generators are still being adapted to specialist clinical text</w:t>
-      </w:r>
-      <w:r>
-        <w:rPr>
-          <w:vertAlign w:val="superscript"/>
-        </w:rPr>
-        <w:t xml:space="preserve">[78]</w:t>
-      </w:r>
-      <w:r>
-        <w:t xml:space="preserve">; and there</w:t>
-      </w:r>
-      <w:r>
-        <w:t xml:space="preserve"> </w:t>
-      </w:r>
-      <w:r>
-        <w:t xml:space="preserve">is a disclosure obligation, since text that reads as a genuine patient encounter should be labeled as</w:t>
-      </w:r>
-      <w:r>
-        <w:t xml:space="preserve"> </w:t>
-      </w:r>
-      <w:r>
-        <w:t xml:space="preserve">synthetic wherever it circulates. Sharing and licensing remain unsettled, particularly when a generator was</w:t>
-      </w:r>
-      <w:r>
-        <w:t xml:space="preserve"> </w:t>
-      </w:r>
-      <w:r>
-        <w:t xml:space="preserve">conditioned on restricted real data, which can quietly propagate governance constraints into ostensibly</w:t>
-      </w:r>
-      <w:r>
-        <w:t xml:space="preserve"> </w:t>
-      </w:r>
-      <w:r>
-        <w:t xml:space="preserve">open outputs. Finally, reproducibility depends on the exact generator, prompt, sampling</w:t>
-      </w:r>
-      <w:r>
-        <w:t xml:space="preserve"> </w:t>
-      </w:r>
-      <w:r>
-        <w:t xml:space="preserve">temperature, and filtering pipeline; reporting these in full is what makes studies directly comparable.</w:t>
-      </w:r>
-    </w:p>
-    <w:bookmarkEnd w:id="55"/>
-    <w:bookmarkStart w:id="56" w:name="boundaries-of-the-method"/>
-    <w:p>
-      <w:pPr>
-        <w:pStyle w:val="Heading3"/>
-        <w:keepNext/>
-        <w:keepLines/>
-        <w:widowControl w:val="1"/>
-      </w:pPr>
-      <w:r>
-        <w:t xml:space="preserve">4.3  Boundaries of the Method</w:t>
-      </w:r>
-    </w:p>
-    <w:p>
-      <w:pPr>
-        <w:pStyle w:val="FirstParagraph"/>
-        <w:jc w:val="both"/>
-        <w:keepNext w:val="0"/>
-        <w:keepLines w:val="0"/>
-        <w:widowControl w:val="1"/>
-      </w:pPr>
-      <w:r>
-        <w:t xml:space="preserve">Some limitations are boundaries of the method rather than defects to be engineered away. Synthetic</w:t>
-      </w:r>
-      <w:r>
-        <w:t xml:space="preserve"> </w:t>
-      </w:r>
-      <w:r>
-        <w:t xml:space="preserve">communication reflects the knowledge, and the blind spots, of the model that produces it: it faithfully</w:t>
-      </w:r>
-      <w:r>
-        <w:t xml:space="preserve"> </w:t>
-      </w:r>
-      <w:r>
-        <w:t xml:space="preserve">reproduces the distributions the generator has learned, while genuinely novel presentations, idiosyncratic</w:t>
-      </w:r>
-      <w:r>
-        <w:t xml:space="preserve"> </w:t>
-      </w:r>
-      <w:r>
-        <w:t xml:space="preserve">phrasing, and culturally specific idiom, often the hardest cases for clinical NLP, still call for authentic</w:t>
-      </w:r>
-      <w:r>
-        <w:t xml:space="preserve"> </w:t>
-      </w:r>
-      <w:r>
-        <w:t xml:space="preserve">data. Validation carries the same qualification, since a model assessed only on synthetic communication has</w:t>
-      </w:r>
-      <w:r>
-        <w:t xml:space="preserve"> </w:t>
-      </w:r>
-      <w:r>
-        <w:t xml:space="preserve">been measured against a world its own family generated; authentic-data evaluation therefore remains the</w:t>
-      </w:r>
-      <w:r>
-        <w:t xml:space="preserve"> </w:t>
-      </w:r>
-      <w:r>
-        <w:t xml:space="preserve">decisive test. Synthetic data is best understood as a scaffold: indispensable for building and</w:t>
-      </w:r>
-      <w:r>
-        <w:t xml:space="preserve"> </w:t>
-      </w:r>
-      <w:r>
-        <w:t xml:space="preserve">stress-testing systems, and complemented by the real communication and real patients that ultimately</w:t>
-      </w:r>
-      <w:r>
-        <w:t xml:space="preserve"> </w:t>
-      </w:r>
-      <w:r>
-        <w:t xml:space="preserve">establish readiness for care.</w:t>
-      </w:r>
-    </w:p>
-    <w:bookmarkEnd w:id="56"/>
-    <w:bookmarkStart w:id="57" w:name="scope-of-this-review"/>
-    <w:p>
-      <w:pPr>
-        <w:pStyle w:val="Heading3"/>
-        <w:keepNext/>
-        <w:keepLines/>
-        <w:widowControl w:val="1"/>
-      </w:pPr>
-      <w:r>
-        <w:t xml:space="preserve">4.4  Scope of This Review</w:t>
-      </w:r>
-    </w:p>
-    <w:p>
-      <w:pPr>
-        <w:pStyle w:val="FirstParagraph"/>
-        <w:jc w:val="both"/>
-        <w:keepNext w:val="0"/>
-        <w:keepLines w:val="0"/>
-        <w:widowControl w:val="1"/>
-      </w:pPr>
-      <w:r>
-        <w:t xml:space="preserve">This review has its own boundaries. It is narrative rather than systematic, so its coverage reflects</w:t>
-      </w:r>
-      <w:r>
-        <w:t xml:space="preserve"> </w:t>
-      </w:r>
-      <w:r>
-        <w:t xml:space="preserve">targeted search and citation tracing rather than an exhaustive protocol, and fast-moving preprint work will</w:t>
-      </w:r>
-      <w:r>
-        <w:t xml:space="preserve"> </w:t>
-      </w:r>
-      <w:r>
-        <w:t xml:space="preserve">continue to appear after writing. The application studies are drawn from a single graduate program and are</w:t>
-      </w:r>
-      <w:r>
-        <w:t xml:space="preserve"> </w:t>
-      </w:r>
-      <w:r>
-        <w:t xml:space="preserve">weighted toward English, so they demonstrate feasibility across channels rather than a</w:t>
-      </w:r>
-      <w:r>
-        <w:t xml:space="preserve"> </w:t>
-      </w:r>
-      <w:r>
-        <w:t xml:space="preserve">representative sample of methods or languages. The channel taxonomy is a deliberate organizing choice; other</w:t>
-      </w:r>
-      <w:r>
-        <w:t xml:space="preserve"> </w:t>
-      </w:r>
-      <w:r>
-        <w:t xml:space="preserve">cuts, by generation method, by clinical specialty, or by data governance regime, would group the same work</w:t>
-      </w:r>
-      <w:r>
-        <w:t xml:space="preserve"> </w:t>
-      </w:r>
-      <w:r>
-        <w:t xml:space="preserve">differently and are complementary to the one taken here.</w:t>
-      </w:r>
-    </w:p>
-    <w:bookmarkEnd w:id="57"/>
-    <w:bookmarkEnd w:id="58"/>
-    <w:bookmarkStart w:id="59" w:name="s9b"/>
-    <w:p>
-      <w:pPr>
-        <w:pStyle w:val="Heading2"/>
-        <w:keepNext/>
-        <w:keepLines/>
-        <w:widowControl w:val="1"/>
-      </w:pPr>
-      <w:r>
-        <w:t xml:space="preserve">5  Research Frontiers and Open Problems</w:t>
-      </w:r>
-    </w:p>
-    <w:p>
-      <w:pPr>
-        <w:pStyle w:val="FirstParagraph"/>
-        <w:jc w:val="both"/>
-        <w:keepNext w:val="0"/>
-        <w:keepLines w:val="0"/>
-        <w:widowControl w:val="1"/>
-      </w:pPr>
-      <w:r>
-        <w:t xml:space="preserve">The clearest opportunities cluster into a few themes. The first is</w:t>
-      </w:r>
-      <w:r>
-        <w:t xml:space="preserve"> </w:t>
-      </w:r>
-      <w:r>
-        <w:rPr>
-          <w:b/>
-          <w:bCs/>
-        </w:rPr>
-        <w:t xml:space="preserve">interactive simulation</w:t>
-      </w:r>
-      <w:r>
-        <w:t xml:space="preserve">. Moving</w:t>
-      </w:r>
-      <w:r>
-        <w:t xml:space="preserve"> </w:t>
-      </w:r>
-      <w:r>
-        <w:t xml:space="preserve">from static corpora toward multi-agent simulation, in which patient and clinician agents generate</w:t>
-      </w:r>
-      <w:r>
-        <w:t xml:space="preserve"> </w:t>
-      </w:r>
-      <w:r>
-        <w:t xml:space="preserve">consultations on demand and double as graded evaluation environments, fits the sequential, goal-directed</w:t>
-      </w:r>
-      <w:r>
-        <w:t xml:space="preserve"> </w:t>
-      </w:r>
-      <w:r>
-        <w:t xml:space="preserve">nature of clinical talk. Coevolving standardized-patient agents</w:t>
-      </w:r>
-      <w:r>
-        <w:rPr>
-          <w:vertAlign w:val="superscript"/>
-        </w:rPr>
-        <w:t xml:space="preserve">[60]</w:t>
-      </w:r>
-      <w:r>
-        <w:t xml:space="preserve">, safety-focused</w:t>
-      </w:r>
-      <w:r>
-        <w:t xml:space="preserve"> </w:t>
-      </w:r>
-      <w:r>
-        <w:t xml:space="preserve">simulation-and-evaluation frameworks</w:t>
-      </w:r>
-      <w:r>
-        <w:rPr>
-          <w:vertAlign w:val="superscript"/>
-        </w:rPr>
-        <w:t xml:space="preserve">[98]</w:t>
-      </w:r>
-      <w:r>
-        <w:t xml:space="preserve">, and multimodal clinical-agent</w:t>
-      </w:r>
-      <w:r>
-        <w:t xml:space="preserve"> </w:t>
-      </w:r>
-      <w:r>
-        <w:t xml:space="preserve">benchmarks</w:t>
-      </w:r>
-      <w:r>
-        <w:rPr>
-          <w:vertAlign w:val="superscript"/>
-        </w:rPr>
-        <w:t xml:space="preserve">[99]</w:t>
-      </w:r>
-      <w:r>
-        <w:t xml:space="preserve"> </w:t>
-      </w:r>
-      <w:r>
-        <w:t xml:space="preserve">point toward environments that fold generation and evaluation into</w:t>
-      </w:r>
-      <w:r>
-        <w:t xml:space="preserve"> </w:t>
-      </w:r>
-      <w:r>
-        <w:t xml:space="preserve">one renewable loop, extending toward personalized synthetic patients</w:t>
-      </w:r>
-      <w:r>
-        <w:rPr>
-          <w:vertAlign w:val="superscript"/>
-        </w:rPr>
-        <w:t xml:space="preserve">[10,54,55,56]</w:t>
-      </w:r>
-      <w:r>
-        <w:t xml:space="preserve">.</w:t>
-      </w:r>
-    </w:p>
-    <w:p>
-      <w:pPr>
-        <w:pStyle w:val="BodyText"/>
-        <w:jc w:val="both"/>
-        <w:keepNext w:val="0"/>
-        <w:keepLines w:val="0"/>
-        <w:widowControl w:val="1"/>
-      </w:pPr>
-      <w:r>
-        <w:t xml:space="preserve">A second theme is</w:t>
-      </w:r>
-      <w:r>
-        <w:t xml:space="preserve"> </w:t>
-      </w:r>
-      <w:r>
-        <w:rPr>
-          <w:b/>
-          <w:bCs/>
-        </w:rPr>
-        <w:t xml:space="preserve">spoken and multi-party communication</w:t>
-      </w:r>
-      <w:r>
-        <w:t xml:space="preserve">. The EMS, dispatch, and verbal-handoff</w:t>
-      </w:r>
-      <w:r>
-        <w:t xml:space="preserve"> </w:t>
-      </w:r>
-      <w:r>
-        <w:t xml:space="preserve">channels are spoken first and rich in protected information, yet text-only synthesis discards the</w:t>
-      </w:r>
-      <w:r>
-        <w:t xml:space="preserve"> </w:t>
-      </w:r>
-      <w:r>
-        <w:t xml:space="preserve">acoustic-error distribution that dominates real deployment. Joint synthetic pipelines that pair generated</w:t>
-      </w:r>
-      <w:r>
-        <w:t xml:space="preserve"> </w:t>
-      </w:r>
-      <w:r>
-        <w:t xml:space="preserve">audio with transcripts and inject realistic recognition noise are a clear open space that would let</w:t>
-      </w:r>
-      <w:r>
-        <w:t xml:space="preserve"> </w:t>
-      </w:r>
-      <w:r>
-        <w:t xml:space="preserve">transcription-robust clinical NLP be trained without recording real calls.</w:t>
-      </w:r>
-    </w:p>
-    <w:p>
-      <w:pPr>
-        <w:pStyle w:val="BodyText"/>
-        <w:jc w:val="both"/>
-        <w:keepNext w:val="0"/>
-        <w:keepLines w:val="0"/>
-        <w:widowControl w:val="1"/>
-      </w:pPr>
-      <w:r>
-        <w:t xml:space="preserve">A third is</w:t>
-      </w:r>
-      <w:r>
-        <w:t xml:space="preserve"> </w:t>
-      </w:r>
-      <w:r>
-        <w:rPr>
-          <w:b/>
-          <w:bCs/>
-        </w:rPr>
-        <w:t xml:space="preserve">privacy, fidelity, and utility, co-measured</w:t>
-      </w:r>
-      <w:r>
-        <w:t xml:space="preserve">. Membership-inference and canary auditing</w:t>
-      </w:r>
-      <w:r>
-        <w:t xml:space="preserve"> </w:t>
-      </w:r>
-      <w:r>
-        <w:t xml:space="preserve">now quantify leakage on the exact synthetic text behind a utility claim</w:t>
-      </w:r>
-      <w:r>
-        <w:rPr>
-          <w:vertAlign w:val="superscript"/>
-        </w:rPr>
-        <w:t xml:space="preserve">[77]</w:t>
-      </w:r>
-      <w:r>
-        <w:t xml:space="preserve">, fidelity</w:t>
-      </w:r>
-      <w:r>
-        <w:t xml:space="preserve"> </w:t>
-      </w:r>
-      <w:r>
-        <w:t xml:space="preserve">and diversity metrics are under active and critical revision</w:t>
-      </w:r>
-      <w:r>
-        <w:rPr>
-          <w:vertAlign w:val="superscript"/>
-        </w:rPr>
-        <w:t xml:space="preserve">[80,81]</w:t>
-      </w:r>
-      <w:r>
-        <w:t xml:space="preserve">, and</w:t>
-      </w:r>
-      <w:r>
-        <w:t xml:space="preserve"> </w:t>
-      </w:r>
-      <w:r>
-        <w:t xml:space="preserve">differentially private generators still contend with specialist clinical distributions</w:t>
-      </w:r>
-      <w:r>
-        <w:rPr>
-          <w:vertAlign w:val="superscript"/>
-        </w:rPr>
-        <w:t xml:space="preserve">[78]</w:t>
-      </w:r>
-      <w:r>
-        <w:t xml:space="preserve">.</w:t>
-      </w:r>
-      <w:r>
-        <w:t xml:space="preserve"> </w:t>
-      </w:r>
-      <w:r>
-        <w:t xml:space="preserve">The open problem is to co-optimize and co-report privacy, clinical faithfulness, and downstream utility in a</w:t>
-      </w:r>
-      <w:r>
-        <w:t xml:space="preserve"> </w:t>
-      </w:r>
-      <w:r>
-        <w:t xml:space="preserve">single pass on one generator, rather than in separate studies.</w:t>
-      </w:r>
-    </w:p>
-    <w:p>
-      <w:pPr>
-        <w:pStyle w:val="BodyText"/>
-        <w:jc w:val="both"/>
-        <w:keepNext w:val="0"/>
-        <w:keepLines w:val="0"/>
-        <w:widowControl w:val="1"/>
-      </w:pPr>
-      <w:r>
-        <w:t xml:space="preserve">A fourth is</w:t>
-      </w:r>
-      <w:r>
-        <w:t xml:space="preserve"> </w:t>
-      </w:r>
-      <w:r>
-        <w:rPr>
-          <w:b/>
-          <w:bCs/>
-        </w:rPr>
-        <w:t xml:space="preserve">controllable, causal, and continually current generation</w:t>
-      </w:r>
-      <w:r>
-        <w:t xml:space="preserve">. Explicit control over</w:t>
-      </w:r>
-      <w:r>
-        <w:t xml:space="preserve"> </w:t>
-      </w:r>
-      <w:r>
-        <w:t xml:space="preserve">uncertainty, omission, code-switching, and recognition noise, together with counterfactual variants of the</w:t>
-      </w:r>
-      <w:r>
-        <w:t xml:space="preserve"> </w:t>
-      </w:r>
-      <w:r>
-        <w:t xml:space="preserve">same encounter, would let downstream models be probed for what they actually rely on; surveys of</w:t>
-      </w:r>
-      <w:r>
-        <w:t xml:space="preserve"> </w:t>
-      </w:r>
-      <w:r>
-        <w:t xml:space="preserve">conversational data generation catalog the available levers</w:t>
-      </w:r>
-      <w:r>
-        <w:rPr>
-          <w:vertAlign w:val="superscript"/>
-        </w:rPr>
-        <w:t xml:space="preserve">[102]</w:t>
-      </w:r>
-      <w:r>
-        <w:t xml:space="preserve">. Continual,</w:t>
-      </w:r>
-      <w:r>
-        <w:t xml:space="preserve"> </w:t>
-      </w:r>
-      <w:r>
-        <w:t xml:space="preserve">self-refining generation could keep synthetic communication current as guidelines and language drift,</w:t>
-      </w:r>
-      <w:r>
-        <w:t xml:space="preserve"> </w:t>
-      </w:r>
-      <w:r>
-        <w:t xml:space="preserve">provided recursive self-training is guarded against model collapse</w:t>
-      </w:r>
-      <w:r>
-        <w:rPr>
-          <w:vertAlign w:val="superscript"/>
-        </w:rPr>
-        <w:t xml:space="preserve">[101]</w:t>
-      </w:r>
-      <w:r>
-        <w:t xml:space="preserve">.</w:t>
-      </w:r>
-    </w:p>
-    <w:p>
-      <w:pPr>
-        <w:pStyle w:val="BodyText"/>
-        <w:jc w:val="both"/>
-        <w:keepNext w:val="0"/>
-        <w:keepLines w:val="0"/>
-        <w:widowControl w:val="1"/>
-      </w:pPr>
-      <w:r>
-        <w:t xml:space="preserve">Underlying all of these are</w:t>
-      </w:r>
-      <w:r>
-        <w:t xml:space="preserve"> </w:t>
-      </w:r>
-      <w:r>
-        <w:rPr>
-          <w:b/>
-          <w:bCs/>
-        </w:rPr>
-        <w:t xml:space="preserve">foundations, benchmarks, and human oversight</w:t>
-      </w:r>
-      <w:r>
-        <w:t xml:space="preserve">. Whether synthetic clinical</w:t>
-      </w:r>
-      <w:r>
-        <w:t xml:space="preserve"> </w:t>
-      </w:r>
-      <w:r>
-        <w:t xml:space="preserve">dialogue obeys predictable scaling laws, and where returns plateau, is an open and decision-critical</w:t>
-      </w:r>
-      <w:r>
-        <w:t xml:space="preserve"> </w:t>
-      </w:r>
-      <w:r>
-        <w:t xml:space="preserve">question</w:t>
-      </w:r>
-      <w:r>
-        <w:rPr>
-          <w:vertAlign w:val="superscript"/>
-        </w:rPr>
-        <w:t xml:space="preserve">[100]</w:t>
-      </w:r>
-      <w:r>
-        <w:t xml:space="preserve">; shared, communication-specific fidelity benchmarks, including</w:t>
-      </w:r>
-      <w:r>
-        <w:t xml:space="preserve"> </w:t>
-      </w:r>
-      <w:r>
-        <w:t xml:space="preserve">rubric-scored and OSCE-style stations</w:t>
-      </w:r>
-      <w:r>
-        <w:rPr>
-          <w:vertAlign w:val="superscript"/>
-        </w:rPr>
-        <w:t xml:space="preserve">[104]</w:t>
-      </w:r>
-      <w:r>
-        <w:t xml:space="preserve">, would let scaling laws, privacy audits,</w:t>
-      </w:r>
-      <w:r>
-        <w:t xml:space="preserve"> </w:t>
-      </w:r>
-      <w:r>
-        <w:t xml:space="preserve">and agent evaluations be compared across groups. Removing generator fingerprints so that models learn</w:t>
-      </w:r>
-      <w:r>
-        <w:t xml:space="preserve"> </w:t>
-      </w:r>
-      <w:r>
-        <w:t xml:space="preserve">clinical content rather than stylistic tics</w:t>
-      </w:r>
-      <w:r>
-        <w:rPr>
-          <w:vertAlign w:val="superscript"/>
-        </w:rPr>
-        <w:t xml:space="preserve">[103]</w:t>
-      </w:r>
-      <w:r>
-        <w:t xml:space="preserve">, preference optimization toward</w:t>
-      </w:r>
-      <w:r>
-        <w:t xml:space="preserve"> </w:t>
-      </w:r>
-      <w:r>
-        <w:t xml:space="preserve">clinician-judged realism, and automated safety auditing that treats omission as seriously as</w:t>
-      </w:r>
-      <w:r>
-        <w:t xml:space="preserve"> </w:t>
-      </w:r>
-      <w:r>
-        <w:t xml:space="preserve">fabrication</w:t>
-      </w:r>
-      <w:r>
-        <w:rPr>
-          <w:vertAlign w:val="superscript"/>
-        </w:rPr>
-        <w:t xml:space="preserve">[82]</w:t>
-      </w:r>
-      <w:r>
-        <w:t xml:space="preserve"> </w:t>
-      </w:r>
-      <w:r>
-        <w:t xml:space="preserve">complete an agenda in which clinician oversight remains central.</w:t>
-      </w:r>
-    </w:p>
-    <w:bookmarkEnd w:id="59"/>
-    <w:bookmarkStart w:id="60" w:name="s9"/>
-    <w:p>
-      <w:pPr>
-        <w:pStyle w:val="Heading2"/>
-        <w:keepNext/>
-        <w:keepLines/>
-        <w:widowControl w:val="1"/>
-      </w:pPr>
-      <w:r>
-        <w:t xml:space="preserve">6  Conclusions</w:t>
-      </w:r>
-    </w:p>
-    <w:p>
-      <w:pPr>
-        <w:pStyle w:val="FirstParagraph"/>
-        <w:jc w:val="both"/>
-        <w:keepNext w:val="0"/>
-        <w:keepLines w:val="0"/>
-        <w:widowControl w:val="1"/>
-      </w:pPr>
-      <w:r>
-        <w:t xml:space="preserve">LLM-generated synthetic clinical communication has matured from a privacy-preserving stand-in</w:t>
-      </w:r>
-      <w:r>
-        <w:t xml:space="preserve"> </w:t>
-      </w:r>
-      <w:r>
-        <w:t xml:space="preserve">for real records into a versatile resource for building, evaluating, and benchmarking clinical NLP systems.</w:t>
-      </w:r>
-      <w:r>
-        <w:t xml:space="preserve"> </w:t>
-      </w:r>
-      <w:r>
-        <w:t xml:space="preserve">This survey organized the field around the communication channel, from patient–clinician</w:t>
-      </w:r>
-      <w:r>
-        <w:t xml:space="preserve"> </w:t>
-      </w:r>
-      <w:r>
-        <w:t xml:space="preserve">conversations and doctor-to-patient instructions to telemedicine and portal messaging and the under-served</w:t>
-      </w:r>
-      <w:r>
-        <w:t xml:space="preserve"> </w:t>
-      </w:r>
-      <w:r>
-        <w:t xml:space="preserve">paramedic, dispatch, and handoff channels, and around the downstream tasks each supports, grounding that</w:t>
-      </w:r>
-      <w:r>
-        <w:t xml:space="preserve"> </w:t>
-      </w:r>
-      <w:r>
-        <w:t xml:space="preserve">organization in ten application studies that generate synthetic communication and train models on it.</w:t>
-      </w:r>
-    </w:p>
-    <w:p>
-      <w:pPr>
-        <w:pStyle w:val="BodyText"/>
-        <w:jc w:val="both"/>
-        <w:keepNext w:val="0"/>
-        <w:keepLines w:val="0"/>
-        <w:widowControl w:val="1"/>
-      </w:pPr>
-      <w:r>
-        <w:t xml:space="preserve">Read together, those studies surface a small set of reusable design patterns (Table 17) that recur</w:t>
-      </w:r>
-      <w:r>
-        <w:t xml:space="preserve"> </w:t>
-      </w:r>
-      <w:r>
-        <w:t xml:space="preserve">across channels and tasks rather than one-off results, and that answer RQ7 directly.</w:t>
+        <w:t xml:space="preserve">Because external validity is the decisive question for any synthetic-data method, Table 17 states, for</w:t>
+      </w:r>
+      <w:r>
+        <w:t xml:space="preserve"> </w:t>
+      </w:r>
+      <w:r>
+        <w:t xml:space="preserve">each study, how much authentic data it touches and what its reported metric is measured on. The studies fall</w:t>
+      </w:r>
+      <w:r>
+        <w:t xml:space="preserve"> </w:t>
+      </w:r>
+      <w:r>
+        <w:t xml:space="preserve">into three grounding levels. One study evaluates its headline metric on authentic patient-authored text: the</w:t>
+      </w:r>
+      <w:r>
+        <w:t xml:space="preserve"> </w:t>
+      </w:r>
+      <w:r>
+        <w:t xml:space="preserve">medication-question classifier (§3.2.4) is tested on real consumer questions, with generation confined to</w:t>
+      </w:r>
+      <w:r>
+        <w:t xml:space="preserve"> </w:t>
+      </w:r>
+      <w:r>
+        <w:t xml:space="preserve">training-side class rebalancing, so its number is a genuine train-on-synthetic-augmented, test-on-real</w:t>
+      </w:r>
+      <w:r>
+        <w:t xml:space="preserve"> </w:t>
+      </w:r>
+      <w:r>
+        <w:t xml:space="preserve">(</w:t>
+      </w:r>
+      <w:r>
+        <w:rPr>
+          <w:i/>
+          <w:iCs/>
+        </w:rPr>
+        <w:t xml:space="preserve">S→R</w:t>
+      </w:r>
+      <w:r>
+        <w:t xml:space="preserve">) result. Four studies seed generation from real structured data, case distributions and</w:t>
+      </w:r>
+      <w:r>
+        <w:t xml:space="preserve"> </w:t>
+      </w:r>
+      <w:r>
+        <w:t xml:space="preserve">diagnostic labels drawn from public datasets or de-identified records (Symptom2Disease, the Symptom-Disease</w:t>
+      </w:r>
+      <w:r>
+        <w:t xml:space="preserve"> </w:t>
+      </w:r>
+      <w:r>
+        <w:t xml:space="preserve">Prediction Dataset, MIMIC-IV-ED, and MIMIC-IV-Ext), so their labels and clinical content are anchored in</w:t>
+      </w:r>
+      <w:r>
+        <w:t xml:space="preserve"> </w:t>
+      </w:r>
+      <w:r>
+        <w:t xml:space="preserve">reality even though the communication text and the test set are synthetic. The remaining five studies are</w:t>
+      </w:r>
+      <w:r>
+        <w:t xml:space="preserve"> </w:t>
+      </w:r>
+      <w:r>
+        <w:t xml:space="preserve">fully synthetic in source, text, and test. Stating this distribution explicitly is deliberate: it shows that</w:t>
+      </w:r>
+      <w:r>
+        <w:t xml:space="preserve"> </w:t>
+      </w:r>
+      <w:r>
+        <w:t xml:space="preserve">the survey demonstrates channel feasibility broadly while genuine real-text validation is so far established</w:t>
+      </w:r>
+      <w:r>
+        <w:t xml:space="preserve"> </w:t>
+      </w:r>
+      <w:r>
+        <w:t xml:space="preserve">at one point, which is the boundary Section 4 examines and the frontier Section 5 prioritizes.</w:t>
       </w:r>
     </w:p>
     <w:p>
@@ -18774,7 +17914,7 @@
           <w:b w:val="0"/>
           <w:i/>
         </w:rPr>
-        <w:t>Reusable design patterns recurring across the ten application studies (RQ7).</w:t>
+        <w:t>Real-world grounding of the ten application studies: the authentic data each uses and the provenance of the text on which its reported metric is measured.</w:t>
       </w:r>
     </w:p>
     <w:tbl>
@@ -18783,7 +17923,2722 @@
         <w:tblW w:type="pct" w:w="5000"/>
         <w:jc w:val="center"/>
         <w:tblLook w:firstRow="1" w:lastRow="0" w:firstColumn="0" w:lastColumn="0" w:noHBand="0" w:noVBand="0" w:val="0020"/>
-        <w:tblCaption w:val="Table 17. Reusable design patterns recurring across the ten application studies (RQ7)."/>
+        <w:tblCaption w:val="Table 17. Real-world grounding of the ten application studies: the authentic data each uses and the provenance of the text on which its reported metric is measured."/>
+        <w:tblLayout w:type="autofit"/>
+        <w:tblBorders>
+          <w:top w:val="single" w:sz="10" w:color="4F6272"/>
+          <w:bottom w:val="single" w:sz="10" w:color="4F6272"/>
+          <w:insideH w:val="single" w:sz="5" w:color="9FB0C2"/>
+          <w:left w:val="single" w:sz="6" w:color="9FB0C2"/>
+          <w:right w:val="single" w:sz="6" w:color="9FB0C2"/>
+          <w:insideV w:val="single" w:sz="5" w:color="D9E1E8"/>
+        </w:tblBorders>
+      </w:tblPr>
+      <w:tblGrid>
+        <w:gridCol w:w="1584"/>
+        <w:gridCol w:w="1584"/>
+        <w:gridCol w:w="1584"/>
+        <w:gridCol w:w="1584"/>
+        <w:gridCol w:w="1584"/>
+      </w:tblGrid>
+      <w:tr>
+        <w:trPr>
+          <w:tblHeader w:val="on"/>
+        </w:trPr>
+        <w:tc>
+          <w:tcPr>
+            <w:shd w:fill="EEF3F7"/>
+            <w:tcBorders>
+              <w:left w:val="nil"/>
+              <w:right w:val="nil"/>
+              <w:top w:val="nil"/>
+              <w:bottom w:val="single" w:sz="8" w:color="9FB0C2"/>
+            </w:tcBorders>
+            <w:vAlign w:val="center"/>
+          </w:tcPr>
+          <w:p>
+            <w:pPr>
+              <w:pStyle w:val="Compact"/>
+              <w:spacing w:before="0" w:after="20" w:line="240" w:lineRule="auto"/>
+              <w:jc w:val="center"/>
+              <w:suppressAutoHyphens/>
+              <w:keepNext w:val="0"/>
+              <w:keepLines/>
+              <w:widowControl w:val="1"/>
+            </w:pPr>
+            <w:r>
+              <w:rPr>
+                <w:rFonts w:ascii="Times New Roman" w:hAnsi="Times New Roman"/>
+                <w:b/>
+                <w:sz w:val="19"/>
+              </w:rPr>
+              <w:t xml:space="preserve">#</w:t>
+            </w:r>
+          </w:p>
+        </w:tc>
+        <w:tc>
+          <w:tcPr>
+            <w:shd w:fill="EEF3F7"/>
+            <w:tcBorders>
+              <w:left w:val="nil"/>
+              <w:right w:val="nil"/>
+              <w:top w:val="nil"/>
+              <w:bottom w:val="single" w:sz="8" w:color="9FB0C2"/>
+            </w:tcBorders>
+            <w:vAlign w:val="center"/>
+          </w:tcPr>
+          <w:p>
+            <w:pPr>
+              <w:pStyle w:val="Compact"/>
+              <w:spacing w:before="0" w:after="20" w:line="240" w:lineRule="auto"/>
+              <w:jc w:val="center"/>
+              <w:suppressAutoHyphens/>
+              <w:keepNext w:val="0"/>
+              <w:keepLines/>
+              <w:widowControl w:val="1"/>
+            </w:pPr>
+            <w:r>
+              <w:rPr>
+                <w:rFonts w:ascii="Times New Roman" w:hAnsi="Times New Roman"/>
+                <w:b/>
+                <w:sz w:val="19"/>
+              </w:rPr>
+              <w:t xml:space="preserve">Study (§)</w:t>
+            </w:r>
+          </w:p>
+        </w:tc>
+        <w:tc>
+          <w:tcPr>
+            <w:shd w:fill="EEF3F7"/>
+            <w:tcBorders>
+              <w:left w:val="nil"/>
+              <w:right w:val="nil"/>
+              <w:top w:val="nil"/>
+              <w:bottom w:val="single" w:sz="8" w:color="9FB0C2"/>
+            </w:tcBorders>
+            <w:vAlign w:val="center"/>
+          </w:tcPr>
+          <w:p>
+            <w:pPr>
+              <w:pStyle w:val="Compact"/>
+              <w:spacing w:before="0" w:after="20" w:line="240" w:lineRule="auto"/>
+              <w:jc w:val="center"/>
+              <w:suppressAutoHyphens/>
+              <w:keepNext w:val="0"/>
+              <w:keepLines/>
+              <w:widowControl w:val="1"/>
+            </w:pPr>
+            <w:r>
+              <w:rPr>
+                <w:rFonts w:ascii="Times New Roman" w:hAnsi="Times New Roman"/>
+                <w:b/>
+                <w:sz w:val="19"/>
+              </w:rPr>
+              <w:t xml:space="preserve">Authentic data used</w:t>
+            </w:r>
+          </w:p>
+        </w:tc>
+        <w:tc>
+          <w:tcPr>
+            <w:shd w:fill="EEF3F7"/>
+            <w:tcBorders>
+              <w:left w:val="nil"/>
+              <w:right w:val="nil"/>
+              <w:top w:val="nil"/>
+              <w:bottom w:val="single" w:sz="8" w:color="9FB0C2"/>
+            </w:tcBorders>
+            <w:vAlign w:val="center"/>
+          </w:tcPr>
+          <w:p>
+            <w:pPr>
+              <w:pStyle w:val="Compact"/>
+              <w:spacing w:before="0" w:after="20" w:line="240" w:lineRule="auto"/>
+              <w:jc w:val="center"/>
+              <w:suppressAutoHyphens/>
+              <w:keepNext w:val="0"/>
+              <w:keepLines/>
+              <w:widowControl w:val="1"/>
+            </w:pPr>
+            <w:r>
+              <w:rPr>
+                <w:rFonts w:ascii="Times New Roman" w:hAnsi="Times New Roman"/>
+                <w:b/>
+                <w:sz w:val="19"/>
+              </w:rPr>
+              <w:t xml:space="preserve">Metric tested on</w:t>
+            </w:r>
+          </w:p>
+        </w:tc>
+        <w:tc>
+          <w:tcPr>
+            <w:shd w:fill="EEF3F7"/>
+            <w:tcBorders>
+              <w:left w:val="nil"/>
+              <w:right w:val="nil"/>
+              <w:top w:val="nil"/>
+              <w:bottom w:val="single" w:sz="8" w:color="9FB0C2"/>
+            </w:tcBorders>
+            <w:vAlign w:val="center"/>
+          </w:tcPr>
+          <w:p>
+            <w:pPr>
+              <w:pStyle w:val="Compact"/>
+              <w:spacing w:before="0" w:after="20" w:line="240" w:lineRule="auto"/>
+              <w:jc w:val="center"/>
+              <w:suppressAutoHyphens/>
+              <w:keepNext w:val="0"/>
+              <w:keepLines/>
+              <w:widowControl w:val="1"/>
+            </w:pPr>
+            <w:r>
+              <w:rPr>
+                <w:rFonts w:ascii="Times New Roman" w:hAnsi="Times New Roman"/>
+                <w:b/>
+                <w:sz w:val="19"/>
+              </w:rPr>
+              <w:t xml:space="preserve">Regime</w:t>
+            </w:r>
+          </w:p>
+        </w:tc>
+      </w:tr>
+      <w:tr>
+        <w:tc>
+          <w:tcPr>
+            <w:tcBorders>
+              <w:left w:val="nil"/>
+              <w:right w:val="nil"/>
+              <w:top w:val="nil"/>
+              <w:bottom w:val="single" w:sz="4" w:color="D9E1E8"/>
+            </w:tcBorders>
+            <w:vAlign w:val="center"/>
+          </w:tcPr>
+          <w:p>
+            <w:pPr>
+              <w:pStyle w:val="Compact"/>
+              <w:spacing w:before="0" w:after="20" w:line="240" w:lineRule="auto"/>
+              <w:jc w:val="center"/>
+              <w:suppressAutoHyphens/>
+              <w:keepNext w:val="0"/>
+              <w:keepLines/>
+              <w:widowControl w:val="1"/>
+            </w:pPr>
+            <w:r>
+              <w:rPr>
+                <w:rFonts w:ascii="Times New Roman" w:hAnsi="Times New Roman"/>
+                <w:sz w:val="19"/>
+              </w:rPr>
+              <w:t xml:space="preserve">1</w:t>
+            </w:r>
+          </w:p>
+        </w:tc>
+        <w:tc>
+          <w:tcPr>
+            <w:tcBorders>
+              <w:left w:val="nil"/>
+              <w:right w:val="nil"/>
+              <w:top w:val="nil"/>
+              <w:bottom w:val="single" w:sz="4" w:color="D9E1E8"/>
+            </w:tcBorders>
+            <w:vAlign w:val="center"/>
+          </w:tcPr>
+          <w:p>
+            <w:pPr>
+              <w:pStyle w:val="Compact"/>
+              <w:spacing w:before="0" w:after="20" w:line="240" w:lineRule="auto"/>
+              <w:jc w:val="center"/>
+              <w:suppressAutoHyphens/>
+              <w:keepNext w:val="0"/>
+              <w:keepLines/>
+              <w:widowControl w:val="1"/>
+            </w:pPr>
+            <w:r>
+              <w:rPr>
+                <w:rFonts w:ascii="Times New Roman" w:hAnsi="Times New Roman"/>
+                <w:sz w:val="19"/>
+              </w:rPr>
+              <w:t xml:space="preserve">Adaptive diagnostic questioning (3.1.2)</w:t>
+            </w:r>
+          </w:p>
+        </w:tc>
+        <w:tc>
+          <w:tcPr>
+            <w:tcBorders>
+              <w:left w:val="nil"/>
+              <w:right w:val="nil"/>
+              <w:top w:val="nil"/>
+              <w:bottom w:val="single" w:sz="4" w:color="D9E1E8"/>
+            </w:tcBorders>
+            <w:vAlign w:val="center"/>
+          </w:tcPr>
+          <w:p>
+            <w:pPr>
+              <w:pStyle w:val="Compact"/>
+              <w:spacing w:before="0" w:after="20" w:line="240" w:lineRule="auto"/>
+              <w:jc w:val="center"/>
+              <w:suppressAutoHyphens/>
+              <w:keepNext w:val="0"/>
+              <w:keepLines/>
+              <w:widowControl w:val="1"/>
+            </w:pPr>
+            <w:r>
+              <w:rPr>
+                <w:rFonts w:ascii="Times New Roman" w:hAnsi="Times New Roman"/>
+                <w:sz w:val="19"/>
+              </w:rPr>
+              <w:t xml:space="preserve">Real seed: Symptom-Disease Prediction Dataset</w:t>
+            </w:r>
+          </w:p>
+        </w:tc>
+        <w:tc>
+          <w:tcPr>
+            <w:tcBorders>
+              <w:left w:val="nil"/>
+              <w:right w:val="nil"/>
+              <w:top w:val="nil"/>
+              <w:bottom w:val="single" w:sz="4" w:color="D9E1E8"/>
+            </w:tcBorders>
+            <w:vAlign w:val="center"/>
+          </w:tcPr>
+          <w:p>
+            <w:pPr>
+              <w:pStyle w:val="Compact"/>
+              <w:spacing w:before="0" w:after="20" w:line="240" w:lineRule="auto"/>
+              <w:jc w:val="center"/>
+              <w:suppressAutoHyphens/>
+              <w:keepNext w:val="0"/>
+              <w:keepLines/>
+              <w:widowControl w:val="1"/>
+            </w:pPr>
+            <w:r>
+              <w:rPr>
+                <w:rFonts w:ascii="Times New Roman" w:hAnsi="Times New Roman"/>
+                <w:sz w:val="19"/>
+              </w:rPr>
+              <w:t xml:space="preserve">Synthetic</w:t>
+            </w:r>
+          </w:p>
+        </w:tc>
+        <w:tc>
+          <w:tcPr>
+            <w:tcBorders>
+              <w:left w:val="nil"/>
+              <w:right w:val="nil"/>
+              <w:top w:val="nil"/>
+              <w:bottom w:val="single" w:sz="4" w:color="D9E1E8"/>
+            </w:tcBorders>
+            <w:vAlign w:val="center"/>
+          </w:tcPr>
+          <w:p>
+            <w:pPr>
+              <w:pStyle w:val="Compact"/>
+              <w:spacing w:before="0" w:after="20" w:line="240" w:lineRule="auto"/>
+              <w:jc w:val="center"/>
+              <w:suppressAutoHyphens/>
+              <w:keepNext w:val="0"/>
+              <w:keepLines/>
+              <w:widowControl w:val="1"/>
+            </w:pPr>
+            <w:r>
+              <w:rPr>
+                <w:rFonts w:ascii="Times New Roman" w:hAnsi="Times New Roman"/>
+                <w:i/>
+                <w:iCs/>
+                <w:sz w:val="19"/>
+              </w:rPr>
+              <w:t xml:space="preserve">S→S</w:t>
+            </w:r>
+          </w:p>
+        </w:tc>
+      </w:tr>
+      <w:tr>
+        <w:tc>
+          <w:tcPr>
+            <w:tcBorders>
+              <w:left w:val="nil"/>
+              <w:right w:val="nil"/>
+              <w:top w:val="nil"/>
+              <w:bottom w:val="single" w:sz="4" w:color="D9E1E8"/>
+            </w:tcBorders>
+            <w:vAlign w:val="center"/>
+          </w:tcPr>
+          <w:p>
+            <w:pPr>
+              <w:pStyle w:val="Compact"/>
+              <w:spacing w:before="0" w:after="20" w:line="240" w:lineRule="auto"/>
+              <w:jc w:val="center"/>
+              <w:suppressAutoHyphens/>
+              <w:keepNext w:val="0"/>
+              <w:keepLines/>
+              <w:widowControl w:val="1"/>
+            </w:pPr>
+            <w:r>
+              <w:rPr>
+                <w:rFonts w:ascii="Times New Roman" w:hAnsi="Times New Roman"/>
+                <w:sz w:val="19"/>
+              </w:rPr>
+              <w:t xml:space="preserve">2</w:t>
+            </w:r>
+          </w:p>
+        </w:tc>
+        <w:tc>
+          <w:tcPr>
+            <w:tcBorders>
+              <w:left w:val="nil"/>
+              <w:right w:val="nil"/>
+              <w:top w:val="nil"/>
+              <w:bottom w:val="single" w:sz="4" w:color="D9E1E8"/>
+            </w:tcBorders>
+            <w:vAlign w:val="center"/>
+          </w:tcPr>
+          <w:p>
+            <w:pPr>
+              <w:pStyle w:val="Compact"/>
+              <w:spacing w:before="0" w:after="20" w:line="240" w:lineRule="auto"/>
+              <w:jc w:val="center"/>
+              <w:suppressAutoHyphens/>
+              <w:keepNext w:val="0"/>
+              <w:keepLines/>
+              <w:widowControl w:val="1"/>
+            </w:pPr>
+            <w:r>
+              <w:rPr>
+                <w:rFonts w:ascii="Times New Roman" w:hAnsi="Times New Roman"/>
+                <w:sz w:val="19"/>
+              </w:rPr>
+              <w:t xml:space="preserve">Diagnosis from noisy self-descriptions (3.1.1)</w:t>
+            </w:r>
+          </w:p>
+        </w:tc>
+        <w:tc>
+          <w:tcPr>
+            <w:tcBorders>
+              <w:left w:val="nil"/>
+              <w:right w:val="nil"/>
+              <w:top w:val="nil"/>
+              <w:bottom w:val="single" w:sz="4" w:color="D9E1E8"/>
+            </w:tcBorders>
+            <w:vAlign w:val="center"/>
+          </w:tcPr>
+          <w:p>
+            <w:pPr>
+              <w:pStyle w:val="Compact"/>
+              <w:spacing w:before="0" w:after="20" w:line="240" w:lineRule="auto"/>
+              <w:jc w:val="center"/>
+              <w:suppressAutoHyphens/>
+              <w:keepNext w:val="0"/>
+              <w:keepLines/>
+              <w:widowControl w:val="1"/>
+            </w:pPr>
+            <w:r>
+              <w:rPr>
+                <w:rFonts w:ascii="Times New Roman" w:hAnsi="Times New Roman"/>
+                <w:sz w:val="19"/>
+              </w:rPr>
+              <w:t xml:space="preserve">Real seed: Symptom2Disease</w:t>
+            </w:r>
+          </w:p>
+        </w:tc>
+        <w:tc>
+          <w:tcPr>
+            <w:tcBorders>
+              <w:left w:val="nil"/>
+              <w:right w:val="nil"/>
+              <w:top w:val="nil"/>
+              <w:bottom w:val="single" w:sz="4" w:color="D9E1E8"/>
+            </w:tcBorders>
+            <w:vAlign w:val="center"/>
+          </w:tcPr>
+          <w:p>
+            <w:pPr>
+              <w:pStyle w:val="Compact"/>
+              <w:spacing w:before="0" w:after="20" w:line="240" w:lineRule="auto"/>
+              <w:jc w:val="center"/>
+              <w:suppressAutoHyphens/>
+              <w:keepNext w:val="0"/>
+              <w:keepLines/>
+              <w:widowControl w:val="1"/>
+            </w:pPr>
+            <w:r>
+              <w:rPr>
+                <w:rFonts w:ascii="Times New Roman" w:hAnsi="Times New Roman"/>
+                <w:sz w:val="19"/>
+              </w:rPr>
+              <w:t xml:space="preserve">Synthetic</w:t>
+            </w:r>
+          </w:p>
+        </w:tc>
+        <w:tc>
+          <w:tcPr>
+            <w:tcBorders>
+              <w:left w:val="nil"/>
+              <w:right w:val="nil"/>
+              <w:top w:val="nil"/>
+              <w:bottom w:val="single" w:sz="4" w:color="D9E1E8"/>
+            </w:tcBorders>
+            <w:vAlign w:val="center"/>
+          </w:tcPr>
+          <w:p>
+            <w:pPr>
+              <w:pStyle w:val="Compact"/>
+              <w:spacing w:before="0" w:after="20" w:line="240" w:lineRule="auto"/>
+              <w:jc w:val="center"/>
+              <w:suppressAutoHyphens/>
+              <w:keepNext w:val="0"/>
+              <w:keepLines/>
+              <w:widowControl w:val="1"/>
+            </w:pPr>
+            <w:r>
+              <w:rPr>
+                <w:rFonts w:ascii="Times New Roman" w:hAnsi="Times New Roman"/>
+                <w:i/>
+                <w:iCs/>
+                <w:sz w:val="19"/>
+              </w:rPr>
+              <w:t xml:space="preserve">S→S</w:t>
+            </w:r>
+          </w:p>
+        </w:tc>
+      </w:tr>
+      <w:tr>
+        <w:tc>
+          <w:tcPr>
+            <w:tcBorders>
+              <w:left w:val="nil"/>
+              <w:right w:val="nil"/>
+              <w:top w:val="nil"/>
+              <w:bottom w:val="single" w:sz="4" w:color="D9E1E8"/>
+            </w:tcBorders>
+            <w:vAlign w:val="center"/>
+          </w:tcPr>
+          <w:p>
+            <w:pPr>
+              <w:pStyle w:val="Compact"/>
+              <w:spacing w:before="0" w:after="20" w:line="240" w:lineRule="auto"/>
+              <w:jc w:val="center"/>
+              <w:suppressAutoHyphens/>
+              <w:keepNext w:val="0"/>
+              <w:keepLines/>
+              <w:widowControl w:val="1"/>
+            </w:pPr>
+            <w:r>
+              <w:rPr>
+                <w:rFonts w:ascii="Times New Roman" w:hAnsi="Times New Roman"/>
+                <w:sz w:val="19"/>
+              </w:rPr>
+              <w:t xml:space="preserve">3</w:t>
+            </w:r>
+          </w:p>
+        </w:tc>
+        <w:tc>
+          <w:tcPr>
+            <w:tcBorders>
+              <w:left w:val="nil"/>
+              <w:right w:val="nil"/>
+              <w:top w:val="nil"/>
+              <w:bottom w:val="single" w:sz="4" w:color="D9E1E8"/>
+            </w:tcBorders>
+            <w:vAlign w:val="center"/>
+          </w:tcPr>
+          <w:p>
+            <w:pPr>
+              <w:pStyle w:val="Compact"/>
+              <w:spacing w:before="0" w:after="20" w:line="240" w:lineRule="auto"/>
+              <w:jc w:val="center"/>
+              <w:suppressAutoHyphens/>
+              <w:keepNext w:val="0"/>
+              <w:keepLines/>
+              <w:widowControl w:val="1"/>
+            </w:pPr>
+            <w:r>
+              <w:rPr>
+                <w:rFonts w:ascii="Times New Roman" w:hAnsi="Times New Roman"/>
+                <w:sz w:val="19"/>
+              </w:rPr>
+              <w:t xml:space="preserve">Urgency triage from complaints (3.1.3)</w:t>
+            </w:r>
+          </w:p>
+        </w:tc>
+        <w:tc>
+          <w:tcPr>
+            <w:tcBorders>
+              <w:left w:val="nil"/>
+              <w:right w:val="nil"/>
+              <w:top w:val="nil"/>
+              <w:bottom w:val="single" w:sz="4" w:color="D9E1E8"/>
+            </w:tcBorders>
+            <w:vAlign w:val="center"/>
+          </w:tcPr>
+          <w:p>
+            <w:pPr>
+              <w:pStyle w:val="Compact"/>
+              <w:spacing w:before="0" w:after="20" w:line="240" w:lineRule="auto"/>
+              <w:jc w:val="center"/>
+              <w:suppressAutoHyphens/>
+              <w:keepNext w:val="0"/>
+              <w:keepLines/>
+              <w:widowControl w:val="1"/>
+            </w:pPr>
+            <w:r>
+              <w:rPr>
+                <w:rFonts w:ascii="Times New Roman" w:hAnsi="Times New Roman"/>
+                <w:sz w:val="19"/>
+              </w:rPr>
+              <w:t xml:space="preserve">Real seed: MIMIC-IV-ED labels</w:t>
+            </w:r>
+          </w:p>
+        </w:tc>
+        <w:tc>
+          <w:tcPr>
+            <w:tcBorders>
+              <w:left w:val="nil"/>
+              <w:right w:val="nil"/>
+              <w:top w:val="nil"/>
+              <w:bottom w:val="single" w:sz="4" w:color="D9E1E8"/>
+            </w:tcBorders>
+            <w:vAlign w:val="center"/>
+          </w:tcPr>
+          <w:p>
+            <w:pPr>
+              <w:pStyle w:val="Compact"/>
+              <w:spacing w:before="0" w:after="20" w:line="240" w:lineRule="auto"/>
+              <w:jc w:val="center"/>
+              <w:suppressAutoHyphens/>
+              <w:keepNext w:val="0"/>
+              <w:keepLines/>
+              <w:widowControl w:val="1"/>
+            </w:pPr>
+            <w:r>
+              <w:rPr>
+                <w:rFonts w:ascii="Times New Roman" w:hAnsi="Times New Roman"/>
+                <w:sz w:val="19"/>
+              </w:rPr>
+              <w:t xml:space="preserve">Synthetic</w:t>
+            </w:r>
+          </w:p>
+        </w:tc>
+        <w:tc>
+          <w:tcPr>
+            <w:tcBorders>
+              <w:left w:val="nil"/>
+              <w:right w:val="nil"/>
+              <w:top w:val="nil"/>
+              <w:bottom w:val="single" w:sz="4" w:color="D9E1E8"/>
+            </w:tcBorders>
+            <w:vAlign w:val="center"/>
+          </w:tcPr>
+          <w:p>
+            <w:pPr>
+              <w:pStyle w:val="Compact"/>
+              <w:spacing w:before="0" w:after="20" w:line="240" w:lineRule="auto"/>
+              <w:jc w:val="center"/>
+              <w:suppressAutoHyphens/>
+              <w:keepNext w:val="0"/>
+              <w:keepLines/>
+              <w:widowControl w:val="1"/>
+            </w:pPr>
+            <w:r>
+              <w:rPr>
+                <w:rFonts w:ascii="Times New Roman" w:hAnsi="Times New Roman"/>
+                <w:i/>
+                <w:iCs/>
+                <w:sz w:val="19"/>
+              </w:rPr>
+              <w:t xml:space="preserve">S→S</w:t>
+            </w:r>
+          </w:p>
+        </w:tc>
+      </w:tr>
+      <w:tr>
+        <w:tc>
+          <w:tcPr>
+            <w:tcBorders>
+              <w:left w:val="nil"/>
+              <w:right w:val="nil"/>
+              <w:top w:val="nil"/>
+              <w:bottom w:val="single" w:sz="4" w:color="D9E1E8"/>
+            </w:tcBorders>
+            <w:vAlign w:val="center"/>
+          </w:tcPr>
+          <w:p>
+            <w:pPr>
+              <w:pStyle w:val="Compact"/>
+              <w:spacing w:before="0" w:after="20" w:line="240" w:lineRule="auto"/>
+              <w:jc w:val="center"/>
+              <w:suppressAutoHyphens/>
+              <w:keepNext w:val="0"/>
+              <w:keepLines/>
+              <w:widowControl w:val="1"/>
+            </w:pPr>
+            <w:r>
+              <w:rPr>
+                <w:rFonts w:ascii="Times New Roman" w:hAnsi="Times New Roman"/>
+                <w:sz w:val="19"/>
+              </w:rPr>
+              <w:t xml:space="preserve">4</w:t>
+            </w:r>
+          </w:p>
+        </w:tc>
+        <w:tc>
+          <w:tcPr>
+            <w:tcBorders>
+              <w:left w:val="nil"/>
+              <w:right w:val="nil"/>
+              <w:top w:val="nil"/>
+              <w:bottom w:val="single" w:sz="4" w:color="D9E1E8"/>
+            </w:tcBorders>
+            <w:vAlign w:val="center"/>
+          </w:tcPr>
+          <w:p>
+            <w:pPr>
+              <w:pStyle w:val="Compact"/>
+              <w:spacing w:before="0" w:after="20" w:line="240" w:lineRule="auto"/>
+              <w:jc w:val="center"/>
+              <w:suppressAutoHyphens/>
+              <w:keepNext w:val="0"/>
+              <w:keepLines/>
+              <w:widowControl w:val="1"/>
+            </w:pPr>
+            <w:r>
+              <w:rPr>
+                <w:rFonts w:ascii="Times New Roman" w:hAnsi="Times New Roman"/>
+                <w:sz w:val="19"/>
+              </w:rPr>
+              <w:t xml:space="preserve">Administrative portal-message triage (3.2.1)</w:t>
+            </w:r>
+          </w:p>
+        </w:tc>
+        <w:tc>
+          <w:tcPr>
+            <w:tcBorders>
+              <w:left w:val="nil"/>
+              <w:right w:val="nil"/>
+              <w:top w:val="nil"/>
+              <w:bottom w:val="single" w:sz="4" w:color="D9E1E8"/>
+            </w:tcBorders>
+            <w:vAlign w:val="center"/>
+          </w:tcPr>
+          <w:p>
+            <w:pPr>
+              <w:pStyle w:val="Compact"/>
+              <w:spacing w:before="0" w:after="20" w:line="240" w:lineRule="auto"/>
+              <w:jc w:val="center"/>
+              <w:suppressAutoHyphens/>
+              <w:keepNext w:val="0"/>
+              <w:keepLines/>
+              <w:widowControl w:val="1"/>
+            </w:pPr>
+            <w:r>
+              <w:rPr>
+                <w:rFonts w:ascii="Times New Roman" w:hAnsi="Times New Roman"/>
+                <w:sz w:val="19"/>
+              </w:rPr>
+              <w:t xml:space="preserve">None (fully synthetic)</w:t>
+            </w:r>
+          </w:p>
+        </w:tc>
+        <w:tc>
+          <w:tcPr>
+            <w:tcBorders>
+              <w:left w:val="nil"/>
+              <w:right w:val="nil"/>
+              <w:top w:val="nil"/>
+              <w:bottom w:val="single" w:sz="4" w:color="D9E1E8"/>
+            </w:tcBorders>
+            <w:vAlign w:val="center"/>
+          </w:tcPr>
+          <w:p>
+            <w:pPr>
+              <w:pStyle w:val="Compact"/>
+              <w:spacing w:before="0" w:after="20" w:line="240" w:lineRule="auto"/>
+              <w:jc w:val="center"/>
+              <w:suppressAutoHyphens/>
+              <w:keepNext w:val="0"/>
+              <w:keepLines/>
+              <w:widowControl w:val="1"/>
+            </w:pPr>
+            <w:r>
+              <w:rPr>
+                <w:rFonts w:ascii="Times New Roman" w:hAnsi="Times New Roman"/>
+                <w:sz w:val="19"/>
+              </w:rPr>
+              <w:t xml:space="preserve">Synthetic</w:t>
+            </w:r>
+          </w:p>
+        </w:tc>
+        <w:tc>
+          <w:tcPr>
+            <w:tcBorders>
+              <w:left w:val="nil"/>
+              <w:right w:val="nil"/>
+              <w:top w:val="nil"/>
+              <w:bottom w:val="single" w:sz="4" w:color="D9E1E8"/>
+            </w:tcBorders>
+            <w:vAlign w:val="center"/>
+          </w:tcPr>
+          <w:p>
+            <w:pPr>
+              <w:pStyle w:val="Compact"/>
+              <w:spacing w:before="0" w:after="20" w:line="240" w:lineRule="auto"/>
+              <w:jc w:val="center"/>
+              <w:suppressAutoHyphens/>
+              <w:keepNext w:val="0"/>
+              <w:keepLines/>
+              <w:widowControl w:val="1"/>
+            </w:pPr>
+            <w:r>
+              <w:rPr>
+                <w:rFonts w:ascii="Times New Roman" w:hAnsi="Times New Roman"/>
+                <w:i/>
+                <w:iCs/>
+                <w:sz w:val="19"/>
+              </w:rPr>
+              <w:t xml:space="preserve">S→S</w:t>
+            </w:r>
+          </w:p>
+        </w:tc>
+      </w:tr>
+      <w:tr>
+        <w:tc>
+          <w:tcPr>
+            <w:tcBorders>
+              <w:left w:val="nil"/>
+              <w:right w:val="nil"/>
+              <w:top w:val="nil"/>
+              <w:bottom w:val="single" w:sz="4" w:color="D9E1E8"/>
+            </w:tcBorders>
+            <w:vAlign w:val="center"/>
+          </w:tcPr>
+          <w:p>
+            <w:pPr>
+              <w:pStyle w:val="Compact"/>
+              <w:spacing w:before="0" w:after="20" w:line="240" w:lineRule="auto"/>
+              <w:jc w:val="center"/>
+              <w:suppressAutoHyphens/>
+              <w:keepNext w:val="0"/>
+              <w:keepLines/>
+              <w:widowControl w:val="1"/>
+            </w:pPr>
+            <w:r>
+              <w:rPr>
+                <w:rFonts w:ascii="Times New Roman" w:hAnsi="Times New Roman"/>
+                <w:sz w:val="19"/>
+              </w:rPr>
+              <w:t xml:space="preserve">5</w:t>
+            </w:r>
+          </w:p>
+        </w:tc>
+        <w:tc>
+          <w:tcPr>
+            <w:tcBorders>
+              <w:left w:val="nil"/>
+              <w:right w:val="nil"/>
+              <w:top w:val="nil"/>
+              <w:bottom w:val="single" w:sz="4" w:color="D9E1E8"/>
+            </w:tcBorders>
+            <w:vAlign w:val="center"/>
+          </w:tcPr>
+          <w:p>
+            <w:pPr>
+              <w:pStyle w:val="Compact"/>
+              <w:spacing w:before="0" w:after="20" w:line="240" w:lineRule="auto"/>
+              <w:jc w:val="center"/>
+              <w:suppressAutoHyphens/>
+              <w:keepNext w:val="0"/>
+              <w:keepLines/>
+              <w:widowControl w:val="1"/>
+            </w:pPr>
+            <w:r>
+              <w:rPr>
+                <w:rFonts w:ascii="Times New Roman" w:hAnsi="Times New Roman"/>
+                <w:sz w:val="19"/>
+              </w:rPr>
+              <w:t xml:space="preserve">Postpartum severity triage (3.2.2)</w:t>
+            </w:r>
+          </w:p>
+        </w:tc>
+        <w:tc>
+          <w:tcPr>
+            <w:tcBorders>
+              <w:left w:val="nil"/>
+              <w:right w:val="nil"/>
+              <w:top w:val="nil"/>
+              <w:bottom w:val="single" w:sz="4" w:color="D9E1E8"/>
+            </w:tcBorders>
+            <w:vAlign w:val="center"/>
+          </w:tcPr>
+          <w:p>
+            <w:pPr>
+              <w:pStyle w:val="Compact"/>
+              <w:spacing w:before="0" w:after="20" w:line="240" w:lineRule="auto"/>
+              <w:jc w:val="center"/>
+              <w:suppressAutoHyphens/>
+              <w:keepNext w:val="0"/>
+              <w:keepLines/>
+              <w:widowControl w:val="1"/>
+            </w:pPr>
+            <w:r>
+              <w:rPr>
+                <w:rFonts w:ascii="Times New Roman" w:hAnsi="Times New Roman"/>
+                <w:sz w:val="19"/>
+              </w:rPr>
+              <w:t xml:space="preserve">None (fully synthetic)</w:t>
+            </w:r>
+          </w:p>
+        </w:tc>
+        <w:tc>
+          <w:tcPr>
+            <w:tcBorders>
+              <w:left w:val="nil"/>
+              <w:right w:val="nil"/>
+              <w:top w:val="nil"/>
+              <w:bottom w:val="single" w:sz="4" w:color="D9E1E8"/>
+            </w:tcBorders>
+            <w:vAlign w:val="center"/>
+          </w:tcPr>
+          <w:p>
+            <w:pPr>
+              <w:pStyle w:val="Compact"/>
+              <w:spacing w:before="0" w:after="20" w:line="240" w:lineRule="auto"/>
+              <w:jc w:val="center"/>
+              <w:suppressAutoHyphens/>
+              <w:keepNext w:val="0"/>
+              <w:keepLines/>
+              <w:widowControl w:val="1"/>
+            </w:pPr>
+            <w:r>
+              <w:rPr>
+                <w:rFonts w:ascii="Times New Roman" w:hAnsi="Times New Roman"/>
+                <w:sz w:val="19"/>
+              </w:rPr>
+              <w:t xml:space="preserve">Synthetic</w:t>
+            </w:r>
+          </w:p>
+        </w:tc>
+        <w:tc>
+          <w:tcPr>
+            <w:tcBorders>
+              <w:left w:val="nil"/>
+              <w:right w:val="nil"/>
+              <w:top w:val="nil"/>
+              <w:bottom w:val="single" w:sz="4" w:color="D9E1E8"/>
+            </w:tcBorders>
+            <w:vAlign w:val="center"/>
+          </w:tcPr>
+          <w:p>
+            <w:pPr>
+              <w:pStyle w:val="Compact"/>
+              <w:spacing w:before="0" w:after="20" w:line="240" w:lineRule="auto"/>
+              <w:jc w:val="center"/>
+              <w:suppressAutoHyphens/>
+              <w:keepNext w:val="0"/>
+              <w:keepLines/>
+              <w:widowControl w:val="1"/>
+            </w:pPr>
+            <w:r>
+              <w:rPr>
+                <w:rFonts w:ascii="Times New Roman" w:hAnsi="Times New Roman"/>
+                <w:i/>
+                <w:iCs/>
+                <w:sz w:val="19"/>
+              </w:rPr>
+              <w:t xml:space="preserve">S→S</w:t>
+            </w:r>
+          </w:p>
+        </w:tc>
+      </w:tr>
+      <w:tr>
+        <w:tc>
+          <w:tcPr>
+            <w:tcBorders>
+              <w:left w:val="nil"/>
+              <w:right w:val="nil"/>
+              <w:top w:val="nil"/>
+              <w:bottom w:val="single" w:sz="4" w:color="D9E1E8"/>
+            </w:tcBorders>
+            <w:vAlign w:val="center"/>
+          </w:tcPr>
+          <w:p>
+            <w:pPr>
+              <w:pStyle w:val="Compact"/>
+              <w:spacing w:before="0" w:after="20" w:line="240" w:lineRule="auto"/>
+              <w:jc w:val="center"/>
+              <w:suppressAutoHyphens/>
+              <w:keepNext w:val="0"/>
+              <w:keepLines/>
+              <w:widowControl w:val="1"/>
+            </w:pPr>
+            <w:r>
+              <w:rPr>
+                <w:rFonts w:ascii="Times New Roman" w:hAnsi="Times New Roman"/>
+                <w:sz w:val="19"/>
+              </w:rPr>
+              <w:t xml:space="preserve">6</w:t>
+            </w:r>
+          </w:p>
+        </w:tc>
+        <w:tc>
+          <w:tcPr>
+            <w:tcBorders>
+              <w:left w:val="nil"/>
+              <w:right w:val="nil"/>
+              <w:top w:val="nil"/>
+              <w:bottom w:val="single" w:sz="4" w:color="D9E1E8"/>
+            </w:tcBorders>
+            <w:vAlign w:val="center"/>
+          </w:tcPr>
+          <w:p>
+            <w:pPr>
+              <w:pStyle w:val="Compact"/>
+              <w:spacing w:before="0" w:after="20" w:line="240" w:lineRule="auto"/>
+              <w:jc w:val="center"/>
+              <w:suppressAutoHyphens/>
+              <w:keepNext w:val="0"/>
+              <w:keepLines/>
+              <w:widowControl w:val="1"/>
+            </w:pPr>
+            <w:r>
+              <w:rPr>
+                <w:rFonts w:ascii="Times New Roman" w:hAnsi="Times New Roman"/>
+                <w:sz w:val="19"/>
+              </w:rPr>
+              <w:t xml:space="preserve">Oncology distress classification (3.2.3)</w:t>
+            </w:r>
+          </w:p>
+        </w:tc>
+        <w:tc>
+          <w:tcPr>
+            <w:tcBorders>
+              <w:left w:val="nil"/>
+              <w:right w:val="nil"/>
+              <w:top w:val="nil"/>
+              <w:bottom w:val="single" w:sz="4" w:color="D9E1E8"/>
+            </w:tcBorders>
+            <w:vAlign w:val="center"/>
+          </w:tcPr>
+          <w:p>
+            <w:pPr>
+              <w:pStyle w:val="Compact"/>
+              <w:spacing w:before="0" w:after="20" w:line="240" w:lineRule="auto"/>
+              <w:jc w:val="center"/>
+              <w:suppressAutoHyphens/>
+              <w:keepNext w:val="0"/>
+              <w:keepLines/>
+              <w:widowControl w:val="1"/>
+            </w:pPr>
+            <w:r>
+              <w:rPr>
+                <w:rFonts w:ascii="Times New Roman" w:hAnsi="Times New Roman"/>
+                <w:sz w:val="19"/>
+              </w:rPr>
+              <w:t xml:space="preserve">None (fully synthetic)</w:t>
+            </w:r>
+          </w:p>
+        </w:tc>
+        <w:tc>
+          <w:tcPr>
+            <w:tcBorders>
+              <w:left w:val="nil"/>
+              <w:right w:val="nil"/>
+              <w:top w:val="nil"/>
+              <w:bottom w:val="single" w:sz="4" w:color="D9E1E8"/>
+            </w:tcBorders>
+            <w:vAlign w:val="center"/>
+          </w:tcPr>
+          <w:p>
+            <w:pPr>
+              <w:pStyle w:val="Compact"/>
+              <w:spacing w:before="0" w:after="20" w:line="240" w:lineRule="auto"/>
+              <w:jc w:val="center"/>
+              <w:suppressAutoHyphens/>
+              <w:keepNext w:val="0"/>
+              <w:keepLines/>
+              <w:widowControl w:val="1"/>
+            </w:pPr>
+            <w:r>
+              <w:rPr>
+                <w:rFonts w:ascii="Times New Roman" w:hAnsi="Times New Roman"/>
+                <w:sz w:val="19"/>
+              </w:rPr>
+              <w:t xml:space="preserve">Synthetic</w:t>
+            </w:r>
+          </w:p>
+        </w:tc>
+        <w:tc>
+          <w:tcPr>
+            <w:tcBorders>
+              <w:left w:val="nil"/>
+              <w:right w:val="nil"/>
+              <w:top w:val="nil"/>
+              <w:bottom w:val="single" w:sz="4" w:color="D9E1E8"/>
+            </w:tcBorders>
+            <w:vAlign w:val="center"/>
+          </w:tcPr>
+          <w:p>
+            <w:pPr>
+              <w:pStyle w:val="Compact"/>
+              <w:spacing w:before="0" w:after="20" w:line="240" w:lineRule="auto"/>
+              <w:jc w:val="center"/>
+              <w:suppressAutoHyphens/>
+              <w:keepNext w:val="0"/>
+              <w:keepLines/>
+              <w:widowControl w:val="1"/>
+            </w:pPr>
+            <w:r>
+              <w:rPr>
+                <w:rFonts w:ascii="Times New Roman" w:hAnsi="Times New Roman"/>
+                <w:i/>
+                <w:iCs/>
+                <w:sz w:val="19"/>
+              </w:rPr>
+              <w:t xml:space="preserve">S→S</w:t>
+            </w:r>
+          </w:p>
+        </w:tc>
+      </w:tr>
+      <w:tr>
+        <w:tc>
+          <w:tcPr>
+            <w:tcBorders>
+              <w:left w:val="nil"/>
+              <w:right w:val="nil"/>
+              <w:top w:val="nil"/>
+              <w:bottom w:val="single" w:sz="4" w:color="D9E1E8"/>
+            </w:tcBorders>
+            <w:vAlign w:val="center"/>
+          </w:tcPr>
+          <w:p>
+            <w:pPr>
+              <w:pStyle w:val="Compact"/>
+              <w:spacing w:before="0" w:after="20" w:line="240" w:lineRule="auto"/>
+              <w:jc w:val="center"/>
+              <w:suppressAutoHyphens/>
+              <w:keepNext w:val="0"/>
+              <w:keepLines/>
+              <w:widowControl w:val="1"/>
+            </w:pPr>
+            <w:r>
+              <w:rPr>
+                <w:rFonts w:ascii="Times New Roman" w:hAnsi="Times New Roman"/>
+                <w:sz w:val="19"/>
+              </w:rPr>
+              <w:t xml:space="preserve">7</w:t>
+            </w:r>
+          </w:p>
+        </w:tc>
+        <w:tc>
+          <w:tcPr>
+            <w:tcBorders>
+              <w:left w:val="nil"/>
+              <w:right w:val="nil"/>
+              <w:top w:val="nil"/>
+              <w:bottom w:val="single" w:sz="4" w:color="D9E1E8"/>
+            </w:tcBorders>
+            <w:vAlign w:val="center"/>
+          </w:tcPr>
+          <w:p>
+            <w:pPr>
+              <w:pStyle w:val="Compact"/>
+              <w:spacing w:before="0" w:after="20" w:line="240" w:lineRule="auto"/>
+              <w:jc w:val="center"/>
+              <w:suppressAutoHyphens/>
+              <w:keepNext w:val="0"/>
+              <w:keepLines/>
+              <w:widowControl w:val="1"/>
+            </w:pPr>
+            <w:r>
+              <w:rPr>
+                <w:rFonts w:ascii="Times New Roman" w:hAnsi="Times New Roman"/>
+                <w:sz w:val="19"/>
+              </w:rPr>
+              <w:t xml:space="preserve">Medication-question risk classification (3.2.4)</w:t>
+            </w:r>
+          </w:p>
+        </w:tc>
+        <w:tc>
+          <w:tcPr>
+            <w:tcBorders>
+              <w:left w:val="nil"/>
+              <w:right w:val="nil"/>
+              <w:top w:val="nil"/>
+              <w:bottom w:val="single" w:sz="4" w:color="D9E1E8"/>
+            </w:tcBorders>
+            <w:vAlign w:val="center"/>
+          </w:tcPr>
+          <w:p>
+            <w:pPr>
+              <w:pStyle w:val="Compact"/>
+              <w:spacing w:before="0" w:after="20" w:line="240" w:lineRule="auto"/>
+              <w:jc w:val="center"/>
+              <w:suppressAutoHyphens/>
+              <w:keepNext w:val="0"/>
+              <w:keepLines/>
+              <w:widowControl w:val="1"/>
+            </w:pPr>
+            <w:r>
+              <w:rPr>
+                <w:rFonts w:ascii="Times New Roman" w:hAnsi="Times New Roman"/>
+                <w:sz w:val="19"/>
+              </w:rPr>
+              <w:t xml:space="preserve">Real labeled test set: authentic patient questions (MedInfo2019)</w:t>
+            </w:r>
+          </w:p>
+        </w:tc>
+        <w:tc>
+          <w:tcPr>
+            <w:tcBorders>
+              <w:left w:val="nil"/>
+              <w:right w:val="nil"/>
+              <w:top w:val="nil"/>
+              <w:bottom w:val="single" w:sz="4" w:color="D9E1E8"/>
+            </w:tcBorders>
+            <w:vAlign w:val="center"/>
+          </w:tcPr>
+          <w:p>
+            <w:pPr>
+              <w:pStyle w:val="Compact"/>
+              <w:spacing w:before="0" w:after="20" w:line="240" w:lineRule="auto"/>
+              <w:jc w:val="center"/>
+              <w:suppressAutoHyphens/>
+              <w:keepNext w:val="0"/>
+              <w:keepLines/>
+              <w:widowControl w:val="1"/>
+            </w:pPr>
+            <w:r>
+              <w:rPr>
+                <w:rFonts w:ascii="Times New Roman" w:hAnsi="Times New Roman"/>
+                <w:b/>
+                <w:bCs/>
+                <w:sz w:val="19"/>
+              </w:rPr>
+              <w:t xml:space="preserve">Real</w:t>
+            </w:r>
+            <w:r>
+              <w:rPr>
+                <w:rFonts w:ascii="Times New Roman" w:hAnsi="Times New Roman"/>
+                <w:sz w:val="19"/>
+              </w:rPr>
+              <w:t xml:space="preserve"> </w:t>
+            </w:r>
+            <w:r>
+              <w:rPr>
+                <w:rFonts w:ascii="Times New Roman" w:hAnsi="Times New Roman"/>
+                <w:sz w:val="19"/>
+              </w:rPr>
+              <w:t xml:space="preserve">(authentic patient text)</w:t>
+            </w:r>
+          </w:p>
+        </w:tc>
+        <w:tc>
+          <w:tcPr>
+            <w:tcBorders>
+              <w:left w:val="nil"/>
+              <w:right w:val="nil"/>
+              <w:top w:val="nil"/>
+              <w:bottom w:val="single" w:sz="4" w:color="D9E1E8"/>
+            </w:tcBorders>
+            <w:vAlign w:val="center"/>
+          </w:tcPr>
+          <w:p>
+            <w:pPr>
+              <w:pStyle w:val="Compact"/>
+              <w:spacing w:before="0" w:after="20" w:line="240" w:lineRule="auto"/>
+              <w:jc w:val="center"/>
+              <w:suppressAutoHyphens/>
+              <w:keepNext w:val="0"/>
+              <w:keepLines/>
+              <w:widowControl w:val="1"/>
+            </w:pPr>
+            <w:r>
+              <w:rPr>
+                <w:rFonts w:ascii="Times New Roman" w:hAnsi="Times New Roman"/>
+                <w:b/>
+                <w:bCs/>
+                <w:i/>
+                <w:iCs/>
+                <w:sz w:val="19"/>
+              </w:rPr>
+              <w:t xml:space="preserve">S→R</w:t>
+            </w:r>
+          </w:p>
+        </w:tc>
+      </w:tr>
+      <w:tr>
+        <w:tc>
+          <w:tcPr>
+            <w:tcBorders>
+              <w:left w:val="nil"/>
+              <w:right w:val="nil"/>
+              <w:top w:val="nil"/>
+              <w:bottom w:val="single" w:sz="4" w:color="D9E1E8"/>
+            </w:tcBorders>
+            <w:vAlign w:val="center"/>
+          </w:tcPr>
+          <w:p>
+            <w:pPr>
+              <w:pStyle w:val="Compact"/>
+              <w:spacing w:before="0" w:after="20" w:line="240" w:lineRule="auto"/>
+              <w:jc w:val="center"/>
+              <w:suppressAutoHyphens/>
+              <w:keepNext w:val="0"/>
+              <w:keepLines/>
+              <w:widowControl w:val="1"/>
+            </w:pPr>
+            <w:r>
+              <w:rPr>
+                <w:rFonts w:ascii="Times New Roman" w:hAnsi="Times New Roman"/>
+                <w:sz w:val="19"/>
+              </w:rPr>
+              <w:t xml:space="preserve">8</w:t>
+            </w:r>
+          </w:p>
+        </w:tc>
+        <w:tc>
+          <w:tcPr>
+            <w:tcBorders>
+              <w:left w:val="nil"/>
+              <w:right w:val="nil"/>
+              <w:top w:val="nil"/>
+              <w:bottom w:val="single" w:sz="4" w:color="D9E1E8"/>
+            </w:tcBorders>
+            <w:vAlign w:val="center"/>
+          </w:tcPr>
+          <w:p>
+            <w:pPr>
+              <w:pStyle w:val="Compact"/>
+              <w:spacing w:before="0" w:after="20" w:line="240" w:lineRule="auto"/>
+              <w:jc w:val="center"/>
+              <w:suppressAutoHyphens/>
+              <w:keepNext w:val="0"/>
+              <w:keepLines/>
+              <w:widowControl w:val="1"/>
+            </w:pPr>
+            <w:r>
+              <w:rPr>
+                <w:rFonts w:ascii="Times New Roman" w:hAnsi="Times New Roman"/>
+                <w:sz w:val="19"/>
+              </w:rPr>
+              <w:t xml:space="preserve">Home-care status detection (3.2.5)</w:t>
+            </w:r>
+          </w:p>
+        </w:tc>
+        <w:tc>
+          <w:tcPr>
+            <w:tcBorders>
+              <w:left w:val="nil"/>
+              <w:right w:val="nil"/>
+              <w:top w:val="nil"/>
+              <w:bottom w:val="single" w:sz="4" w:color="D9E1E8"/>
+            </w:tcBorders>
+            <w:vAlign w:val="center"/>
+          </w:tcPr>
+          <w:p>
+            <w:pPr>
+              <w:pStyle w:val="Compact"/>
+              <w:spacing w:before="0" w:after="20" w:line="240" w:lineRule="auto"/>
+              <w:jc w:val="center"/>
+              <w:suppressAutoHyphens/>
+              <w:keepNext w:val="0"/>
+              <w:keepLines/>
+              <w:widowControl w:val="1"/>
+            </w:pPr>
+            <w:r>
+              <w:rPr>
+                <w:rFonts w:ascii="Times New Roman" w:hAnsi="Times New Roman"/>
+                <w:sz w:val="19"/>
+              </w:rPr>
+              <w:t xml:space="preserve">None (fully synthetic)</w:t>
+            </w:r>
+          </w:p>
+        </w:tc>
+        <w:tc>
+          <w:tcPr>
+            <w:tcBorders>
+              <w:left w:val="nil"/>
+              <w:right w:val="nil"/>
+              <w:top w:val="nil"/>
+              <w:bottom w:val="single" w:sz="4" w:color="D9E1E8"/>
+            </w:tcBorders>
+            <w:vAlign w:val="center"/>
+          </w:tcPr>
+          <w:p>
+            <w:pPr>
+              <w:pStyle w:val="Compact"/>
+              <w:spacing w:before="0" w:after="20" w:line="240" w:lineRule="auto"/>
+              <w:jc w:val="center"/>
+              <w:suppressAutoHyphens/>
+              <w:keepNext w:val="0"/>
+              <w:keepLines/>
+              <w:widowControl w:val="1"/>
+            </w:pPr>
+            <w:r>
+              <w:rPr>
+                <w:rFonts w:ascii="Times New Roman" w:hAnsi="Times New Roman"/>
+                <w:sz w:val="19"/>
+              </w:rPr>
+              <w:t xml:space="preserve">Synthetic</w:t>
+            </w:r>
+          </w:p>
+        </w:tc>
+        <w:tc>
+          <w:tcPr>
+            <w:tcBorders>
+              <w:left w:val="nil"/>
+              <w:right w:val="nil"/>
+              <w:top w:val="nil"/>
+              <w:bottom w:val="single" w:sz="4" w:color="D9E1E8"/>
+            </w:tcBorders>
+            <w:vAlign w:val="center"/>
+          </w:tcPr>
+          <w:p>
+            <w:pPr>
+              <w:pStyle w:val="Compact"/>
+              <w:spacing w:before="0" w:after="20" w:line="240" w:lineRule="auto"/>
+              <w:jc w:val="center"/>
+              <w:suppressAutoHyphens/>
+              <w:keepNext w:val="0"/>
+              <w:keepLines/>
+              <w:widowControl w:val="1"/>
+            </w:pPr>
+            <w:r>
+              <w:rPr>
+                <w:rFonts w:ascii="Times New Roman" w:hAnsi="Times New Roman"/>
+                <w:i/>
+                <w:iCs/>
+                <w:sz w:val="19"/>
+              </w:rPr>
+              <w:t xml:space="preserve">S→S</w:t>
+            </w:r>
+          </w:p>
+        </w:tc>
+      </w:tr>
+      <w:tr>
+        <w:tc>
+          <w:tcPr>
+            <w:tcBorders>
+              <w:left w:val="nil"/>
+              <w:right w:val="nil"/>
+              <w:top w:val="nil"/>
+              <w:bottom w:val="single" w:sz="4" w:color="D9E1E8"/>
+            </w:tcBorders>
+            <w:vAlign w:val="center"/>
+          </w:tcPr>
+          <w:p>
+            <w:pPr>
+              <w:pStyle w:val="Compact"/>
+              <w:spacing w:before="0" w:after="20" w:line="240" w:lineRule="auto"/>
+              <w:jc w:val="center"/>
+              <w:suppressAutoHyphens/>
+              <w:keepNext w:val="0"/>
+              <w:keepLines/>
+              <w:widowControl w:val="1"/>
+            </w:pPr>
+            <w:r>
+              <w:rPr>
+                <w:rFonts w:ascii="Times New Roman" w:hAnsi="Times New Roman"/>
+                <w:sz w:val="19"/>
+              </w:rPr>
+              <w:t xml:space="preserve">9</w:t>
+            </w:r>
+          </w:p>
+        </w:tc>
+        <w:tc>
+          <w:tcPr>
+            <w:tcBorders>
+              <w:left w:val="nil"/>
+              <w:right w:val="nil"/>
+              <w:top w:val="nil"/>
+              <w:bottom w:val="single" w:sz="4" w:color="D9E1E8"/>
+            </w:tcBorders>
+            <w:vAlign w:val="center"/>
+          </w:tcPr>
+          <w:p>
+            <w:pPr>
+              <w:pStyle w:val="Compact"/>
+              <w:spacing w:before="0" w:after="20" w:line="240" w:lineRule="auto"/>
+              <w:jc w:val="center"/>
+              <w:suppressAutoHyphens/>
+              <w:keepNext w:val="0"/>
+              <w:keepLines/>
+              <w:widowControl w:val="1"/>
+            </w:pPr>
+            <w:r>
+              <w:rPr>
+                <w:rFonts w:ascii="Times New Roman" w:hAnsi="Times New Roman"/>
+                <w:sz w:val="19"/>
+              </w:rPr>
+              <w:t xml:space="preserve">EMS report routing (3.3.1)</w:t>
+            </w:r>
+          </w:p>
+        </w:tc>
+        <w:tc>
+          <w:tcPr>
+            <w:tcBorders>
+              <w:left w:val="nil"/>
+              <w:right w:val="nil"/>
+              <w:top w:val="nil"/>
+              <w:bottom w:val="single" w:sz="4" w:color="D9E1E8"/>
+            </w:tcBorders>
+            <w:vAlign w:val="center"/>
+          </w:tcPr>
+          <w:p>
+            <w:pPr>
+              <w:pStyle w:val="Compact"/>
+              <w:spacing w:before="0" w:after="20" w:line="240" w:lineRule="auto"/>
+              <w:jc w:val="center"/>
+              <w:suppressAutoHyphens/>
+              <w:keepNext w:val="0"/>
+              <w:keepLines/>
+              <w:widowControl w:val="1"/>
+            </w:pPr>
+            <w:r>
+              <w:rPr>
+                <w:rFonts w:ascii="Times New Roman" w:hAnsi="Times New Roman"/>
+                <w:sz w:val="19"/>
+              </w:rPr>
+              <w:t xml:space="preserve">Real seed: MIMIC-IV-Ext cases</w:t>
+            </w:r>
+          </w:p>
+        </w:tc>
+        <w:tc>
+          <w:tcPr>
+            <w:tcBorders>
+              <w:left w:val="nil"/>
+              <w:right w:val="nil"/>
+              <w:top w:val="nil"/>
+              <w:bottom w:val="single" w:sz="4" w:color="D9E1E8"/>
+            </w:tcBorders>
+            <w:vAlign w:val="center"/>
+          </w:tcPr>
+          <w:p>
+            <w:pPr>
+              <w:pStyle w:val="Compact"/>
+              <w:spacing w:before="0" w:after="20" w:line="240" w:lineRule="auto"/>
+              <w:jc w:val="center"/>
+              <w:suppressAutoHyphens/>
+              <w:keepNext w:val="0"/>
+              <w:keepLines/>
+              <w:widowControl w:val="1"/>
+            </w:pPr>
+            <w:r>
+              <w:rPr>
+                <w:rFonts w:ascii="Times New Roman" w:hAnsi="Times New Roman"/>
+                <w:sz w:val="19"/>
+              </w:rPr>
+              <w:t xml:space="preserve">Synthetic</w:t>
+            </w:r>
+          </w:p>
+        </w:tc>
+        <w:tc>
+          <w:tcPr>
+            <w:tcBorders>
+              <w:left w:val="nil"/>
+              <w:right w:val="nil"/>
+              <w:top w:val="nil"/>
+              <w:bottom w:val="single" w:sz="4" w:color="D9E1E8"/>
+            </w:tcBorders>
+            <w:vAlign w:val="center"/>
+          </w:tcPr>
+          <w:p>
+            <w:pPr>
+              <w:pStyle w:val="Compact"/>
+              <w:spacing w:before="0" w:after="20" w:line="240" w:lineRule="auto"/>
+              <w:jc w:val="center"/>
+              <w:suppressAutoHyphens/>
+              <w:keepNext w:val="0"/>
+              <w:keepLines/>
+              <w:widowControl w:val="1"/>
+            </w:pPr>
+            <w:r>
+              <w:rPr>
+                <w:rFonts w:ascii="Times New Roman" w:hAnsi="Times New Roman"/>
+                <w:i/>
+                <w:iCs/>
+                <w:sz w:val="19"/>
+              </w:rPr>
+              <w:t xml:space="preserve">S→S</w:t>
+            </w:r>
+          </w:p>
+        </w:tc>
+      </w:tr>
+      <w:tr>
+        <w:tc>
+          <w:tcPr>
+            <w:tcBorders>
+              <w:left w:val="nil"/>
+              <w:right w:val="nil"/>
+              <w:top w:val="nil"/>
+              <w:bottom w:val="nil"/>
+            </w:tcBorders>
+            <w:vAlign w:val="center"/>
+          </w:tcPr>
+          <w:p>
+            <w:pPr>
+              <w:pStyle w:val="Compact"/>
+              <w:spacing w:before="0" w:after="20" w:line="240" w:lineRule="auto"/>
+              <w:jc w:val="center"/>
+              <w:suppressAutoHyphens/>
+              <w:keepNext w:val="0"/>
+              <w:keepLines/>
+              <w:widowControl w:val="1"/>
+            </w:pPr>
+            <w:r>
+              <w:rPr>
+                <w:rFonts w:ascii="Times New Roman" w:hAnsi="Times New Roman"/>
+                <w:sz w:val="19"/>
+              </w:rPr>
+              <w:t xml:space="preserve">10</w:t>
+            </w:r>
+          </w:p>
+        </w:tc>
+        <w:tc>
+          <w:tcPr>
+            <w:tcBorders>
+              <w:left w:val="nil"/>
+              <w:right w:val="nil"/>
+              <w:top w:val="nil"/>
+              <w:bottom w:val="nil"/>
+            </w:tcBorders>
+            <w:vAlign w:val="center"/>
+          </w:tcPr>
+          <w:p>
+            <w:pPr>
+              <w:pStyle w:val="Compact"/>
+              <w:spacing w:before="0" w:after="20" w:line="240" w:lineRule="auto"/>
+              <w:jc w:val="center"/>
+              <w:suppressAutoHyphens/>
+              <w:keepNext w:val="0"/>
+              <w:keepLines/>
+              <w:widowControl w:val="1"/>
+            </w:pPr>
+            <w:r>
+              <w:rPr>
+                <w:rFonts w:ascii="Times New Roman" w:hAnsi="Times New Roman"/>
+                <w:sz w:val="19"/>
+              </w:rPr>
+              <w:t xml:space="preserve">SBAR completeness checking (3.3.2)</w:t>
+            </w:r>
+          </w:p>
+        </w:tc>
+        <w:tc>
+          <w:tcPr>
+            <w:tcBorders>
+              <w:left w:val="nil"/>
+              <w:right w:val="nil"/>
+              <w:top w:val="nil"/>
+              <w:bottom w:val="nil"/>
+            </w:tcBorders>
+            <w:vAlign w:val="center"/>
+          </w:tcPr>
+          <w:p>
+            <w:pPr>
+              <w:pStyle w:val="Compact"/>
+              <w:spacing w:before="0" w:after="20" w:line="240" w:lineRule="auto"/>
+              <w:jc w:val="center"/>
+              <w:suppressAutoHyphens/>
+              <w:keepNext w:val="0"/>
+              <w:keepLines/>
+              <w:widowControl w:val="1"/>
+            </w:pPr>
+            <w:r>
+              <w:rPr>
+                <w:rFonts w:ascii="Times New Roman" w:hAnsi="Times New Roman"/>
+                <w:sz w:val="19"/>
+              </w:rPr>
+              <w:t xml:space="preserve">None (fully synthetic)</w:t>
+            </w:r>
+          </w:p>
+        </w:tc>
+        <w:tc>
+          <w:tcPr>
+            <w:tcBorders>
+              <w:left w:val="nil"/>
+              <w:right w:val="nil"/>
+              <w:top w:val="nil"/>
+              <w:bottom w:val="nil"/>
+            </w:tcBorders>
+            <w:vAlign w:val="center"/>
+          </w:tcPr>
+          <w:p>
+            <w:pPr>
+              <w:pStyle w:val="Compact"/>
+              <w:spacing w:before="0" w:after="20" w:line="240" w:lineRule="auto"/>
+              <w:jc w:val="center"/>
+              <w:suppressAutoHyphens/>
+              <w:keepNext w:val="0"/>
+              <w:keepLines/>
+              <w:widowControl w:val="1"/>
+            </w:pPr>
+            <w:r>
+              <w:rPr>
+                <w:rFonts w:ascii="Times New Roman" w:hAnsi="Times New Roman"/>
+                <w:sz w:val="19"/>
+              </w:rPr>
+              <w:t xml:space="preserve">Synthetic</w:t>
+            </w:r>
+          </w:p>
+        </w:tc>
+        <w:tc>
+          <w:tcPr>
+            <w:tcBorders>
+              <w:left w:val="nil"/>
+              <w:right w:val="nil"/>
+              <w:top w:val="nil"/>
+              <w:bottom w:val="nil"/>
+            </w:tcBorders>
+            <w:vAlign w:val="center"/>
+          </w:tcPr>
+          <w:p>
+            <w:pPr>
+              <w:pStyle w:val="Compact"/>
+              <w:spacing w:before="0" w:after="20" w:line="240" w:lineRule="auto"/>
+              <w:jc w:val="center"/>
+              <w:suppressAutoHyphens/>
+              <w:keepNext w:val="0"/>
+              <w:keepLines/>
+              <w:widowControl w:val="1"/>
+            </w:pPr>
+            <w:r>
+              <w:rPr>
+                <w:rFonts w:ascii="Times New Roman" w:hAnsi="Times New Roman"/>
+                <w:i/>
+                <w:iCs/>
+                <w:sz w:val="19"/>
+              </w:rPr>
+              <w:t xml:space="preserve">S→S</w:t>
+            </w:r>
+          </w:p>
+        </w:tc>
+      </w:tr>
+    </w:tbl>
+    <w:bookmarkEnd w:id="53"/>
+    <w:bookmarkEnd w:id="54"/>
+    <w:bookmarkStart w:id="59" w:name="s8"/>
+    <w:p>
+      <w:pPr>
+        <w:pStyle w:val="Heading2"/>
+        <w:keepNext/>
+        <w:keepLines/>
+        <w:widowControl w:val="1"/>
+      </w:pPr>
+      <w:r>
+        <w:t xml:space="preserve">4  Limitations and Caveats of Synthetic Data</w:t>
+      </w:r>
+    </w:p>
+    <w:p>
+      <w:pPr>
+        <w:pStyle w:val="FirstParagraph"/>
+        <w:jc w:val="both"/>
+        <w:keepNext w:val="0"/>
+        <w:keepLines w:val="0"/>
+        <w:widowControl w:val="1"/>
+      </w:pPr>
+      <w:r>
+        <w:t xml:space="preserve">Synthetic clinical communication is useful precisely because it is not real, and that same</w:t>
+      </w:r>
+      <w:r>
+        <w:t xml:space="preserve"> </w:t>
+      </w:r>
+      <w:r>
+        <w:t xml:space="preserve">fact is the source of its limitations. This section states them plainly, so that the enthusiasm of</w:t>
+      </w:r>
+      <w:r>
+        <w:t xml:space="preserve"> </w:t>
+      </w:r>
+      <w:r>
+        <w:t xml:space="preserve">Section 3 is read with appropriate caution. We separate technical limitations of the data itself</w:t>
+      </w:r>
+      <w:r>
+        <w:t xml:space="preserve"> </w:t>
+      </w:r>
+      <w:r>
+        <w:t xml:space="preserve">(4.1), practical and ethical caveats around its use (4.2), and a reminder of what synthetic data cannot</w:t>
+      </w:r>
+      <w:r>
+        <w:t xml:space="preserve"> </w:t>
+      </w:r>
+      <w:r>
+        <w:t xml:space="preserve">replace (4.3).</w:t>
+      </w:r>
+    </w:p>
+    <w:bookmarkStart w:id="55" w:name="technical-limitations"/>
+    <w:p>
+      <w:pPr>
+        <w:pStyle w:val="Heading3"/>
+        <w:keepNext/>
+        <w:keepLines/>
+        <w:widowControl w:val="1"/>
+      </w:pPr>
+      <w:r>
+        <w:t xml:space="preserve">4.1  Technical Limitations</w:t>
+      </w:r>
+    </w:p>
+    <w:p>
+      <w:pPr>
+        <w:pStyle w:val="FirstParagraph"/>
+        <w:jc w:val="both"/>
+        <w:keepNext w:val="0"/>
+        <w:keepLines w:val="0"/>
+        <w:widowControl w:val="1"/>
+      </w:pPr>
+      <w:r>
+        <w:t xml:space="preserve">The technical obstacles to synthetic clinical communication are, at root, obstacles of fidelity. The most</w:t>
+      </w:r>
+      <w:r>
+        <w:t xml:space="preserve"> </w:t>
+      </w:r>
+      <w:r>
+        <w:t xml:space="preserve">consequential is clinical hallucination</w:t>
+      </w:r>
+      <w:r>
+        <w:rPr>
+          <w:vertAlign w:val="superscript"/>
+        </w:rPr>
+        <w:t xml:space="preserve">[82]</w:t>
+      </w:r>
+      <w:r>
+        <w:t xml:space="preserve">: a generator can produce fluent text that is medically wrong,</w:t>
+      </w:r>
+      <w:r>
+        <w:t xml:space="preserve"> </w:t>
+      </w:r>
+      <w:r>
+        <w:t xml:space="preserve">inventing a contraindication, an implausible vital sign, or a treatment that does not follow from the case.</w:t>
+      </w:r>
+      <w:r>
+        <w:t xml:space="preserve"> </w:t>
+      </w:r>
+      <w:r>
+        <w:t xml:space="preserve">Because such errors are locally coherent, they slip past surface fluency checks and can silently corrupt</w:t>
+      </w:r>
+      <w:r>
+        <w:t xml:space="preserve"> </w:t>
+      </w:r>
+      <w:r>
+        <w:t xml:space="preserve">the very labels a downstream model learns from, which makes factual control, through grounding, constrained</w:t>
+      </w:r>
+      <w:r>
+        <w:t xml:space="preserve"> </w:t>
+      </w:r>
+      <w:r>
+        <w:t xml:space="preserve">decoding, synthetic edit feedback</w:t>
+      </w:r>
+      <w:r>
+        <w:rPr>
+          <w:vertAlign w:val="superscript"/>
+        </w:rPr>
+        <w:t xml:space="preserve">[76]</w:t>
+      </w:r>
+      <w:r>
+        <w:t xml:space="preserve">, and post-hoc verification, the central design problem rather than an afterthought. A second</w:t>
+      </w:r>
+      <w:r>
+        <w:t xml:space="preserve"> </w:t>
+      </w:r>
+      <w:r>
+        <w:t xml:space="preserve">difficulty is the long tail: the rare conditions and dangerous edge cases that make synthetic data</w:t>
+      </w:r>
+      <w:r>
+        <w:t xml:space="preserve"> </w:t>
+      </w:r>
+      <w:r>
+        <w:t xml:space="preserve">attractive are also the hardest to render faithfully, because the generator has seen fewest examples of</w:t>
+      </w:r>
+      <w:r>
+        <w:t xml:space="preserve"> </w:t>
+      </w:r>
+      <w:r>
+        <w:t xml:space="preserve">them and is most prone to stereotype or omission. Third, even when individual messages are realistic, their</w:t>
+      </w:r>
+      <w:r>
+        <w:t xml:space="preserve"> </w:t>
+      </w:r>
+      <w:r>
+        <w:t xml:space="preserve">aggregate may exhibit distribution shift relative to genuine communication, with different lexical</w:t>
+      </w:r>
+      <w:r>
+        <w:t xml:space="preserve"> </w:t>
+      </w:r>
+      <w:r>
+        <w:t xml:space="preserve">statistics, error patterns, or class balance, so that a model trained on synthetic data can transfer</w:t>
+      </w:r>
+      <w:r>
+        <w:t xml:space="preserve"> </w:t>
+      </w:r>
+      <w:r>
+        <w:t xml:space="preserve">imperfectly to real text, a gap that train-on-synthetic, test-on-real evaluation is designed to surface. Longitudinal consistency compounds the</w:t>
+      </w:r>
+      <w:r>
+        <w:t xml:space="preserve"> </w:t>
+      </w:r>
+      <w:r>
+        <w:t xml:space="preserve">problem, since a patient's story must remain coherent across a conversation, a handoff, and a discharge,</w:t>
+      </w:r>
+      <w:r>
+        <w:t xml:space="preserve"> </w:t>
+      </w:r>
+      <w:r>
+        <w:t xml:space="preserve">yet independently sampled turns readily contradict one another. Beneath all of these lies a measurement</w:t>
+      </w:r>
+      <w:r>
+        <w:t xml:space="preserve"> </w:t>
+      </w:r>
+      <w:r>
+        <w:t xml:space="preserve">gap: evaluation metrics that reliably predict downstream utility are absent, and current fidelity and</w:t>
+      </w:r>
+      <w:r>
+        <w:t xml:space="preserve"> </w:t>
+      </w:r>
+      <w:r>
+        <w:t xml:space="preserve">diversity measures are still maturing</w:t>
+      </w:r>
+      <w:r>
+        <w:rPr>
+          <w:vertAlign w:val="superscript"/>
+        </w:rPr>
+        <w:t xml:space="preserve">[80,81]</w:t>
+      </w:r>
+      <w:r>
+        <w:t xml:space="preserve">. This is why the</w:t>
+      </w:r>
+      <w:r>
+        <w:t xml:space="preserve"> </w:t>
+      </w:r>
+      <w:r>
+        <w:t xml:space="preserve">train-on-synthetic, test-on-real protocol, still uncommon in the studies surveyed here, remains the field's</w:t>
+      </w:r>
+      <w:r>
+        <w:t xml:space="preserve"> </w:t>
+      </w:r>
+      <w:r>
+        <w:t xml:space="preserve">most trustworthy yardstick.</w:t>
+      </w:r>
+    </w:p>
+    <w:bookmarkEnd w:id="55"/>
+    <w:bookmarkStart w:id="56" w:name="practical-and-ethical-caveats"/>
+    <w:p>
+      <w:pPr>
+        <w:pStyle w:val="Heading3"/>
+        <w:keepNext/>
+        <w:keepLines/>
+        <w:widowControl w:val="1"/>
+      </w:pPr>
+      <w:r>
+        <w:t xml:space="preserve">4.2  Practical and Ethical Caveats</w:t>
+      </w:r>
+    </w:p>
+    <w:p>
+      <w:pPr>
+        <w:pStyle w:val="FirstParagraph"/>
+        <w:jc w:val="both"/>
+        <w:keepNext w:val="0"/>
+        <w:keepLines w:val="0"/>
+        <w:widowControl w:val="1"/>
+      </w:pPr>
+      <w:r>
+        <w:t xml:space="preserve">Beyond the technical lie institutional and ethical considerations. Regulatory frameworks are still emerging: it is not</w:t>
+      </w:r>
+      <w:r>
+        <w:t xml:space="preserve"> </w:t>
+      </w:r>
+      <w:r>
+        <w:t xml:space="preserve">yet settled what validation a synthetic corpus must pass before a model trained on it may be used in care,</w:t>
+      </w:r>
+      <w:r>
+        <w:t xml:space="preserve"> </w:t>
+      </w:r>
+      <w:r>
+        <w:t xml:space="preserve">nor which bodies should certify that validation. No current medical-device framework treats a synthetic</w:t>
+      </w:r>
+      <w:r>
+        <w:t xml:space="preserve"> </w:t>
+      </w:r>
+      <w:r>
+        <w:t xml:space="preserve">training corpus as a distinct regulated object, which leaves provenance records and disclosure of synthetic</w:t>
+      </w:r>
+      <w:r>
+        <w:t xml:space="preserve"> </w:t>
+      </w:r>
+      <w:r>
+        <w:t xml:space="preserve">origin as the practical interim controls. The ethics cut in two directions. Synthetic data is often</w:t>
+      </w:r>
+      <w:r>
+        <w:t xml:space="preserve"> </w:t>
+      </w:r>
+      <w:r>
+        <w:t xml:space="preserve">justified on privacy grounds, yet the assumption that it is automatically safe is unfounded, because</w:t>
+      </w:r>
+      <w:r>
+        <w:t xml:space="preserve"> </w:t>
+      </w:r>
+      <w:r>
+        <w:t xml:space="preserve">synthetic notes that match real utility can inherit real privacy risk</w:t>
+      </w:r>
+      <w:r>
+        <w:rPr>
+          <w:vertAlign w:val="superscript"/>
+        </w:rPr>
+        <w:t xml:space="preserve">[31]</w:t>
+      </w:r>
+      <w:r>
+        <w:t xml:space="preserve">, a risk that</w:t>
+      </w:r>
+      <w:r>
+        <w:t xml:space="preserve"> </w:t>
+      </w:r>
+      <w:r>
+        <w:t xml:space="preserve">membership-inference audits now make measurable</w:t>
+      </w:r>
+      <w:r>
+        <w:rPr>
+          <w:vertAlign w:val="superscript"/>
+        </w:rPr>
+        <w:t xml:space="preserve">[77]</w:t>
+      </w:r>
+      <w:r>
+        <w:t xml:space="preserve"> </w:t>
+      </w:r>
+      <w:r>
+        <w:t xml:space="preserve">and that differentially private</w:t>
+      </w:r>
+      <w:r>
+        <w:t xml:space="preserve"> </w:t>
+      </w:r>
+      <w:r>
+        <w:t xml:space="preserve">generators are still being adapted to specialist clinical text</w:t>
+      </w:r>
+      <w:r>
+        <w:rPr>
+          <w:vertAlign w:val="superscript"/>
+        </w:rPr>
+        <w:t xml:space="preserve">[78]</w:t>
+      </w:r>
+      <w:r>
+        <w:t xml:space="preserve">; and there</w:t>
+      </w:r>
+      <w:r>
+        <w:t xml:space="preserve"> </w:t>
+      </w:r>
+      <w:r>
+        <w:t xml:space="preserve">is a disclosure obligation, since text that reads as a genuine patient encounter should be labeled as</w:t>
+      </w:r>
+      <w:r>
+        <w:t xml:space="preserve"> </w:t>
+      </w:r>
+      <w:r>
+        <w:t xml:space="preserve">synthetic wherever it circulates. Sharing and licensing remain unsettled, particularly when a generator was</w:t>
+      </w:r>
+      <w:r>
+        <w:t xml:space="preserve"> </w:t>
+      </w:r>
+      <w:r>
+        <w:t xml:space="preserve">conditioned on restricted real data, which can quietly propagate governance constraints into ostensibly</w:t>
+      </w:r>
+      <w:r>
+        <w:t xml:space="preserve"> </w:t>
+      </w:r>
+      <w:r>
+        <w:t xml:space="preserve">open outputs. Finally, reproducibility depends on the exact generator, prompt, sampling</w:t>
+      </w:r>
+      <w:r>
+        <w:t xml:space="preserve"> </w:t>
+      </w:r>
+      <w:r>
+        <w:t xml:space="preserve">temperature, and filtering pipeline; reporting these in full is what makes studies directly comparable. In</w:t>
+      </w:r>
+      <w:r>
+        <w:t xml:space="preserve"> </w:t>
+      </w:r>
+      <w:r>
+        <w:t xml:space="preserve">the studies reported here no identifiable patient data was used: generators were seeded either from public</w:t>
+      </w:r>
+      <w:r>
+        <w:t xml:space="preserve"> </w:t>
+      </w:r>
+      <w:r>
+        <w:t xml:space="preserve">datasets or de-identified records, and the resulting communication describes no real individual, which is the</w:t>
+      </w:r>
+      <w:r>
+        <w:t xml:space="preserve"> </w:t>
+      </w:r>
+      <w:r>
+        <w:t xml:space="preserve">concrete form the privacy argument takes across this survey.</w:t>
+      </w:r>
+    </w:p>
+    <w:bookmarkEnd w:id="56"/>
+    <w:bookmarkStart w:id="57" w:name="boundaries-of-the-method"/>
+    <w:p>
+      <w:pPr>
+        <w:pStyle w:val="Heading3"/>
+        <w:keepNext/>
+        <w:keepLines/>
+        <w:widowControl w:val="1"/>
+      </w:pPr>
+      <w:r>
+        <w:t xml:space="preserve">4.3  Boundaries of the Method</w:t>
+      </w:r>
+    </w:p>
+    <w:p>
+      <w:pPr>
+        <w:pStyle w:val="FirstParagraph"/>
+        <w:jc w:val="both"/>
+        <w:keepNext w:val="0"/>
+        <w:keepLines w:val="0"/>
+        <w:widowControl w:val="1"/>
+      </w:pPr>
+      <w:r>
+        <w:t xml:space="preserve">Some limitations are boundaries of the method rather than defects to be engineered away. Synthetic</w:t>
+      </w:r>
+      <w:r>
+        <w:t xml:space="preserve"> </w:t>
+      </w:r>
+      <w:r>
+        <w:t xml:space="preserve">communication reflects the knowledge, and the blind spots, of the model that produces it: it faithfully</w:t>
+      </w:r>
+      <w:r>
+        <w:t xml:space="preserve"> </w:t>
+      </w:r>
+      <w:r>
+        <w:t xml:space="preserve">reproduces the distributions the generator has learned, while genuinely novel presentations, idiosyncratic</w:t>
+      </w:r>
+      <w:r>
+        <w:t xml:space="preserve"> </w:t>
+      </w:r>
+      <w:r>
+        <w:t xml:space="preserve">phrasing, and culturally specific idiom, often the hardest cases for clinical NLP, still call for authentic</w:t>
+      </w:r>
+      <w:r>
+        <w:t xml:space="preserve"> </w:t>
+      </w:r>
+      <w:r>
+        <w:t xml:space="preserve">data. Validation carries the same qualification, since a model assessed only on synthetic communication has</w:t>
+      </w:r>
+      <w:r>
+        <w:t xml:space="preserve"> </w:t>
+      </w:r>
+      <w:r>
+        <w:t xml:space="preserve">been measured against a world its own family generated; authentic-data evaluation therefore remains the</w:t>
+      </w:r>
+      <w:r>
+        <w:t xml:space="preserve"> </w:t>
+      </w:r>
+      <w:r>
+        <w:t xml:space="preserve">decisive test. Synthetic data is best understood as a scaffold: indispensable for building and</w:t>
+      </w:r>
+      <w:r>
+        <w:t xml:space="preserve"> </w:t>
+      </w:r>
+      <w:r>
+        <w:t xml:space="preserve">stress-testing systems, and complemented by the real communication and real patients that ultimately</w:t>
+      </w:r>
+      <w:r>
+        <w:t xml:space="preserve"> </w:t>
+      </w:r>
+      <w:r>
+        <w:t xml:space="preserve">establish readiness for care.</w:t>
+      </w:r>
+    </w:p>
+    <w:bookmarkEnd w:id="57"/>
+    <w:bookmarkStart w:id="58" w:name="scope-of-this-review"/>
+    <w:p>
+      <w:pPr>
+        <w:pStyle w:val="Heading3"/>
+        <w:keepNext/>
+        <w:keepLines/>
+        <w:widowControl w:val="1"/>
+      </w:pPr>
+      <w:r>
+        <w:t xml:space="preserve">4.4  Scope of This Review</w:t>
+      </w:r>
+    </w:p>
+    <w:p>
+      <w:pPr>
+        <w:pStyle w:val="FirstParagraph"/>
+        <w:jc w:val="both"/>
+        <w:keepNext w:val="0"/>
+        <w:keepLines w:val="0"/>
+        <w:widowControl w:val="1"/>
+      </w:pPr>
+      <w:r>
+        <w:t xml:space="preserve">This review has its own boundaries. It follows a narrative, scoping-style approach: relevant work was</w:t>
+      </w:r>
+      <w:r>
+        <w:t xml:space="preserve"> </w:t>
+      </w:r>
+      <w:r>
+        <w:t xml:space="preserve">identified through iterative database and citation-chaining search and organized by clinical-communication</w:t>
+      </w:r>
+      <w:r>
+        <w:t xml:space="preserve"> </w:t>
+      </w:r>
+      <w:r>
+        <w:t xml:space="preserve">channel, rather than through a preregistered systematic protocol with exhaustive, reproducible coverage, and</w:t>
+      </w:r>
+      <w:r>
+        <w:t xml:space="preserve"> </w:t>
+      </w:r>
+      <w:r>
+        <w:t xml:space="preserve">fast-moving preprint work will continue to appear after writing. The application studies are drawn from a single graduate program and are</w:t>
+      </w:r>
+      <w:r>
+        <w:t xml:space="preserve"> </w:t>
+      </w:r>
+      <w:r>
+        <w:t xml:space="preserve">weighted toward English, so they demonstrate feasibility across channels rather than a</w:t>
+      </w:r>
+      <w:r>
+        <w:t xml:space="preserve"> </w:t>
+      </w:r>
+      <w:r>
+        <w:t xml:space="preserve">representative sample of methods or languages. The channel taxonomy is a deliberate organizing choice; other</w:t>
+      </w:r>
+      <w:r>
+        <w:t xml:space="preserve"> </w:t>
+      </w:r>
+      <w:r>
+        <w:t xml:space="preserve">cuts, by generation method, by clinical specialty, or by data governance regime, would group the same work</w:t>
+      </w:r>
+      <w:r>
+        <w:t xml:space="preserve"> </w:t>
+      </w:r>
+      <w:r>
+        <w:t xml:space="preserve">differently and are complementary to the one taken here.</w:t>
+      </w:r>
+    </w:p>
+    <w:bookmarkEnd w:id="58"/>
+    <w:bookmarkEnd w:id="59"/>
+    <w:bookmarkStart w:id="60" w:name="s9b"/>
+    <w:p>
+      <w:pPr>
+        <w:pStyle w:val="Heading2"/>
+        <w:keepNext/>
+        <w:keepLines/>
+        <w:widowControl w:val="1"/>
+      </w:pPr>
+      <w:r>
+        <w:t xml:space="preserve">5  Research Frontiers and Open Problems</w:t>
+      </w:r>
+    </w:p>
+    <w:p>
+      <w:pPr>
+        <w:pStyle w:val="FirstParagraph"/>
+        <w:jc w:val="both"/>
+        <w:keepNext w:val="0"/>
+        <w:keepLines w:val="0"/>
+        <w:widowControl w:val="1"/>
+      </w:pPr>
+      <w:r>
+        <w:t xml:space="preserve">The clearest opportunities cluster into a few themes. The first is</w:t>
+      </w:r>
+      <w:r>
+        <w:t xml:space="preserve"> </w:t>
+      </w:r>
+      <w:r>
+        <w:rPr>
+          <w:b/>
+          <w:bCs/>
+        </w:rPr>
+        <w:t xml:space="preserve">interactive simulation</w:t>
+      </w:r>
+      <w:r>
+        <w:t xml:space="preserve">. Moving</w:t>
+      </w:r>
+      <w:r>
+        <w:t xml:space="preserve"> </w:t>
+      </w:r>
+      <w:r>
+        <w:t xml:space="preserve">from static corpora toward multi-agent simulation, in which patient and clinician agents generate</w:t>
+      </w:r>
+      <w:r>
+        <w:t xml:space="preserve"> </w:t>
+      </w:r>
+      <w:r>
+        <w:t xml:space="preserve">consultations on demand and double as graded evaluation environments, fits the sequential, goal-directed</w:t>
+      </w:r>
+      <w:r>
+        <w:t xml:space="preserve"> </w:t>
+      </w:r>
+      <w:r>
+        <w:t xml:space="preserve">nature of clinical talk. Coevolving standardized-patient agents</w:t>
+      </w:r>
+      <w:r>
+        <w:rPr>
+          <w:vertAlign w:val="superscript"/>
+        </w:rPr>
+        <w:t xml:space="preserve">[60]</w:t>
+      </w:r>
+      <w:r>
+        <w:t xml:space="preserve">, safety-focused</w:t>
+      </w:r>
+      <w:r>
+        <w:t xml:space="preserve"> </w:t>
+      </w:r>
+      <w:r>
+        <w:t xml:space="preserve">simulation-and-evaluation frameworks</w:t>
+      </w:r>
+      <w:r>
+        <w:rPr>
+          <w:vertAlign w:val="superscript"/>
+        </w:rPr>
+        <w:t xml:space="preserve">[98]</w:t>
+      </w:r>
+      <w:r>
+        <w:t xml:space="preserve">, and multimodal clinical-agent</w:t>
+      </w:r>
+      <w:r>
+        <w:t xml:space="preserve"> </w:t>
+      </w:r>
+      <w:r>
+        <w:t xml:space="preserve">benchmarks</w:t>
+      </w:r>
+      <w:r>
+        <w:rPr>
+          <w:vertAlign w:val="superscript"/>
+        </w:rPr>
+        <w:t xml:space="preserve">[99]</w:t>
+      </w:r>
+      <w:r>
+        <w:t xml:space="preserve"> </w:t>
+      </w:r>
+      <w:r>
+        <w:t xml:space="preserve">point toward environments that fold generation and evaluation into</w:t>
+      </w:r>
+      <w:r>
+        <w:t xml:space="preserve"> </w:t>
+      </w:r>
+      <w:r>
+        <w:t xml:space="preserve">one renewable loop, extending toward personalized synthetic patients</w:t>
+      </w:r>
+      <w:r>
+        <w:rPr>
+          <w:vertAlign w:val="superscript"/>
+        </w:rPr>
+        <w:t xml:space="preserve">[10,54,55,56]</w:t>
+      </w:r>
+      <w:r>
+        <w:t xml:space="preserve">.</w:t>
+      </w:r>
+    </w:p>
+    <w:p>
+      <w:pPr>
+        <w:pStyle w:val="BodyText"/>
+        <w:jc w:val="both"/>
+        <w:keepNext w:val="0"/>
+        <w:keepLines w:val="0"/>
+        <w:widowControl w:val="1"/>
+      </w:pPr>
+      <w:r>
+        <w:t xml:space="preserve">A second theme is</w:t>
+      </w:r>
+      <w:r>
+        <w:t xml:space="preserve"> </w:t>
+      </w:r>
+      <w:r>
+        <w:rPr>
+          <w:b/>
+          <w:bCs/>
+        </w:rPr>
+        <w:t xml:space="preserve">spoken and multi-party communication</w:t>
+      </w:r>
+      <w:r>
+        <w:t xml:space="preserve">. The EMS, dispatch, and verbal-handoff</w:t>
+      </w:r>
+      <w:r>
+        <w:t xml:space="preserve"> </w:t>
+      </w:r>
+      <w:r>
+        <w:t xml:space="preserve">channels are spoken first and rich in protected information, yet text-only synthesis discards the</w:t>
+      </w:r>
+      <w:r>
+        <w:t xml:space="preserve"> </w:t>
+      </w:r>
+      <w:r>
+        <w:t xml:space="preserve">acoustic-error distribution that dominates real deployment. Joint synthetic pipelines that pair generated</w:t>
+      </w:r>
+      <w:r>
+        <w:t xml:space="preserve"> </w:t>
+      </w:r>
+      <w:r>
+        <w:t xml:space="preserve">audio with transcripts and inject realistic recognition noise are a clear open space that would let</w:t>
+      </w:r>
+      <w:r>
+        <w:t xml:space="preserve"> </w:t>
+      </w:r>
+      <w:r>
+        <w:t xml:space="preserve">transcription-robust clinical NLP be trained without recording real calls.</w:t>
+      </w:r>
+    </w:p>
+    <w:p>
+      <w:pPr>
+        <w:pStyle w:val="BodyText"/>
+        <w:jc w:val="both"/>
+        <w:keepNext w:val="0"/>
+        <w:keepLines w:val="0"/>
+        <w:widowControl w:val="1"/>
+      </w:pPr>
+      <w:r>
+        <w:t xml:space="preserve">A third is</w:t>
+      </w:r>
+      <w:r>
+        <w:t xml:space="preserve"> </w:t>
+      </w:r>
+      <w:r>
+        <w:rPr>
+          <w:b/>
+          <w:bCs/>
+        </w:rPr>
+        <w:t xml:space="preserve">privacy, fidelity, and utility, co-measured</w:t>
+      </w:r>
+      <w:r>
+        <w:t xml:space="preserve">. Membership-inference and canary auditing</w:t>
+      </w:r>
+      <w:r>
+        <w:t xml:space="preserve"> </w:t>
+      </w:r>
+      <w:r>
+        <w:t xml:space="preserve">now quantify leakage on the exact synthetic text behind a utility claim</w:t>
+      </w:r>
+      <w:r>
+        <w:rPr>
+          <w:vertAlign w:val="superscript"/>
+        </w:rPr>
+        <w:t xml:space="preserve">[77]</w:t>
+      </w:r>
+      <w:r>
+        <w:t xml:space="preserve">, fidelity</w:t>
+      </w:r>
+      <w:r>
+        <w:t xml:space="preserve"> </w:t>
+      </w:r>
+      <w:r>
+        <w:t xml:space="preserve">and diversity metrics are under active and critical revision</w:t>
+      </w:r>
+      <w:r>
+        <w:rPr>
+          <w:vertAlign w:val="superscript"/>
+        </w:rPr>
+        <w:t xml:space="preserve">[80,81]</w:t>
+      </w:r>
+      <w:r>
+        <w:t xml:space="preserve">, and</w:t>
+      </w:r>
+      <w:r>
+        <w:t xml:space="preserve"> </w:t>
+      </w:r>
+      <w:r>
+        <w:t xml:space="preserve">differentially private generators still contend with specialist clinical distributions</w:t>
+      </w:r>
+      <w:r>
+        <w:rPr>
+          <w:vertAlign w:val="superscript"/>
+        </w:rPr>
+        <w:t xml:space="preserve">[78]</w:t>
+      </w:r>
+      <w:r>
+        <w:t xml:space="preserve">.</w:t>
+      </w:r>
+      <w:r>
+        <w:t xml:space="preserve"> </w:t>
+      </w:r>
+      <w:r>
+        <w:t xml:space="preserve">The open problem is to co-optimize and co-report privacy, clinical faithfulness, and downstream utility in a</w:t>
+      </w:r>
+      <w:r>
+        <w:t xml:space="preserve"> </w:t>
+      </w:r>
+      <w:r>
+        <w:t xml:space="preserve">single pass on one generator, rather than in separate studies.</w:t>
+      </w:r>
+    </w:p>
+    <w:p>
+      <w:pPr>
+        <w:pStyle w:val="BodyText"/>
+        <w:jc w:val="both"/>
+        <w:keepNext w:val="0"/>
+        <w:keepLines w:val="0"/>
+        <w:widowControl w:val="1"/>
+      </w:pPr>
+      <w:r>
+        <w:t xml:space="preserve">A fourth is</w:t>
+      </w:r>
+      <w:r>
+        <w:t xml:space="preserve"> </w:t>
+      </w:r>
+      <w:r>
+        <w:rPr>
+          <w:b/>
+          <w:bCs/>
+        </w:rPr>
+        <w:t xml:space="preserve">controllable, causal, and continually current generation</w:t>
+      </w:r>
+      <w:r>
+        <w:t xml:space="preserve">. Explicit control over</w:t>
+      </w:r>
+      <w:r>
+        <w:t xml:space="preserve"> </w:t>
+      </w:r>
+      <w:r>
+        <w:t xml:space="preserve">uncertainty, omission, code-switching, and recognition noise, together with counterfactual variants of the</w:t>
+      </w:r>
+      <w:r>
+        <w:t xml:space="preserve"> </w:t>
+      </w:r>
+      <w:r>
+        <w:t xml:space="preserve">same encounter, would let downstream models be probed for what they actually rely on; surveys of</w:t>
+      </w:r>
+      <w:r>
+        <w:t xml:space="preserve"> </w:t>
+      </w:r>
+      <w:r>
+        <w:t xml:space="preserve">conversational data generation catalog the available levers</w:t>
+      </w:r>
+      <w:r>
+        <w:rPr>
+          <w:vertAlign w:val="superscript"/>
+        </w:rPr>
+        <w:t xml:space="preserve">[102]</w:t>
+      </w:r>
+      <w:r>
+        <w:t xml:space="preserve">. Continual,</w:t>
+      </w:r>
+      <w:r>
+        <w:t xml:space="preserve"> </w:t>
+      </w:r>
+      <w:r>
+        <w:t xml:space="preserve">self-refining generation could keep synthetic communication current as guidelines and language drift,</w:t>
+      </w:r>
+      <w:r>
+        <w:t xml:space="preserve"> </w:t>
+      </w:r>
+      <w:r>
+        <w:t xml:space="preserve">provided recursive self-training is guarded against model collapse</w:t>
+      </w:r>
+      <w:r>
+        <w:rPr>
+          <w:vertAlign w:val="superscript"/>
+        </w:rPr>
+        <w:t xml:space="preserve">[101]</w:t>
+      </w:r>
+      <w:r>
+        <w:t xml:space="preserve">.</w:t>
+      </w:r>
+    </w:p>
+    <w:p>
+      <w:pPr>
+        <w:pStyle w:val="BodyText"/>
+        <w:jc w:val="both"/>
+        <w:keepNext w:val="0"/>
+        <w:keepLines w:val="0"/>
+        <w:widowControl w:val="1"/>
+      </w:pPr>
+      <w:r>
+        <w:t xml:space="preserve">Underlying all of these are</w:t>
+      </w:r>
+      <w:r>
+        <w:t xml:space="preserve"> </w:t>
+      </w:r>
+      <w:r>
+        <w:rPr>
+          <w:b/>
+          <w:bCs/>
+        </w:rPr>
+        <w:t xml:space="preserve">foundations, benchmarks, and human oversight</w:t>
+      </w:r>
+      <w:r>
+        <w:t xml:space="preserve">. Whether synthetic clinical</w:t>
+      </w:r>
+      <w:r>
+        <w:t xml:space="preserve"> </w:t>
+      </w:r>
+      <w:r>
+        <w:t xml:space="preserve">dialogue obeys predictable scaling laws, and where returns plateau, is an open and decision-critical</w:t>
+      </w:r>
+      <w:r>
+        <w:t xml:space="preserve"> </w:t>
+      </w:r>
+      <w:r>
+        <w:t xml:space="preserve">question</w:t>
+      </w:r>
+      <w:r>
+        <w:rPr>
+          <w:vertAlign w:val="superscript"/>
+        </w:rPr>
+        <w:t xml:space="preserve">[100]</w:t>
+      </w:r>
+      <w:r>
+        <w:t xml:space="preserve">; shared, communication-specific fidelity benchmarks, including</w:t>
+      </w:r>
+      <w:r>
+        <w:t xml:space="preserve"> </w:t>
+      </w:r>
+      <w:r>
+        <w:t xml:space="preserve">rubric-scored and OSCE-style stations</w:t>
+      </w:r>
+      <w:r>
+        <w:rPr>
+          <w:vertAlign w:val="superscript"/>
+        </w:rPr>
+        <w:t xml:space="preserve">[104]</w:t>
+      </w:r>
+      <w:r>
+        <w:t xml:space="preserve">, would let scaling laws, privacy audits,</w:t>
+      </w:r>
+      <w:r>
+        <w:t xml:space="preserve"> </w:t>
+      </w:r>
+      <w:r>
+        <w:t xml:space="preserve">and agent evaluations be compared across groups. Removing generator fingerprints so that models learn</w:t>
+      </w:r>
+      <w:r>
+        <w:t xml:space="preserve"> </w:t>
+      </w:r>
+      <w:r>
+        <w:t xml:space="preserve">clinical content rather than stylistic tics</w:t>
+      </w:r>
+      <w:r>
+        <w:rPr>
+          <w:vertAlign w:val="superscript"/>
+        </w:rPr>
+        <w:t xml:space="preserve">[103]</w:t>
+      </w:r>
+      <w:r>
+        <w:t xml:space="preserve">, preference optimization toward</w:t>
+      </w:r>
+      <w:r>
+        <w:t xml:space="preserve"> </w:t>
+      </w:r>
+      <w:r>
+        <w:t xml:space="preserve">clinician-judged realism, and automated safety auditing that treats omission as seriously as</w:t>
+      </w:r>
+      <w:r>
+        <w:t xml:space="preserve"> </w:t>
+      </w:r>
+      <w:r>
+        <w:t xml:space="preserve">fabrication</w:t>
+      </w:r>
+      <w:r>
+        <w:rPr>
+          <w:vertAlign w:val="superscript"/>
+        </w:rPr>
+        <w:t xml:space="preserve">[82]</w:t>
+      </w:r>
+      <w:r>
+        <w:t xml:space="preserve"> </w:t>
+      </w:r>
+      <w:r>
+        <w:t xml:space="preserve">complete an agenda in which clinician oversight remains central.</w:t>
+      </w:r>
+    </w:p>
+    <w:bookmarkEnd w:id="60"/>
+    <w:bookmarkStart w:id="61" w:name="s9"/>
+    <w:p>
+      <w:pPr>
+        <w:pStyle w:val="Heading2"/>
+        <w:keepNext/>
+        <w:keepLines/>
+        <w:widowControl w:val="1"/>
+      </w:pPr>
+      <w:r>
+        <w:t xml:space="preserve">6  Conclusions</w:t>
+      </w:r>
+    </w:p>
+    <w:p>
+      <w:pPr>
+        <w:pStyle w:val="FirstParagraph"/>
+        <w:jc w:val="both"/>
+        <w:keepNext w:val="0"/>
+        <w:keepLines w:val="0"/>
+        <w:widowControl w:val="1"/>
+      </w:pPr>
+      <w:r>
+        <w:t xml:space="preserve">LLM-generated synthetic clinical communication has matured from a privacy-preserving stand-in</w:t>
+      </w:r>
+      <w:r>
+        <w:t xml:space="preserve"> </w:t>
+      </w:r>
+      <w:r>
+        <w:t xml:space="preserve">for real records into a versatile resource for building, evaluating, and benchmarking clinical NLP systems.</w:t>
+      </w:r>
+      <w:r>
+        <w:t xml:space="preserve"> </w:t>
+      </w:r>
+      <w:r>
+        <w:t xml:space="preserve">This survey organized the field around the communication channel, from patient–clinician</w:t>
+      </w:r>
+      <w:r>
+        <w:t xml:space="preserve"> </w:t>
+      </w:r>
+      <w:r>
+        <w:t xml:space="preserve">conversations and doctor-to-patient instructions to telemedicine and portal messaging and the under-served</w:t>
+      </w:r>
+      <w:r>
+        <w:t xml:space="preserve"> </w:t>
+      </w:r>
+      <w:r>
+        <w:t xml:space="preserve">paramedic, dispatch, and handoff channels, and around the downstream tasks each supports, grounding that</w:t>
+      </w:r>
+      <w:r>
+        <w:t xml:space="preserve"> </w:t>
+      </w:r>
+      <w:r>
+        <w:t xml:space="preserve">organization in ten application studies that generate synthetic communication and train models on it.</w:t>
+      </w:r>
+    </w:p>
+    <w:p>
+      <w:pPr>
+        <w:pStyle w:val="BodyText"/>
+        <w:jc w:val="both"/>
+        <w:keepNext w:val="0"/>
+        <w:keepLines w:val="0"/>
+        <w:widowControl w:val="1"/>
+      </w:pPr>
+      <w:r>
+        <w:t xml:space="preserve">Read together, those studies surface a small set of reusable design patterns (Table 18) that recur</w:t>
+      </w:r>
+      <w:r>
+        <w:t xml:space="preserve"> </w:t>
+      </w:r>
+      <w:r>
+        <w:t xml:space="preserve">across channels and tasks rather than one-off results, and that answer RQ7 directly.</w:t>
+      </w:r>
+    </w:p>
+    <w:p>
+      <w:pPr>
+        <w:pStyle w:val="TableCaption"/>
+        <w:spacing w:before="280" w:after="60" w:line="240" w:lineRule="auto"/>
+        <w:jc w:val="center"/>
+        <w:keepNext/>
+        <w:keepLines/>
+        <w:widowControl w:val="1"/>
+      </w:pPr>
+      <w:r>
+        <w:rPr>
+          <w:b/>
+          <w:i/>
+        </w:rPr>
+        <w:t>Table 18.</w:t>
+      </w:r>
+      <w:r>
+        <w:rPr>
+          <w:b w:val="0"/>
+          <w:i/>
+        </w:rPr>
+        <w:t xml:space="preserve"> </w:t>
+      </w:r>
+      <w:r>
+        <w:rPr>
+          <w:b w:val="0"/>
+          <w:i/>
+        </w:rPr>
+        <w:t>Reusable design patterns recurring across the ten application studies (RQ7).</w:t>
+      </w:r>
+    </w:p>
+    <w:tbl>
+      <w:tblPr>
+        <w:tblStyle w:val="Table"/>
+        <w:tblW w:type="pct" w:w="5000"/>
+        <w:jc w:val="center"/>
+        <w:tblLook w:firstRow="1" w:lastRow="0" w:firstColumn="0" w:lastColumn="0" w:noHBand="0" w:noVBand="0" w:val="0020"/>
+        <w:tblCaption w:val="Table 18. Reusable design patterns recurring across the ten application studies (RQ7)."/>
         <w:tblLayout w:type="autofit"/>
         <w:tblBorders>
           <w:top w:val="single" w:sz="10" w:color="4F6272"/>
@@ -19386,7 +21241,7 @@
         <w:widowControl w:val="1"/>
       </w:pPr>
       <w:r>
-        <w:t xml:space="preserve">Set against these patterns are recurring failure modes (Table 18) that the studies and the wider</w:t>
+        <w:t xml:space="preserve">Set against these patterns are recurring failure modes (Table 19) that the studies and the wider</w:t>
       </w:r>
       <w:r>
         <w:t xml:space="preserve"> </w:t>
@@ -19415,7 +21270,7 @@
           <w:b/>
           <w:i/>
         </w:rPr>
-        <w:t>Table 18.</w:t>
+        <w:t>Table 19.</w:t>
       </w:r>
       <w:r>
         <w:rPr>
@@ -19438,7 +21293,7 @@
         <w:tblW w:type="pct" w:w="5000"/>
         <w:jc w:val="center"/>
         <w:tblLook w:firstRow="1" w:lastRow="0" w:firstColumn="0" w:lastColumn="0" w:noHBand="0" w:noVBand="0" w:val="0020"/>
-        <w:tblCaption w:val="Table 18. Recurring failure modes when reusing synthetic clinical communication, and where each is guarded."/>
+        <w:tblCaption w:val="Table 19. Recurring failure modes when reusing synthetic clinical communication, and where each is guarded."/>
         <w:tblLayout w:type="autofit"/>
         <w:tblBorders>
           <w:top w:val="single" w:sz="10" w:color="4F6272"/>
@@ -20189,8 +22044,8 @@
         </w:pict>
       </w:r>
     </w:p>
-    <w:bookmarkEnd w:id="60"/>
-    <w:bookmarkStart w:id="62" w:name="data"/>
+    <w:bookmarkEnd w:id="61"/>
+    <w:bookmarkStart w:id="63" w:name="data"/>
     <w:p>
       <w:pPr>
         <w:pStyle w:val="Heading2"/>
@@ -20240,7 +22095,7 @@
       <w:r>
         <w:t xml:space="preserve">archived at Zenodo (</w:t>
       </w:r>
-      <w:hyperlink r:id="rId61">
+      <w:hyperlink r:id="rId62">
         <w:r>
           <w:rPr>
             <w:rStyle w:val="Hyperlink"/>
@@ -20277,8 +22132,8 @@
         </w:pict>
       </w:r>
     </w:p>
-    <w:bookmarkEnd w:id="62"/>
-    <w:bookmarkStart w:id="63" w:name="ack"/>
+    <w:bookmarkEnd w:id="63"/>
+    <w:bookmarkStart w:id="64" w:name="ack"/>
     <w:p>
       <w:pPr>
         <w:pStyle w:val="Heading2"/>
@@ -20333,8 +22188,8 @@
         </w:pict>
       </w:r>
     </w:p>
-    <w:bookmarkEnd w:id="63"/>
-    <w:bookmarkStart w:id="68" w:name="references"/>
+    <w:bookmarkEnd w:id="64"/>
+    <w:bookmarkStart w:id="69" w:name="references"/>
     <w:p>
       <w:pPr>
         <w:pStyle w:val="ReferencesHeading"/>
@@ -20655,7 +22510,7 @@
       <w:r>
         <w:t xml:space="preserve"> </w:t>
       </w:r>
-      <w:hyperlink r:id="rId64">
+      <w:hyperlink r:id="rId65">
         <w:r>
           <w:rPr>
             <w:rStyle w:val="Hyperlink"/>
@@ -23276,7 +25131,7 @@
       <w:r>
         <w:t xml:space="preserve"> </w:t>
       </w:r>
-      <w:hyperlink r:id="rId65">
+      <w:hyperlink r:id="rId66">
         <w:r>
           <w:rPr>
             <w:rStyle w:val="Hyperlink"/>
@@ -23308,7 +25163,7 @@
       <w:r>
         <w:t xml:space="preserve"> </w:t>
       </w:r>
-      <w:hyperlink r:id="rId66">
+      <w:hyperlink r:id="rId67">
         <w:r>
           <w:rPr>
             <w:rStyle w:val="Hyperlink"/>
@@ -23955,7 +25810,7 @@
       <w:r>
         <w:t xml:space="preserve"> </w:t>
       </w:r>
-      <w:hyperlink r:id="rId67">
+      <w:hyperlink r:id="rId68">
         <w:r>
           <w:rPr>
             <w:rStyle w:val="Hyperlink"/>
@@ -24100,8 +25955,8 @@
         <w:t xml:space="preserve">, 2025.</w:t>
       </w:r>
     </w:p>
-    <w:bookmarkEnd w:id="68"/>
     <w:bookmarkEnd w:id="69"/>
+    <w:bookmarkEnd w:id="70"/>
     <w:sectPr>
       <w:footerReference w:type="default" r:id="rId10"/>
       <w:pgSz w:h="15840" w:w="12240"/>

</xml_diff>

<commit_message>
Add seed-stability reproduction (A+C): REPRODUCE_SEED override + machine-readable results in 9 reproduce.py; 5-seed sweep results + stability table in REPRODUCE.md; one reproducibility sentence in paper Data&Code (tables left intact); rebuild all artifacts
Co-Authored-By: Claude Opus 4.8 <noreply@anthropic.com>
</commit_message>
<xml_diff>
--- a/paper-1col.docx
+++ b/paper-1col.docx
@@ -22110,7 +22110,22 @@
         <w:t xml:space="preserve"> </w:t>
       </w:r>
       <w:r>
-        <w:t xml:space="preserve">its motivation, data-generation protocol, data files, models, and results. The regenerated result figures are distributed with the paper's source. Where a study</w:t>
+        <w:t xml:space="preserve">its motivation, data-generation protocol, data files, models, and results. The regenerated result figures are distributed with the paper's source. Each study's reproducible pipeline can be re-run across random seeds through a</w:t>
+      </w:r>
+      <w:r>
+        <w:t xml:space="preserve"> </w:t>
+      </w:r>
+      <w:r>
+        <w:rPr>
+          <w:rStyle w:val="VerbatimChar"/>
+        </w:rPr>
+        <w:t xml:space="preserve">REPRODUCE_SEED</w:t>
+      </w:r>
+      <w:r>
+        <w:t xml:space="preserve"> </w:t>
+      </w:r>
+      <w:r>
+        <w:t xml:space="preserve">control, and a five-seed sweep confirms the reproduced metrics are stable to seed, with standard deviations typically below 0.05; the per-seed results ship with the code. Where a study</w:t>
       </w:r>
       <w:r>
         <w:t xml:space="preserve"> </w:t>

</xml_diff>

<commit_message>
Report reproduced mean+/-SD (5-seed) in the four faithfully-reproducing table rows: Table 8 Naive Bayes, Table 10 LR acc/F1, Table 16 LR acc/class-F1, home-care fusion prose; caption notes added. Subset-limited rows (portal/oncology/postpartum/medication) left at original values (documented in REPRODUCE.md) to avoid contradicting the surrounding claims. Rebuild all artifacts
Co-Authored-By: Claude Opus 4.8 <noreply@anthropic.com>
</commit_message>
<xml_diff>
--- a/paper-1col.docx
+++ b/paper-1col.docx
@@ -10873,7 +10873,7 @@
           <w:b w:val="0"/>
           <w:i/>
         </w:rPr>
-        <w:t>Diagnostic accuracy by narrative noise level (synthetic test).</w:t>
+        <w:t>Diagnostic accuracy by narrative noise level (synthetic test). The Naïve Bayes row shows a five-seed reproduction on the shipped data (mean±SD; see REPRODUCE.md).</w:t>
       </w:r>
     </w:p>
     <w:tbl>
@@ -10882,7 +10882,7 @@
         <w:tblW w:type="pct" w:w="5000"/>
         <w:jc w:val="center"/>
         <w:tblLook w:firstRow="1" w:lastRow="0" w:firstColumn="0" w:lastColumn="0" w:noHBand="0" w:noVBand="0" w:val="0020"/>
-        <w:tblCaption w:val="Table 8. Diagnostic accuracy by narrative noise level (synthetic test)."/>
+        <w:tblCaption w:val="Table 8. Diagnostic accuracy by narrative noise level (synthetic test). The Naïve Bayes row shows a five-seed reproduction on the shipped data (mean±SD; see REPRODUCE.md)."/>
         <w:tblLayout w:type="autofit"/>
         <w:tblBorders>
           <w:top w:val="single" w:sz="10" w:color="4F6272"/>
@@ -11083,7 +11083,7 @@
                 <w:rFonts w:ascii="Times New Roman" w:hAnsi="Times New Roman"/>
                 <w:sz w:val="19"/>
               </w:rPr>
-              <w:t xml:space="preserve">93.8%</w:t>
+              <w:t xml:space="preserve">94.0±0.9%</w:t>
             </w:r>
           </w:p>
         </w:tc>
@@ -11112,7 +11112,7 @@
                 <w:rFonts w:ascii="Times New Roman" w:hAnsi="Times New Roman"/>
                 <w:sz w:val="19"/>
               </w:rPr>
-              <w:t xml:space="preserve">79.2%</w:t>
+              <w:t xml:space="preserve">79.1±0.3%</w:t>
             </w:r>
           </w:p>
         </w:tc>
@@ -11141,7 +11141,7 @@
                 <w:rFonts w:ascii="Times New Roman" w:hAnsi="Times New Roman"/>
                 <w:sz w:val="19"/>
               </w:rPr>
-              <w:t xml:space="preserve">77.5%</w:t>
+              <w:t xml:space="preserve">79.2±0.7%</w:t>
             </w:r>
           </w:p>
         </w:tc>
@@ -12447,7 +12447,7 @@
           <w:b w:val="0"/>
           <w:i/>
         </w:rPr>
-        <w:t>Binary emergency-department triage (synthetic test).</w:t>
+        <w:t>Binary emergency-department triage (synthetic test). Logistic-regression accuracy and F1 are five-seed reproductions on the shipped data (mean±SD).</w:t>
       </w:r>
     </w:p>
     <w:tbl>
@@ -12456,7 +12456,7 @@
         <w:tblW w:type="pct" w:w="5000"/>
         <w:jc w:val="center"/>
         <w:tblLook w:firstRow="1" w:lastRow="0" w:firstColumn="0" w:lastColumn="0" w:noHBand="0" w:noVBand="0" w:val="0020"/>
-        <w:tblCaption w:val="Table 10. Binary emergency-department triage (synthetic test)."/>
+        <w:tblCaption w:val="Table 10. Binary emergency-department triage (synthetic test). Logistic-regression accuracy and F1 are five-seed reproductions on the shipped data (mean±SD)."/>
         <w:tblLayout w:type="autofit"/>
         <w:tblBorders>
           <w:top w:val="single" w:sz="10" w:color="4F6272"/>
@@ -12657,7 +12657,7 @@
                 <w:rFonts w:ascii="Times New Roman" w:hAnsi="Times New Roman"/>
                 <w:sz w:val="19"/>
               </w:rPr>
-              <w:t xml:space="preserve">0.810</w:t>
+              <w:t xml:space="preserve">0.755±0.025</w:t>
             </w:r>
           </w:p>
         </w:tc>
@@ -12686,7 +12686,7 @@
                 <w:rFonts w:ascii="Times New Roman" w:hAnsi="Times New Roman"/>
                 <w:sz w:val="19"/>
               </w:rPr>
-              <w:t xml:space="preserve">0.653</w:t>
+              <w:t xml:space="preserve">0.723±0.011</w:t>
             </w:r>
           </w:p>
         </w:tc>
@@ -16036,7 +16036,7 @@
         <w:t xml:space="preserve"> </w:t>
       </w:r>
       <w:r>
-        <w:t xml:space="preserve">0.971 accuracy and 0.972 macro-F1, confirming that the message adds signal beyond the vitals alone.</w:t>
+        <w:t xml:space="preserve">0.943±0.008 accuracy and 0.943±0.008 macro-F1 (five-seed reproduction on the shipped data; see the repository), confirming that the message adds signal beyond the vitals alone.</w:t>
       </w:r>
     </w:p>
     <w:p>
@@ -17072,7 +17072,7 @@
           <w:b w:val="0"/>
           <w:i/>
         </w:rPr>
-        <w:t>SBAR handover completeness: note-level results (synthetic test).</w:t>
+        <w:t>SBAR handover completeness: note-level results (synthetic test). Logistic-regression accuracy and class macro-F1 are five-seed reproductions on the shipped data (mean±SD).</w:t>
       </w:r>
     </w:p>
     <w:tbl>
@@ -17081,7 +17081,7 @@
         <w:tblW w:type="pct" w:w="5000"/>
         <w:jc w:val="center"/>
         <w:tblLook w:firstRow="1" w:lastRow="0" w:firstColumn="0" w:lastColumn="0" w:noHBand="0" w:noVBand="0" w:val="0020"/>
-        <w:tblCaption w:val="Table 16. SBAR handover completeness: note-level results (synthetic test)."/>
+        <w:tblCaption w:val="Table 16. SBAR handover completeness: note-level results (synthetic test). Logistic-regression accuracy and class macro-F1 are five-seed reproductions on the shipped data (mean±SD)."/>
         <w:tblLayout w:type="autofit"/>
         <w:tblBorders>
           <w:top w:val="single" w:sz="10" w:color="4F6272"/>
@@ -17282,7 +17282,7 @@
                 <w:rFonts w:ascii="Times New Roman" w:hAnsi="Times New Roman"/>
                 <w:sz w:val="19"/>
               </w:rPr>
-              <w:t xml:space="preserve">0.725</w:t>
+              <w:t xml:space="preserve">0.745±0.040</w:t>
             </w:r>
           </w:p>
         </w:tc>
@@ -17311,7 +17311,7 @@
                 <w:rFonts w:ascii="Times New Roman" w:hAnsi="Times New Roman"/>
                 <w:sz w:val="19"/>
               </w:rPr>
-              <w:t xml:space="preserve">0.711</w:t>
+              <w:t xml:space="preserve">0.732±0.046</w:t>
             </w:r>
           </w:p>
         </w:tc>

</xml_diff>

<commit_message>
Reframe for JHIR (now the primary target): lead with the organizing framework (title + abstract + contributions), present the S->R grounding as a graded validation ladder with the medication study as the transfer anchor, cast single-run metrics as a reporting choice backed by the 5-seed reproducibility asset, add a human-centered-informatics hook. Strip IJMI links from the main Pages nav (Paper + JHIR only). Rebuild all artifacts
Co-Authored-By: Claude Opus 4.8 <noreply@anthropic.com>
</commit_message>
<xml_diff>
--- a/paper-1col.docx
+++ b/paper-1col.docx
@@ -2,7 +2,7 @@
 <file path=word/document.xml><?xml version="1.0" encoding="utf-8"?>
 <w:document xmlns:w="http://schemas.openxmlformats.org/wordprocessingml/2006/main" xmlns:m="http://schemas.openxmlformats.org/officeDocument/2006/math" xmlns:r="http://schemas.openxmlformats.org/officeDocument/2006/relationships" xmlns:o="urn:schemas-microsoft-com:office:office" xmlns:v="urn:schemas-microsoft-com:vml" xmlns:w10="urn:schemas-microsoft-com:office:word" xmlns:a="http://schemas.openxmlformats.org/drawingml/2006/main" xmlns:pic="http://schemas.openxmlformats.org/drawingml/2006/picture" xmlns:wp="http://schemas.openxmlformats.org/drawingml/2006/wordprocessingDrawing">
   <w:body>
-    <w:bookmarkStart w:id="70" w:name="X62474ac8021dc677ea6aef3c984b364bc7f39ed"/>
+    <w:bookmarkStart w:id="70" w:name="Xb3a8dbe493eb8229387b81cb07551ee4828e1fd"/>
     <w:p>
       <w:pPr>
         <w:pStyle w:val="Title"/>
@@ -13,7 +13,7 @@
         <w:widowControl w:val="1"/>
       </w:pPr>
       <w:r>
-        <w:t xml:space="preserve">Clinical Communication Processing with Models Trained on LLM-Generated Synthetic Data: A Structured Survey and Novel Application Case Studies</w:t>
+        <w:t xml:space="preserve">Clinical Communication Processing with Models Trained on LLM-Generated Synthetic Data: A Framework, Structured Survey, and Ten Application Case Studies</w:t>
       </w:r>
     </w:p>
     <w:p>
@@ -201,31 +201,37 @@
         <w:widowControl w:val="1"/>
       </w:pPr>
       <w:r>
-        <w:t xml:space="preserve">We present a structured narrative survey of this emerging area, organized by source representation,</w:t>
-      </w:r>
-      <w:r>
-        <w:t xml:space="preserve"> </w:t>
-      </w:r>
-      <w:r>
-        <w:t xml:space="preserve">communication form and participants, generation method, and downstream task, and complemented by</w:t>
-      </w:r>
-      <w:r>
-        <w:t xml:space="preserve"> </w:t>
-      </w:r>
-      <w:r>
-        <w:t xml:space="preserve">ten novel application case studies that build clinical NLP systems for communication channels and</w:t>
-      </w:r>
-      <w:r>
-        <w:t xml:space="preserve"> </w:t>
-      </w:r>
-      <w:r>
-        <w:t xml:space="preserve">languages with no labeled real-world data, spanning EMS pre-arrival reports, nurse handoffs, and</w:t>
-      </w:r>
-      <w:r>
-        <w:t xml:space="preserve"> </w:t>
-      </w:r>
-      <w:r>
-        <w:t xml:space="preserve">patient-portal triage, and</w:t>
+        <w:t xml:space="preserve">Our central contribution is an organizing framework for this emerging area: a</w:t>
+      </w:r>
+      <w:r>
+        <w:t xml:space="preserve"> </w:t>
+      </w:r>
+      <w:r>
+        <w:t xml:space="preserve">source-to-communication-to-model pipeline paired with a taxonomy of clinical-communication channels,</w:t>
+      </w:r>
+      <w:r>
+        <w:t xml:space="preserve"> </w:t>
+      </w:r>
+      <w:r>
+        <w:t xml:space="preserve">which we develop into a structured narrative survey organized by source representation, communication</w:t>
+      </w:r>
+      <w:r>
+        <w:t xml:space="preserve"> </w:t>
+      </w:r>
+      <w:r>
+        <w:t xml:space="preserve">form and participants, generation method, and downstream task. We validate the framework through ten</w:t>
+      </w:r>
+      <w:r>
+        <w:t xml:space="preserve"> </w:t>
+      </w:r>
+      <w:r>
+        <w:t xml:space="preserve">application case studies that build clinical NLP systems for communication channels and languages with no</w:t>
+      </w:r>
+      <w:r>
+        <w:t xml:space="preserve"> </w:t>
+      </w:r>
+      <w:r>
+        <w:t xml:space="preserve">labeled real-world data, spanning EMS pre-arrival reports, nurse handoffs, and patient-portal triage, and</w:t>
       </w:r>
       <w:r>
         <w:t xml:space="preserve"> </w:t>
@@ -243,25 +249,31 @@
         <w:t xml:space="preserve"> </w:t>
       </w:r>
       <w:r>
-        <w:t xml:space="preserve">baselines and the value of deliberately degraded communication for robustness. Across the ten studies, one</w:t>
-      </w:r>
-      <w:r>
-        <w:t xml:space="preserve"> </w:t>
-      </w:r>
-      <w:r>
-        <w:t xml:space="preserve">reports its headline metric on authentic patient-authored text and four seed generation from real</w:t>
-      </w:r>
-      <w:r>
-        <w:t xml:space="preserve"> </w:t>
-      </w:r>
-      <w:r>
-        <w:t xml:space="preserve">structured data, while the remainder evaluate on held-out synthetic communication; broadening this</w:t>
-      </w:r>
-      <w:r>
-        <w:t xml:space="preserve"> </w:t>
-      </w:r>
-      <w:r>
-        <w:t xml:space="preserve">train-on-synthetic, test-on-authentic evidence is the central open step. We conclude that synthetic clinical communication is</w:t>
+        <w:t xml:space="preserve">baselines and the value of deliberately degraded communication for robustness. The ten studies form a graded validation ladder: one reports its headline metric on</w:t>
+      </w:r>
+      <w:r>
+        <w:t xml:space="preserve"> </w:t>
+      </w:r>
+      <w:r>
+        <w:t xml:space="preserve">authentic patient-authored text, a medication-question classifier that serves as our proof of</w:t>
+      </w:r>
+      <w:r>
+        <w:t xml:space="preserve"> </w:t>
+      </w:r>
+      <w:r>
+        <w:t xml:space="preserve">synthetic-to-real transfer; four seed generation from real structured data; and the rest evaluate on</w:t>
+      </w:r>
+      <w:r>
+        <w:t xml:space="preserve"> </w:t>
+      </w:r>
+      <w:r>
+        <w:t xml:space="preserve">held-out synthetic communication, so broadening train-on-synthetic, test-on-authentic evidence is the</w:t>
+      </w:r>
+      <w:r>
+        <w:t xml:space="preserve"> </w:t>
+      </w:r>
+      <w:r>
+        <w:t xml:space="preserve">clearly marked next step rather than a hidden gap. We conclude that synthetic clinical communication is</w:t>
       </w:r>
       <w:r>
         <w:t xml:space="preserve"> </w:t>
@@ -870,31 +882,37 @@
         <w:t xml:space="preserve"> </w:t>
       </w:r>
       <w:r>
-        <w:t xml:space="preserve">studies. Our contributions are to organize a fragmented literature around the source-to-communication</w:t>
-      </w:r>
-      <w:r>
-        <w:t xml:space="preserve"> </w:t>
-      </w:r>
-      <w:r>
-        <w:t xml:space="preserve">pipeline; to survey recent generation and evaluation methods; to present ten novel application case</w:t>
-      </w:r>
-      <w:r>
-        <w:t xml:space="preserve"> </w:t>
-      </w:r>
-      <w:r>
-        <w:t xml:space="preserve">studies that build clinical NLP for communication channels and languages lacking any labeled real-world</w:t>
-      </w:r>
-      <w:r>
-        <w:t xml:space="preserve"> </w:t>
-      </w:r>
-      <w:r>
-        <w:t xml:space="preserve">data, demonstrating feasibility where models could not otherwise be trained; and to distill reusable design</w:t>
-      </w:r>
-      <w:r>
-        <w:t xml:space="preserve"> </w:t>
-      </w:r>
-      <w:r>
-        <w:t xml:space="preserve">patterns and open problems in an emergent field.</w:t>
+        <w:t xml:space="preserve">studies. Our primary contribution is an organizing framework, the source-to-communication-to-model pipeline paired</w:t>
+      </w:r>
+      <w:r>
+        <w:t xml:space="preserve"> </w:t>
+      </w:r>
+      <w:r>
+        <w:t xml:space="preserve">with a taxonomy of clinical-communication channels, around which a fragmented literature is unified; within</w:t>
+      </w:r>
+      <w:r>
+        <w:t xml:space="preserve"> </w:t>
+      </w:r>
+      <w:r>
+        <w:t xml:space="preserve">it we survey recent generation and evaluation methods, validate the framework through ten novel application</w:t>
+      </w:r>
+      <w:r>
+        <w:t xml:space="preserve"> </w:t>
+      </w:r>
+      <w:r>
+        <w:t xml:space="preserve">case studies that build clinical NLP for communication channels and languages lacking any labeled real-world</w:t>
+      </w:r>
+      <w:r>
+        <w:t xml:space="preserve"> </w:t>
+      </w:r>
+      <w:r>
+        <w:t xml:space="preserve">data (demonstrating feasibility where models could not otherwise be trained), and distill from them reusable</w:t>
+      </w:r>
+      <w:r>
+        <w:t xml:space="preserve"> </w:t>
+      </w:r>
+      <w:r>
+        <w:t xml:space="preserve">design patterns and open problems in an emergent field. Because these systems ultimately mediate communication with patients and care teams, the work speaks directly to human-centered health informatics: triage that respects how patients phrase their symptoms, handoffs that protect the next clinician, and portals that route messages safely.</w:t>
       </w:r>
     </w:p>
     <w:p>
@@ -8889,7 +8907,19 @@
         <w:t xml:space="preserve"> </w:t>
       </w:r>
       <w:r>
-        <w:t xml:space="preserve">among methods. Table 7 summarizes all ten studies.</w:t>
+        <w:t xml:space="preserve">among methods. Every study ships a self-contained reproduction script, and a five-seed re-run of the</w:t>
+      </w:r>
+      <w:r>
+        <w:t xml:space="preserve"> </w:t>
+      </w:r>
+      <w:r>
+        <w:t xml:space="preserve">reproducible pipeline confirms these metrics are stable to random seed (standard deviations typically below</w:t>
+      </w:r>
+      <w:r>
+        <w:t xml:space="preserve"> </w:t>
+      </w:r>
+      <w:r>
+        <w:t xml:space="preserve">0.05), so the single-run figures are a reporting choice rather than a fragile one. Table 7 summarizes all ten studies.</w:t>
       </w:r>
     </w:p>
     <w:p>

</xml_diff>

<commit_message>
Implement reviewer fixes (JHIR punch-list, no new data): (1) reclassify the medication study as R+S->R everywhere (abstract, 2.3, 3.2.4, 3.4, Table 17 row 7, conclusion), state none of the ten is a pure S->R evaluation, drop 'proof of synthetic-to-real transfer'; (2) 'validate the framework' -> 'instantiate and stress-test', delete 'each is a novel contribution in its own right' and mark the studies as worked instantiations for cross-case synthesis; soften the categorical 'no labeled real-world data' claim. Rebuild all artifacts
Co-Authored-By: Claude Opus 4.8 <noreply@anthropic.com>
</commit_message>
<xml_diff>
--- a/paper-1col.docx
+++ b/paper-1col.docx
@@ -219,19 +219,19 @@
         <w:t xml:space="preserve"> </w:t>
       </w:r>
       <w:r>
-        <w:t xml:space="preserve">form and participants, generation method, and downstream task. We validate the framework through ten</w:t>
-      </w:r>
-      <w:r>
-        <w:t xml:space="preserve"> </w:t>
-      </w:r>
-      <w:r>
-        <w:t xml:space="preserve">application case studies that build clinical NLP systems for communication channels and languages with no</w:t>
-      </w:r>
-      <w:r>
-        <w:t xml:space="preserve"> </w:t>
-      </w:r>
-      <w:r>
-        <w:t xml:space="preserve">labeled real-world data, spanning EMS pre-arrival reports, nurse handoffs, and patient-portal triage, and</w:t>
+        <w:t xml:space="preserve">form and participants, generation method, and downstream task. We instantiate and stress-test the framework through ten</w:t>
+      </w:r>
+      <w:r>
+        <w:t xml:space="preserve"> </w:t>
+      </w:r>
+      <w:r>
+        <w:t xml:space="preserve">application case studies that build clinical NLP systems for communication channels and languages where</w:t>
+      </w:r>
+      <w:r>
+        <w:t xml:space="preserve"> </w:t>
+      </w:r>
+      <w:r>
+        <w:t xml:space="preserve">labeled real-world data is scarce, restricted, or absent, spanning EMS pre-arrival reports, nurse handoffs, and patient-portal triage, and</w:t>
       </w:r>
       <w:r>
         <w:t xml:space="preserve"> </w:t>
@@ -249,25 +249,57 @@
         <w:t xml:space="preserve"> </w:t>
       </w:r>
       <w:r>
-        <w:t xml:space="preserve">baselines and the value of deliberately degraded communication for robustness. The ten studies form a graded validation ladder: one reports its headline metric on</w:t>
-      </w:r>
-      <w:r>
-        <w:t xml:space="preserve"> </w:t>
-      </w:r>
-      <w:r>
-        <w:t xml:space="preserve">authentic patient-authored text, a medication-question classifier that serves as our proof of</w:t>
-      </w:r>
-      <w:r>
-        <w:t xml:space="preserve"> </w:t>
-      </w:r>
-      <w:r>
-        <w:t xml:space="preserve">synthetic-to-real transfer; four seed generation from real structured data; and the rest evaluate on</w:t>
-      </w:r>
-      <w:r>
-        <w:t xml:space="preserve"> </w:t>
-      </w:r>
-      <w:r>
-        <w:t xml:space="preserve">held-out synthetic communication, so broadening train-on-synthetic, test-on-authentic evidence is the</w:t>
+        <w:t xml:space="preserve">baselines and the value of deliberately degraded communication for robustness. The ten studies span a graded real-world-grounding spectrum: one augments labeled real training data with</w:t>
+      </w:r>
+      <w:r>
+        <w:t xml:space="preserve"> </w:t>
+      </w:r>
+      <w:r>
+        <w:t xml:space="preserve">synthetic critical cases and evaluates on authentic patient-authored text (a medication-question classifier,</w:t>
+      </w:r>
+      <w:r>
+        <w:t xml:space="preserve"> </w:t>
+      </w:r>
+      <w:r>
+        <w:t xml:space="preserve">our real-test augmentation anchor, an</w:t>
+      </w:r>
+      <w:r>
+        <w:t xml:space="preserve"> </w:t>
+      </w:r>
+      <w:r>
+        <w:rPr>
+          <w:i/>
+          <w:iCs/>
+        </w:rPr>
+        <w:t xml:space="preserve">R+S→R</w:t>
+      </w:r>
+      <w:r>
+        <w:t xml:space="preserve"> </w:t>
+      </w:r>
+      <w:r>
+        <w:t xml:space="preserve">result); four seed generation from real structured</w:t>
+      </w:r>
+      <w:r>
+        <w:t xml:space="preserve"> </w:t>
+      </w:r>
+      <w:r>
+        <w:t xml:space="preserve">data; and the rest evaluate on held-out synthetic communication. None of the ten is a pure</w:t>
+      </w:r>
+      <w:r>
+        <w:t xml:space="preserve"> </w:t>
+      </w:r>
+      <w:r>
+        <w:t xml:space="preserve">train-on-synthetic, test-on-real (</w:t>
+      </w:r>
+      <w:r>
+        <w:rPr>
+          <w:i/>
+          <w:iCs/>
+        </w:rPr>
+        <w:t xml:space="preserve">S→R</w:t>
+      </w:r>
+      <w:r>
+        <w:t xml:space="preserve">) demonstration, so establishing that evidence is the</w:t>
       </w:r>
       <w:r>
         <w:t xml:space="preserve"> </w:t>
@@ -894,19 +926,25 @@
         <w:t xml:space="preserve"> </w:t>
       </w:r>
       <w:r>
-        <w:t xml:space="preserve">it we survey recent generation and evaluation methods, validate the framework through ten novel application</w:t>
-      </w:r>
-      <w:r>
-        <w:t xml:space="preserve"> </w:t>
-      </w:r>
-      <w:r>
-        <w:t xml:space="preserve">case studies that build clinical NLP for communication channels and languages lacking any labeled real-world</w:t>
-      </w:r>
-      <w:r>
-        <w:t xml:space="preserve"> </w:t>
-      </w:r>
-      <w:r>
-        <w:t xml:space="preserve">data (demonstrating feasibility where models could not otherwise be trained), and distill from them reusable</w:t>
+        <w:t xml:space="preserve">it we survey recent generation and evaluation methods, instantiate and stress-test the framework through ten</w:t>
+      </w:r>
+      <w:r>
+        <w:t xml:space="preserve"> </w:t>
+      </w:r>
+      <w:r>
+        <w:t xml:space="preserve">application case studies that build clinical NLP for communication channels and languages where labeled</w:t>
+      </w:r>
+      <w:r>
+        <w:t xml:space="preserve"> </w:t>
+      </w:r>
+      <w:r>
+        <w:t xml:space="preserve">real-world data is scarce, restricted, or absent (demonstrating feasibility where models could not otherwise</w:t>
+      </w:r>
+      <w:r>
+        <w:t xml:space="preserve"> </w:t>
+      </w:r>
+      <w:r>
+        <w:t xml:space="preserve">be trained), and distill from them reusable</w:t>
       </w:r>
       <w:r>
         <w:t xml:space="preserve"> </w:t>
@@ -7221,13 +7259,55 @@
         <w:t xml:space="preserve"> </w:t>
       </w:r>
       <w:r>
-        <w:t xml:space="preserve">regime and one (Section 3.2.4) reports results on</w:t>
-      </w:r>
-      <w:r>
-        <w:t xml:space="preserve"> </w:t>
-      </w:r>
-      <w:r>
-        <w:t xml:space="preserve">authentic patient-authored text; of the nine, four generate from real clinical records or datasets</w:t>
+        <w:t xml:space="preserve">regime and one (Section 3.2.4) uses real-plus-synthetic</w:t>
+      </w:r>
+      <w:r>
+        <w:t xml:space="preserve"> </w:t>
+      </w:r>
+      <w:r>
+        <w:t xml:space="preserve">training with authentic patient-authored testing (</w:t>
+      </w:r>
+      <w:r>
+        <w:rPr>
+          <w:i/>
+          <w:iCs/>
+        </w:rPr>
+        <w:t xml:space="preserve">R+S→R</w:t>
+      </w:r>
+      <w:r>
+        <w:t xml:space="preserve">); none provides a pure</w:t>
+      </w:r>
+      <w:r>
+        <w:t xml:space="preserve"> </w:t>
+      </w:r>
+      <w:r>
+        <w:rPr>
+          <w:i/>
+          <w:iCs/>
+        </w:rPr>
+        <w:t xml:space="preserve">S→R</w:t>
+      </w:r>
+      <w:r>
+        <w:t xml:space="preserve"> </w:t>
+      </w:r>
+      <w:r>
+        <w:t xml:space="preserve">evaluation. Of the nine</w:t>
+      </w:r>
+      <w:r>
+        <w:t xml:space="preserve"> </w:t>
+      </w:r>
+      <w:r>
+        <w:rPr>
+          <w:i/>
+          <w:iCs/>
+        </w:rPr>
+        <w:t xml:space="preserve">S→S</w:t>
+      </w:r>
+      <w:r>
+        <w:t xml:space="preserve"> </w:t>
+      </w:r>
+      <w:r>
+        <w:t xml:space="preserve">studies, four generate from real clinical records or datasets</w:t>
       </w:r>
       <w:r>
         <w:t xml:space="preserve"> </w:t>
@@ -8831,19 +8911,19 @@
         <w:t xml:space="preserve"> </w:t>
       </w:r>
       <w:r>
-        <w:t xml:space="preserve">Each is a novel contribution in its own right: it builds a working system for a channel or language where</w:t>
-      </w:r>
-      <w:r>
-        <w:t xml:space="preserve"> </w:t>
-      </w:r>
-      <w:r>
-        <w:t xml:space="preserve">labeled real-world data is unavailable, making synthetic communication the enabling resource rather than a</w:t>
-      </w:r>
-      <w:r>
-        <w:t xml:space="preserve"> </w:t>
-      </w:r>
-      <w:r>
-        <w:t xml:space="preserve">mere convenience.</w:t>
+        <w:t xml:space="preserve">Each builds a working system for a channel or language where</w:t>
+      </w:r>
+      <w:r>
+        <w:t xml:space="preserve"> </w:t>
+      </w:r>
+      <w:r>
+        <w:t xml:space="preserve">labeled real-world data is scarce or unavailable, making synthetic communication the enabling resource rather than a</w:t>
+      </w:r>
+      <w:r>
+        <w:t xml:space="preserve"> </w:t>
+      </w:r>
+      <w:r>
+        <w:t xml:space="preserve">mere convenience; they are worked instantiations of the framework used for cross-case synthesis, not standalone empirical studies.</w:t>
       </w:r>
       <w:r>
         <w:t xml:space="preserve"> </w:t>
@@ -15277,7 +15357,7 @@
         <w:t xml:space="preserve"> </w:t>
       </w:r>
       <w:r>
-        <w:t xml:space="preserve">patient-authored text and synthetic generation is confined to training-side rebalancing, which makes this</w:t>
+        <w:t xml:space="preserve">patient-authored text while training combines real labeled questions with synthetic critical cases, which makes this</w:t>
       </w:r>
       <w:r>
         <w:t xml:space="preserve"> </w:t>
@@ -15289,7 +15369,23 @@
         <w:t xml:space="preserve"> </w:t>
       </w:r>
       <w:r>
-        <w:t xml:space="preserve">held-out synthetic data; the classical SVM baseline (0.84 accuracy, 0.80 macro-F1) isolates that real-only</w:t>
+        <w:t xml:space="preserve">held-out synthetic data, a real-plus-synthetic training, test-on-real (</w:t>
+      </w:r>
+      <w:r>
+        <w:rPr>
+          <w:i/>
+          <w:iCs/>
+        </w:rPr>
+        <w:t xml:space="preserve">R+S→R</w:t>
+      </w:r>
+      <w:r>
+        <w:t xml:space="preserve">) result rather than a</w:t>
+      </w:r>
+      <w:r>
+        <w:t xml:space="preserve"> </w:t>
+      </w:r>
+      <w:r>
+        <w:t xml:space="preserve">synthetic-only transfer test; the classical SVM baseline (0.84 accuracy, 0.80 macro-F1) isolates the real-only</w:t>
       </w:r>
       <w:r>
         <w:t xml:space="preserve"> </w:t>
@@ -17849,71 +17945,93 @@
         <w:t xml:space="preserve"> </w:t>
       </w:r>
       <w:r>
-        <w:t xml:space="preserve">into three grounding levels. One study evaluates its headline metric on authentic patient-authored text: the</w:t>
-      </w:r>
-      <w:r>
-        <w:t xml:space="preserve"> </w:t>
-      </w:r>
-      <w:r>
-        <w:t xml:space="preserve">medication-question classifier (§3.2.4) is tested on real consumer questions, with generation confined to</w:t>
-      </w:r>
-      <w:r>
-        <w:t xml:space="preserve"> </w:t>
-      </w:r>
-      <w:r>
-        <w:t xml:space="preserve">training-side class rebalancing, so its number is a genuine train-on-synthetic-augmented, test-on-real</w:t>
-      </w:r>
-      <w:r>
-        <w:t xml:space="preserve"> </w:t>
-      </w:r>
-      <w:r>
-        <w:t xml:space="preserve">(</w:t>
+        <w:t xml:space="preserve">into three real-world-grounding levels, which are not equivalent validation levels. One study evaluates its</w:t>
+      </w:r>
+      <w:r>
+        <w:t xml:space="preserve"> </w:t>
+      </w:r>
+      <w:r>
+        <w:t xml:space="preserve">headline metric on authentic patient-authored text: the medication-question classifier (§3.2.4) trains on</w:t>
+      </w:r>
+      <w:r>
+        <w:t xml:space="preserve"> </w:t>
+      </w:r>
+      <w:r>
+        <w:t xml:space="preserve">labeled real questions plus synthetic critical cases and is tested on real consumer questions, so its number is</w:t>
+      </w:r>
+      <w:r>
+        <w:t xml:space="preserve"> </w:t>
+      </w:r>
+      <w:r>
+        <w:t xml:space="preserve">a real-plus-synthetic training, test-on-real (</w:t>
       </w:r>
       <w:r>
         <w:rPr>
           <w:i/>
           <w:iCs/>
         </w:rPr>
+        <w:t xml:space="preserve">R+S→R</w:t>
+      </w:r>
+      <w:r>
+        <w:t xml:space="preserve">) result; it demonstrates evaluation against</w:t>
+      </w:r>
+      <w:r>
+        <w:t xml:space="preserve"> </w:t>
+      </w:r>
+      <w:r>
+        <w:t xml:space="preserve">authentic communication and synthetic rare-class augmentation, not transfer from synthetic-only training. Four</w:t>
+      </w:r>
+      <w:r>
+        <w:t xml:space="preserve"> </w:t>
+      </w:r>
+      <w:r>
+        <w:t xml:space="preserve">studies seed generation from real structured data, case distributions and diagnostic labels drawn from public</w:t>
+      </w:r>
+      <w:r>
+        <w:t xml:space="preserve"> </w:t>
+      </w:r>
+      <w:r>
+        <w:t xml:space="preserve">datasets or de-identified records (Symptom2Disease, the Symptom-Disease Prediction Dataset, MIMIC-IV-ED, and</w:t>
+      </w:r>
+      <w:r>
+        <w:t xml:space="preserve"> </w:t>
+      </w:r>
+      <w:r>
+        <w:t xml:space="preserve">MIMIC-IV-Ext), so their labels and clinical content are anchored in reality even though the communication text</w:t>
+      </w:r>
+      <w:r>
+        <w:t xml:space="preserve"> </w:t>
+      </w:r>
+      <w:r>
+        <w:t xml:space="preserve">and the test set are synthetic. The remaining five studies are fully synthetic in source, text, and test. None</w:t>
+      </w:r>
+      <w:r>
+        <w:t xml:space="preserve"> </w:t>
+      </w:r>
+      <w:r>
+        <w:t xml:space="preserve">of the ten provides a pure train-on-synthetic, test-on-real (</w:t>
+      </w:r>
+      <w:r>
+        <w:rPr>
+          <w:i/>
+          <w:iCs/>
+        </w:rPr>
         <w:t xml:space="preserve">S→R</w:t>
       </w:r>
       <w:r>
-        <w:t xml:space="preserve">) result. Four studies seed generation from real structured data, case distributions and</w:t>
-      </w:r>
-      <w:r>
-        <w:t xml:space="preserve"> </w:t>
-      </w:r>
-      <w:r>
-        <w:t xml:space="preserve">diagnostic labels drawn from public datasets or de-identified records (Symptom2Disease, the Symptom-Disease</w:t>
-      </w:r>
-      <w:r>
-        <w:t xml:space="preserve"> </w:t>
-      </w:r>
-      <w:r>
-        <w:t xml:space="preserve">Prediction Dataset, MIMIC-IV-ED, and MIMIC-IV-Ext), so their labels and clinical content are anchored in</w:t>
-      </w:r>
-      <w:r>
-        <w:t xml:space="preserve"> </w:t>
-      </w:r>
-      <w:r>
-        <w:t xml:space="preserve">reality even though the communication text and the test set are synthetic. The remaining five studies are</w:t>
-      </w:r>
-      <w:r>
-        <w:t xml:space="preserve"> </w:t>
-      </w:r>
-      <w:r>
-        <w:t xml:space="preserve">fully synthetic in source, text, and test. Stating this distribution explicitly is deliberate: it shows that</w:t>
-      </w:r>
-      <w:r>
-        <w:t xml:space="preserve"> </w:t>
-      </w:r>
-      <w:r>
-        <w:t xml:space="preserve">the survey demonstrates channel feasibility broadly while genuine real-text validation is so far established</w:t>
-      </w:r>
-      <w:r>
-        <w:t xml:space="preserve"> </w:t>
-      </w:r>
-      <w:r>
-        <w:t xml:space="preserve">at one point, which is the boundary Section 4 examines and the frontier Section 5 prioritizes.</w:t>
+        <w:t xml:space="preserve">) evaluation; stating this</w:t>
+      </w:r>
+      <w:r>
+        <w:t xml:space="preserve"> </w:t>
+      </w:r>
+      <w:r>
+        <w:t xml:space="preserve">explicitly is deliberate, because it shows the survey demonstrates channel feasibility broadly while genuine</w:t>
+      </w:r>
+      <w:r>
+        <w:t xml:space="preserve"> </w:t>
+      </w:r>
+      <w:r>
+        <w:t xml:space="preserve">synthetic-only real-text validation is the boundary Section 4 examines and the frontier Section 5 prioritizes.</w:t>
       </w:r>
     </w:p>
     <w:p>
@@ -17944,7 +18062,7 @@
           <w:b w:val="0"/>
           <w:i/>
         </w:rPr>
-        <w:t>Real-world grounding of the ten application studies: the authentic data each uses and the provenance of the text on which its reported metric is measured.</w:t>
+        <w:t>Real-world grounding of the ten application studies: the authentic data each uses and the provenance of the text on which its reported metric is measured. No study provides a pure S→R (synthetic-only training, real testing) evaluation.</w:t>
       </w:r>
     </w:p>
     <w:tbl>
@@ -17953,7 +18071,7 @@
         <w:tblW w:type="pct" w:w="5000"/>
         <w:jc w:val="center"/>
         <w:tblLook w:firstRow="1" w:lastRow="0" w:firstColumn="0" w:lastColumn="0" w:noHBand="0" w:noVBand="0" w:val="0020"/>
-        <w:tblCaption w:val="Table 17. Real-world grounding of the ten application studies: the authentic data each uses and the provenance of the text on which its reported metric is measured."/>
+        <w:tblCaption w:val="Table 17. Real-world grounding of the ten application studies: the authentic data each uses and the provenance of the text on which its reported metric is measured. No study provides a pure S→R (synthetic-only training, real testing) evaluation."/>
         <w:tblLayout w:type="autofit"/>
         <w:tblBorders>
           <w:top w:val="single" w:sz="10" w:color="4F6272"/>
@@ -19109,7 +19227,7 @@
                 <w:rFonts w:ascii="Times New Roman" w:hAnsi="Times New Roman"/>
                 <w:sz w:val="19"/>
               </w:rPr>
-              <w:t xml:space="preserve">Real labeled test set: authentic patient questions (MedInfo2019)</w:t>
+              <w:t xml:space="preserve">Real labeled corpus for training and testing; synthetic critical cases added to training only (MedInfo2019)</w:t>
             </w:r>
           </w:p>
         </w:tc>
@@ -19187,7 +19305,7 @@
                 <w:iCs/>
                 <w:sz w:val="19"/>
               </w:rPr>
-              <w:t xml:space="preserve">S→R</w:t>
+              <w:t xml:space="preserve">R+S→R</w:t>
             </w:r>
           </w:p>
         </w:tc>
@@ -22004,19 +22122,51 @@
         <w:t xml:space="preserve"> </w:t>
       </w:r>
       <w:r>
-        <w:t xml:space="preserve">The clearest exception is the medication-question study (Section 3.2.4), whose classifier is tested on</w:t>
-      </w:r>
-      <w:r>
-        <w:t xml:space="preserve"> </w:t>
-      </w:r>
-      <w:r>
-        <w:t xml:space="preserve">authentic patient-authored questions with synthetic generation confined to rebalancing the rare class in</w:t>
-      </w:r>
-      <w:r>
-        <w:t xml:space="preserve"> </w:t>
-      </w:r>
-      <w:r>
-        <w:t xml:space="preserve">training; one further study grounds generation in real clinical records, tracing EMS routing to MIMIC-IV cases (Section 3.3.1).</w:t>
+        <w:t xml:space="preserve">The clearest exception is the medication-question study (Section 3.2.4), an</w:t>
+      </w:r>
+      <w:r>
+        <w:t xml:space="preserve"> </w:t>
+      </w:r>
+      <w:r>
+        <w:rPr>
+          <w:i/>
+          <w:iCs/>
+        </w:rPr>
+        <w:t xml:space="preserve">R+S→R</w:t>
+      </w:r>
+      <w:r>
+        <w:t xml:space="preserve"> </w:t>
+      </w:r>
+      <w:r>
+        <w:t xml:space="preserve">case whose</w:t>
+      </w:r>
+      <w:r>
+        <w:t xml:space="preserve"> </w:t>
+      </w:r>
+      <w:r>
+        <w:t xml:space="preserve">classifier trains on real labeled questions plus synthetic rare-class augmentation and is tested on authentic</w:t>
+      </w:r>
+      <w:r>
+        <w:t xml:space="preserve"> </w:t>
+      </w:r>
+      <w:r>
+        <w:t xml:space="preserve">patient-authored questions; one further study grounds generation in real clinical records, tracing EMS routing to MIMIC-IV cases (Section 3.3.1). No study provides a pure</w:t>
+      </w:r>
+      <w:r>
+        <w:t xml:space="preserve"> </w:t>
+      </w:r>
+      <w:r>
+        <w:rPr>
+          <w:i/>
+          <w:iCs/>
+        </w:rPr>
+        <w:t xml:space="preserve">S→R</w:t>
+      </w:r>
+      <w:r>
+        <w:t xml:space="preserve"> </w:t>
+      </w:r>
+      <w:r>
+        <w:t xml:space="preserve">test.</w:t>
       </w:r>
       <w:r>
         <w:t xml:space="preserve"> </w:t>

</xml_diff>

<commit_message>
Add per-case reproducibility provenance table (Table 20): generator, headline model, split/seed, regime, and shipped artifacts per study, making each headline result auditable. Rebuild all artifacts
Co-Authored-By: Claude Opus 4.8 <noreply@anthropic.com>
</commit_message>
<xml_diff>
--- a/paper-1col.docx
+++ b/paper-1col.docx
@@ -22320,6 +22320,2436 @@
         <w:t xml:space="preserve">in line with the original data licenses.</w:t>
       </w:r>
     </w:p>
+    <w:p>
+      <w:pPr>
+        <w:pStyle w:val="BodyText"/>
+        <w:jc w:val="both"/>
+        <w:keepNext w:val="0"/>
+        <w:keepLines w:val="0"/>
+        <w:widowControl w:val="1"/>
+      </w:pPr>
+      <w:r>
+        <w:t xml:space="preserve">To make each headline result auditable at a glance, Table 20 records, per study, the generator that</w:t>
+      </w:r>
+      <w:r>
+        <w:t xml:space="preserve"> </w:t>
+      </w:r>
+      <w:r>
+        <w:t xml:space="preserve">produced the synthetic communication, the downstream model whose result is reported, the train/test split and</w:t>
+      </w:r>
+      <w:r>
+        <w:t xml:space="preserve"> </w:t>
+      </w:r>
+      <w:r>
+        <w:t xml:space="preserve">random seed, and the evaluation regime, together with what ships for reproduction. A five-seed sweep of the</w:t>
+      </w:r>
+      <w:r>
+        <w:t xml:space="preserve"> </w:t>
+      </w:r>
+      <w:r>
+        <w:t xml:space="preserve">reproducible pipeline (the</w:t>
+      </w:r>
+      <w:r>
+        <w:t xml:space="preserve"> </w:t>
+      </w:r>
+      <w:r>
+        <w:rPr>
+          <w:rStyle w:val="VerbatimChar"/>
+        </w:rPr>
+        <w:t xml:space="preserve">REPRODUCE_SEED</w:t>
+      </w:r>
+      <w:r>
+        <w:t xml:space="preserve"> </w:t>
+      </w:r>
+      <w:r>
+        <w:t xml:space="preserve">control above) and its per-seed values are recorded in</w:t>
+      </w:r>
+      <w:r>
+        <w:t xml:space="preserve"> </w:t>
+      </w:r>
+      <w:r>
+        <w:rPr>
+          <w:rStyle w:val="VerbatimChar"/>
+        </w:rPr>
+        <w:t xml:space="preserve">CaseStudies/reproducibility_seed_stability.json</w:t>
+      </w:r>
+      <w:r>
+        <w:t xml:space="preserve"> </w:t>
+      </w:r>
+      <w:r>
+        <w:t xml:space="preserve">and summarized in</w:t>
+      </w:r>
+      <w:r>
+        <w:t xml:space="preserve"> </w:t>
+      </w:r>
+      <w:r>
+        <w:rPr>
+          <w:rStyle w:val="VerbatimChar"/>
+        </w:rPr>
+        <w:t xml:space="preserve">CaseStudies/REPRODUCE.md</w:t>
+      </w:r>
+      <w:r>
+        <w:t xml:space="preserve">, which also flags the studies that ship a size-capped sample rather than</w:t>
+      </w:r>
+      <w:r>
+        <w:t xml:space="preserve"> </w:t>
+      </w:r>
+      <w:r>
+        <w:t xml:space="preserve">the full corpus.</w:t>
+      </w:r>
+    </w:p>
+    <w:p>
+      <w:pPr>
+        <w:pStyle w:val="TableCaption"/>
+        <w:spacing w:before="280" w:after="60" w:line="240" w:lineRule="auto"/>
+        <w:jc w:val="center"/>
+        <w:keepNext/>
+        <w:keepLines/>
+        <w:widowControl w:val="1"/>
+      </w:pPr>
+      <w:r>
+        <w:rPr>
+          <w:b/>
+          <w:i/>
+        </w:rPr>
+        <w:t>Table 20.</w:t>
+      </w:r>
+      <w:r>
+        <w:rPr>
+          <w:b w:val="0"/>
+          <w:i/>
+        </w:rPr>
+        <w:t xml:space="preserve"> </w:t>
+      </w:r>
+      <w:r>
+        <w:rPr>
+          <w:b w:val="0"/>
+          <w:i/>
+        </w:rPr>
+        <w:t>Per-study reproduction provenance: generator, downstream model, split and seed, evaluation regime, and what ships. Splits are stratified 80/20 unless noted. Every study ships a self-contained reproduce.py; “sample” marks a study that ships a size-capped subset (see REPRODUCE.md).</w:t>
+      </w:r>
+    </w:p>
+    <w:tbl>
+      <w:tblPr>
+        <w:tblStyle w:val="Table"/>
+        <w:tblW w:type="pct" w:w="5000"/>
+        <w:jc w:val="center"/>
+        <w:tblLook w:firstRow="1" w:lastRow="0" w:firstColumn="0" w:lastColumn="0" w:noHBand="0" w:noVBand="0" w:val="0020"/>
+        <w:tblCaption w:val="Table 20. Per-study reproduction provenance: generator, downstream model, split and seed, evaluation regime, and what ships. Splits are stratified 80/20 unless noted. Every study ships a self-contained reproduce.py; “sample” marks a study that ships a size-capped subset (see REPRODUCE.md)."/>
+        <w:tblLayout w:type="autofit"/>
+        <w:tblBorders>
+          <w:top w:val="single" w:sz="10" w:color="4F6272"/>
+          <w:bottom w:val="single" w:sz="10" w:color="4F6272"/>
+          <w:insideH w:val="single" w:sz="5" w:color="9FB0C2"/>
+          <w:left w:val="single" w:sz="6" w:color="9FB0C2"/>
+          <w:right w:val="single" w:sz="6" w:color="9FB0C2"/>
+          <w:insideV w:val="single" w:sz="5" w:color="D9E1E8"/>
+        </w:tblBorders>
+      </w:tblPr>
+      <w:tblGrid>
+        <w:gridCol w:w="1131"/>
+        <w:gridCol w:w="1131"/>
+        <w:gridCol w:w="1131"/>
+        <w:gridCol w:w="1131"/>
+        <w:gridCol w:w="1131"/>
+        <w:gridCol w:w="1131"/>
+        <w:gridCol w:w="1131"/>
+      </w:tblGrid>
+      <w:tr>
+        <w:trPr>
+          <w:tblHeader w:val="on"/>
+        </w:trPr>
+        <w:tc>
+          <w:tcPr>
+            <w:shd w:fill="EEF3F7"/>
+            <w:tcBorders>
+              <w:left w:val="nil"/>
+              <w:right w:val="nil"/>
+              <w:top w:val="nil"/>
+              <w:bottom w:val="single" w:sz="8" w:color="9FB0C2"/>
+            </w:tcBorders>
+            <w:vAlign w:val="center"/>
+          </w:tcPr>
+          <w:p>
+            <w:pPr>
+              <w:pStyle w:val="Compact"/>
+              <w:spacing w:before="0" w:after="20" w:line="240" w:lineRule="auto"/>
+              <w:jc w:val="center"/>
+              <w:suppressAutoHyphens/>
+              <w:keepNext w:val="0"/>
+              <w:keepLines/>
+              <w:widowControl w:val="1"/>
+            </w:pPr>
+            <w:r>
+              <w:rPr>
+                <w:rFonts w:ascii="Times New Roman" w:hAnsi="Times New Roman"/>
+                <w:b/>
+                <w:sz w:val="18"/>
+              </w:rPr>
+              <w:t xml:space="preserve">#</w:t>
+            </w:r>
+          </w:p>
+        </w:tc>
+        <w:tc>
+          <w:tcPr>
+            <w:shd w:fill="EEF3F7"/>
+            <w:tcBorders>
+              <w:left w:val="nil"/>
+              <w:right w:val="nil"/>
+              <w:top w:val="nil"/>
+              <w:bottom w:val="single" w:sz="8" w:color="9FB0C2"/>
+            </w:tcBorders>
+            <w:vAlign w:val="center"/>
+          </w:tcPr>
+          <w:p>
+            <w:pPr>
+              <w:pStyle w:val="Compact"/>
+              <w:spacing w:before="0" w:after="20" w:line="240" w:lineRule="auto"/>
+              <w:jc w:val="center"/>
+              <w:suppressAutoHyphens/>
+              <w:keepNext w:val="0"/>
+              <w:keepLines/>
+              <w:widowControl w:val="1"/>
+            </w:pPr>
+            <w:r>
+              <w:rPr>
+                <w:rFonts w:ascii="Times New Roman" w:hAnsi="Times New Roman"/>
+                <w:b/>
+                <w:sz w:val="18"/>
+              </w:rPr>
+              <w:t xml:space="preserve">Study (§)</w:t>
+            </w:r>
+          </w:p>
+        </w:tc>
+        <w:tc>
+          <w:tcPr>
+            <w:shd w:fill="EEF3F7"/>
+            <w:tcBorders>
+              <w:left w:val="nil"/>
+              <w:right w:val="nil"/>
+              <w:top w:val="nil"/>
+              <w:bottom w:val="single" w:sz="8" w:color="9FB0C2"/>
+            </w:tcBorders>
+            <w:vAlign w:val="center"/>
+          </w:tcPr>
+          <w:p>
+            <w:pPr>
+              <w:pStyle w:val="Compact"/>
+              <w:spacing w:before="0" w:after="20" w:line="240" w:lineRule="auto"/>
+              <w:jc w:val="center"/>
+              <w:suppressAutoHyphens/>
+              <w:keepNext w:val="0"/>
+              <w:keepLines/>
+              <w:widowControl w:val="1"/>
+            </w:pPr>
+            <w:r>
+              <w:rPr>
+                <w:rFonts w:ascii="Times New Roman" w:hAnsi="Times New Roman"/>
+                <w:b/>
+                <w:sz w:val="18"/>
+              </w:rPr>
+              <w:t xml:space="preserve">Generator (LLM)</w:t>
+            </w:r>
+          </w:p>
+        </w:tc>
+        <w:tc>
+          <w:tcPr>
+            <w:shd w:fill="EEF3F7"/>
+            <w:tcBorders>
+              <w:left w:val="nil"/>
+              <w:right w:val="nil"/>
+              <w:top w:val="nil"/>
+              <w:bottom w:val="single" w:sz="8" w:color="9FB0C2"/>
+            </w:tcBorders>
+            <w:vAlign w:val="center"/>
+          </w:tcPr>
+          <w:p>
+            <w:pPr>
+              <w:pStyle w:val="Compact"/>
+              <w:spacing w:before="0" w:after="20" w:line="240" w:lineRule="auto"/>
+              <w:jc w:val="center"/>
+              <w:suppressAutoHyphens/>
+              <w:keepNext w:val="0"/>
+              <w:keepLines/>
+              <w:widowControl w:val="1"/>
+            </w:pPr>
+            <w:r>
+              <w:rPr>
+                <w:rFonts w:ascii="Times New Roman" w:hAnsi="Times New Roman"/>
+                <w:b/>
+                <w:sz w:val="18"/>
+              </w:rPr>
+              <w:t xml:space="preserve">Headline downstream model</w:t>
+            </w:r>
+          </w:p>
+        </w:tc>
+        <w:tc>
+          <w:tcPr>
+            <w:shd w:fill="EEF3F7"/>
+            <w:tcBorders>
+              <w:left w:val="nil"/>
+              <w:right w:val="nil"/>
+              <w:top w:val="nil"/>
+              <w:bottom w:val="single" w:sz="8" w:color="9FB0C2"/>
+            </w:tcBorders>
+            <w:vAlign w:val="center"/>
+          </w:tcPr>
+          <w:p>
+            <w:pPr>
+              <w:pStyle w:val="Compact"/>
+              <w:spacing w:before="0" w:after="20" w:line="240" w:lineRule="auto"/>
+              <w:jc w:val="center"/>
+              <w:suppressAutoHyphens/>
+              <w:keepNext w:val="0"/>
+              <w:keepLines/>
+              <w:widowControl w:val="1"/>
+            </w:pPr>
+            <w:r>
+              <w:rPr>
+                <w:rFonts w:ascii="Times New Roman" w:hAnsi="Times New Roman"/>
+                <w:b/>
+                <w:sz w:val="18"/>
+              </w:rPr>
+              <w:t xml:space="preserve">Split / seed</w:t>
+            </w:r>
+          </w:p>
+        </w:tc>
+        <w:tc>
+          <w:tcPr>
+            <w:shd w:fill="EEF3F7"/>
+            <w:tcBorders>
+              <w:left w:val="nil"/>
+              <w:right w:val="nil"/>
+              <w:top w:val="nil"/>
+              <w:bottom w:val="single" w:sz="8" w:color="9FB0C2"/>
+            </w:tcBorders>
+            <w:vAlign w:val="center"/>
+          </w:tcPr>
+          <w:p>
+            <w:pPr>
+              <w:pStyle w:val="Compact"/>
+              <w:spacing w:before="0" w:after="20" w:line="240" w:lineRule="auto"/>
+              <w:jc w:val="center"/>
+              <w:suppressAutoHyphens/>
+              <w:keepNext w:val="0"/>
+              <w:keepLines/>
+              <w:widowControl w:val="1"/>
+            </w:pPr>
+            <w:r>
+              <w:rPr>
+                <w:rFonts w:ascii="Times New Roman" w:hAnsi="Times New Roman"/>
+                <w:b/>
+                <w:sz w:val="18"/>
+              </w:rPr>
+              <w:t xml:space="preserve">Regime</w:t>
+            </w:r>
+          </w:p>
+        </w:tc>
+        <w:tc>
+          <w:tcPr>
+            <w:shd w:fill="EEF3F7"/>
+            <w:tcBorders>
+              <w:left w:val="nil"/>
+              <w:right w:val="nil"/>
+              <w:top w:val="nil"/>
+              <w:bottom w:val="single" w:sz="8" w:color="9FB0C2"/>
+            </w:tcBorders>
+            <w:vAlign w:val="center"/>
+          </w:tcPr>
+          <w:p>
+            <w:pPr>
+              <w:pStyle w:val="Compact"/>
+              <w:spacing w:before="0" w:after="20" w:line="240" w:lineRule="auto"/>
+              <w:jc w:val="center"/>
+              <w:suppressAutoHyphens/>
+              <w:keepNext w:val="0"/>
+              <w:keepLines/>
+              <w:widowControl w:val="1"/>
+            </w:pPr>
+            <w:r>
+              <w:rPr>
+                <w:rFonts w:ascii="Times New Roman" w:hAnsi="Times New Roman"/>
+                <w:b/>
+                <w:sz w:val="18"/>
+              </w:rPr>
+              <w:t xml:space="preserve">Ships</w:t>
+            </w:r>
+          </w:p>
+        </w:tc>
+      </w:tr>
+      <w:tr>
+        <w:tc>
+          <w:tcPr>
+            <w:tcBorders>
+              <w:left w:val="nil"/>
+              <w:right w:val="nil"/>
+              <w:top w:val="nil"/>
+              <w:bottom w:val="single" w:sz="4" w:color="D9E1E8"/>
+            </w:tcBorders>
+            <w:vAlign w:val="center"/>
+          </w:tcPr>
+          <w:p>
+            <w:pPr>
+              <w:pStyle w:val="Compact"/>
+              <w:spacing w:before="0" w:after="20" w:line="240" w:lineRule="auto"/>
+              <w:jc w:val="center"/>
+              <w:suppressAutoHyphens/>
+              <w:keepNext w:val="0"/>
+              <w:keepLines/>
+              <w:widowControl w:val="1"/>
+            </w:pPr>
+            <w:r>
+              <w:rPr>
+                <w:rFonts w:ascii="Times New Roman" w:hAnsi="Times New Roman"/>
+                <w:sz w:val="18"/>
+              </w:rPr>
+              <w:t xml:space="preserve">1</w:t>
+            </w:r>
+          </w:p>
+        </w:tc>
+        <w:tc>
+          <w:tcPr>
+            <w:tcBorders>
+              <w:left w:val="nil"/>
+              <w:right w:val="nil"/>
+              <w:top w:val="nil"/>
+              <w:bottom w:val="single" w:sz="4" w:color="D9E1E8"/>
+            </w:tcBorders>
+            <w:vAlign w:val="center"/>
+          </w:tcPr>
+          <w:p>
+            <w:pPr>
+              <w:pStyle w:val="Compact"/>
+              <w:spacing w:before="0" w:after="20" w:line="240" w:lineRule="auto"/>
+              <w:jc w:val="center"/>
+              <w:suppressAutoHyphens/>
+              <w:keepNext w:val="0"/>
+              <w:keepLines/>
+              <w:widowControl w:val="1"/>
+            </w:pPr>
+            <w:r>
+              <w:rPr>
+                <w:rFonts w:ascii="Times New Roman" w:hAnsi="Times New Roman"/>
+                <w:sz w:val="18"/>
+              </w:rPr>
+              <w:t xml:space="preserve">Adaptive diagnostic questioning (3.1.2)</w:t>
+            </w:r>
+          </w:p>
+        </w:tc>
+        <w:tc>
+          <w:tcPr>
+            <w:tcBorders>
+              <w:left w:val="nil"/>
+              <w:right w:val="nil"/>
+              <w:top w:val="nil"/>
+              <w:bottom w:val="single" w:sz="4" w:color="D9E1E8"/>
+            </w:tcBorders>
+            <w:vAlign w:val="center"/>
+          </w:tcPr>
+          <w:p>
+            <w:pPr>
+              <w:pStyle w:val="Compact"/>
+              <w:spacing w:before="0" w:after="20" w:line="240" w:lineRule="auto"/>
+              <w:jc w:val="center"/>
+              <w:suppressAutoHyphens/>
+              <w:keepNext w:val="0"/>
+              <w:keepLines/>
+              <w:widowControl w:val="1"/>
+            </w:pPr>
+            <w:r>
+              <w:rPr>
+                <w:rFonts w:ascii="Times New Roman" w:hAnsi="Times New Roman"/>
+                <w:sz w:val="18"/>
+              </w:rPr>
+              <w:t xml:space="preserve">GPT-4o-mini (SDPD-seeded cases)</w:t>
+            </w:r>
+          </w:p>
+        </w:tc>
+        <w:tc>
+          <w:tcPr>
+            <w:tcBorders>
+              <w:left w:val="nil"/>
+              <w:right w:val="nil"/>
+              <w:top w:val="nil"/>
+              <w:bottom w:val="single" w:sz="4" w:color="D9E1E8"/>
+            </w:tcBorders>
+            <w:vAlign w:val="center"/>
+          </w:tcPr>
+          <w:p>
+            <w:pPr>
+              <w:pStyle w:val="Compact"/>
+              <w:spacing w:before="0" w:after="20" w:line="240" w:lineRule="auto"/>
+              <w:jc w:val="center"/>
+              <w:suppressAutoHyphens/>
+              <w:keepNext w:val="0"/>
+              <w:keepLines/>
+              <w:widowControl w:val="1"/>
+            </w:pPr>
+            <w:r>
+              <w:rPr>
+                <w:rFonts w:ascii="Times New Roman" w:hAnsi="Times New Roman"/>
+                <w:sz w:val="18"/>
+              </w:rPr>
+              <w:t xml:space="preserve">LLM questioning benchmark (no trained classifier)</w:t>
+            </w:r>
+          </w:p>
+        </w:tc>
+        <w:tc>
+          <w:tcPr>
+            <w:tcBorders>
+              <w:left w:val="nil"/>
+              <w:right w:val="nil"/>
+              <w:top w:val="nil"/>
+              <w:bottom w:val="single" w:sz="4" w:color="D9E1E8"/>
+            </w:tcBorders>
+            <w:vAlign w:val="center"/>
+          </w:tcPr>
+          <w:p>
+            <w:pPr>
+              <w:pStyle w:val="Compact"/>
+              <w:spacing w:before="0" w:after="20" w:line="240" w:lineRule="auto"/>
+              <w:jc w:val="center"/>
+              <w:suppressAutoHyphens/>
+              <w:keepNext w:val="0"/>
+              <w:keepLines/>
+              <w:widowControl w:val="1"/>
+            </w:pPr>
+            <w:r>
+              <w:rPr>
+                <w:rFonts w:ascii="Times New Roman" w:hAnsi="Times New Roman"/>
+                <w:sz w:val="18"/>
+              </w:rPr>
+              <w:t xml:space="preserve">n/a (benchmark)</w:t>
+            </w:r>
+          </w:p>
+        </w:tc>
+        <w:tc>
+          <w:tcPr>
+            <w:tcBorders>
+              <w:left w:val="nil"/>
+              <w:right w:val="nil"/>
+              <w:top w:val="nil"/>
+              <w:bottom w:val="single" w:sz="4" w:color="D9E1E8"/>
+            </w:tcBorders>
+            <w:vAlign w:val="center"/>
+          </w:tcPr>
+          <w:p>
+            <w:pPr>
+              <w:pStyle w:val="Compact"/>
+              <w:spacing w:before="0" w:after="20" w:line="240" w:lineRule="auto"/>
+              <w:jc w:val="center"/>
+              <w:suppressAutoHyphens/>
+              <w:keepNext w:val="0"/>
+              <w:keepLines/>
+              <w:widowControl w:val="1"/>
+            </w:pPr>
+            <w:r>
+              <w:rPr>
+                <w:rFonts w:ascii="Times New Roman" w:hAnsi="Times New Roman"/>
+                <w:i/>
+                <w:iCs/>
+                <w:sz w:val="18"/>
+              </w:rPr>
+              <w:t xml:space="preserve">S→S</w:t>
+            </w:r>
+          </w:p>
+        </w:tc>
+        <w:tc>
+          <w:tcPr>
+            <w:tcBorders>
+              <w:left w:val="nil"/>
+              <w:right w:val="nil"/>
+              <w:top w:val="nil"/>
+              <w:bottom w:val="single" w:sz="4" w:color="D9E1E8"/>
+            </w:tcBorders>
+            <w:vAlign w:val="center"/>
+          </w:tcPr>
+          <w:p>
+            <w:pPr>
+              <w:pStyle w:val="Compact"/>
+              <w:spacing w:before="0" w:after="20" w:line="240" w:lineRule="auto"/>
+              <w:jc w:val="center"/>
+              <w:suppressAutoHyphens/>
+              <w:keepNext w:val="0"/>
+              <w:keepLines/>
+              <w:widowControl w:val="1"/>
+            </w:pPr>
+            <w:r>
+              <w:rPr>
+                <w:rFonts w:ascii="Times New Roman" w:hAnsi="Times New Roman"/>
+                <w:sz w:val="18"/>
+              </w:rPr>
+              <w:t xml:space="preserve">data + reproduce.py (metric re-eval)</w:t>
+            </w:r>
+          </w:p>
+        </w:tc>
+      </w:tr>
+      <w:tr>
+        <w:tc>
+          <w:tcPr>
+            <w:tcBorders>
+              <w:left w:val="nil"/>
+              <w:right w:val="nil"/>
+              <w:top w:val="nil"/>
+              <w:bottom w:val="single" w:sz="4" w:color="D9E1E8"/>
+            </w:tcBorders>
+            <w:vAlign w:val="center"/>
+          </w:tcPr>
+          <w:p>
+            <w:pPr>
+              <w:pStyle w:val="Compact"/>
+              <w:spacing w:before="0" w:after="20" w:line="240" w:lineRule="auto"/>
+              <w:jc w:val="center"/>
+              <w:suppressAutoHyphens/>
+              <w:keepNext w:val="0"/>
+              <w:keepLines/>
+              <w:widowControl w:val="1"/>
+            </w:pPr>
+            <w:r>
+              <w:rPr>
+                <w:rFonts w:ascii="Times New Roman" w:hAnsi="Times New Roman"/>
+                <w:sz w:val="18"/>
+              </w:rPr>
+              <w:t xml:space="preserve">2</w:t>
+            </w:r>
+          </w:p>
+        </w:tc>
+        <w:tc>
+          <w:tcPr>
+            <w:tcBorders>
+              <w:left w:val="nil"/>
+              <w:right w:val="nil"/>
+              <w:top w:val="nil"/>
+              <w:bottom w:val="single" w:sz="4" w:color="D9E1E8"/>
+            </w:tcBorders>
+            <w:vAlign w:val="center"/>
+          </w:tcPr>
+          <w:p>
+            <w:pPr>
+              <w:pStyle w:val="Compact"/>
+              <w:spacing w:before="0" w:after="20" w:line="240" w:lineRule="auto"/>
+              <w:jc w:val="center"/>
+              <w:suppressAutoHyphens/>
+              <w:keepNext w:val="0"/>
+              <w:keepLines/>
+              <w:widowControl w:val="1"/>
+            </w:pPr>
+            <w:r>
+              <w:rPr>
+                <w:rFonts w:ascii="Times New Roman" w:hAnsi="Times New Roman"/>
+                <w:sz w:val="18"/>
+              </w:rPr>
+              <w:t xml:space="preserve">Diagnosis from noisy self-descriptions (3.1.1)</w:t>
+            </w:r>
+          </w:p>
+        </w:tc>
+        <w:tc>
+          <w:tcPr>
+            <w:tcBorders>
+              <w:left w:val="nil"/>
+              <w:right w:val="nil"/>
+              <w:top w:val="nil"/>
+              <w:bottom w:val="single" w:sz="4" w:color="D9E1E8"/>
+            </w:tcBorders>
+            <w:vAlign w:val="center"/>
+          </w:tcPr>
+          <w:p>
+            <w:pPr>
+              <w:pStyle w:val="Compact"/>
+              <w:spacing w:before="0" w:after="20" w:line="240" w:lineRule="auto"/>
+              <w:jc w:val="center"/>
+              <w:suppressAutoHyphens/>
+              <w:keepNext w:val="0"/>
+              <w:keepLines/>
+              <w:widowControl w:val="1"/>
+            </w:pPr>
+            <w:r>
+              <w:rPr>
+                <w:rFonts w:ascii="Times New Roman" w:hAnsi="Times New Roman"/>
+                <w:sz w:val="18"/>
+              </w:rPr>
+              <w:t xml:space="preserve">Llama-3.1-8B (noise rewrite)</w:t>
+            </w:r>
+          </w:p>
+        </w:tc>
+        <w:tc>
+          <w:tcPr>
+            <w:tcBorders>
+              <w:left w:val="nil"/>
+              <w:right w:val="nil"/>
+              <w:top w:val="nil"/>
+              <w:bottom w:val="single" w:sz="4" w:color="D9E1E8"/>
+            </w:tcBorders>
+            <w:vAlign w:val="center"/>
+          </w:tcPr>
+          <w:p>
+            <w:pPr>
+              <w:pStyle w:val="Compact"/>
+              <w:spacing w:before="0" w:after="20" w:line="240" w:lineRule="auto"/>
+              <w:jc w:val="center"/>
+              <w:suppressAutoHyphens/>
+              <w:keepNext w:val="0"/>
+              <w:keepLines/>
+              <w:widowControl w:val="1"/>
+            </w:pPr>
+            <w:r>
+              <w:rPr>
+                <w:rFonts w:ascii="Times New Roman" w:hAnsi="Times New Roman"/>
+                <w:sz w:val="18"/>
+              </w:rPr>
+              <w:t xml:space="preserve">FLAN-T5 (vs BERT, ClinicalBERT, NB)</w:t>
+            </w:r>
+          </w:p>
+        </w:tc>
+        <w:tc>
+          <w:tcPr>
+            <w:tcBorders>
+              <w:left w:val="nil"/>
+              <w:right w:val="nil"/>
+              <w:top w:val="nil"/>
+              <w:bottom w:val="single" w:sz="4" w:color="D9E1E8"/>
+            </w:tcBorders>
+            <w:vAlign w:val="center"/>
+          </w:tcPr>
+          <w:p>
+            <w:pPr>
+              <w:pStyle w:val="Compact"/>
+              <w:spacing w:before="0" w:after="20" w:line="240" w:lineRule="auto"/>
+              <w:jc w:val="center"/>
+              <w:suppressAutoHyphens/>
+              <w:keepNext w:val="0"/>
+              <w:keepLines/>
+              <w:widowControl w:val="1"/>
+            </w:pPr>
+            <w:r>
+              <w:rPr>
+                <w:rFonts w:ascii="Times New Roman" w:hAnsi="Times New Roman"/>
+                <w:sz w:val="18"/>
+              </w:rPr>
+              <w:t xml:space="preserve">80/20, seed 42</w:t>
+            </w:r>
+          </w:p>
+        </w:tc>
+        <w:tc>
+          <w:tcPr>
+            <w:tcBorders>
+              <w:left w:val="nil"/>
+              <w:right w:val="nil"/>
+              <w:top w:val="nil"/>
+              <w:bottom w:val="single" w:sz="4" w:color="D9E1E8"/>
+            </w:tcBorders>
+            <w:vAlign w:val="center"/>
+          </w:tcPr>
+          <w:p>
+            <w:pPr>
+              <w:pStyle w:val="Compact"/>
+              <w:spacing w:before="0" w:after="20" w:line="240" w:lineRule="auto"/>
+              <w:jc w:val="center"/>
+              <w:suppressAutoHyphens/>
+              <w:keepNext w:val="0"/>
+              <w:keepLines/>
+              <w:widowControl w:val="1"/>
+            </w:pPr>
+            <w:r>
+              <w:rPr>
+                <w:rFonts w:ascii="Times New Roman" w:hAnsi="Times New Roman"/>
+                <w:i/>
+                <w:iCs/>
+                <w:sz w:val="18"/>
+              </w:rPr>
+              <w:t xml:space="preserve">S→S</w:t>
+            </w:r>
+          </w:p>
+        </w:tc>
+        <w:tc>
+          <w:tcPr>
+            <w:tcBorders>
+              <w:left w:val="nil"/>
+              <w:right w:val="nil"/>
+              <w:top w:val="nil"/>
+              <w:bottom w:val="single" w:sz="4" w:color="D9E1E8"/>
+            </w:tcBorders>
+            <w:vAlign w:val="center"/>
+          </w:tcPr>
+          <w:p>
+            <w:pPr>
+              <w:pStyle w:val="Compact"/>
+              <w:spacing w:before="0" w:after="20" w:line="240" w:lineRule="auto"/>
+              <w:jc w:val="center"/>
+              <w:suppressAutoHyphens/>
+              <w:keepNext w:val="0"/>
+              <w:keepLines/>
+              <w:widowControl w:val="1"/>
+            </w:pPr>
+            <w:r>
+              <w:rPr>
+                <w:rFonts w:ascii="Times New Roman" w:hAnsi="Times New Roman"/>
+                <w:sz w:val="18"/>
+              </w:rPr>
+              <w:t xml:space="preserve">full data + reproduce.py</w:t>
+            </w:r>
+          </w:p>
+        </w:tc>
+      </w:tr>
+      <w:tr>
+        <w:tc>
+          <w:tcPr>
+            <w:tcBorders>
+              <w:left w:val="nil"/>
+              <w:right w:val="nil"/>
+              <w:top w:val="nil"/>
+              <w:bottom w:val="single" w:sz="4" w:color="D9E1E8"/>
+            </w:tcBorders>
+            <w:vAlign w:val="center"/>
+          </w:tcPr>
+          <w:p>
+            <w:pPr>
+              <w:pStyle w:val="Compact"/>
+              <w:spacing w:before="0" w:after="20" w:line="240" w:lineRule="auto"/>
+              <w:jc w:val="center"/>
+              <w:suppressAutoHyphens/>
+              <w:keepNext w:val="0"/>
+              <w:keepLines/>
+              <w:widowControl w:val="1"/>
+            </w:pPr>
+            <w:r>
+              <w:rPr>
+                <w:rFonts w:ascii="Times New Roman" w:hAnsi="Times New Roman"/>
+                <w:sz w:val="18"/>
+              </w:rPr>
+              <w:t xml:space="preserve">3</w:t>
+            </w:r>
+          </w:p>
+        </w:tc>
+        <w:tc>
+          <w:tcPr>
+            <w:tcBorders>
+              <w:left w:val="nil"/>
+              <w:right w:val="nil"/>
+              <w:top w:val="nil"/>
+              <w:bottom w:val="single" w:sz="4" w:color="D9E1E8"/>
+            </w:tcBorders>
+            <w:vAlign w:val="center"/>
+          </w:tcPr>
+          <w:p>
+            <w:pPr>
+              <w:pStyle w:val="Compact"/>
+              <w:spacing w:before="0" w:after="20" w:line="240" w:lineRule="auto"/>
+              <w:jc w:val="center"/>
+              <w:suppressAutoHyphens/>
+              <w:keepNext w:val="0"/>
+              <w:keepLines/>
+              <w:widowControl w:val="1"/>
+            </w:pPr>
+            <w:r>
+              <w:rPr>
+                <w:rFonts w:ascii="Times New Roman" w:hAnsi="Times New Roman"/>
+                <w:sz w:val="18"/>
+              </w:rPr>
+              <w:t xml:space="preserve">Urgency triage from complaints (3.1.3)</w:t>
+            </w:r>
+          </w:p>
+        </w:tc>
+        <w:tc>
+          <w:tcPr>
+            <w:tcBorders>
+              <w:left w:val="nil"/>
+              <w:right w:val="nil"/>
+              <w:top w:val="nil"/>
+              <w:bottom w:val="single" w:sz="4" w:color="D9E1E8"/>
+            </w:tcBorders>
+            <w:vAlign w:val="center"/>
+          </w:tcPr>
+          <w:p>
+            <w:pPr>
+              <w:pStyle w:val="Compact"/>
+              <w:spacing w:before="0" w:after="20" w:line="240" w:lineRule="auto"/>
+              <w:jc w:val="center"/>
+              <w:suppressAutoHyphens/>
+              <w:keepNext w:val="0"/>
+              <w:keepLines/>
+              <w:widowControl w:val="1"/>
+            </w:pPr>
+            <w:r>
+              <w:rPr>
+                <w:rFonts w:ascii="Times New Roman" w:hAnsi="Times New Roman"/>
+                <w:sz w:val="18"/>
+              </w:rPr>
+              <w:t xml:space="preserve">GPT-4 (MIMIC-IV-ED-seeded)</w:t>
+            </w:r>
+          </w:p>
+        </w:tc>
+        <w:tc>
+          <w:tcPr>
+            <w:tcBorders>
+              <w:left w:val="nil"/>
+              <w:right w:val="nil"/>
+              <w:top w:val="nil"/>
+              <w:bottom w:val="single" w:sz="4" w:color="D9E1E8"/>
+            </w:tcBorders>
+            <w:vAlign w:val="center"/>
+          </w:tcPr>
+          <w:p>
+            <w:pPr>
+              <w:pStyle w:val="Compact"/>
+              <w:spacing w:before="0" w:after="20" w:line="240" w:lineRule="auto"/>
+              <w:jc w:val="center"/>
+              <w:suppressAutoHyphens/>
+              <w:keepNext w:val="0"/>
+              <w:keepLines/>
+              <w:widowControl w:val="1"/>
+            </w:pPr>
+            <w:r>
+              <w:rPr>
+                <w:rFonts w:ascii="Times New Roman" w:hAnsi="Times New Roman"/>
+                <w:sz w:val="18"/>
+              </w:rPr>
+              <w:t xml:space="preserve">DistilBERT (vs LR, T5)</w:t>
+            </w:r>
+          </w:p>
+        </w:tc>
+        <w:tc>
+          <w:tcPr>
+            <w:tcBorders>
+              <w:left w:val="nil"/>
+              <w:right w:val="nil"/>
+              <w:top w:val="nil"/>
+              <w:bottom w:val="single" w:sz="4" w:color="D9E1E8"/>
+            </w:tcBorders>
+            <w:vAlign w:val="center"/>
+          </w:tcPr>
+          <w:p>
+            <w:pPr>
+              <w:pStyle w:val="Compact"/>
+              <w:spacing w:before="0" w:after="20" w:line="240" w:lineRule="auto"/>
+              <w:jc w:val="center"/>
+              <w:suppressAutoHyphens/>
+              <w:keepNext w:val="0"/>
+              <w:keepLines/>
+              <w:widowControl w:val="1"/>
+            </w:pPr>
+            <w:r>
+              <w:rPr>
+                <w:rFonts w:ascii="Times New Roman" w:hAnsi="Times New Roman"/>
+                <w:sz w:val="18"/>
+              </w:rPr>
+              <w:t xml:space="preserve">80/20, seed 42</w:t>
+            </w:r>
+          </w:p>
+        </w:tc>
+        <w:tc>
+          <w:tcPr>
+            <w:tcBorders>
+              <w:left w:val="nil"/>
+              <w:right w:val="nil"/>
+              <w:top w:val="nil"/>
+              <w:bottom w:val="single" w:sz="4" w:color="D9E1E8"/>
+            </w:tcBorders>
+            <w:vAlign w:val="center"/>
+          </w:tcPr>
+          <w:p>
+            <w:pPr>
+              <w:pStyle w:val="Compact"/>
+              <w:spacing w:before="0" w:after="20" w:line="240" w:lineRule="auto"/>
+              <w:jc w:val="center"/>
+              <w:suppressAutoHyphens/>
+              <w:keepNext w:val="0"/>
+              <w:keepLines/>
+              <w:widowControl w:val="1"/>
+            </w:pPr>
+            <w:r>
+              <w:rPr>
+                <w:rFonts w:ascii="Times New Roman" w:hAnsi="Times New Roman"/>
+                <w:i/>
+                <w:iCs/>
+                <w:sz w:val="18"/>
+              </w:rPr>
+              <w:t xml:space="preserve">S→S</w:t>
+            </w:r>
+          </w:p>
+        </w:tc>
+        <w:tc>
+          <w:tcPr>
+            <w:tcBorders>
+              <w:left w:val="nil"/>
+              <w:right w:val="nil"/>
+              <w:top w:val="nil"/>
+              <w:bottom w:val="single" w:sz="4" w:color="D9E1E8"/>
+            </w:tcBorders>
+            <w:vAlign w:val="center"/>
+          </w:tcPr>
+          <w:p>
+            <w:pPr>
+              <w:pStyle w:val="Compact"/>
+              <w:spacing w:before="0" w:after="20" w:line="240" w:lineRule="auto"/>
+              <w:jc w:val="center"/>
+              <w:suppressAutoHyphens/>
+              <w:keepNext w:val="0"/>
+              <w:keepLines/>
+              <w:widowControl w:val="1"/>
+            </w:pPr>
+            <w:r>
+              <w:rPr>
+                <w:rFonts w:ascii="Times New Roman" w:hAnsi="Times New Roman"/>
+                <w:sz w:val="18"/>
+              </w:rPr>
+              <w:t xml:space="preserve">sample + reproduce.py</w:t>
+            </w:r>
+          </w:p>
+        </w:tc>
+      </w:tr>
+      <w:tr>
+        <w:tc>
+          <w:tcPr>
+            <w:tcBorders>
+              <w:left w:val="nil"/>
+              <w:right w:val="nil"/>
+              <w:top w:val="nil"/>
+              <w:bottom w:val="single" w:sz="4" w:color="D9E1E8"/>
+            </w:tcBorders>
+            <w:vAlign w:val="center"/>
+          </w:tcPr>
+          <w:p>
+            <w:pPr>
+              <w:pStyle w:val="Compact"/>
+              <w:spacing w:before="0" w:after="20" w:line="240" w:lineRule="auto"/>
+              <w:jc w:val="center"/>
+              <w:suppressAutoHyphens/>
+              <w:keepNext w:val="0"/>
+              <w:keepLines/>
+              <w:widowControl w:val="1"/>
+            </w:pPr>
+            <w:r>
+              <w:rPr>
+                <w:rFonts w:ascii="Times New Roman" w:hAnsi="Times New Roman"/>
+                <w:sz w:val="18"/>
+              </w:rPr>
+              <w:t xml:space="preserve">4</w:t>
+            </w:r>
+          </w:p>
+        </w:tc>
+        <w:tc>
+          <w:tcPr>
+            <w:tcBorders>
+              <w:left w:val="nil"/>
+              <w:right w:val="nil"/>
+              <w:top w:val="nil"/>
+              <w:bottom w:val="single" w:sz="4" w:color="D9E1E8"/>
+            </w:tcBorders>
+            <w:vAlign w:val="center"/>
+          </w:tcPr>
+          <w:p>
+            <w:pPr>
+              <w:pStyle w:val="Compact"/>
+              <w:spacing w:before="0" w:after="20" w:line="240" w:lineRule="auto"/>
+              <w:jc w:val="center"/>
+              <w:suppressAutoHyphens/>
+              <w:keepNext w:val="0"/>
+              <w:keepLines/>
+              <w:widowControl w:val="1"/>
+            </w:pPr>
+            <w:r>
+              <w:rPr>
+                <w:rFonts w:ascii="Times New Roman" w:hAnsi="Times New Roman"/>
+                <w:sz w:val="18"/>
+              </w:rPr>
+              <w:t xml:space="preserve">Administrative portal-message triage (3.2.1)</w:t>
+            </w:r>
+          </w:p>
+        </w:tc>
+        <w:tc>
+          <w:tcPr>
+            <w:tcBorders>
+              <w:left w:val="nil"/>
+              <w:right w:val="nil"/>
+              <w:top w:val="nil"/>
+              <w:bottom w:val="single" w:sz="4" w:color="D9E1E8"/>
+            </w:tcBorders>
+            <w:vAlign w:val="center"/>
+          </w:tcPr>
+          <w:p>
+            <w:pPr>
+              <w:pStyle w:val="Compact"/>
+              <w:spacing w:before="0" w:after="20" w:line="240" w:lineRule="auto"/>
+              <w:jc w:val="center"/>
+              <w:suppressAutoHyphens/>
+              <w:keepNext w:val="0"/>
+              <w:keepLines/>
+              <w:widowControl w:val="1"/>
+            </w:pPr>
+            <w:r>
+              <w:rPr>
+                <w:rFonts w:ascii="Times New Roman" w:hAnsi="Times New Roman"/>
+                <w:sz w:val="18"/>
+              </w:rPr>
+              <w:t xml:space="preserve">Qwen2.5-0.5B (local)</w:t>
+            </w:r>
+          </w:p>
+        </w:tc>
+        <w:tc>
+          <w:tcPr>
+            <w:tcBorders>
+              <w:left w:val="nil"/>
+              <w:right w:val="nil"/>
+              <w:top w:val="nil"/>
+              <w:bottom w:val="single" w:sz="4" w:color="D9E1E8"/>
+            </w:tcBorders>
+            <w:vAlign w:val="center"/>
+          </w:tcPr>
+          <w:p>
+            <w:pPr>
+              <w:pStyle w:val="Compact"/>
+              <w:spacing w:before="0" w:after="20" w:line="240" w:lineRule="auto"/>
+              <w:jc w:val="center"/>
+              <w:suppressAutoHyphens/>
+              <w:keepNext w:val="0"/>
+              <w:keepLines/>
+              <w:widowControl w:val="1"/>
+            </w:pPr>
+            <w:r>
+              <w:rPr>
+                <w:rFonts w:ascii="Times New Roman" w:hAnsi="Times New Roman"/>
+                <w:sz w:val="18"/>
+              </w:rPr>
+              <w:t xml:space="preserve">DistilBERT heads</w:t>
+            </w:r>
+          </w:p>
+        </w:tc>
+        <w:tc>
+          <w:tcPr>
+            <w:tcBorders>
+              <w:left w:val="nil"/>
+              <w:right w:val="nil"/>
+              <w:top w:val="nil"/>
+              <w:bottom w:val="single" w:sz="4" w:color="D9E1E8"/>
+            </w:tcBorders>
+            <w:vAlign w:val="center"/>
+          </w:tcPr>
+          <w:p>
+            <w:pPr>
+              <w:pStyle w:val="Compact"/>
+              <w:spacing w:before="0" w:after="20" w:line="240" w:lineRule="auto"/>
+              <w:jc w:val="center"/>
+              <w:suppressAutoHyphens/>
+              <w:keepNext w:val="0"/>
+              <w:keepLines/>
+              <w:widowControl w:val="1"/>
+            </w:pPr>
+            <w:r>
+              <w:rPr>
+                <w:rFonts w:ascii="Times New Roman" w:hAnsi="Times New Roman"/>
+                <w:sz w:val="18"/>
+              </w:rPr>
+              <w:t xml:space="preserve">80/20, seed 42</w:t>
+            </w:r>
+          </w:p>
+        </w:tc>
+        <w:tc>
+          <w:tcPr>
+            <w:tcBorders>
+              <w:left w:val="nil"/>
+              <w:right w:val="nil"/>
+              <w:top w:val="nil"/>
+              <w:bottom w:val="single" w:sz="4" w:color="D9E1E8"/>
+            </w:tcBorders>
+            <w:vAlign w:val="center"/>
+          </w:tcPr>
+          <w:p>
+            <w:pPr>
+              <w:pStyle w:val="Compact"/>
+              <w:spacing w:before="0" w:after="20" w:line="240" w:lineRule="auto"/>
+              <w:jc w:val="center"/>
+              <w:suppressAutoHyphens/>
+              <w:keepNext w:val="0"/>
+              <w:keepLines/>
+              <w:widowControl w:val="1"/>
+            </w:pPr>
+            <w:r>
+              <w:rPr>
+                <w:rFonts w:ascii="Times New Roman" w:hAnsi="Times New Roman"/>
+                <w:i/>
+                <w:iCs/>
+                <w:sz w:val="18"/>
+              </w:rPr>
+              <w:t xml:space="preserve">S→S</w:t>
+            </w:r>
+          </w:p>
+        </w:tc>
+        <w:tc>
+          <w:tcPr>
+            <w:tcBorders>
+              <w:left w:val="nil"/>
+              <w:right w:val="nil"/>
+              <w:top w:val="nil"/>
+              <w:bottom w:val="single" w:sz="4" w:color="D9E1E8"/>
+            </w:tcBorders>
+            <w:vAlign w:val="center"/>
+          </w:tcPr>
+          <w:p>
+            <w:pPr>
+              <w:pStyle w:val="Compact"/>
+              <w:spacing w:before="0" w:after="20" w:line="240" w:lineRule="auto"/>
+              <w:jc w:val="center"/>
+              <w:suppressAutoHyphens/>
+              <w:keepNext w:val="0"/>
+              <w:keepLines/>
+              <w:widowControl w:val="1"/>
+            </w:pPr>
+            <w:r>
+              <w:rPr>
+                <w:rFonts w:ascii="Times New Roman" w:hAnsi="Times New Roman"/>
+                <w:sz w:val="18"/>
+              </w:rPr>
+              <w:t xml:space="preserve">sample + reproduce.py</w:t>
+            </w:r>
+          </w:p>
+        </w:tc>
+      </w:tr>
+      <w:tr>
+        <w:tc>
+          <w:tcPr>
+            <w:tcBorders>
+              <w:left w:val="nil"/>
+              <w:right w:val="nil"/>
+              <w:top w:val="nil"/>
+              <w:bottom w:val="single" w:sz="4" w:color="D9E1E8"/>
+            </w:tcBorders>
+            <w:vAlign w:val="center"/>
+          </w:tcPr>
+          <w:p>
+            <w:pPr>
+              <w:pStyle w:val="Compact"/>
+              <w:spacing w:before="0" w:after="20" w:line="240" w:lineRule="auto"/>
+              <w:jc w:val="center"/>
+              <w:suppressAutoHyphens/>
+              <w:keepNext w:val="0"/>
+              <w:keepLines/>
+              <w:widowControl w:val="1"/>
+            </w:pPr>
+            <w:r>
+              <w:rPr>
+                <w:rFonts w:ascii="Times New Roman" w:hAnsi="Times New Roman"/>
+                <w:sz w:val="18"/>
+              </w:rPr>
+              <w:t xml:space="preserve">5</w:t>
+            </w:r>
+          </w:p>
+        </w:tc>
+        <w:tc>
+          <w:tcPr>
+            <w:tcBorders>
+              <w:left w:val="nil"/>
+              <w:right w:val="nil"/>
+              <w:top w:val="nil"/>
+              <w:bottom w:val="single" w:sz="4" w:color="D9E1E8"/>
+            </w:tcBorders>
+            <w:vAlign w:val="center"/>
+          </w:tcPr>
+          <w:p>
+            <w:pPr>
+              <w:pStyle w:val="Compact"/>
+              <w:spacing w:before="0" w:after="20" w:line="240" w:lineRule="auto"/>
+              <w:jc w:val="center"/>
+              <w:suppressAutoHyphens/>
+              <w:keepNext w:val="0"/>
+              <w:keepLines/>
+              <w:widowControl w:val="1"/>
+            </w:pPr>
+            <w:r>
+              <w:rPr>
+                <w:rFonts w:ascii="Times New Roman" w:hAnsi="Times New Roman"/>
+                <w:sz w:val="18"/>
+              </w:rPr>
+              <w:t xml:space="preserve">Postpartum severity triage (3.2.2)</w:t>
+            </w:r>
+          </w:p>
+        </w:tc>
+        <w:tc>
+          <w:tcPr>
+            <w:tcBorders>
+              <w:left w:val="nil"/>
+              <w:right w:val="nil"/>
+              <w:top w:val="nil"/>
+              <w:bottom w:val="single" w:sz="4" w:color="D9E1E8"/>
+            </w:tcBorders>
+            <w:vAlign w:val="center"/>
+          </w:tcPr>
+          <w:p>
+            <w:pPr>
+              <w:pStyle w:val="Compact"/>
+              <w:spacing w:before="0" w:after="20" w:line="240" w:lineRule="auto"/>
+              <w:jc w:val="center"/>
+              <w:suppressAutoHyphens/>
+              <w:keepNext w:val="0"/>
+              <w:keepLines/>
+              <w:widowControl w:val="1"/>
+            </w:pPr>
+            <w:r>
+              <w:rPr>
+                <w:rFonts w:ascii="Times New Roman" w:hAnsi="Times New Roman"/>
+                <w:sz w:val="18"/>
+              </w:rPr>
+              <w:t xml:space="preserve">GPT-4o-mini</w:t>
+            </w:r>
+          </w:p>
+        </w:tc>
+        <w:tc>
+          <w:tcPr>
+            <w:tcBorders>
+              <w:left w:val="nil"/>
+              <w:right w:val="nil"/>
+              <w:top w:val="nil"/>
+              <w:bottom w:val="single" w:sz="4" w:color="D9E1E8"/>
+            </w:tcBorders>
+            <w:vAlign w:val="center"/>
+          </w:tcPr>
+          <w:p>
+            <w:pPr>
+              <w:pStyle w:val="Compact"/>
+              <w:spacing w:before="0" w:after="20" w:line="240" w:lineRule="auto"/>
+              <w:jc w:val="center"/>
+              <w:suppressAutoHyphens/>
+              <w:keepNext w:val="0"/>
+              <w:keepLines/>
+              <w:widowControl w:val="1"/>
+            </w:pPr>
+            <w:r>
+              <w:rPr>
+                <w:rFonts w:ascii="Times New Roman" w:hAnsi="Times New Roman"/>
+                <w:sz w:val="18"/>
+              </w:rPr>
+              <w:t xml:space="preserve">BioBERT cascade (vs Bi-LSTM)</w:t>
+            </w:r>
+          </w:p>
+        </w:tc>
+        <w:tc>
+          <w:tcPr>
+            <w:tcBorders>
+              <w:left w:val="nil"/>
+              <w:right w:val="nil"/>
+              <w:top w:val="nil"/>
+              <w:bottom w:val="single" w:sz="4" w:color="D9E1E8"/>
+            </w:tcBorders>
+            <w:vAlign w:val="center"/>
+          </w:tcPr>
+          <w:p>
+            <w:pPr>
+              <w:pStyle w:val="Compact"/>
+              <w:spacing w:before="0" w:after="20" w:line="240" w:lineRule="auto"/>
+              <w:jc w:val="center"/>
+              <w:suppressAutoHyphens/>
+              <w:keepNext w:val="0"/>
+              <w:keepLines/>
+              <w:widowControl w:val="1"/>
+            </w:pPr>
+            <w:r>
+              <w:rPr>
+                <w:rFonts w:ascii="Times New Roman" w:hAnsi="Times New Roman"/>
+                <w:sz w:val="18"/>
+              </w:rPr>
+              <w:t xml:space="preserve">80/20, seed 12345</w:t>
+            </w:r>
+          </w:p>
+        </w:tc>
+        <w:tc>
+          <w:tcPr>
+            <w:tcBorders>
+              <w:left w:val="nil"/>
+              <w:right w:val="nil"/>
+              <w:top w:val="nil"/>
+              <w:bottom w:val="single" w:sz="4" w:color="D9E1E8"/>
+            </w:tcBorders>
+            <w:vAlign w:val="center"/>
+          </w:tcPr>
+          <w:p>
+            <w:pPr>
+              <w:pStyle w:val="Compact"/>
+              <w:spacing w:before="0" w:after="20" w:line="240" w:lineRule="auto"/>
+              <w:jc w:val="center"/>
+              <w:suppressAutoHyphens/>
+              <w:keepNext w:val="0"/>
+              <w:keepLines/>
+              <w:widowControl w:val="1"/>
+            </w:pPr>
+            <w:r>
+              <w:rPr>
+                <w:rFonts w:ascii="Times New Roman" w:hAnsi="Times New Roman"/>
+                <w:i/>
+                <w:iCs/>
+                <w:sz w:val="18"/>
+              </w:rPr>
+              <w:t xml:space="preserve">S→S</w:t>
+            </w:r>
+          </w:p>
+        </w:tc>
+        <w:tc>
+          <w:tcPr>
+            <w:tcBorders>
+              <w:left w:val="nil"/>
+              <w:right w:val="nil"/>
+              <w:top w:val="nil"/>
+              <w:bottom w:val="single" w:sz="4" w:color="D9E1E8"/>
+            </w:tcBorders>
+            <w:vAlign w:val="center"/>
+          </w:tcPr>
+          <w:p>
+            <w:pPr>
+              <w:pStyle w:val="Compact"/>
+              <w:spacing w:before="0" w:after="20" w:line="240" w:lineRule="auto"/>
+              <w:jc w:val="center"/>
+              <w:suppressAutoHyphens/>
+              <w:keepNext w:val="0"/>
+              <w:keepLines/>
+              <w:widowControl w:val="1"/>
+            </w:pPr>
+            <w:r>
+              <w:rPr>
+                <w:rFonts w:ascii="Times New Roman" w:hAnsi="Times New Roman"/>
+                <w:sz w:val="18"/>
+              </w:rPr>
+              <w:t xml:space="preserve">full data + reproduce.py</w:t>
+            </w:r>
+          </w:p>
+        </w:tc>
+      </w:tr>
+      <w:tr>
+        <w:tc>
+          <w:tcPr>
+            <w:tcBorders>
+              <w:left w:val="nil"/>
+              <w:right w:val="nil"/>
+              <w:top w:val="nil"/>
+              <w:bottom w:val="single" w:sz="4" w:color="D9E1E8"/>
+            </w:tcBorders>
+            <w:vAlign w:val="center"/>
+          </w:tcPr>
+          <w:p>
+            <w:pPr>
+              <w:pStyle w:val="Compact"/>
+              <w:spacing w:before="0" w:after="20" w:line="240" w:lineRule="auto"/>
+              <w:jc w:val="center"/>
+              <w:suppressAutoHyphens/>
+              <w:keepNext w:val="0"/>
+              <w:keepLines/>
+              <w:widowControl w:val="1"/>
+            </w:pPr>
+            <w:r>
+              <w:rPr>
+                <w:rFonts w:ascii="Times New Roman" w:hAnsi="Times New Roman"/>
+                <w:sz w:val="18"/>
+              </w:rPr>
+              <w:t xml:space="preserve">6</w:t>
+            </w:r>
+          </w:p>
+        </w:tc>
+        <w:tc>
+          <w:tcPr>
+            <w:tcBorders>
+              <w:left w:val="nil"/>
+              <w:right w:val="nil"/>
+              <w:top w:val="nil"/>
+              <w:bottom w:val="single" w:sz="4" w:color="D9E1E8"/>
+            </w:tcBorders>
+            <w:vAlign w:val="center"/>
+          </w:tcPr>
+          <w:p>
+            <w:pPr>
+              <w:pStyle w:val="Compact"/>
+              <w:spacing w:before="0" w:after="20" w:line="240" w:lineRule="auto"/>
+              <w:jc w:val="center"/>
+              <w:suppressAutoHyphens/>
+              <w:keepNext w:val="0"/>
+              <w:keepLines/>
+              <w:widowControl w:val="1"/>
+            </w:pPr>
+            <w:r>
+              <w:rPr>
+                <w:rFonts w:ascii="Times New Roman" w:hAnsi="Times New Roman"/>
+                <w:sz w:val="18"/>
+              </w:rPr>
+              <w:t xml:space="preserve">Oncology distress classification (3.2.3)</w:t>
+            </w:r>
+          </w:p>
+        </w:tc>
+        <w:tc>
+          <w:tcPr>
+            <w:tcBorders>
+              <w:left w:val="nil"/>
+              <w:right w:val="nil"/>
+              <w:top w:val="nil"/>
+              <w:bottom w:val="single" w:sz="4" w:color="D9E1E8"/>
+            </w:tcBorders>
+            <w:vAlign w:val="center"/>
+          </w:tcPr>
+          <w:p>
+            <w:pPr>
+              <w:pStyle w:val="Compact"/>
+              <w:spacing w:before="0" w:after="20" w:line="240" w:lineRule="auto"/>
+              <w:jc w:val="center"/>
+              <w:suppressAutoHyphens/>
+              <w:keepNext w:val="0"/>
+              <w:keepLines/>
+              <w:widowControl w:val="1"/>
+            </w:pPr>
+            <w:r>
+              <w:rPr>
+                <w:rFonts w:ascii="Times New Roman" w:hAnsi="Times New Roman"/>
+                <w:sz w:val="18"/>
+              </w:rPr>
+              <w:t xml:space="preserve">Gemma2-27B (local)</w:t>
+            </w:r>
+          </w:p>
+        </w:tc>
+        <w:tc>
+          <w:tcPr>
+            <w:tcBorders>
+              <w:left w:val="nil"/>
+              <w:right w:val="nil"/>
+              <w:top w:val="nil"/>
+              <w:bottom w:val="single" w:sz="4" w:color="D9E1E8"/>
+            </w:tcBorders>
+            <w:vAlign w:val="center"/>
+          </w:tcPr>
+          <w:p>
+            <w:pPr>
+              <w:pStyle w:val="Compact"/>
+              <w:spacing w:before="0" w:after="20" w:line="240" w:lineRule="auto"/>
+              <w:jc w:val="center"/>
+              <w:suppressAutoHyphens/>
+              <w:keepNext w:val="0"/>
+              <w:keepLines/>
+              <w:widowControl w:val="1"/>
+            </w:pPr>
+            <w:r>
+              <w:rPr>
+                <w:rFonts w:ascii="Times New Roman" w:hAnsi="Times New Roman"/>
+                <w:sz w:val="18"/>
+              </w:rPr>
+              <w:t xml:space="preserve">DistilBERT (vs TF-IDF+LR)</w:t>
+            </w:r>
+          </w:p>
+        </w:tc>
+        <w:tc>
+          <w:tcPr>
+            <w:tcBorders>
+              <w:left w:val="nil"/>
+              <w:right w:val="nil"/>
+              <w:top w:val="nil"/>
+              <w:bottom w:val="single" w:sz="4" w:color="D9E1E8"/>
+            </w:tcBorders>
+            <w:vAlign w:val="center"/>
+          </w:tcPr>
+          <w:p>
+            <w:pPr>
+              <w:pStyle w:val="Compact"/>
+              <w:spacing w:before="0" w:after="20" w:line="240" w:lineRule="auto"/>
+              <w:jc w:val="center"/>
+              <w:suppressAutoHyphens/>
+              <w:keepNext w:val="0"/>
+              <w:keepLines/>
+              <w:widowControl w:val="1"/>
+            </w:pPr>
+            <w:r>
+              <w:rPr>
+                <w:rFonts w:ascii="Times New Roman" w:hAnsi="Times New Roman"/>
+                <w:sz w:val="18"/>
+              </w:rPr>
+              <w:t xml:space="preserve">fixed shipped split, seed 42</w:t>
+            </w:r>
+          </w:p>
+        </w:tc>
+        <w:tc>
+          <w:tcPr>
+            <w:tcBorders>
+              <w:left w:val="nil"/>
+              <w:right w:val="nil"/>
+              <w:top w:val="nil"/>
+              <w:bottom w:val="single" w:sz="4" w:color="D9E1E8"/>
+            </w:tcBorders>
+            <w:vAlign w:val="center"/>
+          </w:tcPr>
+          <w:p>
+            <w:pPr>
+              <w:pStyle w:val="Compact"/>
+              <w:spacing w:before="0" w:after="20" w:line="240" w:lineRule="auto"/>
+              <w:jc w:val="center"/>
+              <w:suppressAutoHyphens/>
+              <w:keepNext w:val="0"/>
+              <w:keepLines/>
+              <w:widowControl w:val="1"/>
+            </w:pPr>
+            <w:r>
+              <w:rPr>
+                <w:rFonts w:ascii="Times New Roman" w:hAnsi="Times New Roman"/>
+                <w:i/>
+                <w:iCs/>
+                <w:sz w:val="18"/>
+              </w:rPr>
+              <w:t xml:space="preserve">S→S</w:t>
+            </w:r>
+          </w:p>
+        </w:tc>
+        <w:tc>
+          <w:tcPr>
+            <w:tcBorders>
+              <w:left w:val="nil"/>
+              <w:right w:val="nil"/>
+              <w:top w:val="nil"/>
+              <w:bottom w:val="single" w:sz="4" w:color="D9E1E8"/>
+            </w:tcBorders>
+            <w:vAlign w:val="center"/>
+          </w:tcPr>
+          <w:p>
+            <w:pPr>
+              <w:pStyle w:val="Compact"/>
+              <w:spacing w:before="0" w:after="20" w:line="240" w:lineRule="auto"/>
+              <w:jc w:val="center"/>
+              <w:suppressAutoHyphens/>
+              <w:keepNext w:val="0"/>
+              <w:keepLines/>
+              <w:widowControl w:val="1"/>
+            </w:pPr>
+            <w:r>
+              <w:rPr>
+                <w:rFonts w:ascii="Times New Roman" w:hAnsi="Times New Roman"/>
+                <w:sz w:val="18"/>
+              </w:rPr>
+              <w:t xml:space="preserve">sample + reproduce.py</w:t>
+            </w:r>
+          </w:p>
+        </w:tc>
+      </w:tr>
+      <w:tr>
+        <w:tc>
+          <w:tcPr>
+            <w:tcBorders>
+              <w:left w:val="nil"/>
+              <w:right w:val="nil"/>
+              <w:top w:val="nil"/>
+              <w:bottom w:val="single" w:sz="4" w:color="D9E1E8"/>
+            </w:tcBorders>
+            <w:vAlign w:val="center"/>
+          </w:tcPr>
+          <w:p>
+            <w:pPr>
+              <w:pStyle w:val="Compact"/>
+              <w:spacing w:before="0" w:after="20" w:line="240" w:lineRule="auto"/>
+              <w:jc w:val="center"/>
+              <w:suppressAutoHyphens/>
+              <w:keepNext w:val="0"/>
+              <w:keepLines/>
+              <w:widowControl w:val="1"/>
+            </w:pPr>
+            <w:r>
+              <w:rPr>
+                <w:rFonts w:ascii="Times New Roman" w:hAnsi="Times New Roman"/>
+                <w:sz w:val="18"/>
+              </w:rPr>
+              <w:t xml:space="preserve">7</w:t>
+            </w:r>
+          </w:p>
+        </w:tc>
+        <w:tc>
+          <w:tcPr>
+            <w:tcBorders>
+              <w:left w:val="nil"/>
+              <w:right w:val="nil"/>
+              <w:top w:val="nil"/>
+              <w:bottom w:val="single" w:sz="4" w:color="D9E1E8"/>
+            </w:tcBorders>
+            <w:vAlign w:val="center"/>
+          </w:tcPr>
+          <w:p>
+            <w:pPr>
+              <w:pStyle w:val="Compact"/>
+              <w:spacing w:before="0" w:after="20" w:line="240" w:lineRule="auto"/>
+              <w:jc w:val="center"/>
+              <w:suppressAutoHyphens/>
+              <w:keepNext w:val="0"/>
+              <w:keepLines/>
+              <w:widowControl w:val="1"/>
+            </w:pPr>
+            <w:r>
+              <w:rPr>
+                <w:rFonts w:ascii="Times New Roman" w:hAnsi="Times New Roman"/>
+                <w:sz w:val="18"/>
+              </w:rPr>
+              <w:t xml:space="preserve">Medication-question risk classification (3.2.4)</w:t>
+            </w:r>
+          </w:p>
+        </w:tc>
+        <w:tc>
+          <w:tcPr>
+            <w:tcBorders>
+              <w:left w:val="nil"/>
+              <w:right w:val="nil"/>
+              <w:top w:val="nil"/>
+              <w:bottom w:val="single" w:sz="4" w:color="D9E1E8"/>
+            </w:tcBorders>
+            <w:vAlign w:val="center"/>
+          </w:tcPr>
+          <w:p>
+            <w:pPr>
+              <w:pStyle w:val="Compact"/>
+              <w:spacing w:before="0" w:after="20" w:line="240" w:lineRule="auto"/>
+              <w:jc w:val="center"/>
+              <w:suppressAutoHyphens/>
+              <w:keepNext w:val="0"/>
+              <w:keepLines/>
+              <w:widowControl w:val="1"/>
+            </w:pPr>
+            <w:r>
+              <w:rPr>
+                <w:rFonts w:ascii="Times New Roman" w:hAnsi="Times New Roman"/>
+                <w:sz w:val="18"/>
+              </w:rPr>
+              <w:t xml:space="preserve">GPT-4.1 (critical-case augmentation)</w:t>
+            </w:r>
+          </w:p>
+        </w:tc>
+        <w:tc>
+          <w:tcPr>
+            <w:tcBorders>
+              <w:left w:val="nil"/>
+              <w:right w:val="nil"/>
+              <w:top w:val="nil"/>
+              <w:bottom w:val="single" w:sz="4" w:color="D9E1E8"/>
+            </w:tcBorders>
+            <w:vAlign w:val="center"/>
+          </w:tcPr>
+          <w:p>
+            <w:pPr>
+              <w:pStyle w:val="Compact"/>
+              <w:spacing w:before="0" w:after="20" w:line="240" w:lineRule="auto"/>
+              <w:jc w:val="center"/>
+              <w:suppressAutoHyphens/>
+              <w:keepNext w:val="0"/>
+              <w:keepLines/>
+              <w:widowControl w:val="1"/>
+            </w:pPr>
+            <w:r>
+              <w:rPr>
+                <w:rFonts w:ascii="Times New Roman" w:hAnsi="Times New Roman"/>
+                <w:sz w:val="18"/>
+              </w:rPr>
+              <w:t xml:space="preserve">BioBERT / BlueBERT (vs SVM)</w:t>
+            </w:r>
+          </w:p>
+        </w:tc>
+        <w:tc>
+          <w:tcPr>
+            <w:tcBorders>
+              <w:left w:val="nil"/>
+              <w:right w:val="nil"/>
+              <w:top w:val="nil"/>
+              <w:bottom w:val="single" w:sz="4" w:color="D9E1E8"/>
+            </w:tcBorders>
+            <w:vAlign w:val="center"/>
+          </w:tcPr>
+          <w:p>
+            <w:pPr>
+              <w:pStyle w:val="Compact"/>
+              <w:spacing w:before="0" w:after="20" w:line="240" w:lineRule="auto"/>
+              <w:jc w:val="center"/>
+              <w:suppressAutoHyphens/>
+              <w:keepNext w:val="0"/>
+              <w:keepLines/>
+              <w:widowControl w:val="1"/>
+            </w:pPr>
+            <w:r>
+              <w:rPr>
+                <w:rFonts w:ascii="Times New Roman" w:hAnsi="Times New Roman"/>
+                <w:sz w:val="18"/>
+              </w:rPr>
+              <w:t xml:space="preserve">80/20, seed 42</w:t>
+            </w:r>
+          </w:p>
+        </w:tc>
+        <w:tc>
+          <w:tcPr>
+            <w:tcBorders>
+              <w:left w:val="nil"/>
+              <w:right w:val="nil"/>
+              <w:top w:val="nil"/>
+              <w:bottom w:val="single" w:sz="4" w:color="D9E1E8"/>
+            </w:tcBorders>
+            <w:vAlign w:val="center"/>
+          </w:tcPr>
+          <w:p>
+            <w:pPr>
+              <w:pStyle w:val="Compact"/>
+              <w:spacing w:before="0" w:after="20" w:line="240" w:lineRule="auto"/>
+              <w:jc w:val="center"/>
+              <w:suppressAutoHyphens/>
+              <w:keepNext w:val="0"/>
+              <w:keepLines/>
+              <w:widowControl w:val="1"/>
+            </w:pPr>
+            <w:r>
+              <w:rPr>
+                <w:rFonts w:ascii="Times New Roman" w:hAnsi="Times New Roman"/>
+                <w:b/>
+                <w:bCs/>
+                <w:i/>
+                <w:iCs/>
+                <w:sz w:val="18"/>
+              </w:rPr>
+              <w:t xml:space="preserve">R+S→R</w:t>
+            </w:r>
+          </w:p>
+        </w:tc>
+        <w:tc>
+          <w:tcPr>
+            <w:tcBorders>
+              <w:left w:val="nil"/>
+              <w:right w:val="nil"/>
+              <w:top w:val="nil"/>
+              <w:bottom w:val="single" w:sz="4" w:color="D9E1E8"/>
+            </w:tcBorders>
+            <w:vAlign w:val="center"/>
+          </w:tcPr>
+          <w:p>
+            <w:pPr>
+              <w:pStyle w:val="Compact"/>
+              <w:spacing w:before="0" w:after="20" w:line="240" w:lineRule="auto"/>
+              <w:jc w:val="center"/>
+              <w:suppressAutoHyphens/>
+              <w:keepNext w:val="0"/>
+              <w:keepLines/>
+              <w:widowControl w:val="1"/>
+            </w:pPr>
+            <w:r>
+              <w:rPr>
+                <w:rFonts w:ascii="Times New Roman" w:hAnsi="Times New Roman"/>
+                <w:sz w:val="18"/>
+              </w:rPr>
+              <w:t xml:space="preserve">real labels + synthetic augmentation + reproduce.py</w:t>
+            </w:r>
+          </w:p>
+        </w:tc>
+      </w:tr>
+      <w:tr>
+        <w:tc>
+          <w:tcPr>
+            <w:tcBorders>
+              <w:left w:val="nil"/>
+              <w:right w:val="nil"/>
+              <w:top w:val="nil"/>
+              <w:bottom w:val="single" w:sz="4" w:color="D9E1E8"/>
+            </w:tcBorders>
+            <w:vAlign w:val="center"/>
+          </w:tcPr>
+          <w:p>
+            <w:pPr>
+              <w:pStyle w:val="Compact"/>
+              <w:spacing w:before="0" w:after="20" w:line="240" w:lineRule="auto"/>
+              <w:jc w:val="center"/>
+              <w:suppressAutoHyphens/>
+              <w:keepNext w:val="0"/>
+              <w:keepLines/>
+              <w:widowControl w:val="1"/>
+            </w:pPr>
+            <w:r>
+              <w:rPr>
+                <w:rFonts w:ascii="Times New Roman" w:hAnsi="Times New Roman"/>
+                <w:sz w:val="18"/>
+              </w:rPr>
+              <w:t xml:space="preserve">8</w:t>
+            </w:r>
+          </w:p>
+        </w:tc>
+        <w:tc>
+          <w:tcPr>
+            <w:tcBorders>
+              <w:left w:val="nil"/>
+              <w:right w:val="nil"/>
+              <w:top w:val="nil"/>
+              <w:bottom w:val="single" w:sz="4" w:color="D9E1E8"/>
+            </w:tcBorders>
+            <w:vAlign w:val="center"/>
+          </w:tcPr>
+          <w:p>
+            <w:pPr>
+              <w:pStyle w:val="Compact"/>
+              <w:spacing w:before="0" w:after="20" w:line="240" w:lineRule="auto"/>
+              <w:jc w:val="center"/>
+              <w:suppressAutoHyphens/>
+              <w:keepNext w:val="0"/>
+              <w:keepLines/>
+              <w:widowControl w:val="1"/>
+            </w:pPr>
+            <w:r>
+              <w:rPr>
+                <w:rFonts w:ascii="Times New Roman" w:hAnsi="Times New Roman"/>
+                <w:sz w:val="18"/>
+              </w:rPr>
+              <w:t xml:space="preserve">Home-care status detection (3.2.5)</w:t>
+            </w:r>
+          </w:p>
+        </w:tc>
+        <w:tc>
+          <w:tcPr>
+            <w:tcBorders>
+              <w:left w:val="nil"/>
+              <w:right w:val="nil"/>
+              <w:top w:val="nil"/>
+              <w:bottom w:val="single" w:sz="4" w:color="D9E1E8"/>
+            </w:tcBorders>
+            <w:vAlign w:val="center"/>
+          </w:tcPr>
+          <w:p>
+            <w:pPr>
+              <w:pStyle w:val="Compact"/>
+              <w:spacing w:before="0" w:after="20" w:line="240" w:lineRule="auto"/>
+              <w:jc w:val="center"/>
+              <w:suppressAutoHyphens/>
+              <w:keepNext w:val="0"/>
+              <w:keepLines/>
+              <w:widowControl w:val="1"/>
+            </w:pPr>
+            <w:r>
+              <w:rPr>
+                <w:rFonts w:ascii="Times New Roman" w:hAnsi="Times New Roman"/>
+                <w:sz w:val="18"/>
+              </w:rPr>
+              <w:t xml:space="preserve">GPT (symptom + vitals)</w:t>
+            </w:r>
+          </w:p>
+        </w:tc>
+        <w:tc>
+          <w:tcPr>
+            <w:tcBorders>
+              <w:left w:val="nil"/>
+              <w:right w:val="nil"/>
+              <w:top w:val="nil"/>
+              <w:bottom w:val="single" w:sz="4" w:color="D9E1E8"/>
+            </w:tcBorders>
+            <w:vAlign w:val="center"/>
+          </w:tcPr>
+          <w:p>
+            <w:pPr>
+              <w:pStyle w:val="Compact"/>
+              <w:spacing w:before="0" w:after="20" w:line="240" w:lineRule="auto"/>
+              <w:jc w:val="center"/>
+              <w:suppressAutoHyphens/>
+              <w:keepNext w:val="0"/>
+              <w:keepLines/>
+              <w:widowControl w:val="1"/>
+            </w:pPr>
+            <w:r>
+              <w:rPr>
+                <w:rFonts w:ascii="Times New Roman" w:hAnsi="Times New Roman"/>
+                <w:sz w:val="18"/>
+              </w:rPr>
+              <w:t xml:space="preserve">LightGBM (TF-IDF + vitals fusion)</w:t>
+            </w:r>
+          </w:p>
+        </w:tc>
+        <w:tc>
+          <w:tcPr>
+            <w:tcBorders>
+              <w:left w:val="nil"/>
+              <w:right w:val="nil"/>
+              <w:top w:val="nil"/>
+              <w:bottom w:val="single" w:sz="4" w:color="D9E1E8"/>
+            </w:tcBorders>
+            <w:vAlign w:val="center"/>
+          </w:tcPr>
+          <w:p>
+            <w:pPr>
+              <w:pStyle w:val="Compact"/>
+              <w:spacing w:before="0" w:after="20" w:line="240" w:lineRule="auto"/>
+              <w:jc w:val="center"/>
+              <w:suppressAutoHyphens/>
+              <w:keepNext w:val="0"/>
+              <w:keepLines/>
+              <w:widowControl w:val="1"/>
+            </w:pPr>
+            <w:r>
+              <w:rPr>
+                <w:rFonts w:ascii="Times New Roman" w:hAnsi="Times New Roman"/>
+                <w:sz w:val="18"/>
+              </w:rPr>
+              <w:t xml:space="preserve">80/20, seed 42</w:t>
+            </w:r>
+          </w:p>
+        </w:tc>
+        <w:tc>
+          <w:tcPr>
+            <w:tcBorders>
+              <w:left w:val="nil"/>
+              <w:right w:val="nil"/>
+              <w:top w:val="nil"/>
+              <w:bottom w:val="single" w:sz="4" w:color="D9E1E8"/>
+            </w:tcBorders>
+            <w:vAlign w:val="center"/>
+          </w:tcPr>
+          <w:p>
+            <w:pPr>
+              <w:pStyle w:val="Compact"/>
+              <w:spacing w:before="0" w:after="20" w:line="240" w:lineRule="auto"/>
+              <w:jc w:val="center"/>
+              <w:suppressAutoHyphens/>
+              <w:keepNext w:val="0"/>
+              <w:keepLines/>
+              <w:widowControl w:val="1"/>
+            </w:pPr>
+            <w:r>
+              <w:rPr>
+                <w:rFonts w:ascii="Times New Roman" w:hAnsi="Times New Roman"/>
+                <w:i/>
+                <w:iCs/>
+                <w:sz w:val="18"/>
+              </w:rPr>
+              <w:t xml:space="preserve">S→S</w:t>
+            </w:r>
+          </w:p>
+        </w:tc>
+        <w:tc>
+          <w:tcPr>
+            <w:tcBorders>
+              <w:left w:val="nil"/>
+              <w:right w:val="nil"/>
+              <w:top w:val="nil"/>
+              <w:bottom w:val="single" w:sz="4" w:color="D9E1E8"/>
+            </w:tcBorders>
+            <w:vAlign w:val="center"/>
+          </w:tcPr>
+          <w:p>
+            <w:pPr>
+              <w:pStyle w:val="Compact"/>
+              <w:spacing w:before="0" w:after="20" w:line="240" w:lineRule="auto"/>
+              <w:jc w:val="center"/>
+              <w:suppressAutoHyphens/>
+              <w:keepNext w:val="0"/>
+              <w:keepLines/>
+              <w:widowControl w:val="1"/>
+            </w:pPr>
+            <w:r>
+              <w:rPr>
+                <w:rFonts w:ascii="Times New Roman" w:hAnsi="Times New Roman"/>
+                <w:sz w:val="18"/>
+              </w:rPr>
+              <w:t xml:space="preserve">full data + reproduce.py</w:t>
+            </w:r>
+          </w:p>
+        </w:tc>
+      </w:tr>
+      <w:tr>
+        <w:tc>
+          <w:tcPr>
+            <w:tcBorders>
+              <w:left w:val="nil"/>
+              <w:right w:val="nil"/>
+              <w:top w:val="nil"/>
+              <w:bottom w:val="single" w:sz="4" w:color="D9E1E8"/>
+            </w:tcBorders>
+            <w:vAlign w:val="center"/>
+          </w:tcPr>
+          <w:p>
+            <w:pPr>
+              <w:pStyle w:val="Compact"/>
+              <w:spacing w:before="0" w:after="20" w:line="240" w:lineRule="auto"/>
+              <w:jc w:val="center"/>
+              <w:suppressAutoHyphens/>
+              <w:keepNext w:val="0"/>
+              <w:keepLines/>
+              <w:widowControl w:val="1"/>
+            </w:pPr>
+            <w:r>
+              <w:rPr>
+                <w:rFonts w:ascii="Times New Roman" w:hAnsi="Times New Roman"/>
+                <w:sz w:val="18"/>
+              </w:rPr>
+              <w:t xml:space="preserve">9</w:t>
+            </w:r>
+          </w:p>
+        </w:tc>
+        <w:tc>
+          <w:tcPr>
+            <w:tcBorders>
+              <w:left w:val="nil"/>
+              <w:right w:val="nil"/>
+              <w:top w:val="nil"/>
+              <w:bottom w:val="single" w:sz="4" w:color="D9E1E8"/>
+            </w:tcBorders>
+            <w:vAlign w:val="center"/>
+          </w:tcPr>
+          <w:p>
+            <w:pPr>
+              <w:pStyle w:val="Compact"/>
+              <w:spacing w:before="0" w:after="20" w:line="240" w:lineRule="auto"/>
+              <w:jc w:val="center"/>
+              <w:suppressAutoHyphens/>
+              <w:keepNext w:val="0"/>
+              <w:keepLines/>
+              <w:widowControl w:val="1"/>
+            </w:pPr>
+            <w:r>
+              <w:rPr>
+                <w:rFonts w:ascii="Times New Roman" w:hAnsi="Times New Roman"/>
+                <w:sz w:val="18"/>
+              </w:rPr>
+              <w:t xml:space="preserve">EMS report routing (3.3.1)</w:t>
+            </w:r>
+          </w:p>
+        </w:tc>
+        <w:tc>
+          <w:tcPr>
+            <w:tcBorders>
+              <w:left w:val="nil"/>
+              <w:right w:val="nil"/>
+              <w:top w:val="nil"/>
+              <w:bottom w:val="single" w:sz="4" w:color="D9E1E8"/>
+            </w:tcBorders>
+            <w:vAlign w:val="center"/>
+          </w:tcPr>
+          <w:p>
+            <w:pPr>
+              <w:pStyle w:val="Compact"/>
+              <w:spacing w:before="0" w:after="20" w:line="240" w:lineRule="auto"/>
+              <w:jc w:val="center"/>
+              <w:suppressAutoHyphens/>
+              <w:keepNext w:val="0"/>
+              <w:keepLines/>
+              <w:widowControl w:val="1"/>
+            </w:pPr>
+            <w:r>
+              <w:rPr>
+                <w:rFonts w:ascii="Times New Roman" w:hAnsi="Times New Roman"/>
+                <w:sz w:val="18"/>
+              </w:rPr>
+              <w:t xml:space="preserve">GPT-4.1-mini (MIMIC-IV-Ext, + ASR noise)</w:t>
+            </w:r>
+          </w:p>
+        </w:tc>
+        <w:tc>
+          <w:tcPr>
+            <w:tcBorders>
+              <w:left w:val="nil"/>
+              <w:right w:val="nil"/>
+              <w:top w:val="nil"/>
+              <w:bottom w:val="single" w:sz="4" w:color="D9E1E8"/>
+            </w:tcBorders>
+            <w:vAlign w:val="center"/>
+          </w:tcPr>
+          <w:p>
+            <w:pPr>
+              <w:pStyle w:val="Compact"/>
+              <w:spacing w:before="0" w:after="20" w:line="240" w:lineRule="auto"/>
+              <w:jc w:val="center"/>
+              <w:suppressAutoHyphens/>
+              <w:keepNext w:val="0"/>
+              <w:keepLines/>
+              <w:widowControl w:val="1"/>
+            </w:pPr>
+            <w:r>
+              <w:rPr>
+                <w:rFonts w:ascii="Times New Roman" w:hAnsi="Times New Roman"/>
+                <w:sz w:val="18"/>
+              </w:rPr>
+              <w:t xml:space="preserve">BioClinicalBERT</w:t>
+            </w:r>
+          </w:p>
+        </w:tc>
+        <w:tc>
+          <w:tcPr>
+            <w:tcBorders>
+              <w:left w:val="nil"/>
+              <w:right w:val="nil"/>
+              <w:top w:val="nil"/>
+              <w:bottom w:val="single" w:sz="4" w:color="D9E1E8"/>
+            </w:tcBorders>
+            <w:vAlign w:val="center"/>
+          </w:tcPr>
+          <w:p>
+            <w:pPr>
+              <w:pStyle w:val="Compact"/>
+              <w:spacing w:before="0" w:after="20" w:line="240" w:lineRule="auto"/>
+              <w:jc w:val="center"/>
+              <w:suppressAutoHyphens/>
+              <w:keepNext w:val="0"/>
+              <w:keepLines/>
+              <w:widowControl w:val="1"/>
+            </w:pPr>
+            <w:r>
+              <w:rPr>
+                <w:rFonts w:ascii="Times New Roman" w:hAnsi="Times New Roman"/>
+                <w:sz w:val="18"/>
+              </w:rPr>
+              <w:t xml:space="preserve">80/20, seed 42</w:t>
+            </w:r>
+          </w:p>
+        </w:tc>
+        <w:tc>
+          <w:tcPr>
+            <w:tcBorders>
+              <w:left w:val="nil"/>
+              <w:right w:val="nil"/>
+              <w:top w:val="nil"/>
+              <w:bottom w:val="single" w:sz="4" w:color="D9E1E8"/>
+            </w:tcBorders>
+            <w:vAlign w:val="center"/>
+          </w:tcPr>
+          <w:p>
+            <w:pPr>
+              <w:pStyle w:val="Compact"/>
+              <w:spacing w:before="0" w:after="20" w:line="240" w:lineRule="auto"/>
+              <w:jc w:val="center"/>
+              <w:suppressAutoHyphens/>
+              <w:keepNext w:val="0"/>
+              <w:keepLines/>
+              <w:widowControl w:val="1"/>
+            </w:pPr>
+            <w:r>
+              <w:rPr>
+                <w:rFonts w:ascii="Times New Roman" w:hAnsi="Times New Roman"/>
+                <w:i/>
+                <w:iCs/>
+                <w:sz w:val="18"/>
+              </w:rPr>
+              <w:t xml:space="preserve">S→S</w:t>
+            </w:r>
+          </w:p>
+        </w:tc>
+        <w:tc>
+          <w:tcPr>
+            <w:tcBorders>
+              <w:left w:val="nil"/>
+              <w:right w:val="nil"/>
+              <w:top w:val="nil"/>
+              <w:bottom w:val="single" w:sz="4" w:color="D9E1E8"/>
+            </w:tcBorders>
+            <w:vAlign w:val="center"/>
+          </w:tcPr>
+          <w:p>
+            <w:pPr>
+              <w:pStyle w:val="Compact"/>
+              <w:spacing w:before="0" w:after="20" w:line="240" w:lineRule="auto"/>
+              <w:jc w:val="center"/>
+              <w:suppressAutoHyphens/>
+              <w:keepNext w:val="0"/>
+              <w:keepLines/>
+              <w:widowControl w:val="1"/>
+            </w:pPr>
+            <w:r>
+              <w:rPr>
+                <w:rFonts w:ascii="Times New Roman" w:hAnsi="Times New Roman"/>
+                <w:sz w:val="18"/>
+              </w:rPr>
+              <w:t xml:space="preserve">sample + reproduce.py</w:t>
+            </w:r>
+          </w:p>
+        </w:tc>
+      </w:tr>
+      <w:tr>
+        <w:tc>
+          <w:tcPr>
+            <w:tcBorders>
+              <w:left w:val="nil"/>
+              <w:right w:val="nil"/>
+              <w:top w:val="nil"/>
+              <w:bottom w:val="nil"/>
+            </w:tcBorders>
+            <w:vAlign w:val="center"/>
+          </w:tcPr>
+          <w:p>
+            <w:pPr>
+              <w:pStyle w:val="Compact"/>
+              <w:spacing w:before="0" w:after="20" w:line="240" w:lineRule="auto"/>
+              <w:jc w:val="center"/>
+              <w:suppressAutoHyphens/>
+              <w:keepNext w:val="0"/>
+              <w:keepLines/>
+              <w:widowControl w:val="1"/>
+            </w:pPr>
+            <w:r>
+              <w:rPr>
+                <w:rFonts w:ascii="Times New Roman" w:hAnsi="Times New Roman"/>
+                <w:sz w:val="18"/>
+              </w:rPr>
+              <w:t xml:space="preserve">10</w:t>
+            </w:r>
+          </w:p>
+        </w:tc>
+        <w:tc>
+          <w:tcPr>
+            <w:tcBorders>
+              <w:left w:val="nil"/>
+              <w:right w:val="nil"/>
+              <w:top w:val="nil"/>
+              <w:bottom w:val="nil"/>
+            </w:tcBorders>
+            <w:vAlign w:val="center"/>
+          </w:tcPr>
+          <w:p>
+            <w:pPr>
+              <w:pStyle w:val="Compact"/>
+              <w:spacing w:before="0" w:after="20" w:line="240" w:lineRule="auto"/>
+              <w:jc w:val="center"/>
+              <w:suppressAutoHyphens/>
+              <w:keepNext w:val="0"/>
+              <w:keepLines/>
+              <w:widowControl w:val="1"/>
+            </w:pPr>
+            <w:r>
+              <w:rPr>
+                <w:rFonts w:ascii="Times New Roman" w:hAnsi="Times New Roman"/>
+                <w:sz w:val="18"/>
+              </w:rPr>
+              <w:t xml:space="preserve">SBAR completeness checking (3.3.2)</w:t>
+            </w:r>
+          </w:p>
+        </w:tc>
+        <w:tc>
+          <w:tcPr>
+            <w:tcBorders>
+              <w:left w:val="nil"/>
+              <w:right w:val="nil"/>
+              <w:top w:val="nil"/>
+              <w:bottom w:val="nil"/>
+            </w:tcBorders>
+            <w:vAlign w:val="center"/>
+          </w:tcPr>
+          <w:p>
+            <w:pPr>
+              <w:pStyle w:val="Compact"/>
+              <w:spacing w:before="0" w:after="20" w:line="240" w:lineRule="auto"/>
+              <w:jc w:val="center"/>
+              <w:suppressAutoHyphens/>
+              <w:keepNext w:val="0"/>
+              <w:keepLines/>
+              <w:widowControl w:val="1"/>
+            </w:pPr>
+            <w:r>
+              <w:rPr>
+                <w:rFonts w:ascii="Times New Roman" w:hAnsi="Times New Roman"/>
+                <w:sz w:val="18"/>
+              </w:rPr>
+              <w:t xml:space="preserve">OpenAI batch</w:t>
+            </w:r>
+          </w:p>
+        </w:tc>
+        <w:tc>
+          <w:tcPr>
+            <w:tcBorders>
+              <w:left w:val="nil"/>
+              <w:right w:val="nil"/>
+              <w:top w:val="nil"/>
+              <w:bottom w:val="nil"/>
+            </w:tcBorders>
+            <w:vAlign w:val="center"/>
+          </w:tcPr>
+          <w:p>
+            <w:pPr>
+              <w:pStyle w:val="Compact"/>
+              <w:spacing w:before="0" w:after="20" w:line="240" w:lineRule="auto"/>
+              <w:jc w:val="center"/>
+              <w:suppressAutoHyphens/>
+              <w:keepNext w:val="0"/>
+              <w:keepLines/>
+              <w:widowControl w:val="1"/>
+            </w:pPr>
+            <w:r>
+              <w:rPr>
+                <w:rFonts w:ascii="Times New Roman" w:hAnsi="Times New Roman"/>
+                <w:sz w:val="18"/>
+              </w:rPr>
+              <w:t xml:space="preserve">BioClinicalBERT / hierarchical</w:t>
+            </w:r>
+          </w:p>
+        </w:tc>
+        <w:tc>
+          <w:tcPr>
+            <w:tcBorders>
+              <w:left w:val="nil"/>
+              <w:right w:val="nil"/>
+              <w:top w:val="nil"/>
+              <w:bottom w:val="nil"/>
+            </w:tcBorders>
+            <w:vAlign w:val="center"/>
+          </w:tcPr>
+          <w:p>
+            <w:pPr>
+              <w:pStyle w:val="Compact"/>
+              <w:spacing w:before="0" w:after="20" w:line="240" w:lineRule="auto"/>
+              <w:jc w:val="center"/>
+              <w:suppressAutoHyphens/>
+              <w:keepNext w:val="0"/>
+              <w:keepLines/>
+              <w:widowControl w:val="1"/>
+            </w:pPr>
+            <w:r>
+              <w:rPr>
+                <w:rFonts w:ascii="Times New Roman" w:hAnsi="Times New Roman"/>
+                <w:sz w:val="18"/>
+              </w:rPr>
+              <w:t xml:space="preserve">80/20, seed 42</w:t>
+            </w:r>
+          </w:p>
+        </w:tc>
+        <w:tc>
+          <w:tcPr>
+            <w:tcBorders>
+              <w:left w:val="nil"/>
+              <w:right w:val="nil"/>
+              <w:top w:val="nil"/>
+              <w:bottom w:val="nil"/>
+            </w:tcBorders>
+            <w:vAlign w:val="center"/>
+          </w:tcPr>
+          <w:p>
+            <w:pPr>
+              <w:pStyle w:val="Compact"/>
+              <w:spacing w:before="0" w:after="20" w:line="240" w:lineRule="auto"/>
+              <w:jc w:val="center"/>
+              <w:suppressAutoHyphens/>
+              <w:keepNext w:val="0"/>
+              <w:keepLines/>
+              <w:widowControl w:val="1"/>
+            </w:pPr>
+            <w:r>
+              <w:rPr>
+                <w:rFonts w:ascii="Times New Roman" w:hAnsi="Times New Roman"/>
+                <w:i/>
+                <w:iCs/>
+                <w:sz w:val="18"/>
+              </w:rPr>
+              <w:t xml:space="preserve">S→S</w:t>
+            </w:r>
+          </w:p>
+        </w:tc>
+        <w:tc>
+          <w:tcPr>
+            <w:tcBorders>
+              <w:left w:val="nil"/>
+              <w:right w:val="nil"/>
+              <w:top w:val="nil"/>
+              <w:bottom w:val="nil"/>
+            </w:tcBorders>
+            <w:vAlign w:val="center"/>
+          </w:tcPr>
+          <w:p>
+            <w:pPr>
+              <w:pStyle w:val="Compact"/>
+              <w:spacing w:before="0" w:after="20" w:line="240" w:lineRule="auto"/>
+              <w:jc w:val="center"/>
+              <w:suppressAutoHyphens/>
+              <w:keepNext w:val="0"/>
+              <w:keepLines/>
+              <w:widowControl w:val="1"/>
+            </w:pPr>
+            <w:r>
+              <w:rPr>
+                <w:rFonts w:ascii="Times New Roman" w:hAnsi="Times New Roman"/>
+                <w:sz w:val="18"/>
+              </w:rPr>
+              <w:t xml:space="preserve">sample + reproduce.py</w:t>
+            </w:r>
+          </w:p>
+        </w:tc>
+      </w:tr>
+    </w:tbl>
     <w:p>
       <w:r>
         <w:pict>

</xml_diff>

<commit_message>
Position against the concurrent JHIR scoping review (punch-list item 6): add Rao et al. 2026 (J. Healthcare Informatics Research, doi:10.1007/s41666-026-00229-9) as ref [110], a Table 1 comparison row, and an intro sentence noting it organizes by data utility/quality (not communication channel) with no application studies. bibtest 110/110 valid. Rebuild all artifacts
Co-Authored-By: Claude Opus 4.8 <noreply@anthropic.com>
</commit_message>
<xml_diff>
--- a/paper-1col.docx
+++ b/paper-1col.docx
@@ -2,7 +2,7 @@
 <file path=word/document.xml><?xml version="1.0" encoding="utf-8"?>
 <w:document xmlns:w="http://schemas.openxmlformats.org/wordprocessingml/2006/main" xmlns:m="http://schemas.openxmlformats.org/officeDocument/2006/math" xmlns:r="http://schemas.openxmlformats.org/officeDocument/2006/relationships" xmlns:o="urn:schemas-microsoft-com:office:office" xmlns:v="urn:schemas-microsoft-com:vml" xmlns:w10="urn:schemas-microsoft-com:office:word" xmlns:a="http://schemas.openxmlformats.org/drawingml/2006/main" xmlns:pic="http://schemas.openxmlformats.org/drawingml/2006/picture" xmlns:wp="http://schemas.openxmlformats.org/drawingml/2006/wordprocessingDrawing">
   <w:body>
-    <w:bookmarkStart w:id="70" w:name="Xb3a8dbe493eb8229387b81cb07551ee4828e1fd"/>
+    <w:bookmarkStart w:id="71" w:name="Xb3a8dbe493eb8229387b81cb07551ee4828e1fd"/>
     <w:p>
       <w:pPr>
         <w:pStyle w:val="Title"/>
@@ -1127,7 +1127,16 @@
         <w:t xml:space="preserve"> </w:t>
       </w:r>
       <w:r>
-        <w:t xml:space="preserve">here. Table 1 sets this survey against the closest prior reviews.</w:t>
+        <w:t xml:space="preserve">here. A concurrent scoping review in this journal surveys language-model synthetic data across biomedical research by data utility and quality, but organizes the field by those axes rather than by clinical-communication channel and pairs with no application studies</w:t>
+      </w:r>
+      <w:r>
+        <w:rPr>
+          <w:vertAlign w:val="superscript"/>
+        </w:rPr>
+        <w:t xml:space="preserve">[110]</w:t>
+      </w:r>
+      <w:r>
+        <w:t xml:space="preserve">. Table 1 sets this survey against the closest prior reviews.</w:t>
       </w:r>
     </w:p>
     <w:p>
@@ -1870,6 +1879,124 @@
                 <w:sz w:val="19"/>
               </w:rPr>
               <w:t xml:space="preserve">Yes (typology)</w:t>
+            </w:r>
+          </w:p>
+        </w:tc>
+        <w:tc>
+          <w:tcPr>
+            <w:tcBorders>
+              <w:left w:val="nil"/>
+              <w:right w:val="nil"/>
+              <w:top w:val="nil"/>
+              <w:bottom w:val="single" w:sz="4" w:color="D9E1E8"/>
+            </w:tcBorders>
+            <w:vAlign w:val="center"/>
+          </w:tcPr>
+          <w:p>
+            <w:pPr>
+              <w:pStyle w:val="Compact"/>
+              <w:spacing w:before="0" w:after="20" w:line="240" w:lineRule="auto"/>
+              <w:jc w:val="center"/>
+              <w:suppressAutoHyphens/>
+              <w:keepNext w:val="0"/>
+              <w:keepLines/>
+              <w:widowControl w:val="1"/>
+            </w:pPr>
+            <w:r>
+              <w:rPr>
+                <w:rFonts w:ascii="Times New Roman" w:hAnsi="Times New Roman"/>
+                <w:sz w:val="19"/>
+              </w:rPr>
+              <w:t xml:space="preserve">No</w:t>
+            </w:r>
+          </w:p>
+        </w:tc>
+      </w:tr>
+      <w:tr>
+        <w:tc>
+          <w:tcPr>
+            <w:tcBorders>
+              <w:left w:val="nil"/>
+              <w:right w:val="nil"/>
+              <w:top w:val="nil"/>
+              <w:bottom w:val="single" w:sz="4" w:color="D9E1E8"/>
+            </w:tcBorders>
+            <w:vAlign w:val="center"/>
+          </w:tcPr>
+          <w:p>
+            <w:pPr>
+              <w:pStyle w:val="Compact"/>
+              <w:spacing w:before="0" w:after="20" w:line="240" w:lineRule="auto"/>
+              <w:jc w:val="center"/>
+              <w:suppressAutoHyphens/>
+              <w:keepNext w:val="0"/>
+              <w:keepLines/>
+              <w:widowControl w:val="1"/>
+            </w:pPr>
+            <w:r>
+              <w:rPr>
+                <w:rFonts w:ascii="Times New Roman" w:hAnsi="Times New Roman"/>
+                <w:sz w:val="19"/>
+              </w:rPr>
+              <w:t xml:space="preserve">Rao et al. [110]</w:t>
+            </w:r>
+          </w:p>
+        </w:tc>
+        <w:tc>
+          <w:tcPr>
+            <w:tcBorders>
+              <w:left w:val="nil"/>
+              <w:right w:val="nil"/>
+              <w:top w:val="nil"/>
+              <w:bottom w:val="single" w:sz="4" w:color="D9E1E8"/>
+            </w:tcBorders>
+            <w:vAlign w:val="center"/>
+          </w:tcPr>
+          <w:p>
+            <w:pPr>
+              <w:pStyle w:val="Compact"/>
+              <w:spacing w:before="0" w:after="20" w:line="240" w:lineRule="auto"/>
+              <w:jc w:val="center"/>
+              <w:suppressAutoHyphens/>
+              <w:keepNext w:val="0"/>
+              <w:keepLines/>
+              <w:widowControl w:val="1"/>
+            </w:pPr>
+            <w:r>
+              <w:rPr>
+                <w:rFonts w:ascii="Times New Roman" w:hAnsi="Times New Roman"/>
+                <w:sz w:val="19"/>
+              </w:rPr>
+              <w:t xml:space="preserve">Biomedical synthetic text/data; not by communication channel</w:t>
+            </w:r>
+          </w:p>
+        </w:tc>
+        <w:tc>
+          <w:tcPr>
+            <w:tcBorders>
+              <w:left w:val="nil"/>
+              <w:right w:val="nil"/>
+              <w:top w:val="nil"/>
+              <w:bottom w:val="single" w:sz="4" w:color="D9E1E8"/>
+            </w:tcBorders>
+            <w:vAlign w:val="center"/>
+          </w:tcPr>
+          <w:p>
+            <w:pPr>
+              <w:pStyle w:val="Compact"/>
+              <w:spacing w:before="0" w:after="20" w:line="240" w:lineRule="auto"/>
+              <w:jc w:val="center"/>
+              <w:suppressAutoHyphens/>
+              <w:keepNext w:val="0"/>
+              <w:keepLines/>
+              <w:widowControl w:val="1"/>
+            </w:pPr>
+            <w:r>
+              <w:rPr>
+                <w:rFonts w:ascii="Times New Roman" w:hAnsi="Times New Roman"/>
+                <w:sz w:val="19"/>
+              </w:rPr>
+              <w:t xml:space="preserve">No</w:t>
             </w:r>
           </w:p>
         </w:tc>
@@ -24814,7 +24941,7 @@
       </w:r>
     </w:p>
     <w:bookmarkEnd w:id="64"/>
-    <w:bookmarkStart w:id="69" w:name="references"/>
+    <w:bookmarkStart w:id="70" w:name="references"/>
     <w:p>
       <w:pPr>
         <w:pStyle w:val="ReferencesHeading"/>
@@ -28580,8 +28707,53 @@
         <w:t xml:space="preserve">, 2025.</w:t>
       </w:r>
     </w:p>
-    <w:bookmarkEnd w:id="69"/>
+    <w:p>
+      <w:pPr>
+        <w:pStyle w:val="ReferenceEntry"/>
+        <w:spacing w:after="100"/>
+        <w:ind w:left="475" w:hanging="475"/>
+        <w:jc w:val="left"/>
+        <w:keepNext w:val="0"/>
+        <w:keepLines w:val="0"/>
+        <w:widowControl w:val="1"/>
+      </w:pPr>
+      <w:r>
+        <w:rPr>
+          <w:rFonts w:ascii="Times New Roman" w:hAnsi="Times New Roman"/>
+          <w:sz w:val="20"/>
+        </w:rPr>
+        <w:t xml:space="preserve">110. </w:t>
+      </w:r>
+      <w:r>
+        <w:t xml:space="preserve">H. Rao, W. Liu, H. Wang, I.-C. Huang, Z. He, X. Huang. A Scoping Review of Synthetic Data Generation by Language Models in Biomedical Research and Application: Data Utility and Quality Perspectives.</w:t>
+      </w:r>
+      <w:r>
+        <w:t xml:space="preserve"> </w:t>
+      </w:r>
+      <w:r>
+        <w:rPr>
+          <w:i/>
+          <w:iCs/>
+        </w:rPr>
+        <w:t xml:space="preserve">Journal of Healthcare Informatics Research</w:t>
+      </w:r>
+      <w:r>
+        <w:t xml:space="preserve">, 10(2), 2026.</w:t>
+      </w:r>
+      <w:r>
+        <w:t xml:space="preserve"> </w:t>
+      </w:r>
+      <w:hyperlink r:id="rId69">
+        <w:r>
+          <w:rPr>
+            <w:rStyle w:val="Hyperlink"/>
+          </w:rPr>
+          <w:t xml:space="preserve">doi:10.1007/s41666-026-00229-9</w:t>
+        </w:r>
+      </w:hyperlink>
+    </w:p>
     <w:bookmarkEnd w:id="70"/>
+    <w:bookmarkEnd w:id="71"/>
     <w:sectPr>
       <w:footerReference w:type="default" r:id="rId10"/>
       <w:pgSz w:h="15840" w:w="12240"/>

</xml_diff>

<commit_message>
Polish (no new data): make the framework an explicit six-dimension decision space after Figure 1 (source grounding, channel, controlled properties, generation strategy, downstream task, evaluation regime), each mapped to a design choice; clarify title/scope (nine studies train on synthetic communication, the adaptive-questioning study uses it as an evaluation testbed). Counting/label sweep verified clean (Tables 1-20 + Figures 1-6 all captioned and referenced once). Rebuild all artifacts
Co-Authored-By: Claude Opus 4.8 <noreply@anthropic.com>
</commit_message>
<xml_diff>
--- a/paper-1col.docx
+++ b/paper-1col.docx
@@ -806,6 +806,188 @@
         <w:widowControl w:val="1"/>
       </w:pPr>
       <w:r>
+        <w:t xml:space="preserve">Read as a framework rather than a diagram, the pipeline exposes six decision dimensions, each of which forces</w:t>
+      </w:r>
+      <w:r>
+        <w:t xml:space="preserve"> </w:t>
+      </w:r>
+      <w:r>
+        <w:t xml:space="preserve">a concrete design choice: (i) </w:t>
+      </w:r>
+      <w:r>
+        <w:rPr>
+          <w:b/>
+          <w:bCs/>
+        </w:rPr>
+        <w:t xml:space="preserve">source grounding</w:t>
+      </w:r>
+      <w:r>
+        <w:t xml:space="preserve">, how tightly generation is tied to real records,</w:t>
+      </w:r>
+      <w:r>
+        <w:t xml:space="preserve"> </w:t>
+      </w:r>
+      <w:r>
+        <w:t xml:space="preserve">labels, or scenarios, which sets the ceiling on factual fidelity (Section 2.2); (ii) </w:t>
+      </w:r>
+      <w:r>
+        <w:rPr>
+          <w:b/>
+          <w:bCs/>
+        </w:rPr>
+        <w:t xml:space="preserve">communication</w:t>
+      </w:r>
+      <w:r>
+        <w:rPr>
+          <w:b/>
+          <w:bCs/>
+        </w:rPr>
+        <w:t xml:space="preserve"> </w:t>
+      </w:r>
+      <w:r>
+        <w:rPr>
+          <w:b/>
+          <w:bCs/>
+        </w:rPr>
+        <w:t xml:space="preserve">channel</w:t>
+      </w:r>
+      <w:r>
+        <w:t xml:space="preserve">, which fixes the participants, register, and failure modes to reproduce (Section 2.1);</w:t>
+      </w:r>
+      <w:r>
+        <w:t xml:space="preserve"> </w:t>
+      </w:r>
+      <w:r>
+        <w:t xml:space="preserve">(iii) </w:t>
+      </w:r>
+      <w:r>
+        <w:rPr>
+          <w:b/>
+          <w:bCs/>
+        </w:rPr>
+        <w:t xml:space="preserve">controlled communication properties</w:t>
+      </w:r>
+      <w:r>
+        <w:t xml:space="preserve">, the role, intent, uncertainty, missingness, style, and</w:t>
+      </w:r>
+      <w:r>
+        <w:t xml:space="preserve"> </w:t>
+      </w:r>
+      <w:r>
+        <w:t xml:space="preserve">noise deliberately injected (Section 2.2); (iv) </w:t>
+      </w:r>
+      <w:r>
+        <w:rPr>
+          <w:b/>
+          <w:bCs/>
+        </w:rPr>
+        <w:t xml:space="preserve">generation strategy</w:t>
+      </w:r>
+      <w:r>
+        <w:t xml:space="preserve">, from single-shot</w:t>
+      </w:r>
+      <w:r>
+        <w:t xml:space="preserve"> </w:t>
+      </w:r>
+      <w:r>
+        <w:t xml:space="preserve">prompting to multi-agent simulation and audio-plus-ASR degradation, traded against cost and diversity;</w:t>
+      </w:r>
+      <w:r>
+        <w:t xml:space="preserve"> </w:t>
+      </w:r>
+      <w:r>
+        <w:t xml:space="preserve">(v) </w:t>
+      </w:r>
+      <w:r>
+        <w:rPr>
+          <w:b/>
+          <w:bCs/>
+        </w:rPr>
+        <w:t xml:space="preserve">downstream task</w:t>
+      </w:r>
+      <w:r>
+        <w:t xml:space="preserve">, training, augmentation, or evaluation, which determines what labels the</w:t>
+      </w:r>
+      <w:r>
+        <w:t xml:space="preserve"> </w:t>
+      </w:r>
+      <w:r>
+        <w:t xml:space="preserve">generator must carry; and (vi) </w:t>
+      </w:r>
+      <w:r>
+        <w:rPr>
+          <w:b/>
+          <w:bCs/>
+        </w:rPr>
+        <w:t xml:space="preserve">evaluation regime</w:t>
+      </w:r>
+      <w:r>
+        <w:t xml:space="preserve">,</w:t>
+      </w:r>
+      <w:r>
+        <w:t xml:space="preserve"> </w:t>
+      </w:r>
+      <w:r>
+        <w:rPr>
+          <w:i/>
+          <w:iCs/>
+        </w:rPr>
+        <w:t xml:space="preserve">S→S</w:t>
+      </w:r>
+      <w:r>
+        <w:t xml:space="preserve">,</w:t>
+      </w:r>
+      <w:r>
+        <w:t xml:space="preserve"> </w:t>
+      </w:r>
+      <w:r>
+        <w:rPr>
+          <w:i/>
+          <w:iCs/>
+        </w:rPr>
+        <w:t xml:space="preserve">R+S→R</w:t>
+      </w:r>
+      <w:r>
+        <w:t xml:space="preserve">, or</w:t>
+      </w:r>
+      <w:r>
+        <w:t xml:space="preserve"> </w:t>
+      </w:r>
+      <w:r>
+        <w:rPr>
+          <w:i/>
+          <w:iCs/>
+        </w:rPr>
+        <w:t xml:space="preserve">S→R</w:t>
+      </w:r>
+      <w:r>
+        <w:t xml:space="preserve"> </w:t>
+      </w:r>
+      <w:r>
+        <w:t xml:space="preserve">(Section 2.3), which decides how far a result can be trusted. The ten application studies</w:t>
+      </w:r>
+      <w:r>
+        <w:t xml:space="preserve"> </w:t>
+      </w:r>
+      <w:r>
+        <w:t xml:space="preserve">(Section 3) are points in this space; the choices they share are distilled into the reusable design</w:t>
+      </w:r>
+      <w:r>
+        <w:t xml:space="preserve"> </w:t>
+      </w:r>
+      <w:r>
+        <w:t xml:space="preserve">patterns of Table 18 and the channel recipe at the end of Section 2.</w:t>
+      </w:r>
+    </w:p>
+    <w:p>
+      <w:pPr>
+        <w:pStyle w:val="BodyText"/>
+        <w:jc w:val="both"/>
+        <w:keepNext w:val="0"/>
+        <w:keepLines w:val="0"/>
+        <w:widowControl w:val="1"/>
+      </w:pPr>
+      <w:r>
         <w:t xml:space="preserve">Within this scope we include patient–clinician conversations, doctor-to-patient instructions,</w:t>
       </w:r>
       <w:r>
@@ -9032,7 +9214,13 @@
         <w:t xml:space="preserve"> </w:t>
       </w:r>
       <w:r>
-        <w:t xml:space="preserve">it. They are illustrative rather than exhaustive, selected to span the channels of Section 2 rather than through systematic sampling.</w:t>
+        <w:t xml:space="preserve">it; nine train a downstream model on the synthetic communication, while the adaptive diagnostic-questioning</w:t>
+      </w:r>
+      <w:r>
+        <w:t xml:space="preserve"> </w:t>
+      </w:r>
+      <w:r>
+        <w:t xml:space="preserve">study (Section 3.1.2) uses it as an evaluation testbed rather than for training. They are illustrative rather than exhaustive, selected to span the channels of Section 2 rather than through systematic sampling.</w:t>
       </w:r>
       <w:r>
         <w:t xml:space="preserve"> </w:t>

</xml_diff>

<commit_message>
Review-method transparency (narrative review, honest): name the actual discovery tools (Google Scholar + arXiv/PubMed/ACL Anthology + snowballing), add a non-exhaustiveness disclaimer so per-task counts read as within-corpus relative attention rather than field-wide prevalence, and soften the Section 2.4 count sentence accordingly. No fabricated PRISMA protocol. Rebuild all artifacts
Co-Authored-By: Claude Opus 4.8 <noreply@anthropic.com>
</commit_message>
<xml_diff>
--- a/paper-1col.docx
+++ b/paper-1col.docx
@@ -2401,13 +2401,19 @@
         <w:t xml:space="preserve"> </w:t>
       </w:r>
       <w:r>
-        <w:t xml:space="preserve">work through targeted searches of arXiv, PubMed/MEDLINE, and the ACL Anthology, supplemented by forward and</w:t>
-      </w:r>
-      <w:r>
-        <w:t xml:space="preserve"> </w:t>
-      </w:r>
-      <w:r>
-        <w:t xml:space="preserve">backward citation tracing and by browsing recent issues of the venues where this work concentrates (npj</w:t>
+        <w:t xml:space="preserve">work through targeted keyword searches of Google Scholar, arXiv, PubMed/MEDLINE, and the ACL Anthology,</w:t>
+      </w:r>
+      <w:r>
+        <w:t xml:space="preserve"> </w:t>
+      </w:r>
+      <w:r>
+        <w:t xml:space="preserve">supplemented by forward and backward citation tracing (snowballing) and by browsing recent issues of the</w:t>
+      </w:r>
+      <w:r>
+        <w:t xml:space="preserve"> </w:t>
+      </w:r>
+      <w:r>
+        <w:t xml:space="preserve">venues where this work concentrates (npj</w:t>
       </w:r>
       <w:r>
         <w:t xml:space="preserve"> </w:t>
@@ -2437,7 +2443,25 @@
         <w:t xml:space="preserve"> </w:t>
       </w:r>
       <w:r>
-        <w:t xml:space="preserve">or which only classifies existing text without generating communication, is excluded. The application</w:t>
+        <w:t xml:space="preserve">or which only classifies existing text without generating communication, is excluded. This process is deliberately non-exhaustive: coverage reflects</w:t>
+      </w:r>
+      <w:r>
+        <w:t xml:space="preserve"> </w:t>
+      </w:r>
+      <w:r>
+        <w:t xml:space="preserve">targeted search rather than a preregistered protocol, so where Section 2.4 counts works by task, those are</w:t>
+      </w:r>
+      <w:r>
+        <w:t xml:space="preserve"> </w:t>
+      </w:r>
+      <w:r>
+        <w:t xml:space="preserve">counts within the reviewed set, indicating relative attention among the papers surveyed rather than field-wide</w:t>
+      </w:r>
+      <w:r>
+        <w:t xml:space="preserve"> </w:t>
+      </w:r>
+      <w:r>
+        <w:t xml:space="preserve">prevalence. The application</w:t>
       </w:r>
       <w:r>
         <w:t xml:space="preserve"> </w:t>
@@ -9031,25 +9055,31 @@
         <w:widowControl w:val="1"/>
       </w:pPr>
       <w:r>
-        <w:t xml:space="preserve">Counted across these task rows, the surveyed work concentrates in patient simulation and professional</w:t>
-      </w:r>
-      <w:r>
-        <w:t xml:space="preserve"> </w:t>
-      </w:r>
-      <w:r>
-        <w:t xml:space="preserve">training (fourteen representative works), summarization (ten), and information extraction and benchmark</w:t>
-      </w:r>
-      <w:r>
-        <w:t xml:space="preserve"> </w:t>
-      </w:r>
-      <w:r>
-        <w:t xml:space="preserve">construction (nine each), with privacy, augmentation, and distillation cutting across (twelve); triage and</w:t>
-      </w:r>
-      <w:r>
-        <w:t xml:space="preserve"> </w:t>
-      </w:r>
-      <w:r>
-        <w:t xml:space="preserve">routing, clinical coding, and handoff are comparatively sparse (five, two, and one). The application studies</w:t>
+        <w:t xml:space="preserve">Counted across these task rows within the reviewed corpus (a targeted, non-exhaustive set rather than a</w:t>
+      </w:r>
+      <w:r>
+        <w:t xml:space="preserve"> </w:t>
+      </w:r>
+      <w:r>
+        <w:t xml:space="preserve">census), attention concentrates in patient simulation and professional training (fourteen works),</w:t>
+      </w:r>
+      <w:r>
+        <w:t xml:space="preserve"> </w:t>
+      </w:r>
+      <w:r>
+        <w:t xml:space="preserve">summarization (ten), and information extraction and benchmark construction (nine each), with privacy,</w:t>
+      </w:r>
+      <w:r>
+        <w:t xml:space="preserve"> </w:t>
+      </w:r>
+      <w:r>
+        <w:t xml:space="preserve">augmentation, and distillation cutting across (twelve); triage and routing, clinical coding, and handoff are</w:t>
+      </w:r>
+      <w:r>
+        <w:t xml:space="preserve"> </w:t>
+      </w:r>
+      <w:r>
+        <w:t xml:space="preserve">comparatively sparse (five, two, and one). The application studies</w:t>
       </w:r>
       <w:r>
         <w:t xml:space="preserve"> </w:t>

</xml_diff>

<commit_message>
Final JHIR consistency pass (GPTConsult minor-revision items, no new data): retitle to drop 'Models Trained on' and make scope 'trained, augmented, or evaluated' (Figure 1, Table 7 caption, intro definition, Figure 1 regimes); fix stale post-trim counts (3.2 six->five, 3.3 three->two); reconcile medication provenance across 3.2.4/Table 20/Data Availability (augmentation not redistributed); temper Table 18 synthesis rows (encoders-beat-zeroshot restricted to real comparisons + postpartum counterexample; degraded synthetic not real; source-fixed labels judged where used); soften abstract over-claims and the 'macro-F1 throughout' metric claim. bibtest 110/110. Rebuild all artifacts
Co-Authored-By: Claude Opus 4.8 <noreply@anthropic.com>
</commit_message>
<xml_diff>
--- a/paper-1col.docx
+++ b/paper-1col.docx
@@ -2,7 +2,7 @@
 <file path=word/document.xml><?xml version="1.0" encoding="utf-8"?>
 <w:document xmlns:w="http://schemas.openxmlformats.org/wordprocessingml/2006/main" xmlns:m="http://schemas.openxmlformats.org/officeDocument/2006/math" xmlns:r="http://schemas.openxmlformats.org/officeDocument/2006/relationships" xmlns:o="urn:schemas-microsoft-com:office:office" xmlns:v="urn:schemas-microsoft-com:vml" xmlns:w10="urn:schemas-microsoft-com:office:word" xmlns:a="http://schemas.openxmlformats.org/drawingml/2006/main" xmlns:pic="http://schemas.openxmlformats.org/drawingml/2006/picture" xmlns:wp="http://schemas.openxmlformats.org/drawingml/2006/wordprocessingDrawing">
   <w:body>
-    <w:bookmarkStart w:id="71" w:name="Xb3a8dbe493eb8229387b81cb07551ee4828e1fd"/>
+    <w:bookmarkStart w:id="71" w:name="X0a411cfada4dbb0782a2cde052a7779ea98e81b"/>
     <w:p>
       <w:pPr>
         <w:pStyle w:val="Title"/>
@@ -13,7 +13,7 @@
         <w:widowControl w:val="1"/>
       </w:pPr>
       <w:r>
-        <w:t xml:space="preserve">Clinical Communication Processing with Models Trained on LLM-Generated Synthetic Data: A Framework, Structured Survey, and Ten Application Case Studies</w:t>
+        <w:t xml:space="preserve">Clinical Communication Processing with LLM-Generated Synthetic Data: A Framework, Structured Survey, and Ten Application Case Studies</w:t>
       </w:r>
     </w:p>
     <w:p>
@@ -237,7 +237,7 @@
         <w:t xml:space="preserve"> </w:t>
       </w:r>
       <w:r>
-        <w:t xml:space="preserve">showing that synthetic communication can bootstrap systems that could not otherwise be trained.</w:t>
+        <w:t xml:space="preserve">showing that synthetic communication can bootstrap systems for channels and languages that real labeled data does not reach.</w:t>
       </w:r>
       <w:r>
         <w:t xml:space="preserve"> </w:t>
@@ -277,13 +277,7 @@
         <w:t xml:space="preserve"> </w:t>
       </w:r>
       <w:r>
-        <w:t xml:space="preserve">result); four seed generation from real structured</w:t>
-      </w:r>
-      <w:r>
-        <w:t xml:space="preserve"> </w:t>
-      </w:r>
-      <w:r>
-        <w:t xml:space="preserve">data; and the rest evaluate on held-out synthetic communication. None of the ten is a pure</w:t>
+        <w:t xml:space="preserve">result); four seed generation from real datasets or clinical records; and the rest evaluate on held-out synthetic communication. None of the ten is a pure</w:t>
       </w:r>
       <w:r>
         <w:t xml:space="preserve"> </w:t>
@@ -690,7 +684,7 @@
         <w:t xml:space="preserve"> </w:t>
       </w:r>
       <w:r>
-        <w:t xml:space="preserve">trained, wholly or in part, on such synthetic data. The word</w:t>
+        <w:t xml:space="preserve">trained, augmented, or evaluated, wholly or in part, on such synthetic data. The word</w:t>
       </w:r>
       <w:r>
         <w:t xml:space="preserve"> </w:t>
@@ -794,7 +788,7 @@
           <w:b w:val="0"/>
           <w:i/>
         </w:rPr>
-        <w:t>The organizing pipeline of this survey. A clinical source of any format is realized by an LLM, under controlled communication properties, into synthetic communication across channels, on which a downstream model is trained and then evaluated in the S→S regime or, less often, by transfer to real text (S→R).</w:t>
+        <w:t>The organizing pipeline of this survey. A clinical source of any format is realized by an LLM, under controlled communication properties, into synthetic communication across channels, on which a downstream model is trained, augmented, or evaluated, and assessed in the S→S, R+S→R, or S→R regime (Section 2.3).</w:t>
       </w:r>
     </w:p>
     <w:p>
@@ -6919,7 +6913,7 @@
         <w:t xml:space="preserve"> </w:t>
       </w:r>
       <w:r>
-        <w:t xml:space="preserve">Table 5. Throughout Section 3 the headline downstream metric is macro-averaged F1, which weights</w:t>
+        <w:t xml:space="preserve">Table 5. Across most Section 3 studies the principal classification metric is macro-averaged F1, which weights</w:t>
       </w:r>
       <w:r>
         <w:t xml:space="preserve"> </w:t>
@@ -9375,7 +9369,7 @@
           <w:b w:val="0"/>
           <w:i/>
         </w:rPr>
-        <w:t>Clinical-communication processing studies, by channel, using models trained on LLM-generated synthetic data. Generators are the LLMs used to synthesize the training text; results are the headline downstream metric.</w:t>
+        <w:t>Clinical-communication processing studies, by channel, using models trained, augmented, or evaluated on LLM-generated synthetic data. Generators are the LLMs used to synthesize the training text; results are the headline downstream metric.</w:t>
       </w:r>
     </w:p>
     <w:tbl>
@@ -9384,7 +9378,7 @@
         <w:tblW w:type="pct" w:w="5000"/>
         <w:jc w:val="center"/>
         <w:tblLook w:firstRow="1" w:lastRow="0" w:firstColumn="0" w:lastColumn="0" w:noHBand="0" w:noVBand="0" w:val="0020"/>
-        <w:tblCaption w:val="Table 7. Clinical-communication processing studies, by channel, using models trained on LLM-generated synthetic data. Generators are the LLMs used to synthesize the training text; results are the headline downstream metric."/>
+        <w:tblCaption w:val="Table 7. Clinical-communication processing studies, by channel, using models trained, augmented, or evaluated on LLM-generated synthetic data. Generators are the LLMs used to synthesize the training text; results are the headline downstream metric."/>
         <w:tblLayout w:type="autofit"/>
         <w:tblBorders>
           <w:top w:val="single" w:sz="10" w:color="4F6272"/>
@@ -13483,7 +13477,7 @@
         <w:t xml:space="preserve">[67]</w:t>
       </w:r>
       <w:r>
-        <w:t xml:space="preserve">. The six studies below span triage, severity scoring, distress</w:t>
+        <w:t xml:space="preserve">. The five studies below span triage, severity scoring, distress</w:t>
       </w:r>
       <w:r>
         <w:t xml:space="preserve"> </w:t>
@@ -16759,7 +16753,7 @@
         <w:t xml:space="preserve"> </w:t>
       </w:r>
       <w:r>
-        <w:t xml:space="preserve">appeared only lately, and dedicated synthetic SBAR corpora remain largely absent. The three studies below</w:t>
+        <w:t xml:space="preserve">appeared only lately, and dedicated synthetic SBAR corpora remain largely absent. The two studies below</w:t>
       </w:r>
       <w:r>
         <w:t xml:space="preserve"> </w:t>
@@ -21271,7 +21265,7 @@
                 <w:rFonts w:ascii="Times New Roman" w:hAnsi="Times New Roman"/>
                 <w:sz w:val="19"/>
               </w:rPr>
-              <w:t xml:space="preserve">Fine-tuned encoders over zero-shot LLMs</w:t>
+              <w:t xml:space="preserve">Fine-tuned encoders often beat evaluated zero-shot baselines</w:t>
             </w:r>
           </w:p>
         </w:tc>
@@ -21300,7 +21294,7 @@
                 <w:rFonts w:ascii="Times New Roman" w:hAnsi="Times New Roman"/>
                 <w:sz w:val="19"/>
               </w:rPr>
-              <w:t xml:space="preserve">A small encoder fine-tuned on synthetic data outperforms the evaluated zero-shot LLM baselines on the downstream task</w:t>
+              <w:t xml:space="preserve">A small encoder fine-tuned on synthetic data often outperforms the evaluated zero-shot LLM baseline, though not universally (the postpartum study, §3.2.2, is a counterexample)</w:t>
             </w:r>
           </w:p>
         </w:tc>
@@ -21329,7 +21323,7 @@
                 <w:rFonts w:ascii="Times New Roman" w:hAnsi="Times New Roman"/>
                 <w:sz w:val="19"/>
               </w:rPr>
-              <w:t xml:space="preserve">§3.1.1, §3.1.3, §3.2.1, §3.2.3, §3.2.4, §3.3.1, §3.3.2</w:t>
+              <w:t xml:space="preserve">§3.2.1, §3.2.3, §3.2.4, §3.3.2</w:t>
             </w:r>
           </w:p>
         </w:tc>
@@ -21389,7 +21383,7 @@
                 <w:rFonts w:ascii="Times New Roman" w:hAnsi="Times New Roman"/>
                 <w:sz w:val="19"/>
               </w:rPr>
-              <w:t xml:space="preserve">Injecting noise, recognition errors, or omissions into the synthetic text trains models that hold up on degraded real-world input</w:t>
+              <w:t xml:space="preserve">Injecting noise, recognition errors, or omissions into the synthetic text trains models that hold up on held-out degraded synthetic input intended to mimic real-world noise</w:t>
             </w:r>
           </w:p>
         </w:tc>
@@ -21449,7 +21443,7 @@
                 <w:rFonts w:ascii="Times New Roman" w:hAnsi="Times New Roman"/>
                 <w:sz w:val="19"/>
               </w:rPr>
-              <w:t xml:space="preserve">Labels fixed at generation, audited by a judge</w:t>
+              <w:t xml:space="preserve">Source-fixed labels, audited where a judge is used</w:t>
             </w:r>
           </w:p>
         </w:tc>
@@ -21478,7 +21472,7 @@
                 <w:rFonts w:ascii="Times New Roman" w:hAnsi="Times New Roman"/>
                 <w:sz w:val="19"/>
               </w:rPr>
-              <w:t xml:space="preserve">Gold labels are emitted with the text and an independent LLM judge audits quality, giving both control and label reliability</w:t>
+              <w:t xml:space="preserve">Gold labels are emitted with or derived from the source scenario; where used, an LLM judge audits label quality, giving both control and reliability</w:t>
             </w:r>
           </w:p>
         </w:tc>
@@ -22591,13 +22585,13 @@
         <w:widowControl w:val="1"/>
       </w:pPr>
       <w:r>
-        <w:t xml:space="preserve">The datasets, generation scripts, and model configurations for all ten application</w:t>
-      </w:r>
-      <w:r>
-        <w:t xml:space="preserve"> </w:t>
-      </w:r>
-      <w:r>
-        <w:t xml:space="preserve">studies in Section 3 are shared publicly in the paper's repository under</w:t>
+        <w:t xml:space="preserve">The publicly shareable datasets and artifacts, generation scripts, and model configurations for the ten</w:t>
+      </w:r>
+      <w:r>
+        <w:t xml:space="preserve"> </w:t>
+      </w:r>
+      <w:r>
+        <w:t xml:space="preserve">application studies in Section 3 are provided in the paper's repository under</w:t>
       </w:r>
       <w:r>
         <w:t xml:space="preserve"> </w:t>
@@ -24468,7 +24462,7 @@
                 <w:rFonts w:ascii="Times New Roman" w:hAnsi="Times New Roman"/>
                 <w:sz w:val="18"/>
               </w:rPr>
-              <w:t xml:space="preserve">real labels + synthetic augmentation + reproduce.py</w:t>
+              <w:t xml:space="preserve">reproduce.py + real-labeled test set; synthetic augmentation not redistributed</w:t>
             </w:r>
           </w:p>
         </w:tc>

</xml_diff>

<commit_message>
Tighten abstract to a single 229-word unstructured paragraph for JHIR (150-250 word limit), review-led framing per GPTConsult: lead with the review + source-to-communication-to-model framework and its comparison axes; cases as worked instantiations; keep the graded real-world-grounding spectrum with the R+S->R anchor and none-pure-S->R limitation; soften the closing to 'motivates stronger transfer/safety/privacy/reproducibility standards'. Rebuild all artifacts
Co-Authored-By: Claude Opus 4.8 <noreply@anthropic.com>
</commit_message>
<xml_diff>
--- a/paper-1col.docx
+++ b/paper-1col.docx
@@ -134,137 +134,7 @@
         <w:widowControl w:val="1"/>
       </w:pPr>
       <w:r>
-        <w:t xml:space="preserve">A great deal of clinical value is conveyed not through structured records but through communication:</w:t>
-      </w:r>
-      <w:r>
-        <w:t xml:space="preserve"> </w:t>
-      </w:r>
-      <w:r>
-        <w:t xml:space="preserve">the spoken and written exchanges in which patients describe symptoms, clinicians reason and give</w:t>
-      </w:r>
-      <w:r>
-        <w:t xml:space="preserve"> </w:t>
-      </w:r>
-      <w:r>
-        <w:t xml:space="preserve">instructions, ambulances hand over to emergency departments, and nurses pass on a shift. Such language</w:t>
-      </w:r>
-      <w:r>
-        <w:t xml:space="preserve"> </w:t>
-      </w:r>
-      <w:r>
-        <w:t xml:space="preserve">differs from tabular data because meaning depends on speaker role, intent, causality, uncertainty,</w:t>
-      </w:r>
-      <w:r>
-        <w:t xml:space="preserve"> </w:t>
-      </w:r>
-      <w:r>
-        <w:t xml:space="preserve">omission, and channel noise, and healthcare natural language processing (NLP) must interpret information</w:t>
-      </w:r>
-      <w:r>
-        <w:t xml:space="preserve"> </w:t>
-      </w:r>
-      <w:r>
-        <w:t xml:space="preserve">as it is conveyed rather than as it is coded. Learning to do so requires large, diverse, and</w:t>
-      </w:r>
-      <w:r>
-        <w:t xml:space="preserve"> </w:t>
-      </w:r>
-      <w:r>
-        <w:t xml:space="preserve">well-annotated corpora of clinical communication, which are scarce: authentic exchanges are private,</w:t>
-      </w:r>
-      <w:r>
-        <w:t xml:space="preserve"> </w:t>
-      </w:r>
-      <w:r>
-        <w:t xml:space="preserve">fragmented across channels, and costly to annotate. Large language models offer a way forward, because</w:t>
-      </w:r>
-      <w:r>
-        <w:t xml:space="preserve"> </w:t>
-      </w:r>
-      <w:r>
-        <w:t xml:space="preserve">they can transform structured or documentary clinical sources, such as records, diagnostic labels,</w:t>
-      </w:r>
-      <w:r>
-        <w:t xml:space="preserve"> </w:t>
-      </w:r>
-      <w:r>
-        <w:t xml:space="preserve">symptom lists, or care plans, into written and transcribed spoken communication for downstream models.</w:t>
-      </w:r>
-    </w:p>
-    <w:p>
-      <w:pPr>
-        <w:pStyle w:val="BodyText"/>
-        <w:ind w:left="720" w:right="720" w:firstLine="0"/>
-        <w:jc w:val="both"/>
-        <w:keepNext w:val="0"/>
-        <w:keepLines w:val="0"/>
-        <w:widowControl w:val="1"/>
-      </w:pPr>
-      <w:r>
-        <w:t xml:space="preserve">Our central contribution is an organizing framework for this emerging area: a</w:t>
-      </w:r>
-      <w:r>
-        <w:t xml:space="preserve"> </w:t>
-      </w:r>
-      <w:r>
-        <w:t xml:space="preserve">source-to-communication-to-model pipeline paired with a taxonomy of clinical-communication channels,</w:t>
-      </w:r>
-      <w:r>
-        <w:t xml:space="preserve"> </w:t>
-      </w:r>
-      <w:r>
-        <w:t xml:space="preserve">which we develop into a structured narrative survey organized by source representation, communication</w:t>
-      </w:r>
-      <w:r>
-        <w:t xml:space="preserve"> </w:t>
-      </w:r>
-      <w:r>
-        <w:t xml:space="preserve">form and participants, generation method, and downstream task. We instantiate and stress-test the framework through ten</w:t>
-      </w:r>
-      <w:r>
-        <w:t xml:space="preserve"> </w:t>
-      </w:r>
-      <w:r>
-        <w:t xml:space="preserve">application case studies that build clinical NLP systems for communication channels and languages where</w:t>
-      </w:r>
-      <w:r>
-        <w:t xml:space="preserve"> </w:t>
-      </w:r>
-      <w:r>
-        <w:t xml:space="preserve">labeled real-world data is scarce, restricted, or absent, spanning EMS pre-arrival reports, nurse handoffs, and patient-portal triage, and</w:t>
-      </w:r>
-      <w:r>
-        <w:t xml:space="preserve"> </w:t>
-      </w:r>
-      <w:r>
-        <w:t xml:space="preserve">showing that synthetic communication can bootstrap systems for channels and languages that real labeled data does not reach.</w:t>
-      </w:r>
-      <w:r>
-        <w:t xml:space="preserve"> </w:t>
-      </w:r>
-      <w:r>
-        <w:t xml:space="preserve">Recurring observations include the competitiveness of fine-tuned encoder models over evaluated zero-shot</w:t>
-      </w:r>
-      <w:r>
-        <w:t xml:space="preserve"> </w:t>
-      </w:r>
-      <w:r>
-        <w:t xml:space="preserve">baselines and the value of deliberately degraded communication for robustness. The ten studies span a graded real-world-grounding spectrum: one augments labeled real training data with</w:t>
-      </w:r>
-      <w:r>
-        <w:t xml:space="preserve"> </w:t>
-      </w:r>
-      <w:r>
-        <w:t xml:space="preserve">synthetic critical cases and evaluates on authentic patient-authored text (a medication-question classifier,</w:t>
-      </w:r>
-      <w:r>
-        <w:t xml:space="preserve"> </w:t>
-      </w:r>
-      <w:r>
-        <w:t xml:space="preserve">our real-test augmentation anchor, an</w:t>
-      </w:r>
-      <w:r>
-        <w:t xml:space="preserve"> </w:t>
+        <w:t xml:space="preserve">Clinical value is often conveyed through communication rather than structured records: patients describe symptoms, clinicians reason and instruct, ambulances hand over to emergency departments, and nurses transfer responsibility across shifts. Modeling such language is difficult because meaning depends on speaker role, intent, uncertainty, omission, and channel noise, while annotated clinical-communication corpora remain scarce, private, and fragmented. This review examines the emerging use of large language models (LLMs) to generate synthetic written and transcribed clinical communication for downstream natural language processing (NLP). We organize the literature around a source-to-communication-to-model framework and a taxonomy of clinical-communication channels, giving a structured basis for comparing source grounding, communication channel, generation strategy, downstream modeling, and evaluation regime. Ten application case studies serve as worked instantiations of the framework, building clinical NLP for channels that lack labeled real-world data, including emergency-services pre-arrival reports, nurse handoffs, and patient-portal triage. Across these studies, fine-tuned encoder models are competitive with evaluated zero-shot baselines, and deliberately degrading the synthetic communication can improve robustness. The cases also define a graded spectrum of real-world grounding: one uses real-plus-synthetic training with evaluation on authentic patient text (</w:t>
       </w:r>
       <w:r>
         <w:rPr>
@@ -274,16 +144,7 @@
         <w:t xml:space="preserve">R+S→R</w:t>
       </w:r>
       <w:r>
-        <w:t xml:space="preserve"> </w:t>
-      </w:r>
-      <w:r>
-        <w:t xml:space="preserve">result); four seed generation from real datasets or clinical records; and the rest evaluate on held-out synthetic communication. None of the ten is a pure</w:t>
-      </w:r>
-      <w:r>
-        <w:t xml:space="preserve"> </w:t>
-      </w:r>
-      <w:r>
-        <w:t xml:space="preserve">train-on-synthetic, test-on-real (</w:t>
+        <w:t xml:space="preserve">), four ground generation in real datasets or records, and the rest evaluate on held-out synthetic data. None constitutes a pure train-on-synthetic, test-on-real (</w:t>
       </w:r>
       <w:r>
         <w:rPr>
@@ -293,25 +154,7 @@
         <w:t xml:space="preserve">S→R</w:t>
       </w:r>
       <w:r>
-        <w:t xml:space="preserve">) demonstration, so establishing that evidence is the</w:t>
-      </w:r>
-      <w:r>
-        <w:t xml:space="preserve"> </w:t>
-      </w:r>
-      <w:r>
-        <w:t xml:space="preserve">clearly marked next step rather than a hidden gap. We conclude that synthetic clinical communication is</w:t>
-      </w:r>
-      <w:r>
-        <w:t xml:space="preserve"> </w:t>
-      </w:r>
-      <w:r>
-        <w:t xml:space="preserve">becoming a practical research resource; establishing it as reusable clinical infrastructure will build on</w:t>
-      </w:r>
-      <w:r>
-        <w:t xml:space="preserve"> </w:t>
-      </w:r>
-      <w:r>
-        <w:t xml:space="preserve">authentic-data transfer together with attention to safety, privacy, and external validation.</w:t>
+        <w:t xml:space="preserve">) evaluation. This gap identifies the central validation challenge for synthetic clinical communication and motivates stronger authentic-data transfer, safety, privacy, and reproducibility standards.</w:t>
       </w:r>
     </w:p>
     <w:bookmarkStart w:id="12" w:name="s1"/>

</xml_diff>

<commit_message>
Fix consistency/factual issues from the from-scratch GPTConsult review: Table 7 home-care 0.97->0.94 (match reproduced 3.2.5) and SBAR ClinicalBERT->BioClinicalBERT; conclusion 'one further study'->four real-seeded studies; remove intro over-claim 'does not invent clinical truth' (contradicted 4.1); macro-F1 'the right summary'->'a useful primary summary'; reduce 'decisive' repetition. Rebuild all artifacts
Co-Authored-By: Claude Opus 4.8 <noreply@anthropic.com>
</commit_message>
<xml_diff>
--- a/paper-1col.docx
+++ b/paper-1col.docx
@@ -403,13 +403,13 @@
         <w:t xml:space="preserve"> </w:t>
       </w:r>
       <w:r>
-        <w:t xml:space="preserve">demand, optionally carrying their own annotations. Importantly, the source defines the intended facts and</w:t>
-      </w:r>
-      <w:r>
-        <w:t xml:space="preserve"> </w:t>
-      </w:r>
-      <w:r>
-        <w:t xml:space="preserve">the generator realizes them in language; the model does not invent clinical truth. This capability turns</w:t>
+        <w:t xml:space="preserve">demand, optionally carrying their own annotations. The source defines the intended facts and</w:t>
+      </w:r>
+      <w:r>
+        <w:t xml:space="preserve"> </w:t>
+      </w:r>
+      <w:r>
+        <w:t xml:space="preserve">the generator realizes them in language, though the generator may still distort or hallucinate those facts (Section 4.1). This capability turns</w:t>
       </w:r>
       <w:r>
         <w:t xml:space="preserve"> </w:t>
@@ -6762,7 +6762,7 @@
         <w:t xml:space="preserve"> </w:t>
       </w:r>
       <w:r>
-        <w:t xml:space="preserve">every class equally and is therefore the right summary for the imbalanced, safety-critical classes typical</w:t>
+        <w:t xml:space="preserve">every class equally and is therefore a useful primary summary for the imbalanced, safety-critical classes typical</w:t>
       </w:r>
       <w:r>
         <w:t xml:space="preserve"> </w:t>
@@ -10570,7 +10570,7 @@
                 <w:rFonts w:ascii="Times New Roman" w:hAnsi="Times New Roman"/>
                 <w:sz w:val="19"/>
               </w:rPr>
-              <w:t xml:space="preserve">LightGBM + TF-IDF fusion 0.97 F1</w:t>
+              <w:t xml:space="preserve">LightGBM + TF-IDF fusion 0.94 F1</w:t>
             </w:r>
           </w:p>
         </w:tc>
@@ -10864,7 +10864,7 @@
                 <w:rFonts w:ascii="Times New Roman" w:hAnsi="Times New Roman"/>
                 <w:sz w:val="19"/>
               </w:rPr>
-              <w:t xml:space="preserve">ClinicalBERT class-F1 0.75; hierarchical 0.79</w:t>
+              <w:t xml:space="preserve">BioClinicalBERT class-F1 0.75; hierarchical 0.79</w:t>
             </w:r>
           </w:p>
         </w:tc>
@@ -22332,7 +22332,7 @@
         <w:t xml:space="preserve"> </w:t>
       </w:r>
       <w:r>
-        <w:t xml:space="preserve">patient-authored questions; one further study grounds generation in real clinical records, tracing EMS routing to MIMIC-IV cases (Section 3.3.1). No study provides a pure</w:t>
+        <w:t xml:space="preserve">patient-authored questions; four further studies seed generation from real datasets or records (Sections 3.1.1, 3.1.2, 3.1.3, and 3.3.1, the last tracing EMS routing to MIMIC-IV cases). No study provides a pure</w:t>
       </w:r>
       <w:r>
         <w:t xml:space="preserve"> </w:t>
@@ -22354,13 +22354,13 @@
         <w:t xml:space="preserve"> </w:t>
       </w:r>
       <w:r>
-        <w:t xml:space="preserve">Even so, the decisive evidence, strong performance when a model is trained end-to-end on synthetic</w:t>
-      </w:r>
-      <w:r>
-        <w:t xml:space="preserve"> </w:t>
-      </w:r>
-      <w:r>
-        <w:t xml:space="preserve">communication and tested on real communication, is the field's decisive next step. Advancing it, alongside progress on hallucination</w:t>
+        <w:t xml:space="preserve">Even so, the strongest evidence, strong performance when a model is trained end-to-end on synthetic</w:t>
+      </w:r>
+      <w:r>
+        <w:t xml:space="preserve"> </w:t>
+      </w:r>
+      <w:r>
+        <w:t xml:space="preserve">communication and tested on real communication, is the field's central next step. Advancing it, alongside progress on hallucination</w:t>
       </w:r>
       <w:r>
         <w:t xml:space="preserve"> </w:t>

</xml_diff>

<commit_message>
Add verified DOIs to 5 identifier-less references (GPTeach 10.1145/3573051.3593393, Holderried 10.2196/53961, Asgari 10.1038/s41746-025-01670-7, MIMIC-IV-ED 10.13026/5ntk-km72, Diaz Ochoa 10.3389/fdgth.2025.1623922) so they resolve regardless of title-parse; red review-highlight preserved. Rebuild all artifacts
</commit_message>
<xml_diff>
--- a/paper-1col.docx
+++ b/paper-1col.docx
@@ -2,7 +2,7 @@
 <file path=word/document.xml><?xml version="1.0" encoding="utf-8"?>
 <w:document xmlns:w="http://schemas.openxmlformats.org/wordprocessingml/2006/main" xmlns:m="http://schemas.openxmlformats.org/officeDocument/2006/math" xmlns:r="http://schemas.openxmlformats.org/officeDocument/2006/relationships" xmlns:o="urn:schemas-microsoft-com:office:office" xmlns:v="urn:schemas-microsoft-com:vml" xmlns:w10="urn:schemas-microsoft-com:office:word" xmlns:a="http://schemas.openxmlformats.org/drawingml/2006/main" xmlns:pic="http://schemas.openxmlformats.org/drawingml/2006/picture" xmlns:wp="http://schemas.openxmlformats.org/drawingml/2006/wordprocessingDrawing">
   <w:body>
-    <w:bookmarkStart w:id="71" w:name="X0a411cfada4dbb0782a2cde052a7779ea98e81b"/>
+    <w:bookmarkStart w:id="76" w:name="X0a411cfada4dbb0782a2cde052a7779ea98e81b"/>
     <w:p>
       <w:pPr>
         <w:pStyle w:val="Title"/>
@@ -26637,7 +26637,7 @@
       </w:r>
     </w:p>
     <w:bookmarkEnd w:id="64"/>
-    <w:bookmarkStart w:id="70" w:name="references"/>
+    <w:bookmarkStart w:id="75" w:name="references"/>
     <w:p>
       <w:pPr>
         <w:pStyle w:val="ReferencesHeading"/>
@@ -28666,6 +28666,20 @@
         </w:rPr>
         <w:t xml:space="preserve">Markel J, Opferman S, Landay J, Piech C (2023) GPTeach: Interactive TA Training with GPT-based Students. ACM Learning@Scale.</w:t>
       </w:r>
+      <w:r>
+        <w:rPr>
+          <w:color w:val="CC0000"/>
+        </w:rPr>
+        <w:t xml:space="preserve"> </w:t>
+      </w:r>
+      <w:hyperlink r:id="rId68">
+        <w:r>
+          <w:rPr>
+            <w:rStyle w:val="Hyperlink"/>
+          </w:rPr>
+          <w:t xml:space="preserve">https://doi.org/10.1145/3573051.3593393</w:t>
+        </w:r>
+      </w:hyperlink>
     </w:p>
     <w:p>
       <w:pPr>
@@ -28741,6 +28755,20 @@
         </w:rPr>
         <w:t xml:space="preserve">Holderried F, et al (2024) A Generative Pretrained Transformer (GPT)-Powered Chatbot as a Simulated Patient to Practice History Taking. JMIR Medical Education.</w:t>
       </w:r>
+      <w:r>
+        <w:rPr>
+          <w:color w:val="CC0000"/>
+        </w:rPr>
+        <w:t xml:space="preserve"> </w:t>
+      </w:r>
+      <w:hyperlink r:id="rId69">
+        <w:r>
+          <w:rPr>
+            <w:rStyle w:val="Hyperlink"/>
+          </w:rPr>
+          <w:t xml:space="preserve">https://doi.org/10.2196/53961</w:t>
+        </w:r>
+      </w:hyperlink>
     </w:p>
     <w:p>
       <w:pPr>
@@ -28872,7 +28900,7 @@
         </w:rPr>
         <w:t xml:space="preserve"> </w:t>
       </w:r>
-      <w:hyperlink r:id="rId68">
+      <w:hyperlink r:id="rId70">
         <w:r>
           <w:rPr>
             <w:rStyle w:val="Hyperlink"/>
@@ -29130,6 +29158,20 @@
         </w:rPr>
         <w:t xml:space="preserve">Asgari E, Montaña-Brown N, Dubois M, et al (2025) A framework to assess clinical safety and hallucination rates of LLMs for medical text summarisation. npj Digital Medicine.</w:t>
       </w:r>
+      <w:r>
+        <w:rPr>
+          <w:color w:val="CC0000"/>
+        </w:rPr>
+        <w:t xml:space="preserve"> </w:t>
+      </w:r>
+      <w:hyperlink r:id="rId71">
+        <w:r>
+          <w:rPr>
+            <w:rStyle w:val="Hyperlink"/>
+          </w:rPr>
+          <w:t xml:space="preserve">https://doi.org/10.1038/s41746-025-01670-7</w:t>
+        </w:r>
+      </w:hyperlink>
     </w:p>
     <w:p>
       <w:pPr>
@@ -29161,7 +29203,7 @@
         </w:rPr>
         <w:t xml:space="preserve"> </w:t>
       </w:r>
-      <w:hyperlink r:id="rId69">
+      <w:hyperlink r:id="rId72">
         <w:r>
           <w:rPr>
             <w:rStyle w:val="Hyperlink"/>
@@ -29194,6 +29236,20 @@
         </w:rPr>
         <w:t xml:space="preserve">Johnson A, et al (2023) MIMIC-IV-ED (v2.2). PhysioNet.</w:t>
       </w:r>
+      <w:r>
+        <w:rPr>
+          <w:color w:val="CC0000"/>
+        </w:rPr>
+        <w:t xml:space="preserve"> </w:t>
+      </w:r>
+      <w:hyperlink r:id="rId73">
+        <w:r>
+          <w:rPr>
+            <w:rStyle w:val="Hyperlink"/>
+          </w:rPr>
+          <w:t xml:space="preserve">https://doi.org/10.13026/5ntk-km72</w:t>
+        </w:r>
+      </w:hyperlink>
     </w:p>
     <w:p>
       <w:pPr>
@@ -29469,9 +29525,23 @@
         </w:rPr>
         <w:t xml:space="preserve">Diaz Ochoa J, Layer N, Mahr J, Mustafa F, et al (2025) Optimized BERT-based NLP outperforms zero-shot methods for automated symptom detection in clinical practice. Frontiers in Digital Health.</w:t>
       </w:r>
+      <w:r>
+        <w:rPr>
+          <w:color w:val="CC0000"/>
+        </w:rPr>
+        <w:t xml:space="preserve"> </w:t>
+      </w:r>
+      <w:hyperlink r:id="rId74">
+        <w:r>
+          <w:rPr>
+            <w:rStyle w:val="Hyperlink"/>
+          </w:rPr>
+          <w:t xml:space="preserve">https://doi.org/10.3389/fdgth.2025.1623922</w:t>
+        </w:r>
+      </w:hyperlink>
     </w:p>
-    <w:bookmarkEnd w:id="70"/>
-    <w:bookmarkEnd w:id="71"/>
+    <w:bookmarkEnd w:id="75"/>
+    <w:bookmarkEnd w:id="76"/>
     <w:sectPr>
       <w:footerReference w:type="default" r:id="rId10"/>
       <w:pgSz w:h="15840" w:w="12240"/>

</xml_diff>

<commit_message>
Deep-review cycle: fix consistency + tone/style (GPTConsult): remove duplicate Rao reference and re-renumber to first appearance (110->109); abstract lists all six framework dimensions (downstream task); title 'Structured Survey'->'Structured Review'; drop 'scoping-style'; reconcile Data-availability vs Table 20; soften over-claims (channel-can-be-served, could-not-otherwise, privacy burdens, novelty 'no prior review'->'among reviews we identified'); de-jargon (up-generated, multi-agent-play, characteristic-way, earns-its-value, well-positioned); rename Figure 6 file fig7->fig6; trim cover-letter-style three-track sentence. Rebuild all artifacts
Co-Authored-By: Claude Opus 4.8 <noreply@anthropic.com>
</commit_message>
<xml_diff>
--- a/paper-1col.docx
+++ b/paper-1col.docx
@@ -2,7 +2,7 @@
 <file path=word/document.xml><?xml version="1.0" encoding="utf-8"?>
 <w:document xmlns:w="http://schemas.openxmlformats.org/wordprocessingml/2006/main" xmlns:m="http://schemas.openxmlformats.org/officeDocument/2006/math" xmlns:r="http://schemas.openxmlformats.org/officeDocument/2006/relationships" xmlns:o="urn:schemas-microsoft-com:office:office" xmlns:v="urn:schemas-microsoft-com:vml" xmlns:w10="urn:schemas-microsoft-com:office:word" xmlns:a="http://schemas.openxmlformats.org/drawingml/2006/main" xmlns:pic="http://schemas.openxmlformats.org/drawingml/2006/picture" xmlns:wp="http://schemas.openxmlformats.org/drawingml/2006/wordprocessingDrawing">
   <w:body>
-    <w:bookmarkStart w:id="76" w:name="X0a411cfada4dbb0782a2cde052a7779ea98e81b"/>
+    <w:bookmarkStart w:id="76" w:name="X9973f8a238724931489ceba3674175793b6a264"/>
     <w:p>
       <w:pPr>
         <w:pStyle w:val="Title"/>
@@ -13,7 +13,7 @@
         <w:widowControl w:val="1"/>
       </w:pPr>
       <w:r>
-        <w:t xml:space="preserve">Clinical Communication Processing with LLM-Generated Synthetic Data: A Framework, Structured Survey, and Ten Application Case Studies</w:t>
+        <w:t xml:space="preserve">Clinical Communication Processing with LLM-Generated Synthetic Data: A Framework, Structured Review, and Ten Application Case Studies</w:t>
       </w:r>
     </w:p>
     <w:p>
@@ -138,7 +138,7 @@
         <w:widowControl w:val="1"/>
       </w:pPr>
       <w:r>
-        <w:t xml:space="preserve">Clinical value is often conveyed through communication rather than structured records: patients describe symptoms, clinicians reason and instruct, ambulances hand over to emergency departments, and nurses transfer responsibility across shifts. Modeling such language is difficult because meaning depends on speaker role, intent, uncertainty, omission, and channel noise, while annotated clinical-communication corpora remain scarce, private, and fragmented. This review examines the emerging use of large language models (LLMs) to generate synthetic written and transcribed clinical communication for downstream natural language processing (NLP). We organize the literature around a source-to-communication-to-model framework and a taxonomy of clinical-communication channels, giving a structured basis for comparing source grounding, communication channel, generation strategy, downstream modeling, and evaluation regime. Ten application case studies serve as worked instantiations of the framework, building clinical NLP for channels that lack labeled real-world data, including emergency-services pre-arrival reports, nurse handoffs, and patient-portal triage. Across these studies, fine-tuned encoder models are competitive with evaluated zero-shot baselines, and deliberately degrading the synthetic communication can improve robustness. The cases also define a graded spectrum of real-world grounding: one uses real-plus-synthetic training with evaluation on authentic patient text (</w:t>
+        <w:t xml:space="preserve">Clinical value is often conveyed through communication rather than structured records: patients describe symptoms, clinicians reason and instruct, ambulances hand over to emergency departments, and nurses transfer responsibility across shifts. Modeling such language is difficult because meaning depends on speaker role, intent, uncertainty, omission, and channel noise, while annotated clinical-communication corpora remain scarce, private, and fragmented. This review examines the emerging use of large language models (LLMs) to generate synthetic written and transcribed clinical communication for downstream natural language processing (NLP). We organize the literature around a source-to-communication-to-model framework and a taxonomy of clinical-communication channels, giving a structured basis for comparing source grounding, communication channel, controlled communication properties, generation strategy, downstream task, and evaluation regime. Ten application case studies serve as worked instantiations of the framework, building clinical NLP for channels that lack labeled real-world data, including emergency-services pre-arrival reports, nurse handoffs, and patient-portal triage. Across these studies, fine-tuned encoder models are competitive with evaluated zero-shot baselines, and deliberately degrading the synthetic communication can improve robustness. The cases also define a graded spectrum of real-world grounding: one uses real-plus-synthetic training with evaluation on authentic patient text (</w:t>
       </w:r>
       <w:r>
         <w:rPr>
@@ -968,13 +968,7 @@
         <w:t xml:space="preserve"> </w:t>
       </w:r>
       <w:r>
-        <w:t xml:space="preserve">real-world data is scarce, restricted, or absent (demonstrating feasibility where models could not otherwise</w:t>
-      </w:r>
-      <w:r>
-        <w:t xml:space="preserve"> </w:t>
-      </w:r>
-      <w:r>
-        <w:t xml:space="preserve">be trained), and distill from them reusable</w:t>
+        <w:t xml:space="preserve">real-world data is scarce, restricted, or absent (demonstrating feasibility in settings where labeled authentic data are scarce or inaccessible), and distill from them reusable</w:t>
       </w:r>
       <w:r>
         <w:t xml:space="preserve"> </w:t>
@@ -1171,7 +1165,7 @@
           <w:color w:val="CC0000"/>
           <w:vertAlign w:val="superscript"/>
         </w:rPr>
-        <w:t xml:space="preserve">[24]</w:t>
+        <w:t xml:space="preserve">[11]</w:t>
       </w:r>
       <w:r>
         <w:t xml:space="preserve">. Table 1 sets this survey against the closest prior reviews.</w:t>
@@ -1205,7 +1199,7 @@
           <w:b w:val="0"/>
           <w:i/>
         </w:rPr>
-        <w:t>Coverage of the closest prior reviews. No prior review organizes the field by clinical-communication channel across the full set, and none pairs the survey with its own application studies.</w:t>
+        <w:t>Coverage of the closest prior reviews. Among the reviews we identified, none organizes the field by clinical-communication channel across the full set, and none pairs the survey with its own application studies.</w:t>
       </w:r>
     </w:p>
     <w:tbl>
@@ -1214,7 +1208,7 @@
         <w:tblW w:type="pct" w:w="5000"/>
         <w:jc w:val="center"/>
         <w:tblLook w:firstRow="1" w:lastRow="0" w:firstColumn="0" w:lastColumn="0" w:noHBand="0" w:noVBand="0" w:val="0020"/>
-        <w:tblCaption w:val="Table 1. Coverage of the closest prior reviews. No prior review organizes the field by clinical-communication channel across the full set, and none pairs the survey with its own application studies."/>
+        <w:tblCaption w:val="Table 1. Coverage of the closest prior reviews. Among the reviews we identified, none organizes the field by clinical-communication channel across the full set, and none pairs the survey with its own application studies."/>
         <w:tblLayout w:type="autofit"/>
         <w:tblBorders>
           <w:top w:val="single" w:sz="10" w:color="4F6272"/>
@@ -2066,7 +2060,7 @@
                 <w:color w:val="CC0000"/>
                 <w:sz w:val="19"/>
               </w:rPr>
-              <w:t xml:space="preserve">[24]</w:t>
+              <w:t xml:space="preserve">[11]</w:t>
             </w:r>
           </w:p>
         </w:tc>
@@ -2444,7 +2438,7 @@
           <w:color w:val="CC0000"/>
           <w:vertAlign w:val="superscript"/>
         </w:rPr>
-        <w:t xml:space="preserve">[25,18,19,26]</w:t>
+        <w:t xml:space="preserve">[24,18,19,25]</w:t>
       </w:r>
       <w:r>
         <w:t xml:space="preserve">,</w:t>
@@ -2460,7 +2454,7 @@
           <w:color w:val="CC0000"/>
           <w:vertAlign w:val="superscript"/>
         </w:rPr>
-        <w:t xml:space="preserve">[27]</w:t>
+        <w:t xml:space="preserve">[26]</w:t>
       </w:r>
       <w:r>
         <w:t xml:space="preserve">. Information extraction</w:t>
@@ -2476,7 +2470,7 @@
           <w:color w:val="CC0000"/>
           <w:vertAlign w:val="superscript"/>
         </w:rPr>
-        <w:t xml:space="preserve">[28]</w:t>
+        <w:t xml:space="preserve">[27]</w:t>
       </w:r>
       <w:r>
         <w:t xml:space="preserve"> </w:t>
@@ -2495,7 +2489,7 @@
           <w:color w:val="CC0000"/>
           <w:vertAlign w:val="superscript"/>
         </w:rPr>
-        <w:t xml:space="preserve">[29,30]</w:t>
+        <w:t xml:space="preserve">[28,29]</w:t>
       </w:r>
       <w:r>
         <w:t xml:space="preserve">; machine learning on the audio</w:t>
@@ -2517,7 +2511,7 @@
           <w:color w:val="CC0000"/>
           <w:vertAlign w:val="superscript"/>
         </w:rPr>
-        <w:t xml:space="preserve">[31,32]</w:t>
+        <w:t xml:space="preserve">[30,31]</w:t>
       </w:r>
       <w:r>
         <w:t xml:space="preserve">; and patient-portal messages are increasingly triaged and routed</w:t>
@@ -2533,7 +2527,7 @@
           <w:color w:val="CC0000"/>
           <w:vertAlign w:val="superscript"/>
         </w:rPr>
-        <w:t xml:space="preserve">[33]</w:t>
+        <w:t xml:space="preserve">[32]</w:t>
       </w:r>
       <w:r>
         <w:t xml:space="preserve">. What these lines share is a dependence on scarce,</w:t>
@@ -2590,13 +2584,7 @@
         <w:t xml:space="preserve"> </w:t>
       </w:r>
       <w:r>
-        <w:t xml:space="preserve">speaking to whom, under what time pressure, and through what medium, and each with its own</w:t>
-      </w:r>
-      <w:r>
-        <w:t xml:space="preserve"> </w:t>
-      </w:r>
-      <w:r>
-        <w:t xml:space="preserve">characteristic way. A patient–clinician conversation is a two-party, turn-taking exchange in which</w:t>
+        <w:t xml:space="preserve">speaking to whom, under what time pressure, and through what medium, and each with its own characteristic linguistic, operational, and noise patterns. A patient–clinician conversation is a two-party, turn-taking exchange in which</w:t>
       </w:r>
       <w:r>
         <w:t xml:space="preserve"> </w:t>
@@ -4162,7 +4150,7 @@
           <w:color w:val="CC0000"/>
           <w:vertAlign w:val="superscript"/>
         </w:rPr>
-        <w:t xml:space="preserve">[25]</w:t>
+        <w:t xml:space="preserve">[24]</w:t>
       </w:r>
       <w:r>
         <w:t xml:space="preserve"> </w:t>
@@ -6355,7 +6343,7 @@
         <w:t xml:space="preserve"> </w:t>
       </w:r>
       <w:r>
-        <w:t xml:space="preserve">published, and reused without the consent and de-identification burdens that lock away real conversations.</w:t>
+        <w:t xml:space="preserve">published, and reused with much lower consent and de-identification burdens, subject to source provenance, memorization risk, and data governance.</w:t>
       </w:r>
       <w:r>
         <w:t xml:space="preserve"> </w:t>
@@ -6379,7 +6367,7 @@
         <w:t xml:space="preserve"> </w:t>
       </w:r>
       <w:r>
-        <w:t xml:space="preserve">underrepresented classes can be up-generated to correct imbalance. Finally, it enables controlled</w:t>
+        <w:t xml:space="preserve">underrepresented classes can be synthetically oversampled to reduce class imbalance. Finally, it enables controlled</w:t>
       </w:r>
       <w:r>
         <w:t xml:space="preserve"> </w:t>
@@ -6454,7 +6442,7 @@
           <w:color w:val="CC0000"/>
           <w:vertAlign w:val="superscript"/>
         </w:rPr>
-        <w:t xml:space="preserve">[34]</w:t>
+        <w:t xml:space="preserve">[33]</w:t>
       </w:r>
       <w:r>
         <w:t xml:space="preserve">. It is fast and flexible, but its</w:t>
@@ -6530,7 +6518,7 @@
           <w:color w:val="CC0000"/>
           <w:vertAlign w:val="superscript"/>
         </w:rPr>
-        <w:t xml:space="preserve">[17,35,36,37,38]</w:t>
+        <w:t xml:space="preserve">[17,34,35,36,37]</w:t>
       </w:r>
       <w:r>
         <w:t xml:space="preserve">,</w:t>
@@ -6610,7 +6598,7 @@
           <w:color w:val="CC0000"/>
           <w:vertAlign w:val="superscript"/>
         </w:rPr>
-        <w:t xml:space="preserve">[39]</w:t>
+        <w:t xml:space="preserve">[38]</w:t>
       </w:r>
       <w:r>
         <w:t xml:space="preserve">,</w:t>
@@ -6657,7 +6645,7 @@
           <w:color w:val="CC0000"/>
           <w:vertAlign w:val="superscript"/>
         </w:rPr>
-        <w:t xml:space="preserve">[40,41]</w:t>
+        <w:t xml:space="preserve">[39,40]</w:t>
       </w:r>
       <w:r>
         <w:t xml:space="preserve">. Augmentation is cheap and preserves gold labels, and</w:t>
@@ -6684,7 +6672,7 @@
         <w:t xml:space="preserve"> </w:t>
       </w:r>
       <w:r>
-        <w:t xml:space="preserve">sampling to fix the case, template scaffolding to shape the document, multi-agent play to voice it, and a</w:t>
+        <w:t xml:space="preserve">sampling to fix the case, template scaffolding to shape the document, multi-agent simulation to realize the interaction, and a</w:t>
       </w:r>
       <w:r>
         <w:t xml:space="preserve"> </w:t>
@@ -6746,7 +6734,7 @@
           <w:color w:val="CC0000"/>
           <w:vertAlign w:val="superscript"/>
         </w:rPr>
-        <w:t xml:space="preserve">[42]</w:t>
+        <w:t xml:space="preserve">[41]</w:t>
       </w:r>
       <w:r>
         <w:t xml:space="preserve">. A weaker but more flexible alternative runs a second labeling pass, or</w:t>
@@ -6768,7 +6756,7 @@
           <w:color w:val="CC0000"/>
           <w:vertAlign w:val="superscript"/>
         </w:rPr>
-        <w:t xml:space="preserve">[43]</w:t>
+        <w:t xml:space="preserve">[42]</w:t>
       </w:r>
       <w:r>
         <w:t xml:space="preserve">. The scenario parameters used during generation can also be retained as</w:t>
@@ -7640,7 +7628,7 @@
           <w:color w:val="CC0000"/>
           <w:vertAlign w:val="superscript"/>
         </w:rPr>
-        <w:t xml:space="preserve">[44]</w:t>
+        <w:t xml:space="preserve">[43]</w:t>
       </w:r>
       <w:r>
         <w:t xml:space="preserve">,</w:t>
@@ -7662,7 +7650,7 @@
           <w:color w:val="CC0000"/>
           <w:vertAlign w:val="superscript"/>
         </w:rPr>
-        <w:t xml:space="preserve">[45]</w:t>
+        <w:t xml:space="preserve">[44]</w:t>
       </w:r>
       <w:r>
         <w:t xml:space="preserve">. This</w:t>
@@ -7734,7 +7722,7 @@
           <w:color w:val="CC0000"/>
           <w:vertAlign w:val="superscript"/>
         </w:rPr>
-        <w:t xml:space="preserve">[46]</w:t>
+        <w:t xml:space="preserve">[45]</w:t>
       </w:r>
       <w:r>
         <w:t xml:space="preserve">.</w:t>
@@ -7815,7 +7803,7 @@
           <w:color w:val="CC0000"/>
           <w:vertAlign w:val="superscript"/>
         </w:rPr>
-        <w:t xml:space="preserve">[47]</w:t>
+        <w:t xml:space="preserve">[46]</w:t>
       </w:r>
       <w:r>
         <w:t xml:space="preserve">, a setting also studied for noisy user-generated and</w:t>
@@ -7831,7 +7819,7 @@
           <w:color w:val="CC0000"/>
           <w:vertAlign w:val="superscript"/>
         </w:rPr>
-        <w:t xml:space="preserve">[48,49]</w:t>
+        <w:t xml:space="preserve">[47,48]</w:t>
       </w:r>
       <w:r>
         <w:t xml:space="preserve">; comparing text content through a question-answering</w:t>
@@ -7847,7 +7835,7 @@
           <w:color w:val="CC0000"/>
           <w:vertAlign w:val="superscript"/>
         </w:rPr>
-        <w:t xml:space="preserve">[50]</w:t>
+        <w:t xml:space="preserve">[49]</w:t>
       </w:r>
       <w:r>
         <w:t xml:space="preserve">, as in QA- and NLI-based consistency checking</w:t>
@@ -7857,7 +7845,7 @@
           <w:color w:val="CC0000"/>
           <w:vertAlign w:val="superscript"/>
         </w:rPr>
-        <w:t xml:space="preserve">[51,52,53]</w:t>
+        <w:t xml:space="preserve">[50,51,52]</w:t>
       </w:r>
       <w:r>
         <w:t xml:space="preserve">;</w:t>
@@ -7873,7 +7861,7 @@
           <w:color w:val="CC0000"/>
           <w:vertAlign w:val="superscript"/>
         </w:rPr>
-        <w:t xml:space="preserve">[54]</w:t>
+        <w:t xml:space="preserve">[53]</w:t>
       </w:r>
       <w:r>
         <w:t xml:space="preserve">, paralleling</w:t>
@@ -7889,7 +7877,7 @@
           <w:color w:val="CC0000"/>
           <w:vertAlign w:val="superscript"/>
         </w:rPr>
-        <w:t xml:space="preserve">[55,56]</w:t>
+        <w:t xml:space="preserve">[54,55]</w:t>
       </w:r>
       <w:r>
         <w:t xml:space="preserve">; and measuring the</w:t>
@@ -7905,7 +7893,7 @@
           <w:color w:val="CC0000"/>
           <w:vertAlign w:val="superscript"/>
         </w:rPr>
-        <w:t xml:space="preserve">[57]</w:t>
+        <w:t xml:space="preserve">[56]</w:t>
       </w:r>
       <w:r>
         <w:t xml:space="preserve">, a problem with a deep line in symptom-</w:t>
@@ -7921,7 +7909,7 @@
           <w:color w:val="CC0000"/>
           <w:vertAlign w:val="superscript"/>
         </w:rPr>
-        <w:t xml:space="preserve">[58,59,60,61]</w:t>
+        <w:t xml:space="preserve">[57,58,59,60]</w:t>
       </w:r>
       <w:r>
         <w:t xml:space="preserve">. Even aspect-based</w:t>
@@ -7937,7 +7925,7 @@
           <w:color w:val="CC0000"/>
           <w:vertAlign w:val="superscript"/>
         </w:rPr>
-        <w:t xml:space="preserve">[62]</w:t>
+        <w:t xml:space="preserve">[61]</w:t>
       </w:r>
       <w:r>
         <w:t xml:space="preserve">,</w:t>
@@ -8215,6 +8203,160 @@
                 <w:color w:val="CC0000"/>
                 <w:sz w:val="19"/>
               </w:rPr>
+              <w:t xml:space="preserve">[62]</w:t>
+            </w:r>
+            <w:r>
+              <w:rPr>
+                <w:rFonts w:ascii="Times New Roman" w:hAnsi="Times New Roman"/>
+                <w:sz w:val="19"/>
+              </w:rPr>
+              <w:t xml:space="preserve">,</w:t>
+            </w:r>
+            <w:r>
+              <w:rPr>
+                <w:rFonts w:ascii="Times New Roman" w:hAnsi="Times New Roman"/>
+                <w:sz w:val="19"/>
+              </w:rPr>
+              <w:t xml:space="preserve"> </w:t>
+            </w:r>
+            <w:r>
+              <w:rPr>
+                <w:rFonts w:ascii="Times New Roman" w:hAnsi="Times New Roman"/>
+                <w:color w:val="CC0000"/>
+                <w:sz w:val="19"/>
+              </w:rPr>
+              <w:t xml:space="preserve">[53]</w:t>
+            </w:r>
+            <w:r>
+              <w:rPr>
+                <w:rFonts w:ascii="Times New Roman" w:hAnsi="Times New Roman"/>
+                <w:sz w:val="19"/>
+              </w:rPr>
+              <w:t xml:space="preserve">,</w:t>
+            </w:r>
+            <w:r>
+              <w:rPr>
+                <w:rFonts w:ascii="Times New Roman" w:hAnsi="Times New Roman"/>
+                <w:sz w:val="19"/>
+              </w:rPr>
+              <w:t xml:space="preserve"> </w:t>
+            </w:r>
+            <w:r>
+              <w:rPr>
+                <w:rFonts w:ascii="Times New Roman" w:hAnsi="Times New Roman"/>
+                <w:color w:val="CC0000"/>
+                <w:sz w:val="19"/>
+              </w:rPr>
+              <w:t xml:space="preserve">[46]</w:t>
+            </w:r>
+            <w:r>
+              <w:rPr>
+                <w:rFonts w:ascii="Times New Roman" w:hAnsi="Times New Roman"/>
+                <w:sz w:val="19"/>
+              </w:rPr>
+              <w:t xml:space="preserve">,</w:t>
+            </w:r>
+            <w:r>
+              <w:rPr>
+                <w:rFonts w:ascii="Times New Roman" w:hAnsi="Times New Roman"/>
+                <w:sz w:val="19"/>
+              </w:rPr>
+              <w:t xml:space="preserve"> </w:t>
+            </w:r>
+            <w:r>
+              <w:rPr>
+                <w:rFonts w:ascii="Times New Roman" w:hAnsi="Times New Roman"/>
+                <w:color w:val="CC0000"/>
+                <w:sz w:val="19"/>
+              </w:rPr>
+              <w:t xml:space="preserve">[47]</w:t>
+            </w:r>
+            <w:r>
+              <w:rPr>
+                <w:rFonts w:ascii="Times New Roman" w:hAnsi="Times New Roman"/>
+                <w:sz w:val="19"/>
+              </w:rPr>
+              <w:t xml:space="preserve">,</w:t>
+            </w:r>
+            <w:r>
+              <w:rPr>
+                <w:rFonts w:ascii="Times New Roman" w:hAnsi="Times New Roman"/>
+                <w:sz w:val="19"/>
+              </w:rPr>
+              <w:t xml:space="preserve"> </w:t>
+            </w:r>
+            <w:r>
+              <w:rPr>
+                <w:rFonts w:ascii="Times New Roman" w:hAnsi="Times New Roman"/>
+                <w:color w:val="CC0000"/>
+                <w:sz w:val="19"/>
+              </w:rPr>
+              <w:t xml:space="preserve">[48]</w:t>
+            </w:r>
+            <w:r>
+              <w:rPr>
+                <w:rFonts w:ascii="Times New Roman" w:hAnsi="Times New Roman"/>
+                <w:sz w:val="19"/>
+              </w:rPr>
+              <w:t xml:space="preserve">,</w:t>
+            </w:r>
+            <w:r>
+              <w:rPr>
+                <w:rFonts w:ascii="Times New Roman" w:hAnsi="Times New Roman"/>
+                <w:sz w:val="19"/>
+              </w:rPr>
+              <w:t xml:space="preserve"> </w:t>
+            </w:r>
+            <w:r>
+              <w:rPr>
+                <w:rFonts w:ascii="Times New Roman" w:hAnsi="Times New Roman"/>
+                <w:color w:val="CC0000"/>
+                <w:sz w:val="19"/>
+              </w:rPr>
+              <w:t xml:space="preserve">[54]</w:t>
+            </w:r>
+            <w:r>
+              <w:rPr>
+                <w:rFonts w:ascii="Times New Roman" w:hAnsi="Times New Roman"/>
+                <w:sz w:val="19"/>
+              </w:rPr>
+              <w:t xml:space="preserve">,</w:t>
+            </w:r>
+            <w:r>
+              <w:rPr>
+                <w:rFonts w:ascii="Times New Roman" w:hAnsi="Times New Roman"/>
+                <w:sz w:val="19"/>
+              </w:rPr>
+              <w:t xml:space="preserve"> </w:t>
+            </w:r>
+            <w:r>
+              <w:rPr>
+                <w:rFonts w:ascii="Times New Roman" w:hAnsi="Times New Roman"/>
+                <w:color w:val="CC0000"/>
+                <w:sz w:val="19"/>
+              </w:rPr>
+              <w:t xml:space="preserve">[55]</w:t>
+            </w:r>
+            <w:r>
+              <w:rPr>
+                <w:rFonts w:ascii="Times New Roman" w:hAnsi="Times New Roman"/>
+                <w:sz w:val="19"/>
+              </w:rPr>
+              <w:t xml:space="preserve">,</w:t>
+            </w:r>
+            <w:r>
+              <w:rPr>
+                <w:rFonts w:ascii="Times New Roman" w:hAnsi="Times New Roman"/>
+                <w:sz w:val="19"/>
+              </w:rPr>
+              <w:t xml:space="preserve"> </w:t>
+            </w:r>
+            <w:r>
+              <w:rPr>
+                <w:rFonts w:ascii="Times New Roman" w:hAnsi="Times New Roman"/>
+                <w:color w:val="CC0000"/>
+                <w:sz w:val="19"/>
+              </w:rPr>
               <w:t xml:space="preserve">[63]</w:t>
             </w:r>
             <w:r>
@@ -8237,161 +8379,7 @@
                 <w:color w:val="CC0000"/>
                 <w:sz w:val="19"/>
               </w:rPr>
-              <w:t xml:space="preserve">[54]</w:t>
-            </w:r>
-            <w:r>
-              <w:rPr>
-                <w:rFonts w:ascii="Times New Roman" w:hAnsi="Times New Roman"/>
-                <w:sz w:val="19"/>
-              </w:rPr>
-              <w:t xml:space="preserve">,</w:t>
-            </w:r>
-            <w:r>
-              <w:rPr>
-                <w:rFonts w:ascii="Times New Roman" w:hAnsi="Times New Roman"/>
-                <w:sz w:val="19"/>
-              </w:rPr>
-              <w:t xml:space="preserve"> </w:t>
-            </w:r>
-            <w:r>
-              <w:rPr>
-                <w:rFonts w:ascii="Times New Roman" w:hAnsi="Times New Roman"/>
-                <w:color w:val="CC0000"/>
-                <w:sz w:val="19"/>
-              </w:rPr>
-              <w:t xml:space="preserve">[47]</w:t>
-            </w:r>
-            <w:r>
-              <w:rPr>
-                <w:rFonts w:ascii="Times New Roman" w:hAnsi="Times New Roman"/>
-                <w:sz w:val="19"/>
-              </w:rPr>
-              <w:t xml:space="preserve">,</w:t>
-            </w:r>
-            <w:r>
-              <w:rPr>
-                <w:rFonts w:ascii="Times New Roman" w:hAnsi="Times New Roman"/>
-                <w:sz w:val="19"/>
-              </w:rPr>
-              <w:t xml:space="preserve"> </w:t>
-            </w:r>
-            <w:r>
-              <w:rPr>
-                <w:rFonts w:ascii="Times New Roman" w:hAnsi="Times New Roman"/>
-                <w:color w:val="CC0000"/>
-                <w:sz w:val="19"/>
-              </w:rPr>
-              <w:t xml:space="preserve">[48]</w:t>
-            </w:r>
-            <w:r>
-              <w:rPr>
-                <w:rFonts w:ascii="Times New Roman" w:hAnsi="Times New Roman"/>
-                <w:sz w:val="19"/>
-              </w:rPr>
-              <w:t xml:space="preserve">,</w:t>
-            </w:r>
-            <w:r>
-              <w:rPr>
-                <w:rFonts w:ascii="Times New Roman" w:hAnsi="Times New Roman"/>
-                <w:sz w:val="19"/>
-              </w:rPr>
-              <w:t xml:space="preserve"> </w:t>
-            </w:r>
-            <w:r>
-              <w:rPr>
-                <w:rFonts w:ascii="Times New Roman" w:hAnsi="Times New Roman"/>
-                <w:color w:val="CC0000"/>
-                <w:sz w:val="19"/>
-              </w:rPr>
-              <w:t xml:space="preserve">[49]</w:t>
-            </w:r>
-            <w:r>
-              <w:rPr>
-                <w:rFonts w:ascii="Times New Roman" w:hAnsi="Times New Roman"/>
-                <w:sz w:val="19"/>
-              </w:rPr>
-              <w:t xml:space="preserve">,</w:t>
-            </w:r>
-            <w:r>
-              <w:rPr>
-                <w:rFonts w:ascii="Times New Roman" w:hAnsi="Times New Roman"/>
-                <w:sz w:val="19"/>
-              </w:rPr>
-              <w:t xml:space="preserve"> </w:t>
-            </w:r>
-            <w:r>
-              <w:rPr>
-                <w:rFonts w:ascii="Times New Roman" w:hAnsi="Times New Roman"/>
-                <w:color w:val="CC0000"/>
-                <w:sz w:val="19"/>
-              </w:rPr>
-              <w:t xml:space="preserve">[55]</w:t>
-            </w:r>
-            <w:r>
-              <w:rPr>
-                <w:rFonts w:ascii="Times New Roman" w:hAnsi="Times New Roman"/>
-                <w:sz w:val="19"/>
-              </w:rPr>
-              <w:t xml:space="preserve">,</w:t>
-            </w:r>
-            <w:r>
-              <w:rPr>
-                <w:rFonts w:ascii="Times New Roman" w:hAnsi="Times New Roman"/>
-                <w:sz w:val="19"/>
-              </w:rPr>
-              <w:t xml:space="preserve"> </w:t>
-            </w:r>
-            <w:r>
-              <w:rPr>
-                <w:rFonts w:ascii="Times New Roman" w:hAnsi="Times New Roman"/>
-                <w:color w:val="CC0000"/>
-                <w:sz w:val="19"/>
-              </w:rPr>
-              <w:t xml:space="preserve">[56]</w:t>
-            </w:r>
-            <w:r>
-              <w:rPr>
-                <w:rFonts w:ascii="Times New Roman" w:hAnsi="Times New Roman"/>
-                <w:sz w:val="19"/>
-              </w:rPr>
-              <w:t xml:space="preserve">,</w:t>
-            </w:r>
-            <w:r>
-              <w:rPr>
-                <w:rFonts w:ascii="Times New Roman" w:hAnsi="Times New Roman"/>
-                <w:sz w:val="19"/>
-              </w:rPr>
-              <w:t xml:space="preserve"> </w:t>
-            </w:r>
-            <w:r>
-              <w:rPr>
-                <w:rFonts w:ascii="Times New Roman" w:hAnsi="Times New Roman"/>
-                <w:color w:val="CC0000"/>
-                <w:sz w:val="19"/>
-              </w:rPr>
-              <w:t xml:space="preserve">[64]</w:t>
-            </w:r>
-            <w:r>
-              <w:rPr>
-                <w:rFonts w:ascii="Times New Roman" w:hAnsi="Times New Roman"/>
-                <w:sz w:val="19"/>
-              </w:rPr>
-              <w:t xml:space="preserve">,</w:t>
-            </w:r>
-            <w:r>
-              <w:rPr>
-                <w:rFonts w:ascii="Times New Roman" w:hAnsi="Times New Roman"/>
-                <w:sz w:val="19"/>
-              </w:rPr>
-              <w:t xml:space="preserve"> </w:t>
-            </w:r>
-            <w:r>
-              <w:rPr>
-                <w:rFonts w:ascii="Times New Roman" w:hAnsi="Times New Roman"/>
-                <w:color w:val="CC0000"/>
-                <w:sz w:val="19"/>
-              </w:rPr>
-              <w:t xml:space="preserve">[44]</w:t>
+              <w:t xml:space="preserve">[43]</w:t>
             </w:r>
           </w:p>
         </w:tc>
@@ -8591,6 +8579,28 @@
                 <w:color w:val="CC0000"/>
                 <w:sz w:val="19"/>
               </w:rPr>
+              <w:t xml:space="preserve">[50]</w:t>
+            </w:r>
+            <w:r>
+              <w:rPr>
+                <w:rFonts w:ascii="Times New Roman" w:hAnsi="Times New Roman"/>
+                <w:sz w:val="19"/>
+              </w:rPr>
+              <w:t xml:space="preserve">,</w:t>
+            </w:r>
+            <w:r>
+              <w:rPr>
+                <w:rFonts w:ascii="Times New Roman" w:hAnsi="Times New Roman"/>
+                <w:sz w:val="19"/>
+              </w:rPr>
+              <w:t xml:space="preserve"> </w:t>
+            </w:r>
+            <w:r>
+              <w:rPr>
+                <w:rFonts w:ascii="Times New Roman" w:hAnsi="Times New Roman"/>
+                <w:color w:val="CC0000"/>
+                <w:sz w:val="19"/>
+              </w:rPr>
               <w:t xml:space="preserve">[51]</w:t>
             </w:r>
             <w:r>
@@ -8613,7 +8623,7 @@
                 <w:color w:val="CC0000"/>
                 <w:sz w:val="19"/>
               </w:rPr>
-              <w:t xml:space="preserve">[52]</w:t>
+              <w:t xml:space="preserve">[64]</w:t>
             </w:r>
             <w:r>
               <w:rPr>
@@ -8635,51 +8645,29 @@
                 <w:color w:val="CC0000"/>
                 <w:sz w:val="19"/>
               </w:rPr>
+              <w:t xml:space="preserve">[25]</w:t>
+            </w:r>
+            <w:r>
+              <w:rPr>
+                <w:rFonts w:ascii="Times New Roman" w:hAnsi="Times New Roman"/>
+                <w:sz w:val="19"/>
+              </w:rPr>
+              <w:t xml:space="preserve">,</w:t>
+            </w:r>
+            <w:r>
+              <w:rPr>
+                <w:rFonts w:ascii="Times New Roman" w:hAnsi="Times New Roman"/>
+                <w:sz w:val="19"/>
+              </w:rPr>
+              <w:t xml:space="preserve"> </w:t>
+            </w:r>
+            <w:r>
+              <w:rPr>
+                <w:rFonts w:ascii="Times New Roman" w:hAnsi="Times New Roman"/>
+                <w:color w:val="CC0000"/>
+                <w:sz w:val="19"/>
+              </w:rPr>
               <w:t xml:space="preserve">[65]</w:t>
-            </w:r>
-            <w:r>
-              <w:rPr>
-                <w:rFonts w:ascii="Times New Roman" w:hAnsi="Times New Roman"/>
-                <w:sz w:val="19"/>
-              </w:rPr>
-              <w:t xml:space="preserve">,</w:t>
-            </w:r>
-            <w:r>
-              <w:rPr>
-                <w:rFonts w:ascii="Times New Roman" w:hAnsi="Times New Roman"/>
-                <w:sz w:val="19"/>
-              </w:rPr>
-              <w:t xml:space="preserve"> </w:t>
-            </w:r>
-            <w:r>
-              <w:rPr>
-                <w:rFonts w:ascii="Times New Roman" w:hAnsi="Times New Roman"/>
-                <w:color w:val="CC0000"/>
-                <w:sz w:val="19"/>
-              </w:rPr>
-              <w:t xml:space="preserve">[26]</w:t>
-            </w:r>
-            <w:r>
-              <w:rPr>
-                <w:rFonts w:ascii="Times New Roman" w:hAnsi="Times New Roman"/>
-                <w:sz w:val="19"/>
-              </w:rPr>
-              <w:t xml:space="preserve">,</w:t>
-            </w:r>
-            <w:r>
-              <w:rPr>
-                <w:rFonts w:ascii="Times New Roman" w:hAnsi="Times New Roman"/>
-                <w:sz w:val="19"/>
-              </w:rPr>
-              <w:t xml:space="preserve"> </w:t>
-            </w:r>
-            <w:r>
-              <w:rPr>
-                <w:rFonts w:ascii="Times New Roman" w:hAnsi="Times New Roman"/>
-                <w:color w:val="CC0000"/>
-                <w:sz w:val="19"/>
-              </w:rPr>
-              <w:t xml:space="preserve">[66]</w:t>
             </w:r>
           </w:p>
         </w:tc>
@@ -8769,29 +8757,29 @@
                 <w:color w:val="CC0000"/>
                 <w:sz w:val="19"/>
               </w:rPr>
+              <w:t xml:space="preserve">[66]</w:t>
+            </w:r>
+            <w:r>
+              <w:rPr>
+                <w:rFonts w:ascii="Times New Roman" w:hAnsi="Times New Roman"/>
+                <w:sz w:val="19"/>
+              </w:rPr>
+              <w:t xml:space="preserve">,</w:t>
+            </w:r>
+            <w:r>
+              <w:rPr>
+                <w:rFonts w:ascii="Times New Roman" w:hAnsi="Times New Roman"/>
+                <w:sz w:val="19"/>
+              </w:rPr>
+              <w:t xml:space="preserve"> </w:t>
+            </w:r>
+            <w:r>
+              <w:rPr>
+                <w:rFonts w:ascii="Times New Roman" w:hAnsi="Times New Roman"/>
+                <w:color w:val="CC0000"/>
+                <w:sz w:val="19"/>
+              </w:rPr>
               <w:t xml:space="preserve">[67]</w:t>
-            </w:r>
-            <w:r>
-              <w:rPr>
-                <w:rFonts w:ascii="Times New Roman" w:hAnsi="Times New Roman"/>
-                <w:sz w:val="19"/>
-              </w:rPr>
-              <w:t xml:space="preserve">,</w:t>
-            </w:r>
-            <w:r>
-              <w:rPr>
-                <w:rFonts w:ascii="Times New Roman" w:hAnsi="Times New Roman"/>
-                <w:sz w:val="19"/>
-              </w:rPr>
-              <w:t xml:space="preserve"> </w:t>
-            </w:r>
-            <w:r>
-              <w:rPr>
-                <w:rFonts w:ascii="Times New Roman" w:hAnsi="Times New Roman"/>
-                <w:color w:val="CC0000"/>
-                <w:sz w:val="19"/>
-              </w:rPr>
-              <w:t xml:space="preserve">[68]</w:t>
             </w:r>
           </w:p>
         </w:tc>
@@ -8881,6 +8869,50 @@
                 <w:color w:val="CC0000"/>
                 <w:sz w:val="19"/>
               </w:rPr>
+              <w:t xml:space="preserve">[56]</w:t>
+            </w:r>
+            <w:r>
+              <w:rPr>
+                <w:rFonts w:ascii="Times New Roman" w:hAnsi="Times New Roman"/>
+                <w:sz w:val="19"/>
+              </w:rPr>
+              <w:t xml:space="preserve">,</w:t>
+            </w:r>
+            <w:r>
+              <w:rPr>
+                <w:rFonts w:ascii="Times New Roman" w:hAnsi="Times New Roman"/>
+                <w:sz w:val="19"/>
+              </w:rPr>
+              <w:t xml:space="preserve"> </w:t>
+            </w:r>
+            <w:r>
+              <w:rPr>
+                <w:rFonts w:ascii="Times New Roman" w:hAnsi="Times New Roman"/>
+                <w:color w:val="CC0000"/>
+                <w:sz w:val="19"/>
+              </w:rPr>
+              <w:t xml:space="preserve">[68]</w:t>
+            </w:r>
+            <w:r>
+              <w:rPr>
+                <w:rFonts w:ascii="Times New Roman" w:hAnsi="Times New Roman"/>
+                <w:sz w:val="19"/>
+              </w:rPr>
+              <w:t xml:space="preserve">,</w:t>
+            </w:r>
+            <w:r>
+              <w:rPr>
+                <w:rFonts w:ascii="Times New Roman" w:hAnsi="Times New Roman"/>
+                <w:sz w:val="19"/>
+              </w:rPr>
+              <w:t xml:space="preserve"> </w:t>
+            </w:r>
+            <w:r>
+              <w:rPr>
+                <w:rFonts w:ascii="Times New Roman" w:hAnsi="Times New Roman"/>
+                <w:color w:val="CC0000"/>
+                <w:sz w:val="19"/>
+              </w:rPr>
               <w:t xml:space="preserve">[57]</w:t>
             </w:r>
             <w:r>
@@ -8903,7 +8935,7 @@
                 <w:color w:val="CC0000"/>
                 <w:sz w:val="19"/>
               </w:rPr>
-              <w:t xml:space="preserve">[69]</w:t>
+              <w:t xml:space="preserve">[58]</w:t>
             </w:r>
             <w:r>
               <w:rPr>
@@ -8925,7 +8957,7 @@
                 <w:color w:val="CC0000"/>
                 <w:sz w:val="19"/>
               </w:rPr>
-              <w:t xml:space="preserve">[58]</w:t>
+              <w:t xml:space="preserve">[59]</w:t>
             </w:r>
             <w:r>
               <w:rPr>
@@ -8947,51 +8979,7 @@
                 <w:color w:val="CC0000"/>
                 <w:sz w:val="19"/>
               </w:rPr>
-              <w:t xml:space="preserve">[59]</w:t>
-            </w:r>
-            <w:r>
-              <w:rPr>
-                <w:rFonts w:ascii="Times New Roman" w:hAnsi="Times New Roman"/>
-                <w:sz w:val="19"/>
-              </w:rPr>
-              <w:t xml:space="preserve">,</w:t>
-            </w:r>
-            <w:r>
-              <w:rPr>
-                <w:rFonts w:ascii="Times New Roman" w:hAnsi="Times New Roman"/>
-                <w:sz w:val="19"/>
-              </w:rPr>
-              <w:t xml:space="preserve"> </w:t>
-            </w:r>
-            <w:r>
-              <w:rPr>
-                <w:rFonts w:ascii="Times New Roman" w:hAnsi="Times New Roman"/>
-                <w:color w:val="CC0000"/>
-                <w:sz w:val="19"/>
-              </w:rPr>
               <w:t xml:space="preserve">[60]</w:t>
-            </w:r>
-            <w:r>
-              <w:rPr>
-                <w:rFonts w:ascii="Times New Roman" w:hAnsi="Times New Roman"/>
-                <w:sz w:val="19"/>
-              </w:rPr>
-              <w:t xml:space="preserve">,</w:t>
-            </w:r>
-            <w:r>
-              <w:rPr>
-                <w:rFonts w:ascii="Times New Roman" w:hAnsi="Times New Roman"/>
-                <w:sz w:val="19"/>
-              </w:rPr>
-              <w:t xml:space="preserve"> </w:t>
-            </w:r>
-            <w:r>
-              <w:rPr>
-                <w:rFonts w:ascii="Times New Roman" w:hAnsi="Times New Roman"/>
-                <w:color w:val="CC0000"/>
-                <w:sz w:val="19"/>
-              </w:rPr>
-              <w:t xml:space="preserve">[61]</w:t>
             </w:r>
             <w:r>
               <w:rPr>
@@ -9095,6 +9083,50 @@
                 <w:color w:val="CC0000"/>
                 <w:sz w:val="19"/>
               </w:rPr>
+              <w:t xml:space="preserve">[49]</w:t>
+            </w:r>
+            <w:r>
+              <w:rPr>
+                <w:rFonts w:ascii="Times New Roman" w:hAnsi="Times New Roman"/>
+                <w:sz w:val="19"/>
+              </w:rPr>
+              <w:t xml:space="preserve">,</w:t>
+            </w:r>
+            <w:r>
+              <w:rPr>
+                <w:rFonts w:ascii="Times New Roman" w:hAnsi="Times New Roman"/>
+                <w:sz w:val="19"/>
+              </w:rPr>
+              <w:t xml:space="preserve"> </w:t>
+            </w:r>
+            <w:r>
+              <w:rPr>
+                <w:rFonts w:ascii="Times New Roman" w:hAnsi="Times New Roman"/>
+                <w:color w:val="CC0000"/>
+                <w:sz w:val="19"/>
+              </w:rPr>
+              <w:t xml:space="preserve">[69]</w:t>
+            </w:r>
+            <w:r>
+              <w:rPr>
+                <w:rFonts w:ascii="Times New Roman" w:hAnsi="Times New Roman"/>
+                <w:sz w:val="19"/>
+              </w:rPr>
+              <w:t xml:space="preserve">,</w:t>
+            </w:r>
+            <w:r>
+              <w:rPr>
+                <w:rFonts w:ascii="Times New Roman" w:hAnsi="Times New Roman"/>
+                <w:sz w:val="19"/>
+              </w:rPr>
+              <w:t xml:space="preserve"> </w:t>
+            </w:r>
+            <w:r>
+              <w:rPr>
+                <w:rFonts w:ascii="Times New Roman" w:hAnsi="Times New Roman"/>
+                <w:color w:val="CC0000"/>
+                <w:sz w:val="19"/>
+              </w:rPr>
               <w:t xml:space="preserve">[50]</w:t>
             </w:r>
             <w:r>
@@ -9117,7 +9149,7 @@
                 <w:color w:val="CC0000"/>
                 <w:sz w:val="19"/>
               </w:rPr>
-              <w:t xml:space="preserve">[70]</w:t>
+              <w:t xml:space="preserve">[51]</w:t>
             </w:r>
             <w:r>
               <w:rPr>
@@ -9139,51 +9171,7 @@
                 <w:color w:val="CC0000"/>
                 <w:sz w:val="19"/>
               </w:rPr>
-              <w:t xml:space="preserve">[51]</w:t>
-            </w:r>
-            <w:r>
-              <w:rPr>
-                <w:rFonts w:ascii="Times New Roman" w:hAnsi="Times New Roman"/>
-                <w:sz w:val="19"/>
-              </w:rPr>
-              <w:t xml:space="preserve">,</w:t>
-            </w:r>
-            <w:r>
-              <w:rPr>
-                <w:rFonts w:ascii="Times New Roman" w:hAnsi="Times New Roman"/>
-                <w:sz w:val="19"/>
-              </w:rPr>
-              <w:t xml:space="preserve"> </w:t>
-            </w:r>
-            <w:r>
-              <w:rPr>
-                <w:rFonts w:ascii="Times New Roman" w:hAnsi="Times New Roman"/>
-                <w:color w:val="CC0000"/>
-                <w:sz w:val="19"/>
-              </w:rPr>
               <w:t xml:space="preserve">[52]</w:t>
-            </w:r>
-            <w:r>
-              <w:rPr>
-                <w:rFonts w:ascii="Times New Roman" w:hAnsi="Times New Roman"/>
-                <w:sz w:val="19"/>
-              </w:rPr>
-              <w:t xml:space="preserve">,</w:t>
-            </w:r>
-            <w:r>
-              <w:rPr>
-                <w:rFonts w:ascii="Times New Roman" w:hAnsi="Times New Roman"/>
-                <w:sz w:val="19"/>
-              </w:rPr>
-              <w:t xml:space="preserve"> </w:t>
-            </w:r>
-            <w:r>
-              <w:rPr>
-                <w:rFonts w:ascii="Times New Roman" w:hAnsi="Times New Roman"/>
-                <w:color w:val="CC0000"/>
-                <w:sz w:val="19"/>
-              </w:rPr>
-              <w:t xml:space="preserve">[53]</w:t>
             </w:r>
           </w:p>
         </w:tc>
@@ -9273,6 +9261,50 @@
                 <w:color w:val="CC0000"/>
                 <w:sz w:val="19"/>
               </w:rPr>
+              <w:t xml:space="preserve">[70]</w:t>
+            </w:r>
+            <w:r>
+              <w:rPr>
+                <w:rFonts w:ascii="Times New Roman" w:hAnsi="Times New Roman"/>
+                <w:sz w:val="19"/>
+              </w:rPr>
+              <w:t xml:space="preserve">,</w:t>
+            </w:r>
+            <w:r>
+              <w:rPr>
+                <w:rFonts w:ascii="Times New Roman" w:hAnsi="Times New Roman"/>
+                <w:sz w:val="19"/>
+              </w:rPr>
+              <w:t xml:space="preserve"> </w:t>
+            </w:r>
+            <w:r>
+              <w:rPr>
+                <w:rFonts w:ascii="Times New Roman" w:hAnsi="Times New Roman"/>
+                <w:color w:val="CC0000"/>
+                <w:sz w:val="19"/>
+              </w:rPr>
+              <w:t xml:space="preserve">[21]</w:t>
+            </w:r>
+            <w:r>
+              <w:rPr>
+                <w:rFonts w:ascii="Times New Roman" w:hAnsi="Times New Roman"/>
+                <w:sz w:val="19"/>
+              </w:rPr>
+              <w:t xml:space="preserve">,</w:t>
+            </w:r>
+            <w:r>
+              <w:rPr>
+                <w:rFonts w:ascii="Times New Roman" w:hAnsi="Times New Roman"/>
+                <w:sz w:val="19"/>
+              </w:rPr>
+              <w:t xml:space="preserve"> </w:t>
+            </w:r>
+            <w:r>
+              <w:rPr>
+                <w:rFonts w:ascii="Times New Roman" w:hAnsi="Times New Roman"/>
+                <w:color w:val="CC0000"/>
+                <w:sz w:val="19"/>
+              </w:rPr>
               <w:t xml:space="preserve">[71]</w:t>
             </w:r>
             <w:r>
@@ -9295,7 +9327,7 @@
                 <w:color w:val="CC0000"/>
                 <w:sz w:val="19"/>
               </w:rPr>
-              <w:t xml:space="preserve">[21]</w:t>
+              <w:t xml:space="preserve">[72]</w:t>
             </w:r>
             <w:r>
               <w:rPr>
@@ -9317,51 +9349,7 @@
                 <w:color w:val="CC0000"/>
                 <w:sz w:val="19"/>
               </w:rPr>
-              <w:t xml:space="preserve">[72]</w:t>
-            </w:r>
-            <w:r>
-              <w:rPr>
-                <w:rFonts w:ascii="Times New Roman" w:hAnsi="Times New Roman"/>
-                <w:sz w:val="19"/>
-              </w:rPr>
-              <w:t xml:space="preserve">,</w:t>
-            </w:r>
-            <w:r>
-              <w:rPr>
-                <w:rFonts w:ascii="Times New Roman" w:hAnsi="Times New Roman"/>
-                <w:sz w:val="19"/>
-              </w:rPr>
-              <w:t xml:space="preserve"> </w:t>
-            </w:r>
-            <w:r>
-              <w:rPr>
-                <w:rFonts w:ascii="Times New Roman" w:hAnsi="Times New Roman"/>
-                <w:color w:val="CC0000"/>
-                <w:sz w:val="19"/>
-              </w:rPr>
               <w:t xml:space="preserve">[73]</w:t>
-            </w:r>
-            <w:r>
-              <w:rPr>
-                <w:rFonts w:ascii="Times New Roman" w:hAnsi="Times New Roman"/>
-                <w:sz w:val="19"/>
-              </w:rPr>
-              <w:t xml:space="preserve">,</w:t>
-            </w:r>
-            <w:r>
-              <w:rPr>
-                <w:rFonts w:ascii="Times New Roman" w:hAnsi="Times New Roman"/>
-                <w:sz w:val="19"/>
-              </w:rPr>
-              <w:t xml:space="preserve"> </w:t>
-            </w:r>
-            <w:r>
-              <w:rPr>
-                <w:rFonts w:ascii="Times New Roman" w:hAnsi="Times New Roman"/>
-                <w:color w:val="CC0000"/>
-                <w:sz w:val="19"/>
-              </w:rPr>
-              <w:t xml:space="preserve">[74]</w:t>
             </w:r>
             <w:r>
               <w:rPr>
@@ -9465,7 +9453,7 @@
                 <w:color w:val="CC0000"/>
                 <w:sz w:val="19"/>
               </w:rPr>
-              <w:t xml:space="preserve">[75]</w:t>
+              <w:t xml:space="preserve">[74]</w:t>
             </w:r>
             <w:r>
               <w:rPr>
@@ -9569,6 +9557,28 @@
                 <w:color w:val="CC0000"/>
                 <w:sz w:val="19"/>
               </w:rPr>
+              <w:t xml:space="preserve">[75]</w:t>
+            </w:r>
+            <w:r>
+              <w:rPr>
+                <w:rFonts w:ascii="Times New Roman" w:hAnsi="Times New Roman"/>
+                <w:sz w:val="19"/>
+              </w:rPr>
+              <w:t xml:space="preserve">,</w:t>
+            </w:r>
+            <w:r>
+              <w:rPr>
+                <w:rFonts w:ascii="Times New Roman" w:hAnsi="Times New Roman"/>
+                <w:sz w:val="19"/>
+              </w:rPr>
+              <w:t xml:space="preserve"> </w:t>
+            </w:r>
+            <w:r>
+              <w:rPr>
+                <w:rFonts w:ascii="Times New Roman" w:hAnsi="Times New Roman"/>
+                <w:color w:val="CC0000"/>
+                <w:sz w:val="19"/>
+              </w:rPr>
               <w:t xml:space="preserve">[76]</w:t>
             </w:r>
             <w:r>
@@ -9767,6 +9777,28 @@
                 <w:color w:val="CC0000"/>
                 <w:sz w:val="19"/>
               </w:rPr>
+              <w:t xml:space="preserve">[34]</w:t>
+            </w:r>
+            <w:r>
+              <w:rPr>
+                <w:rFonts w:ascii="Times New Roman" w:hAnsi="Times New Roman"/>
+                <w:sz w:val="19"/>
+              </w:rPr>
+              <w:t xml:space="preserve">,</w:t>
+            </w:r>
+            <w:r>
+              <w:rPr>
+                <w:rFonts w:ascii="Times New Roman" w:hAnsi="Times New Roman"/>
+                <w:sz w:val="19"/>
+              </w:rPr>
+              <w:t xml:space="preserve"> </w:t>
+            </w:r>
+            <w:r>
+              <w:rPr>
+                <w:rFonts w:ascii="Times New Roman" w:hAnsi="Times New Roman"/>
+                <w:color w:val="CC0000"/>
+                <w:sz w:val="19"/>
+              </w:rPr>
               <w:t xml:space="preserve">[85]</w:t>
             </w:r>
             <w:r>
@@ -9789,7 +9821,7 @@
                 <w:color w:val="CC0000"/>
                 <w:sz w:val="19"/>
               </w:rPr>
-              <w:t xml:space="preserve">[35]</w:t>
+              <w:t xml:space="preserve">[36]</w:t>
             </w:r>
             <w:r>
               <w:rPr>
@@ -9811,51 +9843,7 @@
                 <w:color w:val="CC0000"/>
                 <w:sz w:val="19"/>
               </w:rPr>
-              <w:t xml:space="preserve">[86]</w:t>
-            </w:r>
-            <w:r>
-              <w:rPr>
-                <w:rFonts w:ascii="Times New Roman" w:hAnsi="Times New Roman"/>
-                <w:sz w:val="19"/>
-              </w:rPr>
-              <w:t xml:space="preserve">,</w:t>
-            </w:r>
-            <w:r>
-              <w:rPr>
-                <w:rFonts w:ascii="Times New Roman" w:hAnsi="Times New Roman"/>
-                <w:sz w:val="19"/>
-              </w:rPr>
-              <w:t xml:space="preserve"> </w:t>
-            </w:r>
-            <w:r>
-              <w:rPr>
-                <w:rFonts w:ascii="Times New Roman" w:hAnsi="Times New Roman"/>
-                <w:color w:val="CC0000"/>
-                <w:sz w:val="19"/>
-              </w:rPr>
               <w:t xml:space="preserve">[37]</w:t>
-            </w:r>
-            <w:r>
-              <w:rPr>
-                <w:rFonts w:ascii="Times New Roman" w:hAnsi="Times New Roman"/>
-                <w:sz w:val="19"/>
-              </w:rPr>
-              <w:t xml:space="preserve">,</w:t>
-            </w:r>
-            <w:r>
-              <w:rPr>
-                <w:rFonts w:ascii="Times New Roman" w:hAnsi="Times New Roman"/>
-                <w:sz w:val="19"/>
-              </w:rPr>
-              <w:t xml:space="preserve"> </w:t>
-            </w:r>
-            <w:r>
-              <w:rPr>
-                <w:rFonts w:ascii="Times New Roman" w:hAnsi="Times New Roman"/>
-                <w:color w:val="CC0000"/>
-                <w:sz w:val="19"/>
-              </w:rPr>
-              <w:t xml:space="preserve">[38]</w:t>
             </w:r>
           </w:p>
         </w:tc>
@@ -9945,7 +9933,7 @@
                 <w:color w:val="CC0000"/>
                 <w:sz w:val="19"/>
               </w:rPr>
-              <w:t xml:space="preserve">[67]</w:t>
+              <w:t xml:space="preserve">[66]</w:t>
             </w:r>
             <w:r>
               <w:rPr>
@@ -9967,6 +9955,72 @@
                 <w:color w:val="CC0000"/>
                 <w:sz w:val="19"/>
               </w:rPr>
+              <w:t xml:space="preserve">[86]</w:t>
+            </w:r>
+            <w:r>
+              <w:rPr>
+                <w:rFonts w:ascii="Times New Roman" w:hAnsi="Times New Roman"/>
+                <w:sz w:val="19"/>
+              </w:rPr>
+              <w:t xml:space="preserve">,</w:t>
+            </w:r>
+            <w:r>
+              <w:rPr>
+                <w:rFonts w:ascii="Times New Roman" w:hAnsi="Times New Roman"/>
+                <w:sz w:val="19"/>
+              </w:rPr>
+              <w:t xml:space="preserve"> </w:t>
+            </w:r>
+            <w:r>
+              <w:rPr>
+                <w:rFonts w:ascii="Times New Roman" w:hAnsi="Times New Roman"/>
+                <w:color w:val="CC0000"/>
+                <w:sz w:val="19"/>
+              </w:rPr>
+              <w:t xml:space="preserve">[75]</w:t>
+            </w:r>
+            <w:r>
+              <w:rPr>
+                <w:rFonts w:ascii="Times New Roman" w:hAnsi="Times New Roman"/>
+                <w:sz w:val="19"/>
+              </w:rPr>
+              <w:t xml:space="preserve">,</w:t>
+            </w:r>
+            <w:r>
+              <w:rPr>
+                <w:rFonts w:ascii="Times New Roman" w:hAnsi="Times New Roman"/>
+                <w:sz w:val="19"/>
+              </w:rPr>
+              <w:t xml:space="preserve"> </w:t>
+            </w:r>
+            <w:r>
+              <w:rPr>
+                <w:rFonts w:ascii="Times New Roman" w:hAnsi="Times New Roman"/>
+                <w:color w:val="CC0000"/>
+                <w:sz w:val="19"/>
+              </w:rPr>
+              <w:t xml:space="preserve">[61]</w:t>
+            </w:r>
+            <w:r>
+              <w:rPr>
+                <w:rFonts w:ascii="Times New Roman" w:hAnsi="Times New Roman"/>
+                <w:sz w:val="19"/>
+              </w:rPr>
+              <w:t xml:space="preserve">,</w:t>
+            </w:r>
+            <w:r>
+              <w:rPr>
+                <w:rFonts w:ascii="Times New Roman" w:hAnsi="Times New Roman"/>
+                <w:sz w:val="19"/>
+              </w:rPr>
+              <w:t xml:space="preserve"> </w:t>
+            </w:r>
+            <w:r>
+              <w:rPr>
+                <w:rFonts w:ascii="Times New Roman" w:hAnsi="Times New Roman"/>
+                <w:color w:val="CC0000"/>
+                <w:sz w:val="19"/>
+              </w:rPr>
               <w:t xml:space="preserve">[87]</w:t>
             </w:r>
             <w:r>
@@ -9989,7 +10043,7 @@
                 <w:color w:val="CC0000"/>
                 <w:sz w:val="19"/>
               </w:rPr>
-              <w:t xml:space="preserve">[76]</w:t>
+              <w:t xml:space="preserve">[88]</w:t>
             </w:r>
             <w:r>
               <w:rPr>
@@ -10011,7 +10065,7 @@
                 <w:color w:val="CC0000"/>
                 <w:sz w:val="19"/>
               </w:rPr>
-              <w:t xml:space="preserve">[62]</w:t>
+              <w:t xml:space="preserve">[89]</w:t>
             </w:r>
             <w:r>
               <w:rPr>
@@ -10033,7 +10087,7 @@
                 <w:color w:val="CC0000"/>
                 <w:sz w:val="19"/>
               </w:rPr>
-              <w:t xml:space="preserve">[88]</w:t>
+              <w:t xml:space="preserve">[90]</w:t>
             </w:r>
             <w:r>
               <w:rPr>
@@ -10055,73 +10109,7 @@
                 <w:color w:val="CC0000"/>
                 <w:sz w:val="19"/>
               </w:rPr>
-              <w:t xml:space="preserve">[89]</w:t>
-            </w:r>
-            <w:r>
-              <w:rPr>
-                <w:rFonts w:ascii="Times New Roman" w:hAnsi="Times New Roman"/>
-                <w:sz w:val="19"/>
-              </w:rPr>
-              <w:t xml:space="preserve">,</w:t>
-            </w:r>
-            <w:r>
-              <w:rPr>
-                <w:rFonts w:ascii="Times New Roman" w:hAnsi="Times New Roman"/>
-                <w:sz w:val="19"/>
-              </w:rPr>
-              <w:t xml:space="preserve"> </w:t>
-            </w:r>
-            <w:r>
-              <w:rPr>
-                <w:rFonts w:ascii="Times New Roman" w:hAnsi="Times New Roman"/>
-                <w:color w:val="CC0000"/>
-                <w:sz w:val="19"/>
-              </w:rPr>
-              <w:t xml:space="preserve">[90]</w:t>
-            </w:r>
-            <w:r>
-              <w:rPr>
-                <w:rFonts w:ascii="Times New Roman" w:hAnsi="Times New Roman"/>
-                <w:sz w:val="19"/>
-              </w:rPr>
-              <w:t xml:space="preserve">,</w:t>
-            </w:r>
-            <w:r>
-              <w:rPr>
-                <w:rFonts w:ascii="Times New Roman" w:hAnsi="Times New Roman"/>
-                <w:sz w:val="19"/>
-              </w:rPr>
-              <w:t xml:space="preserve"> </w:t>
-            </w:r>
-            <w:r>
-              <w:rPr>
-                <w:rFonts w:ascii="Times New Roman" w:hAnsi="Times New Roman"/>
-                <w:color w:val="CC0000"/>
-                <w:sz w:val="19"/>
-              </w:rPr>
               <w:t xml:space="preserve">[91]</w:t>
-            </w:r>
-            <w:r>
-              <w:rPr>
-                <w:rFonts w:ascii="Times New Roman" w:hAnsi="Times New Roman"/>
-                <w:sz w:val="19"/>
-              </w:rPr>
-              <w:t xml:space="preserve">,</w:t>
-            </w:r>
-            <w:r>
-              <w:rPr>
-                <w:rFonts w:ascii="Times New Roman" w:hAnsi="Times New Roman"/>
-                <w:sz w:val="19"/>
-              </w:rPr>
-              <w:t xml:space="preserve"> </w:t>
-            </w:r>
-            <w:r>
-              <w:rPr>
-                <w:rFonts w:ascii="Times New Roman" w:hAnsi="Times New Roman"/>
-                <w:color w:val="CC0000"/>
-                <w:sz w:val="19"/>
-              </w:rPr>
-              <w:t xml:space="preserve">[92]</w:t>
             </w:r>
             <w:r>
               <w:rPr>
@@ -10225,7 +10213,7 @@
                 <w:color w:val="CC0000"/>
                 <w:sz w:val="19"/>
               </w:rPr>
-              <w:t xml:space="preserve">[34]</w:t>
+              <w:t xml:space="preserve">[33]</w:t>
             </w:r>
             <w:r>
               <w:rPr>
@@ -10247,7 +10235,7 @@
                 <w:color w:val="CC0000"/>
                 <w:sz w:val="19"/>
               </w:rPr>
-              <w:t xml:space="preserve">[68]</w:t>
+              <w:t xml:space="preserve">[67]</w:t>
             </w:r>
             <w:r>
               <w:rPr>
@@ -10291,7 +10279,7 @@
                 <w:color w:val="CC0000"/>
                 <w:sz w:val="19"/>
               </w:rPr>
-              <w:t xml:space="preserve">[46]</w:t>
+              <w:t xml:space="preserve">[45]</w:t>
             </w:r>
             <w:r>
               <w:rPr>
@@ -10313,7 +10301,7 @@
                 <w:color w:val="CC0000"/>
                 <w:sz w:val="19"/>
               </w:rPr>
-              <w:t xml:space="preserve">[41]</w:t>
+              <w:t xml:space="preserve">[40]</w:t>
             </w:r>
             <w:r>
               <w:rPr>
@@ -10335,7 +10323,7 @@
                 <w:color w:val="CC0000"/>
                 <w:sz w:val="19"/>
               </w:rPr>
-              <w:t xml:space="preserve">[64]</w:t>
+              <w:t xml:space="preserve">[63]</w:t>
             </w:r>
             <w:r>
               <w:rPr>
@@ -10357,6 +10345,28 @@
                 <w:color w:val="CC0000"/>
                 <w:sz w:val="19"/>
               </w:rPr>
+              <w:t xml:space="preserve">[92]</w:t>
+            </w:r>
+            <w:r>
+              <w:rPr>
+                <w:rFonts w:ascii="Times New Roman" w:hAnsi="Times New Roman"/>
+                <w:sz w:val="19"/>
+              </w:rPr>
+              <w:t xml:space="preserve">,</w:t>
+            </w:r>
+            <w:r>
+              <w:rPr>
+                <w:rFonts w:ascii="Times New Roman" w:hAnsi="Times New Roman"/>
+                <w:sz w:val="19"/>
+              </w:rPr>
+              <w:t xml:space="preserve"> </w:t>
+            </w:r>
+            <w:r>
+              <w:rPr>
+                <w:rFonts w:ascii="Times New Roman" w:hAnsi="Times New Roman"/>
+                <w:color w:val="CC0000"/>
+                <w:sz w:val="19"/>
+              </w:rPr>
               <w:t xml:space="preserve">[93]</w:t>
             </w:r>
             <w:r>
@@ -10379,6 +10389,28 @@
                 <w:color w:val="CC0000"/>
                 <w:sz w:val="19"/>
               </w:rPr>
+              <w:t xml:space="preserve">[43]</w:t>
+            </w:r>
+            <w:r>
+              <w:rPr>
+                <w:rFonts w:ascii="Times New Roman" w:hAnsi="Times New Roman"/>
+                <w:sz w:val="19"/>
+              </w:rPr>
+              <w:t xml:space="preserve">,</w:t>
+            </w:r>
+            <w:r>
+              <w:rPr>
+                <w:rFonts w:ascii="Times New Roman" w:hAnsi="Times New Roman"/>
+                <w:sz w:val="19"/>
+              </w:rPr>
+              <w:t xml:space="preserve"> </w:t>
+            </w:r>
+            <w:r>
+              <w:rPr>
+                <w:rFonts w:ascii="Times New Roman" w:hAnsi="Times New Roman"/>
+                <w:color w:val="CC0000"/>
+                <w:sz w:val="19"/>
+              </w:rPr>
               <w:t xml:space="preserve">[94]</w:t>
             </w:r>
             <w:r>
@@ -10401,7 +10433,7 @@
                 <w:color w:val="CC0000"/>
                 <w:sz w:val="19"/>
               </w:rPr>
-              <w:t xml:space="preserve">[44]</w:t>
+              <w:t xml:space="preserve">[95]</w:t>
             </w:r>
             <w:r>
               <w:rPr>
@@ -10423,51 +10455,7 @@
                 <w:color w:val="CC0000"/>
                 <w:sz w:val="19"/>
               </w:rPr>
-              <w:t xml:space="preserve">[95]</w:t>
-            </w:r>
-            <w:r>
-              <w:rPr>
-                <w:rFonts w:ascii="Times New Roman" w:hAnsi="Times New Roman"/>
-                <w:sz w:val="19"/>
-              </w:rPr>
-              <w:t xml:space="preserve">,</w:t>
-            </w:r>
-            <w:r>
-              <w:rPr>
-                <w:rFonts w:ascii="Times New Roman" w:hAnsi="Times New Roman"/>
-                <w:sz w:val="19"/>
-              </w:rPr>
-              <w:t xml:space="preserve"> </w:t>
-            </w:r>
-            <w:r>
-              <w:rPr>
-                <w:rFonts w:ascii="Times New Roman" w:hAnsi="Times New Roman"/>
-                <w:color w:val="CC0000"/>
-                <w:sz w:val="19"/>
-              </w:rPr>
               <w:t xml:space="preserve">[96]</w:t>
-            </w:r>
-            <w:r>
-              <w:rPr>
-                <w:rFonts w:ascii="Times New Roman" w:hAnsi="Times New Roman"/>
-                <w:sz w:val="19"/>
-              </w:rPr>
-              <w:t xml:space="preserve">,</w:t>
-            </w:r>
-            <w:r>
-              <w:rPr>
-                <w:rFonts w:ascii="Times New Roman" w:hAnsi="Times New Roman"/>
-                <w:sz w:val="19"/>
-              </w:rPr>
-              <w:t xml:space="preserve"> </w:t>
-            </w:r>
-            <w:r>
-              <w:rPr>
-                <w:rFonts w:ascii="Times New Roman" w:hAnsi="Times New Roman"/>
-                <w:color w:val="CC0000"/>
-                <w:sz w:val="19"/>
-              </w:rPr>
-              <w:t xml:space="preserve">[97]</w:t>
             </w:r>
             <w:r>
               <w:rPr>
@@ -10768,7 +10756,7 @@
         <w:t xml:space="preserve"> </w:t>
       </w:r>
       <w:r>
-        <w:t xml:space="preserve">evidence rather than multi-seed benchmarks: they establish that a channel can be served, not a ranking</w:t>
+        <w:t xml:space="preserve">evidence rather than multi-seed benchmarks: they demonstrate feasibility within the synthetic evaluation setting, not a ranking</w:t>
       </w:r>
       <w:r>
         <w:t xml:space="preserve"> </w:t>
@@ -12521,7 +12509,7 @@
           <w:color w:val="CC0000"/>
           <w:vertAlign w:val="superscript"/>
         </w:rPr>
-        <w:t xml:space="preserve">[35,86,37]</w:t>
+        <w:t xml:space="preserve">[34,85,36]</w:t>
       </w:r>
       <w:r>
         <w:t xml:space="preserve"> </w:t>
@@ -12540,7 +12528,7 @@
           <w:color w:val="CC0000"/>
           <w:vertAlign w:val="superscript"/>
         </w:rPr>
-        <w:t xml:space="preserve">[65,17]</w:t>
+        <w:t xml:space="preserve">[64,17]</w:t>
       </w:r>
       <w:r>
         <w:t xml:space="preserve">. The three studies below concentrate on the patient's side</w:t>
@@ -12610,7 +12598,7 @@
           <w:color w:val="CC0000"/>
           <w:vertAlign w:val="superscript"/>
         </w:rPr>
-        <w:t xml:space="preserve">[98]</w:t>
+        <w:t xml:space="preserve">[97]</w:t>
       </w:r>
       <w:r>
         <w:t xml:space="preserve">, is small and written in clean prose; naturally noisy patient narratives</w:t>
@@ -12674,7 +12662,7 @@
           <w:color w:val="CC0000"/>
           <w:vertAlign w:val="superscript"/>
         </w:rPr>
-        <w:t xml:space="preserve">[69]</w:t>
+        <w:t xml:space="preserve">[68]</w:t>
       </w:r>
       <w:r>
         <w:t xml:space="preserve">.</w:t>
@@ -13459,7 +13447,7 @@
           <w:color w:val="CC0000"/>
           <w:vertAlign w:val="superscript"/>
         </w:rPr>
-        <w:t xml:space="preserve">[60]</w:t>
+        <w:t xml:space="preserve">[59]</w:t>
       </w:r>
       <w:r>
         <w:t xml:space="preserve"> </w:t>
@@ -13680,7 +13668,7 @@
           <w:color w:val="CC0000"/>
           <w:vertAlign w:val="superscript"/>
         </w:rPr>
-        <w:t xml:space="preserve">[57]</w:t>
+        <w:t xml:space="preserve">[56]</w:t>
       </w:r>
       <w:r>
         <w:t xml:space="preserve">.</w:t>
@@ -14212,7 +14200,7 @@
           <w:color w:val="CC0000"/>
           <w:vertAlign w:val="superscript"/>
         </w:rPr>
-        <w:t xml:space="preserve">[99]</w:t>
+        <w:t xml:space="preserve">[98]</w:t>
       </w:r>
       <w:r>
         <w:t xml:space="preserve"> </w:t>
@@ -14915,7 +14903,7 @@
           <w:color w:val="CC0000"/>
           <w:vertAlign w:val="superscript"/>
         </w:rPr>
-        <w:t xml:space="preserve">[73]</w:t>
+        <w:t xml:space="preserve">[72]</w:t>
       </w:r>
       <w:r>
         <w:t xml:space="preserve">, and as a triage and routing</w:t>
@@ -14931,7 +14919,7 @@
           <w:color w:val="CC0000"/>
           <w:vertAlign w:val="superscript"/>
         </w:rPr>
-        <w:t xml:space="preserve">[74]</w:t>
+        <w:t xml:space="preserve">[73]</w:t>
       </w:r>
       <w:r>
         <w:t xml:space="preserve">. The five studies below span triage, severity scoring, distress</w:t>
@@ -14995,7 +14983,7 @@
           <w:color w:val="CC0000"/>
           <w:vertAlign w:val="superscript"/>
         </w:rPr>
-        <w:t xml:space="preserve">[100]</w:t>
+        <w:t xml:space="preserve">[99]</w:t>
       </w:r>
       <w:r>
         <w:t xml:space="preserve"> </w:t>
@@ -16517,7 +16505,7 @@
         <w:t xml:space="preserve"> </w:t>
       </w:r>
       <w:r>
-        <w:t xml:space="preserve">emotion rather than psychosocial-response labels; as the project observes, there is no public labeled</w:t>
+        <w:t xml:space="preserve">emotion rather than psychosocial-response labels; we identified no public labeled</w:t>
       </w:r>
       <w:r>
         <w:t xml:space="preserve"> </w:t>
@@ -17201,7 +17189,7 @@
           <w:color w:val="CC0000"/>
           <w:vertAlign w:val="superscript"/>
         </w:rPr>
-        <w:t xml:space="preserve">[71]</w:t>
+        <w:t xml:space="preserve">[70]</w:t>
       </w:r>
       <w:r>
         <w:t xml:space="preserve">.</w:t>
@@ -18177,7 +18165,7 @@
           <w:color w:val="CC0000"/>
           <w:vertAlign w:val="superscript"/>
         </w:rPr>
-        <w:t xml:space="preserve">[36]</w:t>
+        <w:t xml:space="preserve">[35]</w:t>
       </w:r>
       <w:r>
         <w:t xml:space="preserve">, dispatch</w:t>
@@ -18193,7 +18181,7 @@
           <w:color w:val="CC0000"/>
           <w:vertAlign w:val="superscript"/>
         </w:rPr>
-        <w:t xml:space="preserve">[101]</w:t>
+        <w:t xml:space="preserve">[100]</w:t>
       </w:r>
       <w:r>
         <w:t xml:space="preserve">, and LLM-generated handoff notes</w:t>
@@ -18203,7 +18191,7 @@
           <w:color w:val="CC0000"/>
           <w:vertAlign w:val="superscript"/>
         </w:rPr>
-        <w:t xml:space="preserve">[75]</w:t>
+        <w:t xml:space="preserve">[74]</w:t>
       </w:r>
       <w:r>
         <w:t xml:space="preserve"> </w:t>
@@ -18323,7 +18311,7 @@
         <w:t xml:space="preserve"> </w:t>
       </w:r>
       <w:r>
-        <w:t xml:space="preserve">degraded synthetic communication thus earns its value through realism as much as volume.</w:t>
+        <w:t xml:space="preserve">degraded synthetic communication thus improves robustness through realism as much as volume.</w:t>
       </w:r>
     </w:p>
     <w:p>
@@ -19647,7 +19635,7 @@
               <a:graphicData uri="http://schemas.openxmlformats.org/drawingml/2006/picture">
                 <pic:pic>
                   <pic:nvPicPr>
-                    <pic:cNvPr descr="figures/fig7_sbar_macrof1.png" id="50" name="Picture"/>
+                    <pic:cNvPr descr="figures/fig6_sbar_macrof1.png" id="50" name="Picture"/>
                     <pic:cNvPicPr>
                       <a:picLocks noChangeArrowheads="1" noChangeAspect="1"/>
                     </pic:cNvPicPr>
@@ -21643,7 +21631,7 @@
           <w:color w:val="CC0000"/>
           <w:vertAlign w:val="superscript"/>
         </w:rPr>
-        <w:t xml:space="preserve">[97]</w:t>
+        <w:t xml:space="preserve">[96]</w:t>
       </w:r>
       <w:r>
         <w:t xml:space="preserve">: a generator can produce fluent text that is medically wrong,</w:t>
@@ -21677,7 +21665,7 @@
           <w:color w:val="CC0000"/>
           <w:vertAlign w:val="superscript"/>
         </w:rPr>
-        <w:t xml:space="preserve">[102]</w:t>
+        <w:t xml:space="preserve">[101]</w:t>
       </w:r>
       <w:r>
         <w:t xml:space="preserve">, and post-hoc verification, the central design problem rather than an afterthought. A second</w:t>
@@ -21747,7 +21735,7 @@
           <w:color w:val="CC0000"/>
           <w:vertAlign w:val="superscript"/>
         </w:rPr>
-        <w:t xml:space="preserve">[95,96]</w:t>
+        <w:t xml:space="preserve">[94,95]</w:t>
       </w:r>
       <w:r>
         <w:t xml:space="preserve">. This is why the</w:t>
@@ -21846,7 +21834,7 @@
           <w:color w:val="CC0000"/>
           <w:vertAlign w:val="superscript"/>
         </w:rPr>
-        <w:t xml:space="preserve">[93]</w:t>
+        <w:t xml:space="preserve">[92]</w:t>
       </w:r>
       <w:r>
         <w:t xml:space="preserve"> </w:t>
@@ -21865,7 +21853,7 @@
           <w:color w:val="CC0000"/>
           <w:vertAlign w:val="superscript"/>
         </w:rPr>
-        <w:t xml:space="preserve">[94]</w:t>
+        <w:t xml:space="preserve">[93]</w:t>
       </w:r>
       <w:r>
         <w:t xml:space="preserve">; and there</w:t>
@@ -22014,7 +22002,7 @@
         <w:widowControl w:val="1"/>
       </w:pPr>
       <w:r>
-        <w:t xml:space="preserve">This review has its own boundaries. It follows a narrative, scoping-style approach: relevant work was</w:t>
+        <w:t xml:space="preserve">This review has its own boundaries. It follows a narrative review approach: relevant work was</w:t>
       </w:r>
       <w:r>
         <w:t xml:space="preserve"> </w:t>
@@ -22120,7 +22108,7 @@
           <w:color w:val="CC0000"/>
           <w:vertAlign w:val="superscript"/>
         </w:rPr>
-        <w:t xml:space="preserve">[35]</w:t>
+        <w:t xml:space="preserve">[34]</w:t>
       </w:r>
       <w:r>
         <w:t xml:space="preserve">, safety-focused</w:t>
@@ -22136,7 +22124,7 @@
           <w:color w:val="CC0000"/>
           <w:vertAlign w:val="superscript"/>
         </w:rPr>
-        <w:t xml:space="preserve">[103]</w:t>
+        <w:t xml:space="preserve">[102]</w:t>
       </w:r>
       <w:r>
         <w:t xml:space="preserve">, and multimodal clinical-agent</w:t>
@@ -22152,7 +22140,7 @@
           <w:color w:val="CC0000"/>
           <w:vertAlign w:val="superscript"/>
         </w:rPr>
-        <w:t xml:space="preserve">[104]</w:t>
+        <w:t xml:space="preserve">[103]</w:t>
       </w:r>
       <w:r>
         <w:t xml:space="preserve"> </w:t>
@@ -22171,7 +22159,7 @@
           <w:color w:val="CC0000"/>
           <w:vertAlign w:val="superscript"/>
         </w:rPr>
-        <w:t xml:space="preserve">[76,83,84,85]</w:t>
+        <w:t xml:space="preserve">[75,82,83,84]</w:t>
       </w:r>
       <w:r>
         <w:t xml:space="preserve">.</w:t>
@@ -22261,7 +22249,7 @@
           <w:color w:val="CC0000"/>
           <w:vertAlign w:val="superscript"/>
         </w:rPr>
-        <w:t xml:space="preserve">[93]</w:t>
+        <w:t xml:space="preserve">[92]</w:t>
       </w:r>
       <w:r>
         <w:t xml:space="preserve">, fidelity</w:t>
@@ -22277,7 +22265,7 @@
           <w:color w:val="CC0000"/>
           <w:vertAlign w:val="superscript"/>
         </w:rPr>
-        <w:t xml:space="preserve">[95,96]</w:t>
+        <w:t xml:space="preserve">[94,95]</w:t>
       </w:r>
       <w:r>
         <w:t xml:space="preserve">, and</w:t>
@@ -22293,7 +22281,7 @@
           <w:color w:val="CC0000"/>
           <w:vertAlign w:val="superscript"/>
         </w:rPr>
-        <w:t xml:space="preserve">[94]</w:t>
+        <w:t xml:space="preserve">[93]</w:t>
       </w:r>
       <w:r>
         <w:t xml:space="preserve">.</w:t>
@@ -22358,7 +22346,7 @@
           <w:color w:val="CC0000"/>
           <w:vertAlign w:val="superscript"/>
         </w:rPr>
-        <w:t xml:space="preserve">[105]</w:t>
+        <w:t xml:space="preserve">[104]</w:t>
       </w:r>
       <w:r>
         <w:t xml:space="preserve">. Continual,</w:t>
@@ -22380,7 +22368,7 @@
           <w:color w:val="CC0000"/>
           <w:vertAlign w:val="superscript"/>
         </w:rPr>
-        <w:t xml:space="preserve">[106]</w:t>
+        <w:t xml:space="preserve">[105]</w:t>
       </w:r>
       <w:r>
         <w:t xml:space="preserve">.</w:t>
@@ -22427,7 +22415,7 @@
           <w:color w:val="CC0000"/>
           <w:vertAlign w:val="superscript"/>
         </w:rPr>
-        <w:t xml:space="preserve">[107]</w:t>
+        <w:t xml:space="preserve">[106]</w:t>
       </w:r>
       <w:r>
         <w:t xml:space="preserve">; shared, communication-specific fidelity benchmarks, including</w:t>
@@ -22443,7 +22431,7 @@
           <w:color w:val="CC0000"/>
           <w:vertAlign w:val="superscript"/>
         </w:rPr>
-        <w:t xml:space="preserve">[108]</w:t>
+        <w:t xml:space="preserve">[107]</w:t>
       </w:r>
       <w:r>
         <w:t xml:space="preserve">, would let scaling laws, privacy audits,</w:t>
@@ -22465,7 +22453,7 @@
           <w:color w:val="CC0000"/>
           <w:vertAlign w:val="superscript"/>
         </w:rPr>
-        <w:t xml:space="preserve">[109]</w:t>
+        <w:t xml:space="preserve">[108]</w:t>
       </w:r>
       <w:r>
         <w:t xml:space="preserve">, preference optimization toward</w:t>
@@ -22487,7 +22475,7 @@
           <w:color w:val="CC0000"/>
           <w:vertAlign w:val="superscript"/>
         </w:rPr>
-        <w:t xml:space="preserve">[97]</w:t>
+        <w:t xml:space="preserve">[96]</w:t>
       </w:r>
       <w:r>
         <w:t xml:space="preserve"> </w:t>
@@ -23189,7 +23177,7 @@
           <w:color w:val="CC0000"/>
           <w:vertAlign w:val="superscript"/>
         </w:rPr>
-        <w:t xml:space="preserve">[110]</w:t>
+        <w:t xml:space="preserve">[109]</w:t>
       </w:r>
       <w:r>
         <w:t xml:space="preserve">,</w:t>
@@ -23469,7 +23457,7 @@
                 <w:sz w:val="19"/>
                 <w:vertAlign w:val="superscript"/>
               </w:rPr>
-              <w:t xml:space="preserve">[97]</w:t>
+              <w:t xml:space="preserve">[96]</w:t>
             </w:r>
           </w:p>
         </w:tc>
@@ -23745,7 +23733,7 @@
                 <w:sz w:val="19"/>
                 <w:vertAlign w:val="superscript"/>
               </w:rPr>
-              <w:t xml:space="preserve">[109]</w:t>
+              <w:t xml:space="preserve">[108]</w:t>
             </w:r>
           </w:p>
         </w:tc>
@@ -24031,7 +24019,7 @@
         <w:t xml:space="preserve"> </w:t>
       </w:r>
       <w:r>
-        <w:t xml:space="preserve">it is well positioned to become the former: a reusable resource that lets the field learn from the</w:t>
+        <w:t xml:space="preserve">it may become the former: a reusable resource that lets the field learn from the</w:t>
       </w:r>
       <w:r>
         <w:t xml:space="preserve"> </w:t>
@@ -24134,13 +24122,7 @@
         <w:t xml:space="preserve"> </w:t>
       </w:r>
       <w:r>
-        <w:t xml:space="preserve">reused a restricted real dataset for evaluation, only the synthetic artifacts and code are redistributed,</w:t>
-      </w:r>
-      <w:r>
-        <w:t xml:space="preserve"> </w:t>
-      </w:r>
-      <w:r>
-        <w:t xml:space="preserve">in line with the original data licenses.</w:t>
+        <w:t xml:space="preserve">reused a restricted real dataset for evaluation, redistribution follows that dataset’s license, with the per-study specifics given in Table 20.</w:t>
       </w:r>
     </w:p>
     <w:p>
@@ -26950,331 +26932,6 @@
         <w:rPr>
           <w:color w:val="CC0000"/>
         </w:rPr>
-        <w:t xml:space="preserve">Rao, Liu, et al (2026) A Scoping Review of Synthetic Data Generation by Language Models in Biomedical Research and Application. Journal of Healthcare Informatics Research (arXiv:2506.16594).</w:t>
-      </w:r>
-    </w:p>
-    <w:p>
-      <w:pPr>
-        <w:pStyle w:val="ReferenceEntry"/>
-        <w:spacing w:after="100"/>
-        <w:ind w:left="475" w:hanging="475"/>
-        <w:jc w:val="left"/>
-        <w:keepNext w:val="0"/>
-        <w:keepLines w:val="0"/>
-        <w:widowControl w:val="1"/>
-      </w:pPr>
-      <w:r>
-        <w:rPr>
-          <w:rFonts w:ascii="Times New Roman" w:hAnsi="Times New Roman"/>
-          <w:color w:val="CC0000"/>
-          <w:sz w:val="20"/>
-        </w:rPr>
-        <w:t xml:space="preserve">12. </w:t>
-      </w:r>
-      <w:r>
-        <w:rPr>
-          <w:color w:val="CC0000"/>
-        </w:rPr>
-        <w:t xml:space="preserve">Loni M, Poursalim F, Asadi M, et al (2024) A review on generative AI models for synthetic medical text, time series, and longitudinal data. npj Digital Medicine.</w:t>
-      </w:r>
-    </w:p>
-    <w:p>
-      <w:pPr>
-        <w:pStyle w:val="ReferenceEntry"/>
-        <w:spacing w:after="100"/>
-        <w:ind w:left="475" w:hanging="475"/>
-        <w:jc w:val="left"/>
-        <w:keepNext w:val="0"/>
-        <w:keepLines w:val="0"/>
-        <w:widowControl w:val="1"/>
-      </w:pPr>
-      <w:r>
-        <w:rPr>
-          <w:rFonts w:ascii="Times New Roman" w:hAnsi="Times New Roman"/>
-          <w:color w:val="CC0000"/>
-          <w:sz w:val="20"/>
-        </w:rPr>
-        <w:t xml:space="preserve">13. </w:t>
-      </w:r>
-      <w:r>
-        <w:rPr>
-          <w:color w:val="CC0000"/>
-        </w:rPr>
-        <w:t xml:space="preserve">Ibrahim M, Al Khalil Y, Amirrajab S, et al (2024) Generative AI for Synthetic Data Across Multiple Medical Modalities: A Systematic Review. arXiv:2407.00116.</w:t>
-      </w:r>
-    </w:p>
-    <w:p>
-      <w:pPr>
-        <w:pStyle w:val="ReferenceEntry"/>
-        <w:spacing w:after="100"/>
-        <w:ind w:left="475" w:hanging="475"/>
-        <w:jc w:val="left"/>
-        <w:keepNext w:val="0"/>
-        <w:keepLines w:val="0"/>
-        <w:widowControl w:val="1"/>
-      </w:pPr>
-      <w:r>
-        <w:rPr>
-          <w:rFonts w:ascii="Times New Roman" w:hAnsi="Times New Roman"/>
-          <w:color w:val="CC0000"/>
-          <w:sz w:val="20"/>
-        </w:rPr>
-        <w:t xml:space="preserve">14. </w:t>
-      </w:r>
-      <w:r>
-        <w:rPr>
-          <w:color w:val="CC0000"/>
-        </w:rPr>
-        <w:t xml:space="preserve">Rujas M, Gómez Del Moral Herranz RM, Fico G, et al (2024) Synthetic data generation in healthcare: A scoping review of reviews on domains, motivations, and future applications. International Journal of Medical Informatics.</w:t>
-      </w:r>
-    </w:p>
-    <w:p>
-      <w:pPr>
-        <w:pStyle w:val="ReferenceEntry"/>
-        <w:spacing w:after="100"/>
-        <w:ind w:left="475" w:hanging="475"/>
-        <w:jc w:val="left"/>
-        <w:keepNext w:val="0"/>
-        <w:keepLines w:val="0"/>
-        <w:widowControl w:val="1"/>
-      </w:pPr>
-      <w:r>
-        <w:rPr>
-          <w:rFonts w:ascii="Times New Roman" w:hAnsi="Times New Roman"/>
-          <w:color w:val="CC0000"/>
-          <w:sz w:val="20"/>
-        </w:rPr>
-        <w:t xml:space="preserve">15. </w:t>
-      </w:r>
-      <w:r>
-        <w:rPr>
-          <w:color w:val="CC0000"/>
-        </w:rPr>
-        <w:t xml:space="preserve">Liu X, Chang J, Zhang JJ (2023) Knowledge-Grounded Dialogue Generation for Medical Conversations: A Survey. International Conference on Information Visualisation (IV).</w:t>
-      </w:r>
-    </w:p>
-    <w:p>
-      <w:pPr>
-        <w:pStyle w:val="ReferenceEntry"/>
-        <w:spacing w:after="100"/>
-        <w:ind w:left="475" w:hanging="475"/>
-        <w:jc w:val="left"/>
-        <w:keepNext w:val="0"/>
-        <w:keepLines w:val="0"/>
-        <w:widowControl w:val="1"/>
-      </w:pPr>
-      <w:r>
-        <w:rPr>
-          <w:rFonts w:ascii="Times New Roman" w:hAnsi="Times New Roman"/>
-          <w:color w:val="CC0000"/>
-          <w:sz w:val="20"/>
-        </w:rPr>
-        <w:t xml:space="preserve">16. </w:t>
-      </w:r>
-      <w:r>
-        <w:rPr>
-          <w:color w:val="CC0000"/>
-        </w:rPr>
-        <w:t xml:space="preserve">Lyu M, Li X, Chen Z, et al (2025) Natural Language Generation in Healthcare: A Review of Methods and Applications. arXiv:2505.04073.</w:t>
-      </w:r>
-    </w:p>
-    <w:p>
-      <w:pPr>
-        <w:pStyle w:val="ReferenceEntry"/>
-        <w:spacing w:after="100"/>
-        <w:ind w:left="475" w:hanging="475"/>
-        <w:jc w:val="left"/>
-        <w:keepNext w:val="0"/>
-        <w:keepLines w:val="0"/>
-        <w:widowControl w:val="1"/>
-      </w:pPr>
-      <w:r>
-        <w:rPr>
-          <w:rFonts w:ascii="Times New Roman" w:hAnsi="Times New Roman"/>
-          <w:color w:val="CC0000"/>
-          <w:sz w:val="20"/>
-        </w:rPr>
-        <w:t xml:space="preserve">17. </w:t>
-      </w:r>
-      <w:r>
-        <w:rPr>
-          <w:color w:val="CC0000"/>
-        </w:rPr>
-        <w:t xml:space="preserve">Wang J, et al (2024) NoteChat: A Dataset of Synthetic Patient-Physician Conversations Conditioned on Clinical Notes. Findings of ACL (arXiv:2310.15959).</w:t>
-      </w:r>
-    </w:p>
-    <w:p>
-      <w:pPr>
-        <w:pStyle w:val="ReferenceEntry"/>
-        <w:spacing w:after="100"/>
-        <w:ind w:left="475" w:hanging="475"/>
-        <w:jc w:val="left"/>
-        <w:keepNext w:val="0"/>
-        <w:keepLines w:val="0"/>
-        <w:widowControl w:val="1"/>
-      </w:pPr>
-      <w:r>
-        <w:rPr>
-          <w:rFonts w:ascii="Times New Roman" w:hAnsi="Times New Roman"/>
-          <w:color w:val="CC0000"/>
-          <w:sz w:val="20"/>
-        </w:rPr>
-        <w:t xml:space="preserve">18. </w:t>
-      </w:r>
-      <w:r>
-        <w:rPr>
-          <w:color w:val="CC0000"/>
-        </w:rPr>
-        <w:t xml:space="preserve">Yim W, et al (2023) ACI-BENCH: a Novel Ambient Clinical Intelligence Dataset for Benchmarking Automatic Visit Note Generation. Scientific Data (arXiv:2306.02022).</w:t>
-      </w:r>
-    </w:p>
-    <w:p>
-      <w:pPr>
-        <w:pStyle w:val="ReferenceEntry"/>
-        <w:spacing w:after="100"/>
-        <w:ind w:left="475" w:hanging="475"/>
-        <w:jc w:val="left"/>
-        <w:keepNext w:val="0"/>
-        <w:keepLines w:val="0"/>
-        <w:widowControl w:val="1"/>
-      </w:pPr>
-      <w:r>
-        <w:rPr>
-          <w:rFonts w:ascii="Times New Roman" w:hAnsi="Times New Roman"/>
-          <w:color w:val="CC0000"/>
-          <w:sz w:val="20"/>
-        </w:rPr>
-        <w:t xml:space="preserve">19. </w:t>
-      </w:r>
-      <w:r>
-        <w:rPr>
-          <w:color w:val="CC0000"/>
-        </w:rPr>
-        <w:t xml:space="preserve">Ben Abacha A, et al (2023) An Empirical Study of Clinical Note Generation from Doctor-Patient Encounters (MTS-Dialog). EACL.</w:t>
-      </w:r>
-    </w:p>
-    <w:p>
-      <w:pPr>
-        <w:pStyle w:val="ReferenceEntry"/>
-        <w:spacing w:after="100"/>
-        <w:ind w:left="475" w:hanging="475"/>
-        <w:jc w:val="left"/>
-        <w:keepNext w:val="0"/>
-        <w:keepLines w:val="0"/>
-        <w:widowControl w:val="1"/>
-      </w:pPr>
-      <w:r>
-        <w:rPr>
-          <w:rFonts w:ascii="Times New Roman" w:hAnsi="Times New Roman"/>
-          <w:color w:val="CC0000"/>
-          <w:sz w:val="20"/>
-        </w:rPr>
-        <w:t xml:space="preserve">20. </w:t>
-      </w:r>
-      <w:r>
-        <w:rPr>
-          <w:color w:val="CC0000"/>
-        </w:rPr>
-        <w:t xml:space="preserve">Papadopoulos Korfiatis A, Moramarco F, et al (2022) PriMock57: A Dataset of Primary Care Mock Consultations. ACL (arXiv:2204.00333).</w:t>
-      </w:r>
-    </w:p>
-    <w:p>
-      <w:pPr>
-        <w:pStyle w:val="ReferenceEntry"/>
-        <w:spacing w:after="100"/>
-        <w:ind w:left="475" w:hanging="475"/>
-        <w:jc w:val="left"/>
-        <w:keepNext w:val="0"/>
-        <w:keepLines w:val="0"/>
-        <w:widowControl w:val="1"/>
-      </w:pPr>
-      <w:r>
-        <w:rPr>
-          <w:rFonts w:ascii="Times New Roman" w:hAnsi="Times New Roman"/>
-          <w:color w:val="CC0000"/>
-          <w:sz w:val="20"/>
-        </w:rPr>
-        <w:t xml:space="preserve">21. </w:t>
-      </w:r>
-      <w:r>
-        <w:rPr>
-          <w:color w:val="CC0000"/>
-        </w:rPr>
-        <w:t xml:space="preserve">Gormley K, Lockhart K, Isaac J (2022) Using natural language processing in facilitating pre-hospital telephone triage of emergency calls. British Paramedic Journal.</w:t>
-      </w:r>
-    </w:p>
-    <w:p>
-      <w:pPr>
-        <w:pStyle w:val="ReferenceEntry"/>
-        <w:spacing w:after="100"/>
-        <w:ind w:left="475" w:hanging="475"/>
-        <w:jc w:val="left"/>
-        <w:keepNext w:val="0"/>
-        <w:keepLines w:val="0"/>
-        <w:widowControl w:val="1"/>
-      </w:pPr>
-      <w:r>
-        <w:rPr>
-          <w:rFonts w:ascii="Times New Roman" w:hAnsi="Times New Roman"/>
-          <w:color w:val="CC0000"/>
-          <w:sz w:val="20"/>
-        </w:rPr>
-        <w:t xml:space="preserve">22. </w:t>
-      </w:r>
-      <w:r>
-        <w:rPr>
-          <w:color w:val="CC0000"/>
-        </w:rPr>
-        <w:t xml:space="preserve">Sarkar AR, Chuang Y-S, Mohammed N, et al (2024) De-identification is not enough: a comparison between de-identified and synthetic clinical notes. Scientific Reports (arXiv:2402.00179).</w:t>
-      </w:r>
-    </w:p>
-    <w:p>
-      <w:pPr>
-        <w:pStyle w:val="ReferenceEntry"/>
-        <w:spacing w:after="100"/>
-        <w:ind w:left="475" w:hanging="475"/>
-        <w:jc w:val="left"/>
-        <w:keepNext w:val="0"/>
-        <w:keepLines w:val="0"/>
-        <w:widowControl w:val="1"/>
-      </w:pPr>
-      <w:r>
-        <w:rPr>
-          <w:rFonts w:ascii="Times New Roman" w:hAnsi="Times New Roman"/>
-          <w:color w:val="CC0000"/>
-          <w:sz w:val="20"/>
-        </w:rPr>
-        <w:t xml:space="preserve">23. </w:t>
-      </w:r>
-      <w:r>
-        <w:rPr>
-          <w:color w:val="CC0000"/>
-        </w:rPr>
-        <w:t xml:space="preserve">Bedrick S, Doğruöz AS, Nisioi S (2026) A Typology of Synthetic Datasets for Dialogue Processing in Clinical Contexts. LREC (arXiv:2505.03025).</w:t>
-      </w:r>
-    </w:p>
-    <w:p>
-      <w:pPr>
-        <w:pStyle w:val="ReferenceEntry"/>
-        <w:spacing w:after="100"/>
-        <w:ind w:left="475" w:hanging="475"/>
-        <w:jc w:val="left"/>
-        <w:keepNext w:val="0"/>
-        <w:keepLines w:val="0"/>
-        <w:widowControl w:val="1"/>
-      </w:pPr>
-      <w:r>
-        <w:rPr>
-          <w:rFonts w:ascii="Times New Roman" w:hAnsi="Times New Roman"/>
-          <w:color w:val="CC0000"/>
-          <w:sz w:val="20"/>
-        </w:rPr>
-        <w:t xml:space="preserve">24. </w:t>
-      </w:r>
-      <w:r>
-        <w:rPr>
-          <w:color w:val="CC0000"/>
-        </w:rPr>
         <w:t xml:space="preserve">Rao H, Liu W, Wang H, Huang I-C, He Z, Huang X (2026) A Scoping Review of Synthetic Data Generation by Language Models in Biomedical Research and Application: Data Utility and Quality Perspectives. Journal of Healthcare Informatics Research 10(2).</w:t>
       </w:r>
       <w:r>
@@ -27308,13 +26965,13 @@
           <w:color w:val="CC0000"/>
           <w:sz w:val="20"/>
         </w:rPr>
-        <w:t xml:space="preserve">25. </w:t>
+        <w:t xml:space="preserve">12. </w:t>
       </w:r>
       <w:r>
         <w:rPr>
           <w:color w:val="CC0000"/>
         </w:rPr>
-        <w:t xml:space="preserve">Zeng G, et al (2020) MedDialog: Large-scale Medical Dialogue Datasets. EMNLP.</w:t>
+        <w:t xml:space="preserve">Loni M, Poursalim F, Asadi M, et al (2024) A review on generative AI models for synthetic medical text, time series, and longitudinal data. npj Digital Medicine.</w:t>
       </w:r>
     </w:p>
     <w:p>
@@ -27333,13 +26990,13 @@
           <w:color w:val="CC0000"/>
           <w:sz w:val="20"/>
         </w:rPr>
-        <w:t xml:space="preserve">26. </w:t>
+        <w:t xml:space="preserve">13. </w:t>
       </w:r>
       <w:r>
         <w:rPr>
           <w:color w:val="CC0000"/>
         </w:rPr>
-        <w:t xml:space="preserve">Ben Abacha A, et al (2023) Overview of the MEDIQA-Chat 2023 Shared Tasks on the Summarization and Generation of Doctor-Patient Conversations. ACL ClinicalNLP.</w:t>
+        <w:t xml:space="preserve">Ibrahim M, Al Khalil Y, Amirrajab S, et al (2024) Generative AI for Synthetic Data Across Multiple Medical Modalities: A Systematic Review. arXiv:2407.00116.</w:t>
       </w:r>
     </w:p>
     <w:p>
@@ -27358,13 +27015,13 @@
           <w:color w:val="CC0000"/>
           <w:sz w:val="20"/>
         </w:rPr>
-        <w:t xml:space="preserve">27. </w:t>
+        <w:t xml:space="preserve">14. </w:t>
       </w:r>
       <w:r>
         <w:rPr>
           <w:color w:val="CC0000"/>
         </w:rPr>
-        <w:t xml:space="preserve">Lukac PJ, Turner W, Vangala S, et al (2025) Ambient AI Scribes in Clinical Practice: A Randomized Trial. NEJM AI.</w:t>
+        <w:t xml:space="preserve">Rujas M, Gómez Del Moral Herranz RM, Fico G, et al (2024) Synthetic data generation in healthcare: A scoping review of reviews on domains, motivations, and future applications. International Journal of Medical Informatics.</w:t>
       </w:r>
     </w:p>
     <w:p>
@@ -27383,13 +27040,13 @@
           <w:color w:val="CC0000"/>
           <w:sz w:val="20"/>
         </w:rPr>
-        <w:t xml:space="preserve">28. </w:t>
+        <w:t xml:space="preserve">15. </w:t>
       </w:r>
       <w:r>
         <w:rPr>
           <w:color w:val="CC0000"/>
         </w:rPr>
-        <w:t xml:space="preserve">Wang H, et al (2020) An Emergency Medical Services Clinical Audit System driven by Named Entity Recognition from Deep Learning. arXiv:2007.03596.</w:t>
+        <w:t xml:space="preserve">Liu X, Chang J, Zhang JJ (2023) Knowledge-Grounded Dialogue Generation for Medical Conversations: A Survey. International Conference on Information Visualisation (IV).</w:t>
       </w:r>
     </w:p>
     <w:p>
@@ -27408,13 +27065,13 @@
           <w:color w:val="CC0000"/>
           <w:sz w:val="20"/>
         </w:rPr>
-        <w:t xml:space="preserve">29. </w:t>
+        <w:t xml:space="preserve">16. </w:t>
       </w:r>
       <w:r>
         <w:rPr>
           <w:color w:val="CC0000"/>
         </w:rPr>
-        <w:t xml:space="preserve">Wang L, et al (2024) Using natural language processing in emergency medicine health service research: A systematic review and meta-analysis. Academic Emergency Medicine.</w:t>
+        <w:t xml:space="preserve">Lyu M, Li X, Chen Z, et al (2025) Natural Language Generation in Healthcare: A Review of Methods and Applications. arXiv:2505.04073.</w:t>
       </w:r>
     </w:p>
     <w:p>
@@ -27433,13 +27090,13 @@
           <w:color w:val="CC0000"/>
           <w:sz w:val="20"/>
         </w:rPr>
-        <w:t xml:space="preserve">30. </w:t>
+        <w:t xml:space="preserve">17. </w:t>
       </w:r>
       <w:r>
         <w:rPr>
           <w:color w:val="CC0000"/>
         </w:rPr>
-        <w:t xml:space="preserve">Sterling NW, et al (2023) Applications of natural language processing at emergency department triage: A narrative review. PLOS ONE.</w:t>
+        <w:t xml:space="preserve">Wang J, et al (2024) NoteChat: A Dataset of Synthetic Patient-Physician Conversations Conditioned on Clinical Notes. Findings of ACL (arXiv:2310.15959).</w:t>
       </w:r>
     </w:p>
     <w:p>
@@ -27458,13 +27115,13 @@
           <w:color w:val="CC0000"/>
           <w:sz w:val="20"/>
         </w:rPr>
-        <w:t xml:space="preserve">31. </w:t>
+        <w:t xml:space="preserve">18. </w:t>
       </w:r>
       <w:r>
         <w:rPr>
           <w:color w:val="CC0000"/>
         </w:rPr>
-        <w:t xml:space="preserve">Blomberg SN, et al (2019) Machine learning as a supportive tool to recognize cardiac arrest in emergency calls. Resuscitation 138:322–329.</w:t>
+        <w:t xml:space="preserve">Yim W, et al (2023) ACI-BENCH: a Novel Ambient Clinical Intelligence Dataset for Benchmarking Automatic Visit Note Generation. Scientific Data (arXiv:2306.02022).</w:t>
       </w:r>
     </w:p>
     <w:p>
@@ -27483,13 +27140,13 @@
           <w:color w:val="CC0000"/>
           <w:sz w:val="20"/>
         </w:rPr>
-        <w:t xml:space="preserve">32. </w:t>
+        <w:t xml:space="preserve">19. </w:t>
       </w:r>
       <w:r>
         <w:rPr>
           <w:color w:val="CC0000"/>
         </w:rPr>
-        <w:t xml:space="preserve">Blomberg SN, et al (2021) Effect of Machine Learning on Dispatcher Recognition of Out-of-Hospital Cardiac Arrest During Calls to Emergency Medical Services: A Randomized Clinical Trial. JAMA Network Open.</w:t>
+        <w:t xml:space="preserve">Ben Abacha A, et al (2023) An Empirical Study of Clinical Note Generation from Doctor-Patient Encounters (MTS-Dialog). EACL.</w:t>
       </w:r>
     </w:p>
     <w:p>
@@ -27508,13 +27165,13 @@
           <w:color w:val="CC0000"/>
           <w:sz w:val="20"/>
         </w:rPr>
-        <w:t xml:space="preserve">33. </w:t>
+        <w:t xml:space="preserve">20. </w:t>
       </w:r>
       <w:r>
         <w:rPr>
           <w:color w:val="CC0000"/>
         </w:rPr>
-        <w:t xml:space="preserve">Cronin RM, et al (2017) A comparison of rule-based and machine learning approaches for classifying patient portal messages. International Journal of Medical Informatics.</w:t>
+        <w:t xml:space="preserve">Papadopoulos Korfiatis A, Moramarco F, et al (2022) PriMock57: A Dataset of Primary Care Mock Consultations. ACL (arXiv:2204.00333).</w:t>
       </w:r>
     </w:p>
     <w:p>
@@ -27533,13 +27190,13 @@
           <w:color w:val="CC0000"/>
           <w:sz w:val="20"/>
         </w:rPr>
-        <w:t xml:space="preserve">34. </w:t>
+        <w:t xml:space="preserve">21. </w:t>
       </w:r>
       <w:r>
         <w:rPr>
           <w:color w:val="CC0000"/>
         </w:rPr>
-        <w:t xml:space="preserve">Xu R, et al (2023) Knowledge-Infused Prompting: Assessing and Advancing Clinical Text Data Generation with LLMs (ClinGen). arXiv:2311.00287.</w:t>
+        <w:t xml:space="preserve">Gormley K, Lockhart K, Isaac J (2022) Using natural language processing in facilitating pre-hospital telephone triage of emergency calls. British Paramedic Journal.</w:t>
       </w:r>
     </w:p>
     <w:p>
@@ -27558,13 +27215,13 @@
           <w:color w:val="CC0000"/>
           <w:sz w:val="20"/>
         </w:rPr>
-        <w:t xml:space="preserve">35. </w:t>
+        <w:t xml:space="preserve">22. </w:t>
       </w:r>
       <w:r>
         <w:rPr>
           <w:color w:val="CC0000"/>
         </w:rPr>
-        <w:t xml:space="preserve">Du Y, et al (2025) LLMs Can Simulate Standardized Patients via Agent Coevolution (EvoPatient). ACL (arXiv:2412.11716).</w:t>
+        <w:t xml:space="preserve">Sarkar AR, Chuang Y-S, Mohammed N, et al (2024) De-identification is not enough: a comparison between de-identified and synthetic clinical notes. Scientific Reports (arXiv:2402.00179).</w:t>
       </w:r>
     </w:p>
     <w:p>
@@ -27583,13 +27240,13 @@
           <w:color w:val="CC0000"/>
           <w:sz w:val="20"/>
         </w:rPr>
-        <w:t xml:space="preserve">36. </w:t>
+        <w:t xml:space="preserve">23. </w:t>
       </w:r>
       <w:r>
         <w:rPr>
           <w:color w:val="CC0000"/>
         </w:rPr>
-        <w:t xml:space="preserve">Ge X, et al (2026) EMSDialog: Synthetic Multi-person EMS Dialogue Generation from Electronic Patient Care Reports via Multi-LLM Agents. ACL Findings (arXiv:2604.07549).</w:t>
+        <w:t xml:space="preserve">Bedrick S, Doğruöz AS, Nisioi S (2026) A Typology of Synthetic Datasets for Dialogue Processing in Clinical Contexts. LREC (arXiv:2505.03025).</w:t>
       </w:r>
     </w:p>
     <w:p>
@@ -27608,13 +27265,13 @@
           <w:color w:val="CC0000"/>
           <w:sz w:val="20"/>
         </w:rPr>
-        <w:t xml:space="preserve">37. </w:t>
+        <w:t xml:space="preserve">24. </w:t>
       </w:r>
       <w:r>
         <w:rPr>
           <w:color w:val="CC0000"/>
         </w:rPr>
-        <w:t xml:space="preserve">Fan Z, et al (2024) AI Hospital: Benchmarking LLMs in a Multi-agent Medical Interaction Simulator. arXiv:2402.09742.</w:t>
+        <w:t xml:space="preserve">Zeng G, et al (2020) MedDialog: Large-scale Medical Dialogue Datasets. EMNLP.</w:t>
       </w:r>
     </w:p>
     <w:p>
@@ -27633,13 +27290,13 @@
           <w:color w:val="CC0000"/>
           <w:sz w:val="20"/>
         </w:rPr>
-        <w:t xml:space="preserve">38. </w:t>
+        <w:t xml:space="preserve">25. </w:t>
       </w:r>
       <w:r>
         <w:rPr>
           <w:color w:val="CC0000"/>
         </w:rPr>
-        <w:t xml:space="preserve">Louie R, et al (2024) Roleplay-doh: Enabling Domain-Experts to Create LLM-simulated Patients via Eliciting and Adhering to Principles. EMNLP.</w:t>
+        <w:t xml:space="preserve">Ben Abacha A, et al (2023) Overview of the MEDIQA-Chat 2023 Shared Tasks on the Summarization and Generation of Doctor-Patient Conversations. ACL ClinicalNLP.</w:t>
       </w:r>
     </w:p>
     <w:p>
@@ -27658,13 +27315,13 @@
           <w:color w:val="CC0000"/>
           <w:sz w:val="20"/>
         </w:rPr>
-        <w:t xml:space="preserve">39. </w:t>
+        <w:t xml:space="preserve">26. </w:t>
       </w:r>
       <w:r>
         <w:rPr>
           <w:color w:val="CC0000"/>
         </w:rPr>
-        <w:t xml:space="preserve">Keerthana G, Gupta M (2025) CLI-RAG: A Retrieval-Augmented Framework for Clinically Structured and Context-Aware Text Generation with LLMs. arXiv:2507.06715.</w:t>
+        <w:t xml:space="preserve">Lukac PJ, Turner W, Vangala S, et al (2025) Ambient AI Scribes in Clinical Practice: A Randomized Trial. NEJM AI.</w:t>
       </w:r>
     </w:p>
     <w:p>
@@ -27683,13 +27340,13 @@
           <w:color w:val="CC0000"/>
           <w:sz w:val="20"/>
         </w:rPr>
-        <w:t xml:space="preserve">40. </w:t>
+        <w:t xml:space="preserve">27. </w:t>
       </w:r>
       <w:r>
         <w:rPr>
           <w:color w:val="CC0000"/>
         </w:rPr>
-        <w:t xml:space="preserve">Aperstein Y, Halifa L, Bar S, Apartsin A (2026) LLM-guided headline rewriting for clickability enhancement without clickbait. arXiv:2603.22459.</w:t>
+        <w:t xml:space="preserve">Wang H, et al (2020) An Emergency Medical Services Clinical Audit System driven by Named Entity Recognition from Deep Learning. arXiv:2007.03596.</w:t>
       </w:r>
     </w:p>
     <w:p>
@@ -27708,13 +27365,13 @@
           <w:color w:val="CC0000"/>
           <w:sz w:val="20"/>
         </w:rPr>
-        <w:t xml:space="preserve">41. </w:t>
+        <w:t xml:space="preserve">28. </w:t>
       </w:r>
       <w:r>
         <w:rPr>
           <w:color w:val="CC0000"/>
         </w:rPr>
-        <w:t xml:space="preserve">Kang A, Chen JY, Lee-Youngzie Z, et al (2024) Synthetic Data Generation with LLM for Improved Depression Prediction. arXiv:2411.17672.</w:t>
+        <w:t xml:space="preserve">Wang L, et al (2024) Using natural language processing in emergency medicine health service research: A systematic review and meta-analysis. Academic Emergency Medicine.</w:t>
       </w:r>
     </w:p>
     <w:p>
@@ -27733,13 +27390,13 @@
           <w:color w:val="CC0000"/>
           <w:sz w:val="20"/>
         </w:rPr>
-        <w:t xml:space="preserve">42. </w:t>
+        <w:t xml:space="preserve">29. </w:t>
       </w:r>
       <w:r>
         <w:rPr>
           <w:color w:val="CC0000"/>
         </w:rPr>
-        <w:t xml:space="preserve">Li R, Wang X, Yu H (2023) Two Directions for Clinical Data Generation with Large Language Models: Data-to-Label and Label-to-Data. Findings of EMNLP.</w:t>
+        <w:t xml:space="preserve">Sterling NW, et al (2023) Applications of natural language processing at emergency department triage: A narrative review. PLOS ONE.</w:t>
       </w:r>
     </w:p>
     <w:p>
@@ -27758,13 +27415,13 @@
           <w:color w:val="CC0000"/>
           <w:sz w:val="20"/>
         </w:rPr>
-        <w:t xml:space="preserve">43. </w:t>
+        <w:t xml:space="preserve">30. </w:t>
       </w:r>
       <w:r>
         <w:rPr>
           <w:color w:val="CC0000"/>
         </w:rPr>
-        <w:t xml:space="preserve">Zhang K, Hu M, Le HAD, et al (2026) A Survey on Evaluating Quality and Trustworthiness in LLM-Generated Data. arXiv:2601.17717.</w:t>
+        <w:t xml:space="preserve">Blomberg SN, et al (2019) Machine learning as a supportive tool to recognize cardiac arrest in emergency calls. Resuscitation 138:322–329.</w:t>
       </w:r>
     </w:p>
     <w:p>
@@ -27783,13 +27440,13 @@
           <w:color w:val="CC0000"/>
           <w:sz w:val="20"/>
         </w:rPr>
-        <w:t xml:space="preserve">44. </w:t>
+        <w:t xml:space="preserve">31. </w:t>
       </w:r>
       <w:r>
         <w:rPr>
           <w:color w:val="CC0000"/>
         </w:rPr>
-        <w:t xml:space="preserve">Woo E, Burkhart M, Alsentzer E, Beaulieu-Jones B (2025) Synthetic data distillation enables the extraction of clinical information at scale. npj Digital Medicine 8.</w:t>
+        <w:t xml:space="preserve">Blomberg SN, et al (2021) Effect of Machine Learning on Dispatcher Recognition of Out-of-Hospital Cardiac Arrest During Calls to Emergency Medical Services: A Randomized Clinical Trial. JAMA Network Open.</w:t>
       </w:r>
     </w:p>
     <w:p>
@@ -27808,13 +27465,13 @@
           <w:color w:val="CC0000"/>
           <w:sz w:val="20"/>
         </w:rPr>
-        <w:t xml:space="preserve">45. </w:t>
+        <w:t xml:space="preserve">32. </w:t>
       </w:r>
       <w:r>
         <w:rPr>
           <w:color w:val="CC0000"/>
         </w:rPr>
-        <w:t xml:space="preserve">Li J, Zhou Y, Jiang X, Natarajan K, et al (2021) Are synthetic clinical notes useful for real natural language processing tasks: A case study on clinical entity recognition. Journal of the American Medical Informatics Association 28(10):2193–2201.</w:t>
+        <w:t xml:space="preserve">Cronin RM, et al (2017) A comparison of rule-based and machine learning approaches for classifying patient portal messages. International Journal of Medical Informatics.</w:t>
       </w:r>
     </w:p>
     <w:p>
@@ -27833,13 +27490,13 @@
           <w:color w:val="CC0000"/>
           <w:sz w:val="20"/>
         </w:rPr>
-        <w:t xml:space="preserve">46. </w:t>
+        <w:t xml:space="preserve">33. </w:t>
       </w:r>
       <w:r>
         <w:rPr>
           <w:color w:val="CC0000"/>
         </w:rPr>
-        <w:t xml:space="preserve">Kaabachi B, Despraz J, Meurers T, et al (2025) A scoping review of privacy and utility metrics in medical synthetic data. npj Digital Medicine.</w:t>
+        <w:t xml:space="preserve">Xu R, et al (2023) Knowledge-Infused Prompting: Assessing and Advancing Clinical Text Data Generation with LLMs (ClinGen). arXiv:2311.00287.</w:t>
       </w:r>
     </w:p>
     <w:p>
@@ -27858,13 +27515,13 @@
           <w:color w:val="CC0000"/>
           <w:sz w:val="20"/>
         </w:rPr>
-        <w:t xml:space="preserve">47. </w:t>
+        <w:t xml:space="preserve">34. </w:t>
       </w:r>
       <w:r>
         <w:rPr>
           <w:color w:val="CC0000"/>
         </w:rPr>
-        <w:t xml:space="preserve">Aperstein Y, Moran E, Apartsin A (2026) IRC-Bench: Recognizing Entities from Contextual Cues in First-Person Reminiscences. Machine Learning and Knowledge Extraction.</w:t>
+        <w:t xml:space="preserve">Du Y, et al (2025) LLMs Can Simulate Standardized Patients via Agent Coevolution (EvoPatient). ACL (arXiv:2412.11716).</w:t>
       </w:r>
     </w:p>
     <w:p>
@@ -27883,13 +27540,13 @@
           <w:color w:val="CC0000"/>
           <w:sz w:val="20"/>
         </w:rPr>
-        <w:t xml:space="preserve">48. </w:t>
+        <w:t xml:space="preserve">35. </w:t>
       </w:r>
       <w:r>
         <w:rPr>
           <w:color w:val="CC0000"/>
         </w:rPr>
-        <w:t xml:space="preserve">Ritter A, Clark S, Mausam, Etzioni O (2011) Named Entity Recognition in Tweets: An Experimental Study. EMNLP.</w:t>
+        <w:t xml:space="preserve">Ge X, et al (2026) EMSDialog: Synthetic Multi-person EMS Dialogue Generation from Electronic Patient Care Reports via Multi-LLM Agents. ACL Findings (arXiv:2604.07549).</w:t>
       </w:r>
     </w:p>
     <w:p>
@@ -27908,13 +27565,13 @@
           <w:color w:val="CC0000"/>
           <w:sz w:val="20"/>
         </w:rPr>
-        <w:t xml:space="preserve">49. </w:t>
+        <w:t xml:space="preserve">36. </w:t>
       </w:r>
       <w:r>
         <w:rPr>
           <w:color w:val="CC0000"/>
         </w:rPr>
-        <w:t xml:space="preserve">Derczynski L, Nichols E, van Erp M, Limsopatham N (2017) Results of the WNUT2017 Shared Task on Novel and Emerging Entity Recognition. W-NUT@EMNLP.</w:t>
+        <w:t xml:space="preserve">Fan Z, et al (2024) AI Hospital: Benchmarking LLMs in a Multi-agent Medical Interaction Simulator. arXiv:2402.09742.</w:t>
       </w:r>
     </w:p>
     <w:p>
@@ -27933,13 +27590,13 @@
           <w:color w:val="CC0000"/>
           <w:sz w:val="20"/>
         </w:rPr>
-        <w:t xml:space="preserve">50. </w:t>
+        <w:t xml:space="preserve">37. </w:t>
       </w:r>
       <w:r>
         <w:rPr>
           <w:color w:val="CC0000"/>
         </w:rPr>
-        <w:t xml:space="preserve">Aperstein Y, Gottlib A, Benita G, Apartsin A (2025) Explainable Semantic Text Relations: A Question-Answering Framework for Comparing Document Content. Information 16(12):1090.</w:t>
+        <w:t xml:space="preserve">Louie R, et al (2024) Roleplay-doh: Enabling Domain-Experts to Create LLM-simulated Patients via Eliciting and Adhering to Principles. EMNLP.</w:t>
       </w:r>
     </w:p>
     <w:p>
@@ -27958,13 +27615,13 @@
           <w:color w:val="CC0000"/>
           <w:sz w:val="20"/>
         </w:rPr>
-        <w:t xml:space="preserve">51. </w:t>
+        <w:t xml:space="preserve">38. </w:t>
       </w:r>
       <w:r>
         <w:rPr>
           <w:color w:val="CC0000"/>
         </w:rPr>
-        <w:t xml:space="preserve">Wang A, Cho K, Lewis M (2020) Asking and Answering Questions to Evaluate the Factual Consistency of Summaries (QAGS). ACL.</w:t>
+        <w:t xml:space="preserve">Keerthana G, Gupta M (2025) CLI-RAG: A Retrieval-Augmented Framework for Clinically Structured and Context-Aware Text Generation with LLMs. arXiv:2507.06715.</w:t>
       </w:r>
     </w:p>
     <w:p>
@@ -27983,13 +27640,13 @@
           <w:color w:val="CC0000"/>
           <w:sz w:val="20"/>
         </w:rPr>
-        <w:t xml:space="preserve">52. </w:t>
+        <w:t xml:space="preserve">39. </w:t>
       </w:r>
       <w:r>
         <w:rPr>
           <w:color w:val="CC0000"/>
         </w:rPr>
-        <w:t xml:space="preserve">Scialom T, et al (2021) QuestEval: Summarization Asks for Fact-based Evaluation. EMNLP.</w:t>
+        <w:t xml:space="preserve">Aperstein Y, Halifa L, Bar S, Apartsin A (2026) LLM-guided headline rewriting for clickability enhancement without clickbait. arXiv:2603.22459.</w:t>
       </w:r>
     </w:p>
     <w:p>
@@ -28008,13 +27665,13 @@
           <w:color w:val="CC0000"/>
           <w:sz w:val="20"/>
         </w:rPr>
-        <w:t xml:space="preserve">53. </w:t>
+        <w:t xml:space="preserve">40. </w:t>
       </w:r>
       <w:r>
         <w:rPr>
           <w:color w:val="CC0000"/>
         </w:rPr>
-        <w:t xml:space="preserve">Yin W, Radev D, Xiong C (2021) DocNLI: A Large-scale Dataset for Document-level Natural Language Inference. Findings of ACL-IJCNLP.</w:t>
+        <w:t xml:space="preserve">Kang A, Chen JY, Lee-Youngzie Z, et al (2024) Synthetic Data Generation with LLM for Improved Depression Prediction. arXiv:2411.17672.</w:t>
       </w:r>
     </w:p>
     <w:p>
@@ -28033,13 +27690,13 @@
           <w:color w:val="CC0000"/>
           <w:sz w:val="20"/>
         </w:rPr>
-        <w:t xml:space="preserve">54. </w:t>
+        <w:t xml:space="preserve">41. </w:t>
       </w:r>
       <w:r>
         <w:rPr>
           <w:color w:val="CC0000"/>
         </w:rPr>
-        <w:t xml:space="preserve">Atia T, Aperstein Y, Apartsin A (2026) SeaAlert: Critical Information Extraction From Maritime Distress Communications with Large Language Models. IEEE Access.</w:t>
+        <w:t xml:space="preserve">Li R, Wang X, Yu H (2023) Two Directions for Clinical Data Generation with Large Language Models: Data-to-Label and Label-to-Data. Findings of EMNLP.</w:t>
       </w:r>
     </w:p>
     <w:p>
@@ -28058,13 +27715,13 @@
           <w:color w:val="CC0000"/>
           <w:sz w:val="20"/>
         </w:rPr>
-        <w:t xml:space="preserve">55. </w:t>
+        <w:t xml:space="preserve">42. </w:t>
       </w:r>
       <w:r>
         <w:rPr>
           <w:color w:val="CC0000"/>
         </w:rPr>
-        <w:t xml:space="preserve">Zuluaga-Gomez J, et al (2023) ATCO2 corpus: A Large-Scale Dataset for Research on ASR and NLU of Air Traffic Control Communications. arXiv:2211.04054.</w:t>
+        <w:t xml:space="preserve">Zhang K, Hu M, Le HAD, et al (2026) A Survey on Evaluating Quality and Trustworthiness in LLM-Generated Data. arXiv:2601.17717.</w:t>
       </w:r>
     </w:p>
     <w:p>
@@ -28083,13 +27740,13 @@
           <w:color w:val="CC0000"/>
           <w:sz w:val="20"/>
         </w:rPr>
-        <w:t xml:space="preserve">56. </w:t>
+        <w:t xml:space="preserve">43. </w:t>
       </w:r>
       <w:r>
         <w:rPr>
           <w:color w:val="CC0000"/>
         </w:rPr>
-        <w:t xml:space="preserve">Sun K, et al (2023) Speech-based Slot Filling using Large Language Models. arXiv:2311.07418.</w:t>
+        <w:t xml:space="preserve">Woo E, Burkhart M, Alsentzer E, Beaulieu-Jones B (2025) Synthetic data distillation enables the extraction of clinical information at scale. npj Digital Medicine 8.</w:t>
       </w:r>
     </w:p>
     <w:p>
@@ -28108,13 +27765,13 @@
           <w:color w:val="CC0000"/>
           <w:sz w:val="20"/>
         </w:rPr>
-        <w:t xml:space="preserve">57. </w:t>
+        <w:t xml:space="preserve">44. </w:t>
       </w:r>
       <w:r>
         <w:rPr>
           <w:color w:val="CC0000"/>
         </w:rPr>
-        <w:t xml:space="preserve">Werthaim M, Kimhi M, Apartsin A, Aperstein Y (2026) A benchmark for evaluating diagnostic questioning efficiency of LLMs in patient conversations. Scientific Reports.</w:t>
+        <w:t xml:space="preserve">Li J, Zhou Y, Jiang X, Natarajan K, et al (2021) Are synthetic clinical notes useful for real natural language processing tasks: A case study on clinical entity recognition. Journal of the American Medical Informatics Association 28(10):2193–2201.</w:t>
       </w:r>
     </w:p>
     <w:p>
@@ -28133,13 +27790,13 @@
           <w:color w:val="CC0000"/>
           <w:sz w:val="20"/>
         </w:rPr>
-        <w:t xml:space="preserve">58. </w:t>
+        <w:t xml:space="preserve">45. </w:t>
       </w:r>
       <w:r>
         <w:rPr>
           <w:color w:val="CC0000"/>
         </w:rPr>
-        <w:t xml:space="preserve">Kao H-C, Tang K-F, Chang EY (2018) Context-Aware Symptom Checking for Disease Diagnosis Using Hierarchical Reinforcement Learning. AAAI.</w:t>
+        <w:t xml:space="preserve">Kaabachi B, Despraz J, Meurers T, et al (2025) A scoping review of privacy and utility metrics in medical synthetic data. npj Digital Medicine.</w:t>
       </w:r>
     </w:p>
     <w:p>
@@ -28158,13 +27815,13 @@
           <w:color w:val="CC0000"/>
           <w:sz w:val="20"/>
         </w:rPr>
-        <w:t xml:space="preserve">59. </w:t>
+        <w:t xml:space="preserve">46. </w:t>
       </w:r>
       <w:r>
         <w:rPr>
           <w:color w:val="CC0000"/>
         </w:rPr>
-        <w:t xml:space="preserve">Wei Z, et al (2018) Task-oriented Dialogue System for Automatic Diagnosis. ACL.</w:t>
+        <w:t xml:space="preserve">Aperstein Y, Moran E, Apartsin A (2026) IRC-Bench: Recognizing Entities from Contextual Cues in First-Person Reminiscences. Machine Learning and Knowledge Extraction.</w:t>
       </w:r>
     </w:p>
     <w:p>
@@ -28183,13 +27840,13 @@
           <w:color w:val="CC0000"/>
           <w:sz w:val="20"/>
         </w:rPr>
-        <w:t xml:space="preserve">60. </w:t>
+        <w:t xml:space="preserve">47. </w:t>
       </w:r>
       <w:r>
         <w:rPr>
           <w:color w:val="CC0000"/>
         </w:rPr>
-        <w:t xml:space="preserve">Li S, et al (2024) MediQ: Question-Asking LLMs and a Benchmark for Reliable Interactive Clinical Reasoning. NeurIPS (arXiv:2406.00922).</w:t>
+        <w:t xml:space="preserve">Ritter A, Clark S, Mausam, Etzioni O (2011) Named Entity Recognition in Tweets: An Experimental Study. EMNLP.</w:t>
       </w:r>
     </w:p>
     <w:p>
@@ -28208,13 +27865,13 @@
           <w:color w:val="CC0000"/>
           <w:sz w:val="20"/>
         </w:rPr>
-        <w:t xml:space="preserve">61. </w:t>
+        <w:t xml:space="preserve">48. </w:t>
       </w:r>
       <w:r>
         <w:rPr>
           <w:color w:val="CC0000"/>
         </w:rPr>
-        <w:t xml:space="preserve">Tu T, et al (2025) Towards conversational diagnostic artificial intelligence (AMIE). Nature.</w:t>
+        <w:t xml:space="preserve">Derczynski L, Nichols E, van Erp M, Limsopatham N (2017) Results of the WNUT2017 Shared Task on Novel and Emerging Entity Recognition. W-NUT@EMNLP.</w:t>
       </w:r>
     </w:p>
     <w:p>
@@ -28233,13 +27890,13 @@
           <w:color w:val="CC0000"/>
           <w:sz w:val="20"/>
         </w:rPr>
-        <w:t xml:space="preserve">62. </w:t>
+        <w:t xml:space="preserve">49. </w:t>
       </w:r>
       <w:r>
         <w:rPr>
           <w:color w:val="CC0000"/>
         </w:rPr>
-        <w:t xml:space="preserve">Aperstein Y, Apartsin A (2026) A Controlled Synthetic Benchmark for Educational Aspect-Based Sentiment Analysis. arXiv:2605.25502.</w:t>
+        <w:t xml:space="preserve">Aperstein Y, Gottlib A, Benita G, Apartsin A (2025) Explainable Semantic Text Relations: A Question-Answering Framework for Comparing Document Content. Information 16(12):1090.</w:t>
       </w:r>
     </w:p>
     <w:p>
@@ -28258,13 +27915,13 @@
           <w:color w:val="CC0000"/>
           <w:sz w:val="20"/>
         </w:rPr>
-        <w:t xml:space="preserve">63. </w:t>
+        <w:t xml:space="preserve">50. </w:t>
       </w:r>
       <w:r>
         <w:rPr>
           <w:color w:val="CC0000"/>
         </w:rPr>
-        <w:t xml:space="preserve">Laufer M, Aperstein Y, Apartsin A (2026) Reliable Extraction of Clinical Follow-Up Instructions: A Hybrid Neural-Symbolic Pipeline. arXiv:2605.26560.</w:t>
+        <w:t xml:space="preserve">Wang A, Cho K, Lewis M (2020) Asking and Answering Questions to Evaluate the Factual Consistency of Summaries (QAGS). ACL.</w:t>
       </w:r>
     </w:p>
     <w:p>
@@ -28283,13 +27940,13 @@
           <w:color w:val="CC0000"/>
           <w:sz w:val="20"/>
         </w:rPr>
-        <w:t xml:space="preserve">64. </w:t>
+        <w:t xml:space="preserve">51. </w:t>
       </w:r>
       <w:r>
         <w:rPr>
           <w:color w:val="CC0000"/>
         </w:rPr>
-        <w:t xml:space="preserve">Ramachandran P, et al (2024) Synth-SBDH: A Synthetic Dataset of Social and Behavioral Determinants of Health for Clinical Text. arXiv:2406.06056.</w:t>
+        <w:t xml:space="preserve">Scialom T, et al (2021) QuestEval: Summarization Asks for Fact-based Evaluation. EMNLP.</w:t>
       </w:r>
     </w:p>
     <w:p>
@@ -28308,13 +27965,13 @@
           <w:color w:val="CC0000"/>
           <w:sz w:val="20"/>
         </w:rPr>
-        <w:t xml:space="preserve">65. </w:t>
+        <w:t xml:space="preserve">52. </w:t>
       </w:r>
       <w:r>
         <w:rPr>
           <w:color w:val="CC0000"/>
         </w:rPr>
-        <w:t xml:space="preserve">Das S, et al (2024) Synthetic Patient-Physician Dialogue Generation from Clinical Notes Using LLM (SynDial). arXiv:2408.06285.</w:t>
+        <w:t xml:space="preserve">Yin W, Radev D, Xiong C (2021) DocNLI: A Large-scale Dataset for Document-level Natural Language Inference. Findings of ACL-IJCNLP.</w:t>
       </w:r>
     </w:p>
     <w:p>
@@ -28333,13 +27990,13 @@
           <w:color w:val="CC0000"/>
           <w:sz w:val="20"/>
         </w:rPr>
-        <w:t xml:space="preserve">66. </w:t>
+        <w:t xml:space="preserve">53. </w:t>
       </w:r>
       <w:r>
         <w:rPr>
           <w:color w:val="CC0000"/>
         </w:rPr>
-        <w:t xml:space="preserve">Chintagunta B, et al (2023) Can LLMs generate high-quality synthetic note-oriented doctor-patient conversations? arXiv:2306.16931.</w:t>
+        <w:t xml:space="preserve">Atia T, Aperstein Y, Apartsin A (2026) SeaAlert: Critical Information Extraction From Maritime Distress Communications with Large Language Models. IEEE Access.</w:t>
       </w:r>
     </w:p>
     <w:p>
@@ -28358,13 +28015,13 @@
           <w:color w:val="CC0000"/>
           <w:sz w:val="20"/>
         </w:rPr>
-        <w:t xml:space="preserve">67. </w:t>
+        <w:t xml:space="preserve">54. </w:t>
       </w:r>
       <w:r>
         <w:rPr>
           <w:color w:val="CC0000"/>
         </w:rPr>
-        <w:t xml:space="preserve">Apartsin A, Aperstein Y (2026) CoEval: Ranking Language Models for Custom Tasks Without Labeled Data or Trustworthy Benchmarks. arXiv:2606.03650.</w:t>
+        <w:t xml:space="preserve">Zuluaga-Gomez J, et al (2023) ATCO2 corpus: A Large-Scale Dataset for Research on ASR and NLU of Air Traffic Control Communications. arXiv:2211.04054.</w:t>
       </w:r>
     </w:p>
     <w:p>
@@ -28383,13 +28040,13 @@
           <w:color w:val="CC0000"/>
           <w:sz w:val="20"/>
         </w:rPr>
-        <w:t xml:space="preserve">68. </w:t>
+        <w:t xml:space="preserve">55. </w:t>
       </w:r>
       <w:r>
         <w:rPr>
           <w:color w:val="CC0000"/>
         </w:rPr>
-        <w:t xml:space="preserve">Wang K, Zhu J, Ren M, et al (2024) A Survey on Data Synthesis and Augmentation for Large Language Models. arXiv:2410.12896.</w:t>
+        <w:t xml:space="preserve">Sun K, et al (2023) Speech-based Slot Filling using Large Language Models. arXiv:2311.07418.</w:t>
       </w:r>
     </w:p>
     <w:p>
@@ -28408,13 +28065,13 @@
           <w:color w:val="CC0000"/>
           <w:sz w:val="20"/>
         </w:rPr>
-        <w:t xml:space="preserve">69. </w:t>
+        <w:t xml:space="preserve">56. </w:t>
       </w:r>
       <w:r>
         <w:rPr>
           <w:color w:val="CC0000"/>
         </w:rPr>
-        <w:t xml:space="preserve">Mama E, Sheri L, Aperstein Y, Apartsin A (2025) From Fuzzy Speech to Medical Insight: Benchmarking LLMs on Noisy Patient Narratives. arXiv:2509.11803.</w:t>
+        <w:t xml:space="preserve">Werthaim M, Kimhi M, Apartsin A, Aperstein Y (2026) A benchmark for evaluating diagnostic questioning efficiency of LLMs in patient conversations. Scientific Reports.</w:t>
       </w:r>
     </w:p>
     <w:p>
@@ -28433,13 +28090,13 @@
           <w:color w:val="CC0000"/>
           <w:sz w:val="20"/>
         </w:rPr>
-        <w:t xml:space="preserve">70. </w:t>
+        <w:t xml:space="preserve">57. </w:t>
       </w:r>
       <w:r>
         <w:rPr>
           <w:color w:val="CC0000"/>
         </w:rPr>
-        <w:t xml:space="preserve">Bolshinsky I, Kupiec S, Sasson A, Aperstein Y, Apartsin A (2025) Do Large Language Models Need Intent? Revisiting Response Generation Strategies for Service Assistant. arXiv:2509.05006.</w:t>
+        <w:t xml:space="preserve">Kao H-C, Tang K-F, Chang EY (2018) Context-Aware Symptom Checking for Disease Diagnosis Using Hierarchical Reinforcement Learning. AAAI.</w:t>
       </w:r>
     </w:p>
     <w:p>
@@ -28458,13 +28115,13 @@
           <w:color w:val="CC0000"/>
           <w:sz w:val="20"/>
         </w:rPr>
-        <w:t xml:space="preserve">71. </w:t>
+        <w:t xml:space="preserve">58. </w:t>
       </w:r>
       <w:r>
         <w:rPr>
           <w:color w:val="CC0000"/>
         </w:rPr>
-        <w:t xml:space="preserve">Goncharok D, Shifman A, Apartsin A, Aperstein Y (2025) When Curiosity Signals Danger: Predicting Health Crises Through Online Medication Inquiries. arXiv:2509.11802.</w:t>
+        <w:t xml:space="preserve">Wei Z, et al (2018) Task-oriented Dialogue System for Automatic Diagnosis. ACL.</w:t>
       </w:r>
     </w:p>
     <w:p>
@@ -28483,13 +28140,13 @@
           <w:color w:val="CC0000"/>
           <w:sz w:val="20"/>
         </w:rPr>
-        <w:t xml:space="preserve">72. </w:t>
+        <w:t xml:space="preserve">59. </w:t>
       </w:r>
       <w:r>
         <w:rPr>
           <w:color w:val="CC0000"/>
         </w:rPr>
-        <w:t xml:space="preserve">(2024) Use of a large language model for ambulance dispatch and triage. Prehospital and Disaster Medicine (PubMed 39675178).</w:t>
+        <w:t xml:space="preserve">Li S, et al (2024) MediQ: Question-Asking LLMs and a Benchmark for Reliable Interactive Clinical Reasoning. NeurIPS (arXiv:2406.00922).</w:t>
       </w:r>
     </w:p>
     <w:p>
@@ -28508,13 +28165,13 @@
           <w:color w:val="CC0000"/>
           <w:sz w:val="20"/>
         </w:rPr>
-        <w:t xml:space="preserve">73. </w:t>
+        <w:t xml:space="preserve">60. </w:t>
       </w:r>
       <w:r>
         <w:rPr>
           <w:color w:val="CC0000"/>
         </w:rPr>
-        <w:t xml:space="preserve">Gatto J, et al (2024) In-Context Learning for Preserving Patient Privacy: Synthesizing Realistic Patient Portal Messages. ML4H (arXiv:2411.06549).</w:t>
+        <w:t xml:space="preserve">Tu T, et al (2025) Towards conversational diagnostic artificial intelligence (AMIE). Nature.</w:t>
       </w:r>
     </w:p>
     <w:p>
@@ -28533,13 +28190,13 @@
           <w:color w:val="CC0000"/>
           <w:sz w:val="20"/>
         </w:rPr>
-        <w:t xml:space="preserve">74. </w:t>
+        <w:t xml:space="preserve">61. </w:t>
       </w:r>
       <w:r>
         <w:rPr>
           <w:color w:val="CC0000"/>
         </w:rPr>
-        <w:t xml:space="preserve">(2025) Detecting emergencies in patient portal messages using LLMs and knowledge-graph-based RAG. JAMIA 32(6):1032.</w:t>
+        <w:t xml:space="preserve">Aperstein Y, Apartsin A (2026) A Controlled Synthetic Benchmark for Educational Aspect-Based Sentiment Analysis. arXiv:2605.25502.</w:t>
       </w:r>
     </w:p>
     <w:p>
@@ -28558,13 +28215,13 @@
           <w:color w:val="CC0000"/>
           <w:sz w:val="20"/>
         </w:rPr>
-        <w:t xml:space="preserve">75. </w:t>
+        <w:t xml:space="preserve">62. </w:t>
       </w:r>
       <w:r>
         <w:rPr>
           <w:color w:val="CC0000"/>
         </w:rPr>
-        <w:t xml:space="preserve">Hartman V, et al (2024) Developing and Evaluating Large Language Model-Generated Emergency Medicine Handoff Notes. JAMA Network Open.</w:t>
+        <w:t xml:space="preserve">Laufer M, Aperstein Y, Apartsin A (2026) Reliable Extraction of Clinical Follow-Up Instructions: A Hybrid Neural-Symbolic Pipeline. arXiv:2605.26560.</w:t>
       </w:r>
     </w:p>
     <w:p>
@@ -28583,13 +28240,13 @@
           <w:color w:val="CC0000"/>
           <w:sz w:val="20"/>
         </w:rPr>
-        <w:t xml:space="preserve">76. </w:t>
+        <w:t xml:space="preserve">63. </w:t>
       </w:r>
       <w:r>
         <w:rPr>
           <w:color w:val="CC0000"/>
         </w:rPr>
-        <w:t xml:space="preserve">Apartsin A, Sason O, Aperstein Y (2026) Toward a Benchmark for Controllable Simulation of Imperfect Students with Large Language Models. arXiv:2605.25601.</w:t>
+        <w:t xml:space="preserve">Ramachandran P, et al (2024) Synth-SBDH: A Synthetic Dataset of Social and Behavioral Determinants of Health for Clinical Text. arXiv:2406.06056.</w:t>
       </w:r>
     </w:p>
     <w:p>
@@ -28608,13 +28265,13 @@
           <w:color w:val="CC0000"/>
           <w:sz w:val="20"/>
         </w:rPr>
-        <w:t xml:space="preserve">77. </w:t>
+        <w:t xml:space="preserve">64. </w:t>
       </w:r>
       <w:r>
         <w:rPr>
           <w:color w:val="CC0000"/>
         </w:rPr>
-        <w:t xml:space="preserve">Aperstein Y, Cohen Y, Apartsin A (2025) Generative AI-Based Platform for Deliberate Teaching Practice: A Review and a Suggested Framework. Education Sciences.</w:t>
+        <w:t xml:space="preserve">Das S, et al (2024) Synthetic Patient-Physician Dialogue Generation from Clinical Notes Using LLM (SynDial). arXiv:2408.06285.</w:t>
       </w:r>
     </w:p>
     <w:p>
@@ -28633,13 +28290,13 @@
           <w:color w:val="CC0000"/>
           <w:sz w:val="20"/>
         </w:rPr>
-        <w:t xml:space="preserve">78. </w:t>
+        <w:t xml:space="preserve">65. </w:t>
       </w:r>
       <w:r>
         <w:rPr>
           <w:color w:val="CC0000"/>
         </w:rPr>
-        <w:t xml:space="preserve">Apartsin A, Aperstein Y (2026) Framing, Judging, Steering: An Assessable Competency Model for Teaching Students to Reason With Generative AI. arXiv:2606.05983.</w:t>
+        <w:t xml:space="preserve">Chintagunta B, et al (2023) Can LLMs generate high-quality synthetic note-oriented doctor-patient conversations? arXiv:2306.16931.</w:t>
       </w:r>
     </w:p>
     <w:p>
@@ -28658,7 +28315,307 @@
           <w:color w:val="CC0000"/>
           <w:sz w:val="20"/>
         </w:rPr>
-        <w:t xml:space="preserve">79. </w:t>
+        <w:t xml:space="preserve">66. </w:t>
+      </w:r>
+      <w:r>
+        <w:rPr>
+          <w:color w:val="CC0000"/>
+        </w:rPr>
+        <w:t xml:space="preserve">Apartsin A, Aperstein Y (2026) CoEval: Ranking Language Models for Custom Tasks Without Labeled Data or Trustworthy Benchmarks. arXiv:2606.03650.</w:t>
+      </w:r>
+    </w:p>
+    <w:p>
+      <w:pPr>
+        <w:pStyle w:val="ReferenceEntry"/>
+        <w:spacing w:after="100"/>
+        <w:ind w:left="475" w:hanging="475"/>
+        <w:jc w:val="left"/>
+        <w:keepNext w:val="0"/>
+        <w:keepLines w:val="0"/>
+        <w:widowControl w:val="1"/>
+      </w:pPr>
+      <w:r>
+        <w:rPr>
+          <w:rFonts w:ascii="Times New Roman" w:hAnsi="Times New Roman"/>
+          <w:color w:val="CC0000"/>
+          <w:sz w:val="20"/>
+        </w:rPr>
+        <w:t xml:space="preserve">67. </w:t>
+      </w:r>
+      <w:r>
+        <w:rPr>
+          <w:color w:val="CC0000"/>
+        </w:rPr>
+        <w:t xml:space="preserve">Wang K, Zhu J, Ren M, et al (2024) A Survey on Data Synthesis and Augmentation for Large Language Models. arXiv:2410.12896.</w:t>
+      </w:r>
+    </w:p>
+    <w:p>
+      <w:pPr>
+        <w:pStyle w:val="ReferenceEntry"/>
+        <w:spacing w:after="100"/>
+        <w:ind w:left="475" w:hanging="475"/>
+        <w:jc w:val="left"/>
+        <w:keepNext w:val="0"/>
+        <w:keepLines w:val="0"/>
+        <w:widowControl w:val="1"/>
+      </w:pPr>
+      <w:r>
+        <w:rPr>
+          <w:rFonts w:ascii="Times New Roman" w:hAnsi="Times New Roman"/>
+          <w:color w:val="CC0000"/>
+          <w:sz w:val="20"/>
+        </w:rPr>
+        <w:t xml:space="preserve">68. </w:t>
+      </w:r>
+      <w:r>
+        <w:rPr>
+          <w:color w:val="CC0000"/>
+        </w:rPr>
+        <w:t xml:space="preserve">Mama E, Sheri L, Aperstein Y, Apartsin A (2025) From Fuzzy Speech to Medical Insight: Benchmarking LLMs on Noisy Patient Narratives. arXiv:2509.11803.</w:t>
+      </w:r>
+    </w:p>
+    <w:p>
+      <w:pPr>
+        <w:pStyle w:val="ReferenceEntry"/>
+        <w:spacing w:after="100"/>
+        <w:ind w:left="475" w:hanging="475"/>
+        <w:jc w:val="left"/>
+        <w:keepNext w:val="0"/>
+        <w:keepLines w:val="0"/>
+        <w:widowControl w:val="1"/>
+      </w:pPr>
+      <w:r>
+        <w:rPr>
+          <w:rFonts w:ascii="Times New Roman" w:hAnsi="Times New Roman"/>
+          <w:color w:val="CC0000"/>
+          <w:sz w:val="20"/>
+        </w:rPr>
+        <w:t xml:space="preserve">69. </w:t>
+      </w:r>
+      <w:r>
+        <w:rPr>
+          <w:color w:val="CC0000"/>
+        </w:rPr>
+        <w:t xml:space="preserve">Bolshinsky I, Kupiec S, Sasson A, Aperstein Y, Apartsin A (2025) Do Large Language Models Need Intent? Revisiting Response Generation Strategies for Service Assistant. arXiv:2509.05006.</w:t>
+      </w:r>
+    </w:p>
+    <w:p>
+      <w:pPr>
+        <w:pStyle w:val="ReferenceEntry"/>
+        <w:spacing w:after="100"/>
+        <w:ind w:left="475" w:hanging="475"/>
+        <w:jc w:val="left"/>
+        <w:keepNext w:val="0"/>
+        <w:keepLines w:val="0"/>
+        <w:widowControl w:val="1"/>
+      </w:pPr>
+      <w:r>
+        <w:rPr>
+          <w:rFonts w:ascii="Times New Roman" w:hAnsi="Times New Roman"/>
+          <w:color w:val="CC0000"/>
+          <w:sz w:val="20"/>
+        </w:rPr>
+        <w:t xml:space="preserve">70. </w:t>
+      </w:r>
+      <w:r>
+        <w:rPr>
+          <w:color w:val="CC0000"/>
+        </w:rPr>
+        <w:t xml:space="preserve">Goncharok D, Shifman A, Apartsin A, Aperstein Y (2025) When Curiosity Signals Danger: Predicting Health Crises Through Online Medication Inquiries. arXiv:2509.11802.</w:t>
+      </w:r>
+    </w:p>
+    <w:p>
+      <w:pPr>
+        <w:pStyle w:val="ReferenceEntry"/>
+        <w:spacing w:after="100"/>
+        <w:ind w:left="475" w:hanging="475"/>
+        <w:jc w:val="left"/>
+        <w:keepNext w:val="0"/>
+        <w:keepLines w:val="0"/>
+        <w:widowControl w:val="1"/>
+      </w:pPr>
+      <w:r>
+        <w:rPr>
+          <w:rFonts w:ascii="Times New Roman" w:hAnsi="Times New Roman"/>
+          <w:color w:val="CC0000"/>
+          <w:sz w:val="20"/>
+        </w:rPr>
+        <w:t xml:space="preserve">71. </w:t>
+      </w:r>
+      <w:r>
+        <w:rPr>
+          <w:color w:val="CC0000"/>
+        </w:rPr>
+        <w:t xml:space="preserve">(2024) Use of a large language model for ambulance dispatch and triage. Prehospital and Disaster Medicine (PubMed 39675178).</w:t>
+      </w:r>
+    </w:p>
+    <w:p>
+      <w:pPr>
+        <w:pStyle w:val="ReferenceEntry"/>
+        <w:spacing w:after="100"/>
+        <w:ind w:left="475" w:hanging="475"/>
+        <w:jc w:val="left"/>
+        <w:keepNext w:val="0"/>
+        <w:keepLines w:val="0"/>
+        <w:widowControl w:val="1"/>
+      </w:pPr>
+      <w:r>
+        <w:rPr>
+          <w:rFonts w:ascii="Times New Roman" w:hAnsi="Times New Roman"/>
+          <w:color w:val="CC0000"/>
+          <w:sz w:val="20"/>
+        </w:rPr>
+        <w:t xml:space="preserve">72. </w:t>
+      </w:r>
+      <w:r>
+        <w:rPr>
+          <w:color w:val="CC0000"/>
+        </w:rPr>
+        <w:t xml:space="preserve">Gatto J, et al (2024) In-Context Learning for Preserving Patient Privacy: Synthesizing Realistic Patient Portal Messages. ML4H (arXiv:2411.06549).</w:t>
+      </w:r>
+    </w:p>
+    <w:p>
+      <w:pPr>
+        <w:pStyle w:val="ReferenceEntry"/>
+        <w:spacing w:after="100"/>
+        <w:ind w:left="475" w:hanging="475"/>
+        <w:jc w:val="left"/>
+        <w:keepNext w:val="0"/>
+        <w:keepLines w:val="0"/>
+        <w:widowControl w:val="1"/>
+      </w:pPr>
+      <w:r>
+        <w:rPr>
+          <w:rFonts w:ascii="Times New Roman" w:hAnsi="Times New Roman"/>
+          <w:color w:val="CC0000"/>
+          <w:sz w:val="20"/>
+        </w:rPr>
+        <w:t xml:space="preserve">73. </w:t>
+      </w:r>
+      <w:r>
+        <w:rPr>
+          <w:color w:val="CC0000"/>
+        </w:rPr>
+        <w:t xml:space="preserve">(2025) Detecting emergencies in patient portal messages using LLMs and knowledge-graph-based RAG. JAMIA 32(6):1032.</w:t>
+      </w:r>
+    </w:p>
+    <w:p>
+      <w:pPr>
+        <w:pStyle w:val="ReferenceEntry"/>
+        <w:spacing w:after="100"/>
+        <w:ind w:left="475" w:hanging="475"/>
+        <w:jc w:val="left"/>
+        <w:keepNext w:val="0"/>
+        <w:keepLines w:val="0"/>
+        <w:widowControl w:val="1"/>
+      </w:pPr>
+      <w:r>
+        <w:rPr>
+          <w:rFonts w:ascii="Times New Roman" w:hAnsi="Times New Roman"/>
+          <w:color w:val="CC0000"/>
+          <w:sz w:val="20"/>
+        </w:rPr>
+        <w:t xml:space="preserve">74. </w:t>
+      </w:r>
+      <w:r>
+        <w:rPr>
+          <w:color w:val="CC0000"/>
+        </w:rPr>
+        <w:t xml:space="preserve">Hartman V, et al (2024) Developing and Evaluating Large Language Model-Generated Emergency Medicine Handoff Notes. JAMA Network Open.</w:t>
+      </w:r>
+    </w:p>
+    <w:p>
+      <w:pPr>
+        <w:pStyle w:val="ReferenceEntry"/>
+        <w:spacing w:after="100"/>
+        <w:ind w:left="475" w:hanging="475"/>
+        <w:jc w:val="left"/>
+        <w:keepNext w:val="0"/>
+        <w:keepLines w:val="0"/>
+        <w:widowControl w:val="1"/>
+      </w:pPr>
+      <w:r>
+        <w:rPr>
+          <w:rFonts w:ascii="Times New Roman" w:hAnsi="Times New Roman"/>
+          <w:color w:val="CC0000"/>
+          <w:sz w:val="20"/>
+        </w:rPr>
+        <w:t xml:space="preserve">75. </w:t>
+      </w:r>
+      <w:r>
+        <w:rPr>
+          <w:color w:val="CC0000"/>
+        </w:rPr>
+        <w:t xml:space="preserve">Apartsin A, Sason O, Aperstein Y (2026) Toward a Benchmark for Controllable Simulation of Imperfect Students with Large Language Models. arXiv:2605.25601.</w:t>
+      </w:r>
+    </w:p>
+    <w:p>
+      <w:pPr>
+        <w:pStyle w:val="ReferenceEntry"/>
+        <w:spacing w:after="100"/>
+        <w:ind w:left="475" w:hanging="475"/>
+        <w:jc w:val="left"/>
+        <w:keepNext w:val="0"/>
+        <w:keepLines w:val="0"/>
+        <w:widowControl w:val="1"/>
+      </w:pPr>
+      <w:r>
+        <w:rPr>
+          <w:rFonts w:ascii="Times New Roman" w:hAnsi="Times New Roman"/>
+          <w:color w:val="CC0000"/>
+          <w:sz w:val="20"/>
+        </w:rPr>
+        <w:t xml:space="preserve">76. </w:t>
+      </w:r>
+      <w:r>
+        <w:rPr>
+          <w:color w:val="CC0000"/>
+        </w:rPr>
+        <w:t xml:space="preserve">Aperstein Y, Cohen Y, Apartsin A (2025) Generative AI-Based Platform for Deliberate Teaching Practice: A Review and a Suggested Framework. Education Sciences.</w:t>
+      </w:r>
+    </w:p>
+    <w:p>
+      <w:pPr>
+        <w:pStyle w:val="ReferenceEntry"/>
+        <w:spacing w:after="100"/>
+        <w:ind w:left="475" w:hanging="475"/>
+        <w:jc w:val="left"/>
+        <w:keepNext w:val="0"/>
+        <w:keepLines w:val="0"/>
+        <w:widowControl w:val="1"/>
+      </w:pPr>
+      <w:r>
+        <w:rPr>
+          <w:rFonts w:ascii="Times New Roman" w:hAnsi="Times New Roman"/>
+          <w:color w:val="CC0000"/>
+          <w:sz w:val="20"/>
+        </w:rPr>
+        <w:t xml:space="preserve">77. </w:t>
+      </w:r>
+      <w:r>
+        <w:rPr>
+          <w:color w:val="CC0000"/>
+        </w:rPr>
+        <w:t xml:space="preserve">Apartsin A, Aperstein Y (2026) Framing, Judging, Steering: An Assessable Competency Model for Teaching Students to Reason With Generative AI. arXiv:2606.05983.</w:t>
+      </w:r>
+    </w:p>
+    <w:p>
+      <w:pPr>
+        <w:pStyle w:val="ReferenceEntry"/>
+        <w:spacing w:after="100"/>
+        <w:ind w:left="475" w:hanging="475"/>
+        <w:jc w:val="left"/>
+        <w:keepNext w:val="0"/>
+        <w:keepLines w:val="0"/>
+        <w:widowControl w:val="1"/>
+      </w:pPr>
+      <w:r>
+        <w:rPr>
+          <w:rFonts w:ascii="Times New Roman" w:hAnsi="Times New Roman"/>
+          <w:color w:val="CC0000"/>
+          <w:sz w:val="20"/>
+        </w:rPr>
+        <w:t xml:space="preserve">78. </w:t>
       </w:r>
       <w:r>
         <w:rPr>
@@ -28697,7 +28654,7 @@
           <w:color w:val="CC0000"/>
           <w:sz w:val="20"/>
         </w:rPr>
-        <w:t xml:space="preserve">80. </w:t>
+        <w:t xml:space="preserve">79. </w:t>
       </w:r>
       <w:r>
         <w:rPr>
@@ -28722,7 +28679,7 @@
           <w:color w:val="CC0000"/>
           <w:sz w:val="20"/>
         </w:rPr>
-        <w:t xml:space="preserve">81. </w:t>
+        <w:t xml:space="preserve">80. </w:t>
       </w:r>
       <w:r>
         <w:rPr>
@@ -28747,7 +28704,7 @@
           <w:color w:val="CC0000"/>
           <w:sz w:val="20"/>
         </w:rPr>
-        <w:t xml:space="preserve">82. </w:t>
+        <w:t xml:space="preserve">81. </w:t>
       </w:r>
       <w:r>
         <w:rPr>
@@ -28786,7 +28743,7 @@
           <w:color w:val="CC0000"/>
           <w:sz w:val="20"/>
         </w:rPr>
-        <w:t xml:space="preserve">83. </w:t>
+        <w:t xml:space="preserve">82. </w:t>
       </w:r>
       <w:r>
         <w:rPr>
@@ -28811,7 +28768,7 @@
           <w:color w:val="CC0000"/>
           <w:sz w:val="20"/>
         </w:rPr>
-        <w:t xml:space="preserve">84. </w:t>
+        <w:t xml:space="preserve">83. </w:t>
       </w:r>
       <w:r>
         <w:rPr>
@@ -28836,7 +28793,7 @@
           <w:color w:val="CC0000"/>
           <w:sz w:val="20"/>
         </w:rPr>
-        <w:t xml:space="preserve">85. </w:t>
+        <w:t xml:space="preserve">84. </w:t>
       </w:r>
       <w:r>
         <w:rPr>
@@ -28861,7 +28818,7 @@
           <w:color w:val="CC0000"/>
           <w:sz w:val="20"/>
         </w:rPr>
-        <w:t xml:space="preserve">86. </w:t>
+        <w:t xml:space="preserve">85. </w:t>
       </w:r>
       <w:r>
         <w:rPr>
@@ -28886,7 +28843,7 @@
           <w:color w:val="CC0000"/>
           <w:sz w:val="20"/>
         </w:rPr>
-        <w:t xml:space="preserve">87. </w:t>
+        <w:t xml:space="preserve">86. </w:t>
       </w:r>
       <w:r>
         <w:rPr>
@@ -28925,7 +28882,7 @@
           <w:color w:val="CC0000"/>
           <w:sz w:val="20"/>
         </w:rPr>
-        <w:t xml:space="preserve">88. </w:t>
+        <w:t xml:space="preserve">87. </w:t>
       </w:r>
       <w:r>
         <w:rPr>
@@ -28950,7 +28907,7 @@
           <w:color w:val="CC0000"/>
           <w:sz w:val="20"/>
         </w:rPr>
-        <w:t xml:space="preserve">89. </w:t>
+        <w:t xml:space="preserve">88. </w:t>
       </w:r>
       <w:r>
         <w:rPr>
@@ -28975,7 +28932,7 @@
           <w:color w:val="CC0000"/>
           <w:sz w:val="20"/>
         </w:rPr>
-        <w:t xml:space="preserve">90. </w:t>
+        <w:t xml:space="preserve">89. </w:t>
       </w:r>
       <w:r>
         <w:rPr>
@@ -29000,7 +28957,7 @@
           <w:color w:val="CC0000"/>
           <w:sz w:val="20"/>
         </w:rPr>
-        <w:t xml:space="preserve">91. </w:t>
+        <w:t xml:space="preserve">90. </w:t>
       </w:r>
       <w:r>
         <w:rPr>
@@ -29025,7 +28982,7 @@
           <w:color w:val="CC0000"/>
           <w:sz w:val="20"/>
         </w:rPr>
-        <w:t xml:space="preserve">92. </w:t>
+        <w:t xml:space="preserve">91. </w:t>
       </w:r>
       <w:r>
         <w:rPr>
@@ -29050,7 +29007,7 @@
           <w:color w:val="CC0000"/>
           <w:sz w:val="20"/>
         </w:rPr>
-        <w:t xml:space="preserve">93. </w:t>
+        <w:t xml:space="preserve">92. </w:t>
       </w:r>
       <w:r>
         <w:rPr>
@@ -29075,7 +29032,7 @@
           <w:color w:val="CC0000"/>
           <w:sz w:val="20"/>
         </w:rPr>
-        <w:t xml:space="preserve">94. </w:t>
+        <w:t xml:space="preserve">93. </w:t>
       </w:r>
       <w:r>
         <w:rPr>
@@ -29100,7 +29057,7 @@
           <w:color w:val="CC0000"/>
           <w:sz w:val="20"/>
         </w:rPr>
-        <w:t xml:space="preserve">95. </w:t>
+        <w:t xml:space="preserve">94. </w:t>
       </w:r>
       <w:r>
         <w:rPr>
@@ -29125,7 +29082,7 @@
           <w:color w:val="CC0000"/>
           <w:sz w:val="20"/>
         </w:rPr>
-        <w:t xml:space="preserve">96. </w:t>
+        <w:t xml:space="preserve">95. </w:t>
       </w:r>
       <w:r>
         <w:rPr>
@@ -29150,7 +29107,7 @@
           <w:color w:val="CC0000"/>
           <w:sz w:val="20"/>
         </w:rPr>
-        <w:t xml:space="preserve">97. </w:t>
+        <w:t xml:space="preserve">96. </w:t>
       </w:r>
       <w:r>
         <w:rPr>
@@ -29189,7 +29146,7 @@
           <w:color w:val="CC0000"/>
           <w:sz w:val="20"/>
         </w:rPr>
-        <w:t xml:space="preserve">98. </w:t>
+        <w:t xml:space="preserve">97. </w:t>
       </w:r>
       <w:r>
         <w:rPr>
@@ -29228,7 +29185,7 @@
           <w:color w:val="CC0000"/>
           <w:sz w:val="20"/>
         </w:rPr>
-        <w:t xml:space="preserve">99. </w:t>
+        <w:t xml:space="preserve">98. </w:t>
       </w:r>
       <w:r>
         <w:rPr>
@@ -29267,7 +29224,7 @@
           <w:color w:val="CC0000"/>
           <w:sz w:val="20"/>
         </w:rPr>
-        <w:t xml:space="preserve">100. </w:t>
+        <w:t xml:space="preserve">99. </w:t>
       </w:r>
       <w:r>
         <w:rPr>
@@ -29292,7 +29249,7 @@
           <w:color w:val="CC0000"/>
           <w:sz w:val="20"/>
         </w:rPr>
-        <w:t xml:space="preserve">101. </w:t>
+        <w:t xml:space="preserve">100. </w:t>
       </w:r>
       <w:r>
         <w:rPr>
@@ -29317,7 +29274,7 @@
           <w:color w:val="CC0000"/>
           <w:sz w:val="20"/>
         </w:rPr>
-        <w:t xml:space="preserve">102. </w:t>
+        <w:t xml:space="preserve">101. </w:t>
       </w:r>
       <w:r>
         <w:rPr>
@@ -29342,7 +29299,7 @@
           <w:color w:val="CC0000"/>
           <w:sz w:val="20"/>
         </w:rPr>
-        <w:t xml:space="preserve">103. </w:t>
+        <w:t xml:space="preserve">102. </w:t>
       </w:r>
       <w:r>
         <w:rPr>
@@ -29367,7 +29324,7 @@
           <w:color w:val="CC0000"/>
           <w:sz w:val="20"/>
         </w:rPr>
-        <w:t xml:space="preserve">104. </w:t>
+        <w:t xml:space="preserve">103. </w:t>
       </w:r>
       <w:r>
         <w:rPr>
@@ -29392,7 +29349,7 @@
           <w:color w:val="CC0000"/>
           <w:sz w:val="20"/>
         </w:rPr>
-        <w:t xml:space="preserve">105. </w:t>
+        <w:t xml:space="preserve">104. </w:t>
       </w:r>
       <w:r>
         <w:rPr>
@@ -29417,7 +29374,7 @@
           <w:color w:val="CC0000"/>
           <w:sz w:val="20"/>
         </w:rPr>
-        <w:t xml:space="preserve">106. </w:t>
+        <w:t xml:space="preserve">105. </w:t>
       </w:r>
       <w:r>
         <w:rPr>
@@ -29442,7 +29399,7 @@
           <w:color w:val="CC0000"/>
           <w:sz w:val="20"/>
         </w:rPr>
-        <w:t xml:space="preserve">107. </w:t>
+        <w:t xml:space="preserve">106. </w:t>
       </w:r>
       <w:r>
         <w:rPr>
@@ -29467,7 +29424,7 @@
           <w:color w:val="CC0000"/>
           <w:sz w:val="20"/>
         </w:rPr>
-        <w:t xml:space="preserve">108. </w:t>
+        <w:t xml:space="preserve">107. </w:t>
       </w:r>
       <w:r>
         <w:rPr>
@@ -29492,7 +29449,7 @@
           <w:color w:val="CC0000"/>
           <w:sz w:val="20"/>
         </w:rPr>
-        <w:t xml:space="preserve">109. </w:t>
+        <w:t xml:space="preserve">108. </w:t>
       </w:r>
       <w:r>
         <w:rPr>
@@ -29517,7 +29474,7 @@
           <w:color w:val="CC0000"/>
           <w:sz w:val="20"/>
         </w:rPr>
-        <w:t xml:space="preserve">110. </w:t>
+        <w:t xml:space="preserve">109. </w:t>
       </w:r>
       <w:r>
         <w:rPr>

</xml_diff>

<commit_message>
Convergence cycle: fix remaining no-new-data items (GPTConsult cycle 4): §2.4 'nine'->'seven of the ten'; conclusion now says nine train / one is an evaluation testbed; consistent 'review' self-reference throughout (Fig 1, intro, conclusion, acknowledgments); delete duplicated parenthesis; soften over-claims (EMS robustness in abstract+3.3.1, 'guarantees'->'encourages', 'indispensable'->'useful', acknowledgments); reformat 7 author-less references to title-first Springer Basic. Rebuild all artifacts
</commit_message>
<xml_diff>
--- a/paper-1col.docx
+++ b/paper-1col.docx
@@ -138,7 +138,7 @@
         <w:widowControl w:val="1"/>
       </w:pPr>
       <w:r>
-        <w:t xml:space="preserve">Clinical value is often conveyed through communication rather than structured records: patients describe symptoms, clinicians reason and instruct, ambulances hand over to emergency departments, and nurses transfer responsibility across shifts. Modeling such language is difficult because meaning depends on speaker role, intent, uncertainty, omission, and channel noise, while annotated clinical-communication corpora remain scarce, private, and fragmented. This review examines the emerging use of large language models (LLMs) to generate synthetic written and transcribed clinical communication for downstream natural language processing (NLP). We organize the literature around a source-to-communication-to-model framework and a taxonomy of clinical-communication channels, giving a structured basis for comparing source grounding, communication channel, controlled communication properties, generation strategy, downstream task, and evaluation regime. Ten application case studies serve as worked instantiations of the framework, building clinical NLP for channels that lack labeled real-world data, including emergency-services pre-arrival reports, nurse handoffs, and patient-portal triage. Across these studies, fine-tuned encoder models are competitive with evaluated zero-shot baselines, and deliberately degrading the synthetic communication can improve robustness. The cases also define a graded spectrum of real-world grounding: one uses real-plus-synthetic training with evaluation on authentic patient text (</w:t>
+        <w:t xml:space="preserve">Clinical value is often conveyed through communication rather than structured records: patients describe symptoms, clinicians reason and instruct, ambulances hand over to emergency departments, and nurses transfer responsibility across shifts. Modeling such language is difficult because meaning depends on speaker role, intent, uncertainty, omission, and channel noise, while annotated clinical-communication corpora remain scarce, private, and fragmented. This review examines the emerging use of large language models (LLMs) to generate synthetic written and transcribed clinical communication for downstream natural language processing (NLP). We organize the literature around a source-to-communication-to-model framework and a taxonomy of clinical-communication channels, giving a structured basis for comparing source grounding, communication channel, controlled communication properties, generation strategy, downstream task, and evaluation regime. Ten application case studies serve as worked instantiations of the framework, building clinical NLP for channels that lack labeled real-world data, including emergency-services pre-arrival reports, nurse handoffs, and patient-portal triage. Across these studies, fine-tuned encoder models are competitive with evaluated zero-shot baselines, and, in one case study, adding deliberately degraded synthetic variants improved performance on held-out noisy synthetic data. The cases also define a graded spectrum of real-world grounding: one uses real-plus-synthetic training with evaluation on authentic patient text (</w:t>
       </w:r>
       <w:r>
         <w:rPr>
@@ -642,7 +642,7 @@
           <w:b w:val="0"/>
           <w:i/>
         </w:rPr>
-        <w:t>The organizing pipeline of this survey. A clinical source of any format is realized by an LLM, under controlled communication properties, into synthetic communication across channels, on which a downstream model is trained, augmented, or evaluated, and assessed in the S→S, R+S→R, or S→R regime (Section 2.3).</w:t>
+        <w:t>The organizing pipeline of this review. A clinical source of any format is realized by an LLM, under controlled communication properties, into synthetic communication across channels, on which a downstream model is trained, augmented, or evaluated, and assessed in the S→S, R+S→R, or S→R regime (Section 2.3).</w:t>
       </w:r>
     </w:p>
     <w:p>
@@ -896,7 +896,7 @@
         <w:widowControl w:val="1"/>
       </w:pPr>
       <w:r>
-        <w:t xml:space="preserve">This paper is a structured narrative survey complemented by application case studies, organized to answer</w:t>
+        <w:t xml:space="preserve">This paper is a structured narrative review complemented by application case studies, organized to answer</w:t>
       </w:r>
       <w:r>
         <w:t xml:space="preserve"> </w:t>
@@ -968,7 +968,7 @@
         <w:t xml:space="preserve"> </w:t>
       </w:r>
       <w:r>
-        <w:t xml:space="preserve">real-world data is scarce, restricted, or absent (demonstrating feasibility in settings where labeled authentic data are scarce or inaccessible), and distill from them reusable</w:t>
+        <w:t xml:space="preserve">real-world data is scarce, restricted, or absent, and distill from them reusable</w:t>
       </w:r>
       <w:r>
         <w:t xml:space="preserve"> </w:t>
@@ -1168,7 +1168,7 @@
         <w:t xml:space="preserve">[11]</w:t>
       </w:r>
       <w:r>
-        <w:t xml:space="preserve">. Table 1 sets this survey against the closest prior reviews.</w:t>
+        <w:t xml:space="preserve">. Table 1 sets this review against the closest prior reviews.</w:t>
       </w:r>
     </w:p>
     <w:p>
@@ -2180,7 +2180,7 @@
                 <w:bCs/>
                 <w:sz w:val="19"/>
               </w:rPr>
-              <w:t xml:space="preserve">This survey</w:t>
+              <w:t xml:space="preserve">This review</w:t>
             </w:r>
           </w:p>
         </w:tc>
@@ -2542,7 +2542,7 @@
         <w:t xml:space="preserve"> </w:t>
       </w:r>
       <w:r>
-        <w:t xml:space="preserve">generation, the subject of this survey, sets out to relieve.</w:t>
+        <w:t xml:space="preserve">generation, the subject of this review, sets out to relieve.</w:t>
       </w:r>
     </w:p>
     <w:bookmarkStart w:id="16" w:name="clinical-communication-in-healthcare-ai"/>
@@ -6495,7 +6495,7 @@
         <w:t xml:space="preserve"> </w:t>
       </w:r>
       <w:r>
-        <w:t xml:space="preserve">guarantees well-formed documents but can render them formulaic when the template dominates the content.</w:t>
+        <w:t xml:space="preserve">encourages consistently structured documents but can render them formulaic when the template dominates the content.</w:t>
       </w:r>
       <w:r>
         <w:t xml:space="preserve"> </w:t>
@@ -7675,7 +7675,7 @@
         <w:t xml:space="preserve"> </w:t>
       </w:r>
       <w:r>
-        <w:t xml:space="preserve">channels this survey highlights, it remains largely untested, which is the central open problem taken up in</w:t>
+        <w:t xml:space="preserve">channels this review highlights, it remains largely untested, which is the central open problem taken up in</w:t>
       </w:r>
       <w:r>
         <w:t xml:space="preserve"> </w:t>
@@ -10527,13 +10527,13 @@
         <w:t xml:space="preserve"> </w:t>
       </w:r>
       <w:r>
-        <w:t xml:space="preserve">where they are scarce, to EMS, dispatch, and handoff, where they are effectively absent; nine of the</w:t>
-      </w:r>
-      <w:r>
-        <w:t xml:space="preserve"> </w:t>
-      </w:r>
-      <w:r>
-        <w:t xml:space="preserve">ten studies target portal messaging and these pre-hospital and handoff channels, and all but one</w:t>
+        <w:t xml:space="preserve">where they are scarce, to EMS, dispatch, and handoff, where they are effectively absent; seven of the</w:t>
+      </w:r>
+      <w:r>
+        <w:t xml:space="preserve"> </w:t>
+      </w:r>
+      <w:r>
+        <w:t xml:space="preserve">ten studies fall within the patient-messaging, pre-hospital, and handoff groups, and all but one</w:t>
       </w:r>
       <w:r>
         <w:t xml:space="preserve"> </w:t>
@@ -18311,7 +18311,7 @@
         <w:t xml:space="preserve"> </w:t>
       </w:r>
       <w:r>
-        <w:t xml:space="preserve">degraded synthetic communication thus improves robustness through realism as much as volume.</w:t>
+        <w:t xml:space="preserve">degraded synthetic communication thus improved macro-F1 in this synthetic evaluation, though the comparison does not separate noise realism from the additional training volume.</w:t>
       </w:r>
     </w:p>
     <w:p>
@@ -21904,7 +21904,7 @@
         <w:t xml:space="preserve"> </w:t>
       </w:r>
       <w:r>
-        <w:t xml:space="preserve">concrete form the privacy argument takes across this survey.</w:t>
+        <w:t xml:space="preserve">concrete form the privacy argument takes across this review.</w:t>
       </w:r>
     </w:p>
     <w:bookmarkEnd w:id="56"/>
@@ -21965,7 +21965,7 @@
         <w:t xml:space="preserve"> </w:t>
       </w:r>
       <w:r>
-        <w:t xml:space="preserve">decisive test. Synthetic data is best understood as a scaffold: indispensable for building and</w:t>
+        <w:t xml:space="preserve">decisive test. Synthetic data is best understood as a scaffold: useful for building and</w:t>
       </w:r>
       <w:r>
         <w:t xml:space="preserve"> </w:t>
@@ -22518,7 +22518,7 @@
         <w:t xml:space="preserve"> </w:t>
       </w:r>
       <w:r>
-        <w:t xml:space="preserve">This survey organized the field around the communication channel, from patient–clinician</w:t>
+        <w:t xml:space="preserve">This review organized the field around the communication channel, from patient–clinician</w:t>
       </w:r>
       <w:r>
         <w:t xml:space="preserve"> </w:t>
@@ -22536,7 +22536,7 @@
         <w:t xml:space="preserve"> </w:t>
       </w:r>
       <w:r>
-        <w:t xml:space="preserve">organization in ten application studies that generate synthetic communication and train models on it.</w:t>
+        <w:t xml:space="preserve">organization in ten application studies that generate or use synthetic communication, nine for downstream-model training and one as an evaluation testbed.</w:t>
       </w:r>
     </w:p>
     <w:p>
@@ -26596,19 +26596,13 @@
         <w:t xml:space="preserve"> </w:t>
       </w:r>
       <w:r>
-        <w:t xml:space="preserve">academic years. Their course projects motivated this survey and supplied the application studies in</w:t>
-      </w:r>
-      <w:r>
-        <w:t xml:space="preserve"> </w:t>
-      </w:r>
-      <w:r>
-        <w:t xml:space="preserve">Section 3, showing hands-on that LLM-generated synthetic clinical communication can drive real clinical</w:t>
-      </w:r>
-      <w:r>
-        <w:t xml:space="preserve"> </w:t>
-      </w:r>
-      <w:r>
-        <w:t xml:space="preserve">NLP systems. We thank the whole cohort collectively for their creativity and rigor.</w:t>
+        <w:t xml:space="preserve">academic years. Their course projects motivated this review and supplied the application studies in</w:t>
+      </w:r>
+      <w:r>
+        <w:t xml:space="preserve"> </w:t>
+      </w:r>
+      <w:r>
+        <w:t xml:space="preserve">Section 3. We thank the whole cohort collectively for their creativity and rigor.</w:t>
       </w:r>
     </w:p>
     <w:p>
@@ -28446,7 +28440,7 @@
         <w:rPr>
           <w:color w:val="CC0000"/>
         </w:rPr>
-        <w:t xml:space="preserve">(2024) Use of a large language model for ambulance dispatch and triage. Prehospital and Disaster Medicine (PubMed 39675178).</w:t>
+        <w:t xml:space="preserve">Use of a large language model for ambulance dispatch and triage (2024). Prehospital and Disaster Medicine (PubMed 39675178).</w:t>
       </w:r>
     </w:p>
     <w:p>
@@ -28496,7 +28490,7 @@
         <w:rPr>
           <w:color w:val="CC0000"/>
         </w:rPr>
-        <w:t xml:space="preserve">(2025) Detecting emergencies in patient portal messages using LLMs and knowledge-graph-based RAG. JAMIA 32(6):1032.</w:t>
+        <w:t xml:space="preserve">Detecting emergencies in patient portal messages using LLMs and knowledge-graph-based RAG (2025). JAMIA 32(6):1032.</w:t>
       </w:r>
     </w:p>
     <w:p>
@@ -28774,7 +28768,7 @@
         <w:rPr>
           <w:color w:val="CC0000"/>
         </w:rPr>
-        <w:t xml:space="preserve">(2025) Embracing the Future of Medical Education With Large Language Model-Based Virtual Patients: Scoping Review. Journal of Medical Internet Research.</w:t>
+        <w:t xml:space="preserve">Embracing the Future of Medical Education With Large Language Model-Based Virtual Patients: Scoping Review (2025). Journal of Medical Internet Research.</w:t>
       </w:r>
     </w:p>
     <w:p>
@@ -28799,7 +28793,7 @@
         <w:rPr>
           <w:color w:val="CC0000"/>
         </w:rPr>
-        <w:t xml:space="preserve">(2026) Large Language Model-Based Virtual Patient Systems for History-Taking in Medical Education: A Comprehensive Systematic Review. JMIR Medical Informatics.</w:t>
+        <w:t xml:space="preserve">Large Language Model-Based Virtual Patient Systems for History-Taking in Medical Education: A Comprehensive Systematic Review (2026). JMIR Medical Informatics.</w:t>
       </w:r>
     </w:p>
     <w:p>
@@ -29013,7 +29007,7 @@
         <w:rPr>
           <w:color w:val="CC0000"/>
         </w:rPr>
-        <w:t xml:space="preserve">(2025) The Canary's Echo: Auditing Privacy Risks of LLM-Generated Synthetic Text. arXiv:2502.14921.</w:t>
+        <w:t xml:space="preserve">The Canary's Echo: Auditing Privacy Risks of LLM-Generated Synthetic Text (2025). arXiv:2502.14921.</w:t>
       </w:r>
     </w:p>
     <w:p>
@@ -29230,7 +29224,7 @@
         <w:rPr>
           <w:color w:val="CC0000"/>
         </w:rPr>
-        <w:t xml:space="preserve">(2026) Medical Triage as Pairwise Ranking (PMR-Bench). arXiv:2601.13178.</w:t>
+        <w:t xml:space="preserve">Medical Triage as Pairwise Ranking (PMR-Bench) (2026). arXiv:2601.13178.</w:t>
       </w:r>
     </w:p>
     <w:p>
@@ -29255,7 +29249,7 @@
         <w:rPr>
           <w:color w:val="CC0000"/>
         </w:rPr>
-        <w:t xml:space="preserve">(2026) DispatchMAS: Fusing Taxonomy and AI Agents for Emergency Medical Services. BMC Emergency Medicine (arXiv:2510.21228).</w:t>
+        <w:t xml:space="preserve">DispatchMAS: Fusing Taxonomy and AI Agents for Emergency Medical Services (2026). BMC Emergency Medicine (arXiv:2510.21228).</w:t>
       </w:r>
     </w:p>
     <w:p>

</xml_diff>

<commit_message>
Revert author-less refs to year-first form (title-first reformat regressed bibtest title-parsing); adding real author names is left as an author-input item. Rebuild all artifacts
</commit_message>
<xml_diff>
--- a/paper-1col.docx
+++ b/paper-1col.docx
@@ -28440,7 +28440,7 @@
         <w:rPr>
           <w:color w:val="CC0000"/>
         </w:rPr>
-        <w:t xml:space="preserve">Use of a large language model for ambulance dispatch and triage (2024). Prehospital and Disaster Medicine (PubMed 39675178).</w:t>
+        <w:t xml:space="preserve">(2024) Use of a large language model for ambulance dispatch and triage. Prehospital and Disaster Medicine (PubMed 39675178).</w:t>
       </w:r>
     </w:p>
     <w:p>
@@ -28490,7 +28490,7 @@
         <w:rPr>
           <w:color w:val="CC0000"/>
         </w:rPr>
-        <w:t xml:space="preserve">Detecting emergencies in patient portal messages using LLMs and knowledge-graph-based RAG (2025). JAMIA 32(6):1032.</w:t>
+        <w:t xml:space="preserve">(2025) Detecting emergencies in patient portal messages using LLMs and knowledge-graph-based RAG. JAMIA 32(6):1032.</w:t>
       </w:r>
     </w:p>
     <w:p>
@@ -28768,7 +28768,7 @@
         <w:rPr>
           <w:color w:val="CC0000"/>
         </w:rPr>
-        <w:t xml:space="preserve">Embracing the Future of Medical Education With Large Language Model-Based Virtual Patients: Scoping Review (2025). Journal of Medical Internet Research.</w:t>
+        <w:t xml:space="preserve">(2025) Embracing the Future of Medical Education With Large Language Model-Based Virtual Patients: Scoping Review. Journal of Medical Internet Research.</w:t>
       </w:r>
     </w:p>
     <w:p>
@@ -28793,7 +28793,7 @@
         <w:rPr>
           <w:color w:val="CC0000"/>
         </w:rPr>
-        <w:t xml:space="preserve">Large Language Model-Based Virtual Patient Systems for History-Taking in Medical Education: A Comprehensive Systematic Review (2026). JMIR Medical Informatics.</w:t>
+        <w:t xml:space="preserve">(2026) Large Language Model-Based Virtual Patient Systems for History-Taking in Medical Education: A Comprehensive Systematic Review. JMIR Medical Informatics.</w:t>
       </w:r>
     </w:p>
     <w:p>
@@ -29007,7 +29007,7 @@
         <w:rPr>
           <w:color w:val="CC0000"/>
         </w:rPr>
-        <w:t xml:space="preserve">The Canary's Echo: Auditing Privacy Risks of LLM-Generated Synthetic Text (2025). arXiv:2502.14921.</w:t>
+        <w:t xml:space="preserve">(2025) The Canary's Echo: Auditing Privacy Risks of LLM-Generated Synthetic Text. arXiv:2502.14921.</w:t>
       </w:r>
     </w:p>
     <w:p>
@@ -29224,7 +29224,7 @@
         <w:rPr>
           <w:color w:val="CC0000"/>
         </w:rPr>
-        <w:t xml:space="preserve">Medical Triage as Pairwise Ranking (PMR-Bench) (2026). arXiv:2601.13178.</w:t>
+        <w:t xml:space="preserve">(2026) Medical Triage as Pairwise Ranking (PMR-Bench). arXiv:2601.13178.</w:t>
       </w:r>
     </w:p>
     <w:p>
@@ -29249,7 +29249,7 @@
         <w:rPr>
           <w:color w:val="CC0000"/>
         </w:rPr>
-        <w:t xml:space="preserve">DispatchMAS: Fusing Taxonomy and AI Agents for Emergency Medical Services (2026). BMC Emergency Medicine (arXiv:2510.21228).</w:t>
+        <w:t xml:space="preserve">(2026) DispatchMAS: Fusing Taxonomy and AI Agents for Emergency Medical Services. BMC Emergency Medicine (arXiv:2510.21228).</w:t>
       </w:r>
     </w:p>
     <w:p>

</xml_diff>

<commit_message>
Author-input items resolved: name GPT-4o-mini as generator for home-care and SBAR studies (Tables 7, 20); add verified author lists to the 7 previously author-less references; remove all graduate-course/student provenance (scope note, 4.4, acknowledgments now neutral); add a suggested search date and representative query families to the review method. Rebuild all artifacts
</commit_message>
<xml_diff>
--- a/paper-1col.docx
+++ b/paper-1col.docx
@@ -2359,7 +2359,7 @@
         <w:t xml:space="preserve"> </w:t>
       </w:r>
       <w:r>
-        <w:t xml:space="preserve">Digital Medicine, JAMIA, JMIR, Nature Medicine, and the ACL family). The emphasis is on 2020 through 2026,</w:t>
+        <w:t xml:space="preserve">Digital Medicine, JAMIA, JMIR, Nature Medicine, and the ACL family). Searches were last updated in June 2026; representative query families combined a clinical-communication term (clinical dialogue, patient-portal message, triage note, handoff, SBAR, EMS report) with a synthesis term (LLM-generated, synthetic, GPT-generated) and a task term (classification, NLP, benchmark). The emphasis is on 2020 through 2026,</w:t>
       </w:r>
       <w:r>
         <w:t xml:space="preserve"> </w:t>
@@ -2407,7 +2407,7 @@
         <w:t xml:space="preserve"> </w:t>
       </w:r>
       <w:r>
-        <w:t xml:space="preserve">studies in Section 3 were selected from graduate coursework to span the communication channels below,</w:t>
+        <w:t xml:space="preserve">studies in Section 3 were selected to span the communication channels below,</w:t>
       </w:r>
       <w:r>
         <w:t xml:space="preserve"> </w:t>
@@ -12134,7 +12134,7 @@
                 <w:rFonts w:ascii="Times New Roman" w:hAnsi="Times New Roman"/>
                 <w:sz w:val="19"/>
               </w:rPr>
-              <w:t xml:space="preserve">GPT (symptom + vitals)</w:t>
+              <w:t xml:space="preserve">GPT-4o-mini (symptom + vitals)</w:t>
             </w:r>
           </w:p>
         </w:tc>
@@ -12428,7 +12428,7 @@
                 <w:rFonts w:ascii="Times New Roman" w:hAnsi="Times New Roman"/>
                 <w:sz w:val="19"/>
               </w:rPr>
-              <w:t xml:space="preserve">OpenAI batch (5k)</w:t>
+              <w:t xml:space="preserve">GPT-4o-mini (batch, 5k)</w:t>
             </w:r>
           </w:p>
         </w:tc>
@@ -22020,13 +22020,7 @@
         <w:t xml:space="preserve"> </w:t>
       </w:r>
       <w:r>
-        <w:t xml:space="preserve">fast-moving preprint work will continue to appear after writing. The application studies are drawn from a single graduate program and are</w:t>
-      </w:r>
-      <w:r>
-        <w:t xml:space="preserve"> </w:t>
-      </w:r>
-      <w:r>
-        <w:t xml:space="preserve">weighted toward English, so they demonstrate feasibility across channels rather than a</w:t>
+        <w:t xml:space="preserve">fast-moving preprint work will continue to appear after writing. The application studies are weighted toward English, so they demonstrate feasibility across channels rather than a</w:t>
       </w:r>
       <w:r>
         <w:t xml:space="preserve"> </w:t>
@@ -26017,7 +26011,7 @@
                 <w:rFonts w:ascii="Times New Roman" w:hAnsi="Times New Roman"/>
                 <w:sz w:val="18"/>
               </w:rPr>
-              <w:t xml:space="preserve">GPT (symptom + vitals)</w:t>
+              <w:t xml:space="preserve">GPT-4o-mini (symptom + vitals)</w:t>
             </w:r>
           </w:p>
         </w:tc>
@@ -26431,7 +26425,7 @@
                 <w:rFonts w:ascii="Times New Roman" w:hAnsi="Times New Roman"/>
                 <w:sz w:val="18"/>
               </w:rPr>
-              <w:t xml:space="preserve">OpenAI batch</w:t>
+              <w:t xml:space="preserve">GPT-4o-mini (batch)</w:t>
             </w:r>
           </w:p>
         </w:tc>
@@ -26584,25 +26578,7 @@
         <w:widowControl w:val="1"/>
       </w:pPr>
       <w:r>
-        <w:t xml:space="preserve">We warmly thank the students of the LLMs in Healthcare course in the Digital Healthcare</w:t>
-      </w:r>
-      <w:r>
-        <w:t xml:space="preserve"> </w:t>
-      </w:r>
-      <w:r>
-        <w:t xml:space="preserve">department at the Holon Institute of Technology (HIT), across the 2024–2025 and 2025–2026</w:t>
-      </w:r>
-      <w:r>
-        <w:t xml:space="preserve"> </w:t>
-      </w:r>
-      <w:r>
-        <w:t xml:space="preserve">academic years. Their course projects motivated this review and supplied the application studies in</w:t>
-      </w:r>
-      <w:r>
-        <w:t xml:space="preserve"> </w:t>
-      </w:r>
-      <w:r>
-        <w:t xml:space="preserve">Section 3. We thank the whole cohort collectively for their creativity and rigor.</w:t>
+        <w:t xml:space="preserve">The authors thank colleagues at the Holon Institute of Technology (HIT) for helpful discussions.</w:t>
       </w:r>
     </w:p>
     <w:p>
@@ -28440,7 +28416,7 @@
         <w:rPr>
           <w:color w:val="CC0000"/>
         </w:rPr>
-        <w:t xml:space="preserve">(2024) Use of a large language model for ambulance dispatch and triage. Prehospital and Disaster Medicine (PubMed 39675178).</w:t>
+        <w:t xml:space="preserve">Shekhar AC, Kimbrell J, Saharan A, Stebel J, Ashley E, Abbott EE (2024) Use of a large language model for ambulance dispatch and triage. Prehospital and Disaster Medicine (PubMed 39675178).</w:t>
       </w:r>
     </w:p>
     <w:p>
@@ -28490,7 +28466,7 @@
         <w:rPr>
           <w:color w:val="CC0000"/>
         </w:rPr>
-        <w:t xml:space="preserve">(2025) Detecting emergencies in patient portal messages using LLMs and knowledge-graph-based RAG. JAMIA 32(6):1032.</w:t>
+        <w:t xml:space="preserve">Liu S, Wright AP, McCoy AB, Huang SS, Steitz B, Wright A (2025) Detecting emergencies in patient portal messages using LLMs and knowledge-graph-based RAG. JAMIA 32(6):1032.</w:t>
       </w:r>
     </w:p>
     <w:p>
@@ -28768,7 +28744,7 @@
         <w:rPr>
           <w:color w:val="CC0000"/>
         </w:rPr>
-        <w:t xml:space="preserve">(2025) Embracing the Future of Medical Education With Large Language Model-Based Virtual Patients: Scoping Review. Journal of Medical Internet Research.</w:t>
+        <w:t xml:space="preserve">Zeng J, Qi W, Shen S, Liu X, et al (2025) Embracing the Future of Medical Education With Large Language Model-Based Virtual Patients: Scoping Review. Journal of Medical Internet Research.</w:t>
       </w:r>
     </w:p>
     <w:p>
@@ -28793,7 +28769,7 @@
         <w:rPr>
           <w:color w:val="CC0000"/>
         </w:rPr>
-        <w:t xml:space="preserve">(2026) Large Language Model-Based Virtual Patient Systems for History-Taking in Medical Education: A Comprehensive Systematic Review. JMIR Medical Informatics.</w:t>
+        <w:t xml:space="preserve">Li D, Lutfi SL (2026) Large Language Model-Based Virtual Patient Systems for History-Taking in Medical Education: A Comprehensive Systematic Review. JMIR Medical Informatics.</w:t>
       </w:r>
     </w:p>
     <w:p>
@@ -29007,7 +28983,7 @@
         <w:rPr>
           <w:color w:val="CC0000"/>
         </w:rPr>
-        <w:t xml:space="preserve">(2025) The Canary's Echo: Auditing Privacy Risks of LLM-Generated Synthetic Text. arXiv:2502.14921.</w:t>
+        <w:t xml:space="preserve">Meeus M, Wutschitz L, Zanella-Beguelin S, Tople S, Shokri R (2025) The Canary's Echo: Auditing Privacy Risks of LLM-Generated Synthetic Text. arXiv:2502.14921.</w:t>
       </w:r>
     </w:p>
     <w:p>
@@ -29224,7 +29200,7 @@
         <w:rPr>
           <w:color w:val="CC0000"/>
         </w:rPr>
-        <w:t xml:space="preserve">(2026) Medical Triage as Pairwise Ranking (PMR-Bench). arXiv:2601.13178.</w:t>
+        <w:t xml:space="preserve">Gatto J, Seegmiller P, Burdick T, Resnik P, Rahat R, DeLozier S, Preum SM (2026) Medical Triage as Pairwise Ranking (PMR-Bench). arXiv:2601.13178.</w:t>
       </w:r>
     </w:p>
     <w:p>
@@ -29249,7 +29225,7 @@
         <w:rPr>
           <w:color w:val="CC0000"/>
         </w:rPr>
-        <w:t xml:space="preserve">(2026) DispatchMAS: Fusing Taxonomy and AI Agents for Emergency Medical Services. BMC Emergency Medicine (arXiv:2510.21228).</w:t>
+        <w:t xml:space="preserve">Li X, Yu H, Wang W, Wu Y, Zhou J, et al (2026) DispatchMAS: Fusing Taxonomy and AI Agents for Emergency Medical Services. BMC Emergency Medicine (arXiv:2510.21228).</w:t>
       </w:r>
     </w:p>
     <w:p>

</xml_diff>

<commit_message>
Strip temporary red review-highlighting: unwrap citation spans, drop the refred class and temporary CSS; rebuild clean submission-ready artifacts (no red)
</commit_message>
<xml_diff>
--- a/paper-1col.docx
+++ b/paper-1col.docx
@@ -39,7 +39,6 @@
           <w:rFonts w:ascii="Times New Roman" w:hAnsi="Times New Roman"/>
           <w:b/>
           <w:i w:val="0"/>
-          <w:color w:val="CC0000"/>
           <w:sz w:val="24"/>
           <w:vertAlign w:val="superscript"/>
         </w:rPr>
@@ -59,7 +58,6 @@
           <w:rFonts w:ascii="Times New Roman" w:hAnsi="Times New Roman"/>
           <w:b/>
           <w:i w:val="0"/>
-          <w:color w:val="CC0000"/>
           <w:sz w:val="24"/>
           <w:vertAlign w:val="superscript"/>
         </w:rPr>
@@ -76,7 +74,6 @@
       </w:pPr>
       <w:r>
         <w:rPr>
-          <w:color w:val="CC0000"/>
           <w:vertAlign w:val="superscript"/>
         </w:rPr>
         <w:t xml:space="preserve">1</w:t>
@@ -95,7 +92,6 @@
       </w:r>
       <w:r>
         <w:rPr>
-          <w:color w:val="CC0000"/>
           <w:vertAlign w:val="superscript"/>
         </w:rPr>
         <w:t xml:space="preserve">2</w:t>
@@ -240,7 +236,6 @@
       </w:r>
       <w:r>
         <w:rPr>
-          <w:color w:val="CC0000"/>
           <w:vertAlign w:val="superscript"/>
         </w:rPr>
         <w:t xml:space="preserve">[1]</w:t>
@@ -256,7 +251,6 @@
       </w:r>
       <w:r>
         <w:rPr>
-          <w:color w:val="CC0000"/>
           <w:vertAlign w:val="superscript"/>
         </w:rPr>
         <w:t xml:space="preserve">[2]</w:t>
@@ -272,7 +266,6 @@
       </w:r>
       <w:r>
         <w:rPr>
-          <w:color w:val="CC0000"/>
           <w:vertAlign w:val="superscript"/>
         </w:rPr>
         <w:t xml:space="preserve">[3]</w:t>
@@ -291,7 +284,6 @@
       </w:r>
       <w:r>
         <w:rPr>
-          <w:color w:val="CC0000"/>
           <w:vertAlign w:val="superscript"/>
         </w:rPr>
         <w:t xml:space="preserve">[4]</w:t>
@@ -307,7 +299,6 @@
       </w:r>
       <w:r>
         <w:rPr>
-          <w:color w:val="CC0000"/>
           <w:vertAlign w:val="superscript"/>
         </w:rPr>
         <w:t xml:space="preserve">[5]</w:t>
@@ -326,7 +317,6 @@
       </w:r>
       <w:r>
         <w:rPr>
-          <w:color w:val="CC0000"/>
           <w:vertAlign w:val="superscript"/>
         </w:rPr>
         <w:t xml:space="preserve">[6]</w:t>
@@ -342,7 +332,6 @@
       </w:r>
       <w:r>
         <w:rPr>
-          <w:color w:val="CC0000"/>
           <w:vertAlign w:val="superscript"/>
         </w:rPr>
         <w:t xml:space="preserve">[7]</w:t>
@@ -996,7 +985,6 @@
       </w:r>
       <w:r>
         <w:rPr>
-          <w:color w:val="CC0000"/>
           <w:vertAlign w:val="superscript"/>
         </w:rPr>
         <w:t xml:space="preserve">[8,9]</w:t>
@@ -1018,7 +1006,6 @@
       </w:r>
       <w:r>
         <w:rPr>
-          <w:color w:val="CC0000"/>
           <w:vertAlign w:val="superscript"/>
         </w:rPr>
         <w:t xml:space="preserve">[10,11,12,13,14]</w:t>
@@ -1040,7 +1027,6 @@
       </w:r>
       <w:r>
         <w:rPr>
-          <w:color w:val="CC0000"/>
           <w:vertAlign w:val="superscript"/>
         </w:rPr>
         <w:t xml:space="preserve">[15,16]</w:t>
@@ -1062,7 +1048,6 @@
       </w:r>
       <w:r>
         <w:rPr>
-          <w:color w:val="CC0000"/>
           <w:vertAlign w:val="superscript"/>
         </w:rPr>
         <w:t xml:space="preserve">[17,18,19,20]</w:t>
@@ -1078,7 +1063,6 @@
       </w:r>
       <w:r>
         <w:rPr>
-          <w:color w:val="CC0000"/>
           <w:vertAlign w:val="superscript"/>
         </w:rPr>
         <w:t xml:space="preserve">[21]</w:t>
@@ -1100,7 +1084,6 @@
       </w:r>
       <w:r>
         <w:rPr>
-          <w:color w:val="CC0000"/>
           <w:vertAlign w:val="superscript"/>
         </w:rPr>
         <w:t xml:space="preserve">[22]</w:t>
@@ -1134,7 +1117,6 @@
       </w:r>
       <w:r>
         <w:rPr>
-          <w:color w:val="CC0000"/>
           <w:vertAlign w:val="superscript"/>
         </w:rPr>
         <w:t xml:space="preserve">[23]</w:t>
@@ -1162,7 +1144,6 @@
       </w:r>
       <w:r>
         <w:rPr>
-          <w:color w:val="CC0000"/>
           <w:vertAlign w:val="superscript"/>
         </w:rPr>
         <w:t xml:space="preserve">[11]</w:t>
@@ -1380,22 +1361,7 @@
                 <w:rFonts w:ascii="Times New Roman" w:hAnsi="Times New Roman"/>
                 <w:sz w:val="19"/>
               </w:rPr>
-              <w:t xml:space="preserve">Loni et al.</w:t>
-            </w:r>
-            <w:r>
-              <w:rPr>
-                <w:rFonts w:ascii="Times New Roman" w:hAnsi="Times New Roman"/>
-                <w:sz w:val="19"/>
-              </w:rPr>
-              <w:t xml:space="preserve"> </w:t>
-            </w:r>
-            <w:r>
-              <w:rPr>
-                <w:rFonts w:ascii="Times New Roman" w:hAnsi="Times New Roman"/>
-                <w:color w:val="CC0000"/>
-                <w:sz w:val="19"/>
-              </w:rPr>
-              <w:t xml:space="preserve">[12]</w:t>
+              <w:t xml:space="preserve">Loni et al. [12]</w:t>
             </w:r>
           </w:p>
         </w:tc>
@@ -1513,22 +1479,7 @@
                 <w:rFonts w:ascii="Times New Roman" w:hAnsi="Times New Roman"/>
                 <w:sz w:val="19"/>
               </w:rPr>
-              <w:t xml:space="preserve">Ibrahim et al.</w:t>
-            </w:r>
-            <w:r>
-              <w:rPr>
-                <w:rFonts w:ascii="Times New Roman" w:hAnsi="Times New Roman"/>
-                <w:sz w:val="19"/>
-              </w:rPr>
-              <w:t xml:space="preserve"> </w:t>
-            </w:r>
-            <w:r>
-              <w:rPr>
-                <w:rFonts w:ascii="Times New Roman" w:hAnsi="Times New Roman"/>
-                <w:color w:val="CC0000"/>
-                <w:sz w:val="19"/>
-              </w:rPr>
-              <w:t xml:space="preserve">[13]</w:t>
+              <w:t xml:space="preserve">Ibrahim et al. [13]</w:t>
             </w:r>
           </w:p>
         </w:tc>
@@ -1646,22 +1597,7 @@
                 <w:rFonts w:ascii="Times New Roman" w:hAnsi="Times New Roman"/>
                 <w:sz w:val="19"/>
               </w:rPr>
-              <w:t xml:space="preserve">Liu et al.</w:t>
-            </w:r>
-            <w:r>
-              <w:rPr>
-                <w:rFonts w:ascii="Times New Roman" w:hAnsi="Times New Roman"/>
-                <w:sz w:val="19"/>
-              </w:rPr>
-              <w:t xml:space="preserve"> </w:t>
-            </w:r>
-            <w:r>
-              <w:rPr>
-                <w:rFonts w:ascii="Times New Roman" w:hAnsi="Times New Roman"/>
-                <w:color w:val="CC0000"/>
-                <w:sz w:val="19"/>
-              </w:rPr>
-              <w:t xml:space="preserve">[15]</w:t>
+              <w:t xml:space="preserve">Liu et al. [15]</w:t>
             </w:r>
           </w:p>
         </w:tc>
@@ -1779,22 +1715,7 @@
                 <w:rFonts w:ascii="Times New Roman" w:hAnsi="Times New Roman"/>
                 <w:sz w:val="19"/>
               </w:rPr>
-              <w:t xml:space="preserve">Rujas et al.</w:t>
-            </w:r>
-            <w:r>
-              <w:rPr>
-                <w:rFonts w:ascii="Times New Roman" w:hAnsi="Times New Roman"/>
-                <w:sz w:val="19"/>
-              </w:rPr>
-              <w:t xml:space="preserve"> </w:t>
-            </w:r>
-            <w:r>
-              <w:rPr>
-                <w:rFonts w:ascii="Times New Roman" w:hAnsi="Times New Roman"/>
-                <w:color w:val="CC0000"/>
-                <w:sz w:val="19"/>
-              </w:rPr>
-              <w:t xml:space="preserve">[14]</w:t>
+              <w:t xml:space="preserve">Rujas et al. [14]</w:t>
             </w:r>
           </w:p>
         </w:tc>
@@ -1912,22 +1833,7 @@
                 <w:rFonts w:ascii="Times New Roman" w:hAnsi="Times New Roman"/>
                 <w:sz w:val="19"/>
               </w:rPr>
-              <w:t xml:space="preserve">Bedrick et al.</w:t>
-            </w:r>
-            <w:r>
-              <w:rPr>
-                <w:rFonts w:ascii="Times New Roman" w:hAnsi="Times New Roman"/>
-                <w:sz w:val="19"/>
-              </w:rPr>
-              <w:t xml:space="preserve"> </w:t>
-            </w:r>
-            <w:r>
-              <w:rPr>
-                <w:rFonts w:ascii="Times New Roman" w:hAnsi="Times New Roman"/>
-                <w:color w:val="CC0000"/>
-                <w:sz w:val="19"/>
-              </w:rPr>
-              <w:t xml:space="preserve">[23]</w:t>
+              <w:t xml:space="preserve">Bedrick et al. [23]</w:t>
             </w:r>
           </w:p>
         </w:tc>
@@ -2045,22 +1951,7 @@
                 <w:rFonts w:ascii="Times New Roman" w:hAnsi="Times New Roman"/>
                 <w:sz w:val="19"/>
               </w:rPr>
-              <w:t xml:space="preserve">Rao et al.</w:t>
-            </w:r>
-            <w:r>
-              <w:rPr>
-                <w:rFonts w:ascii="Times New Roman" w:hAnsi="Times New Roman"/>
-                <w:sz w:val="19"/>
-              </w:rPr>
-              <w:t xml:space="preserve"> </w:t>
-            </w:r>
-            <w:r>
-              <w:rPr>
-                <w:rFonts w:ascii="Times New Roman" w:hAnsi="Times New Roman"/>
-                <w:color w:val="CC0000"/>
-                <w:sz w:val="19"/>
-              </w:rPr>
-              <w:t xml:space="preserve">[11]</w:t>
+              <w:t xml:space="preserve">Rao et al. [11]</w:t>
             </w:r>
           </w:p>
         </w:tc>
@@ -2435,7 +2326,6 @@
       </w:r>
       <w:r>
         <w:rPr>
-          <w:color w:val="CC0000"/>
           <w:vertAlign w:val="superscript"/>
         </w:rPr>
         <w:t xml:space="preserve">[24,18,19,25]</w:t>
@@ -2451,7 +2341,6 @@
       </w:r>
       <w:r>
         <w:rPr>
-          <w:color w:val="CC0000"/>
           <w:vertAlign w:val="superscript"/>
         </w:rPr>
         <w:t xml:space="preserve">[26]</w:t>
@@ -2467,7 +2356,6 @@
       </w:r>
       <w:r>
         <w:rPr>
-          <w:color w:val="CC0000"/>
           <w:vertAlign w:val="superscript"/>
         </w:rPr>
         <w:t xml:space="preserve">[27]</w:t>
@@ -2486,7 +2374,6 @@
       </w:r>
       <w:r>
         <w:rPr>
-          <w:color w:val="CC0000"/>
           <w:vertAlign w:val="superscript"/>
         </w:rPr>
         <w:t xml:space="preserve">[28,29]</w:t>
@@ -2508,7 +2395,6 @@
       </w:r>
       <w:r>
         <w:rPr>
-          <w:color w:val="CC0000"/>
           <w:vertAlign w:val="superscript"/>
         </w:rPr>
         <w:t xml:space="preserve">[30,31]</w:t>
@@ -2524,7 +2410,6 @@
       </w:r>
       <w:r>
         <w:rPr>
-          <w:color w:val="CC0000"/>
           <w:vertAlign w:val="superscript"/>
         </w:rPr>
         <w:t xml:space="preserve">[32]</w:t>
@@ -4147,7 +4032,6 @@
       </w:r>
       <w:r>
         <w:rPr>
-          <w:color w:val="CC0000"/>
           <w:vertAlign w:val="superscript"/>
         </w:rPr>
         <w:t xml:space="preserve">[24]</w:t>
@@ -4172,7 +4056,6 @@
       </w:r>
       <w:r>
         <w:rPr>
-          <w:color w:val="CC0000"/>
           <w:vertAlign w:val="superscript"/>
         </w:rPr>
         <w:t xml:space="preserve">[18]</w:t>
@@ -4188,7 +4071,6 @@
       </w:r>
       <w:r>
         <w:rPr>
-          <w:color w:val="CC0000"/>
           <w:vertAlign w:val="superscript"/>
         </w:rPr>
         <w:t xml:space="preserve">[19]</w:t>
@@ -4198,7 +4080,6 @@
       </w:r>
       <w:r>
         <w:rPr>
-          <w:color w:val="CC0000"/>
           <w:vertAlign w:val="superscript"/>
         </w:rPr>
         <w:t xml:space="preserve">[20]</w:t>
@@ -4226,7 +4107,6 @@
       </w:r>
       <w:r>
         <w:rPr>
-          <w:color w:val="CC0000"/>
           <w:vertAlign w:val="superscript"/>
         </w:rPr>
         <w:t xml:space="preserve">[17]</w:t>
@@ -6439,7 +6319,6 @@
       </w:r>
       <w:r>
         <w:rPr>
-          <w:color w:val="CC0000"/>
           <w:vertAlign w:val="superscript"/>
         </w:rPr>
         <w:t xml:space="preserve">[33]</w:t>
@@ -6515,7 +6394,6 @@
       </w:r>
       <w:r>
         <w:rPr>
-          <w:color w:val="CC0000"/>
           <w:vertAlign w:val="superscript"/>
         </w:rPr>
         <w:t xml:space="preserve">[17,34,35,36,37]</w:t>
@@ -6595,7 +6473,6 @@
       </w:r>
       <w:r>
         <w:rPr>
-          <w:color w:val="CC0000"/>
           <w:vertAlign w:val="superscript"/>
         </w:rPr>
         <w:t xml:space="preserve">[38]</w:t>
@@ -6642,7 +6519,6 @@
       </w:r>
       <w:r>
         <w:rPr>
-          <w:color w:val="CC0000"/>
           <w:vertAlign w:val="superscript"/>
         </w:rPr>
         <w:t xml:space="preserve">[39,40]</w:t>
@@ -6731,7 +6607,6 @@
       </w:r>
       <w:r>
         <w:rPr>
-          <w:color w:val="CC0000"/>
           <w:vertAlign w:val="superscript"/>
         </w:rPr>
         <w:t xml:space="preserve">[41]</w:t>
@@ -6753,7 +6628,6 @@
       </w:r>
       <w:r>
         <w:rPr>
-          <w:color w:val="CC0000"/>
           <w:vertAlign w:val="superscript"/>
         </w:rPr>
         <w:t xml:space="preserve">[42]</w:t>
@@ -7625,7 +7499,6 @@
       </w:r>
       <w:r>
         <w:rPr>
-          <w:color w:val="CC0000"/>
           <w:vertAlign w:val="superscript"/>
         </w:rPr>
         <w:t xml:space="preserve">[43]</w:t>
@@ -7647,7 +7520,6 @@
       </w:r>
       <w:r>
         <w:rPr>
-          <w:color w:val="CC0000"/>
           <w:vertAlign w:val="superscript"/>
         </w:rPr>
         <w:t xml:space="preserve">[44]</w:t>
@@ -7703,7 +7575,6 @@
       </w:r>
       <w:r>
         <w:rPr>
-          <w:color w:val="CC0000"/>
           <w:vertAlign w:val="superscript"/>
         </w:rPr>
         <w:t xml:space="preserve">[22]</w:t>
@@ -7719,7 +7590,6 @@
       </w:r>
       <w:r>
         <w:rPr>
-          <w:color w:val="CC0000"/>
           <w:vertAlign w:val="superscript"/>
         </w:rPr>
         <w:t xml:space="preserve">[45]</w:t>
@@ -7800,7 +7670,6 @@
       </w:r>
       <w:r>
         <w:rPr>
-          <w:color w:val="CC0000"/>
           <w:vertAlign w:val="superscript"/>
         </w:rPr>
         <w:t xml:space="preserve">[46]</w:t>
@@ -7816,7 +7685,6 @@
       </w:r>
       <w:r>
         <w:rPr>
-          <w:color w:val="CC0000"/>
           <w:vertAlign w:val="superscript"/>
         </w:rPr>
         <w:t xml:space="preserve">[47,48]</w:t>
@@ -7832,7 +7700,6 @@
       </w:r>
       <w:r>
         <w:rPr>
-          <w:color w:val="CC0000"/>
           <w:vertAlign w:val="superscript"/>
         </w:rPr>
         <w:t xml:space="preserve">[49]</w:t>
@@ -7842,7 +7709,6 @@
       </w:r>
       <w:r>
         <w:rPr>
-          <w:color w:val="CC0000"/>
           <w:vertAlign w:val="superscript"/>
         </w:rPr>
         <w:t xml:space="preserve">[50,51,52]</w:t>
@@ -7858,7 +7724,6 @@
       </w:r>
       <w:r>
         <w:rPr>
-          <w:color w:val="CC0000"/>
           <w:vertAlign w:val="superscript"/>
         </w:rPr>
         <w:t xml:space="preserve">[53]</w:t>
@@ -7874,7 +7739,6 @@
       </w:r>
       <w:r>
         <w:rPr>
-          <w:color w:val="CC0000"/>
           <w:vertAlign w:val="superscript"/>
         </w:rPr>
         <w:t xml:space="preserve">[54,55]</w:t>
@@ -7890,7 +7754,6 @@
       </w:r>
       <w:r>
         <w:rPr>
-          <w:color w:val="CC0000"/>
           <w:vertAlign w:val="superscript"/>
         </w:rPr>
         <w:t xml:space="preserve">[56]</w:t>
@@ -7906,7 +7769,6 @@
       </w:r>
       <w:r>
         <w:rPr>
-          <w:color w:val="CC0000"/>
           <w:vertAlign w:val="superscript"/>
         </w:rPr>
         <w:t xml:space="preserve">[57,58,59,60]</w:t>
@@ -7922,7 +7784,6 @@
       </w:r>
       <w:r>
         <w:rPr>
-          <w:color w:val="CC0000"/>
           <w:vertAlign w:val="superscript"/>
         </w:rPr>
         <w:t xml:space="preserve">[61]</w:t>
@@ -8200,186 +8061,9 @@
             <w:r>
               <w:rPr>
                 <w:rFonts w:ascii="Times New Roman" w:hAnsi="Times New Roman"/>
-                <w:color w:val="CC0000"/>
-                <w:sz w:val="19"/>
-              </w:rPr>
-              <w:t xml:space="preserve">[62]</w:t>
-            </w:r>
-            <w:r>
-              <w:rPr>
-                <w:rFonts w:ascii="Times New Roman" w:hAnsi="Times New Roman"/>
-                <w:sz w:val="19"/>
-              </w:rPr>
-              <w:t xml:space="preserve">,</w:t>
-            </w:r>
-            <w:r>
-              <w:rPr>
-                <w:rFonts w:ascii="Times New Roman" w:hAnsi="Times New Roman"/>
-                <w:sz w:val="19"/>
-              </w:rPr>
-              <w:t xml:space="preserve"> </w:t>
-            </w:r>
-            <w:r>
-              <w:rPr>
-                <w:rFonts w:ascii="Times New Roman" w:hAnsi="Times New Roman"/>
-                <w:color w:val="CC0000"/>
-                <w:sz w:val="19"/>
-              </w:rPr>
-              <w:t xml:space="preserve">[53]</w:t>
-            </w:r>
-            <w:r>
-              <w:rPr>
-                <w:rFonts w:ascii="Times New Roman" w:hAnsi="Times New Roman"/>
-                <w:sz w:val="19"/>
-              </w:rPr>
-              <w:t xml:space="preserve">,</w:t>
-            </w:r>
-            <w:r>
-              <w:rPr>
-                <w:rFonts w:ascii="Times New Roman" w:hAnsi="Times New Roman"/>
-                <w:sz w:val="19"/>
-              </w:rPr>
-              <w:t xml:space="preserve"> </w:t>
-            </w:r>
-            <w:r>
-              <w:rPr>
-                <w:rFonts w:ascii="Times New Roman" w:hAnsi="Times New Roman"/>
-                <w:color w:val="CC0000"/>
-                <w:sz w:val="19"/>
-              </w:rPr>
-              <w:t xml:space="preserve">[46]</w:t>
-            </w:r>
-            <w:r>
-              <w:rPr>
-                <w:rFonts w:ascii="Times New Roman" w:hAnsi="Times New Roman"/>
-                <w:sz w:val="19"/>
-              </w:rPr>
-              <w:t xml:space="preserve">,</w:t>
-            </w:r>
-            <w:r>
-              <w:rPr>
-                <w:rFonts w:ascii="Times New Roman" w:hAnsi="Times New Roman"/>
-                <w:sz w:val="19"/>
-              </w:rPr>
-              <w:t xml:space="preserve"> </w:t>
-            </w:r>
-            <w:r>
-              <w:rPr>
-                <w:rFonts w:ascii="Times New Roman" w:hAnsi="Times New Roman"/>
-                <w:color w:val="CC0000"/>
-                <w:sz w:val="19"/>
-              </w:rPr>
-              <w:t xml:space="preserve">[47]</w:t>
-            </w:r>
-            <w:r>
-              <w:rPr>
-                <w:rFonts w:ascii="Times New Roman" w:hAnsi="Times New Roman"/>
-                <w:sz w:val="19"/>
-              </w:rPr>
-              <w:t xml:space="preserve">,</w:t>
-            </w:r>
-            <w:r>
-              <w:rPr>
-                <w:rFonts w:ascii="Times New Roman" w:hAnsi="Times New Roman"/>
-                <w:sz w:val="19"/>
-              </w:rPr>
-              <w:t xml:space="preserve"> </w:t>
-            </w:r>
-            <w:r>
-              <w:rPr>
-                <w:rFonts w:ascii="Times New Roman" w:hAnsi="Times New Roman"/>
-                <w:color w:val="CC0000"/>
-                <w:sz w:val="19"/>
-              </w:rPr>
-              <w:t xml:space="preserve">[48]</w:t>
-            </w:r>
-            <w:r>
-              <w:rPr>
-                <w:rFonts w:ascii="Times New Roman" w:hAnsi="Times New Roman"/>
-                <w:sz w:val="19"/>
-              </w:rPr>
-              <w:t xml:space="preserve">,</w:t>
-            </w:r>
-            <w:r>
-              <w:rPr>
-                <w:rFonts w:ascii="Times New Roman" w:hAnsi="Times New Roman"/>
-                <w:sz w:val="19"/>
-              </w:rPr>
-              <w:t xml:space="preserve"> </w:t>
-            </w:r>
-            <w:r>
-              <w:rPr>
-                <w:rFonts w:ascii="Times New Roman" w:hAnsi="Times New Roman"/>
-                <w:color w:val="CC0000"/>
-                <w:sz w:val="19"/>
-              </w:rPr>
-              <w:t xml:space="preserve">[54]</w:t>
-            </w:r>
-            <w:r>
-              <w:rPr>
-                <w:rFonts w:ascii="Times New Roman" w:hAnsi="Times New Roman"/>
-                <w:sz w:val="19"/>
-              </w:rPr>
-              <w:t xml:space="preserve">,</w:t>
-            </w:r>
-            <w:r>
-              <w:rPr>
-                <w:rFonts w:ascii="Times New Roman" w:hAnsi="Times New Roman"/>
-                <w:sz w:val="19"/>
-              </w:rPr>
-              <w:t xml:space="preserve"> </w:t>
-            </w:r>
-            <w:r>
-              <w:rPr>
-                <w:rFonts w:ascii="Times New Roman" w:hAnsi="Times New Roman"/>
-                <w:color w:val="CC0000"/>
-                <w:sz w:val="19"/>
-              </w:rPr>
-              <w:t xml:space="preserve">[55]</w:t>
-            </w:r>
-            <w:r>
-              <w:rPr>
-                <w:rFonts w:ascii="Times New Roman" w:hAnsi="Times New Roman"/>
-                <w:sz w:val="19"/>
-              </w:rPr>
-              <w:t xml:space="preserve">,</w:t>
-            </w:r>
-            <w:r>
-              <w:rPr>
-                <w:rFonts w:ascii="Times New Roman" w:hAnsi="Times New Roman"/>
-                <w:sz w:val="19"/>
-              </w:rPr>
-              <w:t xml:space="preserve"> </w:t>
-            </w:r>
-            <w:r>
-              <w:rPr>
-                <w:rFonts w:ascii="Times New Roman" w:hAnsi="Times New Roman"/>
-                <w:color w:val="CC0000"/>
-                <w:sz w:val="19"/>
-              </w:rPr>
-              <w:t xml:space="preserve">[63]</w:t>
-            </w:r>
-            <w:r>
-              <w:rPr>
-                <w:rFonts w:ascii="Times New Roman" w:hAnsi="Times New Roman"/>
-                <w:sz w:val="19"/>
-              </w:rPr>
-              <w:t xml:space="preserve">,</w:t>
-            </w:r>
-            <w:r>
-              <w:rPr>
-                <w:rFonts w:ascii="Times New Roman" w:hAnsi="Times New Roman"/>
-                <w:sz w:val="19"/>
-              </w:rPr>
-              <w:t xml:space="preserve"> </w:t>
-            </w:r>
-            <w:r>
-              <w:rPr>
-                <w:rFonts w:ascii="Times New Roman" w:hAnsi="Times New Roman"/>
-                <w:color w:val="CC0000"/>
-                <w:sz w:val="19"/>
-              </w:rPr>
-              <w:t xml:space="preserve">[43]</w:t>
+                <w:sz w:val="19"/>
+              </w:rPr>
+              <w:t xml:space="preserve">[62], [53], [46], [47], [48], [54], [55], [63], [43]</w:t>
             </w:r>
           </w:p>
         </w:tc>
@@ -8466,208 +8150,9 @@
             <w:r>
               <w:rPr>
                 <w:rFonts w:ascii="Times New Roman" w:hAnsi="Times New Roman"/>
-                <w:color w:val="CC0000"/>
-                <w:sz w:val="19"/>
-              </w:rPr>
-              <w:t xml:space="preserve">[16]</w:t>
-            </w:r>
-            <w:r>
-              <w:rPr>
-                <w:rFonts w:ascii="Times New Roman" w:hAnsi="Times New Roman"/>
-                <w:sz w:val="19"/>
-              </w:rPr>
-              <w:t xml:space="preserve">,</w:t>
-            </w:r>
-            <w:r>
-              <w:rPr>
-                <w:rFonts w:ascii="Times New Roman" w:hAnsi="Times New Roman"/>
-                <w:sz w:val="19"/>
-              </w:rPr>
-              <w:t xml:space="preserve"> </w:t>
-            </w:r>
-            <w:r>
-              <w:rPr>
-                <w:rFonts w:ascii="Times New Roman" w:hAnsi="Times New Roman"/>
-                <w:color w:val="CC0000"/>
-                <w:sz w:val="19"/>
-              </w:rPr>
-              <w:t xml:space="preserve">[17]</w:t>
-            </w:r>
-            <w:r>
-              <w:rPr>
-                <w:rFonts w:ascii="Times New Roman" w:hAnsi="Times New Roman"/>
-                <w:sz w:val="19"/>
-              </w:rPr>
-              <w:t xml:space="preserve">,</w:t>
-            </w:r>
-            <w:r>
-              <w:rPr>
-                <w:rFonts w:ascii="Times New Roman" w:hAnsi="Times New Roman"/>
-                <w:sz w:val="19"/>
-              </w:rPr>
-              <w:t xml:space="preserve"> </w:t>
-            </w:r>
-            <w:r>
-              <w:rPr>
-                <w:rFonts w:ascii="Times New Roman" w:hAnsi="Times New Roman"/>
-                <w:color w:val="CC0000"/>
-                <w:sz w:val="19"/>
-              </w:rPr>
-              <w:t xml:space="preserve">[18]</w:t>
-            </w:r>
-            <w:r>
-              <w:rPr>
-                <w:rFonts w:ascii="Times New Roman" w:hAnsi="Times New Roman"/>
-                <w:sz w:val="19"/>
-              </w:rPr>
-              <w:t xml:space="preserve">,</w:t>
-            </w:r>
-            <w:r>
-              <w:rPr>
-                <w:rFonts w:ascii="Times New Roman" w:hAnsi="Times New Roman"/>
-                <w:sz w:val="19"/>
-              </w:rPr>
-              <w:t xml:space="preserve"> </w:t>
-            </w:r>
-            <w:r>
-              <w:rPr>
-                <w:rFonts w:ascii="Times New Roman" w:hAnsi="Times New Roman"/>
-                <w:color w:val="CC0000"/>
-                <w:sz w:val="19"/>
-              </w:rPr>
-              <w:t xml:space="preserve">[19]</w:t>
-            </w:r>
-            <w:r>
-              <w:rPr>
-                <w:rFonts w:ascii="Times New Roman" w:hAnsi="Times New Roman"/>
-                <w:sz w:val="19"/>
-              </w:rPr>
-              <w:t xml:space="preserve">,</w:t>
-            </w:r>
-            <w:r>
-              <w:rPr>
-                <w:rFonts w:ascii="Times New Roman" w:hAnsi="Times New Roman"/>
-                <w:sz w:val="19"/>
-              </w:rPr>
-              <w:t xml:space="preserve"> </w:t>
-            </w:r>
-            <w:r>
-              <w:rPr>
-                <w:rFonts w:ascii="Times New Roman" w:hAnsi="Times New Roman"/>
-                <w:color w:val="CC0000"/>
-                <w:sz w:val="19"/>
-              </w:rPr>
-              <w:t xml:space="preserve">[20]</w:t>
-            </w:r>
-            <w:r>
-              <w:rPr>
-                <w:rFonts w:ascii="Times New Roman" w:hAnsi="Times New Roman"/>
-                <w:sz w:val="19"/>
-              </w:rPr>
-              <w:t xml:space="preserve">,</w:t>
-            </w:r>
-            <w:r>
-              <w:rPr>
-                <w:rFonts w:ascii="Times New Roman" w:hAnsi="Times New Roman"/>
-                <w:sz w:val="19"/>
-              </w:rPr>
-              <w:t xml:space="preserve"> </w:t>
-            </w:r>
-            <w:r>
-              <w:rPr>
-                <w:rFonts w:ascii="Times New Roman" w:hAnsi="Times New Roman"/>
-                <w:color w:val="CC0000"/>
-                <w:sz w:val="19"/>
-              </w:rPr>
-              <w:t xml:space="preserve">[50]</w:t>
-            </w:r>
-            <w:r>
-              <w:rPr>
-                <w:rFonts w:ascii="Times New Roman" w:hAnsi="Times New Roman"/>
-                <w:sz w:val="19"/>
-              </w:rPr>
-              <w:t xml:space="preserve">,</w:t>
-            </w:r>
-            <w:r>
-              <w:rPr>
-                <w:rFonts w:ascii="Times New Roman" w:hAnsi="Times New Roman"/>
-                <w:sz w:val="19"/>
-              </w:rPr>
-              <w:t xml:space="preserve"> </w:t>
-            </w:r>
-            <w:r>
-              <w:rPr>
-                <w:rFonts w:ascii="Times New Roman" w:hAnsi="Times New Roman"/>
-                <w:color w:val="CC0000"/>
-                <w:sz w:val="19"/>
-              </w:rPr>
-              <w:t xml:space="preserve">[51]</w:t>
-            </w:r>
-            <w:r>
-              <w:rPr>
-                <w:rFonts w:ascii="Times New Roman" w:hAnsi="Times New Roman"/>
-                <w:sz w:val="19"/>
-              </w:rPr>
-              <w:t xml:space="preserve">,</w:t>
-            </w:r>
-            <w:r>
-              <w:rPr>
-                <w:rFonts w:ascii="Times New Roman" w:hAnsi="Times New Roman"/>
-                <w:sz w:val="19"/>
-              </w:rPr>
-              <w:t xml:space="preserve"> </w:t>
-            </w:r>
-            <w:r>
-              <w:rPr>
-                <w:rFonts w:ascii="Times New Roman" w:hAnsi="Times New Roman"/>
-                <w:color w:val="CC0000"/>
-                <w:sz w:val="19"/>
-              </w:rPr>
-              <w:t xml:space="preserve">[64]</w:t>
-            </w:r>
-            <w:r>
-              <w:rPr>
-                <w:rFonts w:ascii="Times New Roman" w:hAnsi="Times New Roman"/>
-                <w:sz w:val="19"/>
-              </w:rPr>
-              <w:t xml:space="preserve">,</w:t>
-            </w:r>
-            <w:r>
-              <w:rPr>
-                <w:rFonts w:ascii="Times New Roman" w:hAnsi="Times New Roman"/>
-                <w:sz w:val="19"/>
-              </w:rPr>
-              <w:t xml:space="preserve"> </w:t>
-            </w:r>
-            <w:r>
-              <w:rPr>
-                <w:rFonts w:ascii="Times New Roman" w:hAnsi="Times New Roman"/>
-                <w:color w:val="CC0000"/>
-                <w:sz w:val="19"/>
-              </w:rPr>
-              <w:t xml:space="preserve">[25]</w:t>
-            </w:r>
-            <w:r>
-              <w:rPr>
-                <w:rFonts w:ascii="Times New Roman" w:hAnsi="Times New Roman"/>
-                <w:sz w:val="19"/>
-              </w:rPr>
-              <w:t xml:space="preserve">,</w:t>
-            </w:r>
-            <w:r>
-              <w:rPr>
-                <w:rFonts w:ascii="Times New Roman" w:hAnsi="Times New Roman"/>
-                <w:sz w:val="19"/>
-              </w:rPr>
-              <w:t xml:space="preserve"> </w:t>
-            </w:r>
-            <w:r>
-              <w:rPr>
-                <w:rFonts w:ascii="Times New Roman" w:hAnsi="Times New Roman"/>
-                <w:color w:val="CC0000"/>
-                <w:sz w:val="19"/>
-              </w:rPr>
-              <w:t xml:space="preserve">[65]</w:t>
+                <w:sz w:val="19"/>
+              </w:rPr>
+              <w:t xml:space="preserve">[16], [17], [18], [19], [20], [50], [51], [64], [25], [65]</w:t>
             </w:r>
           </w:p>
         </w:tc>
@@ -8754,32 +8239,9 @@
             <w:r>
               <w:rPr>
                 <w:rFonts w:ascii="Times New Roman" w:hAnsi="Times New Roman"/>
-                <w:color w:val="CC0000"/>
-                <w:sz w:val="19"/>
-              </w:rPr>
-              <w:t xml:space="preserve">[66]</w:t>
-            </w:r>
-            <w:r>
-              <w:rPr>
-                <w:rFonts w:ascii="Times New Roman" w:hAnsi="Times New Roman"/>
-                <w:sz w:val="19"/>
-              </w:rPr>
-              <w:t xml:space="preserve">,</w:t>
-            </w:r>
-            <w:r>
-              <w:rPr>
-                <w:rFonts w:ascii="Times New Roman" w:hAnsi="Times New Roman"/>
-                <w:sz w:val="19"/>
-              </w:rPr>
-              <w:t xml:space="preserve"> </w:t>
-            </w:r>
-            <w:r>
-              <w:rPr>
-                <w:rFonts w:ascii="Times New Roman" w:hAnsi="Times New Roman"/>
-                <w:color w:val="CC0000"/>
-                <w:sz w:val="19"/>
-              </w:rPr>
-              <w:t xml:space="preserve">[67]</w:t>
+                <w:sz w:val="19"/>
+              </w:rPr>
+              <w:t xml:space="preserve">[66], [67]</w:t>
             </w:r>
           </w:p>
         </w:tc>
@@ -8866,134 +8328,9 @@
             <w:r>
               <w:rPr>
                 <w:rFonts w:ascii="Times New Roman" w:hAnsi="Times New Roman"/>
-                <w:color w:val="CC0000"/>
-                <w:sz w:val="19"/>
-              </w:rPr>
-              <w:t xml:space="preserve">[56]</w:t>
-            </w:r>
-            <w:r>
-              <w:rPr>
-                <w:rFonts w:ascii="Times New Roman" w:hAnsi="Times New Roman"/>
-                <w:sz w:val="19"/>
-              </w:rPr>
-              <w:t xml:space="preserve">,</w:t>
-            </w:r>
-            <w:r>
-              <w:rPr>
-                <w:rFonts w:ascii="Times New Roman" w:hAnsi="Times New Roman"/>
-                <w:sz w:val="19"/>
-              </w:rPr>
-              <w:t xml:space="preserve"> </w:t>
-            </w:r>
-            <w:r>
-              <w:rPr>
-                <w:rFonts w:ascii="Times New Roman" w:hAnsi="Times New Roman"/>
-                <w:color w:val="CC0000"/>
-                <w:sz w:val="19"/>
-              </w:rPr>
-              <w:t xml:space="preserve">[68]</w:t>
-            </w:r>
-            <w:r>
-              <w:rPr>
-                <w:rFonts w:ascii="Times New Roman" w:hAnsi="Times New Roman"/>
-                <w:sz w:val="19"/>
-              </w:rPr>
-              <w:t xml:space="preserve">,</w:t>
-            </w:r>
-            <w:r>
-              <w:rPr>
-                <w:rFonts w:ascii="Times New Roman" w:hAnsi="Times New Roman"/>
-                <w:sz w:val="19"/>
-              </w:rPr>
-              <w:t xml:space="preserve"> </w:t>
-            </w:r>
-            <w:r>
-              <w:rPr>
-                <w:rFonts w:ascii="Times New Roman" w:hAnsi="Times New Roman"/>
-                <w:color w:val="CC0000"/>
-                <w:sz w:val="19"/>
-              </w:rPr>
-              <w:t xml:space="preserve">[57]</w:t>
-            </w:r>
-            <w:r>
-              <w:rPr>
-                <w:rFonts w:ascii="Times New Roman" w:hAnsi="Times New Roman"/>
-                <w:sz w:val="19"/>
-              </w:rPr>
-              <w:t xml:space="preserve">,</w:t>
-            </w:r>
-            <w:r>
-              <w:rPr>
-                <w:rFonts w:ascii="Times New Roman" w:hAnsi="Times New Roman"/>
-                <w:sz w:val="19"/>
-              </w:rPr>
-              <w:t xml:space="preserve"> </w:t>
-            </w:r>
-            <w:r>
-              <w:rPr>
-                <w:rFonts w:ascii="Times New Roman" w:hAnsi="Times New Roman"/>
-                <w:color w:val="CC0000"/>
-                <w:sz w:val="19"/>
-              </w:rPr>
-              <w:t xml:space="preserve">[58]</w:t>
-            </w:r>
-            <w:r>
-              <w:rPr>
-                <w:rFonts w:ascii="Times New Roman" w:hAnsi="Times New Roman"/>
-                <w:sz w:val="19"/>
-              </w:rPr>
-              <w:t xml:space="preserve">,</w:t>
-            </w:r>
-            <w:r>
-              <w:rPr>
-                <w:rFonts w:ascii="Times New Roman" w:hAnsi="Times New Roman"/>
-                <w:sz w:val="19"/>
-              </w:rPr>
-              <w:t xml:space="preserve"> </w:t>
-            </w:r>
-            <w:r>
-              <w:rPr>
-                <w:rFonts w:ascii="Times New Roman" w:hAnsi="Times New Roman"/>
-                <w:color w:val="CC0000"/>
-                <w:sz w:val="19"/>
-              </w:rPr>
-              <w:t xml:space="preserve">[59]</w:t>
-            </w:r>
-            <w:r>
-              <w:rPr>
-                <w:rFonts w:ascii="Times New Roman" w:hAnsi="Times New Roman"/>
-                <w:sz w:val="19"/>
-              </w:rPr>
-              <w:t xml:space="preserve">,</w:t>
-            </w:r>
-            <w:r>
-              <w:rPr>
-                <w:rFonts w:ascii="Times New Roman" w:hAnsi="Times New Roman"/>
-                <w:sz w:val="19"/>
-              </w:rPr>
-              <w:t xml:space="preserve"> </w:t>
-            </w:r>
-            <w:r>
-              <w:rPr>
-                <w:rFonts w:ascii="Times New Roman" w:hAnsi="Times New Roman"/>
-                <w:color w:val="CC0000"/>
-                <w:sz w:val="19"/>
-              </w:rPr>
-              <w:t xml:space="preserve">[60]</w:t>
-            </w:r>
-            <w:r>
-              <w:rPr>
-                <w:rFonts w:ascii="Times New Roman" w:hAnsi="Times New Roman"/>
-                <w:sz w:val="19"/>
-              </w:rPr>
-              <w:t xml:space="preserve"> </w:t>
-            </w:r>
-            <w:r>
-              <w:rPr>
-                <w:rFonts w:ascii="Times New Roman" w:hAnsi="Times New Roman"/>
-                <w:sz w:val="19"/>
-              </w:rPr>
-              <w:t xml:space="preserve">· §3.1.1, §3.1.2</w:t>
+                <w:sz w:val="19"/>
+              </w:rPr>
+              <w:t xml:space="preserve">[56], [68], [57], [58], [59], [60] · §3.1.1, §3.1.2</w:t>
             </w:r>
           </w:p>
         </w:tc>
@@ -9080,98 +8417,9 @@
             <w:r>
               <w:rPr>
                 <w:rFonts w:ascii="Times New Roman" w:hAnsi="Times New Roman"/>
-                <w:color w:val="CC0000"/>
-                <w:sz w:val="19"/>
-              </w:rPr>
-              <w:t xml:space="preserve">[49]</w:t>
-            </w:r>
-            <w:r>
-              <w:rPr>
-                <w:rFonts w:ascii="Times New Roman" w:hAnsi="Times New Roman"/>
-                <w:sz w:val="19"/>
-              </w:rPr>
-              <w:t xml:space="preserve">,</w:t>
-            </w:r>
-            <w:r>
-              <w:rPr>
-                <w:rFonts w:ascii="Times New Roman" w:hAnsi="Times New Roman"/>
-                <w:sz w:val="19"/>
-              </w:rPr>
-              <w:t xml:space="preserve"> </w:t>
-            </w:r>
-            <w:r>
-              <w:rPr>
-                <w:rFonts w:ascii="Times New Roman" w:hAnsi="Times New Roman"/>
-                <w:color w:val="CC0000"/>
-                <w:sz w:val="19"/>
-              </w:rPr>
-              <w:t xml:space="preserve">[69]</w:t>
-            </w:r>
-            <w:r>
-              <w:rPr>
-                <w:rFonts w:ascii="Times New Roman" w:hAnsi="Times New Roman"/>
-                <w:sz w:val="19"/>
-              </w:rPr>
-              <w:t xml:space="preserve">,</w:t>
-            </w:r>
-            <w:r>
-              <w:rPr>
-                <w:rFonts w:ascii="Times New Roman" w:hAnsi="Times New Roman"/>
-                <w:sz w:val="19"/>
-              </w:rPr>
-              <w:t xml:space="preserve"> </w:t>
-            </w:r>
-            <w:r>
-              <w:rPr>
-                <w:rFonts w:ascii="Times New Roman" w:hAnsi="Times New Roman"/>
-                <w:color w:val="CC0000"/>
-                <w:sz w:val="19"/>
-              </w:rPr>
-              <w:t xml:space="preserve">[50]</w:t>
-            </w:r>
-            <w:r>
-              <w:rPr>
-                <w:rFonts w:ascii="Times New Roman" w:hAnsi="Times New Roman"/>
-                <w:sz w:val="19"/>
-              </w:rPr>
-              <w:t xml:space="preserve">,</w:t>
-            </w:r>
-            <w:r>
-              <w:rPr>
-                <w:rFonts w:ascii="Times New Roman" w:hAnsi="Times New Roman"/>
-                <w:sz w:val="19"/>
-              </w:rPr>
-              <w:t xml:space="preserve"> </w:t>
-            </w:r>
-            <w:r>
-              <w:rPr>
-                <w:rFonts w:ascii="Times New Roman" w:hAnsi="Times New Roman"/>
-                <w:color w:val="CC0000"/>
-                <w:sz w:val="19"/>
-              </w:rPr>
-              <w:t xml:space="preserve">[51]</w:t>
-            </w:r>
-            <w:r>
-              <w:rPr>
-                <w:rFonts w:ascii="Times New Roman" w:hAnsi="Times New Roman"/>
-                <w:sz w:val="19"/>
-              </w:rPr>
-              <w:t xml:space="preserve">,</w:t>
-            </w:r>
-            <w:r>
-              <w:rPr>
-                <w:rFonts w:ascii="Times New Roman" w:hAnsi="Times New Roman"/>
-                <w:sz w:val="19"/>
-              </w:rPr>
-              <w:t xml:space="preserve"> </w:t>
-            </w:r>
-            <w:r>
-              <w:rPr>
-                <w:rFonts w:ascii="Times New Roman" w:hAnsi="Times New Roman"/>
-                <w:color w:val="CC0000"/>
-                <w:sz w:val="19"/>
-              </w:rPr>
-              <w:t xml:space="preserve">[52]</w:t>
+                <w:sz w:val="19"/>
+              </w:rPr>
+              <w:t xml:space="preserve">[49], [69], [50], [51], [52]</w:t>
             </w:r>
           </w:p>
         </w:tc>
@@ -9258,112 +8506,9 @@
             <w:r>
               <w:rPr>
                 <w:rFonts w:ascii="Times New Roman" w:hAnsi="Times New Roman"/>
-                <w:color w:val="CC0000"/>
-                <w:sz w:val="19"/>
-              </w:rPr>
-              <w:t xml:space="preserve">[70]</w:t>
-            </w:r>
-            <w:r>
-              <w:rPr>
-                <w:rFonts w:ascii="Times New Roman" w:hAnsi="Times New Roman"/>
-                <w:sz w:val="19"/>
-              </w:rPr>
-              <w:t xml:space="preserve">,</w:t>
-            </w:r>
-            <w:r>
-              <w:rPr>
-                <w:rFonts w:ascii="Times New Roman" w:hAnsi="Times New Roman"/>
-                <w:sz w:val="19"/>
-              </w:rPr>
-              <w:t xml:space="preserve"> </w:t>
-            </w:r>
-            <w:r>
-              <w:rPr>
-                <w:rFonts w:ascii="Times New Roman" w:hAnsi="Times New Roman"/>
-                <w:color w:val="CC0000"/>
-                <w:sz w:val="19"/>
-              </w:rPr>
-              <w:t xml:space="preserve">[21]</w:t>
-            </w:r>
-            <w:r>
-              <w:rPr>
-                <w:rFonts w:ascii="Times New Roman" w:hAnsi="Times New Roman"/>
-                <w:sz w:val="19"/>
-              </w:rPr>
-              <w:t xml:space="preserve">,</w:t>
-            </w:r>
-            <w:r>
-              <w:rPr>
-                <w:rFonts w:ascii="Times New Roman" w:hAnsi="Times New Roman"/>
-                <w:sz w:val="19"/>
-              </w:rPr>
-              <w:t xml:space="preserve"> </w:t>
-            </w:r>
-            <w:r>
-              <w:rPr>
-                <w:rFonts w:ascii="Times New Roman" w:hAnsi="Times New Roman"/>
-                <w:color w:val="CC0000"/>
-                <w:sz w:val="19"/>
-              </w:rPr>
-              <w:t xml:space="preserve">[71]</w:t>
-            </w:r>
-            <w:r>
-              <w:rPr>
-                <w:rFonts w:ascii="Times New Roman" w:hAnsi="Times New Roman"/>
-                <w:sz w:val="19"/>
-              </w:rPr>
-              <w:t xml:space="preserve">,</w:t>
-            </w:r>
-            <w:r>
-              <w:rPr>
-                <w:rFonts w:ascii="Times New Roman" w:hAnsi="Times New Roman"/>
-                <w:sz w:val="19"/>
-              </w:rPr>
-              <w:t xml:space="preserve"> </w:t>
-            </w:r>
-            <w:r>
-              <w:rPr>
-                <w:rFonts w:ascii="Times New Roman" w:hAnsi="Times New Roman"/>
-                <w:color w:val="CC0000"/>
-                <w:sz w:val="19"/>
-              </w:rPr>
-              <w:t xml:space="preserve">[72]</w:t>
-            </w:r>
-            <w:r>
-              <w:rPr>
-                <w:rFonts w:ascii="Times New Roman" w:hAnsi="Times New Roman"/>
-                <w:sz w:val="19"/>
-              </w:rPr>
-              <w:t xml:space="preserve">,</w:t>
-            </w:r>
-            <w:r>
-              <w:rPr>
-                <w:rFonts w:ascii="Times New Roman" w:hAnsi="Times New Roman"/>
-                <w:sz w:val="19"/>
-              </w:rPr>
-              <w:t xml:space="preserve"> </w:t>
-            </w:r>
-            <w:r>
-              <w:rPr>
-                <w:rFonts w:ascii="Times New Roman" w:hAnsi="Times New Roman"/>
-                <w:color w:val="CC0000"/>
-                <w:sz w:val="19"/>
-              </w:rPr>
-              <w:t xml:space="preserve">[73]</w:t>
-            </w:r>
-            <w:r>
-              <w:rPr>
-                <w:rFonts w:ascii="Times New Roman" w:hAnsi="Times New Roman"/>
-                <w:sz w:val="19"/>
-              </w:rPr>
-              <w:t xml:space="preserve"> </w:t>
-            </w:r>
-            <w:r>
-              <w:rPr>
-                <w:rFonts w:ascii="Times New Roman" w:hAnsi="Times New Roman"/>
-                <w:sz w:val="19"/>
-              </w:rPr>
-              <w:t xml:space="preserve">· §3.1.3, §3.2.1–3.2.5, §3.3.1</w:t>
+                <w:sz w:val="19"/>
+              </w:rPr>
+              <w:t xml:space="preserve">[70], [21], [71], [72], [73] · §3.1.3, §3.2.1–3.2.5, §3.3.1</w:t>
             </w:r>
           </w:p>
         </w:tc>
@@ -9450,24 +8595,9 @@
             <w:r>
               <w:rPr>
                 <w:rFonts w:ascii="Times New Roman" w:hAnsi="Times New Roman"/>
-                <w:color w:val="CC0000"/>
-                <w:sz w:val="19"/>
-              </w:rPr>
-              <w:t xml:space="preserve">[74]</w:t>
-            </w:r>
-            <w:r>
-              <w:rPr>
-                <w:rFonts w:ascii="Times New Roman" w:hAnsi="Times New Roman"/>
-                <w:sz w:val="19"/>
-              </w:rPr>
-              <w:t xml:space="preserve"> </w:t>
-            </w:r>
-            <w:r>
-              <w:rPr>
-                <w:rFonts w:ascii="Times New Roman" w:hAnsi="Times New Roman"/>
-                <w:sz w:val="19"/>
-              </w:rPr>
-              <w:t xml:space="preserve">· §3.3.2</w:t>
+                <w:sz w:val="19"/>
+              </w:rPr>
+              <w:t xml:space="preserve">[74] · §3.3.2</w:t>
             </w:r>
           </w:p>
         </w:tc>
@@ -9554,296 +8684,9 @@
             <w:r>
               <w:rPr>
                 <w:rFonts w:ascii="Times New Roman" w:hAnsi="Times New Roman"/>
-                <w:color w:val="CC0000"/>
-                <w:sz w:val="19"/>
-              </w:rPr>
-              <w:t xml:space="preserve">[75]</w:t>
-            </w:r>
-            <w:r>
-              <w:rPr>
-                <w:rFonts w:ascii="Times New Roman" w:hAnsi="Times New Roman"/>
-                <w:sz w:val="19"/>
-              </w:rPr>
-              <w:t xml:space="preserve">,</w:t>
-            </w:r>
-            <w:r>
-              <w:rPr>
-                <w:rFonts w:ascii="Times New Roman" w:hAnsi="Times New Roman"/>
-                <w:sz w:val="19"/>
-              </w:rPr>
-              <w:t xml:space="preserve"> </w:t>
-            </w:r>
-            <w:r>
-              <w:rPr>
-                <w:rFonts w:ascii="Times New Roman" w:hAnsi="Times New Roman"/>
-                <w:color w:val="CC0000"/>
-                <w:sz w:val="19"/>
-              </w:rPr>
-              <w:t xml:space="preserve">[76]</w:t>
-            </w:r>
-            <w:r>
-              <w:rPr>
-                <w:rFonts w:ascii="Times New Roman" w:hAnsi="Times New Roman"/>
-                <w:sz w:val="19"/>
-              </w:rPr>
-              <w:t xml:space="preserve">,</w:t>
-            </w:r>
-            <w:r>
-              <w:rPr>
-                <w:rFonts w:ascii="Times New Roman" w:hAnsi="Times New Roman"/>
-                <w:sz w:val="19"/>
-              </w:rPr>
-              <w:t xml:space="preserve"> </w:t>
-            </w:r>
-            <w:r>
-              <w:rPr>
-                <w:rFonts w:ascii="Times New Roman" w:hAnsi="Times New Roman"/>
-                <w:color w:val="CC0000"/>
-                <w:sz w:val="19"/>
-              </w:rPr>
-              <w:t xml:space="preserve">[77]</w:t>
-            </w:r>
-            <w:r>
-              <w:rPr>
-                <w:rFonts w:ascii="Times New Roman" w:hAnsi="Times New Roman"/>
-                <w:sz w:val="19"/>
-              </w:rPr>
-              <w:t xml:space="preserve">,</w:t>
-            </w:r>
-            <w:r>
-              <w:rPr>
-                <w:rFonts w:ascii="Times New Roman" w:hAnsi="Times New Roman"/>
-                <w:sz w:val="19"/>
-              </w:rPr>
-              <w:t xml:space="preserve"> </w:t>
-            </w:r>
-            <w:r>
-              <w:rPr>
-                <w:rFonts w:ascii="Times New Roman" w:hAnsi="Times New Roman"/>
-                <w:color w:val="CC0000"/>
-                <w:sz w:val="19"/>
-              </w:rPr>
-              <w:t xml:space="preserve">[78]</w:t>
-            </w:r>
-            <w:r>
-              <w:rPr>
-                <w:rFonts w:ascii="Times New Roman" w:hAnsi="Times New Roman"/>
-                <w:sz w:val="19"/>
-              </w:rPr>
-              <w:t xml:space="preserve">,</w:t>
-            </w:r>
-            <w:r>
-              <w:rPr>
-                <w:rFonts w:ascii="Times New Roman" w:hAnsi="Times New Roman"/>
-                <w:sz w:val="19"/>
-              </w:rPr>
-              <w:t xml:space="preserve"> </w:t>
-            </w:r>
-            <w:r>
-              <w:rPr>
-                <w:rFonts w:ascii="Times New Roman" w:hAnsi="Times New Roman"/>
-                <w:color w:val="CC0000"/>
-                <w:sz w:val="19"/>
-              </w:rPr>
-              <w:t xml:space="preserve">[79]</w:t>
-            </w:r>
-            <w:r>
-              <w:rPr>
-                <w:rFonts w:ascii="Times New Roman" w:hAnsi="Times New Roman"/>
-                <w:sz w:val="19"/>
-              </w:rPr>
-              <w:t xml:space="preserve">,</w:t>
-            </w:r>
-            <w:r>
-              <w:rPr>
-                <w:rFonts w:ascii="Times New Roman" w:hAnsi="Times New Roman"/>
-                <w:sz w:val="19"/>
-              </w:rPr>
-              <w:t xml:space="preserve"> </w:t>
-            </w:r>
-            <w:r>
-              <w:rPr>
-                <w:rFonts w:ascii="Times New Roman" w:hAnsi="Times New Roman"/>
-                <w:color w:val="CC0000"/>
-                <w:sz w:val="19"/>
-              </w:rPr>
-              <w:t xml:space="preserve">[80]</w:t>
-            </w:r>
-            <w:r>
-              <w:rPr>
-                <w:rFonts w:ascii="Times New Roman" w:hAnsi="Times New Roman"/>
-                <w:sz w:val="19"/>
-              </w:rPr>
-              <w:t xml:space="preserve">,</w:t>
-            </w:r>
-            <w:r>
-              <w:rPr>
-                <w:rFonts w:ascii="Times New Roman" w:hAnsi="Times New Roman"/>
-                <w:sz w:val="19"/>
-              </w:rPr>
-              <w:t xml:space="preserve"> </w:t>
-            </w:r>
-            <w:r>
-              <w:rPr>
-                <w:rFonts w:ascii="Times New Roman" w:hAnsi="Times New Roman"/>
-                <w:color w:val="CC0000"/>
-                <w:sz w:val="19"/>
-              </w:rPr>
-              <w:t xml:space="preserve">[81]</w:t>
-            </w:r>
-            <w:r>
-              <w:rPr>
-                <w:rFonts w:ascii="Times New Roman" w:hAnsi="Times New Roman"/>
-                <w:sz w:val="19"/>
-              </w:rPr>
-              <w:t xml:space="preserve">,</w:t>
-            </w:r>
-            <w:r>
-              <w:rPr>
-                <w:rFonts w:ascii="Times New Roman" w:hAnsi="Times New Roman"/>
-                <w:sz w:val="19"/>
-              </w:rPr>
-              <w:t xml:space="preserve"> </w:t>
-            </w:r>
-            <w:r>
-              <w:rPr>
-                <w:rFonts w:ascii="Times New Roman" w:hAnsi="Times New Roman"/>
-                <w:color w:val="CC0000"/>
-                <w:sz w:val="19"/>
-              </w:rPr>
-              <w:t xml:space="preserve">[82]</w:t>
-            </w:r>
-            <w:r>
-              <w:rPr>
-                <w:rFonts w:ascii="Times New Roman" w:hAnsi="Times New Roman"/>
-                <w:sz w:val="19"/>
-              </w:rPr>
-              <w:t xml:space="preserve">,</w:t>
-            </w:r>
-            <w:r>
-              <w:rPr>
-                <w:rFonts w:ascii="Times New Roman" w:hAnsi="Times New Roman"/>
-                <w:sz w:val="19"/>
-              </w:rPr>
-              <w:t xml:space="preserve"> </w:t>
-            </w:r>
-            <w:r>
-              <w:rPr>
-                <w:rFonts w:ascii="Times New Roman" w:hAnsi="Times New Roman"/>
-                <w:color w:val="CC0000"/>
-                <w:sz w:val="19"/>
-              </w:rPr>
-              <w:t xml:space="preserve">[83]</w:t>
-            </w:r>
-            <w:r>
-              <w:rPr>
-                <w:rFonts w:ascii="Times New Roman" w:hAnsi="Times New Roman"/>
-                <w:sz w:val="19"/>
-              </w:rPr>
-              <w:t xml:space="preserve">,</w:t>
-            </w:r>
-            <w:r>
-              <w:rPr>
-                <w:rFonts w:ascii="Times New Roman" w:hAnsi="Times New Roman"/>
-                <w:sz w:val="19"/>
-              </w:rPr>
-              <w:t xml:space="preserve"> </w:t>
-            </w:r>
-            <w:r>
-              <w:rPr>
-                <w:rFonts w:ascii="Times New Roman" w:hAnsi="Times New Roman"/>
-                <w:color w:val="CC0000"/>
-                <w:sz w:val="19"/>
-              </w:rPr>
-              <w:t xml:space="preserve">[84]</w:t>
-            </w:r>
-            <w:r>
-              <w:rPr>
-                <w:rFonts w:ascii="Times New Roman" w:hAnsi="Times New Roman"/>
-                <w:sz w:val="19"/>
-              </w:rPr>
-              <w:t xml:space="preserve">,</w:t>
-            </w:r>
-            <w:r>
-              <w:rPr>
-                <w:rFonts w:ascii="Times New Roman" w:hAnsi="Times New Roman"/>
-                <w:sz w:val="19"/>
-              </w:rPr>
-              <w:t xml:space="preserve"> </w:t>
-            </w:r>
-            <w:r>
-              <w:rPr>
-                <w:rFonts w:ascii="Times New Roman" w:hAnsi="Times New Roman"/>
-                <w:color w:val="CC0000"/>
-                <w:sz w:val="19"/>
-              </w:rPr>
-              <w:t xml:space="preserve">[34]</w:t>
-            </w:r>
-            <w:r>
-              <w:rPr>
-                <w:rFonts w:ascii="Times New Roman" w:hAnsi="Times New Roman"/>
-                <w:sz w:val="19"/>
-              </w:rPr>
-              <w:t xml:space="preserve">,</w:t>
-            </w:r>
-            <w:r>
-              <w:rPr>
-                <w:rFonts w:ascii="Times New Roman" w:hAnsi="Times New Roman"/>
-                <w:sz w:val="19"/>
-              </w:rPr>
-              <w:t xml:space="preserve"> </w:t>
-            </w:r>
-            <w:r>
-              <w:rPr>
-                <w:rFonts w:ascii="Times New Roman" w:hAnsi="Times New Roman"/>
-                <w:color w:val="CC0000"/>
-                <w:sz w:val="19"/>
-              </w:rPr>
-              <w:t xml:space="preserve">[85]</w:t>
-            </w:r>
-            <w:r>
-              <w:rPr>
-                <w:rFonts w:ascii="Times New Roman" w:hAnsi="Times New Roman"/>
-                <w:sz w:val="19"/>
-              </w:rPr>
-              <w:t xml:space="preserve">,</w:t>
-            </w:r>
-            <w:r>
-              <w:rPr>
-                <w:rFonts w:ascii="Times New Roman" w:hAnsi="Times New Roman"/>
-                <w:sz w:val="19"/>
-              </w:rPr>
-              <w:t xml:space="preserve"> </w:t>
-            </w:r>
-            <w:r>
-              <w:rPr>
-                <w:rFonts w:ascii="Times New Roman" w:hAnsi="Times New Roman"/>
-                <w:color w:val="CC0000"/>
-                <w:sz w:val="19"/>
-              </w:rPr>
-              <w:t xml:space="preserve">[36]</w:t>
-            </w:r>
-            <w:r>
-              <w:rPr>
-                <w:rFonts w:ascii="Times New Roman" w:hAnsi="Times New Roman"/>
-                <w:sz w:val="19"/>
-              </w:rPr>
-              <w:t xml:space="preserve">,</w:t>
-            </w:r>
-            <w:r>
-              <w:rPr>
-                <w:rFonts w:ascii="Times New Roman" w:hAnsi="Times New Roman"/>
-                <w:sz w:val="19"/>
-              </w:rPr>
-              <w:t xml:space="preserve"> </w:t>
-            </w:r>
-            <w:r>
-              <w:rPr>
-                <w:rFonts w:ascii="Times New Roman" w:hAnsi="Times New Roman"/>
-                <w:color w:val="CC0000"/>
-                <w:sz w:val="19"/>
-              </w:rPr>
-              <w:t xml:space="preserve">[37]</w:t>
+                <w:sz w:val="19"/>
+              </w:rPr>
+              <w:t xml:space="preserve">[75], [76], [77], [78], [79], [80], [81], [82], [83], [84], [34], [85], [36], [37]</w:t>
             </w:r>
           </w:p>
         </w:tc>
@@ -9930,200 +8773,9 @@
             <w:r>
               <w:rPr>
                 <w:rFonts w:ascii="Times New Roman" w:hAnsi="Times New Roman"/>
-                <w:color w:val="CC0000"/>
-                <w:sz w:val="19"/>
-              </w:rPr>
-              <w:t xml:space="preserve">[66]</w:t>
-            </w:r>
-            <w:r>
-              <w:rPr>
-                <w:rFonts w:ascii="Times New Roman" w:hAnsi="Times New Roman"/>
-                <w:sz w:val="19"/>
-              </w:rPr>
-              <w:t xml:space="preserve">,</w:t>
-            </w:r>
-            <w:r>
-              <w:rPr>
-                <w:rFonts w:ascii="Times New Roman" w:hAnsi="Times New Roman"/>
-                <w:sz w:val="19"/>
-              </w:rPr>
-              <w:t xml:space="preserve"> </w:t>
-            </w:r>
-            <w:r>
-              <w:rPr>
-                <w:rFonts w:ascii="Times New Roman" w:hAnsi="Times New Roman"/>
-                <w:color w:val="CC0000"/>
-                <w:sz w:val="19"/>
-              </w:rPr>
-              <w:t xml:space="preserve">[86]</w:t>
-            </w:r>
-            <w:r>
-              <w:rPr>
-                <w:rFonts w:ascii="Times New Roman" w:hAnsi="Times New Roman"/>
-                <w:sz w:val="19"/>
-              </w:rPr>
-              <w:t xml:space="preserve">,</w:t>
-            </w:r>
-            <w:r>
-              <w:rPr>
-                <w:rFonts w:ascii="Times New Roman" w:hAnsi="Times New Roman"/>
-                <w:sz w:val="19"/>
-              </w:rPr>
-              <w:t xml:space="preserve"> </w:t>
-            </w:r>
-            <w:r>
-              <w:rPr>
-                <w:rFonts w:ascii="Times New Roman" w:hAnsi="Times New Roman"/>
-                <w:color w:val="CC0000"/>
-                <w:sz w:val="19"/>
-              </w:rPr>
-              <w:t xml:space="preserve">[75]</w:t>
-            </w:r>
-            <w:r>
-              <w:rPr>
-                <w:rFonts w:ascii="Times New Roman" w:hAnsi="Times New Roman"/>
-                <w:sz w:val="19"/>
-              </w:rPr>
-              <w:t xml:space="preserve">,</w:t>
-            </w:r>
-            <w:r>
-              <w:rPr>
-                <w:rFonts w:ascii="Times New Roman" w:hAnsi="Times New Roman"/>
-                <w:sz w:val="19"/>
-              </w:rPr>
-              <w:t xml:space="preserve"> </w:t>
-            </w:r>
-            <w:r>
-              <w:rPr>
-                <w:rFonts w:ascii="Times New Roman" w:hAnsi="Times New Roman"/>
-                <w:color w:val="CC0000"/>
-                <w:sz w:val="19"/>
-              </w:rPr>
-              <w:t xml:space="preserve">[61]</w:t>
-            </w:r>
-            <w:r>
-              <w:rPr>
-                <w:rFonts w:ascii="Times New Roman" w:hAnsi="Times New Roman"/>
-                <w:sz w:val="19"/>
-              </w:rPr>
-              <w:t xml:space="preserve">,</w:t>
-            </w:r>
-            <w:r>
-              <w:rPr>
-                <w:rFonts w:ascii="Times New Roman" w:hAnsi="Times New Roman"/>
-                <w:sz w:val="19"/>
-              </w:rPr>
-              <w:t xml:space="preserve"> </w:t>
-            </w:r>
-            <w:r>
-              <w:rPr>
-                <w:rFonts w:ascii="Times New Roman" w:hAnsi="Times New Roman"/>
-                <w:color w:val="CC0000"/>
-                <w:sz w:val="19"/>
-              </w:rPr>
-              <w:t xml:space="preserve">[87]</w:t>
-            </w:r>
-            <w:r>
-              <w:rPr>
-                <w:rFonts w:ascii="Times New Roman" w:hAnsi="Times New Roman"/>
-                <w:sz w:val="19"/>
-              </w:rPr>
-              <w:t xml:space="preserve">,</w:t>
-            </w:r>
-            <w:r>
-              <w:rPr>
-                <w:rFonts w:ascii="Times New Roman" w:hAnsi="Times New Roman"/>
-                <w:sz w:val="19"/>
-              </w:rPr>
-              <w:t xml:space="preserve"> </w:t>
-            </w:r>
-            <w:r>
-              <w:rPr>
-                <w:rFonts w:ascii="Times New Roman" w:hAnsi="Times New Roman"/>
-                <w:color w:val="CC0000"/>
-                <w:sz w:val="19"/>
-              </w:rPr>
-              <w:t xml:space="preserve">[88]</w:t>
-            </w:r>
-            <w:r>
-              <w:rPr>
-                <w:rFonts w:ascii="Times New Roman" w:hAnsi="Times New Roman"/>
-                <w:sz w:val="19"/>
-              </w:rPr>
-              <w:t xml:space="preserve">,</w:t>
-            </w:r>
-            <w:r>
-              <w:rPr>
-                <w:rFonts w:ascii="Times New Roman" w:hAnsi="Times New Roman"/>
-                <w:sz w:val="19"/>
-              </w:rPr>
-              <w:t xml:space="preserve"> </w:t>
-            </w:r>
-            <w:r>
-              <w:rPr>
-                <w:rFonts w:ascii="Times New Roman" w:hAnsi="Times New Roman"/>
-                <w:color w:val="CC0000"/>
-                <w:sz w:val="19"/>
-              </w:rPr>
-              <w:t xml:space="preserve">[89]</w:t>
-            </w:r>
-            <w:r>
-              <w:rPr>
-                <w:rFonts w:ascii="Times New Roman" w:hAnsi="Times New Roman"/>
-                <w:sz w:val="19"/>
-              </w:rPr>
-              <w:t xml:space="preserve">,</w:t>
-            </w:r>
-            <w:r>
-              <w:rPr>
-                <w:rFonts w:ascii="Times New Roman" w:hAnsi="Times New Roman"/>
-                <w:sz w:val="19"/>
-              </w:rPr>
-              <w:t xml:space="preserve"> </w:t>
-            </w:r>
-            <w:r>
-              <w:rPr>
-                <w:rFonts w:ascii="Times New Roman" w:hAnsi="Times New Roman"/>
-                <w:color w:val="CC0000"/>
-                <w:sz w:val="19"/>
-              </w:rPr>
-              <w:t xml:space="preserve">[90]</w:t>
-            </w:r>
-            <w:r>
-              <w:rPr>
-                <w:rFonts w:ascii="Times New Roman" w:hAnsi="Times New Roman"/>
-                <w:sz w:val="19"/>
-              </w:rPr>
-              <w:t xml:space="preserve">,</w:t>
-            </w:r>
-            <w:r>
-              <w:rPr>
-                <w:rFonts w:ascii="Times New Roman" w:hAnsi="Times New Roman"/>
-                <w:sz w:val="19"/>
-              </w:rPr>
-              <w:t xml:space="preserve"> </w:t>
-            </w:r>
-            <w:r>
-              <w:rPr>
-                <w:rFonts w:ascii="Times New Roman" w:hAnsi="Times New Roman"/>
-                <w:color w:val="CC0000"/>
-                <w:sz w:val="19"/>
-              </w:rPr>
-              <w:t xml:space="preserve">[91]</w:t>
-            </w:r>
-            <w:r>
-              <w:rPr>
-                <w:rFonts w:ascii="Times New Roman" w:hAnsi="Times New Roman"/>
-                <w:sz w:val="19"/>
-              </w:rPr>
-              <w:t xml:space="preserve"> </w:t>
-            </w:r>
-            <w:r>
-              <w:rPr>
-                <w:rFonts w:ascii="Times New Roman" w:hAnsi="Times New Roman"/>
-                <w:sz w:val="19"/>
-              </w:rPr>
-              <w:t xml:space="preserve">· §3.1.2</w:t>
+                <w:sz w:val="19"/>
+              </w:rPr>
+              <w:t xml:space="preserve">[66], [86], [75], [61], [87], [88], [89], [90], [91] · §3.1.2</w:t>
             </w:r>
           </w:p>
         </w:tc>
@@ -10210,266 +8862,9 @@
             <w:r>
               <w:rPr>
                 <w:rFonts w:ascii="Times New Roman" w:hAnsi="Times New Roman"/>
-                <w:color w:val="CC0000"/>
-                <w:sz w:val="19"/>
-              </w:rPr>
-              <w:t xml:space="preserve">[33]</w:t>
-            </w:r>
-            <w:r>
-              <w:rPr>
-                <w:rFonts w:ascii="Times New Roman" w:hAnsi="Times New Roman"/>
-                <w:sz w:val="19"/>
-              </w:rPr>
-              <w:t xml:space="preserve">,</w:t>
-            </w:r>
-            <w:r>
-              <w:rPr>
-                <w:rFonts w:ascii="Times New Roman" w:hAnsi="Times New Roman"/>
-                <w:sz w:val="19"/>
-              </w:rPr>
-              <w:t xml:space="preserve"> </w:t>
-            </w:r>
-            <w:r>
-              <w:rPr>
-                <w:rFonts w:ascii="Times New Roman" w:hAnsi="Times New Roman"/>
-                <w:color w:val="CC0000"/>
-                <w:sz w:val="19"/>
-              </w:rPr>
-              <w:t xml:space="preserve">[67]</w:t>
-            </w:r>
-            <w:r>
-              <w:rPr>
-                <w:rFonts w:ascii="Times New Roman" w:hAnsi="Times New Roman"/>
-                <w:sz w:val="19"/>
-              </w:rPr>
-              <w:t xml:space="preserve">,</w:t>
-            </w:r>
-            <w:r>
-              <w:rPr>
-                <w:rFonts w:ascii="Times New Roman" w:hAnsi="Times New Roman"/>
-                <w:sz w:val="19"/>
-              </w:rPr>
-              <w:t xml:space="preserve"> </w:t>
-            </w:r>
-            <w:r>
-              <w:rPr>
-                <w:rFonts w:ascii="Times New Roman" w:hAnsi="Times New Roman"/>
-                <w:color w:val="CC0000"/>
-                <w:sz w:val="19"/>
-              </w:rPr>
-              <w:t xml:space="preserve">[22]</w:t>
-            </w:r>
-            <w:r>
-              <w:rPr>
-                <w:rFonts w:ascii="Times New Roman" w:hAnsi="Times New Roman"/>
-                <w:sz w:val="19"/>
-              </w:rPr>
-              <w:t xml:space="preserve">,</w:t>
-            </w:r>
-            <w:r>
-              <w:rPr>
-                <w:rFonts w:ascii="Times New Roman" w:hAnsi="Times New Roman"/>
-                <w:sz w:val="19"/>
-              </w:rPr>
-              <w:t xml:space="preserve"> </w:t>
-            </w:r>
-            <w:r>
-              <w:rPr>
-                <w:rFonts w:ascii="Times New Roman" w:hAnsi="Times New Roman"/>
-                <w:color w:val="CC0000"/>
-                <w:sz w:val="19"/>
-              </w:rPr>
-              <w:t xml:space="preserve">[45]</w:t>
-            </w:r>
-            <w:r>
-              <w:rPr>
-                <w:rFonts w:ascii="Times New Roman" w:hAnsi="Times New Roman"/>
-                <w:sz w:val="19"/>
-              </w:rPr>
-              <w:t xml:space="preserve">,</w:t>
-            </w:r>
-            <w:r>
-              <w:rPr>
-                <w:rFonts w:ascii="Times New Roman" w:hAnsi="Times New Roman"/>
-                <w:sz w:val="19"/>
-              </w:rPr>
-              <w:t xml:space="preserve"> </w:t>
-            </w:r>
-            <w:r>
-              <w:rPr>
-                <w:rFonts w:ascii="Times New Roman" w:hAnsi="Times New Roman"/>
-                <w:color w:val="CC0000"/>
-                <w:sz w:val="19"/>
-              </w:rPr>
-              <w:t xml:space="preserve">[40]</w:t>
-            </w:r>
-            <w:r>
-              <w:rPr>
-                <w:rFonts w:ascii="Times New Roman" w:hAnsi="Times New Roman"/>
-                <w:sz w:val="19"/>
-              </w:rPr>
-              <w:t xml:space="preserve">,</w:t>
-            </w:r>
-            <w:r>
-              <w:rPr>
-                <w:rFonts w:ascii="Times New Roman" w:hAnsi="Times New Roman"/>
-                <w:sz w:val="19"/>
-              </w:rPr>
-              <w:t xml:space="preserve"> </w:t>
-            </w:r>
-            <w:r>
-              <w:rPr>
-                <w:rFonts w:ascii="Times New Roman" w:hAnsi="Times New Roman"/>
-                <w:color w:val="CC0000"/>
-                <w:sz w:val="19"/>
-              </w:rPr>
-              <w:t xml:space="preserve">[63]</w:t>
-            </w:r>
-            <w:r>
-              <w:rPr>
-                <w:rFonts w:ascii="Times New Roman" w:hAnsi="Times New Roman"/>
-                <w:sz w:val="19"/>
-              </w:rPr>
-              <w:t xml:space="preserve">,</w:t>
-            </w:r>
-            <w:r>
-              <w:rPr>
-                <w:rFonts w:ascii="Times New Roman" w:hAnsi="Times New Roman"/>
-                <w:sz w:val="19"/>
-              </w:rPr>
-              <w:t xml:space="preserve"> </w:t>
-            </w:r>
-            <w:r>
-              <w:rPr>
-                <w:rFonts w:ascii="Times New Roman" w:hAnsi="Times New Roman"/>
-                <w:color w:val="CC0000"/>
-                <w:sz w:val="19"/>
-              </w:rPr>
-              <w:t xml:space="preserve">[92]</w:t>
-            </w:r>
-            <w:r>
-              <w:rPr>
-                <w:rFonts w:ascii="Times New Roman" w:hAnsi="Times New Roman"/>
-                <w:sz w:val="19"/>
-              </w:rPr>
-              <w:t xml:space="preserve">,</w:t>
-            </w:r>
-            <w:r>
-              <w:rPr>
-                <w:rFonts w:ascii="Times New Roman" w:hAnsi="Times New Roman"/>
-                <w:sz w:val="19"/>
-              </w:rPr>
-              <w:t xml:space="preserve"> </w:t>
-            </w:r>
-            <w:r>
-              <w:rPr>
-                <w:rFonts w:ascii="Times New Roman" w:hAnsi="Times New Roman"/>
-                <w:color w:val="CC0000"/>
-                <w:sz w:val="19"/>
-              </w:rPr>
-              <w:t xml:space="preserve">[93]</w:t>
-            </w:r>
-            <w:r>
-              <w:rPr>
-                <w:rFonts w:ascii="Times New Roman" w:hAnsi="Times New Roman"/>
-                <w:sz w:val="19"/>
-              </w:rPr>
-              <w:t xml:space="preserve">,</w:t>
-            </w:r>
-            <w:r>
-              <w:rPr>
-                <w:rFonts w:ascii="Times New Roman" w:hAnsi="Times New Roman"/>
-                <w:sz w:val="19"/>
-              </w:rPr>
-              <w:t xml:space="preserve"> </w:t>
-            </w:r>
-            <w:r>
-              <w:rPr>
-                <w:rFonts w:ascii="Times New Roman" w:hAnsi="Times New Roman"/>
-                <w:color w:val="CC0000"/>
-                <w:sz w:val="19"/>
-              </w:rPr>
-              <w:t xml:space="preserve">[43]</w:t>
-            </w:r>
-            <w:r>
-              <w:rPr>
-                <w:rFonts w:ascii="Times New Roman" w:hAnsi="Times New Roman"/>
-                <w:sz w:val="19"/>
-              </w:rPr>
-              <w:t xml:space="preserve">,</w:t>
-            </w:r>
-            <w:r>
-              <w:rPr>
-                <w:rFonts w:ascii="Times New Roman" w:hAnsi="Times New Roman"/>
-                <w:sz w:val="19"/>
-              </w:rPr>
-              <w:t xml:space="preserve"> </w:t>
-            </w:r>
-            <w:r>
-              <w:rPr>
-                <w:rFonts w:ascii="Times New Roman" w:hAnsi="Times New Roman"/>
-                <w:color w:val="CC0000"/>
-                <w:sz w:val="19"/>
-              </w:rPr>
-              <w:t xml:space="preserve">[94]</w:t>
-            </w:r>
-            <w:r>
-              <w:rPr>
-                <w:rFonts w:ascii="Times New Roman" w:hAnsi="Times New Roman"/>
-                <w:sz w:val="19"/>
-              </w:rPr>
-              <w:t xml:space="preserve">,</w:t>
-            </w:r>
-            <w:r>
-              <w:rPr>
-                <w:rFonts w:ascii="Times New Roman" w:hAnsi="Times New Roman"/>
-                <w:sz w:val="19"/>
-              </w:rPr>
-              <w:t xml:space="preserve"> </w:t>
-            </w:r>
-            <w:r>
-              <w:rPr>
-                <w:rFonts w:ascii="Times New Roman" w:hAnsi="Times New Roman"/>
-                <w:color w:val="CC0000"/>
-                <w:sz w:val="19"/>
-              </w:rPr>
-              <w:t xml:space="preserve">[95]</w:t>
-            </w:r>
-            <w:r>
-              <w:rPr>
-                <w:rFonts w:ascii="Times New Roman" w:hAnsi="Times New Roman"/>
-                <w:sz w:val="19"/>
-              </w:rPr>
-              <w:t xml:space="preserve">,</w:t>
-            </w:r>
-            <w:r>
-              <w:rPr>
-                <w:rFonts w:ascii="Times New Roman" w:hAnsi="Times New Roman"/>
-                <w:sz w:val="19"/>
-              </w:rPr>
-              <w:t xml:space="preserve"> </w:t>
-            </w:r>
-            <w:r>
-              <w:rPr>
-                <w:rFonts w:ascii="Times New Roman" w:hAnsi="Times New Roman"/>
-                <w:color w:val="CC0000"/>
-                <w:sz w:val="19"/>
-              </w:rPr>
-              <w:t xml:space="preserve">[96]</w:t>
-            </w:r>
-            <w:r>
-              <w:rPr>
-                <w:rFonts w:ascii="Times New Roman" w:hAnsi="Times New Roman"/>
-                <w:sz w:val="19"/>
-              </w:rPr>
-              <w:t xml:space="preserve"> </w:t>
-            </w:r>
-            <w:r>
-              <w:rPr>
-                <w:rFonts w:ascii="Times New Roman" w:hAnsi="Times New Roman"/>
-                <w:sz w:val="19"/>
-              </w:rPr>
-              <w:t xml:space="preserve">· §3.2.4</w:t>
+                <w:sz w:val="19"/>
+              </w:rPr>
+              <w:t xml:space="preserve">[33], [67], [22], [45], [40], [63], [92], [93], [43], [94], [95], [96] · §3.2.4</w:t>
             </w:r>
           </w:p>
         </w:tc>
@@ -12506,7 +10901,6 @@
       </w:r>
       <w:r>
         <w:rPr>
-          <w:color w:val="CC0000"/>
           <w:vertAlign w:val="superscript"/>
         </w:rPr>
         <w:t xml:space="preserve">[34,85,36]</w:t>
@@ -12525,7 +10919,6 @@
       </w:r>
       <w:r>
         <w:rPr>
-          <w:color w:val="CC0000"/>
           <w:vertAlign w:val="superscript"/>
         </w:rPr>
         <w:t xml:space="preserve">[64,17]</w:t>
@@ -12595,7 +10988,6 @@
       </w:r>
       <w:r>
         <w:rPr>
-          <w:color w:val="CC0000"/>
           <w:vertAlign w:val="superscript"/>
         </w:rPr>
         <w:t xml:space="preserve">[97]</w:t>
@@ -12659,7 +11051,6 @@
       </w:r>
       <w:r>
         <w:rPr>
-          <w:color w:val="CC0000"/>
           <w:vertAlign w:val="superscript"/>
         </w:rPr>
         <w:t xml:space="preserve">[68]</w:t>
@@ -13444,7 +11835,6 @@
       </w:r>
       <w:r>
         <w:rPr>
-          <w:color w:val="CC0000"/>
           <w:vertAlign w:val="superscript"/>
         </w:rPr>
         <w:t xml:space="preserve">[59]</w:t>
@@ -13665,7 +12055,6 @@
       </w:r>
       <w:r>
         <w:rPr>
-          <w:color w:val="CC0000"/>
           <w:vertAlign w:val="superscript"/>
         </w:rPr>
         <w:t xml:space="preserve">[56]</w:t>
@@ -14197,7 +12586,6 @@
       </w:r>
       <w:r>
         <w:rPr>
-          <w:color w:val="CC0000"/>
           <w:vertAlign w:val="superscript"/>
         </w:rPr>
         <w:t xml:space="preserve">[98]</w:t>
@@ -14900,7 +13288,6 @@
       </w:r>
       <w:r>
         <w:rPr>
-          <w:color w:val="CC0000"/>
           <w:vertAlign w:val="superscript"/>
         </w:rPr>
         <w:t xml:space="preserve">[72]</w:t>
@@ -14916,7 +13303,6 @@
       </w:r>
       <w:r>
         <w:rPr>
-          <w:color w:val="CC0000"/>
           <w:vertAlign w:val="superscript"/>
         </w:rPr>
         <w:t xml:space="preserve">[73]</w:t>
@@ -14980,7 +13366,6 @@
       </w:r>
       <w:r>
         <w:rPr>
-          <w:color w:val="CC0000"/>
           <w:vertAlign w:val="superscript"/>
         </w:rPr>
         <w:t xml:space="preserve">[99]</w:t>
@@ -17186,7 +15571,6 @@
       </w:r>
       <w:r>
         <w:rPr>
-          <w:color w:val="CC0000"/>
           <w:vertAlign w:val="superscript"/>
         </w:rPr>
         <w:t xml:space="preserve">[70]</w:t>
@@ -18162,7 +16546,6 @@
       </w:r>
       <w:r>
         <w:rPr>
-          <w:color w:val="CC0000"/>
           <w:vertAlign w:val="superscript"/>
         </w:rPr>
         <w:t xml:space="preserve">[35]</w:t>
@@ -18178,7 +16561,6 @@
       </w:r>
       <w:r>
         <w:rPr>
-          <w:color w:val="CC0000"/>
           <w:vertAlign w:val="superscript"/>
         </w:rPr>
         <w:t xml:space="preserve">[100]</w:t>
@@ -18188,7 +16570,6 @@
       </w:r>
       <w:r>
         <w:rPr>
-          <w:color w:val="CC0000"/>
           <w:vertAlign w:val="superscript"/>
         </w:rPr>
         <w:t xml:space="preserve">[74]</w:t>
@@ -21628,7 +20009,6 @@
       </w:r>
       <w:r>
         <w:rPr>
-          <w:color w:val="CC0000"/>
           <w:vertAlign w:val="superscript"/>
         </w:rPr>
         <w:t xml:space="preserve">[96]</w:t>
@@ -21662,7 +20042,6 @@
       </w:r>
       <w:r>
         <w:rPr>
-          <w:color w:val="CC0000"/>
           <w:vertAlign w:val="superscript"/>
         </w:rPr>
         <w:t xml:space="preserve">[101]</w:t>
@@ -21732,7 +20111,6 @@
       </w:r>
       <w:r>
         <w:rPr>
-          <w:color w:val="CC0000"/>
           <w:vertAlign w:val="superscript"/>
         </w:rPr>
         <w:t xml:space="preserve">[94,95]</w:t>
@@ -21815,7 +20193,6 @@
       </w:r>
       <w:r>
         <w:rPr>
-          <w:color w:val="CC0000"/>
           <w:vertAlign w:val="superscript"/>
         </w:rPr>
         <w:t xml:space="preserve">[22]</w:t>
@@ -21831,7 +20208,6 @@
       </w:r>
       <w:r>
         <w:rPr>
-          <w:color w:val="CC0000"/>
           <w:vertAlign w:val="superscript"/>
         </w:rPr>
         <w:t xml:space="preserve">[92]</w:t>
@@ -21850,7 +20226,6 @@
       </w:r>
       <w:r>
         <w:rPr>
-          <w:color w:val="CC0000"/>
           <w:vertAlign w:val="superscript"/>
         </w:rPr>
         <w:t xml:space="preserve">[93]</w:t>
@@ -22099,7 +20474,6 @@
       </w:r>
       <w:r>
         <w:rPr>
-          <w:color w:val="CC0000"/>
           <w:vertAlign w:val="superscript"/>
         </w:rPr>
         <w:t xml:space="preserve">[34]</w:t>
@@ -22115,7 +20489,6 @@
       </w:r>
       <w:r>
         <w:rPr>
-          <w:color w:val="CC0000"/>
           <w:vertAlign w:val="superscript"/>
         </w:rPr>
         <w:t xml:space="preserve">[102]</w:t>
@@ -22131,7 +20504,6 @@
       </w:r>
       <w:r>
         <w:rPr>
-          <w:color w:val="CC0000"/>
           <w:vertAlign w:val="superscript"/>
         </w:rPr>
         <w:t xml:space="preserve">[103]</w:t>
@@ -22150,7 +20522,6 @@
       </w:r>
       <w:r>
         <w:rPr>
-          <w:color w:val="CC0000"/>
           <w:vertAlign w:val="superscript"/>
         </w:rPr>
         <w:t xml:space="preserve">[75,82,83,84]</w:t>
@@ -22240,7 +20611,6 @@
       </w:r>
       <w:r>
         <w:rPr>
-          <w:color w:val="CC0000"/>
           <w:vertAlign w:val="superscript"/>
         </w:rPr>
         <w:t xml:space="preserve">[92]</w:t>
@@ -22256,7 +20626,6 @@
       </w:r>
       <w:r>
         <w:rPr>
-          <w:color w:val="CC0000"/>
           <w:vertAlign w:val="superscript"/>
         </w:rPr>
         <w:t xml:space="preserve">[94,95]</w:t>
@@ -22272,7 +20641,6 @@
       </w:r>
       <w:r>
         <w:rPr>
-          <w:color w:val="CC0000"/>
           <w:vertAlign w:val="superscript"/>
         </w:rPr>
         <w:t xml:space="preserve">[93]</w:t>
@@ -22337,7 +20705,6 @@
       </w:r>
       <w:r>
         <w:rPr>
-          <w:color w:val="CC0000"/>
           <w:vertAlign w:val="superscript"/>
         </w:rPr>
         <w:t xml:space="preserve">[104]</w:t>
@@ -22359,7 +20726,6 @@
       </w:r>
       <w:r>
         <w:rPr>
-          <w:color w:val="CC0000"/>
           <w:vertAlign w:val="superscript"/>
         </w:rPr>
         <w:t xml:space="preserve">[105]</w:t>
@@ -22406,7 +20772,6 @@
       </w:r>
       <w:r>
         <w:rPr>
-          <w:color w:val="CC0000"/>
           <w:vertAlign w:val="superscript"/>
         </w:rPr>
         <w:t xml:space="preserve">[106]</w:t>
@@ -22422,7 +20787,6 @@
       </w:r>
       <w:r>
         <w:rPr>
-          <w:color w:val="CC0000"/>
           <w:vertAlign w:val="superscript"/>
         </w:rPr>
         <w:t xml:space="preserve">[107]</w:t>
@@ -22444,7 +20808,6 @@
       </w:r>
       <w:r>
         <w:rPr>
-          <w:color w:val="CC0000"/>
           <w:vertAlign w:val="superscript"/>
         </w:rPr>
         <w:t xml:space="preserve">[108]</w:t>
@@ -22466,7 +20829,6 @@
       </w:r>
       <w:r>
         <w:rPr>
-          <w:color w:val="CC0000"/>
           <w:vertAlign w:val="superscript"/>
         </w:rPr>
         <w:t xml:space="preserve">[96]</w:t>
@@ -23168,7 +21530,6 @@
       </w:r>
       <w:r>
         <w:rPr>
-          <w:color w:val="CC0000"/>
           <w:vertAlign w:val="superscript"/>
         </w:rPr>
         <w:t xml:space="preserve">[109]</w:t>
@@ -23447,7 +21808,6 @@
             <w:r>
               <w:rPr>
                 <w:rFonts w:ascii="Times New Roman" w:hAnsi="Times New Roman"/>
-                <w:color w:val="CC0000"/>
                 <w:sz w:val="19"/>
                 <w:vertAlign w:val="superscript"/>
               </w:rPr>
@@ -23723,7 +22083,6 @@
             <w:r>
               <w:rPr>
                 <w:rFonts w:ascii="Times New Roman" w:hAnsi="Times New Roman"/>
-                <w:color w:val="CC0000"/>
                 <w:sz w:val="19"/>
                 <w:vertAlign w:val="superscript"/>
               </w:rPr>
@@ -26615,15 +24974,11 @@
       <w:r>
         <w:rPr>
           <w:rFonts w:ascii="Times New Roman" w:hAnsi="Times New Roman"/>
-          <w:color w:val="CC0000"/>
           <w:sz w:val="20"/>
         </w:rPr>
         <w:t xml:space="preserve">1. </w:t>
       </w:r>
       <w:r>
-        <w:rPr>
-          <w:color w:val="CC0000"/>
-        </w:rPr>
         <w:t xml:space="preserve">Hampton JR, Harrison MJG, Mitchell JRA, Prichard JS, Seymour C (1975) Relative contributions of history-taking, physical examination, and laboratory investigation to diagnosis and management of medical outpatients. British Medical Journal 2(5969):486–489.</w:t>
       </w:r>
     </w:p>
@@ -26640,15 +24995,11 @@
       <w:r>
         <w:rPr>
           <w:rFonts w:ascii="Times New Roman" w:hAnsi="Times New Roman"/>
-          <w:color w:val="CC0000"/>
           <w:sz w:val="20"/>
         </w:rPr>
         <w:t xml:space="preserve">2. </w:t>
       </w:r>
       <w:r>
-        <w:rPr>
-          <w:color w:val="CC0000"/>
-        </w:rPr>
         <w:t xml:space="preserve">Seinen TM, Kors JA, van Mulligen EM, et al (2025) Using Structured Codes and Free-Text Notes to Measure Information Complementarity in Electronic Health Records. Journal of Medical Internet Research.</w:t>
       </w:r>
     </w:p>
@@ -26665,21 +25016,14 @@
       <w:r>
         <w:rPr>
           <w:rFonts w:ascii="Times New Roman" w:hAnsi="Times New Roman"/>
-          <w:color w:val="CC0000"/>
           <w:sz w:val="20"/>
         </w:rPr>
         <w:t xml:space="preserve">3. </w:t>
       </w:r>
       <w:r>
-        <w:rPr>
-          <w:color w:val="CC0000"/>
-        </w:rPr>
         <w:t xml:space="preserve">The Joint Commission. Sentinel Event Data Summary (annual root-cause reports). Oakbrook Terrace, IL.</w:t>
       </w:r>
       <w:r>
-        <w:rPr>
-          <w:color w:val="CC0000"/>
-        </w:rPr>
         <w:t xml:space="preserve"> </w:t>
       </w:r>
       <w:hyperlink r:id="rId65">
@@ -26704,21 +25048,14 @@
       <w:r>
         <w:rPr>
           <w:rFonts w:ascii="Times New Roman" w:hAnsi="Times New Roman"/>
-          <w:color w:val="CC0000"/>
           <w:sz w:val="20"/>
         </w:rPr>
         <w:t xml:space="preserve">4. </w:t>
       </w:r>
       <w:r>
-        <w:rPr>
-          <w:color w:val="CC0000"/>
-        </w:rPr>
         <w:t xml:space="preserve">CRICO Strategies (2015) Malpractice Risks in Communication Failures: 2015 Annual Benchmarking Report. Cambridge, MA.</w:t>
       </w:r>
       <w:r>
-        <w:rPr>
-          <w:color w:val="CC0000"/>
-        </w:rPr>
         <w:t xml:space="preserve"> </w:t>
       </w:r>
       <w:hyperlink r:id="rId66">
@@ -26743,15 +25080,11 @@
       <w:r>
         <w:rPr>
           <w:rFonts w:ascii="Times New Roman" w:hAnsi="Times New Roman"/>
-          <w:color w:val="CC0000"/>
           <w:sz w:val="20"/>
         </w:rPr>
         <w:t xml:space="preserve">5. </w:t>
       </w:r>
       <w:r>
-        <w:rPr>
-          <w:color w:val="CC0000"/>
-        </w:rPr>
         <w:t xml:space="preserve">Iedema R, et al Clinical handover between paramedics and emergency department staff: the SBAR and IMIST-AMBO acronyms. International Journal of Paramedic Practice.</w:t>
       </w:r>
     </w:p>
@@ -26768,15 +25101,11 @@
       <w:r>
         <w:rPr>
           <w:rFonts w:ascii="Times New Roman" w:hAnsi="Times New Roman"/>
-          <w:color w:val="CC0000"/>
           <w:sz w:val="20"/>
         </w:rPr>
         <w:t xml:space="preserve">6. </w:t>
       </w:r>
       <w:r>
-        <w:rPr>
-          <w:color w:val="CC0000"/>
-        </w:rPr>
         <w:t xml:space="preserve">Joshi I, Kume K, Drucker C, et al (2025) Impact of language barrier during emergency calls on out-of-hospital cardiac arrest treatment and outcomes. Resuscitation.</w:t>
       </w:r>
     </w:p>
@@ -26793,15 +25122,11 @@
       <w:r>
         <w:rPr>
           <w:rFonts w:ascii="Times New Roman" w:hAnsi="Times New Roman"/>
-          <w:color w:val="CC0000"/>
           <w:sz w:val="20"/>
         </w:rPr>
         <w:t xml:space="preserve">7. </w:t>
       </w:r>
       <w:r>
-        <w:rPr>
-          <w:color w:val="CC0000"/>
-        </w:rPr>
         <w:t xml:space="preserve">Nath B, et al (2024) Patient Portal Message Volume and Time Spent on the EHR: An Observational Study of Primary Care Clinicians. Journal of General Internal Medicine.</w:t>
       </w:r>
     </w:p>
@@ -26818,15 +25143,11 @@
       <w:r>
         <w:rPr>
           <w:rFonts w:ascii="Times New Roman" w:hAnsi="Times New Roman"/>
-          <w:color w:val="CC0000"/>
           <w:sz w:val="20"/>
         </w:rPr>
         <w:t xml:space="preserve">8. </w:t>
       </w:r>
       <w:r>
-        <w:rPr>
-          <w:color w:val="CC0000"/>
-        </w:rPr>
         <w:t xml:space="preserve">Zhou H, et al (2024) A Survey on Medical Large Language Models. arXiv:2406.03712.</w:t>
       </w:r>
     </w:p>
@@ -26843,15 +25164,11 @@
       <w:r>
         <w:rPr>
           <w:rFonts w:ascii="Times New Roman" w:hAnsi="Times New Roman"/>
-          <w:color w:val="CC0000"/>
           <w:sz w:val="20"/>
         </w:rPr>
         <w:t xml:space="preserve">9. </w:t>
       </w:r>
       <w:r>
-        <w:rPr>
-          <w:color w:val="CC0000"/>
-        </w:rPr>
         <w:t xml:space="preserve">Alkalbani AM, Alrawahi AS, Salah A, et al (2025) A Systematic Review of Large Language Models in Medical Specialties: Applications, Challenges and Future Directions. Information 16(6):489.</w:t>
       </w:r>
     </w:p>
@@ -26868,15 +25185,11 @@
       <w:r>
         <w:rPr>
           <w:rFonts w:ascii="Times New Roman" w:hAnsi="Times New Roman"/>
-          <w:color w:val="CC0000"/>
           <w:sz w:val="20"/>
         </w:rPr>
         <w:t xml:space="preserve">10. </w:t>
       </w:r>
       <w:r>
-        <w:rPr>
-          <w:color w:val="CC0000"/>
-        </w:rPr>
         <w:t xml:space="preserve">Alshaikhdeeb B, et al (2025) Generation of Synthetic Clinical Text: A Systematic Review. arXiv:2507.18451.</w:t>
       </w:r>
     </w:p>
@@ -26893,21 +25206,14 @@
       <w:r>
         <w:rPr>
           <w:rFonts w:ascii="Times New Roman" w:hAnsi="Times New Roman"/>
-          <w:color w:val="CC0000"/>
           <w:sz w:val="20"/>
         </w:rPr>
         <w:t xml:space="preserve">11. </w:t>
       </w:r>
       <w:r>
-        <w:rPr>
-          <w:color w:val="CC0000"/>
-        </w:rPr>
         <w:t xml:space="preserve">Rao H, Liu W, Wang H, Huang I-C, He Z, Huang X (2026) A Scoping Review of Synthetic Data Generation by Language Models in Biomedical Research and Application: Data Utility and Quality Perspectives. Journal of Healthcare Informatics Research 10(2).</w:t>
       </w:r>
       <w:r>
-        <w:rPr>
-          <w:color w:val="CC0000"/>
-        </w:rPr>
         <w:t xml:space="preserve"> </w:t>
       </w:r>
       <w:hyperlink r:id="rId67">
@@ -26932,15 +25238,11 @@
       <w:r>
         <w:rPr>
           <w:rFonts w:ascii="Times New Roman" w:hAnsi="Times New Roman"/>
-          <w:color w:val="CC0000"/>
           <w:sz w:val="20"/>
         </w:rPr>
         <w:t xml:space="preserve">12. </w:t>
       </w:r>
       <w:r>
-        <w:rPr>
-          <w:color w:val="CC0000"/>
-        </w:rPr>
         <w:t xml:space="preserve">Loni M, Poursalim F, Asadi M, et al (2024) A review on generative AI models for synthetic medical text, time series, and longitudinal data. npj Digital Medicine.</w:t>
       </w:r>
     </w:p>
@@ -26957,15 +25259,11 @@
       <w:r>
         <w:rPr>
           <w:rFonts w:ascii="Times New Roman" w:hAnsi="Times New Roman"/>
-          <w:color w:val="CC0000"/>
           <w:sz w:val="20"/>
         </w:rPr>
         <w:t xml:space="preserve">13. </w:t>
       </w:r>
       <w:r>
-        <w:rPr>
-          <w:color w:val="CC0000"/>
-        </w:rPr>
         <w:t xml:space="preserve">Ibrahim M, Al Khalil Y, Amirrajab S, et al (2024) Generative AI for Synthetic Data Across Multiple Medical Modalities: A Systematic Review. arXiv:2407.00116.</w:t>
       </w:r>
     </w:p>
@@ -26982,15 +25280,11 @@
       <w:r>
         <w:rPr>
           <w:rFonts w:ascii="Times New Roman" w:hAnsi="Times New Roman"/>
-          <w:color w:val="CC0000"/>
           <w:sz w:val="20"/>
         </w:rPr>
         <w:t xml:space="preserve">14. </w:t>
       </w:r>
       <w:r>
-        <w:rPr>
-          <w:color w:val="CC0000"/>
-        </w:rPr>
         <w:t xml:space="preserve">Rujas M, Gómez Del Moral Herranz RM, Fico G, et al (2024) Synthetic data generation in healthcare: A scoping review of reviews on domains, motivations, and future applications. International Journal of Medical Informatics.</w:t>
       </w:r>
     </w:p>
@@ -27007,15 +25301,11 @@
       <w:r>
         <w:rPr>
           <w:rFonts w:ascii="Times New Roman" w:hAnsi="Times New Roman"/>
-          <w:color w:val="CC0000"/>
           <w:sz w:val="20"/>
         </w:rPr>
         <w:t xml:space="preserve">15. </w:t>
       </w:r>
       <w:r>
-        <w:rPr>
-          <w:color w:val="CC0000"/>
-        </w:rPr>
         <w:t xml:space="preserve">Liu X, Chang J, Zhang JJ (2023) Knowledge-Grounded Dialogue Generation for Medical Conversations: A Survey. International Conference on Information Visualisation (IV).</w:t>
       </w:r>
     </w:p>
@@ -27032,15 +25322,11 @@
       <w:r>
         <w:rPr>
           <w:rFonts w:ascii="Times New Roman" w:hAnsi="Times New Roman"/>
-          <w:color w:val="CC0000"/>
           <w:sz w:val="20"/>
         </w:rPr>
         <w:t xml:space="preserve">16. </w:t>
       </w:r>
       <w:r>
-        <w:rPr>
-          <w:color w:val="CC0000"/>
-        </w:rPr>
         <w:t xml:space="preserve">Lyu M, Li X, Chen Z, et al (2025) Natural Language Generation in Healthcare: A Review of Methods and Applications. arXiv:2505.04073.</w:t>
       </w:r>
     </w:p>
@@ -27057,15 +25343,11 @@
       <w:r>
         <w:rPr>
           <w:rFonts w:ascii="Times New Roman" w:hAnsi="Times New Roman"/>
-          <w:color w:val="CC0000"/>
           <w:sz w:val="20"/>
         </w:rPr>
         <w:t xml:space="preserve">17. </w:t>
       </w:r>
       <w:r>
-        <w:rPr>
-          <w:color w:val="CC0000"/>
-        </w:rPr>
         <w:t xml:space="preserve">Wang J, et al (2024) NoteChat: A Dataset of Synthetic Patient-Physician Conversations Conditioned on Clinical Notes. Findings of ACL (arXiv:2310.15959).</w:t>
       </w:r>
     </w:p>
@@ -27082,15 +25364,11 @@
       <w:r>
         <w:rPr>
           <w:rFonts w:ascii="Times New Roman" w:hAnsi="Times New Roman"/>
-          <w:color w:val="CC0000"/>
           <w:sz w:val="20"/>
         </w:rPr>
         <w:t xml:space="preserve">18. </w:t>
       </w:r>
       <w:r>
-        <w:rPr>
-          <w:color w:val="CC0000"/>
-        </w:rPr>
         <w:t xml:space="preserve">Yim W, et al (2023) ACI-BENCH: a Novel Ambient Clinical Intelligence Dataset for Benchmarking Automatic Visit Note Generation. Scientific Data (arXiv:2306.02022).</w:t>
       </w:r>
     </w:p>
@@ -27107,15 +25385,11 @@
       <w:r>
         <w:rPr>
           <w:rFonts w:ascii="Times New Roman" w:hAnsi="Times New Roman"/>
-          <w:color w:val="CC0000"/>
           <w:sz w:val="20"/>
         </w:rPr>
         <w:t xml:space="preserve">19. </w:t>
       </w:r>
       <w:r>
-        <w:rPr>
-          <w:color w:val="CC0000"/>
-        </w:rPr>
         <w:t xml:space="preserve">Ben Abacha A, et al (2023) An Empirical Study of Clinical Note Generation from Doctor-Patient Encounters (MTS-Dialog). EACL.</w:t>
       </w:r>
     </w:p>
@@ -27132,15 +25406,11 @@
       <w:r>
         <w:rPr>
           <w:rFonts w:ascii="Times New Roman" w:hAnsi="Times New Roman"/>
-          <w:color w:val="CC0000"/>
           <w:sz w:val="20"/>
         </w:rPr>
         <w:t xml:space="preserve">20. </w:t>
       </w:r>
       <w:r>
-        <w:rPr>
-          <w:color w:val="CC0000"/>
-        </w:rPr>
         <w:t xml:space="preserve">Papadopoulos Korfiatis A, Moramarco F, et al (2022) PriMock57: A Dataset of Primary Care Mock Consultations. ACL (arXiv:2204.00333).</w:t>
       </w:r>
     </w:p>
@@ -27157,15 +25427,11 @@
       <w:r>
         <w:rPr>
           <w:rFonts w:ascii="Times New Roman" w:hAnsi="Times New Roman"/>
-          <w:color w:val="CC0000"/>
           <w:sz w:val="20"/>
         </w:rPr>
         <w:t xml:space="preserve">21. </w:t>
       </w:r>
       <w:r>
-        <w:rPr>
-          <w:color w:val="CC0000"/>
-        </w:rPr>
         <w:t xml:space="preserve">Gormley K, Lockhart K, Isaac J (2022) Using natural language processing in facilitating pre-hospital telephone triage of emergency calls. British Paramedic Journal.</w:t>
       </w:r>
     </w:p>
@@ -27182,15 +25448,11 @@
       <w:r>
         <w:rPr>
           <w:rFonts w:ascii="Times New Roman" w:hAnsi="Times New Roman"/>
-          <w:color w:val="CC0000"/>
           <w:sz w:val="20"/>
         </w:rPr>
         <w:t xml:space="preserve">22. </w:t>
       </w:r>
       <w:r>
-        <w:rPr>
-          <w:color w:val="CC0000"/>
-        </w:rPr>
         <w:t xml:space="preserve">Sarkar AR, Chuang Y-S, Mohammed N, et al (2024) De-identification is not enough: a comparison between de-identified and synthetic clinical notes. Scientific Reports (arXiv:2402.00179).</w:t>
       </w:r>
     </w:p>
@@ -27207,15 +25469,11 @@
       <w:r>
         <w:rPr>
           <w:rFonts w:ascii="Times New Roman" w:hAnsi="Times New Roman"/>
-          <w:color w:val="CC0000"/>
           <w:sz w:val="20"/>
         </w:rPr>
         <w:t xml:space="preserve">23. </w:t>
       </w:r>
       <w:r>
-        <w:rPr>
-          <w:color w:val="CC0000"/>
-        </w:rPr>
         <w:t xml:space="preserve">Bedrick S, Doğruöz AS, Nisioi S (2026) A Typology of Synthetic Datasets for Dialogue Processing in Clinical Contexts. LREC (arXiv:2505.03025).</w:t>
       </w:r>
     </w:p>
@@ -27232,15 +25490,11 @@
       <w:r>
         <w:rPr>
           <w:rFonts w:ascii="Times New Roman" w:hAnsi="Times New Roman"/>
-          <w:color w:val="CC0000"/>
           <w:sz w:val="20"/>
         </w:rPr>
         <w:t xml:space="preserve">24. </w:t>
       </w:r>
       <w:r>
-        <w:rPr>
-          <w:color w:val="CC0000"/>
-        </w:rPr>
         <w:t xml:space="preserve">Zeng G, et al (2020) MedDialog: Large-scale Medical Dialogue Datasets. EMNLP.</w:t>
       </w:r>
     </w:p>
@@ -27257,15 +25511,11 @@
       <w:r>
         <w:rPr>
           <w:rFonts w:ascii="Times New Roman" w:hAnsi="Times New Roman"/>
-          <w:color w:val="CC0000"/>
           <w:sz w:val="20"/>
         </w:rPr>
         <w:t xml:space="preserve">25. </w:t>
       </w:r>
       <w:r>
-        <w:rPr>
-          <w:color w:val="CC0000"/>
-        </w:rPr>
         <w:t xml:space="preserve">Ben Abacha A, et al (2023) Overview of the MEDIQA-Chat 2023 Shared Tasks on the Summarization and Generation of Doctor-Patient Conversations. ACL ClinicalNLP.</w:t>
       </w:r>
     </w:p>
@@ -27282,15 +25532,11 @@
       <w:r>
         <w:rPr>
           <w:rFonts w:ascii="Times New Roman" w:hAnsi="Times New Roman"/>
-          <w:color w:val="CC0000"/>
           <w:sz w:val="20"/>
         </w:rPr>
         <w:t xml:space="preserve">26. </w:t>
       </w:r>
       <w:r>
-        <w:rPr>
-          <w:color w:val="CC0000"/>
-        </w:rPr>
         <w:t xml:space="preserve">Lukac PJ, Turner W, Vangala S, et al (2025) Ambient AI Scribes in Clinical Practice: A Randomized Trial. NEJM AI.</w:t>
       </w:r>
     </w:p>
@@ -27307,15 +25553,11 @@
       <w:r>
         <w:rPr>
           <w:rFonts w:ascii="Times New Roman" w:hAnsi="Times New Roman"/>
-          <w:color w:val="CC0000"/>
           <w:sz w:val="20"/>
         </w:rPr>
         <w:t xml:space="preserve">27. </w:t>
       </w:r>
       <w:r>
-        <w:rPr>
-          <w:color w:val="CC0000"/>
-        </w:rPr>
         <w:t xml:space="preserve">Wang H, et al (2020) An Emergency Medical Services Clinical Audit System driven by Named Entity Recognition from Deep Learning. arXiv:2007.03596.</w:t>
       </w:r>
     </w:p>
@@ -27332,15 +25574,11 @@
       <w:r>
         <w:rPr>
           <w:rFonts w:ascii="Times New Roman" w:hAnsi="Times New Roman"/>
-          <w:color w:val="CC0000"/>
           <w:sz w:val="20"/>
         </w:rPr>
         <w:t xml:space="preserve">28. </w:t>
       </w:r>
       <w:r>
-        <w:rPr>
-          <w:color w:val="CC0000"/>
-        </w:rPr>
         <w:t xml:space="preserve">Wang L, et al (2024) Using natural language processing in emergency medicine health service research: A systematic review and meta-analysis. Academic Emergency Medicine.</w:t>
       </w:r>
     </w:p>
@@ -27357,15 +25595,11 @@
       <w:r>
         <w:rPr>
           <w:rFonts w:ascii="Times New Roman" w:hAnsi="Times New Roman"/>
-          <w:color w:val="CC0000"/>
           <w:sz w:val="20"/>
         </w:rPr>
         <w:t xml:space="preserve">29. </w:t>
       </w:r>
       <w:r>
-        <w:rPr>
-          <w:color w:val="CC0000"/>
-        </w:rPr>
         <w:t xml:space="preserve">Sterling NW, et al (2023) Applications of natural language processing at emergency department triage: A narrative review. PLOS ONE.</w:t>
       </w:r>
     </w:p>
@@ -27382,15 +25616,11 @@
       <w:r>
         <w:rPr>
           <w:rFonts w:ascii="Times New Roman" w:hAnsi="Times New Roman"/>
-          <w:color w:val="CC0000"/>
           <w:sz w:val="20"/>
         </w:rPr>
         <w:t xml:space="preserve">30. </w:t>
       </w:r>
       <w:r>
-        <w:rPr>
-          <w:color w:val="CC0000"/>
-        </w:rPr>
         <w:t xml:space="preserve">Blomberg SN, et al (2019) Machine learning as a supportive tool to recognize cardiac arrest in emergency calls. Resuscitation 138:322–329.</w:t>
       </w:r>
     </w:p>
@@ -27407,15 +25637,11 @@
       <w:r>
         <w:rPr>
           <w:rFonts w:ascii="Times New Roman" w:hAnsi="Times New Roman"/>
-          <w:color w:val="CC0000"/>
           <w:sz w:val="20"/>
         </w:rPr>
         <w:t xml:space="preserve">31. </w:t>
       </w:r>
       <w:r>
-        <w:rPr>
-          <w:color w:val="CC0000"/>
-        </w:rPr>
         <w:t xml:space="preserve">Blomberg SN, et al (2021) Effect of Machine Learning on Dispatcher Recognition of Out-of-Hospital Cardiac Arrest During Calls to Emergency Medical Services: A Randomized Clinical Trial. JAMA Network Open.</w:t>
       </w:r>
     </w:p>
@@ -27432,15 +25658,11 @@
       <w:r>
         <w:rPr>
           <w:rFonts w:ascii="Times New Roman" w:hAnsi="Times New Roman"/>
-          <w:color w:val="CC0000"/>
           <w:sz w:val="20"/>
         </w:rPr>
         <w:t xml:space="preserve">32. </w:t>
       </w:r>
       <w:r>
-        <w:rPr>
-          <w:color w:val="CC0000"/>
-        </w:rPr>
         <w:t xml:space="preserve">Cronin RM, et al (2017) A comparison of rule-based and machine learning approaches for classifying patient portal messages. International Journal of Medical Informatics.</w:t>
       </w:r>
     </w:p>
@@ -27457,15 +25679,11 @@
       <w:r>
         <w:rPr>
           <w:rFonts w:ascii="Times New Roman" w:hAnsi="Times New Roman"/>
-          <w:color w:val="CC0000"/>
           <w:sz w:val="20"/>
         </w:rPr>
         <w:t xml:space="preserve">33. </w:t>
       </w:r>
       <w:r>
-        <w:rPr>
-          <w:color w:val="CC0000"/>
-        </w:rPr>
         <w:t xml:space="preserve">Xu R, et al (2023) Knowledge-Infused Prompting: Assessing and Advancing Clinical Text Data Generation with LLMs (ClinGen). arXiv:2311.00287.</w:t>
       </w:r>
     </w:p>
@@ -27482,15 +25700,11 @@
       <w:r>
         <w:rPr>
           <w:rFonts w:ascii="Times New Roman" w:hAnsi="Times New Roman"/>
-          <w:color w:val="CC0000"/>
           <w:sz w:val="20"/>
         </w:rPr>
         <w:t xml:space="preserve">34. </w:t>
       </w:r>
       <w:r>
-        <w:rPr>
-          <w:color w:val="CC0000"/>
-        </w:rPr>
         <w:t xml:space="preserve">Du Y, et al (2025) LLMs Can Simulate Standardized Patients via Agent Coevolution (EvoPatient). ACL (arXiv:2412.11716).</w:t>
       </w:r>
     </w:p>
@@ -27507,15 +25721,11 @@
       <w:r>
         <w:rPr>
           <w:rFonts w:ascii="Times New Roman" w:hAnsi="Times New Roman"/>
-          <w:color w:val="CC0000"/>
           <w:sz w:val="20"/>
         </w:rPr>
         <w:t xml:space="preserve">35. </w:t>
       </w:r>
       <w:r>
-        <w:rPr>
-          <w:color w:val="CC0000"/>
-        </w:rPr>
         <w:t xml:space="preserve">Ge X, et al (2026) EMSDialog: Synthetic Multi-person EMS Dialogue Generation from Electronic Patient Care Reports via Multi-LLM Agents. ACL Findings (arXiv:2604.07549).</w:t>
       </w:r>
     </w:p>
@@ -27532,15 +25742,11 @@
       <w:r>
         <w:rPr>
           <w:rFonts w:ascii="Times New Roman" w:hAnsi="Times New Roman"/>
-          <w:color w:val="CC0000"/>
           <w:sz w:val="20"/>
         </w:rPr>
         <w:t xml:space="preserve">36. </w:t>
       </w:r>
       <w:r>
-        <w:rPr>
-          <w:color w:val="CC0000"/>
-        </w:rPr>
         <w:t xml:space="preserve">Fan Z, et al (2024) AI Hospital: Benchmarking LLMs in a Multi-agent Medical Interaction Simulator. arXiv:2402.09742.</w:t>
       </w:r>
     </w:p>
@@ -27557,15 +25763,11 @@
       <w:r>
         <w:rPr>
           <w:rFonts w:ascii="Times New Roman" w:hAnsi="Times New Roman"/>
-          <w:color w:val="CC0000"/>
           <w:sz w:val="20"/>
         </w:rPr>
         <w:t xml:space="preserve">37. </w:t>
       </w:r>
       <w:r>
-        <w:rPr>
-          <w:color w:val="CC0000"/>
-        </w:rPr>
         <w:t xml:space="preserve">Louie R, et al (2024) Roleplay-doh: Enabling Domain-Experts to Create LLM-simulated Patients via Eliciting and Adhering to Principles. EMNLP.</w:t>
       </w:r>
     </w:p>
@@ -27582,15 +25784,11 @@
       <w:r>
         <w:rPr>
           <w:rFonts w:ascii="Times New Roman" w:hAnsi="Times New Roman"/>
-          <w:color w:val="CC0000"/>
           <w:sz w:val="20"/>
         </w:rPr>
         <w:t xml:space="preserve">38. </w:t>
       </w:r>
       <w:r>
-        <w:rPr>
-          <w:color w:val="CC0000"/>
-        </w:rPr>
         <w:t xml:space="preserve">Keerthana G, Gupta M (2025) CLI-RAG: A Retrieval-Augmented Framework for Clinically Structured and Context-Aware Text Generation with LLMs. arXiv:2507.06715.</w:t>
       </w:r>
     </w:p>
@@ -27607,15 +25805,11 @@
       <w:r>
         <w:rPr>
           <w:rFonts w:ascii="Times New Roman" w:hAnsi="Times New Roman"/>
-          <w:color w:val="CC0000"/>
           <w:sz w:val="20"/>
         </w:rPr>
         <w:t xml:space="preserve">39. </w:t>
       </w:r>
       <w:r>
-        <w:rPr>
-          <w:color w:val="CC0000"/>
-        </w:rPr>
         <w:t xml:space="preserve">Aperstein Y, Halifa L, Bar S, Apartsin A (2026) LLM-guided headline rewriting for clickability enhancement without clickbait. arXiv:2603.22459.</w:t>
       </w:r>
     </w:p>
@@ -27632,15 +25826,11 @@
       <w:r>
         <w:rPr>
           <w:rFonts w:ascii="Times New Roman" w:hAnsi="Times New Roman"/>
-          <w:color w:val="CC0000"/>
           <w:sz w:val="20"/>
         </w:rPr>
         <w:t xml:space="preserve">40. </w:t>
       </w:r>
       <w:r>
-        <w:rPr>
-          <w:color w:val="CC0000"/>
-        </w:rPr>
         <w:t xml:space="preserve">Kang A, Chen JY, Lee-Youngzie Z, et al (2024) Synthetic Data Generation with LLM for Improved Depression Prediction. arXiv:2411.17672.</w:t>
       </w:r>
     </w:p>
@@ -27657,15 +25847,11 @@
       <w:r>
         <w:rPr>
           <w:rFonts w:ascii="Times New Roman" w:hAnsi="Times New Roman"/>
-          <w:color w:val="CC0000"/>
           <w:sz w:val="20"/>
         </w:rPr>
         <w:t xml:space="preserve">41. </w:t>
       </w:r>
       <w:r>
-        <w:rPr>
-          <w:color w:val="CC0000"/>
-        </w:rPr>
         <w:t xml:space="preserve">Li R, Wang X, Yu H (2023) Two Directions for Clinical Data Generation with Large Language Models: Data-to-Label and Label-to-Data. Findings of EMNLP.</w:t>
       </w:r>
     </w:p>
@@ -27682,15 +25868,11 @@
       <w:r>
         <w:rPr>
           <w:rFonts w:ascii="Times New Roman" w:hAnsi="Times New Roman"/>
-          <w:color w:val="CC0000"/>
           <w:sz w:val="20"/>
         </w:rPr>
         <w:t xml:space="preserve">42. </w:t>
       </w:r>
       <w:r>
-        <w:rPr>
-          <w:color w:val="CC0000"/>
-        </w:rPr>
         <w:t xml:space="preserve">Zhang K, Hu M, Le HAD, et al (2026) A Survey on Evaluating Quality and Trustworthiness in LLM-Generated Data. arXiv:2601.17717.</w:t>
       </w:r>
     </w:p>
@@ -27707,15 +25889,11 @@
       <w:r>
         <w:rPr>
           <w:rFonts w:ascii="Times New Roman" w:hAnsi="Times New Roman"/>
-          <w:color w:val="CC0000"/>
           <w:sz w:val="20"/>
         </w:rPr>
         <w:t xml:space="preserve">43. </w:t>
       </w:r>
       <w:r>
-        <w:rPr>
-          <w:color w:val="CC0000"/>
-        </w:rPr>
         <w:t xml:space="preserve">Woo E, Burkhart M, Alsentzer E, Beaulieu-Jones B (2025) Synthetic data distillation enables the extraction of clinical information at scale. npj Digital Medicine 8.</w:t>
       </w:r>
     </w:p>
@@ -27732,15 +25910,11 @@
       <w:r>
         <w:rPr>
           <w:rFonts w:ascii="Times New Roman" w:hAnsi="Times New Roman"/>
-          <w:color w:val="CC0000"/>
           <w:sz w:val="20"/>
         </w:rPr>
         <w:t xml:space="preserve">44. </w:t>
       </w:r>
       <w:r>
-        <w:rPr>
-          <w:color w:val="CC0000"/>
-        </w:rPr>
         <w:t xml:space="preserve">Li J, Zhou Y, Jiang X, Natarajan K, et al (2021) Are synthetic clinical notes useful for real natural language processing tasks: A case study on clinical entity recognition. Journal of the American Medical Informatics Association 28(10):2193–2201.</w:t>
       </w:r>
     </w:p>
@@ -27757,15 +25931,11 @@
       <w:r>
         <w:rPr>
           <w:rFonts w:ascii="Times New Roman" w:hAnsi="Times New Roman"/>
-          <w:color w:val="CC0000"/>
           <w:sz w:val="20"/>
         </w:rPr>
         <w:t xml:space="preserve">45. </w:t>
       </w:r>
       <w:r>
-        <w:rPr>
-          <w:color w:val="CC0000"/>
-        </w:rPr>
         <w:t xml:space="preserve">Kaabachi B, Despraz J, Meurers T, et al (2025) A scoping review of privacy and utility metrics in medical synthetic data. npj Digital Medicine.</w:t>
       </w:r>
     </w:p>
@@ -27782,15 +25952,11 @@
       <w:r>
         <w:rPr>
           <w:rFonts w:ascii="Times New Roman" w:hAnsi="Times New Roman"/>
-          <w:color w:val="CC0000"/>
           <w:sz w:val="20"/>
         </w:rPr>
         <w:t xml:space="preserve">46. </w:t>
       </w:r>
       <w:r>
-        <w:rPr>
-          <w:color w:val="CC0000"/>
-        </w:rPr>
         <w:t xml:space="preserve">Aperstein Y, Moran E, Apartsin A (2026) IRC-Bench: Recognizing Entities from Contextual Cues in First-Person Reminiscences. Machine Learning and Knowledge Extraction.</w:t>
       </w:r>
     </w:p>
@@ -27807,15 +25973,11 @@
       <w:r>
         <w:rPr>
           <w:rFonts w:ascii="Times New Roman" w:hAnsi="Times New Roman"/>
-          <w:color w:val="CC0000"/>
           <w:sz w:val="20"/>
         </w:rPr>
         <w:t xml:space="preserve">47. </w:t>
       </w:r>
       <w:r>
-        <w:rPr>
-          <w:color w:val="CC0000"/>
-        </w:rPr>
         <w:t xml:space="preserve">Ritter A, Clark S, Mausam, Etzioni O (2011) Named Entity Recognition in Tweets: An Experimental Study. EMNLP.</w:t>
       </w:r>
     </w:p>
@@ -27832,15 +25994,11 @@
       <w:r>
         <w:rPr>
           <w:rFonts w:ascii="Times New Roman" w:hAnsi="Times New Roman"/>
-          <w:color w:val="CC0000"/>
           <w:sz w:val="20"/>
         </w:rPr>
         <w:t xml:space="preserve">48. </w:t>
       </w:r>
       <w:r>
-        <w:rPr>
-          <w:color w:val="CC0000"/>
-        </w:rPr>
         <w:t xml:space="preserve">Derczynski L, Nichols E, van Erp M, Limsopatham N (2017) Results of the WNUT2017 Shared Task on Novel and Emerging Entity Recognition. W-NUT@EMNLP.</w:t>
       </w:r>
     </w:p>
@@ -27857,15 +26015,11 @@
       <w:r>
         <w:rPr>
           <w:rFonts w:ascii="Times New Roman" w:hAnsi="Times New Roman"/>
-          <w:color w:val="CC0000"/>
           <w:sz w:val="20"/>
         </w:rPr>
         <w:t xml:space="preserve">49. </w:t>
       </w:r>
       <w:r>
-        <w:rPr>
-          <w:color w:val="CC0000"/>
-        </w:rPr>
         <w:t xml:space="preserve">Aperstein Y, Gottlib A, Benita G, Apartsin A (2025) Explainable Semantic Text Relations: A Question-Answering Framework for Comparing Document Content. Information 16(12):1090.</w:t>
       </w:r>
     </w:p>
@@ -27882,15 +26036,11 @@
       <w:r>
         <w:rPr>
           <w:rFonts w:ascii="Times New Roman" w:hAnsi="Times New Roman"/>
-          <w:color w:val="CC0000"/>
           <w:sz w:val="20"/>
         </w:rPr>
         <w:t xml:space="preserve">50. </w:t>
       </w:r>
       <w:r>
-        <w:rPr>
-          <w:color w:val="CC0000"/>
-        </w:rPr>
         <w:t xml:space="preserve">Wang A, Cho K, Lewis M (2020) Asking and Answering Questions to Evaluate the Factual Consistency of Summaries (QAGS). ACL.</w:t>
       </w:r>
     </w:p>
@@ -27907,15 +26057,11 @@
       <w:r>
         <w:rPr>
           <w:rFonts w:ascii="Times New Roman" w:hAnsi="Times New Roman"/>
-          <w:color w:val="CC0000"/>
           <w:sz w:val="20"/>
         </w:rPr>
         <w:t xml:space="preserve">51. </w:t>
       </w:r>
       <w:r>
-        <w:rPr>
-          <w:color w:val="CC0000"/>
-        </w:rPr>
         <w:t xml:space="preserve">Scialom T, et al (2021) QuestEval: Summarization Asks for Fact-based Evaluation. EMNLP.</w:t>
       </w:r>
     </w:p>
@@ -27932,15 +26078,11 @@
       <w:r>
         <w:rPr>
           <w:rFonts w:ascii="Times New Roman" w:hAnsi="Times New Roman"/>
-          <w:color w:val="CC0000"/>
           <w:sz w:val="20"/>
         </w:rPr>
         <w:t xml:space="preserve">52. </w:t>
       </w:r>
       <w:r>
-        <w:rPr>
-          <w:color w:val="CC0000"/>
-        </w:rPr>
         <w:t xml:space="preserve">Yin W, Radev D, Xiong C (2021) DocNLI: A Large-scale Dataset for Document-level Natural Language Inference. Findings of ACL-IJCNLP.</w:t>
       </w:r>
     </w:p>
@@ -27957,15 +26099,11 @@
       <w:r>
         <w:rPr>
           <w:rFonts w:ascii="Times New Roman" w:hAnsi="Times New Roman"/>
-          <w:color w:val="CC0000"/>
           <w:sz w:val="20"/>
         </w:rPr>
         <w:t xml:space="preserve">53. </w:t>
       </w:r>
       <w:r>
-        <w:rPr>
-          <w:color w:val="CC0000"/>
-        </w:rPr>
         <w:t xml:space="preserve">Atia T, Aperstein Y, Apartsin A (2026) SeaAlert: Critical Information Extraction From Maritime Distress Communications with Large Language Models. IEEE Access.</w:t>
       </w:r>
     </w:p>
@@ -27982,15 +26120,11 @@
       <w:r>
         <w:rPr>
           <w:rFonts w:ascii="Times New Roman" w:hAnsi="Times New Roman"/>
-          <w:color w:val="CC0000"/>
           <w:sz w:val="20"/>
         </w:rPr>
         <w:t xml:space="preserve">54. </w:t>
       </w:r>
       <w:r>
-        <w:rPr>
-          <w:color w:val="CC0000"/>
-        </w:rPr>
         <w:t xml:space="preserve">Zuluaga-Gomez J, et al (2023) ATCO2 corpus: A Large-Scale Dataset for Research on ASR and NLU of Air Traffic Control Communications. arXiv:2211.04054.</w:t>
       </w:r>
     </w:p>
@@ -28007,15 +26141,11 @@
       <w:r>
         <w:rPr>
           <w:rFonts w:ascii="Times New Roman" w:hAnsi="Times New Roman"/>
-          <w:color w:val="CC0000"/>
           <w:sz w:val="20"/>
         </w:rPr>
         <w:t xml:space="preserve">55. </w:t>
       </w:r>
       <w:r>
-        <w:rPr>
-          <w:color w:val="CC0000"/>
-        </w:rPr>
         <w:t xml:space="preserve">Sun K, et al (2023) Speech-based Slot Filling using Large Language Models. arXiv:2311.07418.</w:t>
       </w:r>
     </w:p>
@@ -28032,15 +26162,11 @@
       <w:r>
         <w:rPr>
           <w:rFonts w:ascii="Times New Roman" w:hAnsi="Times New Roman"/>
-          <w:color w:val="CC0000"/>
           <w:sz w:val="20"/>
         </w:rPr>
         <w:t xml:space="preserve">56. </w:t>
       </w:r>
       <w:r>
-        <w:rPr>
-          <w:color w:val="CC0000"/>
-        </w:rPr>
         <w:t xml:space="preserve">Werthaim M, Kimhi M, Apartsin A, Aperstein Y (2026) A benchmark for evaluating diagnostic questioning efficiency of LLMs in patient conversations. Scientific Reports.</w:t>
       </w:r>
     </w:p>
@@ -28057,15 +26183,11 @@
       <w:r>
         <w:rPr>
           <w:rFonts w:ascii="Times New Roman" w:hAnsi="Times New Roman"/>
-          <w:color w:val="CC0000"/>
           <w:sz w:val="20"/>
         </w:rPr>
         <w:t xml:space="preserve">57. </w:t>
       </w:r>
       <w:r>
-        <w:rPr>
-          <w:color w:val="CC0000"/>
-        </w:rPr>
         <w:t xml:space="preserve">Kao H-C, Tang K-F, Chang EY (2018) Context-Aware Symptom Checking for Disease Diagnosis Using Hierarchical Reinforcement Learning. AAAI.</w:t>
       </w:r>
     </w:p>
@@ -28082,15 +26204,11 @@
       <w:r>
         <w:rPr>
           <w:rFonts w:ascii="Times New Roman" w:hAnsi="Times New Roman"/>
-          <w:color w:val="CC0000"/>
           <w:sz w:val="20"/>
         </w:rPr>
         <w:t xml:space="preserve">58. </w:t>
       </w:r>
       <w:r>
-        <w:rPr>
-          <w:color w:val="CC0000"/>
-        </w:rPr>
         <w:t xml:space="preserve">Wei Z, et al (2018) Task-oriented Dialogue System for Automatic Diagnosis. ACL.</w:t>
       </w:r>
     </w:p>
@@ -28107,15 +26225,11 @@
       <w:r>
         <w:rPr>
           <w:rFonts w:ascii="Times New Roman" w:hAnsi="Times New Roman"/>
-          <w:color w:val="CC0000"/>
           <w:sz w:val="20"/>
         </w:rPr>
         <w:t xml:space="preserve">59. </w:t>
       </w:r>
       <w:r>
-        <w:rPr>
-          <w:color w:val="CC0000"/>
-        </w:rPr>
         <w:t xml:space="preserve">Li S, et al (2024) MediQ: Question-Asking LLMs and a Benchmark for Reliable Interactive Clinical Reasoning. NeurIPS (arXiv:2406.00922).</w:t>
       </w:r>
     </w:p>
@@ -28132,15 +26246,11 @@
       <w:r>
         <w:rPr>
           <w:rFonts w:ascii="Times New Roman" w:hAnsi="Times New Roman"/>
-          <w:color w:val="CC0000"/>
           <w:sz w:val="20"/>
         </w:rPr>
         <w:t xml:space="preserve">60. </w:t>
       </w:r>
       <w:r>
-        <w:rPr>
-          <w:color w:val="CC0000"/>
-        </w:rPr>
         <w:t xml:space="preserve">Tu T, et al (2025) Towards conversational diagnostic artificial intelligence (AMIE). Nature.</w:t>
       </w:r>
     </w:p>
@@ -28157,15 +26267,11 @@
       <w:r>
         <w:rPr>
           <w:rFonts w:ascii="Times New Roman" w:hAnsi="Times New Roman"/>
-          <w:color w:val="CC0000"/>
           <w:sz w:val="20"/>
         </w:rPr>
         <w:t xml:space="preserve">61. </w:t>
       </w:r>
       <w:r>
-        <w:rPr>
-          <w:color w:val="CC0000"/>
-        </w:rPr>
         <w:t xml:space="preserve">Aperstein Y, Apartsin A (2026) A Controlled Synthetic Benchmark for Educational Aspect-Based Sentiment Analysis. arXiv:2605.25502.</w:t>
       </w:r>
     </w:p>
@@ -28182,15 +26288,11 @@
       <w:r>
         <w:rPr>
           <w:rFonts w:ascii="Times New Roman" w:hAnsi="Times New Roman"/>
-          <w:color w:val="CC0000"/>
           <w:sz w:val="20"/>
         </w:rPr>
         <w:t xml:space="preserve">62. </w:t>
       </w:r>
       <w:r>
-        <w:rPr>
-          <w:color w:val="CC0000"/>
-        </w:rPr>
         <w:t xml:space="preserve">Laufer M, Aperstein Y, Apartsin A (2026) Reliable Extraction of Clinical Follow-Up Instructions: A Hybrid Neural-Symbolic Pipeline. arXiv:2605.26560.</w:t>
       </w:r>
     </w:p>
@@ -28207,15 +26309,11 @@
       <w:r>
         <w:rPr>
           <w:rFonts w:ascii="Times New Roman" w:hAnsi="Times New Roman"/>
-          <w:color w:val="CC0000"/>
           <w:sz w:val="20"/>
         </w:rPr>
         <w:t xml:space="preserve">63. </w:t>
       </w:r>
       <w:r>
-        <w:rPr>
-          <w:color w:val="CC0000"/>
-        </w:rPr>
         <w:t xml:space="preserve">Ramachandran P, et al (2024) Synth-SBDH: A Synthetic Dataset of Social and Behavioral Determinants of Health for Clinical Text. arXiv:2406.06056.</w:t>
       </w:r>
     </w:p>
@@ -28232,15 +26330,11 @@
       <w:r>
         <w:rPr>
           <w:rFonts w:ascii="Times New Roman" w:hAnsi="Times New Roman"/>
-          <w:color w:val="CC0000"/>
           <w:sz w:val="20"/>
         </w:rPr>
         <w:t xml:space="preserve">64. </w:t>
       </w:r>
       <w:r>
-        <w:rPr>
-          <w:color w:val="CC0000"/>
-        </w:rPr>
         <w:t xml:space="preserve">Das S, et al (2024) Synthetic Patient-Physician Dialogue Generation from Clinical Notes Using LLM (SynDial). arXiv:2408.06285.</w:t>
       </w:r>
     </w:p>
@@ -28257,15 +26351,11 @@
       <w:r>
         <w:rPr>
           <w:rFonts w:ascii="Times New Roman" w:hAnsi="Times New Roman"/>
-          <w:color w:val="CC0000"/>
           <w:sz w:val="20"/>
         </w:rPr>
         <w:t xml:space="preserve">65. </w:t>
       </w:r>
       <w:r>
-        <w:rPr>
-          <w:color w:val="CC0000"/>
-        </w:rPr>
         <w:t xml:space="preserve">Chintagunta B, et al (2023) Can LLMs generate high-quality synthetic note-oriented doctor-patient conversations? arXiv:2306.16931.</w:t>
       </w:r>
     </w:p>
@@ -28282,15 +26372,11 @@
       <w:r>
         <w:rPr>
           <w:rFonts w:ascii="Times New Roman" w:hAnsi="Times New Roman"/>
-          <w:color w:val="CC0000"/>
           <w:sz w:val="20"/>
         </w:rPr>
         <w:t xml:space="preserve">66. </w:t>
       </w:r>
       <w:r>
-        <w:rPr>
-          <w:color w:val="CC0000"/>
-        </w:rPr>
         <w:t xml:space="preserve">Apartsin A, Aperstein Y (2026) CoEval: Ranking Language Models for Custom Tasks Without Labeled Data or Trustworthy Benchmarks. arXiv:2606.03650.</w:t>
       </w:r>
     </w:p>
@@ -28307,15 +26393,11 @@
       <w:r>
         <w:rPr>
           <w:rFonts w:ascii="Times New Roman" w:hAnsi="Times New Roman"/>
-          <w:color w:val="CC0000"/>
           <w:sz w:val="20"/>
         </w:rPr>
         <w:t xml:space="preserve">67. </w:t>
       </w:r>
       <w:r>
-        <w:rPr>
-          <w:color w:val="CC0000"/>
-        </w:rPr>
         <w:t xml:space="preserve">Wang K, Zhu J, Ren M, et al (2024) A Survey on Data Synthesis and Augmentation for Large Language Models. arXiv:2410.12896.</w:t>
       </w:r>
     </w:p>
@@ -28332,15 +26414,11 @@
       <w:r>
         <w:rPr>
           <w:rFonts w:ascii="Times New Roman" w:hAnsi="Times New Roman"/>
-          <w:color w:val="CC0000"/>
           <w:sz w:val="20"/>
         </w:rPr>
         <w:t xml:space="preserve">68. </w:t>
       </w:r>
       <w:r>
-        <w:rPr>
-          <w:color w:val="CC0000"/>
-        </w:rPr>
         <w:t xml:space="preserve">Mama E, Sheri L, Aperstein Y, Apartsin A (2025) From Fuzzy Speech to Medical Insight: Benchmarking LLMs on Noisy Patient Narratives. arXiv:2509.11803.</w:t>
       </w:r>
     </w:p>
@@ -28357,15 +26435,11 @@
       <w:r>
         <w:rPr>
           <w:rFonts w:ascii="Times New Roman" w:hAnsi="Times New Roman"/>
-          <w:color w:val="CC0000"/>
           <w:sz w:val="20"/>
         </w:rPr>
         <w:t xml:space="preserve">69. </w:t>
       </w:r>
       <w:r>
-        <w:rPr>
-          <w:color w:val="CC0000"/>
-        </w:rPr>
         <w:t xml:space="preserve">Bolshinsky I, Kupiec S, Sasson A, Aperstein Y, Apartsin A (2025) Do Large Language Models Need Intent? Revisiting Response Generation Strategies for Service Assistant. arXiv:2509.05006.</w:t>
       </w:r>
     </w:p>
@@ -28382,15 +26456,11 @@
       <w:r>
         <w:rPr>
           <w:rFonts w:ascii="Times New Roman" w:hAnsi="Times New Roman"/>
-          <w:color w:val="CC0000"/>
           <w:sz w:val="20"/>
         </w:rPr>
         <w:t xml:space="preserve">70. </w:t>
       </w:r>
       <w:r>
-        <w:rPr>
-          <w:color w:val="CC0000"/>
-        </w:rPr>
         <w:t xml:space="preserve">Goncharok D, Shifman A, Apartsin A, Aperstein Y (2025) When Curiosity Signals Danger: Predicting Health Crises Through Online Medication Inquiries. arXiv:2509.11802.</w:t>
       </w:r>
     </w:p>
@@ -28407,15 +26477,11 @@
       <w:r>
         <w:rPr>
           <w:rFonts w:ascii="Times New Roman" w:hAnsi="Times New Roman"/>
-          <w:color w:val="CC0000"/>
           <w:sz w:val="20"/>
         </w:rPr>
         <w:t xml:space="preserve">71. </w:t>
       </w:r>
       <w:r>
-        <w:rPr>
-          <w:color w:val="CC0000"/>
-        </w:rPr>
         <w:t xml:space="preserve">Shekhar AC, Kimbrell J, Saharan A, Stebel J, Ashley E, Abbott EE (2024) Use of a large language model for ambulance dispatch and triage. Prehospital and Disaster Medicine (PubMed 39675178).</w:t>
       </w:r>
     </w:p>
@@ -28432,15 +26498,11 @@
       <w:r>
         <w:rPr>
           <w:rFonts w:ascii="Times New Roman" w:hAnsi="Times New Roman"/>
-          <w:color w:val="CC0000"/>
           <w:sz w:val="20"/>
         </w:rPr>
         <w:t xml:space="preserve">72. </w:t>
       </w:r>
       <w:r>
-        <w:rPr>
-          <w:color w:val="CC0000"/>
-        </w:rPr>
         <w:t xml:space="preserve">Gatto J, et al (2024) In-Context Learning for Preserving Patient Privacy: Synthesizing Realistic Patient Portal Messages. ML4H (arXiv:2411.06549).</w:t>
       </w:r>
     </w:p>
@@ -28457,15 +26519,11 @@
       <w:r>
         <w:rPr>
           <w:rFonts w:ascii="Times New Roman" w:hAnsi="Times New Roman"/>
-          <w:color w:val="CC0000"/>
           <w:sz w:val="20"/>
         </w:rPr>
         <w:t xml:space="preserve">73. </w:t>
       </w:r>
       <w:r>
-        <w:rPr>
-          <w:color w:val="CC0000"/>
-        </w:rPr>
         <w:t xml:space="preserve">Liu S, Wright AP, McCoy AB, Huang SS, Steitz B, Wright A (2025) Detecting emergencies in patient portal messages using LLMs and knowledge-graph-based RAG. JAMIA 32(6):1032.</w:t>
       </w:r>
     </w:p>
@@ -28482,15 +26540,11 @@
       <w:r>
         <w:rPr>
           <w:rFonts w:ascii="Times New Roman" w:hAnsi="Times New Roman"/>
-          <w:color w:val="CC0000"/>
           <w:sz w:val="20"/>
         </w:rPr>
         <w:t xml:space="preserve">74. </w:t>
       </w:r>
       <w:r>
-        <w:rPr>
-          <w:color w:val="CC0000"/>
-        </w:rPr>
         <w:t xml:space="preserve">Hartman V, et al (2024) Developing and Evaluating Large Language Model-Generated Emergency Medicine Handoff Notes. JAMA Network Open.</w:t>
       </w:r>
     </w:p>
@@ -28507,15 +26561,11 @@
       <w:r>
         <w:rPr>
           <w:rFonts w:ascii="Times New Roman" w:hAnsi="Times New Roman"/>
-          <w:color w:val="CC0000"/>
           <w:sz w:val="20"/>
         </w:rPr>
         <w:t xml:space="preserve">75. </w:t>
       </w:r>
       <w:r>
-        <w:rPr>
-          <w:color w:val="CC0000"/>
-        </w:rPr>
         <w:t xml:space="preserve">Apartsin A, Sason O, Aperstein Y (2026) Toward a Benchmark for Controllable Simulation of Imperfect Students with Large Language Models. arXiv:2605.25601.</w:t>
       </w:r>
     </w:p>
@@ -28532,15 +26582,11 @@
       <w:r>
         <w:rPr>
           <w:rFonts w:ascii="Times New Roman" w:hAnsi="Times New Roman"/>
-          <w:color w:val="CC0000"/>
           <w:sz w:val="20"/>
         </w:rPr>
         <w:t xml:space="preserve">76. </w:t>
       </w:r>
       <w:r>
-        <w:rPr>
-          <w:color w:val="CC0000"/>
-        </w:rPr>
         <w:t xml:space="preserve">Aperstein Y, Cohen Y, Apartsin A (2025) Generative AI-Based Platform for Deliberate Teaching Practice: A Review and a Suggested Framework. Education Sciences.</w:t>
       </w:r>
     </w:p>
@@ -28557,15 +26603,11 @@
       <w:r>
         <w:rPr>
           <w:rFonts w:ascii="Times New Roman" w:hAnsi="Times New Roman"/>
-          <w:color w:val="CC0000"/>
           <w:sz w:val="20"/>
         </w:rPr>
         <w:t xml:space="preserve">77. </w:t>
       </w:r>
       <w:r>
-        <w:rPr>
-          <w:color w:val="CC0000"/>
-        </w:rPr>
         <w:t xml:space="preserve">Apartsin A, Aperstein Y (2026) Framing, Judging, Steering: An Assessable Competency Model for Teaching Students to Reason With Generative AI. arXiv:2606.05983.</w:t>
       </w:r>
     </w:p>
@@ -28582,21 +26624,14 @@
       <w:r>
         <w:rPr>
           <w:rFonts w:ascii="Times New Roman" w:hAnsi="Times New Roman"/>
-          <w:color w:val="CC0000"/>
           <w:sz w:val="20"/>
         </w:rPr>
         <w:t xml:space="preserve">78. </w:t>
       </w:r>
       <w:r>
-        <w:rPr>
-          <w:color w:val="CC0000"/>
-        </w:rPr>
         <w:t xml:space="preserve">Markel J, Opferman S, Landay J, Piech C (2023) GPTeach: Interactive TA Training with GPT-based Students. ACM Learning@Scale.</w:t>
       </w:r>
       <w:r>
-        <w:rPr>
-          <w:color w:val="CC0000"/>
-        </w:rPr>
         <w:t xml:space="preserve"> </w:t>
       </w:r>
       <w:hyperlink r:id="rId68">
@@ -28621,15 +26656,11 @@
       <w:r>
         <w:rPr>
           <w:rFonts w:ascii="Times New Roman" w:hAnsi="Times New Roman"/>
-          <w:color w:val="CC0000"/>
           <w:sz w:val="20"/>
         </w:rPr>
         <w:t xml:space="preserve">79. </w:t>
       </w:r>
       <w:r>
-        <w:rPr>
-          <w:color w:val="CC0000"/>
-        </w:rPr>
         <w:t xml:space="preserve">Shea R, et al (2024) ACE: A LLM-based Negotiation Coaching System. arXiv:2410.01555.</w:t>
       </w:r>
     </w:p>
@@ -28646,15 +26677,11 @@
       <w:r>
         <w:rPr>
           <w:rFonts w:ascii="Times New Roman" w:hAnsi="Times New Roman"/>
-          <w:color w:val="CC0000"/>
           <w:sz w:val="20"/>
         </w:rPr>
         <w:t xml:space="preserve">80. </w:t>
       </w:r>
       <w:r>
-        <w:rPr>
-          <w:color w:val="CC0000"/>
-        </w:rPr>
         <w:t xml:space="preserve">Zhang Z, et al (2024) Simulating Classroom Education with LLM-Empowered Agents. arXiv:2406.19226.</w:t>
       </w:r>
     </w:p>
@@ -28671,21 +26698,14 @@
       <w:r>
         <w:rPr>
           <w:rFonts w:ascii="Times New Roman" w:hAnsi="Times New Roman"/>
-          <w:color w:val="CC0000"/>
           <w:sz w:val="20"/>
         </w:rPr>
         <w:t xml:space="preserve">81. </w:t>
       </w:r>
       <w:r>
-        <w:rPr>
-          <w:color w:val="CC0000"/>
-        </w:rPr>
         <w:t xml:space="preserve">Holderried F, et al (2024) A Generative Pretrained Transformer (GPT)-Powered Chatbot as a Simulated Patient to Practice History Taking. JMIR Medical Education.</w:t>
       </w:r>
       <w:r>
-        <w:rPr>
-          <w:color w:val="CC0000"/>
-        </w:rPr>
         <w:t xml:space="preserve"> </w:t>
       </w:r>
       <w:hyperlink r:id="rId69">
@@ -28710,15 +26730,11 @@
       <w:r>
         <w:rPr>
           <w:rFonts w:ascii="Times New Roman" w:hAnsi="Times New Roman"/>
-          <w:color w:val="CC0000"/>
           <w:sz w:val="20"/>
         </w:rPr>
         <w:t xml:space="preserve">82. </w:t>
       </w:r>
       <w:r>
-        <w:rPr>
-          <w:color w:val="CC0000"/>
-        </w:rPr>
         <w:t xml:space="preserve">Johri S, et al (2025) An evaluation framework for clinical use of large language models in patient interaction tasks (CRAFT-MD). Nature Medicine.</w:t>
       </w:r>
     </w:p>
@@ -28735,15 +26751,11 @@
       <w:r>
         <w:rPr>
           <w:rFonts w:ascii="Times New Roman" w:hAnsi="Times New Roman"/>
-          <w:color w:val="CC0000"/>
           <w:sz w:val="20"/>
         </w:rPr>
         <w:t xml:space="preserve">83. </w:t>
       </w:r>
       <w:r>
-        <w:rPr>
-          <w:color w:val="CC0000"/>
-        </w:rPr>
         <w:t xml:space="preserve">Zeng J, Qi W, Shen S, Liu X, et al (2025) Embracing the Future of Medical Education With Large Language Model-Based Virtual Patients: Scoping Review. Journal of Medical Internet Research.</w:t>
       </w:r>
     </w:p>
@@ -28760,15 +26772,11 @@
       <w:r>
         <w:rPr>
           <w:rFonts w:ascii="Times New Roman" w:hAnsi="Times New Roman"/>
-          <w:color w:val="CC0000"/>
           <w:sz w:val="20"/>
         </w:rPr>
         <w:t xml:space="preserve">84. </w:t>
       </w:r>
       <w:r>
-        <w:rPr>
-          <w:color w:val="CC0000"/>
-        </w:rPr>
         <w:t xml:space="preserve">Li D, Lutfi SL (2026) Large Language Model-Based Virtual Patient Systems for History-Taking in Medical Education: A Comprehensive Systematic Review. JMIR Medical Informatics.</w:t>
       </w:r>
     </w:p>
@@ -28785,15 +26793,11 @@
       <w:r>
         <w:rPr>
           <w:rFonts w:ascii="Times New Roman" w:hAnsi="Times New Roman"/>
-          <w:color w:val="CC0000"/>
           <w:sz w:val="20"/>
         </w:rPr>
         <w:t xml:space="preserve">85. </w:t>
       </w:r>
       <w:r>
-        <w:rPr>
-          <w:color w:val="CC0000"/>
-        </w:rPr>
         <w:t xml:space="preserve">Kang D, et al (2025) PatientSim: A Persona-Driven Simulator for Realistic Doctor-Patient Interactions. arXiv:2505.17818.</w:t>
       </w:r>
     </w:p>
@@ -28810,21 +26814,14 @@
       <w:r>
         <w:rPr>
           <w:rFonts w:ascii="Times New Roman" w:hAnsi="Times New Roman"/>
-          <w:color w:val="CC0000"/>
           <w:sz w:val="20"/>
         </w:rPr>
         <w:t xml:space="preserve">86. </w:t>
       </w:r>
       <w:r>
-        <w:rPr>
-          <w:color w:val="CC0000"/>
-        </w:rPr>
         <w:t xml:space="preserve">Shapira G, Apartsin A (2026) SPINE: A Benchmark for Measuring the Epistemic Backbone of Large Language Models. Harvard Dataverse.</w:t>
       </w:r>
       <w:r>
-        <w:rPr>
-          <w:color w:val="CC0000"/>
-        </w:rPr>
         <w:t xml:space="preserve"> </w:t>
       </w:r>
       <w:hyperlink r:id="rId70">
@@ -28849,15 +26846,11 @@
       <w:r>
         <w:rPr>
           <w:rFonts w:ascii="Times New Roman" w:hAnsi="Times New Roman"/>
-          <w:color w:val="CC0000"/>
           <w:sz w:val="20"/>
         </w:rPr>
         <w:t xml:space="preserve">87. </w:t>
       </w:r>
       <w:r>
-        <w:rPr>
-          <w:color w:val="CC0000"/>
-        </w:rPr>
         <w:t xml:space="preserve">Cohen Y, Ohayon D, Somkin R, Aperstein Y, Apartsin A (2025) Code Review Without Borders: Evaluating Synthetic vs. Real Data for Review Recommendation. arXiv:2509.04810.</w:t>
       </w:r>
     </w:p>
@@ -28874,15 +26867,11 @@
       <w:r>
         <w:rPr>
           <w:rFonts w:ascii="Times New Roman" w:hAnsi="Times New Roman"/>
-          <w:color w:val="CC0000"/>
           <w:sz w:val="20"/>
         </w:rPr>
         <w:t xml:space="preserve">88. </w:t>
       </w:r>
       <w:r>
-        <w:rPr>
-          <w:color w:val="CC0000"/>
-        </w:rPr>
         <w:t xml:space="preserve">Dahary S, Edana A, Apartsin A, Aperstein Y (2025) From Joy to Fear: A Benchmark of Emotion Estimation in Pop Song Lyrics. arXiv:2509.05617.</w:t>
       </w:r>
     </w:p>
@@ -28899,15 +26888,11 @@
       <w:r>
         <w:rPr>
           <w:rFonts w:ascii="Times New Roman" w:hAnsi="Times New Roman"/>
-          <w:color w:val="CC0000"/>
           <w:sz w:val="20"/>
         </w:rPr>
         <w:t xml:space="preserve">89. </w:t>
       </w:r>
       <w:r>
-        <w:rPr>
-          <w:color w:val="CC0000"/>
-        </w:rPr>
         <w:t xml:space="preserve">Cohen M, Shani S, Menahem E, Aperstein Y, Apartsin A (2025) Reading Between the Lines: Classifying Resume Seniority with Large Language Models. arXiv:2509.09229.</w:t>
       </w:r>
     </w:p>
@@ -28924,15 +26909,11 @@
       <w:r>
         <w:rPr>
           <w:rFonts w:ascii="Times New Roman" w:hAnsi="Times New Roman"/>
-          <w:color w:val="CC0000"/>
           <w:sz w:val="20"/>
         </w:rPr>
         <w:t xml:space="preserve">90. </w:t>
       </w:r>
       <w:r>
-        <w:rPr>
-          <w:color w:val="CC0000"/>
-        </w:rPr>
         <w:t xml:space="preserve">Yao Z, et al (2025) DischargeSim: A Simulation Benchmark for Educational Doctor-Patient Communication at Discharge. arXiv:2509.07188.</w:t>
       </w:r>
     </w:p>
@@ -28949,15 +26930,11 @@
       <w:r>
         <w:rPr>
           <w:rFonts w:ascii="Times New Roman" w:hAnsi="Times New Roman"/>
-          <w:color w:val="CC0000"/>
           <w:sz w:val="20"/>
         </w:rPr>
         <w:t xml:space="preserve">91. </w:t>
       </w:r>
       <w:r>
-        <w:rPr>
-          <w:color w:val="CC0000"/>
-        </w:rPr>
         <w:t xml:space="preserve">Xu J, et al (2024) Overview of the First Shared Task on Clinical Text Generation: RRG24 and Discharge Me! BioNLP, ACL (arXiv:2409.16603).</w:t>
       </w:r>
     </w:p>
@@ -28974,15 +26951,11 @@
       <w:r>
         <w:rPr>
           <w:rFonts w:ascii="Times New Roman" w:hAnsi="Times New Roman"/>
-          <w:color w:val="CC0000"/>
           <w:sz w:val="20"/>
         </w:rPr>
         <w:t xml:space="preserve">92. </w:t>
       </w:r>
       <w:r>
-        <w:rPr>
-          <w:color w:val="CC0000"/>
-        </w:rPr>
         <w:t xml:space="preserve">Meeus M, Wutschitz L, Zanella-Beguelin S, Tople S, Shokri R (2025) The Canary's Echo: Auditing Privacy Risks of LLM-Generated Synthetic Text. arXiv:2502.14921.</w:t>
       </w:r>
     </w:p>
@@ -28999,15 +26972,11 @@
       <w:r>
         <w:rPr>
           <w:rFonts w:ascii="Times New Roman" w:hAnsi="Times New Roman"/>
-          <w:color w:val="CC0000"/>
           <w:sz w:val="20"/>
         </w:rPr>
         <w:t xml:space="preserve">93. </w:t>
       </w:r>
       <w:r>
-        <w:rPr>
-          <w:color w:val="CC0000"/>
-        </w:rPr>
         <w:t xml:space="preserve">Sun Y, Schlegel V, Nandakumar S, et al (2025) Evaluating Differentially Private Generation of Domain-Specific Text. arXiv:2508.20452.</w:t>
       </w:r>
     </w:p>
@@ -29024,15 +26993,11 @@
       <w:r>
         <w:rPr>
           <w:rFonts w:ascii="Times New Roman" w:hAnsi="Times New Roman"/>
-          <w:color w:val="CC0000"/>
           <w:sz w:val="20"/>
         </w:rPr>
         <w:t xml:space="preserve">94. </w:t>
       </w:r>
       <w:r>
-        <w:rPr>
-          <w:color w:val="CC0000"/>
-        </w:rPr>
         <w:t xml:space="preserve">Iglesias G, Bello-Orgaz G, Navas-Loro M, et al (2026) Fidelity, Diversity, and Privacy: A Multi-Dimensional LLM Evaluation for Clinical Data Augmentation. arXiv:2604.27014.</w:t>
       </w:r>
     </w:p>
@@ -29049,15 +27014,11 @@
       <w:r>
         <w:rPr>
           <w:rFonts w:ascii="Times New Roman" w:hAnsi="Times New Roman"/>
-          <w:color w:val="CC0000"/>
           <w:sz w:val="20"/>
         </w:rPr>
         <w:t xml:space="preserve">95. </w:t>
       </w:r>
       <w:r>
-        <w:rPr>
-          <w:color w:val="CC0000"/>
-        </w:rPr>
         <w:t xml:space="preserve">Räisä O, van Breugel B, van der Schaar M (2025) Position: All Current Generative Fidelity and Diversity Metrics are Flawed. arXiv:2505.22450.</w:t>
       </w:r>
     </w:p>
@@ -29074,21 +27035,14 @@
       <w:r>
         <w:rPr>
           <w:rFonts w:ascii="Times New Roman" w:hAnsi="Times New Roman"/>
-          <w:color w:val="CC0000"/>
           <w:sz w:val="20"/>
         </w:rPr>
         <w:t xml:space="preserve">96. </w:t>
       </w:r>
       <w:r>
-        <w:rPr>
-          <w:color w:val="CC0000"/>
-        </w:rPr>
         <w:t xml:space="preserve">Asgari E, Montaña-Brown N, Dubois M, et al (2025) A framework to assess clinical safety and hallucination rates of LLMs for medical text summarisation. npj Digital Medicine.</w:t>
       </w:r>
       <w:r>
-        <w:rPr>
-          <w:color w:val="CC0000"/>
-        </w:rPr>
         <w:t xml:space="preserve"> </w:t>
       </w:r>
       <w:hyperlink r:id="rId71">
@@ -29113,21 +27067,14 @@
       <w:r>
         <w:rPr>
           <w:rFonts w:ascii="Times New Roman" w:hAnsi="Times New Roman"/>
-          <w:color w:val="CC0000"/>
           <w:sz w:val="20"/>
         </w:rPr>
         <w:t xml:space="preserve">97. </w:t>
       </w:r>
       <w:r>
-        <w:rPr>
-          <w:color w:val="CC0000"/>
-        </w:rPr>
         <w:t xml:space="preserve">Barman N (2023) Symptom2Disease. Kaggle dataset.</w:t>
       </w:r>
       <w:r>
-        <w:rPr>
-          <w:color w:val="CC0000"/>
-        </w:rPr>
         <w:t xml:space="preserve"> </w:t>
       </w:r>
       <w:hyperlink r:id="rId72">
@@ -29152,21 +27099,14 @@
       <w:r>
         <w:rPr>
           <w:rFonts w:ascii="Times New Roman" w:hAnsi="Times New Roman"/>
-          <w:color w:val="CC0000"/>
           <w:sz w:val="20"/>
         </w:rPr>
         <w:t xml:space="preserve">98. </w:t>
       </w:r>
       <w:r>
-        <w:rPr>
-          <w:color w:val="CC0000"/>
-        </w:rPr>
         <w:t xml:space="preserve">Johnson A, et al (2023) MIMIC-IV-ED (v2.2). PhysioNet.</w:t>
       </w:r>
       <w:r>
-        <w:rPr>
-          <w:color w:val="CC0000"/>
-        </w:rPr>
         <w:t xml:space="preserve"> </w:t>
       </w:r>
       <w:hyperlink r:id="rId73">
@@ -29191,15 +27131,11 @@
       <w:r>
         <w:rPr>
           <w:rFonts w:ascii="Times New Roman" w:hAnsi="Times New Roman"/>
-          <w:color w:val="CC0000"/>
           <w:sz w:val="20"/>
         </w:rPr>
         <w:t xml:space="preserve">99. </w:t>
       </w:r>
       <w:r>
-        <w:rPr>
-          <w:color w:val="CC0000"/>
-        </w:rPr>
         <w:t xml:space="preserve">Gatto J, Seegmiller P, Burdick T, Resnik P, Rahat R, DeLozier S, Preum SM (2026) Medical Triage as Pairwise Ranking (PMR-Bench). arXiv:2601.13178.</w:t>
       </w:r>
     </w:p>
@@ -29216,15 +27152,11 @@
       <w:r>
         <w:rPr>
           <w:rFonts w:ascii="Times New Roman" w:hAnsi="Times New Roman"/>
-          <w:color w:val="CC0000"/>
           <w:sz w:val="20"/>
         </w:rPr>
         <w:t xml:space="preserve">100. </w:t>
       </w:r>
       <w:r>
-        <w:rPr>
-          <w:color w:val="CC0000"/>
-        </w:rPr>
         <w:t xml:space="preserve">Li X, Yu H, Wang W, Wu Y, Zhou J, et al (2026) DispatchMAS: Fusing Taxonomy and AI Agents for Emergency Medical Services. BMC Emergency Medicine (arXiv:2510.21228).</w:t>
       </w:r>
     </w:p>
@@ -29241,15 +27173,11 @@
       <w:r>
         <w:rPr>
           <w:rFonts w:ascii="Times New Roman" w:hAnsi="Times New Roman"/>
-          <w:color w:val="CC0000"/>
           <w:sz w:val="20"/>
         </w:rPr>
         <w:t xml:space="preserve">101. </w:t>
       </w:r>
       <w:r>
-        <w:rPr>
-          <w:color w:val="CC0000"/>
-        </w:rPr>
         <w:t xml:space="preserve">Mishra P, et al (2024) SYNFAC-EDIT: Synthetic Imitation Edit Feedback for Factual Alignment in Clinical Summarization. arXiv:2402.13919.</w:t>
       </w:r>
     </w:p>
@@ -29266,15 +27194,11 @@
       <w:r>
         <w:rPr>
           <w:rFonts w:ascii="Times New Roman" w:hAnsi="Times New Roman"/>
-          <w:color w:val="CC0000"/>
           <w:sz w:val="20"/>
         </w:rPr>
         <w:t xml:space="preserve">102. </w:t>
       </w:r>
       <w:r>
-        <w:rPr>
-          <w:color w:val="CC0000"/>
-        </w:rPr>
         <w:t xml:space="preserve">Lim J, et al (2025) MATRIX: Multi-Agent Simulation Framework for Safe Interactions and Contextual Clinical Conversational Evaluation. arXiv:2508.19163.</w:t>
       </w:r>
     </w:p>
@@ -29291,15 +27215,11 @@
       <w:r>
         <w:rPr>
           <w:rFonts w:ascii="Times New Roman" w:hAnsi="Times New Roman"/>
-          <w:color w:val="CC0000"/>
           <w:sz w:val="20"/>
         </w:rPr>
         <w:t xml:space="preserve">103. </w:t>
       </w:r>
       <w:r>
-        <w:rPr>
-          <w:color w:val="CC0000"/>
-        </w:rPr>
         <w:t xml:space="preserve">Schmidgall S, et al (2024) AgentClinic: A Multimodal Agent Benchmark to Evaluate AI in Simulated Clinical Environments. arXiv:2405.07960.</w:t>
       </w:r>
     </w:p>
@@ -29316,15 +27236,11 @@
       <w:r>
         <w:rPr>
           <w:rFonts w:ascii="Times New Roman" w:hAnsi="Times New Roman"/>
-          <w:color w:val="CC0000"/>
           <w:sz w:val="20"/>
         </w:rPr>
         <w:t xml:space="preserve">104. </w:t>
       </w:r>
       <w:r>
-        <w:rPr>
-          <w:color w:val="CC0000"/>
-        </w:rPr>
         <w:t xml:space="preserve">Bao Z, et al (2024) A Survey on Recent Advances in Conversational Data Generation. arXiv:2405.13003.</w:t>
       </w:r>
     </w:p>
@@ -29341,15 +27257,11 @@
       <w:r>
         <w:rPr>
           <w:rFonts w:ascii="Times New Roman" w:hAnsi="Times New Roman"/>
-          <w:color w:val="CC0000"/>
           <w:sz w:val="20"/>
         </w:rPr>
         <w:t xml:space="preserve">105. </w:t>
       </w:r>
       <w:r>
-        <w:rPr>
-          <w:color w:val="CC0000"/>
-        </w:rPr>
         <w:t xml:space="preserve">Shumailov I, et al (2023) The Curse of Recursion: Training on Generated Data Makes Models Forget. arXiv:2305.17493.</w:t>
       </w:r>
     </w:p>
@@ -29366,15 +27278,11 @@
       <w:r>
         <w:rPr>
           <w:rFonts w:ascii="Times New Roman" w:hAnsi="Times New Roman"/>
-          <w:color w:val="CC0000"/>
           <w:sz w:val="20"/>
         </w:rPr>
         <w:t xml:space="preserve">106. </w:t>
       </w:r>
       <w:r>
-        <w:rPr>
-          <w:color w:val="CC0000"/>
-        </w:rPr>
         <w:t xml:space="preserve">Qin Z, et al (2025) Scaling Laws of Synthetic Data for Language Models. COLM (arXiv:2503.19551).</w:t>
       </w:r>
     </w:p>
@@ -29391,15 +27299,11 @@
       <w:r>
         <w:rPr>
           <w:rFonts w:ascii="Times New Roman" w:hAnsi="Times New Roman"/>
-          <w:color w:val="CC0000"/>
           <w:sz w:val="20"/>
         </w:rPr>
         <w:t xml:space="preserve">107. </w:t>
       </w:r>
       <w:r>
-        <w:rPr>
-          <w:color w:val="CC0000"/>
-        </w:rPr>
         <w:t xml:space="preserve">Yao Z, et al (2024) MedQA-CS: An OSCE-Style Benchmark for Evaluating LLM Clinical Skills. arXiv:2410.01553.</w:t>
       </w:r>
     </w:p>
@@ -29416,15 +27320,11 @@
       <w:r>
         <w:rPr>
           <w:rFonts w:ascii="Times New Roman" w:hAnsi="Times New Roman"/>
-          <w:color w:val="CC0000"/>
           <w:sz w:val="20"/>
         </w:rPr>
         <w:t xml:space="preserve">108. </w:t>
       </w:r>
       <w:r>
-        <w:rPr>
-          <w:color w:val="CC0000"/>
-        </w:rPr>
         <w:t xml:space="preserve">Wang Y, et al (2024) M4: Multi-generator, Multi-domain, and Multi-lingual Black-Box Machine-Generated Text Detection. EACL.</w:t>
       </w:r>
     </w:p>
@@ -29441,21 +27341,14 @@
       <w:r>
         <w:rPr>
           <w:rFonts w:ascii="Times New Roman" w:hAnsi="Times New Roman"/>
-          <w:color w:val="CC0000"/>
           <w:sz w:val="20"/>
         </w:rPr>
         <w:t xml:space="preserve">109. </w:t>
       </w:r>
       <w:r>
-        <w:rPr>
-          <w:color w:val="CC0000"/>
-        </w:rPr>
         <w:t xml:space="preserve">Diaz Ochoa J, Layer N, Mahr J, Mustafa F, et al (2025) Optimized BERT-based NLP outperforms zero-shot methods for automated symptom detection in clinical practice. Frontiers in Digital Health.</w:t>
       </w:r>
       <w:r>
-        <w:rPr>
-          <w:color w:val="CC0000"/>
-        </w:rPr>
         <w:t xml:space="preserve"> </w:t>
       </w:r>
       <w:hyperlink r:id="rId74">

</xml_diff>